<commit_message>
docs: manuals updated for the three-form KoboToolbox sync (v1.2)
Co-Authored-By: Claude Sonnet 5 <noreply@anthropic.com>
</commit_message>
<xml_diff>
--- a/docs/manuals/RA_Training_Manual.docx
+++ b/docs/manuals/RA_Training_Manual.docx
@@ -469,7 +469,7 @@
                 <w:sz w:val="19"/>
                 <w:szCs w:val="19"/>
               </w:rPr>
-              <w:t>Version 1.1 · 19 September 2026</w:t>
+              <w:t>Version 1.2 · 20 September 2026</w:t>
             </w:r>
           </w:p>
         </w:tc>
@@ -538,7 +538,7 @@
     <w:sdt>
       <w:sdtPr>
         <w:alias w:val="Contents"/>
-        <w:id w:val="-2129304872"/>
+        <w:id w:val="-1513837585"/>
       </w:sdtPr>
       <w:sdtEndPr/>
       <w:sdtContent>
@@ -567,7 +567,7 @@
           <w:r>
             <w:fldChar w:fldCharType="separate"/>
           </w:r>
-          <w:hyperlink w:anchor="_Toc240712986" w:history="1">
+          <w:hyperlink w:anchor="_Toc240758732" w:history="1">
             <w:r>
               <w:rPr>
                 <w:rStyle w:val="Hyperlink"/>
@@ -591,7 +591,7 @@
               <w:rPr>
                 <w:noProof/>
               </w:rPr>
-              <w:instrText xml:space="preserve"> PAGEREF _Toc240712986 \h </w:instrText>
+              <w:instrText xml:space="preserve"> PAGEREF _Toc240758732 \h </w:instrText>
             </w:r>
             <w:r>
               <w:rPr>
@@ -634,7 +634,7 @@
               <w14:ligatures w14:val="standardContextual"/>
             </w:rPr>
           </w:pPr>
-          <w:hyperlink w:anchor="_Toc240712987" w:history="1">
+          <w:hyperlink w:anchor="_Toc240758733" w:history="1">
             <w:r>
               <w:rPr>
                 <w:rStyle w:val="Hyperlink"/>
@@ -658,7 +658,7 @@
               <w:rPr>
                 <w:noProof/>
               </w:rPr>
-              <w:instrText xml:space="preserve"> PAGEREF _Toc240712987 \h </w:instrText>
+              <w:instrText xml:space="preserve"> PAGEREF _Toc240758733 \h </w:instrText>
             </w:r>
             <w:r>
               <w:rPr>
@@ -701,7 +701,7 @@
               <w14:ligatures w14:val="standardContextual"/>
             </w:rPr>
           </w:pPr>
-          <w:hyperlink w:anchor="_Toc240712988" w:history="1">
+          <w:hyperlink w:anchor="_Toc240758734" w:history="1">
             <w:r>
               <w:rPr>
                 <w:rStyle w:val="Hyperlink"/>
@@ -725,7 +725,7 @@
               <w:rPr>
                 <w:noProof/>
               </w:rPr>
-              <w:instrText xml:space="preserve"> PAGEREF _Toc240712988 \h </w:instrText>
+              <w:instrText xml:space="preserve"> PAGEREF _Toc240758734 \h </w:instrText>
             </w:r>
             <w:r>
               <w:rPr>
@@ -768,7 +768,7 @@
               <w14:ligatures w14:val="standardContextual"/>
             </w:rPr>
           </w:pPr>
-          <w:hyperlink w:anchor="_Toc240712989" w:history="1">
+          <w:hyperlink w:anchor="_Toc240758735" w:history="1">
             <w:r>
               <w:rPr>
                 <w:rStyle w:val="Hyperlink"/>
@@ -792,7 +792,7 @@
               <w:rPr>
                 <w:noProof/>
               </w:rPr>
-              <w:instrText xml:space="preserve"> PAGEREF _Toc240712989 \h </w:instrText>
+              <w:instrText xml:space="preserve"> PAGEREF _Toc240758735 \h </w:instrText>
             </w:r>
             <w:r>
               <w:rPr>
@@ -835,7 +835,7 @@
               <w14:ligatures w14:val="standardContextual"/>
             </w:rPr>
           </w:pPr>
-          <w:hyperlink w:anchor="_Toc240712990" w:history="1">
+          <w:hyperlink w:anchor="_Toc240758736" w:history="1">
             <w:r>
               <w:rPr>
                 <w:rStyle w:val="Hyperlink"/>
@@ -859,7 +859,7 @@
               <w:rPr>
                 <w:noProof/>
               </w:rPr>
-              <w:instrText xml:space="preserve"> PAGEREF _Toc240712990 \h </w:instrText>
+              <w:instrText xml:space="preserve"> PAGEREF _Toc240758736 \h </w:instrText>
             </w:r>
             <w:r>
               <w:rPr>
@@ -902,7 +902,7 @@
               <w14:ligatures w14:val="standardContextual"/>
             </w:rPr>
           </w:pPr>
-          <w:hyperlink w:anchor="_Toc240712991" w:history="1">
+          <w:hyperlink w:anchor="_Toc240758737" w:history="1">
             <w:r>
               <w:rPr>
                 <w:rStyle w:val="Hyperlink"/>
@@ -926,7 +926,7 @@
               <w:rPr>
                 <w:noProof/>
               </w:rPr>
-              <w:instrText xml:space="preserve"> PAGEREF _Toc240712991 \h </w:instrText>
+              <w:instrText xml:space="preserve"> PAGEREF _Toc240758737 \h </w:instrText>
             </w:r>
             <w:r>
               <w:rPr>
@@ -969,7 +969,7 @@
               <w14:ligatures w14:val="standardContextual"/>
             </w:rPr>
           </w:pPr>
-          <w:hyperlink w:anchor="_Toc240712992" w:history="1">
+          <w:hyperlink w:anchor="_Toc240758738" w:history="1">
             <w:r>
               <w:rPr>
                 <w:rStyle w:val="Hyperlink"/>
@@ -993,7 +993,7 @@
               <w:rPr>
                 <w:noProof/>
               </w:rPr>
-              <w:instrText xml:space="preserve"> PAGEREF _Toc240712992 \h </w:instrText>
+              <w:instrText xml:space="preserve"> PAGEREF _Toc240758738 \h </w:instrText>
             </w:r>
             <w:r>
               <w:rPr>
@@ -1036,7 +1036,7 @@
               <w14:ligatures w14:val="standardContextual"/>
             </w:rPr>
           </w:pPr>
-          <w:hyperlink w:anchor="_Toc240712993" w:history="1">
+          <w:hyperlink w:anchor="_Toc240758739" w:history="1">
             <w:r>
               <w:rPr>
                 <w:rStyle w:val="Hyperlink"/>
@@ -1060,7 +1060,7 @@
               <w:rPr>
                 <w:noProof/>
               </w:rPr>
-              <w:instrText xml:space="preserve"> PAGEREF _Toc240712993 \h </w:instrText>
+              <w:instrText xml:space="preserve"> PAGEREF _Toc240758739 \h </w:instrText>
             </w:r>
             <w:r>
               <w:rPr>
@@ -1103,7 +1103,7 @@
               <w14:ligatures w14:val="standardContextual"/>
             </w:rPr>
           </w:pPr>
-          <w:hyperlink w:anchor="_Toc240712994" w:history="1">
+          <w:hyperlink w:anchor="_Toc240758740" w:history="1">
             <w:r>
               <w:rPr>
                 <w:rStyle w:val="Hyperlink"/>
@@ -1127,7 +1127,7 @@
               <w:rPr>
                 <w:noProof/>
               </w:rPr>
-              <w:instrText xml:space="preserve"> PAGEREF _Toc240712994 \h </w:instrText>
+              <w:instrText xml:space="preserve"> PAGEREF _Toc240758740 \h </w:instrText>
             </w:r>
             <w:r>
               <w:rPr>
@@ -1170,7 +1170,7 @@
               <w14:ligatures w14:val="standardContextual"/>
             </w:rPr>
           </w:pPr>
-          <w:hyperlink w:anchor="_Toc240712995" w:history="1">
+          <w:hyperlink w:anchor="_Toc240758741" w:history="1">
             <w:r>
               <w:rPr>
                 <w:rStyle w:val="Hyperlink"/>
@@ -1194,7 +1194,7 @@
               <w:rPr>
                 <w:noProof/>
               </w:rPr>
-              <w:instrText xml:space="preserve"> PAGEREF _Toc240712995 \h </w:instrText>
+              <w:instrText xml:space="preserve"> PAGEREF _Toc240758741 \h </w:instrText>
             </w:r>
             <w:r>
               <w:rPr>
@@ -1237,7 +1237,7 @@
               <w14:ligatures w14:val="standardContextual"/>
             </w:rPr>
           </w:pPr>
-          <w:hyperlink w:anchor="_Toc240712996" w:history="1">
+          <w:hyperlink w:anchor="_Toc240758742" w:history="1">
             <w:r>
               <w:rPr>
                 <w:rStyle w:val="Hyperlink"/>
@@ -1261,7 +1261,7 @@
               <w:rPr>
                 <w:noProof/>
               </w:rPr>
-              <w:instrText xml:space="preserve"> PAGEREF _Toc240712996 \h </w:instrText>
+              <w:instrText xml:space="preserve"> PAGEREF _Toc240758742 \h </w:instrText>
             </w:r>
             <w:r>
               <w:rPr>
@@ -1304,7 +1304,7 @@
               <w14:ligatures w14:val="standardContextual"/>
             </w:rPr>
           </w:pPr>
-          <w:hyperlink w:anchor="_Toc240712997" w:history="1">
+          <w:hyperlink w:anchor="_Toc240758743" w:history="1">
             <w:r>
               <w:rPr>
                 <w:rStyle w:val="Hyperlink"/>
@@ -1328,7 +1328,7 @@
               <w:rPr>
                 <w:noProof/>
               </w:rPr>
-              <w:instrText xml:space="preserve"> PAGEREF _Toc240712997 \h </w:instrText>
+              <w:instrText xml:space="preserve"> PAGEREF _Toc240758743 \h </w:instrText>
             </w:r>
             <w:r>
               <w:rPr>
@@ -1371,7 +1371,7 @@
               <w14:ligatures w14:val="standardContextual"/>
             </w:rPr>
           </w:pPr>
-          <w:hyperlink w:anchor="_Toc240712998" w:history="1">
+          <w:hyperlink w:anchor="_Toc240758744" w:history="1">
             <w:r>
               <w:rPr>
                 <w:rStyle w:val="Hyperlink"/>
@@ -1395,7 +1395,7 @@
               <w:rPr>
                 <w:noProof/>
               </w:rPr>
-              <w:instrText xml:space="preserve"> PAGEREF _Toc240712998 \h </w:instrText>
+              <w:instrText xml:space="preserve"> PAGEREF _Toc240758744 \h </w:instrText>
             </w:r>
             <w:r>
               <w:rPr>
@@ -1438,7 +1438,7 @@
               <w14:ligatures w14:val="standardContextual"/>
             </w:rPr>
           </w:pPr>
-          <w:hyperlink w:anchor="_Toc240712999" w:history="1">
+          <w:hyperlink w:anchor="_Toc240758745" w:history="1">
             <w:r>
               <w:rPr>
                 <w:rStyle w:val="Hyperlink"/>
@@ -1462,7 +1462,7 @@
               <w:rPr>
                 <w:noProof/>
               </w:rPr>
-              <w:instrText xml:space="preserve"> PAGEREF _Toc240712999 \h </w:instrText>
+              <w:instrText xml:space="preserve"> PAGEREF _Toc240758745 \h </w:instrText>
             </w:r>
             <w:r>
               <w:rPr>
@@ -1505,7 +1505,7 @@
               <w14:ligatures w14:val="standardContextual"/>
             </w:rPr>
           </w:pPr>
-          <w:hyperlink w:anchor="_Toc240713000" w:history="1">
+          <w:hyperlink w:anchor="_Toc240758746" w:history="1">
             <w:r>
               <w:rPr>
                 <w:rStyle w:val="Hyperlink"/>
@@ -1529,7 +1529,7 @@
               <w:rPr>
                 <w:noProof/>
               </w:rPr>
-              <w:instrText xml:space="preserve"> PAGEREF _Toc240713000 \h </w:instrText>
+              <w:instrText xml:space="preserve"> PAGEREF _Toc240758746 \h </w:instrText>
             </w:r>
             <w:r>
               <w:rPr>
@@ -1572,7 +1572,7 @@
               <w14:ligatures w14:val="standardContextual"/>
             </w:rPr>
           </w:pPr>
-          <w:hyperlink w:anchor="_Toc240713001" w:history="1">
+          <w:hyperlink w:anchor="_Toc240758747" w:history="1">
             <w:r>
               <w:rPr>
                 <w:rStyle w:val="Hyperlink"/>
@@ -1596,7 +1596,7 @@
               <w:rPr>
                 <w:noProof/>
               </w:rPr>
-              <w:instrText xml:space="preserve"> PAGEREF _Toc240713001 \h </w:instrText>
+              <w:instrText xml:space="preserve"> PAGEREF _Toc240758747 \h </w:instrText>
             </w:r>
             <w:r>
               <w:rPr>
@@ -1639,7 +1639,7 @@
               <w14:ligatures w14:val="standardContextual"/>
             </w:rPr>
           </w:pPr>
-          <w:hyperlink w:anchor="_Toc240713002" w:history="1">
+          <w:hyperlink w:anchor="_Toc240758748" w:history="1">
             <w:r>
               <w:rPr>
                 <w:rStyle w:val="Hyperlink"/>
@@ -1663,7 +1663,7 @@
               <w:rPr>
                 <w:noProof/>
               </w:rPr>
-              <w:instrText xml:space="preserve"> PAGEREF _Toc240713002 \h </w:instrText>
+              <w:instrText xml:space="preserve"> PAGEREF _Toc240758748 \h </w:instrText>
             </w:r>
             <w:r>
               <w:rPr>
@@ -1706,7 +1706,7 @@
               <w14:ligatures w14:val="standardContextual"/>
             </w:rPr>
           </w:pPr>
-          <w:hyperlink w:anchor="_Toc240713003" w:history="1">
+          <w:hyperlink w:anchor="_Toc240758749" w:history="1">
             <w:r>
               <w:rPr>
                 <w:rStyle w:val="Hyperlink"/>
@@ -1730,7 +1730,7 @@
               <w:rPr>
                 <w:noProof/>
               </w:rPr>
-              <w:instrText xml:space="preserve"> PAGEREF _Toc240713003 \h </w:instrText>
+              <w:instrText xml:space="preserve"> PAGEREF _Toc240758749 \h </w:instrText>
             </w:r>
             <w:r>
               <w:rPr>
@@ -1773,7 +1773,7 @@
               <w14:ligatures w14:val="standardContextual"/>
             </w:rPr>
           </w:pPr>
-          <w:hyperlink w:anchor="_Toc240713004" w:history="1">
+          <w:hyperlink w:anchor="_Toc240758750" w:history="1">
             <w:r>
               <w:rPr>
                 <w:rStyle w:val="Hyperlink"/>
@@ -1797,7 +1797,7 @@
               <w:rPr>
                 <w:noProof/>
               </w:rPr>
-              <w:instrText xml:space="preserve"> PAGEREF _Toc240713004 \h </w:instrText>
+              <w:instrText xml:space="preserve"> PAGEREF _Toc240758750 \h </w:instrText>
             </w:r>
             <w:r>
               <w:rPr>
@@ -1840,7 +1840,7 @@
               <w14:ligatures w14:val="standardContextual"/>
             </w:rPr>
           </w:pPr>
-          <w:hyperlink w:anchor="_Toc240713005" w:history="1">
+          <w:hyperlink w:anchor="_Toc240758751" w:history="1">
             <w:r>
               <w:rPr>
                 <w:rStyle w:val="Hyperlink"/>
@@ -1864,7 +1864,7 @@
               <w:rPr>
                 <w:noProof/>
               </w:rPr>
-              <w:instrText xml:space="preserve"> PAGEREF _Toc240713005 \h </w:instrText>
+              <w:instrText xml:space="preserve"> PAGEREF _Toc240758751 \h </w:instrText>
             </w:r>
             <w:r>
               <w:rPr>
@@ -1907,7 +1907,7 @@
               <w14:ligatures w14:val="standardContextual"/>
             </w:rPr>
           </w:pPr>
-          <w:hyperlink w:anchor="_Toc240713006" w:history="1">
+          <w:hyperlink w:anchor="_Toc240758752" w:history="1">
             <w:r>
               <w:rPr>
                 <w:rStyle w:val="Hyperlink"/>
@@ -1931,7 +1931,7 @@
               <w:rPr>
                 <w:noProof/>
               </w:rPr>
-              <w:instrText xml:space="preserve"> PAGEREF _Toc240713006 \h </w:instrText>
+              <w:instrText xml:space="preserve"> PAGEREF _Toc240758752 \h </w:instrText>
             </w:r>
             <w:r>
               <w:rPr>
@@ -1974,7 +1974,7 @@
               <w14:ligatures w14:val="standardContextual"/>
             </w:rPr>
           </w:pPr>
-          <w:hyperlink w:anchor="_Toc240713007" w:history="1">
+          <w:hyperlink w:anchor="_Toc240758753" w:history="1">
             <w:r>
               <w:rPr>
                 <w:rStyle w:val="Hyperlink"/>
@@ -1998,7 +1998,7 @@
               <w:rPr>
                 <w:noProof/>
               </w:rPr>
-              <w:instrText xml:space="preserve"> PAGEREF _Toc240713007 \h </w:instrText>
+              <w:instrText xml:space="preserve"> PAGEREF _Toc240758753 \h </w:instrText>
             </w:r>
             <w:r>
               <w:rPr>
@@ -2041,7 +2041,7 @@
               <w14:ligatures w14:val="standardContextual"/>
             </w:rPr>
           </w:pPr>
-          <w:hyperlink w:anchor="_Toc240713008" w:history="1">
+          <w:hyperlink w:anchor="_Toc240758754" w:history="1">
             <w:r>
               <w:rPr>
                 <w:rStyle w:val="Hyperlink"/>
@@ -2065,7 +2065,7 @@
               <w:rPr>
                 <w:noProof/>
               </w:rPr>
-              <w:instrText xml:space="preserve"> PAGEREF _Toc240713008 \h </w:instrText>
+              <w:instrText xml:space="preserve"> PAGEREF _Toc240758754 \h </w:instrText>
             </w:r>
             <w:r>
               <w:rPr>
@@ -2108,7 +2108,7 @@
               <w14:ligatures w14:val="standardContextual"/>
             </w:rPr>
           </w:pPr>
-          <w:hyperlink w:anchor="_Toc240713009" w:history="1">
+          <w:hyperlink w:anchor="_Toc240758755" w:history="1">
             <w:r>
               <w:rPr>
                 <w:rStyle w:val="Hyperlink"/>
@@ -2132,7 +2132,7 @@
               <w:rPr>
                 <w:noProof/>
               </w:rPr>
-              <w:instrText xml:space="preserve"> PAGEREF _Toc240713009 \h </w:instrText>
+              <w:instrText xml:space="preserve"> PAGEREF _Toc240758755 \h </w:instrText>
             </w:r>
             <w:r>
               <w:rPr>
@@ -2175,7 +2175,7 @@
               <w14:ligatures w14:val="standardContextual"/>
             </w:rPr>
           </w:pPr>
-          <w:hyperlink w:anchor="_Toc240713010" w:history="1">
+          <w:hyperlink w:anchor="_Toc240758756" w:history="1">
             <w:r>
               <w:rPr>
                 <w:rStyle w:val="Hyperlink"/>
@@ -2199,7 +2199,7 @@
               <w:rPr>
                 <w:noProof/>
               </w:rPr>
-              <w:instrText xml:space="preserve"> PAGEREF _Toc240713010 \h </w:instrText>
+              <w:instrText xml:space="preserve"> PAGEREF _Toc240758756 \h </w:instrText>
             </w:r>
             <w:r>
               <w:rPr>
@@ -2242,7 +2242,7 @@
               <w14:ligatures w14:val="standardContextual"/>
             </w:rPr>
           </w:pPr>
-          <w:hyperlink w:anchor="_Toc240713011" w:history="1">
+          <w:hyperlink w:anchor="_Toc240758757" w:history="1">
             <w:r>
               <w:rPr>
                 <w:rStyle w:val="Hyperlink"/>
@@ -2266,7 +2266,7 @@
               <w:rPr>
                 <w:noProof/>
               </w:rPr>
-              <w:instrText xml:space="preserve"> PAGEREF _Toc240713011 \h </w:instrText>
+              <w:instrText xml:space="preserve"> PAGEREF _Toc240758757 \h </w:instrText>
             </w:r>
             <w:r>
               <w:rPr>
@@ -2309,7 +2309,7 @@
               <w14:ligatures w14:val="standardContextual"/>
             </w:rPr>
           </w:pPr>
-          <w:hyperlink w:anchor="_Toc240713012" w:history="1">
+          <w:hyperlink w:anchor="_Toc240758758" w:history="1">
             <w:r>
               <w:rPr>
                 <w:rStyle w:val="Hyperlink"/>
@@ -2333,7 +2333,7 @@
               <w:rPr>
                 <w:noProof/>
               </w:rPr>
-              <w:instrText xml:space="preserve"> PAGEREF _Toc240713012 \h </w:instrText>
+              <w:instrText xml:space="preserve"> PAGEREF _Toc240758758 \h </w:instrText>
             </w:r>
             <w:r>
               <w:rPr>
@@ -2376,7 +2376,7 @@
               <w14:ligatures w14:val="standardContextual"/>
             </w:rPr>
           </w:pPr>
-          <w:hyperlink w:anchor="_Toc240713013" w:history="1">
+          <w:hyperlink w:anchor="_Toc240758759" w:history="1">
             <w:r>
               <w:rPr>
                 <w:rStyle w:val="Hyperlink"/>
@@ -2400,7 +2400,7 @@
               <w:rPr>
                 <w:noProof/>
               </w:rPr>
-              <w:instrText xml:space="preserve"> PAGEREF _Toc240713013 \h </w:instrText>
+              <w:instrText xml:space="preserve"> PAGEREF _Toc240758759 \h </w:instrText>
             </w:r>
             <w:r>
               <w:rPr>
@@ -2443,7 +2443,7 @@
               <w14:ligatures w14:val="standardContextual"/>
             </w:rPr>
           </w:pPr>
-          <w:hyperlink w:anchor="_Toc240713014" w:history="1">
+          <w:hyperlink w:anchor="_Toc240758760" w:history="1">
             <w:r>
               <w:rPr>
                 <w:rStyle w:val="Hyperlink"/>
@@ -2467,7 +2467,7 @@
               <w:rPr>
                 <w:noProof/>
               </w:rPr>
-              <w:instrText xml:space="preserve"> PAGEREF _Toc240713014 \h </w:instrText>
+              <w:instrText xml:space="preserve"> PAGEREF _Toc240758760 \h </w:instrText>
             </w:r>
             <w:r>
               <w:rPr>
@@ -2510,7 +2510,7 @@
               <w14:ligatures w14:val="standardContextual"/>
             </w:rPr>
           </w:pPr>
-          <w:hyperlink w:anchor="_Toc240713015" w:history="1">
+          <w:hyperlink w:anchor="_Toc240758761" w:history="1">
             <w:r>
               <w:rPr>
                 <w:rStyle w:val="Hyperlink"/>
@@ -2534,7 +2534,7 @@
               <w:rPr>
                 <w:noProof/>
               </w:rPr>
-              <w:instrText xml:space="preserve"> PAGEREF _Toc240713015 \h </w:instrText>
+              <w:instrText xml:space="preserve"> PAGEREF _Toc240758761 \h </w:instrText>
             </w:r>
             <w:r>
               <w:rPr>
@@ -2577,7 +2577,7 @@
               <w14:ligatures w14:val="standardContextual"/>
             </w:rPr>
           </w:pPr>
-          <w:hyperlink w:anchor="_Toc240713016" w:history="1">
+          <w:hyperlink w:anchor="_Toc240758762" w:history="1">
             <w:r>
               <w:rPr>
                 <w:rStyle w:val="Hyperlink"/>
@@ -2601,7 +2601,7 @@
               <w:rPr>
                 <w:noProof/>
               </w:rPr>
-              <w:instrText xml:space="preserve"> PAGEREF _Toc240713016 \h </w:instrText>
+              <w:instrText xml:space="preserve"> PAGEREF _Toc240758762 \h </w:instrText>
             </w:r>
             <w:r>
               <w:rPr>
@@ -2644,7 +2644,7 @@
               <w14:ligatures w14:val="standardContextual"/>
             </w:rPr>
           </w:pPr>
-          <w:hyperlink w:anchor="_Toc240713017" w:history="1">
+          <w:hyperlink w:anchor="_Toc240758763" w:history="1">
             <w:r>
               <w:rPr>
                 <w:rStyle w:val="Hyperlink"/>
@@ -2668,7 +2668,7 @@
               <w:rPr>
                 <w:noProof/>
               </w:rPr>
-              <w:instrText xml:space="preserve"> PAGEREF _Toc240713017 \h </w:instrText>
+              <w:instrText xml:space="preserve"> PAGEREF _Toc240758763 \h </w:instrText>
             </w:r>
             <w:r>
               <w:rPr>
@@ -2711,7 +2711,7 @@
               <w14:ligatures w14:val="standardContextual"/>
             </w:rPr>
           </w:pPr>
-          <w:hyperlink w:anchor="_Toc240713018" w:history="1">
+          <w:hyperlink w:anchor="_Toc240758764" w:history="1">
             <w:r>
               <w:rPr>
                 <w:rStyle w:val="Hyperlink"/>
@@ -2735,7 +2735,7 @@
               <w:rPr>
                 <w:noProof/>
               </w:rPr>
-              <w:instrText xml:space="preserve"> PAGEREF _Toc240713018 \h </w:instrText>
+              <w:instrText xml:space="preserve"> PAGEREF _Toc240758764 \h </w:instrText>
             </w:r>
             <w:r>
               <w:rPr>
@@ -2778,7 +2778,7 @@
               <w14:ligatures w14:val="standardContextual"/>
             </w:rPr>
           </w:pPr>
-          <w:hyperlink w:anchor="_Toc240713019" w:history="1">
+          <w:hyperlink w:anchor="_Toc240758765" w:history="1">
             <w:r>
               <w:rPr>
                 <w:rStyle w:val="Hyperlink"/>
@@ -2802,7 +2802,7 @@
               <w:rPr>
                 <w:noProof/>
               </w:rPr>
-              <w:instrText xml:space="preserve"> PAGEREF _Toc240713019 \h </w:instrText>
+              <w:instrText xml:space="preserve"> PAGEREF _Toc240758765 \h </w:instrText>
             </w:r>
             <w:r>
               <w:rPr>
@@ -2845,7 +2845,7 @@
               <w14:ligatures w14:val="standardContextual"/>
             </w:rPr>
           </w:pPr>
-          <w:hyperlink w:anchor="_Toc240713020" w:history="1">
+          <w:hyperlink w:anchor="_Toc240758766" w:history="1">
             <w:r>
               <w:rPr>
                 <w:rStyle w:val="Hyperlink"/>
@@ -2869,7 +2869,7 @@
               <w:rPr>
                 <w:noProof/>
               </w:rPr>
-              <w:instrText xml:space="preserve"> PAGEREF _Toc240713020 \h </w:instrText>
+              <w:instrText xml:space="preserve"> PAGEREF _Toc240758766 \h </w:instrText>
             </w:r>
             <w:r>
               <w:rPr>
@@ -2912,7 +2912,7 @@
               <w14:ligatures w14:val="standardContextual"/>
             </w:rPr>
           </w:pPr>
-          <w:hyperlink w:anchor="_Toc240713021" w:history="1">
+          <w:hyperlink w:anchor="_Toc240758767" w:history="1">
             <w:r>
               <w:rPr>
                 <w:rStyle w:val="Hyperlink"/>
@@ -2936,7 +2936,7 @@
               <w:rPr>
                 <w:noProof/>
               </w:rPr>
-              <w:instrText xml:space="preserve"> PAGEREF _Toc240713021 \h </w:instrText>
+              <w:instrText xml:space="preserve"> PAGEREF _Toc240758767 \h </w:instrText>
             </w:r>
             <w:r>
               <w:rPr>
@@ -2979,7 +2979,7 @@
               <w14:ligatures w14:val="standardContextual"/>
             </w:rPr>
           </w:pPr>
-          <w:hyperlink w:anchor="_Toc240713022" w:history="1">
+          <w:hyperlink w:anchor="_Toc240758768" w:history="1">
             <w:r>
               <w:rPr>
                 <w:rStyle w:val="Hyperlink"/>
@@ -3003,7 +3003,7 @@
               <w:rPr>
                 <w:noProof/>
               </w:rPr>
-              <w:instrText xml:space="preserve"> PAGEREF _Toc240713022 \h </w:instrText>
+              <w:instrText xml:space="preserve"> PAGEREF _Toc240758768 \h </w:instrText>
             </w:r>
             <w:r>
               <w:rPr>
@@ -3046,7 +3046,7 @@
               <w14:ligatures w14:val="standardContextual"/>
             </w:rPr>
           </w:pPr>
-          <w:hyperlink w:anchor="_Toc240713023" w:history="1">
+          <w:hyperlink w:anchor="_Toc240758769" w:history="1">
             <w:r>
               <w:rPr>
                 <w:rStyle w:val="Hyperlink"/>
@@ -3070,7 +3070,7 @@
               <w:rPr>
                 <w:noProof/>
               </w:rPr>
-              <w:instrText xml:space="preserve"> PAGEREF _Toc240713023 \h </w:instrText>
+              <w:instrText xml:space="preserve"> PAGEREF _Toc240758769 \h </w:instrText>
             </w:r>
             <w:r>
               <w:rPr>
@@ -3113,7 +3113,7 @@
               <w14:ligatures w14:val="standardContextual"/>
             </w:rPr>
           </w:pPr>
-          <w:hyperlink w:anchor="_Toc240713024" w:history="1">
+          <w:hyperlink w:anchor="_Toc240758770" w:history="1">
             <w:r>
               <w:rPr>
                 <w:rStyle w:val="Hyperlink"/>
@@ -3137,7 +3137,7 @@
               <w:rPr>
                 <w:noProof/>
               </w:rPr>
-              <w:instrText xml:space="preserve"> PAGEREF _Toc240713024 \h </w:instrText>
+              <w:instrText xml:space="preserve"> PAGEREF _Toc240758770 \h </w:instrText>
             </w:r>
             <w:r>
               <w:rPr>
@@ -3180,7 +3180,7 @@
               <w14:ligatures w14:val="standardContextual"/>
             </w:rPr>
           </w:pPr>
-          <w:hyperlink w:anchor="_Toc240713025" w:history="1">
+          <w:hyperlink w:anchor="_Toc240758771" w:history="1">
             <w:r>
               <w:rPr>
                 <w:rStyle w:val="Hyperlink"/>
@@ -3204,7 +3204,7 @@
               <w:rPr>
                 <w:noProof/>
               </w:rPr>
-              <w:instrText xml:space="preserve"> PAGEREF _Toc240713025 \h </w:instrText>
+              <w:instrText xml:space="preserve"> PAGEREF _Toc240758771 \h </w:instrText>
             </w:r>
             <w:r>
               <w:rPr>
@@ -3247,7 +3247,7 @@
               <w14:ligatures w14:val="standardContextual"/>
             </w:rPr>
           </w:pPr>
-          <w:hyperlink w:anchor="_Toc240713026" w:history="1">
+          <w:hyperlink w:anchor="_Toc240758772" w:history="1">
             <w:r>
               <w:rPr>
                 <w:rStyle w:val="Hyperlink"/>
@@ -3271,7 +3271,7 @@
               <w:rPr>
                 <w:noProof/>
               </w:rPr>
-              <w:instrText xml:space="preserve"> PAGEREF _Toc240713026 \h </w:instrText>
+              <w:instrText xml:space="preserve"> PAGEREF _Toc240758772 \h </w:instrText>
             </w:r>
             <w:r>
               <w:rPr>
@@ -3310,7 +3310,7 @@
         <w:pStyle w:val="Heading1"/>
         <w:pageBreakBefore/>
       </w:pPr>
-      <w:bookmarkStart w:id="0" w:name="_Toc240712986"/>
+      <w:bookmarkStart w:id="0" w:name="_Toc240758732"/>
       <w:r>
         <w:lastRenderedPageBreak/>
         <w:t>1. Welcome</w:t>
@@ -3339,7 +3339,7 @@
       <w:pPr>
         <w:pStyle w:val="Heading2"/>
       </w:pPr>
-      <w:bookmarkStart w:id="1" w:name="_Toc240712987"/>
+      <w:bookmarkStart w:id="1" w:name="_Toc240758733"/>
       <w:r>
         <w:t>How to use this manual</w:t>
       </w:r>
@@ -3406,7 +3406,7 @@
       <w:pPr>
         <w:pStyle w:val="Heading2"/>
       </w:pPr>
-      <w:bookmarkStart w:id="2" w:name="_Toc240712988"/>
+      <w:bookmarkStart w:id="2" w:name="_Toc240758734"/>
       <w:r>
         <w:t>Who to contact</w:t>
       </w:r>
@@ -3624,7 +3624,7 @@
         <w:pStyle w:val="Heading1"/>
         <w:pageBreakBefore/>
       </w:pPr>
-      <w:bookmarkStart w:id="3" w:name="_Toc240712989"/>
+      <w:bookmarkStart w:id="3" w:name="_Toc240758735"/>
       <w:r>
         <w:lastRenderedPageBreak/>
         <w:t>2. The study</w:t>
@@ -4220,7 +4220,7 @@
       <w:pPr>
         <w:pStyle w:val="Heading2"/>
       </w:pPr>
-      <w:bookmarkStart w:id="4" w:name="_Toc240712990"/>
+      <w:bookmarkStart w:id="4" w:name="_Toc240758736"/>
       <w:r>
         <w:t>Explaining the study in two minutes</w:t>
       </w:r>
@@ -4239,7 +4239,7 @@
         <w:pStyle w:val="Heading1"/>
         <w:pageBreakBefore/>
       </w:pPr>
-      <w:bookmarkStart w:id="5" w:name="_Toc240712991"/>
+      <w:bookmarkStart w:id="5" w:name="_Toc240758737"/>
       <w:r>
         <w:lastRenderedPageBreak/>
         <w:t>3. Ethics and data protection</w:t>
@@ -4250,7 +4250,7 @@
       <w:pPr>
         <w:pStyle w:val="Heading2"/>
       </w:pPr>
-      <w:bookmarkStart w:id="6" w:name="_Toc240712992"/>
+      <w:bookmarkStart w:id="6" w:name="_Toc240758738"/>
       <w:r>
         <w:t>3.1 Principles you must apply</w:t>
       </w:r>
@@ -4700,7 +4700,7 @@
       <w:pPr>
         <w:pStyle w:val="Heading2"/>
       </w:pPr>
-      <w:bookmarkStart w:id="7" w:name="_Toc240712993"/>
+      <w:bookmarkStart w:id="7" w:name="_Toc240758739"/>
       <w:r>
         <w:t>3.2 What respondents are told (PIS v1.3, summary)</w:t>
       </w:r>
@@ -4806,7 +4806,7 @@
       <w:pPr>
         <w:pStyle w:val="Heading2"/>
       </w:pPr>
-      <w:bookmarkStart w:id="8" w:name="_Toc240712994"/>
+      <w:bookmarkStart w:id="8" w:name="_Toc240758740"/>
       <w:r>
         <w:t>3.3 Data protection rules</w:t>
       </w:r>
@@ -4938,7 +4938,7 @@
       <w:pPr>
         <w:pStyle w:val="Heading2"/>
       </w:pPr>
-      <w:bookmarkStart w:id="9" w:name="_Toc240712995"/>
+      <w:bookmarkStart w:id="9" w:name="_Toc240758741"/>
       <w:r>
         <w:t>3.4 Your devices</w:t>
       </w:r>
@@ -5018,7 +5018,7 @@
       <w:pPr>
         <w:pStyle w:val="Heading2"/>
       </w:pPr>
-      <w:bookmarkStart w:id="10" w:name="_Toc240712996"/>
+      <w:bookmarkStart w:id="10" w:name="_Toc240758742"/>
       <w:r>
         <w:t>3.5 Conduct</w:t>
       </w:r>
@@ -5099,7 +5099,7 @@
         <w:pStyle w:val="Heading1"/>
         <w:pageBreakBefore/>
       </w:pPr>
-      <w:bookmarkStart w:id="11" w:name="_Toc240712997"/>
+      <w:bookmarkStart w:id="11" w:name="_Toc240758743"/>
       <w:r>
         <w:lastRenderedPageBreak/>
         <w:t>4. The portal and the forms</w:t>
@@ -5110,7 +5110,7 @@
       <w:pPr>
         <w:pStyle w:val="Heading2"/>
       </w:pPr>
-      <w:bookmarkStart w:id="12" w:name="_Toc240712998"/>
+      <w:bookmarkStart w:id="12" w:name="_Toc240758744"/>
       <w:r>
         <w:t>Signing in</w:t>
       </w:r>
@@ -5193,7 +5193,7 @@
           <w:noProof/>
         </w:rPr>
         <w:drawing>
-          <wp:inline distT="0" distB="0" distL="0" distR="0" wp14:anchorId="584E4CB5" wp14:editId="4EE1A853">
+          <wp:inline distT="0" distB="0" distL="0" distR="0" wp14:anchorId="29C547B4" wp14:editId="105C91DF">
             <wp:extent cx="5334000" cy="2333625"/>
             <wp:effectExtent l="0" t="0" r="0" b="0"/>
             <wp:docPr id="1" name="adm_login.jpg" descr="The sign-in screen for all internal staff." title="The sign-in screen for all internal staff."/>
@@ -5360,7 +5360,7 @@
       <w:pPr>
         <w:pStyle w:val="Heading2"/>
       </w:pPr>
-      <w:bookmarkStart w:id="13" w:name="_Toc240712999"/>
+      <w:bookmarkStart w:id="13" w:name="_Toc240758745"/>
       <w:r>
         <w:t>Finding your way around</w:t>
       </w:r>
@@ -5535,7 +5535,7 @@
         </w:rPr>
         <w:lastRenderedPageBreak/>
         <w:drawing>
-          <wp:inline distT="0" distB="0" distL="0" distR="0" wp14:anchorId="4203598F" wp14:editId="158FA1E3">
+          <wp:inline distT="0" distB="0" distL="0" distR="0" wp14:anchorId="4A54C472" wp14:editId="3101183D">
             <wp:extent cx="5715000" cy="1876425"/>
             <wp:effectExtent l="0" t="0" r="0" b="0"/>
             <wp:docPr id="2" name="adm_not_your_role.jpg" descr="Opening a screen outside your role (for example from an old bookmark) shows this card instead of the screen." title="Opening a screen outside your role (for example from an old bookmark) shows this card instead of the screen."/>
@@ -5604,7 +5604,7 @@
       <w:pPr>
         <w:pStyle w:val="Heading2"/>
       </w:pPr>
-      <w:bookmarkStart w:id="14" w:name="_Toc240713000"/>
+      <w:bookmarkStart w:id="14" w:name="_Toc240758746"/>
       <w:r>
         <w:t>Roles</w:t>
       </w:r>
@@ -6386,7 +6386,7 @@
       <w:pPr>
         <w:pStyle w:val="Heading2"/>
       </w:pPr>
-      <w:bookmarkStart w:id="15" w:name="_Toc240713001"/>
+      <w:bookmarkStart w:id="15" w:name="_Toc240758747"/>
       <w:r>
         <w:t>Case statuses you will see</w:t>
       </w:r>
@@ -7901,7 +7901,7 @@
       <w:pPr>
         <w:pStyle w:val="Heading2"/>
       </w:pPr>
-      <w:bookmarkStart w:id="16" w:name="_Toc240713002"/>
+      <w:bookmarkStart w:id="16" w:name="_Toc240758748"/>
       <w:r>
         <w:t>The KoboToolbox forms</w:t>
       </w:r>
@@ -8345,7 +8345,7 @@
         <w:pStyle w:val="Heading1"/>
         <w:pageBreakBefore/>
       </w:pPr>
-      <w:bookmarkStart w:id="17" w:name="_Toc240713003"/>
+      <w:bookmarkStart w:id="17" w:name="_Toc240758749"/>
       <w:r>
         <w:lastRenderedPageBreak/>
         <w:t>5. Communication scripts</w:t>
@@ -8356,7 +8356,7 @@
       <w:pPr>
         <w:pStyle w:val="Heading2"/>
       </w:pPr>
-      <w:bookmarkStart w:id="18" w:name="_Toc240713004"/>
+      <w:bookmarkStart w:id="18" w:name="_Toc240758750"/>
       <w:r>
         <w:t>5.1 First phone call</w:t>
       </w:r>
@@ -8436,7 +8436,7 @@
       <w:pPr>
         <w:pStyle w:val="Heading2"/>
       </w:pPr>
-      <w:bookmarkStart w:id="19" w:name="_Toc240713005"/>
+      <w:bookmarkStart w:id="19" w:name="_Toc240758751"/>
       <w:r>
         <w:t>5.2 If they are busy</w:t>
       </w:r>
@@ -8454,7 +8454,7 @@
       <w:pPr>
         <w:pStyle w:val="Heading2"/>
       </w:pPr>
-      <w:bookmarkStart w:id="20" w:name="_Toc240713006"/>
+      <w:bookmarkStart w:id="20" w:name="_Toc240758752"/>
       <w:r>
         <w:t>5.3 Voicemail or no answer</w:t>
       </w:r>
@@ -8472,7 +8472,7 @@
       <w:pPr>
         <w:pStyle w:val="Heading2"/>
       </w:pPr>
-      <w:bookmarkStart w:id="21" w:name="_Toc240713007"/>
+      <w:bookmarkStart w:id="21" w:name="_Toc240758753"/>
       <w:r>
         <w:t>5.4 Common questions</w:t>
       </w:r>
@@ -8922,7 +8922,7 @@
       <w:pPr>
         <w:pStyle w:val="Heading2"/>
       </w:pPr>
-      <w:bookmarkStart w:id="22" w:name="_Toc240713008"/>
+      <w:bookmarkStart w:id="22" w:name="_Toc240758754"/>
       <w:r>
         <w:t>5.5 Refusals and withdrawals</w:t>
       </w:r>
@@ -8941,7 +8941,7 @@
         <w:pStyle w:val="Heading1"/>
         <w:pageBreakBefore/>
       </w:pPr>
-      <w:bookmarkStart w:id="23" w:name="_Toc240713009"/>
+      <w:bookmarkStart w:id="23" w:name="_Toc240758755"/>
       <w:r>
         <w:lastRenderedPageBreak/>
         <w:t>6. Role modules</w:t>
@@ -8960,7 +8960,7 @@
       <w:pPr>
         <w:pStyle w:val="Heading2"/>
       </w:pPr>
-      <w:bookmarkStart w:id="24" w:name="_Toc240713010"/>
+      <w:bookmarkStart w:id="24" w:name="_Toc240758756"/>
       <w:r>
         <w:t>Module A — Contact RA</w:t>
       </w:r>
@@ -9101,7 +9101,7 @@
           <w:noProof/>
         </w:rPr>
         <w:drawing>
-          <wp:inline distT="0" distB="0" distL="0" distR="0" wp14:anchorId="42423A43" wp14:editId="01C1EA0B">
+          <wp:inline distT="0" distB="0" distL="0" distR="0" wp14:anchorId="120BB94D" wp14:editId="66D069FB">
             <wp:extent cx="5334000" cy="2114550"/>
             <wp:effectExtent l="0" t="0" r="0" b="0"/>
             <wp:docPr id="3" name="adm_case_add_person.jpg" descr="Adding a person to a case." title="Adding a person to a case."/>
@@ -9476,7 +9476,7 @@
         </w:rPr>
         <w:lastRenderedPageBreak/>
         <w:drawing>
-          <wp:inline distT="0" distB="0" distL="0" distR="0" wp14:anchorId="073C6956" wp14:editId="33A1CAB5">
+          <wp:inline distT="0" distB="0" distL="0" distR="0" wp14:anchorId="647EA610" wp14:editId="69B59285">
             <wp:extent cx="5334000" cy="1143000"/>
             <wp:effectExtent l="0" t="0" r="0" b="0"/>
             <wp:docPr id="4" name="cra_case_invitations_before.jpg" descr="Invitations panel before sending, with the history of earlier invitations." title="Invitations panel before sending, with the history of earlier invitations."/>
@@ -9605,7 +9605,7 @@
           <w:noProof/>
         </w:rPr>
         <w:drawing>
-          <wp:inline distT="0" distB="0" distL="0" distR="0" wp14:anchorId="60EA50A4" wp14:editId="18249ECD">
+          <wp:inline distT="0" distB="0" distL="0" distR="0" wp14:anchorId="75C2E8EE" wp14:editId="516EF2E3">
             <wp:extent cx="5334000" cy="2152650"/>
             <wp:effectExtent l="0" t="0" r="0" b="0"/>
             <wp:docPr id="5" name="cra_case_invitation_sent.jpg" descr="The link, manual code and ready-written messages are shown once, with a send button for each channel." title="The link, manual code and ready-written messages are shown once, with a send button for each channel."/>
@@ -10045,7 +10045,7 @@
           <w:noProof/>
         </w:rPr>
         <w:drawing>
-          <wp:inline distT="0" distB="0" distL="0" distR="0" wp14:anchorId="4FECD9F7" wp14:editId="4C72BB1C">
+          <wp:inline distT="0" distB="0" distL="0" distR="0" wp14:anchorId="2868D531" wp14:editId="58C793C3">
             <wp:extent cx="5334000" cy="1343025"/>
             <wp:effectExtent l="0" t="0" r="0" b="0"/>
             <wp:docPr id="6" name="adm_case_timeline.jpg" descr="Contact timeline and the form for logging an attempt." title="Contact timeline and the form for logging an attempt."/>
@@ -10255,7 +10255,7 @@
         </w:rPr>
         <w:lastRenderedPageBreak/>
         <w:drawing>
-          <wp:inline distT="0" distB="0" distL="0" distR="0" wp14:anchorId="68810DF7" wp14:editId="3A01B30B">
+          <wp:inline distT="0" distB="0" distL="0" distR="0" wp14:anchorId="7B7C8D4F" wp14:editId="7445F7FF">
             <wp:extent cx="5334000" cy="3333750"/>
             <wp:effectExtent l="0" t="0" r="0" b="0"/>
             <wp:docPr id="7" name="cra_follow_ups.jpg" descr="Follow-ups due. Contact RAs see only their own cases." title="Follow-ups due. Contact RAs see only their own cases."/>
@@ -10519,7 +10519,7 @@
           <w:noProof/>
         </w:rPr>
         <w:drawing>
-          <wp:inline distT="0" distB="0" distL="0" distR="0" wp14:anchorId="6E3E7F91" wp14:editId="6EB0BDF5">
+          <wp:inline distT="0" distB="0" distL="0" distR="0" wp14:anchorId="3B47EBD8" wp14:editId="512FA133">
             <wp:extent cx="5334000" cy="2667000"/>
             <wp:effectExtent l="0" t="0" r="0" b="0"/>
             <wp:docPr id="8" name="cra_appointments.jpg" descr="Appointment Queue." title="Appointment Queue."/>
@@ -11428,7 +11428,7 @@
       <w:pPr>
         <w:pStyle w:val="Heading2"/>
       </w:pPr>
-      <w:bookmarkStart w:id="25" w:name="_Toc240713011"/>
+      <w:bookmarkStart w:id="25" w:name="_Toc240758757"/>
       <w:r>
         <w:t>Module B — QUAN/Kobo QA RA</w:t>
       </w:r>
@@ -11477,7 +11477,7 @@
         </w:rPr>
         <w:lastRenderedPageBreak/>
         <w:drawing>
-          <wp:inline distT="0" distB="0" distL="0" distR="0" wp14:anchorId="0D744995" wp14:editId="41378A0F">
+          <wp:inline distT="0" distB="0" distL="0" distR="0" wp14:anchorId="2B47F24D" wp14:editId="02274679">
             <wp:extent cx="5334000" cy="3333750"/>
             <wp:effectExtent l="0" t="0" r="0" b="0"/>
             <wp:docPr id="9" name="qa_queue.jpg" descr="QUAN QA Queue with the KoboToolbox sync panel." title="QUAN QA Queue with the KoboToolbox sync panel."/>
@@ -12278,7 +12278,7 @@
           <w:noProof/>
         </w:rPr>
         <w:drawing>
-          <wp:inline distT="0" distB="0" distL="0" distR="0" wp14:anchorId="0AB82C62" wp14:editId="568B514A">
+          <wp:inline distT="0" distB="0" distL="0" distR="0" wp14:anchorId="37C742E9" wp14:editId="725EABE7">
             <wp:extent cx="5334000" cy="3333750"/>
             <wp:effectExtent l="0" t="0" r="0" b="0"/>
             <wp:docPr id="10" name="qa_exceptions.jpg" descr="QA Exception Queue." title="QA Exception Queue."/>
@@ -12539,7 +12539,7 @@
       <w:pPr>
         <w:pStyle w:val="Heading2"/>
       </w:pPr>
-      <w:bookmarkStart w:id="26" w:name="_Toc240713012"/>
+      <w:bookmarkStart w:id="26" w:name="_Toc240758758"/>
       <w:r>
         <w:t>Module C — KII RA</w:t>
       </w:r>
@@ -12588,7 +12588,7 @@
         </w:rPr>
         <w:lastRenderedPageBreak/>
         <w:drawing>
-          <wp:inline distT="0" distB="0" distL="0" distR="0" wp14:anchorId="39BA6BBC" wp14:editId="3FC3DBB2">
+          <wp:inline distT="0" distB="0" distL="0" distR="0" wp14:anchorId="34F5A3CC" wp14:editId="4E998BB8">
             <wp:extent cx="5334000" cy="2667000"/>
             <wp:effectExtent l="0" t="0" r="0" b="0"/>
             <wp:docPr id="11" name="kii_new.jpg" descr="New KII Record." title="New KII Record."/>
@@ -12773,7 +12773,7 @@
           <w:noProof/>
         </w:rPr>
         <w:drawing>
-          <wp:inline distT="0" distB="0" distL="0" distR="0" wp14:anchorId="57D011AE" wp14:editId="64432E21">
+          <wp:inline distT="0" distB="0" distL="0" distR="0" wp14:anchorId="7391FE0A" wp14:editId="42CBAA90">
             <wp:extent cx="5334000" cy="3333750"/>
             <wp:effectExtent l="0" t="0" r="0" b="0"/>
             <wp:docPr id="12" name="kii_register.jpg" descr="KII Register." title="KII Register."/>
@@ -12873,7 +12873,7 @@
         </w:rPr>
         <w:lastRenderedPageBreak/>
         <w:drawing>
-          <wp:inline distT="0" distB="0" distL="0" distR="0" wp14:anchorId="004D93BD" wp14:editId="3B2974C7">
+          <wp:inline distT="0" distB="0" distL="0" distR="0" wp14:anchorId="1A5B2391" wp14:editId="35702F91">
             <wp:extent cx="5334000" cy="3752850"/>
             <wp:effectExtent l="0" t="0" r="0" b="0"/>
             <wp:docPr id="13" name="kii_detail.jpg" descr="KII record: status, consent, transcript and coding." title="KII record: status, consent, transcript and coding."/>
@@ -13067,7 +13067,37 @@
         <w:t>Completed KII form (KoboToolbox)</w:t>
       </w:r>
       <w:r>
-        <w:t xml:space="preserve"> panel then links to its PDF.</w:t>
+        <w:t xml:space="preserve"> panel then links to its PDF, and at the next sync (within 15 minutes, or at once with </w:t>
+      </w:r>
+      <w:r>
+        <w:rPr>
+          <w:b/>
+          <w:bCs/>
+        </w:rPr>
+        <w:t>Sync now</w:t>
+      </w:r>
+      <w:r>
+        <w:t xml:space="preserve"> on </w:t>
+      </w:r>
+      <w:r>
+        <w:rPr>
+          <w:b/>
+          <w:bCs/>
+        </w:rPr>
+        <w:t>Form PDFs</w:t>
+      </w:r>
+      <w:r>
+        <w:t xml:space="preserve">) the portal sets </w:t>
+      </w:r>
+      <w:r>
+        <w:rPr>
+          <w:b/>
+          <w:bCs/>
+        </w:rPr>
+        <w:t>Coding</w:t>
+      </w:r>
+      <w:r>
+        <w:t xml:space="preserve"> to COMPLETE for you.</w:t>
       </w:r>
     </w:p>
     <w:p>
@@ -13127,7 +13157,7 @@
           <w:noProof/>
         </w:rPr>
         <w:drawing>
-          <wp:inline distT="0" distB="0" distL="0" distR="0" wp14:anchorId="4071DC32" wp14:editId="6B195396">
+          <wp:inline distT="0" distB="0" distL="0" distR="0" wp14:anchorId="2BDDA8DD" wp14:editId="71A4024B">
             <wp:extent cx="5334000" cy="523875"/>
             <wp:effectExtent l="0" t="0" r="0" b="0"/>
             <wp:docPr id="14" name="kii_coding_locked.jpg" descr="Before consent: no interview link." title="Before consent: no interview link."/>
@@ -13225,8 +13255,9 @@
         <w:rPr>
           <w:noProof/>
         </w:rPr>
+        <w:lastRenderedPageBreak/>
         <w:drawing>
-          <wp:inline distT="0" distB="0" distL="0" distR="0" wp14:anchorId="45A89123" wp14:editId="6ED4B810">
+          <wp:inline distT="0" distB="0" distL="0" distR="0" wp14:anchorId="3BF8F98C" wp14:editId="598A44E7">
             <wp:extent cx="5334000" cy="742950"/>
             <wp:effectExtent l="0" t="0" r="0" b="0"/>
             <wp:docPr id="15" name="kii_coding_ready.jpg" descr="After consent: Continue this interview." title="After consent: Continue this interview."/>
@@ -13301,7 +13332,6 @@
         <w:spacing w:after="80" w:line="276" w:lineRule="auto"/>
       </w:pPr>
       <w:r>
-        <w:lastRenderedPageBreak/>
         <w:t>Complete the interview in the form as usual.</w:t>
       </w:r>
     </w:p>
@@ -13462,7 +13492,7 @@
       <w:pPr>
         <w:pStyle w:val="Heading2"/>
       </w:pPr>
-      <w:bookmarkStart w:id="27" w:name="_Toc240713013"/>
+      <w:bookmarkStart w:id="27" w:name="_Toc240758759"/>
       <w:r>
         <w:t>Module D — Documentary RA</w:t>
       </w:r>
@@ -13510,7 +13540,7 @@
           <w:noProof/>
         </w:rPr>
         <w:drawing>
-          <wp:inline distT="0" distB="0" distL="0" distR="0" wp14:anchorId="71A64189" wp14:editId="122D0B33">
+          <wp:inline distT="0" distB="0" distL="0" distR="0" wp14:anchorId="288231FA" wp14:editId="25C4186B">
             <wp:extent cx="5334000" cy="3171825"/>
             <wp:effectExtent l="0" t="0" r="0" b="0"/>
             <wp:docPr id="16" name="doc_new.jpg" descr="New Documentary Evidence Record." title="New Documentary Evidence Record."/>
@@ -13585,6 +13615,7 @@
         <w:spacing w:after="80" w:line="276" w:lineRule="auto"/>
       </w:pPr>
       <w:r>
+        <w:lastRenderedPageBreak/>
         <w:t xml:space="preserve">Enter </w:t>
       </w:r>
       <w:r>
@@ -13668,7 +13699,6 @@
         <w:pStyle w:val="Heading3"/>
       </w:pPr>
       <w:r>
-        <w:lastRenderedPageBreak/>
         <w:t>Attaching the source file, and removing a wrong one</w:t>
       </w:r>
     </w:p>
@@ -13716,7 +13746,7 @@
           <w:noProof/>
         </w:rPr>
         <w:drawing>
-          <wp:inline distT="0" distB="0" distL="0" distR="0" wp14:anchorId="651362B1" wp14:editId="33BDFEDD">
+          <wp:inline distT="0" distB="0" distL="0" distR="0" wp14:anchorId="6EE9771E" wp14:editId="0D8BA739">
             <wp:extent cx="5334000" cy="819150"/>
             <wp:effectExtent l="0" t="0" r="0" b="0"/>
             <wp:docPr id="17" name="doc_source_file.jpg" descr="Source file: the file name, size and date, with Remove file beside it." title="Source file: the file name, size and date, with Remove file beside it."/>
@@ -13967,7 +13997,7 @@
           <w:noProof/>
         </w:rPr>
         <w:drawing>
-          <wp:inline distT="0" distB="0" distL="0" distR="0" wp14:anchorId="1AE7209B" wp14:editId="2FDA9641">
+          <wp:inline distT="0" distB="0" distL="0" distR="0" wp14:anchorId="419AE9C8" wp14:editId="6F0780B5">
             <wp:extent cx="5334000" cy="3333750"/>
             <wp:effectExtent l="0" t="0" r="0" b="0"/>
             <wp:docPr id="18" name="doc_register.jpg" descr="Documentary Evidence Corpus." title="Documentary Evidence Corpus."/>
@@ -14042,6 +14072,7 @@
         <w:spacing w:after="80" w:line="276" w:lineRule="auto"/>
       </w:pPr>
       <w:r>
+        <w:lastRenderedPageBreak/>
         <w:t xml:space="preserve">Assess authenticity: select </w:t>
       </w:r>
       <w:r>
@@ -14075,9 +14106,8 @@
         <w:rPr>
           <w:noProof/>
         </w:rPr>
-        <w:lastRenderedPageBreak/>
         <w:drawing>
-          <wp:inline distT="0" distB="0" distL="0" distR="0" wp14:anchorId="6FC2FB13" wp14:editId="26270256">
+          <wp:inline distT="0" distB="0" distL="0" distR="0" wp14:anchorId="0DE1A4E8" wp14:editId="24800338">
             <wp:extent cx="5334000" cy="3419475"/>
             <wp:effectExtent l="0" t="0" r="0" b="0"/>
             <wp:docPr id="19" name="doc_detail.jpg" descr="Document record: authenticity, QA status, memo and coding form." title="Document record: authenticity, QA status, memo and coding form."/>
@@ -14556,7 +14586,7 @@
           <w:noProof/>
         </w:rPr>
         <w:drawing>
-          <wp:inline distT="0" distB="0" distL="0" distR="0" wp14:anchorId="41916F97" wp14:editId="0372BF3D">
+          <wp:inline distT="0" distB="0" distL="0" distR="0" wp14:anchorId="5E0831E4" wp14:editId="7B6EDAA8">
             <wp:extent cx="5715000" cy="904875"/>
             <wp:effectExtent l="0" t="0" r="0" b="0"/>
             <wp:docPr id="20" name="doc_coding_buttons.jpg" descr="The Coding panel: Code this document, and Auto-fill." title="The Coding panel: Code this document, and Auto-fill."/>
@@ -14709,7 +14739,7 @@
           <w:noProof/>
         </w:rPr>
         <w:drawing>
-          <wp:inline distT="0" distB="0" distL="0" distR="0" wp14:anchorId="641F304B" wp14:editId="1B8CA2BC">
+          <wp:inline distT="0" distB="0" distL="0" distR="0" wp14:anchorId="66C74F46" wp14:editId="07390E2B">
             <wp:extent cx="5334000" cy="2171700"/>
             <wp:effectExtent l="0" t="0" r="0" b="0"/>
             <wp:docPr id="21" name="doc_autofill_pages.jpg" descr="A 240-page PDF asks for a page range." title="A 240-page PDF asks for a page range."/>
@@ -14808,7 +14838,7 @@
           <w:noProof/>
         </w:rPr>
         <w:drawing>
-          <wp:inline distT="0" distB="0" distL="0" distR="0" wp14:anchorId="7D4BD8F0" wp14:editId="61CE7CCD">
+          <wp:inline distT="0" distB="0" distL="0" distR="0" wp14:anchorId="32E14404" wp14:editId="06FB105E">
             <wp:extent cx="5334000" cy="1752600"/>
             <wp:effectExtent l="0" t="0" r="0" b="0"/>
             <wp:docPr id="22" name="doc_autofill_running.jpg" descr="The AI is reading the document." title="The AI is reading the document."/>
@@ -14898,7 +14928,7 @@
         </w:rPr>
         <w:lastRenderedPageBreak/>
         <w:drawing>
-          <wp:inline distT="0" distB="0" distL="0" distR="0" wp14:anchorId="4996AA00" wp14:editId="3404A090">
+          <wp:inline distT="0" distB="0" distL="0" distR="0" wp14:anchorId="68AFA17D" wp14:editId="34D33338">
             <wp:extent cx="5334000" cy="4581525"/>
             <wp:effectExtent l="0" t="0" r="0" b="0"/>
             <wp:docPr id="23" name="doc_autofill_review.jpg" descr="The review screen: the draft, ready to check and edit." title="The review screen: the draft, ready to check and edit."/>
@@ -14988,7 +15018,7 @@
         </w:rPr>
         <w:lastRenderedPageBreak/>
         <w:drawing>
-          <wp:inline distT="0" distB="0" distL="0" distR="0" wp14:anchorId="309070A2" wp14:editId="303DB2CC">
+          <wp:inline distT="0" distB="0" distL="0" distR="0" wp14:anchorId="2560BA05" wp14:editId="0ACD2105">
             <wp:extent cx="5334000" cy="3838575"/>
             <wp:effectExtent l="0" t="0" r="0" b="0"/>
             <wp:docPr id="24" name="doc_autofill_section_d.jpg" descr="Section D: ratings and locators, all editable." title="Section D: ratings and locators, all editable."/>
@@ -15077,7 +15107,7 @@
           <w:noProof/>
         </w:rPr>
         <w:drawing>
-          <wp:inline distT="0" distB="0" distL="0" distR="0" wp14:anchorId="4A00FB93" wp14:editId="22C00A79">
+          <wp:inline distT="0" distB="0" distL="0" distR="0" wp14:anchorId="7A787010" wp14:editId="79701F4E">
             <wp:extent cx="5334000" cy="3838575"/>
             <wp:effectExtent l="0" t="0" r="0" b="0"/>
             <wp:docPr id="25" name="doc_autofill_section_j.jpg" descr="Section J: quantitative metrics." title="Section J: quantitative metrics."/>
@@ -15206,7 +15236,27 @@
         <w:t>Form PDFs</w:t>
       </w:r>
       <w:r>
-        <w:t>, found by its DOC ID. There is no separate sync to run for documents.</w:t>
+        <w:t xml:space="preserve">, found by its DOC ID. The portal's copy of the Document Analysis Tool is refreshed the moment you submit. If a coding you submitted is later deleted in KoboToolbox, the next sync (automatic, or </w:t>
+      </w:r>
+      <w:r>
+        <w:rPr>
+          <w:b/>
+          <w:bCs/>
+        </w:rPr>
+        <w:t>Sync now</w:t>
+      </w:r>
+      <w:r>
+        <w:t xml:space="preserve"> on </w:t>
+      </w:r>
+      <w:r>
+        <w:rPr>
+          <w:b/>
+          <w:bCs/>
+        </w:rPr>
+        <w:t>Form PDFs</w:t>
+      </w:r>
+      <w:r>
+        <w:t>) unlocks the document so it can be coded again.</w:t>
       </w:r>
     </w:p>
     <w:p>
@@ -16686,7 +16736,7 @@
         <w:pStyle w:val="Heading1"/>
         <w:pageBreakBefore/>
       </w:pPr>
-      <w:bookmarkStart w:id="28" w:name="_Toc240713014"/>
+      <w:bookmarkStart w:id="28" w:name="_Toc240758760"/>
       <w:r>
         <w:lastRenderedPageBreak/>
         <w:t>7. Scenarios</w:t>
@@ -17641,7 +17691,7 @@
         <w:pStyle w:val="Heading1"/>
         <w:pageBreakBefore/>
       </w:pPr>
-      <w:bookmarkStart w:id="29" w:name="_Toc240713015"/>
+      <w:bookmarkStart w:id="29" w:name="_Toc240758761"/>
       <w:r>
         <w:lastRenderedPageBreak/>
         <w:t>8. Practice exercises</w:t>
@@ -17660,7 +17710,7 @@
       <w:pPr>
         <w:pStyle w:val="Heading2"/>
       </w:pPr>
-      <w:bookmarkStart w:id="30" w:name="_Toc240713016"/>
+      <w:bookmarkStart w:id="30" w:name="_Toc240758762"/>
       <w:r>
         <w:t>Exercise 1 — Getting around (all RAs)</w:t>
       </w:r>
@@ -17727,7 +17777,7 @@
       <w:pPr>
         <w:pStyle w:val="Heading2"/>
       </w:pPr>
-      <w:bookmarkStart w:id="31" w:name="_Toc240713017"/>
+      <w:bookmarkStart w:id="31" w:name="_Toc240758763"/>
       <w:r>
         <w:t>Exercise 2 — A complete contact (Contact RAs)</w:t>
       </w:r>
@@ -17807,7 +17857,7 @@
       <w:pPr>
         <w:pStyle w:val="Heading2"/>
       </w:pPr>
-      <w:bookmarkStart w:id="32" w:name="_Toc240713018"/>
+      <w:bookmarkStart w:id="32" w:name="_Toc240758764"/>
       <w:r>
         <w:t>Exercise 3 — QA decisions (QA RAs)</w:t>
       </w:r>
@@ -17874,7 +17924,7 @@
       <w:pPr>
         <w:pStyle w:val="Heading2"/>
       </w:pPr>
-      <w:bookmarkStart w:id="33" w:name="_Toc240713019"/>
+      <w:bookmarkStart w:id="33" w:name="_Toc240758765"/>
       <w:r>
         <w:t>Exercise 4 — A KII record (KII RAs)</w:t>
       </w:r>
@@ -17941,7 +17991,7 @@
       <w:pPr>
         <w:pStyle w:val="Heading2"/>
       </w:pPr>
-      <w:bookmarkStart w:id="34" w:name="_Toc240713020"/>
+      <w:bookmarkStart w:id="34" w:name="_Toc240758766"/>
       <w:r>
         <w:t>Exercise 5 — A document (Documentary RAs)</w:t>
       </w:r>
@@ -18113,7 +18163,7 @@
         <w:pStyle w:val="Heading1"/>
         <w:pageBreakBefore/>
       </w:pPr>
-      <w:bookmarkStart w:id="35" w:name="_Toc240713021"/>
+      <w:bookmarkStart w:id="35" w:name="_Toc240758767"/>
       <w:r>
         <w:lastRenderedPageBreak/>
         <w:t>9. Daily checklists</w:t>
@@ -18124,7 +18174,7 @@
       <w:pPr>
         <w:pStyle w:val="Heading2"/>
       </w:pPr>
-      <w:bookmarkStart w:id="36" w:name="_Toc240713022"/>
+      <w:bookmarkStart w:id="36" w:name="_Toc240758768"/>
       <w:r>
         <w:t>Start of the day</w:t>
       </w:r>
@@ -18204,7 +18254,7 @@
       <w:pPr>
         <w:pStyle w:val="Heading2"/>
       </w:pPr>
-      <w:bookmarkStart w:id="37" w:name="_Toc240713023"/>
+      <w:bookmarkStart w:id="37" w:name="_Toc240758769"/>
       <w:r>
         <w:t>End of the day</w:t>
       </w:r>
@@ -18258,7 +18308,7 @@
       <w:pPr>
         <w:pStyle w:val="Heading2"/>
       </w:pPr>
-      <w:bookmarkStart w:id="38" w:name="_Toc240713024"/>
+      <w:bookmarkStart w:id="38" w:name="_Toc240758770"/>
       <w:r>
         <w:t>Troubleshooting</w:t>
       </w:r>
@@ -18814,7 +18864,7 @@
                 <w:sz w:val="19"/>
                 <w:szCs w:val="19"/>
               </w:rPr>
-              <w:t>A page keeps loading</w:t>
+              <w:t>Form PDFs says "Not in sync with KoboToolbox yet"</w:t>
             </w:r>
           </w:p>
         </w:tc>
@@ -18838,7 +18888,7 @@
                 <w:sz w:val="19"/>
                 <w:szCs w:val="19"/>
               </w:rPr>
-              <w:t>A slow or dropped connection.</w:t>
+              <w:t>The counts differ: a form was submitted or changed in KoboToolbox since the last sync (it runs every 15 minutes).</w:t>
             </w:r>
           </w:p>
         </w:tc>
@@ -18862,7 +18912,7 @@
                 <w:sz w:val="19"/>
                 <w:szCs w:val="19"/>
               </w:rPr>
-              <w:t>Refresh the page. Your saved work is not lost; unsaved typing may be.</w:t>
+              <w:t>Select Sync now. If it still differs, or says it couldn't reach KoboToolbox, try again in a few minutes and tell the PI if it persists.</w:t>
             </w:r>
           </w:p>
         </w:tc>
@@ -18896,6 +18946,169 @@
                 <w:sz w:val="19"/>
                 <w:szCs w:val="19"/>
               </w:rPr>
+              <w:t>A document says "Already submitted" and its answers are locked</w:t>
+            </w:r>
+          </w:p>
+        </w:tc>
+        <w:tc>
+          <w:tcPr>
+            <w:tcW w:w="3200" w:type="dxa"/>
+            <w:tcMar>
+              <w:top w:w="70" w:type="dxa"/>
+              <w:left w:w="110" w:type="dxa"/>
+              <w:bottom w:w="70" w:type="dxa"/>
+              <w:right w:w="110" w:type="dxa"/>
+            </w:tcMar>
+          </w:tcPr>
+          <w:p>
+            <w:pPr>
+              <w:spacing w:after="40"/>
+            </w:pPr>
+            <w:r>
+              <w:rPr>
+                <w:sz w:val="19"/>
+                <w:szCs w:val="19"/>
+              </w:rPr>
+              <w:t>Its coding was already sent to KoboToolbox; changing it here would not change that record.</w:t>
+            </w:r>
+          </w:p>
+        </w:tc>
+        <w:tc>
+          <w:tcPr>
+            <w:tcW w:w="3577" w:type="dxa"/>
+            <w:tcMar>
+              <w:top w:w="70" w:type="dxa"/>
+              <w:left w:w="110" w:type="dxa"/>
+              <w:bottom w:w="70" w:type="dxa"/>
+              <w:right w:w="110" w:type="dxa"/>
+            </w:tcMar>
+          </w:tcPr>
+          <w:p>
+            <w:pPr>
+              <w:spacing w:after="40"/>
+            </w:pPr>
+            <w:r>
+              <w:rPr>
+                <w:sz w:val="19"/>
+                <w:szCs w:val="19"/>
+              </w:rPr>
+              <w:t>To redo the coding, delete that record in KoboToolbox, then select Sync now on Form PDFs. The document unlocks.</w:t>
+            </w:r>
+          </w:p>
+        </w:tc>
+      </w:tr>
+      <w:tr>
+        <w:tblPrEx>
+          <w:tblCellMar>
+            <w:top w:w="0" w:type="dxa"/>
+            <w:bottom w:w="0" w:type="dxa"/>
+          </w:tblCellMar>
+        </w:tblPrEx>
+        <w:trPr>
+          <w:cantSplit/>
+        </w:trPr>
+        <w:tc>
+          <w:tcPr>
+            <w:tcW w:w="2635" w:type="dxa"/>
+            <w:shd w:val="clear" w:color="auto" w:fill="F8FAFB"/>
+            <w:tcMar>
+              <w:top w:w="70" w:type="dxa"/>
+              <w:left w:w="110" w:type="dxa"/>
+              <w:bottom w:w="70" w:type="dxa"/>
+              <w:right w:w="110" w:type="dxa"/>
+            </w:tcMar>
+          </w:tcPr>
+          <w:p>
+            <w:pPr>
+              <w:spacing w:after="40"/>
+            </w:pPr>
+            <w:r>
+              <w:rPr>
+                <w:sz w:val="19"/>
+                <w:szCs w:val="19"/>
+              </w:rPr>
+              <w:t>A page keeps loading</w:t>
+            </w:r>
+          </w:p>
+        </w:tc>
+        <w:tc>
+          <w:tcPr>
+            <w:tcW w:w="3200" w:type="dxa"/>
+            <w:shd w:val="clear" w:color="auto" w:fill="F8FAFB"/>
+            <w:tcMar>
+              <w:top w:w="70" w:type="dxa"/>
+              <w:left w:w="110" w:type="dxa"/>
+              <w:bottom w:w="70" w:type="dxa"/>
+              <w:right w:w="110" w:type="dxa"/>
+            </w:tcMar>
+          </w:tcPr>
+          <w:p>
+            <w:pPr>
+              <w:spacing w:after="40"/>
+            </w:pPr>
+            <w:r>
+              <w:rPr>
+                <w:sz w:val="19"/>
+                <w:szCs w:val="19"/>
+              </w:rPr>
+              <w:t>A slow or dropped connection.</w:t>
+            </w:r>
+          </w:p>
+        </w:tc>
+        <w:tc>
+          <w:tcPr>
+            <w:tcW w:w="3577" w:type="dxa"/>
+            <w:shd w:val="clear" w:color="auto" w:fill="F8FAFB"/>
+            <w:tcMar>
+              <w:top w:w="70" w:type="dxa"/>
+              <w:left w:w="110" w:type="dxa"/>
+              <w:bottom w:w="70" w:type="dxa"/>
+              <w:right w:w="110" w:type="dxa"/>
+            </w:tcMar>
+          </w:tcPr>
+          <w:p>
+            <w:pPr>
+              <w:spacing w:after="40"/>
+            </w:pPr>
+            <w:r>
+              <w:rPr>
+                <w:sz w:val="19"/>
+                <w:szCs w:val="19"/>
+              </w:rPr>
+              <w:t>Refresh the page. Your saved work is not lost; unsaved typing may be.</w:t>
+            </w:r>
+          </w:p>
+        </w:tc>
+      </w:tr>
+      <w:tr>
+        <w:tblPrEx>
+          <w:tblCellMar>
+            <w:top w:w="0" w:type="dxa"/>
+            <w:bottom w:w="0" w:type="dxa"/>
+          </w:tblCellMar>
+        </w:tblPrEx>
+        <w:trPr>
+          <w:cantSplit/>
+        </w:trPr>
+        <w:tc>
+          <w:tcPr>
+            <w:tcW w:w="2635" w:type="dxa"/>
+            <w:tcMar>
+              <w:top w:w="70" w:type="dxa"/>
+              <w:left w:w="110" w:type="dxa"/>
+              <w:bottom w:w="70" w:type="dxa"/>
+              <w:right w:w="110" w:type="dxa"/>
+            </w:tcMar>
+          </w:tcPr>
+          <w:p>
+            <w:pPr>
+              <w:spacing w:after="40"/>
+            </w:pPr>
+            <w:r>
+              <w:rPr>
+                <w:sz w:val="19"/>
+                <w:szCs w:val="19"/>
+              </w:rPr>
               <w:t>A file upload seems stuck</w:t>
             </w:r>
           </w:p>
@@ -18958,7 +19171,7 @@
         <w:pStyle w:val="Heading1"/>
         <w:pageBreakBefore/>
       </w:pPr>
-      <w:bookmarkStart w:id="39" w:name="_Toc240713025"/>
+      <w:bookmarkStart w:id="39" w:name="_Toc240758771"/>
       <w:r>
         <w:lastRenderedPageBreak/>
         <w:t>10. Glossary</w:t>
@@ -19892,7 +20105,7 @@
                 <w:sz w:val="19"/>
                 <w:szCs w:val="19"/>
               </w:rPr>
-              <w:t>QA</w:t>
+              <w:t>Sync</w:t>
             </w:r>
           </w:p>
         </w:tc>
@@ -19915,7 +20128,7 @@
                 <w:sz w:val="19"/>
                 <w:szCs w:val="19"/>
               </w:rPr>
-              <w:t>Quality assurance: automated checks plus a human decision on every questionnaire.</w:t>
+              <w:t>Bringing the portal's own copy of the three KoboToolbox forms level with KoboToolbox. Automatic every 15 minutes, or Sync now.</w:t>
             </w:r>
           </w:p>
         </w:tc>
@@ -19950,7 +20163,7 @@
                 <w:sz w:val="19"/>
                 <w:szCs w:val="19"/>
               </w:rPr>
-              <w:t>QA exception</w:t>
+              <w:t>QA</w:t>
             </w:r>
           </w:p>
         </w:tc>
@@ -19974,7 +20187,7 @@
                 <w:sz w:val="19"/>
                 <w:szCs w:val="19"/>
               </w:rPr>
-              <w:t>An automated flag raised by a QA rule, worked and closed by a person.</w:t>
+              <w:t>Quality assurance: automated checks plus a human decision on every questionnaire.</w:t>
             </w:r>
           </w:p>
         </w:tc>
@@ -20008,7 +20221,7 @@
                 <w:sz w:val="19"/>
                 <w:szCs w:val="19"/>
               </w:rPr>
-              <w:t>KII</w:t>
+              <w:t>QA exception</w:t>
             </w:r>
           </w:p>
         </w:tc>
@@ -20031,7 +20244,7 @@
                 <w:sz w:val="19"/>
                 <w:szCs w:val="19"/>
               </w:rPr>
-              <w:t>Key Informant Interview (target 60 completed).</w:t>
+              <w:t>An automated flag raised by a QA rule, worked and closed by a person.</w:t>
             </w:r>
           </w:p>
         </w:tc>
@@ -20066,7 +20279,7 @@
                 <w:sz w:val="19"/>
                 <w:szCs w:val="19"/>
               </w:rPr>
-              <w:t>Documentary evidence</w:t>
+              <w:t>KII</w:t>
             </w:r>
           </w:p>
         </w:tc>
@@ -20090,7 +20303,7 @@
                 <w:sz w:val="19"/>
                 <w:szCs w:val="19"/>
               </w:rPr>
-              <w:t>Documents, digital platform and media sources analysed (target 50–75).</w:t>
+              <w:t>Key Informant Interview (target 60 completed).</w:t>
             </w:r>
           </w:p>
         </w:tc>
@@ -20124,7 +20337,7 @@
                 <w:sz w:val="19"/>
                 <w:szCs w:val="19"/>
               </w:rPr>
-              <w:t>Source file</w:t>
+              <w:t>Documentary evidence</w:t>
             </w:r>
           </w:p>
         </w:tc>
@@ -20147,7 +20360,7 @@
                 <w:sz w:val="19"/>
                 <w:szCs w:val="19"/>
               </w:rPr>
-              <w:t>The uploaded scan, PDF, photo or document a documentary record is coded from. Stored privately; it can be removed or replaced.</w:t>
+              <w:t>Documents, digital platform and media sources analysed (target 50–75).</w:t>
             </w:r>
           </w:p>
         </w:tc>
@@ -20182,7 +20395,7 @@
                 <w:sz w:val="19"/>
                 <w:szCs w:val="19"/>
               </w:rPr>
-              <w:t>Auto-fill</w:t>
+              <w:t>Source file</w:t>
             </w:r>
           </w:p>
         </w:tc>
@@ -20206,7 +20419,7 @@
                 <w:sz w:val="19"/>
                 <w:szCs w:val="19"/>
               </w:rPr>
-              <w:t>A button on a document's page that has AI read the source file and draft the whole Document Analysis Tool for you to review. It never submits anything by itself.</w:t>
+              <w:t>The uploaded scan, PDF, photo or document a documentary record is coded from. Stored privately; it can be removed or replaced.</w:t>
             </w:r>
           </w:p>
         </w:tc>
@@ -20240,7 +20453,7 @@
                 <w:sz w:val="19"/>
                 <w:szCs w:val="19"/>
               </w:rPr>
-              <w:t>AI draft</w:t>
+              <w:t>Auto-fill</w:t>
             </w:r>
           </w:p>
         </w:tc>
@@ -20263,7 +20476,7 @@
                 <w:sz w:val="19"/>
                 <w:szCs w:val="19"/>
               </w:rPr>
-              <w:t>The AI's proposed answers to the Document Analysis Tool: editable, reviewed by a person, and only sent to KoboToolbox when that person selects Submit.</w:t>
+              <w:t>A button on a document's page that has AI read the source file and draft the whole Document Analysis Tool for you to review. It never submits anything by itself.</w:t>
             </w:r>
           </w:p>
         </w:tc>
@@ -20298,7 +20511,7 @@
                 <w:sz w:val="19"/>
                 <w:szCs w:val="19"/>
               </w:rPr>
-              <w:t>Page range</w:t>
+              <w:t>AI draft</w:t>
             </w:r>
           </w:p>
         </w:tc>
@@ -20322,7 +20535,7 @@
                 <w:sz w:val="19"/>
                 <w:szCs w:val="19"/>
               </w:rPr>
-              <w:t>The pages of a long PDF that make up one evidence unit (up to 100), entered for Auto-fill.</w:t>
+              <w:t>The AI's proposed answers to the Document Analysis Tool: editable, reviewed by a person, and only sent to KoboToolbox when that person selects Submit.</w:t>
             </w:r>
           </w:p>
         </w:tc>
@@ -20356,7 +20569,7 @@
                 <w:sz w:val="19"/>
                 <w:szCs w:val="19"/>
               </w:rPr>
-              <w:t>Administration mode</w:t>
+              <w:t>Page range</w:t>
             </w:r>
           </w:p>
         </w:tc>
@@ -20379,7 +20592,7 @@
                 <w:sz w:val="19"/>
                 <w:szCs w:val="19"/>
               </w:rPr>
-              <w:t>How the questionnaire was completed (codes 01–06).</w:t>
+              <w:t>The pages of a long PDF that make up one evidence unit (up to 100), entered for Auto-fill.</w:t>
             </w:r>
           </w:p>
         </w:tc>
@@ -20414,7 +20627,7 @@
                 <w:sz w:val="19"/>
                 <w:szCs w:val="19"/>
               </w:rPr>
-              <w:t>Follow-up</w:t>
+              <w:t>Administration mode</w:t>
             </w:r>
           </w:p>
         </w:tc>
@@ -20438,7 +20651,7 @@
                 <w:sz w:val="19"/>
                 <w:szCs w:val="19"/>
               </w:rPr>
-              <w:t>An approved reminder due to be sent to an invited respondent (Day 2, Day 7).</w:t>
+              <w:t>How the questionnaire was completed (codes 01–06).</w:t>
             </w:r>
           </w:p>
         </w:tc>
@@ -20472,7 +20685,7 @@
                 <w:sz w:val="19"/>
                 <w:szCs w:val="19"/>
               </w:rPr>
-              <w:t>Withdrawal</w:t>
+              <w:t>Follow-up</w:t>
             </w:r>
           </w:p>
         </w:tc>
@@ -20495,7 +20708,7 @@
                 <w:sz w:val="19"/>
                 <w:szCs w:val="19"/>
               </w:rPr>
-              <w:t>A participant's request to stop taking part, recorded once in the portal.</w:t>
+              <w:t>An approved reminder due to be sent to an invited respondent (Day 2, Day 7).</w:t>
             </w:r>
           </w:p>
         </w:tc>
@@ -20530,7 +20743,8 @@
                 <w:sz w:val="19"/>
                 <w:szCs w:val="19"/>
               </w:rPr>
-              <w:t>Audit log</w:t>
+              <w:lastRenderedPageBreak/>
+              <w:t>Withdrawal</w:t>
             </w:r>
           </w:p>
         </w:tc>
@@ -20554,7 +20768,7 @@
                 <w:sz w:val="19"/>
                 <w:szCs w:val="19"/>
               </w:rPr>
-              <w:t>The permanent record of every sensitive action and who took it.</w:t>
+              <w:t>A participant's request to stop taking part, recorded once in the portal.</w:t>
             </w:r>
           </w:p>
         </w:tc>
@@ -20588,7 +20802,64 @@
                 <w:sz w:val="19"/>
                 <w:szCs w:val="19"/>
               </w:rPr>
-              <w:lastRenderedPageBreak/>
+              <w:t>Audit log</w:t>
+            </w:r>
+          </w:p>
+        </w:tc>
+        <w:tc>
+          <w:tcPr>
+            <w:tcW w:w="7059" w:type="dxa"/>
+            <w:tcMar>
+              <w:top w:w="70" w:type="dxa"/>
+              <w:left w:w="110" w:type="dxa"/>
+              <w:bottom w:w="70" w:type="dxa"/>
+              <w:right w:w="110" w:type="dxa"/>
+            </w:tcMar>
+          </w:tcPr>
+          <w:p>
+            <w:pPr>
+              <w:spacing w:after="40"/>
+            </w:pPr>
+            <w:r>
+              <w:rPr>
+                <w:sz w:val="19"/>
+                <w:szCs w:val="19"/>
+              </w:rPr>
+              <w:t>The permanent record of every sensitive action and who took it.</w:t>
+            </w:r>
+          </w:p>
+        </w:tc>
+      </w:tr>
+      <w:tr>
+        <w:tblPrEx>
+          <w:tblCellMar>
+            <w:top w:w="0" w:type="dxa"/>
+            <w:bottom w:w="0" w:type="dxa"/>
+          </w:tblCellMar>
+        </w:tblPrEx>
+        <w:trPr>
+          <w:cantSplit/>
+        </w:trPr>
+        <w:tc>
+          <w:tcPr>
+            <w:tcW w:w="2353" w:type="dxa"/>
+            <w:shd w:val="clear" w:color="auto" w:fill="F8FAFB"/>
+            <w:tcMar>
+              <w:top w:w="70" w:type="dxa"/>
+              <w:left w:w="110" w:type="dxa"/>
+              <w:bottom w:w="70" w:type="dxa"/>
+              <w:right w:w="110" w:type="dxa"/>
+            </w:tcMar>
+          </w:tcPr>
+          <w:p>
+            <w:pPr>
+              <w:spacing w:after="40"/>
+            </w:pPr>
+            <w:r>
+              <w:rPr>
+                <w:sz w:val="19"/>
+                <w:szCs w:val="19"/>
+              </w:rPr>
               <w:t>Data lock</w:t>
             </w:r>
           </w:p>
@@ -20596,6 +20867,7 @@
         <w:tc>
           <w:tcPr>
             <w:tcW w:w="7059" w:type="dxa"/>
+            <w:shd w:val="clear" w:color="auto" w:fill="F8FAFB"/>
             <w:tcMar>
               <w:top w:w="70" w:type="dxa"/>
               <w:left w:w="110" w:type="dxa"/>
@@ -20628,7 +20900,7 @@
         <w:pStyle w:val="Heading1"/>
         <w:pageBreakBefore/>
       </w:pPr>
-      <w:bookmarkStart w:id="40" w:name="_Toc240713026"/>
+      <w:bookmarkStart w:id="40" w:name="_Toc240758772"/>
       <w:r>
         <w:lastRenderedPageBreak/>
         <w:t>11. Confidentiality and conduct declaration</w:t>
@@ -21114,7 +21386,7 @@
         <w:sz w:val="16"/>
         <w:szCs w:val="16"/>
       </w:rPr>
-      <w:t>Version 1.1 · 19 September 2026</w:t>
+      <w:t>Version 1.2 · 20 September 2026</w:t>
     </w:r>
     <w:r>
       <w:rPr>
@@ -21287,10 +21559,10 @@
 <file path=word/numbering.xml><?xml version="1.0" encoding="utf-8"?>
 <w:numbering xmlns:wpc="http://schemas.microsoft.com/office/word/2010/wordprocessingCanvas" xmlns:cx="http://schemas.microsoft.com/office/drawing/2014/chartex" xmlns:cx1="http://schemas.microsoft.com/office/drawing/2015/9/8/chartex" xmlns:cx2="http://schemas.microsoft.com/office/drawing/2015/10/21/chartex" xmlns:cx3="http://schemas.microsoft.com/office/drawing/2016/5/9/chartex" xmlns:cx4="http://schemas.microsoft.com/office/drawing/2016/5/10/chartex" xmlns:cx5="http://schemas.microsoft.com/office/drawing/2016/5/11/chartex" xmlns:cx6="http://schemas.microsoft.com/office/drawing/2016/5/12/chartex" xmlns:cx7="http://schemas.microsoft.com/office/drawing/2016/5/13/chartex" xmlns:cx8="http://schemas.microsoft.com/office/drawing/2016/5/14/chartex" xmlns:mc="http://schemas.openxmlformats.org/markup-compatibility/2006" xmlns:aink="http://schemas.microsoft.com/office/drawing/2016/ink" xmlns:am3d="http://schemas.microsoft.com/office/drawing/2017/model3d" xmlns:o="urn:schemas-microsoft-com:office:office" xmlns:oel="http://schemas.microsoft.com/office/2019/extlst" xmlns:r="http://schemas.openxmlformats.org/officeDocument/2006/relationships" xmlns:m="http://schemas.openxmlformats.org/officeDocument/2006/math" xmlns:v="urn:schemas-microsoft-com:vml" xmlns:wp14="http://schemas.microsoft.com/office/word/2010/wordprocessingDrawing" xmlns:wp="http://schemas.openxmlformats.org/drawingml/2006/wordprocessingDrawing" xmlns:w10="urn:schemas-microsoft-com:office:word" xmlns:w="http://schemas.openxmlformats.org/wordprocessingml/2006/main" xmlns:w14="http://schemas.microsoft.com/office/word/2010/wordml" xmlns:w15="http://schemas.microsoft.com/office/word/2012/wordml" xmlns:w16cex="http://schemas.microsoft.com/office/word/2018/wordml/cex" xmlns:w16cid="http://schemas.microsoft.com/office/word/2016/wordml/cid" xmlns:w16="http://schemas.microsoft.com/office/word/2018/wordml" xmlns:w16sdtdh="http://schemas.microsoft.com/office/word/2020/wordml/sdtdatahash" xmlns:w16se="http://schemas.microsoft.com/office/word/2015/wordml/symex" xmlns:wpg="http://schemas.microsoft.com/office/word/2010/wordprocessingGroup" xmlns:wpi="http://schemas.microsoft.com/office/word/2010/wordprocessingInk" xmlns:wne="http://schemas.microsoft.com/office/word/2006/wordml" xmlns:wps="http://schemas.microsoft.com/office/word/2010/wordprocessingShape" mc:Ignorable="w14 w15 w16se w16cid w16 w16cex w16sdtdh wp14">
   <w:abstractNum w:abstractNumId="0" w15:restartNumberingAfterBreak="0">
-    <w:nsid w:val="005142E2"/>
+    <w:nsid w:val="01BE107E"/>
     <w:multiLevelType w:val="hybridMultilevel"/>
-    <w:tmpl w:val="10607BAC"/>
-    <w:lvl w:ilvl="0" w:tplc="EFC26A04">
+    <w:tmpl w:val="B62ADC0A"/>
+    <w:lvl w:ilvl="0" w:tplc="F490D398">
       <w:start w:val="1"/>
       <w:numFmt w:val="decimal"/>
       <w:lvlText w:val="%1."/>
@@ -21304,52 +21576,52 @@
         <w:color w:val="A67C27"/>
       </w:rPr>
     </w:lvl>
-    <w:lvl w:ilvl="1" w:tplc="865881F8">
+    <w:lvl w:ilvl="1" w:tplc="E458C4BA">
       <w:numFmt w:val="decimal"/>
       <w:lvlText w:val=""/>
       <w:lvlJc w:val="left"/>
     </w:lvl>
-    <w:lvl w:ilvl="2" w:tplc="90D4AD56">
+    <w:lvl w:ilvl="2" w:tplc="B9D4900C">
       <w:numFmt w:val="decimal"/>
       <w:lvlText w:val=""/>
       <w:lvlJc w:val="left"/>
     </w:lvl>
-    <w:lvl w:ilvl="3" w:tplc="355A2EAA">
+    <w:lvl w:ilvl="3" w:tplc="A43E59CA">
       <w:numFmt w:val="decimal"/>
       <w:lvlText w:val=""/>
       <w:lvlJc w:val="left"/>
     </w:lvl>
-    <w:lvl w:ilvl="4" w:tplc="869801C2">
+    <w:lvl w:ilvl="4" w:tplc="23F2740C">
       <w:numFmt w:val="decimal"/>
       <w:lvlText w:val=""/>
       <w:lvlJc w:val="left"/>
     </w:lvl>
-    <w:lvl w:ilvl="5" w:tplc="CBC624B4">
+    <w:lvl w:ilvl="5" w:tplc="639859CC">
       <w:numFmt w:val="decimal"/>
       <w:lvlText w:val=""/>
       <w:lvlJc w:val="left"/>
     </w:lvl>
-    <w:lvl w:ilvl="6" w:tplc="7DC674F4">
+    <w:lvl w:ilvl="6" w:tplc="505C2CFC">
       <w:numFmt w:val="decimal"/>
       <w:lvlText w:val=""/>
       <w:lvlJc w:val="left"/>
     </w:lvl>
-    <w:lvl w:ilvl="7" w:tplc="2D767172">
+    <w:lvl w:ilvl="7" w:tplc="3786949C">
       <w:numFmt w:val="decimal"/>
       <w:lvlText w:val=""/>
       <w:lvlJc w:val="left"/>
     </w:lvl>
-    <w:lvl w:ilvl="8" w:tplc="BE86D5E0">
+    <w:lvl w:ilvl="8" w:tplc="A7420FD6">
       <w:numFmt w:val="decimal"/>
       <w:lvlText w:val=""/>
       <w:lvlJc w:val="left"/>
     </w:lvl>
   </w:abstractNum>
   <w:abstractNum w:abstractNumId="1" w15:restartNumberingAfterBreak="0">
-    <w:nsid w:val="01913C4B"/>
+    <w:nsid w:val="02E24F7C"/>
     <w:multiLevelType w:val="hybridMultilevel"/>
-    <w:tmpl w:val="9FF4D17A"/>
-    <w:lvl w:ilvl="0" w:tplc="ABCE7CDA">
+    <w:tmpl w:val="3BD4960A"/>
+    <w:lvl w:ilvl="0" w:tplc="95C8C1CA">
       <w:start w:val="1"/>
       <w:numFmt w:val="decimal"/>
       <w:lvlText w:val="%1."/>
@@ -21363,52 +21635,52 @@
         <w:color w:val="A67C27"/>
       </w:rPr>
     </w:lvl>
-    <w:lvl w:ilvl="1" w:tplc="3D7ADEA4">
+    <w:lvl w:ilvl="1" w:tplc="0FE2BAEC">
       <w:numFmt w:val="decimal"/>
       <w:lvlText w:val=""/>
       <w:lvlJc w:val="left"/>
     </w:lvl>
-    <w:lvl w:ilvl="2" w:tplc="CE16CD66">
+    <w:lvl w:ilvl="2" w:tplc="9DBCB466">
       <w:numFmt w:val="decimal"/>
       <w:lvlText w:val=""/>
       <w:lvlJc w:val="left"/>
     </w:lvl>
-    <w:lvl w:ilvl="3" w:tplc="6ED2FA98">
+    <w:lvl w:ilvl="3" w:tplc="4C4C561E">
       <w:numFmt w:val="decimal"/>
       <w:lvlText w:val=""/>
       <w:lvlJc w:val="left"/>
     </w:lvl>
-    <w:lvl w:ilvl="4" w:tplc="27FC5D1C">
+    <w:lvl w:ilvl="4" w:tplc="14AA448E">
       <w:numFmt w:val="decimal"/>
       <w:lvlText w:val=""/>
       <w:lvlJc w:val="left"/>
     </w:lvl>
-    <w:lvl w:ilvl="5" w:tplc="4FB8AE8E">
+    <w:lvl w:ilvl="5" w:tplc="90546D6A">
       <w:numFmt w:val="decimal"/>
       <w:lvlText w:val=""/>
       <w:lvlJc w:val="left"/>
     </w:lvl>
-    <w:lvl w:ilvl="6" w:tplc="1EC004E4">
+    <w:lvl w:ilvl="6" w:tplc="DEB693BA">
       <w:numFmt w:val="decimal"/>
       <w:lvlText w:val=""/>
       <w:lvlJc w:val="left"/>
     </w:lvl>
-    <w:lvl w:ilvl="7" w:tplc="078CD980">
+    <w:lvl w:ilvl="7" w:tplc="D400B00A">
       <w:numFmt w:val="decimal"/>
       <w:lvlText w:val=""/>
       <w:lvlJc w:val="left"/>
     </w:lvl>
-    <w:lvl w:ilvl="8" w:tplc="C77EC47C">
+    <w:lvl w:ilvl="8" w:tplc="E1E231D2">
       <w:numFmt w:val="decimal"/>
       <w:lvlText w:val=""/>
       <w:lvlJc w:val="left"/>
     </w:lvl>
   </w:abstractNum>
   <w:abstractNum w:abstractNumId="2" w15:restartNumberingAfterBreak="0">
-    <w:nsid w:val="02645808"/>
+    <w:nsid w:val="04667034"/>
     <w:multiLevelType w:val="hybridMultilevel"/>
-    <w:tmpl w:val="F95E1050"/>
-    <w:lvl w:ilvl="0" w:tplc="318EA0C6">
+    <w:tmpl w:val="A24A9CAC"/>
+    <w:lvl w:ilvl="0" w:tplc="DADCB384">
       <w:start w:val="1"/>
       <w:numFmt w:val="decimal"/>
       <w:lvlText w:val="%1."/>
@@ -21422,52 +21694,52 @@
         <w:color w:val="A67C27"/>
       </w:rPr>
     </w:lvl>
-    <w:lvl w:ilvl="1" w:tplc="5F5247B0">
+    <w:lvl w:ilvl="1" w:tplc="7E3E8D96">
       <w:numFmt w:val="decimal"/>
       <w:lvlText w:val=""/>
       <w:lvlJc w:val="left"/>
     </w:lvl>
-    <w:lvl w:ilvl="2" w:tplc="BD7CD75E">
+    <w:lvl w:ilvl="2" w:tplc="19B69FCA">
       <w:numFmt w:val="decimal"/>
       <w:lvlText w:val=""/>
       <w:lvlJc w:val="left"/>
     </w:lvl>
-    <w:lvl w:ilvl="3" w:tplc="E7FE8D86">
+    <w:lvl w:ilvl="3" w:tplc="81FC0F46">
       <w:numFmt w:val="decimal"/>
       <w:lvlText w:val=""/>
       <w:lvlJc w:val="left"/>
     </w:lvl>
-    <w:lvl w:ilvl="4" w:tplc="B2D426C4">
+    <w:lvl w:ilvl="4" w:tplc="4C1427FC">
       <w:numFmt w:val="decimal"/>
       <w:lvlText w:val=""/>
       <w:lvlJc w:val="left"/>
     </w:lvl>
-    <w:lvl w:ilvl="5" w:tplc="89DA0488">
+    <w:lvl w:ilvl="5" w:tplc="73BA1DCA">
       <w:numFmt w:val="decimal"/>
       <w:lvlText w:val=""/>
       <w:lvlJc w:val="left"/>
     </w:lvl>
-    <w:lvl w:ilvl="6" w:tplc="530203E2">
+    <w:lvl w:ilvl="6" w:tplc="477CD442">
       <w:numFmt w:val="decimal"/>
       <w:lvlText w:val=""/>
       <w:lvlJc w:val="left"/>
     </w:lvl>
-    <w:lvl w:ilvl="7" w:tplc="53B25F98">
+    <w:lvl w:ilvl="7" w:tplc="70EA2DB4">
       <w:numFmt w:val="decimal"/>
       <w:lvlText w:val=""/>
       <w:lvlJc w:val="left"/>
     </w:lvl>
-    <w:lvl w:ilvl="8" w:tplc="A4A25242">
+    <w:lvl w:ilvl="8" w:tplc="A7AAA9F8">
       <w:numFmt w:val="decimal"/>
       <w:lvlText w:val=""/>
       <w:lvlJc w:val="left"/>
     </w:lvl>
   </w:abstractNum>
   <w:abstractNum w:abstractNumId="3" w15:restartNumberingAfterBreak="0">
-    <w:nsid w:val="059965FB"/>
+    <w:nsid w:val="09C16E88"/>
     <w:multiLevelType w:val="hybridMultilevel"/>
-    <w:tmpl w:val="30048D34"/>
-    <w:lvl w:ilvl="0" w:tplc="9D94AC8C">
+    <w:tmpl w:val="3406157C"/>
+    <w:lvl w:ilvl="0" w:tplc="BF2C75A8">
       <w:start w:val="1"/>
       <w:numFmt w:val="decimal"/>
       <w:lvlText w:val="%1."/>
@@ -21481,52 +21753,52 @@
         <w:color w:val="A67C27"/>
       </w:rPr>
     </w:lvl>
-    <w:lvl w:ilvl="1" w:tplc="06903C42">
+    <w:lvl w:ilvl="1" w:tplc="342618C6">
       <w:numFmt w:val="decimal"/>
       <w:lvlText w:val=""/>
       <w:lvlJc w:val="left"/>
     </w:lvl>
-    <w:lvl w:ilvl="2" w:tplc="17AA3748">
+    <w:lvl w:ilvl="2" w:tplc="A2D2EFBC">
       <w:numFmt w:val="decimal"/>
       <w:lvlText w:val=""/>
       <w:lvlJc w:val="left"/>
     </w:lvl>
-    <w:lvl w:ilvl="3" w:tplc="264EE528">
+    <w:lvl w:ilvl="3" w:tplc="8F0652D6">
       <w:numFmt w:val="decimal"/>
       <w:lvlText w:val=""/>
       <w:lvlJc w:val="left"/>
     </w:lvl>
-    <w:lvl w:ilvl="4" w:tplc="AB42AB5C">
+    <w:lvl w:ilvl="4" w:tplc="530A26BE">
       <w:numFmt w:val="decimal"/>
       <w:lvlText w:val=""/>
       <w:lvlJc w:val="left"/>
     </w:lvl>
-    <w:lvl w:ilvl="5" w:tplc="85D6E020">
+    <w:lvl w:ilvl="5" w:tplc="AE603A7A">
       <w:numFmt w:val="decimal"/>
       <w:lvlText w:val=""/>
       <w:lvlJc w:val="left"/>
     </w:lvl>
-    <w:lvl w:ilvl="6" w:tplc="DA56A4F8">
+    <w:lvl w:ilvl="6" w:tplc="AEBAAA74">
       <w:numFmt w:val="decimal"/>
       <w:lvlText w:val=""/>
       <w:lvlJc w:val="left"/>
     </w:lvl>
-    <w:lvl w:ilvl="7" w:tplc="6B8EC12A">
+    <w:lvl w:ilvl="7" w:tplc="A4A4A3CC">
       <w:numFmt w:val="decimal"/>
       <w:lvlText w:val=""/>
       <w:lvlJc w:val="left"/>
     </w:lvl>
-    <w:lvl w:ilvl="8" w:tplc="F2707476">
+    <w:lvl w:ilvl="8" w:tplc="394A4E92">
       <w:numFmt w:val="decimal"/>
       <w:lvlText w:val=""/>
       <w:lvlJc w:val="left"/>
     </w:lvl>
   </w:abstractNum>
   <w:abstractNum w:abstractNumId="4" w15:restartNumberingAfterBreak="0">
-    <w:nsid w:val="068F477B"/>
+    <w:nsid w:val="0A627A49"/>
     <w:multiLevelType w:val="hybridMultilevel"/>
-    <w:tmpl w:val="E8EA1264"/>
-    <w:lvl w:ilvl="0" w:tplc="075A682C">
+    <w:tmpl w:val="2660B1EA"/>
+    <w:lvl w:ilvl="0" w:tplc="E3F6DC82">
       <w:start w:val="1"/>
       <w:numFmt w:val="decimal"/>
       <w:lvlText w:val="%1."/>
@@ -21540,52 +21812,138 @@
         <w:color w:val="A67C27"/>
       </w:rPr>
     </w:lvl>
-    <w:lvl w:ilvl="1" w:tplc="EB9423FE">
+    <w:lvl w:ilvl="1" w:tplc="E998ECC8">
       <w:numFmt w:val="decimal"/>
       <w:lvlText w:val=""/>
       <w:lvlJc w:val="left"/>
     </w:lvl>
-    <w:lvl w:ilvl="2" w:tplc="1916C09C">
+    <w:lvl w:ilvl="2" w:tplc="3924A784">
       <w:numFmt w:val="decimal"/>
       <w:lvlText w:val=""/>
       <w:lvlJc w:val="left"/>
     </w:lvl>
-    <w:lvl w:ilvl="3" w:tplc="CF7A2AE4">
+    <w:lvl w:ilvl="3" w:tplc="F4CCF304">
       <w:numFmt w:val="decimal"/>
       <w:lvlText w:val=""/>
       <w:lvlJc w:val="left"/>
     </w:lvl>
-    <w:lvl w:ilvl="4" w:tplc="EFD8D94A">
+    <w:lvl w:ilvl="4" w:tplc="845054CC">
       <w:numFmt w:val="decimal"/>
       <w:lvlText w:val=""/>
       <w:lvlJc w:val="left"/>
     </w:lvl>
-    <w:lvl w:ilvl="5" w:tplc="78BA09AC">
+    <w:lvl w:ilvl="5" w:tplc="9EF0CA00">
       <w:numFmt w:val="decimal"/>
       <w:lvlText w:val=""/>
       <w:lvlJc w:val="left"/>
     </w:lvl>
-    <w:lvl w:ilvl="6" w:tplc="804C83AC">
+    <w:lvl w:ilvl="6" w:tplc="E06ACC4A">
       <w:numFmt w:val="decimal"/>
       <w:lvlText w:val=""/>
       <w:lvlJc w:val="left"/>
     </w:lvl>
-    <w:lvl w:ilvl="7" w:tplc="D02C9D68">
+    <w:lvl w:ilvl="7" w:tplc="F282057A">
       <w:numFmt w:val="decimal"/>
       <w:lvlText w:val=""/>
       <w:lvlJc w:val="left"/>
     </w:lvl>
-    <w:lvl w:ilvl="8" w:tplc="1F462FDC">
+    <w:lvl w:ilvl="8" w:tplc="51AEE382">
       <w:numFmt w:val="decimal"/>
       <w:lvlText w:val=""/>
       <w:lvlJc w:val="left"/>
     </w:lvl>
   </w:abstractNum>
   <w:abstractNum w:abstractNumId="5" w15:restartNumberingAfterBreak="0">
-    <w:nsid w:val="0F835291"/>
+    <w:nsid w:val="0BB55D67"/>
     <w:multiLevelType w:val="hybridMultilevel"/>
-    <w:tmpl w:val="824C3274"/>
-    <w:lvl w:ilvl="0" w:tplc="FB0ED970">
+    <w:tmpl w:val="284C74C0"/>
+    <w:lvl w:ilvl="0" w:tplc="7D023B76">
+      <w:start w:val="1"/>
+      <w:numFmt w:val="bullet"/>
+      <w:lvlText w:val="●"/>
+      <w:lvlJc w:val="left"/>
+      <w:pPr>
+        <w:ind w:left="720" w:hanging="360"/>
+      </w:pPr>
+    </w:lvl>
+    <w:lvl w:ilvl="1" w:tplc="6B3C577E">
+      <w:start w:val="1"/>
+      <w:numFmt w:val="bullet"/>
+      <w:lvlText w:val="○"/>
+      <w:lvlJc w:val="left"/>
+      <w:pPr>
+        <w:ind w:left="1440" w:hanging="360"/>
+      </w:pPr>
+    </w:lvl>
+    <w:lvl w:ilvl="2" w:tplc="03DE9F54">
+      <w:start w:val="1"/>
+      <w:numFmt w:val="bullet"/>
+      <w:lvlText w:val="■"/>
+      <w:lvlJc w:val="left"/>
+      <w:pPr>
+        <w:ind w:left="2160" w:hanging="360"/>
+      </w:pPr>
+    </w:lvl>
+    <w:lvl w:ilvl="3" w:tplc="C28CFC72">
+      <w:start w:val="1"/>
+      <w:numFmt w:val="bullet"/>
+      <w:lvlText w:val="●"/>
+      <w:lvlJc w:val="left"/>
+      <w:pPr>
+        <w:ind w:left="2880" w:hanging="360"/>
+      </w:pPr>
+    </w:lvl>
+    <w:lvl w:ilvl="4" w:tplc="52BC4FAC">
+      <w:start w:val="1"/>
+      <w:numFmt w:val="bullet"/>
+      <w:lvlText w:val="○"/>
+      <w:lvlJc w:val="left"/>
+      <w:pPr>
+        <w:ind w:left="3600" w:hanging="360"/>
+      </w:pPr>
+    </w:lvl>
+    <w:lvl w:ilvl="5" w:tplc="ECA8AE98">
+      <w:start w:val="1"/>
+      <w:numFmt w:val="bullet"/>
+      <w:lvlText w:val="■"/>
+      <w:lvlJc w:val="left"/>
+      <w:pPr>
+        <w:ind w:left="4320" w:hanging="360"/>
+      </w:pPr>
+    </w:lvl>
+    <w:lvl w:ilvl="6" w:tplc="9F1EC3A6">
+      <w:start w:val="1"/>
+      <w:numFmt w:val="bullet"/>
+      <w:lvlText w:val="●"/>
+      <w:lvlJc w:val="left"/>
+      <w:pPr>
+        <w:ind w:left="5040" w:hanging="360"/>
+      </w:pPr>
+    </w:lvl>
+    <w:lvl w:ilvl="7" w:tplc="5718A702">
+      <w:start w:val="1"/>
+      <w:numFmt w:val="bullet"/>
+      <w:lvlText w:val="●"/>
+      <w:lvlJc w:val="left"/>
+      <w:pPr>
+        <w:ind w:left="5760" w:hanging="360"/>
+      </w:pPr>
+    </w:lvl>
+    <w:lvl w:ilvl="8" w:tplc="9EBAD7F0">
+      <w:start w:val="1"/>
+      <w:numFmt w:val="bullet"/>
+      <w:lvlText w:val="●"/>
+      <w:lvlJc w:val="left"/>
+      <w:pPr>
+        <w:ind w:left="6480" w:hanging="360"/>
+      </w:pPr>
+    </w:lvl>
+  </w:abstractNum>
+  <w:abstractNum w:abstractNumId="6" w15:restartNumberingAfterBreak="0">
+    <w:nsid w:val="0BDB0A0F"/>
+    <w:multiLevelType w:val="hybridMultilevel"/>
+    <w:tmpl w:val="01708EC4"/>
+    <w:lvl w:ilvl="0" w:tplc="6FAA55C2">
       <w:start w:val="1"/>
       <w:numFmt w:val="decimal"/>
       <w:lvlText w:val="%1."/>
@@ -21599,52 +21957,52 @@
         <w:color w:val="A67C27"/>
       </w:rPr>
     </w:lvl>
-    <w:lvl w:ilvl="1" w:tplc="59D23AD6">
+    <w:lvl w:ilvl="1" w:tplc="565C7C5C">
       <w:numFmt w:val="decimal"/>
       <w:lvlText w:val=""/>
       <w:lvlJc w:val="left"/>
     </w:lvl>
-    <w:lvl w:ilvl="2" w:tplc="7B9CA2F0">
+    <w:lvl w:ilvl="2" w:tplc="653644E8">
       <w:numFmt w:val="decimal"/>
       <w:lvlText w:val=""/>
       <w:lvlJc w:val="left"/>
     </w:lvl>
-    <w:lvl w:ilvl="3" w:tplc="5EC4ED3A">
+    <w:lvl w:ilvl="3" w:tplc="E6969EFC">
       <w:numFmt w:val="decimal"/>
       <w:lvlText w:val=""/>
       <w:lvlJc w:val="left"/>
     </w:lvl>
-    <w:lvl w:ilvl="4" w:tplc="7E62F1C8">
+    <w:lvl w:ilvl="4" w:tplc="D36A4064">
       <w:numFmt w:val="decimal"/>
       <w:lvlText w:val=""/>
       <w:lvlJc w:val="left"/>
     </w:lvl>
-    <w:lvl w:ilvl="5" w:tplc="2B887D1E">
+    <w:lvl w:ilvl="5" w:tplc="92703F54">
       <w:numFmt w:val="decimal"/>
       <w:lvlText w:val=""/>
       <w:lvlJc w:val="left"/>
     </w:lvl>
-    <w:lvl w:ilvl="6" w:tplc="5E0ECB94">
+    <w:lvl w:ilvl="6" w:tplc="0E38BEBE">
       <w:numFmt w:val="decimal"/>
       <w:lvlText w:val=""/>
       <w:lvlJc w:val="left"/>
     </w:lvl>
-    <w:lvl w:ilvl="7" w:tplc="8B1A0AB0">
+    <w:lvl w:ilvl="7" w:tplc="12408330">
       <w:numFmt w:val="decimal"/>
       <w:lvlText w:val=""/>
       <w:lvlJc w:val="left"/>
     </w:lvl>
-    <w:lvl w:ilvl="8" w:tplc="70784D9A">
+    <w:lvl w:ilvl="8" w:tplc="7292BFE2">
       <w:numFmt w:val="decimal"/>
       <w:lvlText w:val=""/>
       <w:lvlJc w:val="left"/>
     </w:lvl>
   </w:abstractNum>
-  <w:abstractNum w:abstractNumId="6" w15:restartNumberingAfterBreak="0">
-    <w:nsid w:val="2174182C"/>
+  <w:abstractNum w:abstractNumId="7" w15:restartNumberingAfterBreak="0">
+    <w:nsid w:val="10E2641A"/>
     <w:multiLevelType w:val="hybridMultilevel"/>
-    <w:tmpl w:val="0414E7CA"/>
-    <w:lvl w:ilvl="0" w:tplc="E8AEDC9A">
+    <w:tmpl w:val="292CC366"/>
+    <w:lvl w:ilvl="0" w:tplc="A9D497EA">
       <w:start w:val="1"/>
       <w:numFmt w:val="decimal"/>
       <w:lvlText w:val="%1."/>
@@ -21658,52 +22016,52 @@
         <w:color w:val="A67C27"/>
       </w:rPr>
     </w:lvl>
-    <w:lvl w:ilvl="1" w:tplc="7CCE627E">
+    <w:lvl w:ilvl="1" w:tplc="6AD25A18">
       <w:numFmt w:val="decimal"/>
       <w:lvlText w:val=""/>
       <w:lvlJc w:val="left"/>
     </w:lvl>
-    <w:lvl w:ilvl="2" w:tplc="DBFA8F76">
+    <w:lvl w:ilvl="2" w:tplc="ADCAD03C">
       <w:numFmt w:val="decimal"/>
       <w:lvlText w:val=""/>
       <w:lvlJc w:val="left"/>
     </w:lvl>
-    <w:lvl w:ilvl="3" w:tplc="358C93B8">
+    <w:lvl w:ilvl="3" w:tplc="36F81B9C">
       <w:numFmt w:val="decimal"/>
       <w:lvlText w:val=""/>
       <w:lvlJc w:val="left"/>
     </w:lvl>
-    <w:lvl w:ilvl="4" w:tplc="99EC8EB6">
+    <w:lvl w:ilvl="4" w:tplc="B3B8386E">
       <w:numFmt w:val="decimal"/>
       <w:lvlText w:val=""/>
       <w:lvlJc w:val="left"/>
     </w:lvl>
-    <w:lvl w:ilvl="5" w:tplc="810AE0AA">
+    <w:lvl w:ilvl="5" w:tplc="57526A8E">
       <w:numFmt w:val="decimal"/>
       <w:lvlText w:val=""/>
       <w:lvlJc w:val="left"/>
     </w:lvl>
-    <w:lvl w:ilvl="6" w:tplc="8BD84516">
+    <w:lvl w:ilvl="6" w:tplc="5BFA03D8">
       <w:numFmt w:val="decimal"/>
       <w:lvlText w:val=""/>
       <w:lvlJc w:val="left"/>
     </w:lvl>
-    <w:lvl w:ilvl="7" w:tplc="C91003EA">
+    <w:lvl w:ilvl="7" w:tplc="C384566A">
       <w:numFmt w:val="decimal"/>
       <w:lvlText w:val=""/>
       <w:lvlJc w:val="left"/>
     </w:lvl>
-    <w:lvl w:ilvl="8" w:tplc="64A44FCA">
+    <w:lvl w:ilvl="8" w:tplc="923A4DB2">
       <w:numFmt w:val="decimal"/>
       <w:lvlText w:val=""/>
       <w:lvlJc w:val="left"/>
     </w:lvl>
   </w:abstractNum>
-  <w:abstractNum w:abstractNumId="7" w15:restartNumberingAfterBreak="0">
-    <w:nsid w:val="267B77FD"/>
+  <w:abstractNum w:abstractNumId="8" w15:restartNumberingAfterBreak="0">
+    <w:nsid w:val="120749F6"/>
     <w:multiLevelType w:val="hybridMultilevel"/>
-    <w:tmpl w:val="02C475BE"/>
-    <w:lvl w:ilvl="0" w:tplc="923A64EE">
+    <w:tmpl w:val="2DFC6240"/>
+    <w:lvl w:ilvl="0" w:tplc="CABC02E2">
       <w:start w:val="1"/>
       <w:numFmt w:val="decimal"/>
       <w:lvlText w:val="%1."/>
@@ -21717,110 +22075,52 @@
         <w:color w:val="A67C27"/>
       </w:rPr>
     </w:lvl>
-    <w:lvl w:ilvl="1" w:tplc="9C8ACF9C">
+    <w:lvl w:ilvl="1" w:tplc="0394C006">
       <w:numFmt w:val="decimal"/>
       <w:lvlText w:val=""/>
       <w:lvlJc w:val="left"/>
     </w:lvl>
-    <w:lvl w:ilvl="2" w:tplc="498AA9A6">
+    <w:lvl w:ilvl="2" w:tplc="5D52952C">
       <w:numFmt w:val="decimal"/>
       <w:lvlText w:val=""/>
       <w:lvlJc w:val="left"/>
     </w:lvl>
-    <w:lvl w:ilvl="3" w:tplc="B3E4E56A">
+    <w:lvl w:ilvl="3" w:tplc="4D705774">
       <w:numFmt w:val="decimal"/>
       <w:lvlText w:val=""/>
       <w:lvlJc w:val="left"/>
     </w:lvl>
-    <w:lvl w:ilvl="4" w:tplc="9D8686AC">
+    <w:lvl w:ilvl="4" w:tplc="88CEC9AE">
       <w:numFmt w:val="decimal"/>
       <w:lvlText w:val=""/>
       <w:lvlJc w:val="left"/>
     </w:lvl>
-    <w:lvl w:ilvl="5" w:tplc="D4FAFF9A">
+    <w:lvl w:ilvl="5" w:tplc="9DC4FE14">
       <w:numFmt w:val="decimal"/>
       <w:lvlText w:val=""/>
       <w:lvlJc w:val="left"/>
     </w:lvl>
-    <w:lvl w:ilvl="6" w:tplc="70C84A34">
+    <w:lvl w:ilvl="6" w:tplc="CEAC3D02">
       <w:numFmt w:val="decimal"/>
       <w:lvlText w:val=""/>
       <w:lvlJc w:val="left"/>
     </w:lvl>
-    <w:lvl w:ilvl="7" w:tplc="FCE6A650">
+    <w:lvl w:ilvl="7" w:tplc="E012A31E">
       <w:numFmt w:val="decimal"/>
       <w:lvlText w:val=""/>
       <w:lvlJc w:val="left"/>
     </w:lvl>
-    <w:lvl w:ilvl="8" w:tplc="EC0663A0">
-      <w:numFmt w:val="decimal"/>
-      <w:lvlText w:val=""/>
-      <w:lvlJc w:val="left"/>
-    </w:lvl>
-  </w:abstractNum>
-  <w:abstractNum w:abstractNumId="8" w15:restartNumberingAfterBreak="0">
-    <w:nsid w:val="2AFF221B"/>
-    <w:multiLevelType w:val="hybridMultilevel"/>
-    <w:tmpl w:val="21985066"/>
-    <w:lvl w:ilvl="0" w:tplc="BE60F7E6">
-      <w:start w:val="1"/>
-      <w:numFmt w:val="bullet"/>
-      <w:lvlText w:val="•"/>
-      <w:lvlJc w:val="left"/>
-      <w:pPr>
-        <w:ind w:left="460" w:hanging="280"/>
-      </w:pPr>
-    </w:lvl>
-    <w:lvl w:ilvl="1" w:tplc="D7A441B2">
-      <w:start w:val="1"/>
-      <w:numFmt w:val="bullet"/>
-      <w:lvlText w:val="–"/>
-      <w:lvlJc w:val="left"/>
-      <w:pPr>
-        <w:ind w:left="900" w:hanging="280"/>
-      </w:pPr>
-    </w:lvl>
-    <w:lvl w:ilvl="2" w:tplc="A884527A">
-      <w:numFmt w:val="decimal"/>
-      <w:lvlText w:val=""/>
-      <w:lvlJc w:val="left"/>
-    </w:lvl>
-    <w:lvl w:ilvl="3" w:tplc="769CC274">
-      <w:numFmt w:val="decimal"/>
-      <w:lvlText w:val=""/>
-      <w:lvlJc w:val="left"/>
-    </w:lvl>
-    <w:lvl w:ilvl="4" w:tplc="6156AD92">
-      <w:numFmt w:val="decimal"/>
-      <w:lvlText w:val=""/>
-      <w:lvlJc w:val="left"/>
-    </w:lvl>
-    <w:lvl w:ilvl="5" w:tplc="7090A94C">
-      <w:numFmt w:val="decimal"/>
-      <w:lvlText w:val=""/>
-      <w:lvlJc w:val="left"/>
-    </w:lvl>
-    <w:lvl w:ilvl="6" w:tplc="69E4C958">
-      <w:numFmt w:val="decimal"/>
-      <w:lvlText w:val=""/>
-      <w:lvlJc w:val="left"/>
-    </w:lvl>
-    <w:lvl w:ilvl="7" w:tplc="EAEAA8DE">
-      <w:numFmt w:val="decimal"/>
-      <w:lvlText w:val=""/>
-      <w:lvlJc w:val="left"/>
-    </w:lvl>
-    <w:lvl w:ilvl="8" w:tplc="F774B9E0">
+    <w:lvl w:ilvl="8" w:tplc="23607F34">
       <w:numFmt w:val="decimal"/>
       <w:lvlText w:val=""/>
       <w:lvlJc w:val="left"/>
     </w:lvl>
   </w:abstractNum>
   <w:abstractNum w:abstractNumId="9" w15:restartNumberingAfterBreak="0">
-    <w:nsid w:val="30265B1C"/>
+    <w:nsid w:val="199E7F2E"/>
     <w:multiLevelType w:val="hybridMultilevel"/>
-    <w:tmpl w:val="382C752A"/>
-    <w:lvl w:ilvl="0" w:tplc="3EB29740">
+    <w:tmpl w:val="96F6CFB4"/>
+    <w:lvl w:ilvl="0" w:tplc="B40EFFD8">
       <w:start w:val="1"/>
       <w:numFmt w:val="decimal"/>
       <w:lvlText w:val="%1."/>
@@ -21834,52 +22134,52 @@
         <w:color w:val="A67C27"/>
       </w:rPr>
     </w:lvl>
-    <w:lvl w:ilvl="1" w:tplc="DE74A5B2">
+    <w:lvl w:ilvl="1" w:tplc="B404AE16">
       <w:numFmt w:val="decimal"/>
       <w:lvlText w:val=""/>
       <w:lvlJc w:val="left"/>
     </w:lvl>
-    <w:lvl w:ilvl="2" w:tplc="4838FB12">
+    <w:lvl w:ilvl="2" w:tplc="1FD0DFA8">
       <w:numFmt w:val="decimal"/>
       <w:lvlText w:val=""/>
       <w:lvlJc w:val="left"/>
     </w:lvl>
-    <w:lvl w:ilvl="3" w:tplc="70141DB4">
+    <w:lvl w:ilvl="3" w:tplc="E0A258F6">
       <w:numFmt w:val="decimal"/>
       <w:lvlText w:val=""/>
       <w:lvlJc w:val="left"/>
     </w:lvl>
-    <w:lvl w:ilvl="4" w:tplc="D1B6E746">
+    <w:lvl w:ilvl="4" w:tplc="38DCA248">
       <w:numFmt w:val="decimal"/>
       <w:lvlText w:val=""/>
       <w:lvlJc w:val="left"/>
     </w:lvl>
-    <w:lvl w:ilvl="5" w:tplc="1C4A93CA">
+    <w:lvl w:ilvl="5" w:tplc="22B4BDE4">
       <w:numFmt w:val="decimal"/>
       <w:lvlText w:val=""/>
       <w:lvlJc w:val="left"/>
     </w:lvl>
-    <w:lvl w:ilvl="6" w:tplc="1F0094D6">
+    <w:lvl w:ilvl="6" w:tplc="58E83C14">
       <w:numFmt w:val="decimal"/>
       <w:lvlText w:val=""/>
       <w:lvlJc w:val="left"/>
     </w:lvl>
-    <w:lvl w:ilvl="7" w:tplc="5CB648E6">
+    <w:lvl w:ilvl="7" w:tplc="1DA0F5B2">
       <w:numFmt w:val="decimal"/>
       <w:lvlText w:val=""/>
       <w:lvlJc w:val="left"/>
     </w:lvl>
-    <w:lvl w:ilvl="8" w:tplc="25164A16">
+    <w:lvl w:ilvl="8" w:tplc="5CC8C5DA">
       <w:numFmt w:val="decimal"/>
       <w:lvlText w:val=""/>
       <w:lvlJc w:val="left"/>
     </w:lvl>
   </w:abstractNum>
   <w:abstractNum w:abstractNumId="10" w15:restartNumberingAfterBreak="0">
-    <w:nsid w:val="320E0408"/>
+    <w:nsid w:val="1BAA09DE"/>
     <w:multiLevelType w:val="hybridMultilevel"/>
-    <w:tmpl w:val="C9C8A98E"/>
-    <w:lvl w:ilvl="0" w:tplc="26B8C8CE">
+    <w:tmpl w:val="65226848"/>
+    <w:lvl w:ilvl="0" w:tplc="2F8A14B8">
       <w:start w:val="1"/>
       <w:numFmt w:val="decimal"/>
       <w:lvlText w:val="%1."/>
@@ -21893,52 +22193,52 @@
         <w:color w:val="A67C27"/>
       </w:rPr>
     </w:lvl>
-    <w:lvl w:ilvl="1" w:tplc="4506838A">
+    <w:lvl w:ilvl="1" w:tplc="2CE6BBE4">
       <w:numFmt w:val="decimal"/>
       <w:lvlText w:val=""/>
       <w:lvlJc w:val="left"/>
     </w:lvl>
-    <w:lvl w:ilvl="2" w:tplc="A6302D00">
+    <w:lvl w:ilvl="2" w:tplc="89FCFE9A">
       <w:numFmt w:val="decimal"/>
       <w:lvlText w:val=""/>
       <w:lvlJc w:val="left"/>
     </w:lvl>
-    <w:lvl w:ilvl="3" w:tplc="E7903FC4">
+    <w:lvl w:ilvl="3" w:tplc="23F280A6">
       <w:numFmt w:val="decimal"/>
       <w:lvlText w:val=""/>
       <w:lvlJc w:val="left"/>
     </w:lvl>
-    <w:lvl w:ilvl="4" w:tplc="A2ECC46A">
+    <w:lvl w:ilvl="4" w:tplc="003433D2">
       <w:numFmt w:val="decimal"/>
       <w:lvlText w:val=""/>
       <w:lvlJc w:val="left"/>
     </w:lvl>
-    <w:lvl w:ilvl="5" w:tplc="B4FE1682">
+    <w:lvl w:ilvl="5" w:tplc="8ED2B96A">
       <w:numFmt w:val="decimal"/>
       <w:lvlText w:val=""/>
       <w:lvlJc w:val="left"/>
     </w:lvl>
-    <w:lvl w:ilvl="6" w:tplc="F4E4985A">
+    <w:lvl w:ilvl="6" w:tplc="BC4EB664">
       <w:numFmt w:val="decimal"/>
       <w:lvlText w:val=""/>
       <w:lvlJc w:val="left"/>
     </w:lvl>
-    <w:lvl w:ilvl="7" w:tplc="607E22C6">
+    <w:lvl w:ilvl="7" w:tplc="C4CA00C2">
       <w:numFmt w:val="decimal"/>
       <w:lvlText w:val=""/>
       <w:lvlJc w:val="left"/>
     </w:lvl>
-    <w:lvl w:ilvl="8" w:tplc="6490625C">
+    <w:lvl w:ilvl="8" w:tplc="4D343B8C">
       <w:numFmt w:val="decimal"/>
       <w:lvlText w:val=""/>
       <w:lvlJc w:val="left"/>
     </w:lvl>
   </w:abstractNum>
   <w:abstractNum w:abstractNumId="11" w15:restartNumberingAfterBreak="0">
-    <w:nsid w:val="3536163F"/>
+    <w:nsid w:val="297777BB"/>
     <w:multiLevelType w:val="hybridMultilevel"/>
-    <w:tmpl w:val="5BE00EAE"/>
-    <w:lvl w:ilvl="0" w:tplc="81E23FD2">
+    <w:tmpl w:val="0D4ED090"/>
+    <w:lvl w:ilvl="0" w:tplc="D41CF7A2">
       <w:start w:val="1"/>
       <w:numFmt w:val="decimal"/>
       <w:lvlText w:val="%1."/>
@@ -21952,52 +22252,52 @@
         <w:color w:val="A67C27"/>
       </w:rPr>
     </w:lvl>
-    <w:lvl w:ilvl="1" w:tplc="D9808A22">
+    <w:lvl w:ilvl="1" w:tplc="99ACD390">
       <w:numFmt w:val="decimal"/>
       <w:lvlText w:val=""/>
       <w:lvlJc w:val="left"/>
     </w:lvl>
-    <w:lvl w:ilvl="2" w:tplc="CF883706">
+    <w:lvl w:ilvl="2" w:tplc="F7FC0598">
       <w:numFmt w:val="decimal"/>
       <w:lvlText w:val=""/>
       <w:lvlJc w:val="left"/>
     </w:lvl>
-    <w:lvl w:ilvl="3" w:tplc="55529BC0">
+    <w:lvl w:ilvl="3" w:tplc="00006C6C">
       <w:numFmt w:val="decimal"/>
       <w:lvlText w:val=""/>
       <w:lvlJc w:val="left"/>
     </w:lvl>
-    <w:lvl w:ilvl="4" w:tplc="90A8EE1C">
+    <w:lvl w:ilvl="4" w:tplc="CA802ACE">
       <w:numFmt w:val="decimal"/>
       <w:lvlText w:val=""/>
       <w:lvlJc w:val="left"/>
     </w:lvl>
-    <w:lvl w:ilvl="5" w:tplc="2C5E6A30">
+    <w:lvl w:ilvl="5" w:tplc="A38C99B6">
       <w:numFmt w:val="decimal"/>
       <w:lvlText w:val=""/>
       <w:lvlJc w:val="left"/>
     </w:lvl>
-    <w:lvl w:ilvl="6" w:tplc="3A20531E">
+    <w:lvl w:ilvl="6" w:tplc="5500698E">
       <w:numFmt w:val="decimal"/>
       <w:lvlText w:val=""/>
       <w:lvlJc w:val="left"/>
     </w:lvl>
-    <w:lvl w:ilvl="7" w:tplc="229647E2">
+    <w:lvl w:ilvl="7" w:tplc="0452FE64">
       <w:numFmt w:val="decimal"/>
       <w:lvlText w:val=""/>
       <w:lvlJc w:val="left"/>
     </w:lvl>
-    <w:lvl w:ilvl="8" w:tplc="2B42F034">
+    <w:lvl w:ilvl="8" w:tplc="F42CF5C2">
       <w:numFmt w:val="decimal"/>
       <w:lvlText w:val=""/>
       <w:lvlJc w:val="left"/>
     </w:lvl>
   </w:abstractNum>
   <w:abstractNum w:abstractNumId="12" w15:restartNumberingAfterBreak="0">
-    <w:nsid w:val="37CA7F49"/>
+    <w:nsid w:val="2F9E0C9A"/>
     <w:multiLevelType w:val="hybridMultilevel"/>
-    <w:tmpl w:val="C714C6EA"/>
-    <w:lvl w:ilvl="0" w:tplc="AA7492A8">
+    <w:tmpl w:val="5E787706"/>
+    <w:lvl w:ilvl="0" w:tplc="85463B26">
       <w:start w:val="1"/>
       <w:numFmt w:val="decimal"/>
       <w:lvlText w:val="%1."/>
@@ -22011,52 +22311,52 @@
         <w:color w:val="A67C27"/>
       </w:rPr>
     </w:lvl>
-    <w:lvl w:ilvl="1" w:tplc="BB4E573E">
+    <w:lvl w:ilvl="1" w:tplc="9FC48B5C">
       <w:numFmt w:val="decimal"/>
       <w:lvlText w:val=""/>
       <w:lvlJc w:val="left"/>
     </w:lvl>
-    <w:lvl w:ilvl="2" w:tplc="7C2E75B8">
+    <w:lvl w:ilvl="2" w:tplc="D1869700">
       <w:numFmt w:val="decimal"/>
       <w:lvlText w:val=""/>
       <w:lvlJc w:val="left"/>
     </w:lvl>
-    <w:lvl w:ilvl="3" w:tplc="8DF6AEAA">
+    <w:lvl w:ilvl="3" w:tplc="83E8EF4C">
       <w:numFmt w:val="decimal"/>
       <w:lvlText w:val=""/>
       <w:lvlJc w:val="left"/>
     </w:lvl>
-    <w:lvl w:ilvl="4" w:tplc="46CC7B06">
+    <w:lvl w:ilvl="4" w:tplc="F2E03A08">
       <w:numFmt w:val="decimal"/>
       <w:lvlText w:val=""/>
       <w:lvlJc w:val="left"/>
     </w:lvl>
-    <w:lvl w:ilvl="5" w:tplc="1B109160">
+    <w:lvl w:ilvl="5" w:tplc="A32EA162">
       <w:numFmt w:val="decimal"/>
       <w:lvlText w:val=""/>
       <w:lvlJc w:val="left"/>
     </w:lvl>
-    <w:lvl w:ilvl="6" w:tplc="802812EC">
+    <w:lvl w:ilvl="6" w:tplc="C2F83EB0">
       <w:numFmt w:val="decimal"/>
       <w:lvlText w:val=""/>
       <w:lvlJc w:val="left"/>
     </w:lvl>
-    <w:lvl w:ilvl="7" w:tplc="4E22037E">
+    <w:lvl w:ilvl="7" w:tplc="60283948">
       <w:numFmt w:val="decimal"/>
       <w:lvlText w:val=""/>
       <w:lvlJc w:val="left"/>
     </w:lvl>
-    <w:lvl w:ilvl="8" w:tplc="682A9D0E">
+    <w:lvl w:ilvl="8" w:tplc="F5542608">
       <w:numFmt w:val="decimal"/>
       <w:lvlText w:val=""/>
       <w:lvlJc w:val="left"/>
     </w:lvl>
   </w:abstractNum>
   <w:abstractNum w:abstractNumId="13" w15:restartNumberingAfterBreak="0">
-    <w:nsid w:val="3BAC6ADF"/>
+    <w:nsid w:val="43CA531E"/>
     <w:multiLevelType w:val="hybridMultilevel"/>
-    <w:tmpl w:val="777E82FC"/>
-    <w:lvl w:ilvl="0" w:tplc="5AF00978">
+    <w:tmpl w:val="EB02547A"/>
+    <w:lvl w:ilvl="0" w:tplc="4E9409F4">
       <w:start w:val="1"/>
       <w:numFmt w:val="decimal"/>
       <w:lvlText w:val="%1."/>
@@ -22070,138 +22370,52 @@
         <w:color w:val="A67C27"/>
       </w:rPr>
     </w:lvl>
-    <w:lvl w:ilvl="1" w:tplc="B0E249A4">
+    <w:lvl w:ilvl="1" w:tplc="49CC8024">
       <w:numFmt w:val="decimal"/>
       <w:lvlText w:val=""/>
       <w:lvlJc w:val="left"/>
     </w:lvl>
-    <w:lvl w:ilvl="2" w:tplc="855A3C4E">
+    <w:lvl w:ilvl="2" w:tplc="4BFEDBC6">
       <w:numFmt w:val="decimal"/>
       <w:lvlText w:val=""/>
       <w:lvlJc w:val="left"/>
     </w:lvl>
-    <w:lvl w:ilvl="3" w:tplc="D5106CE6">
+    <w:lvl w:ilvl="3" w:tplc="C94A9C6A">
       <w:numFmt w:val="decimal"/>
       <w:lvlText w:val=""/>
       <w:lvlJc w:val="left"/>
     </w:lvl>
-    <w:lvl w:ilvl="4" w:tplc="2B70AE5E">
+    <w:lvl w:ilvl="4" w:tplc="F424C45E">
       <w:numFmt w:val="decimal"/>
       <w:lvlText w:val=""/>
       <w:lvlJc w:val="left"/>
     </w:lvl>
-    <w:lvl w:ilvl="5" w:tplc="F41C91B6">
+    <w:lvl w:ilvl="5" w:tplc="CFBC0CD6">
       <w:numFmt w:val="decimal"/>
       <w:lvlText w:val=""/>
       <w:lvlJc w:val="left"/>
     </w:lvl>
-    <w:lvl w:ilvl="6" w:tplc="68EA69A6">
+    <w:lvl w:ilvl="6" w:tplc="D5AEFEB8">
       <w:numFmt w:val="decimal"/>
       <w:lvlText w:val=""/>
       <w:lvlJc w:val="left"/>
     </w:lvl>
-    <w:lvl w:ilvl="7" w:tplc="8AE63A48">
+    <w:lvl w:ilvl="7" w:tplc="75BC31D0">
       <w:numFmt w:val="decimal"/>
       <w:lvlText w:val=""/>
       <w:lvlJc w:val="left"/>
     </w:lvl>
-    <w:lvl w:ilvl="8" w:tplc="35B23B48">
+    <w:lvl w:ilvl="8" w:tplc="4F8E81D8">
       <w:numFmt w:val="decimal"/>
       <w:lvlText w:val=""/>
       <w:lvlJc w:val="left"/>
     </w:lvl>
   </w:abstractNum>
   <w:abstractNum w:abstractNumId="14" w15:restartNumberingAfterBreak="0">
-    <w:nsid w:val="46334CAD"/>
+    <w:nsid w:val="4A513D0F"/>
     <w:multiLevelType w:val="hybridMultilevel"/>
-    <w:tmpl w:val="B6A44EE8"/>
-    <w:lvl w:ilvl="0" w:tplc="930E0F52">
-      <w:start w:val="1"/>
-      <w:numFmt w:val="bullet"/>
-      <w:lvlText w:val="●"/>
-      <w:lvlJc w:val="left"/>
-      <w:pPr>
-        <w:ind w:left="720" w:hanging="360"/>
-      </w:pPr>
-    </w:lvl>
-    <w:lvl w:ilvl="1" w:tplc="29A4F1D8">
-      <w:start w:val="1"/>
-      <w:numFmt w:val="bullet"/>
-      <w:lvlText w:val="○"/>
-      <w:lvlJc w:val="left"/>
-      <w:pPr>
-        <w:ind w:left="1440" w:hanging="360"/>
-      </w:pPr>
-    </w:lvl>
-    <w:lvl w:ilvl="2" w:tplc="ADB464D6">
-      <w:start w:val="1"/>
-      <w:numFmt w:val="bullet"/>
-      <w:lvlText w:val="■"/>
-      <w:lvlJc w:val="left"/>
-      <w:pPr>
-        <w:ind w:left="2160" w:hanging="360"/>
-      </w:pPr>
-    </w:lvl>
-    <w:lvl w:ilvl="3" w:tplc="CA78E430">
-      <w:start w:val="1"/>
-      <w:numFmt w:val="bullet"/>
-      <w:lvlText w:val="●"/>
-      <w:lvlJc w:val="left"/>
-      <w:pPr>
-        <w:ind w:left="2880" w:hanging="360"/>
-      </w:pPr>
-    </w:lvl>
-    <w:lvl w:ilvl="4" w:tplc="A9C8C9B2">
-      <w:start w:val="1"/>
-      <w:numFmt w:val="bullet"/>
-      <w:lvlText w:val="○"/>
-      <w:lvlJc w:val="left"/>
-      <w:pPr>
-        <w:ind w:left="3600" w:hanging="360"/>
-      </w:pPr>
-    </w:lvl>
-    <w:lvl w:ilvl="5" w:tplc="34E0DA00">
-      <w:start w:val="1"/>
-      <w:numFmt w:val="bullet"/>
-      <w:lvlText w:val="■"/>
-      <w:lvlJc w:val="left"/>
-      <w:pPr>
-        <w:ind w:left="4320" w:hanging="360"/>
-      </w:pPr>
-    </w:lvl>
-    <w:lvl w:ilvl="6" w:tplc="E42E5034">
-      <w:start w:val="1"/>
-      <w:numFmt w:val="bullet"/>
-      <w:lvlText w:val="●"/>
-      <w:lvlJc w:val="left"/>
-      <w:pPr>
-        <w:ind w:left="5040" w:hanging="360"/>
-      </w:pPr>
-    </w:lvl>
-    <w:lvl w:ilvl="7" w:tplc="3A5EA530">
-      <w:start w:val="1"/>
-      <w:numFmt w:val="bullet"/>
-      <w:lvlText w:val="●"/>
-      <w:lvlJc w:val="left"/>
-      <w:pPr>
-        <w:ind w:left="5760" w:hanging="360"/>
-      </w:pPr>
-    </w:lvl>
-    <w:lvl w:ilvl="8" w:tplc="B0704C9C">
-      <w:start w:val="1"/>
-      <w:numFmt w:val="bullet"/>
-      <w:lvlText w:val="●"/>
-      <w:lvlJc w:val="left"/>
-      <w:pPr>
-        <w:ind w:left="6480" w:hanging="360"/>
-      </w:pPr>
-    </w:lvl>
-  </w:abstractNum>
-  <w:abstractNum w:abstractNumId="15" w15:restartNumberingAfterBreak="0">
-    <w:nsid w:val="581E4E25"/>
-    <w:multiLevelType w:val="hybridMultilevel"/>
-    <w:tmpl w:val="626C3170"/>
-    <w:lvl w:ilvl="0" w:tplc="1E7CE66E">
+    <w:tmpl w:val="69880C2E"/>
+    <w:lvl w:ilvl="0" w:tplc="BF20A102">
       <w:start w:val="1"/>
       <w:numFmt w:val="decimal"/>
       <w:lvlText w:val="%1."/>
@@ -22215,52 +22429,111 @@
         <w:color w:val="A67C27"/>
       </w:rPr>
     </w:lvl>
-    <w:lvl w:ilvl="1" w:tplc="96A82466">
+    <w:lvl w:ilvl="1" w:tplc="7832B5C2">
       <w:numFmt w:val="decimal"/>
       <w:lvlText w:val=""/>
       <w:lvlJc w:val="left"/>
     </w:lvl>
-    <w:lvl w:ilvl="2" w:tplc="A9A49170">
+    <w:lvl w:ilvl="2" w:tplc="8C5E52E6">
       <w:numFmt w:val="decimal"/>
       <w:lvlText w:val=""/>
       <w:lvlJc w:val="left"/>
     </w:lvl>
-    <w:lvl w:ilvl="3" w:tplc="D9F29D16">
+    <w:lvl w:ilvl="3" w:tplc="95A20F7E">
       <w:numFmt w:val="decimal"/>
       <w:lvlText w:val=""/>
       <w:lvlJc w:val="left"/>
     </w:lvl>
-    <w:lvl w:ilvl="4" w:tplc="DBBC5EF0">
+    <w:lvl w:ilvl="4" w:tplc="C774253A">
       <w:numFmt w:val="decimal"/>
       <w:lvlText w:val=""/>
       <w:lvlJc w:val="left"/>
     </w:lvl>
-    <w:lvl w:ilvl="5" w:tplc="73E48D8C">
+    <w:lvl w:ilvl="5" w:tplc="9C1EDA0A">
       <w:numFmt w:val="decimal"/>
       <w:lvlText w:val=""/>
       <w:lvlJc w:val="left"/>
     </w:lvl>
-    <w:lvl w:ilvl="6" w:tplc="C9BA9288">
+    <w:lvl w:ilvl="6" w:tplc="7092FC02">
       <w:numFmt w:val="decimal"/>
       <w:lvlText w:val=""/>
       <w:lvlJc w:val="left"/>
     </w:lvl>
-    <w:lvl w:ilvl="7" w:tplc="E7C401BC">
+    <w:lvl w:ilvl="7" w:tplc="6E0A04C8">
       <w:numFmt w:val="decimal"/>
       <w:lvlText w:val=""/>
       <w:lvlJc w:val="left"/>
     </w:lvl>
-    <w:lvl w:ilvl="8" w:tplc="FEB62218">
+    <w:lvl w:ilvl="8" w:tplc="A516A62C">
+      <w:numFmt w:val="decimal"/>
+      <w:lvlText w:val=""/>
+      <w:lvlJc w:val="left"/>
+    </w:lvl>
+  </w:abstractNum>
+  <w:abstractNum w:abstractNumId="15" w15:restartNumberingAfterBreak="0">
+    <w:nsid w:val="4E625A08"/>
+    <w:multiLevelType w:val="hybridMultilevel"/>
+    <w:tmpl w:val="6EE4B49A"/>
+    <w:lvl w:ilvl="0" w:tplc="2A1AB4DE">
+      <w:start w:val="1"/>
+      <w:numFmt w:val="decimal"/>
+      <w:lvlText w:val="%1."/>
+      <w:lvlJc w:val="left"/>
+      <w:pPr>
+        <w:ind w:left="460" w:hanging="360"/>
+      </w:pPr>
+      <w:rPr>
+        <w:b/>
+        <w:bCs/>
+        <w:color w:val="A67C27"/>
+      </w:rPr>
+    </w:lvl>
+    <w:lvl w:ilvl="1" w:tplc="3A566CC6">
+      <w:numFmt w:val="decimal"/>
+      <w:lvlText w:val=""/>
+      <w:lvlJc w:val="left"/>
+    </w:lvl>
+    <w:lvl w:ilvl="2" w:tplc="51A6BC3E">
+      <w:numFmt w:val="decimal"/>
+      <w:lvlText w:val=""/>
+      <w:lvlJc w:val="left"/>
+    </w:lvl>
+    <w:lvl w:ilvl="3" w:tplc="0AA0139A">
+      <w:numFmt w:val="decimal"/>
+      <w:lvlText w:val=""/>
+      <w:lvlJc w:val="left"/>
+    </w:lvl>
+    <w:lvl w:ilvl="4" w:tplc="58D086E2">
+      <w:numFmt w:val="decimal"/>
+      <w:lvlText w:val=""/>
+      <w:lvlJc w:val="left"/>
+    </w:lvl>
+    <w:lvl w:ilvl="5" w:tplc="07967472">
+      <w:numFmt w:val="decimal"/>
+      <w:lvlText w:val=""/>
+      <w:lvlJc w:val="left"/>
+    </w:lvl>
+    <w:lvl w:ilvl="6" w:tplc="C750D03C">
+      <w:numFmt w:val="decimal"/>
+      <w:lvlText w:val=""/>
+      <w:lvlJc w:val="left"/>
+    </w:lvl>
+    <w:lvl w:ilvl="7" w:tplc="1C9A8C08">
+      <w:numFmt w:val="decimal"/>
+      <w:lvlText w:val=""/>
+      <w:lvlJc w:val="left"/>
+    </w:lvl>
+    <w:lvl w:ilvl="8" w:tplc="94FAB320">
       <w:numFmt w:val="decimal"/>
       <w:lvlText w:val=""/>
       <w:lvlJc w:val="left"/>
     </w:lvl>
   </w:abstractNum>
   <w:abstractNum w:abstractNumId="16" w15:restartNumberingAfterBreak="0">
-    <w:nsid w:val="5BE8240E"/>
+    <w:nsid w:val="52431031"/>
     <w:multiLevelType w:val="hybridMultilevel"/>
-    <w:tmpl w:val="DB34FE5A"/>
-    <w:lvl w:ilvl="0" w:tplc="6110111C">
+    <w:tmpl w:val="B9BE1E64"/>
+    <w:lvl w:ilvl="0" w:tplc="4456EC2E">
       <w:start w:val="1"/>
       <w:numFmt w:val="decimal"/>
       <w:lvlText w:val="%1."/>
@@ -22274,52 +22547,52 @@
         <w:color w:val="A67C27"/>
       </w:rPr>
     </w:lvl>
-    <w:lvl w:ilvl="1" w:tplc="A5CE3850">
+    <w:lvl w:ilvl="1" w:tplc="5942C934">
       <w:numFmt w:val="decimal"/>
       <w:lvlText w:val=""/>
       <w:lvlJc w:val="left"/>
     </w:lvl>
-    <w:lvl w:ilvl="2" w:tplc="A9BC10D6">
+    <w:lvl w:ilvl="2" w:tplc="6734ACBE">
       <w:numFmt w:val="decimal"/>
       <w:lvlText w:val=""/>
       <w:lvlJc w:val="left"/>
     </w:lvl>
-    <w:lvl w:ilvl="3" w:tplc="65CC9FD0">
+    <w:lvl w:ilvl="3" w:tplc="627A4408">
       <w:numFmt w:val="decimal"/>
       <w:lvlText w:val=""/>
       <w:lvlJc w:val="left"/>
     </w:lvl>
-    <w:lvl w:ilvl="4" w:tplc="8F2866E0">
+    <w:lvl w:ilvl="4" w:tplc="5CAEE910">
       <w:numFmt w:val="decimal"/>
       <w:lvlText w:val=""/>
       <w:lvlJc w:val="left"/>
     </w:lvl>
-    <w:lvl w:ilvl="5" w:tplc="FD984862">
+    <w:lvl w:ilvl="5" w:tplc="9DE03290">
       <w:numFmt w:val="decimal"/>
       <w:lvlText w:val=""/>
       <w:lvlJc w:val="left"/>
     </w:lvl>
-    <w:lvl w:ilvl="6" w:tplc="3796BD10">
+    <w:lvl w:ilvl="6" w:tplc="4DA2D4A8">
       <w:numFmt w:val="decimal"/>
       <w:lvlText w:val=""/>
       <w:lvlJc w:val="left"/>
     </w:lvl>
-    <w:lvl w:ilvl="7" w:tplc="8AA43F96">
+    <w:lvl w:ilvl="7" w:tplc="ECAE6C5E">
       <w:numFmt w:val="decimal"/>
       <w:lvlText w:val=""/>
       <w:lvlJc w:val="left"/>
     </w:lvl>
-    <w:lvl w:ilvl="8" w:tplc="CA9A1098">
+    <w:lvl w:ilvl="8" w:tplc="D564F520">
       <w:numFmt w:val="decimal"/>
       <w:lvlText w:val=""/>
       <w:lvlJc w:val="left"/>
     </w:lvl>
   </w:abstractNum>
   <w:abstractNum w:abstractNumId="17" w15:restartNumberingAfterBreak="0">
-    <w:nsid w:val="5CE63D01"/>
+    <w:nsid w:val="554616DE"/>
     <w:multiLevelType w:val="hybridMultilevel"/>
-    <w:tmpl w:val="3D20881E"/>
-    <w:lvl w:ilvl="0" w:tplc="7158B972">
+    <w:tmpl w:val="CCBCBC8A"/>
+    <w:lvl w:ilvl="0" w:tplc="851AC3C4">
       <w:start w:val="1"/>
       <w:numFmt w:val="decimal"/>
       <w:lvlText w:val="%1."/>
@@ -22333,52 +22606,52 @@
         <w:color w:val="A67C27"/>
       </w:rPr>
     </w:lvl>
-    <w:lvl w:ilvl="1" w:tplc="F82098CA">
+    <w:lvl w:ilvl="1" w:tplc="A8CE68E4">
       <w:numFmt w:val="decimal"/>
       <w:lvlText w:val=""/>
       <w:lvlJc w:val="left"/>
     </w:lvl>
-    <w:lvl w:ilvl="2" w:tplc="F7D8D4DC">
+    <w:lvl w:ilvl="2" w:tplc="82CC4C38">
       <w:numFmt w:val="decimal"/>
       <w:lvlText w:val=""/>
       <w:lvlJc w:val="left"/>
     </w:lvl>
-    <w:lvl w:ilvl="3" w:tplc="777A16F6">
+    <w:lvl w:ilvl="3" w:tplc="7F3C99C6">
       <w:numFmt w:val="decimal"/>
       <w:lvlText w:val=""/>
       <w:lvlJc w:val="left"/>
     </w:lvl>
-    <w:lvl w:ilvl="4" w:tplc="574C7402">
+    <w:lvl w:ilvl="4" w:tplc="BAEC9DF2">
       <w:numFmt w:val="decimal"/>
       <w:lvlText w:val=""/>
       <w:lvlJc w:val="left"/>
     </w:lvl>
-    <w:lvl w:ilvl="5" w:tplc="CCA0C8C4">
+    <w:lvl w:ilvl="5" w:tplc="B3DA269C">
       <w:numFmt w:val="decimal"/>
       <w:lvlText w:val=""/>
       <w:lvlJc w:val="left"/>
     </w:lvl>
-    <w:lvl w:ilvl="6" w:tplc="AC389520">
+    <w:lvl w:ilvl="6" w:tplc="82A448E6">
       <w:numFmt w:val="decimal"/>
       <w:lvlText w:val=""/>
       <w:lvlJc w:val="left"/>
     </w:lvl>
-    <w:lvl w:ilvl="7" w:tplc="9A36A25C">
+    <w:lvl w:ilvl="7" w:tplc="0B68E498">
       <w:numFmt w:val="decimal"/>
       <w:lvlText w:val=""/>
       <w:lvlJc w:val="left"/>
     </w:lvl>
-    <w:lvl w:ilvl="8" w:tplc="4E3E0BF8">
+    <w:lvl w:ilvl="8" w:tplc="22C417F8">
       <w:numFmt w:val="decimal"/>
       <w:lvlText w:val=""/>
       <w:lvlJc w:val="left"/>
     </w:lvl>
   </w:abstractNum>
   <w:abstractNum w:abstractNumId="18" w15:restartNumberingAfterBreak="0">
-    <w:nsid w:val="5FDA76E1"/>
+    <w:nsid w:val="57534971"/>
     <w:multiLevelType w:val="hybridMultilevel"/>
-    <w:tmpl w:val="C150A700"/>
-    <w:lvl w:ilvl="0" w:tplc="15DE412E">
+    <w:tmpl w:val="4FC23884"/>
+    <w:lvl w:ilvl="0" w:tplc="731A5178">
       <w:start w:val="1"/>
       <w:numFmt w:val="decimal"/>
       <w:lvlText w:val="%1."/>
@@ -22392,52 +22665,52 @@
         <w:color w:val="A67C27"/>
       </w:rPr>
     </w:lvl>
-    <w:lvl w:ilvl="1" w:tplc="DFF69A1E">
+    <w:lvl w:ilvl="1" w:tplc="D79C306E">
       <w:numFmt w:val="decimal"/>
       <w:lvlText w:val=""/>
       <w:lvlJc w:val="left"/>
     </w:lvl>
-    <w:lvl w:ilvl="2" w:tplc="D7D0044C">
+    <w:lvl w:ilvl="2" w:tplc="4966356C">
       <w:numFmt w:val="decimal"/>
       <w:lvlText w:val=""/>
       <w:lvlJc w:val="left"/>
     </w:lvl>
-    <w:lvl w:ilvl="3" w:tplc="1102E26C">
+    <w:lvl w:ilvl="3" w:tplc="C2921590">
       <w:numFmt w:val="decimal"/>
       <w:lvlText w:val=""/>
       <w:lvlJc w:val="left"/>
     </w:lvl>
-    <w:lvl w:ilvl="4" w:tplc="D4147C8A">
+    <w:lvl w:ilvl="4" w:tplc="AF7231E4">
       <w:numFmt w:val="decimal"/>
       <w:lvlText w:val=""/>
       <w:lvlJc w:val="left"/>
     </w:lvl>
-    <w:lvl w:ilvl="5" w:tplc="4FDE826C">
+    <w:lvl w:ilvl="5" w:tplc="55D2F0B2">
       <w:numFmt w:val="decimal"/>
       <w:lvlText w:val=""/>
       <w:lvlJc w:val="left"/>
     </w:lvl>
-    <w:lvl w:ilvl="6" w:tplc="F96C6082">
+    <w:lvl w:ilvl="6" w:tplc="5EDA412E">
       <w:numFmt w:val="decimal"/>
       <w:lvlText w:val=""/>
       <w:lvlJc w:val="left"/>
     </w:lvl>
-    <w:lvl w:ilvl="7" w:tplc="F290224A">
+    <w:lvl w:ilvl="7" w:tplc="0BA2A84A">
       <w:numFmt w:val="decimal"/>
       <w:lvlText w:val=""/>
       <w:lvlJc w:val="left"/>
     </w:lvl>
-    <w:lvl w:ilvl="8" w:tplc="B2C00B80">
+    <w:lvl w:ilvl="8" w:tplc="9156FE7A">
       <w:numFmt w:val="decimal"/>
       <w:lvlText w:val=""/>
       <w:lvlJc w:val="left"/>
     </w:lvl>
   </w:abstractNum>
   <w:abstractNum w:abstractNumId="19" w15:restartNumberingAfterBreak="0">
-    <w:nsid w:val="62AF1E95"/>
+    <w:nsid w:val="5CEA3646"/>
     <w:multiLevelType w:val="hybridMultilevel"/>
-    <w:tmpl w:val="06647374"/>
-    <w:lvl w:ilvl="0" w:tplc="C5A841A4">
+    <w:tmpl w:val="BD42180E"/>
+    <w:lvl w:ilvl="0" w:tplc="4DDEC036">
       <w:start w:val="1"/>
       <w:numFmt w:val="decimal"/>
       <w:lvlText w:val="%1."/>
@@ -22451,52 +22724,110 @@
         <w:color w:val="A67C27"/>
       </w:rPr>
     </w:lvl>
-    <w:lvl w:ilvl="1" w:tplc="B4466F32">
+    <w:lvl w:ilvl="1" w:tplc="85A218B0">
       <w:numFmt w:val="decimal"/>
       <w:lvlText w:val=""/>
       <w:lvlJc w:val="left"/>
     </w:lvl>
-    <w:lvl w:ilvl="2" w:tplc="5838E0F0">
+    <w:lvl w:ilvl="2" w:tplc="57FA7940">
       <w:numFmt w:val="decimal"/>
       <w:lvlText w:val=""/>
       <w:lvlJc w:val="left"/>
     </w:lvl>
-    <w:lvl w:ilvl="3" w:tplc="19F4152C">
+    <w:lvl w:ilvl="3" w:tplc="2518594C">
       <w:numFmt w:val="decimal"/>
       <w:lvlText w:val=""/>
       <w:lvlJc w:val="left"/>
     </w:lvl>
-    <w:lvl w:ilvl="4" w:tplc="8438F5B0">
+    <w:lvl w:ilvl="4" w:tplc="499C532E">
       <w:numFmt w:val="decimal"/>
       <w:lvlText w:val=""/>
       <w:lvlJc w:val="left"/>
     </w:lvl>
-    <w:lvl w:ilvl="5" w:tplc="EB443446">
+    <w:lvl w:ilvl="5" w:tplc="9ADECAC6">
       <w:numFmt w:val="decimal"/>
       <w:lvlText w:val=""/>
       <w:lvlJc w:val="left"/>
     </w:lvl>
-    <w:lvl w:ilvl="6" w:tplc="C18248B0">
+    <w:lvl w:ilvl="6" w:tplc="ADAC22E6">
       <w:numFmt w:val="decimal"/>
       <w:lvlText w:val=""/>
       <w:lvlJc w:val="left"/>
     </w:lvl>
-    <w:lvl w:ilvl="7" w:tplc="11765112">
+    <w:lvl w:ilvl="7" w:tplc="1826D316">
       <w:numFmt w:val="decimal"/>
       <w:lvlText w:val=""/>
       <w:lvlJc w:val="left"/>
     </w:lvl>
-    <w:lvl w:ilvl="8" w:tplc="905A4064">
+    <w:lvl w:ilvl="8" w:tplc="6D049F5E">
       <w:numFmt w:val="decimal"/>
       <w:lvlText w:val=""/>
       <w:lvlJc w:val="left"/>
     </w:lvl>
   </w:abstractNum>
   <w:abstractNum w:abstractNumId="20" w15:restartNumberingAfterBreak="0">
-    <w:nsid w:val="66133636"/>
+    <w:nsid w:val="652C1AB7"/>
     <w:multiLevelType w:val="hybridMultilevel"/>
-    <w:tmpl w:val="CAE67458"/>
-    <w:lvl w:ilvl="0" w:tplc="BE0ECD4C">
+    <w:tmpl w:val="362EFB96"/>
+    <w:lvl w:ilvl="0" w:tplc="75F25322">
+      <w:start w:val="1"/>
+      <w:numFmt w:val="bullet"/>
+      <w:lvlText w:val="•"/>
+      <w:lvlJc w:val="left"/>
+      <w:pPr>
+        <w:ind w:left="460" w:hanging="280"/>
+      </w:pPr>
+    </w:lvl>
+    <w:lvl w:ilvl="1" w:tplc="99FE17F4">
+      <w:start w:val="1"/>
+      <w:numFmt w:val="bullet"/>
+      <w:lvlText w:val="–"/>
+      <w:lvlJc w:val="left"/>
+      <w:pPr>
+        <w:ind w:left="900" w:hanging="280"/>
+      </w:pPr>
+    </w:lvl>
+    <w:lvl w:ilvl="2" w:tplc="6666D614">
+      <w:numFmt w:val="decimal"/>
+      <w:lvlText w:val=""/>
+      <w:lvlJc w:val="left"/>
+    </w:lvl>
+    <w:lvl w:ilvl="3" w:tplc="7D7ED298">
+      <w:numFmt w:val="decimal"/>
+      <w:lvlText w:val=""/>
+      <w:lvlJc w:val="left"/>
+    </w:lvl>
+    <w:lvl w:ilvl="4" w:tplc="D1A070E4">
+      <w:numFmt w:val="decimal"/>
+      <w:lvlText w:val=""/>
+      <w:lvlJc w:val="left"/>
+    </w:lvl>
+    <w:lvl w:ilvl="5" w:tplc="3BF0F938">
+      <w:numFmt w:val="decimal"/>
+      <w:lvlText w:val=""/>
+      <w:lvlJc w:val="left"/>
+    </w:lvl>
+    <w:lvl w:ilvl="6" w:tplc="990008CC">
+      <w:numFmt w:val="decimal"/>
+      <w:lvlText w:val=""/>
+      <w:lvlJc w:val="left"/>
+    </w:lvl>
+    <w:lvl w:ilvl="7" w:tplc="C3762EA4">
+      <w:numFmt w:val="decimal"/>
+      <w:lvlText w:val=""/>
+      <w:lvlJc w:val="left"/>
+    </w:lvl>
+    <w:lvl w:ilvl="8" w:tplc="972283AA">
+      <w:numFmt w:val="decimal"/>
+      <w:lvlText w:val=""/>
+      <w:lvlJc w:val="left"/>
+    </w:lvl>
+  </w:abstractNum>
+  <w:abstractNum w:abstractNumId="21" w15:restartNumberingAfterBreak="0">
+    <w:nsid w:val="698B4B19"/>
+    <w:multiLevelType w:val="hybridMultilevel"/>
+    <w:tmpl w:val="745EBB24"/>
+    <w:lvl w:ilvl="0" w:tplc="C6262272">
       <w:start w:val="1"/>
       <w:numFmt w:val="decimal"/>
       <w:lvlText w:val="%1."/>
@@ -22510,52 +22841,52 @@
         <w:color w:val="A67C27"/>
       </w:rPr>
     </w:lvl>
-    <w:lvl w:ilvl="1" w:tplc="86C82D4A">
+    <w:lvl w:ilvl="1" w:tplc="C446451A">
       <w:numFmt w:val="decimal"/>
       <w:lvlText w:val=""/>
       <w:lvlJc w:val="left"/>
     </w:lvl>
-    <w:lvl w:ilvl="2" w:tplc="E46A318E">
+    <w:lvl w:ilvl="2" w:tplc="8D8A5B60">
       <w:numFmt w:val="decimal"/>
       <w:lvlText w:val=""/>
       <w:lvlJc w:val="left"/>
     </w:lvl>
-    <w:lvl w:ilvl="3" w:tplc="71AE95C6">
+    <w:lvl w:ilvl="3" w:tplc="E0360668">
       <w:numFmt w:val="decimal"/>
       <w:lvlText w:val=""/>
       <w:lvlJc w:val="left"/>
     </w:lvl>
-    <w:lvl w:ilvl="4" w:tplc="625AB318">
+    <w:lvl w:ilvl="4" w:tplc="18D62986">
       <w:numFmt w:val="decimal"/>
       <w:lvlText w:val=""/>
       <w:lvlJc w:val="left"/>
     </w:lvl>
-    <w:lvl w:ilvl="5" w:tplc="57AE01C4">
+    <w:lvl w:ilvl="5" w:tplc="4566C280">
       <w:numFmt w:val="decimal"/>
       <w:lvlText w:val=""/>
       <w:lvlJc w:val="left"/>
     </w:lvl>
-    <w:lvl w:ilvl="6" w:tplc="154C5D1A">
+    <w:lvl w:ilvl="6" w:tplc="5E7AE662">
       <w:numFmt w:val="decimal"/>
       <w:lvlText w:val=""/>
       <w:lvlJc w:val="left"/>
     </w:lvl>
-    <w:lvl w:ilvl="7" w:tplc="263AECB2">
+    <w:lvl w:ilvl="7" w:tplc="DB481B98">
       <w:numFmt w:val="decimal"/>
       <w:lvlText w:val=""/>
       <w:lvlJc w:val="left"/>
     </w:lvl>
-    <w:lvl w:ilvl="8" w:tplc="23C4588E">
+    <w:lvl w:ilvl="8" w:tplc="EFA07774">
       <w:numFmt w:val="decimal"/>
       <w:lvlText w:val=""/>
       <w:lvlJc w:val="left"/>
     </w:lvl>
   </w:abstractNum>
-  <w:abstractNum w:abstractNumId="21" w15:restartNumberingAfterBreak="0">
-    <w:nsid w:val="67625C8D"/>
+  <w:abstractNum w:abstractNumId="22" w15:restartNumberingAfterBreak="0">
+    <w:nsid w:val="69D67B9E"/>
     <w:multiLevelType w:val="hybridMultilevel"/>
-    <w:tmpl w:val="8968FA28"/>
-    <w:lvl w:ilvl="0" w:tplc="7F823C6A">
+    <w:tmpl w:val="85802824"/>
+    <w:lvl w:ilvl="0" w:tplc="7B68B914">
       <w:start w:val="1"/>
       <w:numFmt w:val="decimal"/>
       <w:lvlText w:val="%1."/>
@@ -22569,52 +22900,52 @@
         <w:color w:val="A67C27"/>
       </w:rPr>
     </w:lvl>
-    <w:lvl w:ilvl="1" w:tplc="0E90F252">
+    <w:lvl w:ilvl="1" w:tplc="C464E7FE">
       <w:numFmt w:val="decimal"/>
       <w:lvlText w:val=""/>
       <w:lvlJc w:val="left"/>
     </w:lvl>
-    <w:lvl w:ilvl="2" w:tplc="C9068084">
+    <w:lvl w:ilvl="2" w:tplc="9F04CB54">
       <w:numFmt w:val="decimal"/>
       <w:lvlText w:val=""/>
       <w:lvlJc w:val="left"/>
     </w:lvl>
-    <w:lvl w:ilvl="3" w:tplc="E97CFB3E">
+    <w:lvl w:ilvl="3" w:tplc="CC4883D6">
       <w:numFmt w:val="decimal"/>
       <w:lvlText w:val=""/>
       <w:lvlJc w:val="left"/>
     </w:lvl>
-    <w:lvl w:ilvl="4" w:tplc="1EA6358E">
+    <w:lvl w:ilvl="4" w:tplc="1FA2F28A">
       <w:numFmt w:val="decimal"/>
       <w:lvlText w:val=""/>
       <w:lvlJc w:val="left"/>
     </w:lvl>
-    <w:lvl w:ilvl="5" w:tplc="08307A02">
+    <w:lvl w:ilvl="5" w:tplc="280C9F62">
       <w:numFmt w:val="decimal"/>
       <w:lvlText w:val=""/>
       <w:lvlJc w:val="left"/>
     </w:lvl>
-    <w:lvl w:ilvl="6" w:tplc="3DD0C37A">
+    <w:lvl w:ilvl="6" w:tplc="06BA5954">
       <w:numFmt w:val="decimal"/>
       <w:lvlText w:val=""/>
       <w:lvlJc w:val="left"/>
     </w:lvl>
-    <w:lvl w:ilvl="7" w:tplc="A4CCB39C">
+    <w:lvl w:ilvl="7" w:tplc="40128622">
       <w:numFmt w:val="decimal"/>
       <w:lvlText w:val=""/>
       <w:lvlJc w:val="left"/>
     </w:lvl>
-    <w:lvl w:ilvl="8" w:tplc="E3864E7C">
+    <w:lvl w:ilvl="8" w:tplc="45B6B1F4">
       <w:numFmt w:val="decimal"/>
       <w:lvlText w:val=""/>
       <w:lvlJc w:val="left"/>
     </w:lvl>
   </w:abstractNum>
-  <w:abstractNum w:abstractNumId="22" w15:restartNumberingAfterBreak="0">
-    <w:nsid w:val="6C5A0EE0"/>
+  <w:abstractNum w:abstractNumId="23" w15:restartNumberingAfterBreak="0">
+    <w:nsid w:val="7A056BAF"/>
     <w:multiLevelType w:val="hybridMultilevel"/>
-    <w:tmpl w:val="A7B418D6"/>
-    <w:lvl w:ilvl="0" w:tplc="50089EB2">
+    <w:tmpl w:val="ADA2A66E"/>
+    <w:lvl w:ilvl="0" w:tplc="77CEAB54">
       <w:start w:val="1"/>
       <w:numFmt w:val="decimal"/>
       <w:lvlText w:val="%1."/>
@@ -22628,52 +22959,52 @@
         <w:color w:val="A67C27"/>
       </w:rPr>
     </w:lvl>
-    <w:lvl w:ilvl="1" w:tplc="B41875B6">
+    <w:lvl w:ilvl="1" w:tplc="667E5828">
       <w:numFmt w:val="decimal"/>
       <w:lvlText w:val=""/>
       <w:lvlJc w:val="left"/>
     </w:lvl>
-    <w:lvl w:ilvl="2" w:tplc="676C139A">
+    <w:lvl w:ilvl="2" w:tplc="850822FC">
       <w:numFmt w:val="decimal"/>
       <w:lvlText w:val=""/>
       <w:lvlJc w:val="left"/>
     </w:lvl>
-    <w:lvl w:ilvl="3" w:tplc="6464D426">
+    <w:lvl w:ilvl="3" w:tplc="79308836">
       <w:numFmt w:val="decimal"/>
       <w:lvlText w:val=""/>
       <w:lvlJc w:val="left"/>
     </w:lvl>
-    <w:lvl w:ilvl="4" w:tplc="42145D3C">
+    <w:lvl w:ilvl="4" w:tplc="F6C2203E">
       <w:numFmt w:val="decimal"/>
       <w:lvlText w:val=""/>
       <w:lvlJc w:val="left"/>
     </w:lvl>
-    <w:lvl w:ilvl="5" w:tplc="517C994E">
+    <w:lvl w:ilvl="5" w:tplc="3AB46FA0">
       <w:numFmt w:val="decimal"/>
       <w:lvlText w:val=""/>
       <w:lvlJc w:val="left"/>
     </w:lvl>
-    <w:lvl w:ilvl="6" w:tplc="CDFA6B38">
+    <w:lvl w:ilvl="6" w:tplc="DF7C2724">
       <w:numFmt w:val="decimal"/>
       <w:lvlText w:val=""/>
       <w:lvlJc w:val="left"/>
     </w:lvl>
-    <w:lvl w:ilvl="7" w:tplc="AC56F658">
+    <w:lvl w:ilvl="7" w:tplc="19342D96">
       <w:numFmt w:val="decimal"/>
       <w:lvlText w:val=""/>
       <w:lvlJc w:val="left"/>
     </w:lvl>
-    <w:lvl w:ilvl="8" w:tplc="4DF2A70E">
+    <w:lvl w:ilvl="8" w:tplc="2A927EBE">
       <w:numFmt w:val="decimal"/>
       <w:lvlText w:val=""/>
       <w:lvlJc w:val="left"/>
     </w:lvl>
   </w:abstractNum>
-  <w:abstractNum w:abstractNumId="23" w15:restartNumberingAfterBreak="0">
-    <w:nsid w:val="7062271C"/>
+  <w:abstractNum w:abstractNumId="24" w15:restartNumberingAfterBreak="0">
+    <w:nsid w:val="7D4D4C4D"/>
     <w:multiLevelType w:val="hybridMultilevel"/>
-    <w:tmpl w:val="388EEDB2"/>
-    <w:lvl w:ilvl="0" w:tplc="52E827A6">
+    <w:tmpl w:val="E56AC328"/>
+    <w:lvl w:ilvl="0" w:tplc="673C09B0">
       <w:start w:val="1"/>
       <w:numFmt w:val="decimal"/>
       <w:lvlText w:val="%1."/>
@@ -22687,252 +23018,193 @@
         <w:color w:val="A67C27"/>
       </w:rPr>
     </w:lvl>
-    <w:lvl w:ilvl="1" w:tplc="5E6E0ECC">
+    <w:lvl w:ilvl="1" w:tplc="2144B2AA">
       <w:numFmt w:val="decimal"/>
       <w:lvlText w:val=""/>
       <w:lvlJc w:val="left"/>
     </w:lvl>
-    <w:lvl w:ilvl="2" w:tplc="EC528678">
+    <w:lvl w:ilvl="2" w:tplc="D5E65B6E">
       <w:numFmt w:val="decimal"/>
       <w:lvlText w:val=""/>
       <w:lvlJc w:val="left"/>
     </w:lvl>
-    <w:lvl w:ilvl="3" w:tplc="4C1063F4">
+    <w:lvl w:ilvl="3" w:tplc="FB381BDA">
       <w:numFmt w:val="decimal"/>
       <w:lvlText w:val=""/>
       <w:lvlJc w:val="left"/>
     </w:lvl>
-    <w:lvl w:ilvl="4" w:tplc="EB163046">
+    <w:lvl w:ilvl="4" w:tplc="D2CEDE8C">
       <w:numFmt w:val="decimal"/>
       <w:lvlText w:val=""/>
       <w:lvlJc w:val="left"/>
     </w:lvl>
-    <w:lvl w:ilvl="5" w:tplc="7C1E236E">
+    <w:lvl w:ilvl="5" w:tplc="4BA2F216">
       <w:numFmt w:val="decimal"/>
       <w:lvlText w:val=""/>
       <w:lvlJc w:val="left"/>
     </w:lvl>
-    <w:lvl w:ilvl="6" w:tplc="A9525638">
+    <w:lvl w:ilvl="6" w:tplc="E93C2F4A">
       <w:numFmt w:val="decimal"/>
       <w:lvlText w:val=""/>
       <w:lvlJc w:val="left"/>
     </w:lvl>
-    <w:lvl w:ilvl="7" w:tplc="2550C842">
+    <w:lvl w:ilvl="7" w:tplc="B0A41900">
       <w:numFmt w:val="decimal"/>
       <w:lvlText w:val=""/>
       <w:lvlJc w:val="left"/>
     </w:lvl>
-    <w:lvl w:ilvl="8" w:tplc="4704F2B0">
+    <w:lvl w:ilvl="8" w:tplc="61929662">
       <w:numFmt w:val="decimal"/>
       <w:lvlText w:val=""/>
       <w:lvlJc w:val="left"/>
     </w:lvl>
   </w:abstractNum>
-  <w:abstractNum w:abstractNumId="24" w15:restartNumberingAfterBreak="0">
-    <w:nsid w:val="7BFF2926"/>
-    <w:multiLevelType w:val="hybridMultilevel"/>
-    <w:tmpl w:val="8736BEBA"/>
-    <w:lvl w:ilvl="0" w:tplc="605C2268">
-      <w:start w:val="1"/>
-      <w:numFmt w:val="decimal"/>
-      <w:lvlText w:val="%1."/>
-      <w:lvlJc w:val="left"/>
-      <w:pPr>
-        <w:ind w:left="460" w:hanging="360"/>
-      </w:pPr>
-      <w:rPr>
-        <w:b/>
-        <w:bCs/>
-        <w:color w:val="A67C27"/>
-      </w:rPr>
-    </w:lvl>
-    <w:lvl w:ilvl="1" w:tplc="4524D582">
-      <w:numFmt w:val="decimal"/>
-      <w:lvlText w:val=""/>
-      <w:lvlJc w:val="left"/>
-    </w:lvl>
-    <w:lvl w:ilvl="2" w:tplc="5D308036">
-      <w:numFmt w:val="decimal"/>
-      <w:lvlText w:val=""/>
-      <w:lvlJc w:val="left"/>
-    </w:lvl>
-    <w:lvl w:ilvl="3" w:tplc="20D607E6">
-      <w:numFmt w:val="decimal"/>
-      <w:lvlText w:val=""/>
-      <w:lvlJc w:val="left"/>
-    </w:lvl>
-    <w:lvl w:ilvl="4" w:tplc="612090B4">
-      <w:numFmt w:val="decimal"/>
-      <w:lvlText w:val=""/>
-      <w:lvlJc w:val="left"/>
-    </w:lvl>
-    <w:lvl w:ilvl="5" w:tplc="E80CABA6">
-      <w:numFmt w:val="decimal"/>
-      <w:lvlText w:val=""/>
-      <w:lvlJc w:val="left"/>
-    </w:lvl>
-    <w:lvl w:ilvl="6" w:tplc="A33255A8">
-      <w:numFmt w:val="decimal"/>
-      <w:lvlText w:val=""/>
-      <w:lvlJc w:val="left"/>
-    </w:lvl>
-    <w:lvl w:ilvl="7" w:tplc="A86CB0A8">
-      <w:numFmt w:val="decimal"/>
-      <w:lvlText w:val=""/>
-      <w:lvlJc w:val="left"/>
-    </w:lvl>
-    <w:lvl w:ilvl="8" w:tplc="8C66BEBA">
-      <w:numFmt w:val="decimal"/>
-      <w:lvlText w:val=""/>
-      <w:lvlJc w:val="left"/>
-    </w:lvl>
-  </w:abstractNum>
-  <w:num w:numId="1" w16cid:durableId="2135950581">
+  <w:num w:numId="1" w16cid:durableId="982856353">
+    <w:abstractNumId w:val="5"/>
+    <w:lvlOverride w:ilvl="0">
+      <w:startOverride w:val="1"/>
+    </w:lvlOverride>
+  </w:num>
+  <w:num w:numId="2" w16cid:durableId="933711736">
+    <w:abstractNumId w:val="20"/>
+    <w:lvlOverride w:ilvl="0">
+      <w:startOverride w:val="1"/>
+    </w:lvlOverride>
+  </w:num>
+  <w:num w:numId="3" w16cid:durableId="1762678445">
+    <w:abstractNumId w:val="18"/>
+    <w:lvlOverride w:ilvl="0">
+      <w:startOverride w:val="1"/>
+    </w:lvlOverride>
+  </w:num>
+  <w:num w:numId="4" w16cid:durableId="511189863">
+    <w:abstractNumId w:val="10"/>
+    <w:lvlOverride w:ilvl="0">
+      <w:startOverride w:val="1"/>
+    </w:lvlOverride>
+  </w:num>
+  <w:num w:numId="5" w16cid:durableId="667559035">
+    <w:abstractNumId w:val="9"/>
+    <w:lvlOverride w:ilvl="0">
+      <w:startOverride w:val="1"/>
+    </w:lvlOverride>
+  </w:num>
+  <w:num w:numId="6" w16cid:durableId="1798572480">
+    <w:abstractNumId w:val="0"/>
+    <w:lvlOverride w:ilvl="0">
+      <w:startOverride w:val="1"/>
+    </w:lvlOverride>
+  </w:num>
+  <w:num w:numId="7" w16cid:durableId="981471866">
+    <w:abstractNumId w:val="8"/>
+    <w:lvlOverride w:ilvl="0">
+      <w:startOverride w:val="1"/>
+    </w:lvlOverride>
+  </w:num>
+  <w:num w:numId="8" w16cid:durableId="145127676">
+    <w:abstractNumId w:val="11"/>
+    <w:lvlOverride w:ilvl="0">
+      <w:startOverride w:val="1"/>
+    </w:lvlOverride>
+  </w:num>
+  <w:num w:numId="9" w16cid:durableId="728769585">
+    <w:abstractNumId w:val="4"/>
+    <w:lvlOverride w:ilvl="0">
+      <w:startOverride w:val="1"/>
+    </w:lvlOverride>
+  </w:num>
+  <w:num w:numId="10" w16cid:durableId="222185396">
+    <w:abstractNumId w:val="2"/>
+    <w:lvlOverride w:ilvl="0">
+      <w:startOverride w:val="1"/>
+    </w:lvlOverride>
+  </w:num>
+  <w:num w:numId="11" w16cid:durableId="384645093">
+    <w:abstractNumId w:val="12"/>
+    <w:lvlOverride w:ilvl="0">
+      <w:startOverride w:val="1"/>
+    </w:lvlOverride>
+  </w:num>
+  <w:num w:numId="12" w16cid:durableId="964651637">
+    <w:abstractNumId w:val="24"/>
+    <w:lvlOverride w:ilvl="0">
+      <w:startOverride w:val="1"/>
+    </w:lvlOverride>
+  </w:num>
+  <w:num w:numId="13" w16cid:durableId="646282263">
     <w:abstractNumId w:val="14"/>
     <w:lvlOverride w:ilvl="0">
       <w:startOverride w:val="1"/>
     </w:lvlOverride>
   </w:num>
-  <w:num w:numId="2" w16cid:durableId="1622493940">
-    <w:abstractNumId w:val="8"/>
+  <w:num w:numId="14" w16cid:durableId="1048726118">
+    <w:abstractNumId w:val="13"/>
     <w:lvlOverride w:ilvl="0">
       <w:startOverride w:val="1"/>
     </w:lvlOverride>
   </w:num>
-  <w:num w:numId="3" w16cid:durableId="391080933">
-    <w:abstractNumId w:val="12"/>
+  <w:num w:numId="15" w16cid:durableId="1138912341">
+    <w:abstractNumId w:val="15"/>
     <w:lvlOverride w:ilvl="0">
       <w:startOverride w:val="1"/>
     </w:lvlOverride>
   </w:num>
-  <w:num w:numId="4" w16cid:durableId="1407147278">
+  <w:num w:numId="16" w16cid:durableId="308438179">
+    <w:abstractNumId w:val="17"/>
+    <w:lvlOverride w:ilvl="0">
+      <w:startOverride w:val="1"/>
+    </w:lvlOverride>
+  </w:num>
+  <w:num w:numId="17" w16cid:durableId="461070927">
+    <w:abstractNumId w:val="6"/>
+    <w:lvlOverride w:ilvl="0">
+      <w:startOverride w:val="1"/>
+    </w:lvlOverride>
+  </w:num>
+  <w:num w:numId="18" w16cid:durableId="297762228">
+    <w:abstractNumId w:val="16"/>
+    <w:lvlOverride w:ilvl="0">
+      <w:startOverride w:val="1"/>
+    </w:lvlOverride>
+  </w:num>
+  <w:num w:numId="19" w16cid:durableId="1714691406">
+    <w:abstractNumId w:val="22"/>
+    <w:lvlOverride w:ilvl="0">
+      <w:startOverride w:val="1"/>
+    </w:lvlOverride>
+  </w:num>
+  <w:num w:numId="20" w16cid:durableId="2069954981">
+    <w:abstractNumId w:val="3"/>
+    <w:lvlOverride w:ilvl="0">
+      <w:startOverride w:val="1"/>
+    </w:lvlOverride>
+  </w:num>
+  <w:num w:numId="21" w16cid:durableId="472140760">
     <w:abstractNumId w:val="23"/>
     <w:lvlOverride w:ilvl="0">
       <w:startOverride w:val="1"/>
     </w:lvlOverride>
   </w:num>
-  <w:num w:numId="5" w16cid:durableId="942347479">
-    <w:abstractNumId w:val="19"/>
+  <w:num w:numId="22" w16cid:durableId="1720206920">
+    <w:abstractNumId w:val="21"/>
     <w:lvlOverride w:ilvl="0">
       <w:startOverride w:val="1"/>
     </w:lvlOverride>
   </w:num>
-  <w:num w:numId="6" w16cid:durableId="620185386">
-    <w:abstractNumId w:val="0"/>
-    <w:lvlOverride w:ilvl="0">
-      <w:startOverride w:val="1"/>
-    </w:lvlOverride>
-  </w:num>
-  <w:num w:numId="7" w16cid:durableId="815028887">
-    <w:abstractNumId w:val="6"/>
-    <w:lvlOverride w:ilvl="0">
-      <w:startOverride w:val="1"/>
-    </w:lvlOverride>
-  </w:num>
-  <w:num w:numId="8" w16cid:durableId="402263479">
+  <w:num w:numId="23" w16cid:durableId="1741518790">
     <w:abstractNumId w:val="7"/>
     <w:lvlOverride w:ilvl="0">
       <w:startOverride w:val="1"/>
     </w:lvlOverride>
   </w:num>
-  <w:num w:numId="9" w16cid:durableId="65224073">
-    <w:abstractNumId w:val="5"/>
-    <w:lvlOverride w:ilvl="0">
-      <w:startOverride w:val="1"/>
-    </w:lvlOverride>
-  </w:num>
-  <w:num w:numId="10" w16cid:durableId="1789355483">
+  <w:num w:numId="24" w16cid:durableId="1283728950">
     <w:abstractNumId w:val="1"/>
     <w:lvlOverride w:ilvl="0">
       <w:startOverride w:val="1"/>
     </w:lvlOverride>
   </w:num>
-  <w:num w:numId="11" w16cid:durableId="892470289">
-    <w:abstractNumId w:val="21"/>
-    <w:lvlOverride w:ilvl="0">
-      <w:startOverride w:val="1"/>
-    </w:lvlOverride>
-  </w:num>
-  <w:num w:numId="12" w16cid:durableId="1927573853">
-    <w:abstractNumId w:val="17"/>
-    <w:lvlOverride w:ilvl="0">
-      <w:startOverride w:val="1"/>
-    </w:lvlOverride>
-  </w:num>
-  <w:num w:numId="13" w16cid:durableId="1395664982">
-    <w:abstractNumId w:val="10"/>
-    <w:lvlOverride w:ilvl="0">
-      <w:startOverride w:val="1"/>
-    </w:lvlOverride>
-  </w:num>
-  <w:num w:numId="14" w16cid:durableId="1030841843">
-    <w:abstractNumId w:val="4"/>
-    <w:lvlOverride w:ilvl="0">
-      <w:startOverride w:val="1"/>
-    </w:lvlOverride>
-  </w:num>
-  <w:num w:numId="15" w16cid:durableId="941451136">
-    <w:abstractNumId w:val="11"/>
-    <w:lvlOverride w:ilvl="0">
-      <w:startOverride w:val="1"/>
-    </w:lvlOverride>
-  </w:num>
-  <w:num w:numId="16" w16cid:durableId="438919204">
-    <w:abstractNumId w:val="13"/>
-    <w:lvlOverride w:ilvl="0">
-      <w:startOverride w:val="1"/>
-    </w:lvlOverride>
-  </w:num>
-  <w:num w:numId="17" w16cid:durableId="1642423270">
-    <w:abstractNumId w:val="16"/>
-    <w:lvlOverride w:ilvl="0">
-      <w:startOverride w:val="1"/>
-    </w:lvlOverride>
-  </w:num>
-  <w:num w:numId="18" w16cid:durableId="419717608">
-    <w:abstractNumId w:val="22"/>
-    <w:lvlOverride w:ilvl="0">
-      <w:startOverride w:val="1"/>
-    </w:lvlOverride>
-  </w:num>
-  <w:num w:numId="19" w16cid:durableId="251593921">
-    <w:abstractNumId w:val="2"/>
-    <w:lvlOverride w:ilvl="0">
-      <w:startOverride w:val="1"/>
-    </w:lvlOverride>
-  </w:num>
-  <w:num w:numId="20" w16cid:durableId="1172530917">
-    <w:abstractNumId w:val="20"/>
-    <w:lvlOverride w:ilvl="0">
-      <w:startOverride w:val="1"/>
-    </w:lvlOverride>
-  </w:num>
-  <w:num w:numId="21" w16cid:durableId="1851406973">
-    <w:abstractNumId w:val="15"/>
-    <w:lvlOverride w:ilvl="0">
-      <w:startOverride w:val="1"/>
-    </w:lvlOverride>
-  </w:num>
-  <w:num w:numId="22" w16cid:durableId="1527057098">
-    <w:abstractNumId w:val="3"/>
-    <w:lvlOverride w:ilvl="0">
-      <w:startOverride w:val="1"/>
-    </w:lvlOverride>
-  </w:num>
-  <w:num w:numId="23" w16cid:durableId="2041589719">
-    <w:abstractNumId w:val="24"/>
-    <w:lvlOverride w:ilvl="0">
-      <w:startOverride w:val="1"/>
-    </w:lvlOverride>
-  </w:num>
-  <w:num w:numId="24" w16cid:durableId="492524363">
-    <w:abstractNumId w:val="9"/>
-    <w:lvlOverride w:ilvl="0">
-      <w:startOverride w:val="1"/>
-    </w:lvlOverride>
-  </w:num>
-  <w:num w:numId="25" w16cid:durableId="1190484572">
-    <w:abstractNumId w:val="18"/>
+  <w:num w:numId="25" w16cid:durableId="1660767600">
+    <w:abstractNumId w:val="19"/>
     <w:lvlOverride w:ilvl="0">
       <w:startOverride w:val="1"/>
     </w:lvlOverride>
@@ -23557,7 +23829,7 @@
     <w:autoRedefine/>
     <w:uiPriority w:val="39"/>
     <w:unhideWhenUsed/>
-    <w:rsid w:val="00B2209A"/>
+    <w:rsid w:val="00506FF7"/>
     <w:pPr>
       <w:spacing w:after="100"/>
     </w:pPr>
@@ -23569,7 +23841,7 @@
     <w:autoRedefine/>
     <w:uiPriority w:val="39"/>
     <w:unhideWhenUsed/>
-    <w:rsid w:val="00B2209A"/>
+    <w:rsid w:val="00506FF7"/>
     <w:pPr>
       <w:spacing w:after="100"/>
       <w:ind w:left="210"/>

</xml_diff>

<commit_message>
docs: retake Form PDFs screenshots with the sync panel; rebuild manuals
Co-Authored-By: Claude Sonnet 5 <noreply@anthropic.com>
</commit_message>
<xml_diff>
--- a/docs/manuals/RA_Training_Manual.docx
+++ b/docs/manuals/RA_Training_Manual.docx
@@ -538,7 +538,7 @@
     <w:sdt>
       <w:sdtPr>
         <w:alias w:val="Contents"/>
-        <w:id w:val="-1513837585"/>
+        <w:id w:val="-1278561249"/>
       </w:sdtPr>
       <w:sdtEndPr/>
       <w:sdtContent>
@@ -567,7 +567,7 @@
           <w:r>
             <w:fldChar w:fldCharType="separate"/>
           </w:r>
-          <w:hyperlink w:anchor="_Toc240758732" w:history="1">
+          <w:hyperlink w:anchor="_Toc240758992" w:history="1">
             <w:r>
               <w:rPr>
                 <w:rStyle w:val="Hyperlink"/>
@@ -591,7 +591,7 @@
               <w:rPr>
                 <w:noProof/>
               </w:rPr>
-              <w:instrText xml:space="preserve"> PAGEREF _Toc240758732 \h </w:instrText>
+              <w:instrText xml:space="preserve"> PAGEREF _Toc240758992 \h </w:instrText>
             </w:r>
             <w:r>
               <w:rPr>
@@ -634,7 +634,7 @@
               <w14:ligatures w14:val="standardContextual"/>
             </w:rPr>
           </w:pPr>
-          <w:hyperlink w:anchor="_Toc240758733" w:history="1">
+          <w:hyperlink w:anchor="_Toc240758993" w:history="1">
             <w:r>
               <w:rPr>
                 <w:rStyle w:val="Hyperlink"/>
@@ -658,7 +658,7 @@
               <w:rPr>
                 <w:noProof/>
               </w:rPr>
-              <w:instrText xml:space="preserve"> PAGEREF _Toc240758733 \h </w:instrText>
+              <w:instrText xml:space="preserve"> PAGEREF _Toc240758993 \h </w:instrText>
             </w:r>
             <w:r>
               <w:rPr>
@@ -701,7 +701,7 @@
               <w14:ligatures w14:val="standardContextual"/>
             </w:rPr>
           </w:pPr>
-          <w:hyperlink w:anchor="_Toc240758734" w:history="1">
+          <w:hyperlink w:anchor="_Toc240758994" w:history="1">
             <w:r>
               <w:rPr>
                 <w:rStyle w:val="Hyperlink"/>
@@ -725,7 +725,7 @@
               <w:rPr>
                 <w:noProof/>
               </w:rPr>
-              <w:instrText xml:space="preserve"> PAGEREF _Toc240758734 \h </w:instrText>
+              <w:instrText xml:space="preserve"> PAGEREF _Toc240758994 \h </w:instrText>
             </w:r>
             <w:r>
               <w:rPr>
@@ -768,7 +768,7 @@
               <w14:ligatures w14:val="standardContextual"/>
             </w:rPr>
           </w:pPr>
-          <w:hyperlink w:anchor="_Toc240758735" w:history="1">
+          <w:hyperlink w:anchor="_Toc240758995" w:history="1">
             <w:r>
               <w:rPr>
                 <w:rStyle w:val="Hyperlink"/>
@@ -792,7 +792,7 @@
               <w:rPr>
                 <w:noProof/>
               </w:rPr>
-              <w:instrText xml:space="preserve"> PAGEREF _Toc240758735 \h </w:instrText>
+              <w:instrText xml:space="preserve"> PAGEREF _Toc240758995 \h </w:instrText>
             </w:r>
             <w:r>
               <w:rPr>
@@ -835,7 +835,7 @@
               <w14:ligatures w14:val="standardContextual"/>
             </w:rPr>
           </w:pPr>
-          <w:hyperlink w:anchor="_Toc240758736" w:history="1">
+          <w:hyperlink w:anchor="_Toc240758996" w:history="1">
             <w:r>
               <w:rPr>
                 <w:rStyle w:val="Hyperlink"/>
@@ -859,7 +859,7 @@
               <w:rPr>
                 <w:noProof/>
               </w:rPr>
-              <w:instrText xml:space="preserve"> PAGEREF _Toc240758736 \h </w:instrText>
+              <w:instrText xml:space="preserve"> PAGEREF _Toc240758996 \h </w:instrText>
             </w:r>
             <w:r>
               <w:rPr>
@@ -902,7 +902,7 @@
               <w14:ligatures w14:val="standardContextual"/>
             </w:rPr>
           </w:pPr>
-          <w:hyperlink w:anchor="_Toc240758737" w:history="1">
+          <w:hyperlink w:anchor="_Toc240758997" w:history="1">
             <w:r>
               <w:rPr>
                 <w:rStyle w:val="Hyperlink"/>
@@ -926,7 +926,7 @@
               <w:rPr>
                 <w:noProof/>
               </w:rPr>
-              <w:instrText xml:space="preserve"> PAGEREF _Toc240758737 \h </w:instrText>
+              <w:instrText xml:space="preserve"> PAGEREF _Toc240758997 \h </w:instrText>
             </w:r>
             <w:r>
               <w:rPr>
@@ -969,7 +969,7 @@
               <w14:ligatures w14:val="standardContextual"/>
             </w:rPr>
           </w:pPr>
-          <w:hyperlink w:anchor="_Toc240758738" w:history="1">
+          <w:hyperlink w:anchor="_Toc240758998" w:history="1">
             <w:r>
               <w:rPr>
                 <w:rStyle w:val="Hyperlink"/>
@@ -993,7 +993,7 @@
               <w:rPr>
                 <w:noProof/>
               </w:rPr>
-              <w:instrText xml:space="preserve"> PAGEREF _Toc240758738 \h </w:instrText>
+              <w:instrText xml:space="preserve"> PAGEREF _Toc240758998 \h </w:instrText>
             </w:r>
             <w:r>
               <w:rPr>
@@ -1036,7 +1036,7 @@
               <w14:ligatures w14:val="standardContextual"/>
             </w:rPr>
           </w:pPr>
-          <w:hyperlink w:anchor="_Toc240758739" w:history="1">
+          <w:hyperlink w:anchor="_Toc240758999" w:history="1">
             <w:r>
               <w:rPr>
                 <w:rStyle w:val="Hyperlink"/>
@@ -1060,7 +1060,7 @@
               <w:rPr>
                 <w:noProof/>
               </w:rPr>
-              <w:instrText xml:space="preserve"> PAGEREF _Toc240758739 \h </w:instrText>
+              <w:instrText xml:space="preserve"> PAGEREF _Toc240758999 \h </w:instrText>
             </w:r>
             <w:r>
               <w:rPr>
@@ -1103,7 +1103,7 @@
               <w14:ligatures w14:val="standardContextual"/>
             </w:rPr>
           </w:pPr>
-          <w:hyperlink w:anchor="_Toc240758740" w:history="1">
+          <w:hyperlink w:anchor="_Toc240759000" w:history="1">
             <w:r>
               <w:rPr>
                 <w:rStyle w:val="Hyperlink"/>
@@ -1127,7 +1127,7 @@
               <w:rPr>
                 <w:noProof/>
               </w:rPr>
-              <w:instrText xml:space="preserve"> PAGEREF _Toc240758740 \h </w:instrText>
+              <w:instrText xml:space="preserve"> PAGEREF _Toc240759000 \h </w:instrText>
             </w:r>
             <w:r>
               <w:rPr>
@@ -1170,7 +1170,7 @@
               <w14:ligatures w14:val="standardContextual"/>
             </w:rPr>
           </w:pPr>
-          <w:hyperlink w:anchor="_Toc240758741" w:history="1">
+          <w:hyperlink w:anchor="_Toc240759001" w:history="1">
             <w:r>
               <w:rPr>
                 <w:rStyle w:val="Hyperlink"/>
@@ -1194,7 +1194,7 @@
               <w:rPr>
                 <w:noProof/>
               </w:rPr>
-              <w:instrText xml:space="preserve"> PAGEREF _Toc240758741 \h </w:instrText>
+              <w:instrText xml:space="preserve"> PAGEREF _Toc240759001 \h </w:instrText>
             </w:r>
             <w:r>
               <w:rPr>
@@ -1237,7 +1237,7 @@
               <w14:ligatures w14:val="standardContextual"/>
             </w:rPr>
           </w:pPr>
-          <w:hyperlink w:anchor="_Toc240758742" w:history="1">
+          <w:hyperlink w:anchor="_Toc240759002" w:history="1">
             <w:r>
               <w:rPr>
                 <w:rStyle w:val="Hyperlink"/>
@@ -1261,7 +1261,7 @@
               <w:rPr>
                 <w:noProof/>
               </w:rPr>
-              <w:instrText xml:space="preserve"> PAGEREF _Toc240758742 \h </w:instrText>
+              <w:instrText xml:space="preserve"> PAGEREF _Toc240759002 \h </w:instrText>
             </w:r>
             <w:r>
               <w:rPr>
@@ -1304,7 +1304,7 @@
               <w14:ligatures w14:val="standardContextual"/>
             </w:rPr>
           </w:pPr>
-          <w:hyperlink w:anchor="_Toc240758743" w:history="1">
+          <w:hyperlink w:anchor="_Toc240759003" w:history="1">
             <w:r>
               <w:rPr>
                 <w:rStyle w:val="Hyperlink"/>
@@ -1328,7 +1328,7 @@
               <w:rPr>
                 <w:noProof/>
               </w:rPr>
-              <w:instrText xml:space="preserve"> PAGEREF _Toc240758743 \h </w:instrText>
+              <w:instrText xml:space="preserve"> PAGEREF _Toc240759003 \h </w:instrText>
             </w:r>
             <w:r>
               <w:rPr>
@@ -1371,7 +1371,7 @@
               <w14:ligatures w14:val="standardContextual"/>
             </w:rPr>
           </w:pPr>
-          <w:hyperlink w:anchor="_Toc240758744" w:history="1">
+          <w:hyperlink w:anchor="_Toc240759004" w:history="1">
             <w:r>
               <w:rPr>
                 <w:rStyle w:val="Hyperlink"/>
@@ -1395,7 +1395,7 @@
               <w:rPr>
                 <w:noProof/>
               </w:rPr>
-              <w:instrText xml:space="preserve"> PAGEREF _Toc240758744 \h </w:instrText>
+              <w:instrText xml:space="preserve"> PAGEREF _Toc240759004 \h </w:instrText>
             </w:r>
             <w:r>
               <w:rPr>
@@ -1438,7 +1438,7 @@
               <w14:ligatures w14:val="standardContextual"/>
             </w:rPr>
           </w:pPr>
-          <w:hyperlink w:anchor="_Toc240758745" w:history="1">
+          <w:hyperlink w:anchor="_Toc240759005" w:history="1">
             <w:r>
               <w:rPr>
                 <w:rStyle w:val="Hyperlink"/>
@@ -1462,7 +1462,7 @@
               <w:rPr>
                 <w:noProof/>
               </w:rPr>
-              <w:instrText xml:space="preserve"> PAGEREF _Toc240758745 \h </w:instrText>
+              <w:instrText xml:space="preserve"> PAGEREF _Toc240759005 \h </w:instrText>
             </w:r>
             <w:r>
               <w:rPr>
@@ -1505,7 +1505,7 @@
               <w14:ligatures w14:val="standardContextual"/>
             </w:rPr>
           </w:pPr>
-          <w:hyperlink w:anchor="_Toc240758746" w:history="1">
+          <w:hyperlink w:anchor="_Toc240759006" w:history="1">
             <w:r>
               <w:rPr>
                 <w:rStyle w:val="Hyperlink"/>
@@ -1529,7 +1529,7 @@
               <w:rPr>
                 <w:noProof/>
               </w:rPr>
-              <w:instrText xml:space="preserve"> PAGEREF _Toc240758746 \h </w:instrText>
+              <w:instrText xml:space="preserve"> PAGEREF _Toc240759006 \h </w:instrText>
             </w:r>
             <w:r>
               <w:rPr>
@@ -1572,7 +1572,7 @@
               <w14:ligatures w14:val="standardContextual"/>
             </w:rPr>
           </w:pPr>
-          <w:hyperlink w:anchor="_Toc240758747" w:history="1">
+          <w:hyperlink w:anchor="_Toc240759007" w:history="1">
             <w:r>
               <w:rPr>
                 <w:rStyle w:val="Hyperlink"/>
@@ -1596,7 +1596,7 @@
               <w:rPr>
                 <w:noProof/>
               </w:rPr>
-              <w:instrText xml:space="preserve"> PAGEREF _Toc240758747 \h </w:instrText>
+              <w:instrText xml:space="preserve"> PAGEREF _Toc240759007 \h </w:instrText>
             </w:r>
             <w:r>
               <w:rPr>
@@ -1639,7 +1639,7 @@
               <w14:ligatures w14:val="standardContextual"/>
             </w:rPr>
           </w:pPr>
-          <w:hyperlink w:anchor="_Toc240758748" w:history="1">
+          <w:hyperlink w:anchor="_Toc240759008" w:history="1">
             <w:r>
               <w:rPr>
                 <w:rStyle w:val="Hyperlink"/>
@@ -1663,7 +1663,7 @@
               <w:rPr>
                 <w:noProof/>
               </w:rPr>
-              <w:instrText xml:space="preserve"> PAGEREF _Toc240758748 \h </w:instrText>
+              <w:instrText xml:space="preserve"> PAGEREF _Toc240759008 \h </w:instrText>
             </w:r>
             <w:r>
               <w:rPr>
@@ -1706,7 +1706,7 @@
               <w14:ligatures w14:val="standardContextual"/>
             </w:rPr>
           </w:pPr>
-          <w:hyperlink w:anchor="_Toc240758749" w:history="1">
+          <w:hyperlink w:anchor="_Toc240759009" w:history="1">
             <w:r>
               <w:rPr>
                 <w:rStyle w:val="Hyperlink"/>
@@ -1730,7 +1730,7 @@
               <w:rPr>
                 <w:noProof/>
               </w:rPr>
-              <w:instrText xml:space="preserve"> PAGEREF _Toc240758749 \h </w:instrText>
+              <w:instrText xml:space="preserve"> PAGEREF _Toc240759009 \h </w:instrText>
             </w:r>
             <w:r>
               <w:rPr>
@@ -1773,7 +1773,7 @@
               <w14:ligatures w14:val="standardContextual"/>
             </w:rPr>
           </w:pPr>
-          <w:hyperlink w:anchor="_Toc240758750" w:history="1">
+          <w:hyperlink w:anchor="_Toc240759010" w:history="1">
             <w:r>
               <w:rPr>
                 <w:rStyle w:val="Hyperlink"/>
@@ -1797,7 +1797,7 @@
               <w:rPr>
                 <w:noProof/>
               </w:rPr>
-              <w:instrText xml:space="preserve"> PAGEREF _Toc240758750 \h </w:instrText>
+              <w:instrText xml:space="preserve"> PAGEREF _Toc240759010 \h </w:instrText>
             </w:r>
             <w:r>
               <w:rPr>
@@ -1840,7 +1840,7 @@
               <w14:ligatures w14:val="standardContextual"/>
             </w:rPr>
           </w:pPr>
-          <w:hyperlink w:anchor="_Toc240758751" w:history="1">
+          <w:hyperlink w:anchor="_Toc240759011" w:history="1">
             <w:r>
               <w:rPr>
                 <w:rStyle w:val="Hyperlink"/>
@@ -1864,7 +1864,7 @@
               <w:rPr>
                 <w:noProof/>
               </w:rPr>
-              <w:instrText xml:space="preserve"> PAGEREF _Toc240758751 \h </w:instrText>
+              <w:instrText xml:space="preserve"> PAGEREF _Toc240759011 \h </w:instrText>
             </w:r>
             <w:r>
               <w:rPr>
@@ -1907,7 +1907,7 @@
               <w14:ligatures w14:val="standardContextual"/>
             </w:rPr>
           </w:pPr>
-          <w:hyperlink w:anchor="_Toc240758752" w:history="1">
+          <w:hyperlink w:anchor="_Toc240759012" w:history="1">
             <w:r>
               <w:rPr>
                 <w:rStyle w:val="Hyperlink"/>
@@ -1931,7 +1931,7 @@
               <w:rPr>
                 <w:noProof/>
               </w:rPr>
-              <w:instrText xml:space="preserve"> PAGEREF _Toc240758752 \h </w:instrText>
+              <w:instrText xml:space="preserve"> PAGEREF _Toc240759012 \h </w:instrText>
             </w:r>
             <w:r>
               <w:rPr>
@@ -1974,7 +1974,7 @@
               <w14:ligatures w14:val="standardContextual"/>
             </w:rPr>
           </w:pPr>
-          <w:hyperlink w:anchor="_Toc240758753" w:history="1">
+          <w:hyperlink w:anchor="_Toc240759013" w:history="1">
             <w:r>
               <w:rPr>
                 <w:rStyle w:val="Hyperlink"/>
@@ -1998,7 +1998,7 @@
               <w:rPr>
                 <w:noProof/>
               </w:rPr>
-              <w:instrText xml:space="preserve"> PAGEREF _Toc240758753 \h </w:instrText>
+              <w:instrText xml:space="preserve"> PAGEREF _Toc240759013 \h </w:instrText>
             </w:r>
             <w:r>
               <w:rPr>
@@ -2041,7 +2041,7 @@
               <w14:ligatures w14:val="standardContextual"/>
             </w:rPr>
           </w:pPr>
-          <w:hyperlink w:anchor="_Toc240758754" w:history="1">
+          <w:hyperlink w:anchor="_Toc240759014" w:history="1">
             <w:r>
               <w:rPr>
                 <w:rStyle w:val="Hyperlink"/>
@@ -2065,7 +2065,7 @@
               <w:rPr>
                 <w:noProof/>
               </w:rPr>
-              <w:instrText xml:space="preserve"> PAGEREF _Toc240758754 \h </w:instrText>
+              <w:instrText xml:space="preserve"> PAGEREF _Toc240759014 \h </w:instrText>
             </w:r>
             <w:r>
               <w:rPr>
@@ -2108,7 +2108,7 @@
               <w14:ligatures w14:val="standardContextual"/>
             </w:rPr>
           </w:pPr>
-          <w:hyperlink w:anchor="_Toc240758755" w:history="1">
+          <w:hyperlink w:anchor="_Toc240759015" w:history="1">
             <w:r>
               <w:rPr>
                 <w:rStyle w:val="Hyperlink"/>
@@ -2132,7 +2132,7 @@
               <w:rPr>
                 <w:noProof/>
               </w:rPr>
-              <w:instrText xml:space="preserve"> PAGEREF _Toc240758755 \h </w:instrText>
+              <w:instrText xml:space="preserve"> PAGEREF _Toc240759015 \h </w:instrText>
             </w:r>
             <w:r>
               <w:rPr>
@@ -2175,7 +2175,7 @@
               <w14:ligatures w14:val="standardContextual"/>
             </w:rPr>
           </w:pPr>
-          <w:hyperlink w:anchor="_Toc240758756" w:history="1">
+          <w:hyperlink w:anchor="_Toc240759016" w:history="1">
             <w:r>
               <w:rPr>
                 <w:rStyle w:val="Hyperlink"/>
@@ -2199,7 +2199,7 @@
               <w:rPr>
                 <w:noProof/>
               </w:rPr>
-              <w:instrText xml:space="preserve"> PAGEREF _Toc240758756 \h </w:instrText>
+              <w:instrText xml:space="preserve"> PAGEREF _Toc240759016 \h </w:instrText>
             </w:r>
             <w:r>
               <w:rPr>
@@ -2242,7 +2242,7 @@
               <w14:ligatures w14:val="standardContextual"/>
             </w:rPr>
           </w:pPr>
-          <w:hyperlink w:anchor="_Toc240758757" w:history="1">
+          <w:hyperlink w:anchor="_Toc240759017" w:history="1">
             <w:r>
               <w:rPr>
                 <w:rStyle w:val="Hyperlink"/>
@@ -2266,7 +2266,7 @@
               <w:rPr>
                 <w:noProof/>
               </w:rPr>
-              <w:instrText xml:space="preserve"> PAGEREF _Toc240758757 \h </w:instrText>
+              <w:instrText xml:space="preserve"> PAGEREF _Toc240759017 \h </w:instrText>
             </w:r>
             <w:r>
               <w:rPr>
@@ -2309,7 +2309,7 @@
               <w14:ligatures w14:val="standardContextual"/>
             </w:rPr>
           </w:pPr>
-          <w:hyperlink w:anchor="_Toc240758758" w:history="1">
+          <w:hyperlink w:anchor="_Toc240759018" w:history="1">
             <w:r>
               <w:rPr>
                 <w:rStyle w:val="Hyperlink"/>
@@ -2333,7 +2333,7 @@
               <w:rPr>
                 <w:noProof/>
               </w:rPr>
-              <w:instrText xml:space="preserve"> PAGEREF _Toc240758758 \h </w:instrText>
+              <w:instrText xml:space="preserve"> PAGEREF _Toc240759018 \h </w:instrText>
             </w:r>
             <w:r>
               <w:rPr>
@@ -2376,7 +2376,7 @@
               <w14:ligatures w14:val="standardContextual"/>
             </w:rPr>
           </w:pPr>
-          <w:hyperlink w:anchor="_Toc240758759" w:history="1">
+          <w:hyperlink w:anchor="_Toc240759019" w:history="1">
             <w:r>
               <w:rPr>
                 <w:rStyle w:val="Hyperlink"/>
@@ -2400,7 +2400,7 @@
               <w:rPr>
                 <w:noProof/>
               </w:rPr>
-              <w:instrText xml:space="preserve"> PAGEREF _Toc240758759 \h </w:instrText>
+              <w:instrText xml:space="preserve"> PAGEREF _Toc240759019 \h </w:instrText>
             </w:r>
             <w:r>
               <w:rPr>
@@ -2443,7 +2443,7 @@
               <w14:ligatures w14:val="standardContextual"/>
             </w:rPr>
           </w:pPr>
-          <w:hyperlink w:anchor="_Toc240758760" w:history="1">
+          <w:hyperlink w:anchor="_Toc240759020" w:history="1">
             <w:r>
               <w:rPr>
                 <w:rStyle w:val="Hyperlink"/>
@@ -2467,7 +2467,7 @@
               <w:rPr>
                 <w:noProof/>
               </w:rPr>
-              <w:instrText xml:space="preserve"> PAGEREF _Toc240758760 \h </w:instrText>
+              <w:instrText xml:space="preserve"> PAGEREF _Toc240759020 \h </w:instrText>
             </w:r>
             <w:r>
               <w:rPr>
@@ -2510,7 +2510,7 @@
               <w14:ligatures w14:val="standardContextual"/>
             </w:rPr>
           </w:pPr>
-          <w:hyperlink w:anchor="_Toc240758761" w:history="1">
+          <w:hyperlink w:anchor="_Toc240759021" w:history="1">
             <w:r>
               <w:rPr>
                 <w:rStyle w:val="Hyperlink"/>
@@ -2534,7 +2534,7 @@
               <w:rPr>
                 <w:noProof/>
               </w:rPr>
-              <w:instrText xml:space="preserve"> PAGEREF _Toc240758761 \h </w:instrText>
+              <w:instrText xml:space="preserve"> PAGEREF _Toc240759021 \h </w:instrText>
             </w:r>
             <w:r>
               <w:rPr>
@@ -2577,7 +2577,7 @@
               <w14:ligatures w14:val="standardContextual"/>
             </w:rPr>
           </w:pPr>
-          <w:hyperlink w:anchor="_Toc240758762" w:history="1">
+          <w:hyperlink w:anchor="_Toc240759022" w:history="1">
             <w:r>
               <w:rPr>
                 <w:rStyle w:val="Hyperlink"/>
@@ -2601,7 +2601,7 @@
               <w:rPr>
                 <w:noProof/>
               </w:rPr>
-              <w:instrText xml:space="preserve"> PAGEREF _Toc240758762 \h </w:instrText>
+              <w:instrText xml:space="preserve"> PAGEREF _Toc240759022 \h </w:instrText>
             </w:r>
             <w:r>
               <w:rPr>
@@ -2644,7 +2644,7 @@
               <w14:ligatures w14:val="standardContextual"/>
             </w:rPr>
           </w:pPr>
-          <w:hyperlink w:anchor="_Toc240758763" w:history="1">
+          <w:hyperlink w:anchor="_Toc240759023" w:history="1">
             <w:r>
               <w:rPr>
                 <w:rStyle w:val="Hyperlink"/>
@@ -2668,7 +2668,7 @@
               <w:rPr>
                 <w:noProof/>
               </w:rPr>
-              <w:instrText xml:space="preserve"> PAGEREF _Toc240758763 \h </w:instrText>
+              <w:instrText xml:space="preserve"> PAGEREF _Toc240759023 \h </w:instrText>
             </w:r>
             <w:r>
               <w:rPr>
@@ -2711,7 +2711,7 @@
               <w14:ligatures w14:val="standardContextual"/>
             </w:rPr>
           </w:pPr>
-          <w:hyperlink w:anchor="_Toc240758764" w:history="1">
+          <w:hyperlink w:anchor="_Toc240759024" w:history="1">
             <w:r>
               <w:rPr>
                 <w:rStyle w:val="Hyperlink"/>
@@ -2735,7 +2735,7 @@
               <w:rPr>
                 <w:noProof/>
               </w:rPr>
-              <w:instrText xml:space="preserve"> PAGEREF _Toc240758764 \h </w:instrText>
+              <w:instrText xml:space="preserve"> PAGEREF _Toc240759024 \h </w:instrText>
             </w:r>
             <w:r>
               <w:rPr>
@@ -2778,7 +2778,7 @@
               <w14:ligatures w14:val="standardContextual"/>
             </w:rPr>
           </w:pPr>
-          <w:hyperlink w:anchor="_Toc240758765" w:history="1">
+          <w:hyperlink w:anchor="_Toc240759025" w:history="1">
             <w:r>
               <w:rPr>
                 <w:rStyle w:val="Hyperlink"/>
@@ -2802,7 +2802,7 @@
               <w:rPr>
                 <w:noProof/>
               </w:rPr>
-              <w:instrText xml:space="preserve"> PAGEREF _Toc240758765 \h </w:instrText>
+              <w:instrText xml:space="preserve"> PAGEREF _Toc240759025 \h </w:instrText>
             </w:r>
             <w:r>
               <w:rPr>
@@ -2845,7 +2845,7 @@
               <w14:ligatures w14:val="standardContextual"/>
             </w:rPr>
           </w:pPr>
-          <w:hyperlink w:anchor="_Toc240758766" w:history="1">
+          <w:hyperlink w:anchor="_Toc240759026" w:history="1">
             <w:r>
               <w:rPr>
                 <w:rStyle w:val="Hyperlink"/>
@@ -2869,7 +2869,7 @@
               <w:rPr>
                 <w:noProof/>
               </w:rPr>
-              <w:instrText xml:space="preserve"> PAGEREF _Toc240758766 \h </w:instrText>
+              <w:instrText xml:space="preserve"> PAGEREF _Toc240759026 \h </w:instrText>
             </w:r>
             <w:r>
               <w:rPr>
@@ -2912,7 +2912,7 @@
               <w14:ligatures w14:val="standardContextual"/>
             </w:rPr>
           </w:pPr>
-          <w:hyperlink w:anchor="_Toc240758767" w:history="1">
+          <w:hyperlink w:anchor="_Toc240759027" w:history="1">
             <w:r>
               <w:rPr>
                 <w:rStyle w:val="Hyperlink"/>
@@ -2936,7 +2936,7 @@
               <w:rPr>
                 <w:noProof/>
               </w:rPr>
-              <w:instrText xml:space="preserve"> PAGEREF _Toc240758767 \h </w:instrText>
+              <w:instrText xml:space="preserve"> PAGEREF _Toc240759027 \h </w:instrText>
             </w:r>
             <w:r>
               <w:rPr>
@@ -2979,7 +2979,7 @@
               <w14:ligatures w14:val="standardContextual"/>
             </w:rPr>
           </w:pPr>
-          <w:hyperlink w:anchor="_Toc240758768" w:history="1">
+          <w:hyperlink w:anchor="_Toc240759028" w:history="1">
             <w:r>
               <w:rPr>
                 <w:rStyle w:val="Hyperlink"/>
@@ -3003,7 +3003,7 @@
               <w:rPr>
                 <w:noProof/>
               </w:rPr>
-              <w:instrText xml:space="preserve"> PAGEREF _Toc240758768 \h </w:instrText>
+              <w:instrText xml:space="preserve"> PAGEREF _Toc240759028 \h </w:instrText>
             </w:r>
             <w:r>
               <w:rPr>
@@ -3046,7 +3046,7 @@
               <w14:ligatures w14:val="standardContextual"/>
             </w:rPr>
           </w:pPr>
-          <w:hyperlink w:anchor="_Toc240758769" w:history="1">
+          <w:hyperlink w:anchor="_Toc240759029" w:history="1">
             <w:r>
               <w:rPr>
                 <w:rStyle w:val="Hyperlink"/>
@@ -3070,7 +3070,7 @@
               <w:rPr>
                 <w:noProof/>
               </w:rPr>
-              <w:instrText xml:space="preserve"> PAGEREF _Toc240758769 \h </w:instrText>
+              <w:instrText xml:space="preserve"> PAGEREF _Toc240759029 \h </w:instrText>
             </w:r>
             <w:r>
               <w:rPr>
@@ -3113,7 +3113,7 @@
               <w14:ligatures w14:val="standardContextual"/>
             </w:rPr>
           </w:pPr>
-          <w:hyperlink w:anchor="_Toc240758770" w:history="1">
+          <w:hyperlink w:anchor="_Toc240759030" w:history="1">
             <w:r>
               <w:rPr>
                 <w:rStyle w:val="Hyperlink"/>
@@ -3137,7 +3137,7 @@
               <w:rPr>
                 <w:noProof/>
               </w:rPr>
-              <w:instrText xml:space="preserve"> PAGEREF _Toc240758770 \h </w:instrText>
+              <w:instrText xml:space="preserve"> PAGEREF _Toc240759030 \h </w:instrText>
             </w:r>
             <w:r>
               <w:rPr>
@@ -3180,7 +3180,7 @@
               <w14:ligatures w14:val="standardContextual"/>
             </w:rPr>
           </w:pPr>
-          <w:hyperlink w:anchor="_Toc240758771" w:history="1">
+          <w:hyperlink w:anchor="_Toc240759031" w:history="1">
             <w:r>
               <w:rPr>
                 <w:rStyle w:val="Hyperlink"/>
@@ -3204,7 +3204,7 @@
               <w:rPr>
                 <w:noProof/>
               </w:rPr>
-              <w:instrText xml:space="preserve"> PAGEREF _Toc240758771 \h </w:instrText>
+              <w:instrText xml:space="preserve"> PAGEREF _Toc240759031 \h </w:instrText>
             </w:r>
             <w:r>
               <w:rPr>
@@ -3247,7 +3247,7 @@
               <w14:ligatures w14:val="standardContextual"/>
             </w:rPr>
           </w:pPr>
-          <w:hyperlink w:anchor="_Toc240758772" w:history="1">
+          <w:hyperlink w:anchor="_Toc240759032" w:history="1">
             <w:r>
               <w:rPr>
                 <w:rStyle w:val="Hyperlink"/>
@@ -3271,7 +3271,7 @@
               <w:rPr>
                 <w:noProof/>
               </w:rPr>
-              <w:instrText xml:space="preserve"> PAGEREF _Toc240758772 \h </w:instrText>
+              <w:instrText xml:space="preserve"> PAGEREF _Toc240759032 \h </w:instrText>
             </w:r>
             <w:r>
               <w:rPr>
@@ -3310,7 +3310,7 @@
         <w:pStyle w:val="Heading1"/>
         <w:pageBreakBefore/>
       </w:pPr>
-      <w:bookmarkStart w:id="0" w:name="_Toc240758732"/>
+      <w:bookmarkStart w:id="0" w:name="_Toc240758992"/>
       <w:r>
         <w:lastRenderedPageBreak/>
         <w:t>1. Welcome</w:t>
@@ -3339,7 +3339,7 @@
       <w:pPr>
         <w:pStyle w:val="Heading2"/>
       </w:pPr>
-      <w:bookmarkStart w:id="1" w:name="_Toc240758733"/>
+      <w:bookmarkStart w:id="1" w:name="_Toc240758993"/>
       <w:r>
         <w:t>How to use this manual</w:t>
       </w:r>
@@ -3406,7 +3406,7 @@
       <w:pPr>
         <w:pStyle w:val="Heading2"/>
       </w:pPr>
-      <w:bookmarkStart w:id="2" w:name="_Toc240758734"/>
+      <w:bookmarkStart w:id="2" w:name="_Toc240758994"/>
       <w:r>
         <w:t>Who to contact</w:t>
       </w:r>
@@ -3624,7 +3624,7 @@
         <w:pStyle w:val="Heading1"/>
         <w:pageBreakBefore/>
       </w:pPr>
-      <w:bookmarkStart w:id="3" w:name="_Toc240758735"/>
+      <w:bookmarkStart w:id="3" w:name="_Toc240758995"/>
       <w:r>
         <w:lastRenderedPageBreak/>
         <w:t>2. The study</w:t>
@@ -4220,7 +4220,7 @@
       <w:pPr>
         <w:pStyle w:val="Heading2"/>
       </w:pPr>
-      <w:bookmarkStart w:id="4" w:name="_Toc240758736"/>
+      <w:bookmarkStart w:id="4" w:name="_Toc240758996"/>
       <w:r>
         <w:t>Explaining the study in two minutes</w:t>
       </w:r>
@@ -4239,7 +4239,7 @@
         <w:pStyle w:val="Heading1"/>
         <w:pageBreakBefore/>
       </w:pPr>
-      <w:bookmarkStart w:id="5" w:name="_Toc240758737"/>
+      <w:bookmarkStart w:id="5" w:name="_Toc240758997"/>
       <w:r>
         <w:lastRenderedPageBreak/>
         <w:t>3. Ethics and data protection</w:t>
@@ -4250,7 +4250,7 @@
       <w:pPr>
         <w:pStyle w:val="Heading2"/>
       </w:pPr>
-      <w:bookmarkStart w:id="6" w:name="_Toc240758738"/>
+      <w:bookmarkStart w:id="6" w:name="_Toc240758998"/>
       <w:r>
         <w:t>3.1 Principles you must apply</w:t>
       </w:r>
@@ -4700,7 +4700,7 @@
       <w:pPr>
         <w:pStyle w:val="Heading2"/>
       </w:pPr>
-      <w:bookmarkStart w:id="7" w:name="_Toc240758739"/>
+      <w:bookmarkStart w:id="7" w:name="_Toc240758999"/>
       <w:r>
         <w:t>3.2 What respondents are told (PIS v1.3, summary)</w:t>
       </w:r>
@@ -4806,7 +4806,7 @@
       <w:pPr>
         <w:pStyle w:val="Heading2"/>
       </w:pPr>
-      <w:bookmarkStart w:id="8" w:name="_Toc240758740"/>
+      <w:bookmarkStart w:id="8" w:name="_Toc240759000"/>
       <w:r>
         <w:t>3.3 Data protection rules</w:t>
       </w:r>
@@ -4938,7 +4938,7 @@
       <w:pPr>
         <w:pStyle w:val="Heading2"/>
       </w:pPr>
-      <w:bookmarkStart w:id="9" w:name="_Toc240758741"/>
+      <w:bookmarkStart w:id="9" w:name="_Toc240759001"/>
       <w:r>
         <w:t>3.4 Your devices</w:t>
       </w:r>
@@ -5018,7 +5018,7 @@
       <w:pPr>
         <w:pStyle w:val="Heading2"/>
       </w:pPr>
-      <w:bookmarkStart w:id="10" w:name="_Toc240758742"/>
+      <w:bookmarkStart w:id="10" w:name="_Toc240759002"/>
       <w:r>
         <w:t>3.5 Conduct</w:t>
       </w:r>
@@ -5099,7 +5099,7 @@
         <w:pStyle w:val="Heading1"/>
         <w:pageBreakBefore/>
       </w:pPr>
-      <w:bookmarkStart w:id="11" w:name="_Toc240758743"/>
+      <w:bookmarkStart w:id="11" w:name="_Toc240759003"/>
       <w:r>
         <w:lastRenderedPageBreak/>
         <w:t>4. The portal and the forms</w:t>
@@ -5110,7 +5110,7 @@
       <w:pPr>
         <w:pStyle w:val="Heading2"/>
       </w:pPr>
-      <w:bookmarkStart w:id="12" w:name="_Toc240758744"/>
+      <w:bookmarkStart w:id="12" w:name="_Toc240759004"/>
       <w:r>
         <w:t>Signing in</w:t>
       </w:r>
@@ -5193,7 +5193,7 @@
           <w:noProof/>
         </w:rPr>
         <w:drawing>
-          <wp:inline distT="0" distB="0" distL="0" distR="0" wp14:anchorId="29C547B4" wp14:editId="105C91DF">
+          <wp:inline distT="0" distB="0" distL="0" distR="0" wp14:anchorId="32A4CA14" wp14:editId="76E91E41">
             <wp:extent cx="5334000" cy="2333625"/>
             <wp:effectExtent l="0" t="0" r="0" b="0"/>
             <wp:docPr id="1" name="adm_login.jpg" descr="The sign-in screen for all internal staff." title="The sign-in screen for all internal staff."/>
@@ -5360,7 +5360,7 @@
       <w:pPr>
         <w:pStyle w:val="Heading2"/>
       </w:pPr>
-      <w:bookmarkStart w:id="13" w:name="_Toc240758745"/>
+      <w:bookmarkStart w:id="13" w:name="_Toc240759005"/>
       <w:r>
         <w:t>Finding your way around</w:t>
       </w:r>
@@ -5535,7 +5535,7 @@
         </w:rPr>
         <w:lastRenderedPageBreak/>
         <w:drawing>
-          <wp:inline distT="0" distB="0" distL="0" distR="0" wp14:anchorId="4A54C472" wp14:editId="3101183D">
+          <wp:inline distT="0" distB="0" distL="0" distR="0" wp14:anchorId="683A9E45" wp14:editId="2BD6A43F">
             <wp:extent cx="5715000" cy="1876425"/>
             <wp:effectExtent l="0" t="0" r="0" b="0"/>
             <wp:docPr id="2" name="adm_not_your_role.jpg" descr="Opening a screen outside your role (for example from an old bookmark) shows this card instead of the screen." title="Opening a screen outside your role (for example from an old bookmark) shows this card instead of the screen."/>
@@ -5604,7 +5604,7 @@
       <w:pPr>
         <w:pStyle w:val="Heading2"/>
       </w:pPr>
-      <w:bookmarkStart w:id="14" w:name="_Toc240758746"/>
+      <w:bookmarkStart w:id="14" w:name="_Toc240759006"/>
       <w:r>
         <w:t>Roles</w:t>
       </w:r>
@@ -6386,7 +6386,7 @@
       <w:pPr>
         <w:pStyle w:val="Heading2"/>
       </w:pPr>
-      <w:bookmarkStart w:id="15" w:name="_Toc240758747"/>
+      <w:bookmarkStart w:id="15" w:name="_Toc240759007"/>
       <w:r>
         <w:t>Case statuses you will see</w:t>
       </w:r>
@@ -7901,7 +7901,7 @@
       <w:pPr>
         <w:pStyle w:val="Heading2"/>
       </w:pPr>
-      <w:bookmarkStart w:id="16" w:name="_Toc240758748"/>
+      <w:bookmarkStart w:id="16" w:name="_Toc240759008"/>
       <w:r>
         <w:t>The KoboToolbox forms</w:t>
       </w:r>
@@ -8345,7 +8345,7 @@
         <w:pStyle w:val="Heading1"/>
         <w:pageBreakBefore/>
       </w:pPr>
-      <w:bookmarkStart w:id="17" w:name="_Toc240758749"/>
+      <w:bookmarkStart w:id="17" w:name="_Toc240759009"/>
       <w:r>
         <w:lastRenderedPageBreak/>
         <w:t>5. Communication scripts</w:t>
@@ -8356,7 +8356,7 @@
       <w:pPr>
         <w:pStyle w:val="Heading2"/>
       </w:pPr>
-      <w:bookmarkStart w:id="18" w:name="_Toc240758750"/>
+      <w:bookmarkStart w:id="18" w:name="_Toc240759010"/>
       <w:r>
         <w:t>5.1 First phone call</w:t>
       </w:r>
@@ -8436,7 +8436,7 @@
       <w:pPr>
         <w:pStyle w:val="Heading2"/>
       </w:pPr>
-      <w:bookmarkStart w:id="19" w:name="_Toc240758751"/>
+      <w:bookmarkStart w:id="19" w:name="_Toc240759011"/>
       <w:r>
         <w:t>5.2 If they are busy</w:t>
       </w:r>
@@ -8454,7 +8454,7 @@
       <w:pPr>
         <w:pStyle w:val="Heading2"/>
       </w:pPr>
-      <w:bookmarkStart w:id="20" w:name="_Toc240758752"/>
+      <w:bookmarkStart w:id="20" w:name="_Toc240759012"/>
       <w:r>
         <w:t>5.3 Voicemail or no answer</w:t>
       </w:r>
@@ -8472,7 +8472,7 @@
       <w:pPr>
         <w:pStyle w:val="Heading2"/>
       </w:pPr>
-      <w:bookmarkStart w:id="21" w:name="_Toc240758753"/>
+      <w:bookmarkStart w:id="21" w:name="_Toc240759013"/>
       <w:r>
         <w:t>5.4 Common questions</w:t>
       </w:r>
@@ -8922,7 +8922,7 @@
       <w:pPr>
         <w:pStyle w:val="Heading2"/>
       </w:pPr>
-      <w:bookmarkStart w:id="22" w:name="_Toc240758754"/>
+      <w:bookmarkStart w:id="22" w:name="_Toc240759014"/>
       <w:r>
         <w:t>5.5 Refusals and withdrawals</w:t>
       </w:r>
@@ -8941,7 +8941,7 @@
         <w:pStyle w:val="Heading1"/>
         <w:pageBreakBefore/>
       </w:pPr>
-      <w:bookmarkStart w:id="23" w:name="_Toc240758755"/>
+      <w:bookmarkStart w:id="23" w:name="_Toc240759015"/>
       <w:r>
         <w:lastRenderedPageBreak/>
         <w:t>6. Role modules</w:t>
@@ -8960,7 +8960,7 @@
       <w:pPr>
         <w:pStyle w:val="Heading2"/>
       </w:pPr>
-      <w:bookmarkStart w:id="24" w:name="_Toc240758756"/>
+      <w:bookmarkStart w:id="24" w:name="_Toc240759016"/>
       <w:r>
         <w:t>Module A — Contact RA</w:t>
       </w:r>
@@ -9101,7 +9101,7 @@
           <w:noProof/>
         </w:rPr>
         <w:drawing>
-          <wp:inline distT="0" distB="0" distL="0" distR="0" wp14:anchorId="120BB94D" wp14:editId="66D069FB">
+          <wp:inline distT="0" distB="0" distL="0" distR="0" wp14:anchorId="6467BCEE" wp14:editId="7AC7F191">
             <wp:extent cx="5334000" cy="2114550"/>
             <wp:effectExtent l="0" t="0" r="0" b="0"/>
             <wp:docPr id="3" name="adm_case_add_person.jpg" descr="Adding a person to a case." title="Adding a person to a case."/>
@@ -9476,7 +9476,7 @@
         </w:rPr>
         <w:lastRenderedPageBreak/>
         <w:drawing>
-          <wp:inline distT="0" distB="0" distL="0" distR="0" wp14:anchorId="647EA610" wp14:editId="69B59285">
+          <wp:inline distT="0" distB="0" distL="0" distR="0" wp14:anchorId="638B3239" wp14:editId="6E1299EF">
             <wp:extent cx="5334000" cy="1143000"/>
             <wp:effectExtent l="0" t="0" r="0" b="0"/>
             <wp:docPr id="4" name="cra_case_invitations_before.jpg" descr="Invitations panel before sending, with the history of earlier invitations." title="Invitations panel before sending, with the history of earlier invitations."/>
@@ -9605,7 +9605,7 @@
           <w:noProof/>
         </w:rPr>
         <w:drawing>
-          <wp:inline distT="0" distB="0" distL="0" distR="0" wp14:anchorId="75C2E8EE" wp14:editId="516EF2E3">
+          <wp:inline distT="0" distB="0" distL="0" distR="0" wp14:anchorId="5AA84EDF" wp14:editId="05E6B455">
             <wp:extent cx="5334000" cy="2152650"/>
             <wp:effectExtent l="0" t="0" r="0" b="0"/>
             <wp:docPr id="5" name="cra_case_invitation_sent.jpg" descr="The link, manual code and ready-written messages are shown once, with a send button for each channel." title="The link, manual code and ready-written messages are shown once, with a send button for each channel."/>
@@ -10045,7 +10045,7 @@
           <w:noProof/>
         </w:rPr>
         <w:drawing>
-          <wp:inline distT="0" distB="0" distL="0" distR="0" wp14:anchorId="2868D531" wp14:editId="58C793C3">
+          <wp:inline distT="0" distB="0" distL="0" distR="0" wp14:anchorId="7EA0C2E5" wp14:editId="7861B6DC">
             <wp:extent cx="5334000" cy="1343025"/>
             <wp:effectExtent l="0" t="0" r="0" b="0"/>
             <wp:docPr id="6" name="adm_case_timeline.jpg" descr="Contact timeline and the form for logging an attempt." title="Contact timeline and the form for logging an attempt."/>
@@ -10255,7 +10255,7 @@
         </w:rPr>
         <w:lastRenderedPageBreak/>
         <w:drawing>
-          <wp:inline distT="0" distB="0" distL="0" distR="0" wp14:anchorId="7B7C8D4F" wp14:editId="7445F7FF">
+          <wp:inline distT="0" distB="0" distL="0" distR="0" wp14:anchorId="57B116DF" wp14:editId="3FC75A14">
             <wp:extent cx="5334000" cy="3333750"/>
             <wp:effectExtent l="0" t="0" r="0" b="0"/>
             <wp:docPr id="7" name="cra_follow_ups.jpg" descr="Follow-ups due. Contact RAs see only their own cases." title="Follow-ups due. Contact RAs see only their own cases."/>
@@ -10519,7 +10519,7 @@
           <w:noProof/>
         </w:rPr>
         <w:drawing>
-          <wp:inline distT="0" distB="0" distL="0" distR="0" wp14:anchorId="3B47EBD8" wp14:editId="512FA133">
+          <wp:inline distT="0" distB="0" distL="0" distR="0" wp14:anchorId="5DD78EC6" wp14:editId="318D3625">
             <wp:extent cx="5334000" cy="2667000"/>
             <wp:effectExtent l="0" t="0" r="0" b="0"/>
             <wp:docPr id="8" name="cra_appointments.jpg" descr="Appointment Queue." title="Appointment Queue."/>
@@ -11428,7 +11428,7 @@
       <w:pPr>
         <w:pStyle w:val="Heading2"/>
       </w:pPr>
-      <w:bookmarkStart w:id="25" w:name="_Toc240758757"/>
+      <w:bookmarkStart w:id="25" w:name="_Toc240759017"/>
       <w:r>
         <w:t>Module B — QUAN/Kobo QA RA</w:t>
       </w:r>
@@ -11477,7 +11477,7 @@
         </w:rPr>
         <w:lastRenderedPageBreak/>
         <w:drawing>
-          <wp:inline distT="0" distB="0" distL="0" distR="0" wp14:anchorId="2B47F24D" wp14:editId="02274679">
+          <wp:inline distT="0" distB="0" distL="0" distR="0" wp14:anchorId="1162F8B8" wp14:editId="1CEC6511">
             <wp:extent cx="5334000" cy="3333750"/>
             <wp:effectExtent l="0" t="0" r="0" b="0"/>
             <wp:docPr id="9" name="qa_queue.jpg" descr="QUAN QA Queue with the KoboToolbox sync panel." title="QUAN QA Queue with the KoboToolbox sync panel."/>
@@ -12278,7 +12278,7 @@
           <w:noProof/>
         </w:rPr>
         <w:drawing>
-          <wp:inline distT="0" distB="0" distL="0" distR="0" wp14:anchorId="37C742E9" wp14:editId="725EABE7">
+          <wp:inline distT="0" distB="0" distL="0" distR="0" wp14:anchorId="33EDF5D3" wp14:editId="4AFC5F6A">
             <wp:extent cx="5334000" cy="3333750"/>
             <wp:effectExtent l="0" t="0" r="0" b="0"/>
             <wp:docPr id="10" name="qa_exceptions.jpg" descr="QA Exception Queue." title="QA Exception Queue."/>
@@ -12539,7 +12539,7 @@
       <w:pPr>
         <w:pStyle w:val="Heading2"/>
       </w:pPr>
-      <w:bookmarkStart w:id="26" w:name="_Toc240758758"/>
+      <w:bookmarkStart w:id="26" w:name="_Toc240759018"/>
       <w:r>
         <w:t>Module C — KII RA</w:t>
       </w:r>
@@ -12588,7 +12588,7 @@
         </w:rPr>
         <w:lastRenderedPageBreak/>
         <w:drawing>
-          <wp:inline distT="0" distB="0" distL="0" distR="0" wp14:anchorId="34F5A3CC" wp14:editId="4E998BB8">
+          <wp:inline distT="0" distB="0" distL="0" distR="0" wp14:anchorId="4EE55573" wp14:editId="4F0C04DA">
             <wp:extent cx="5334000" cy="2667000"/>
             <wp:effectExtent l="0" t="0" r="0" b="0"/>
             <wp:docPr id="11" name="kii_new.jpg" descr="New KII Record." title="New KII Record."/>
@@ -12773,7 +12773,7 @@
           <w:noProof/>
         </w:rPr>
         <w:drawing>
-          <wp:inline distT="0" distB="0" distL="0" distR="0" wp14:anchorId="7391FE0A" wp14:editId="42CBAA90">
+          <wp:inline distT="0" distB="0" distL="0" distR="0" wp14:anchorId="1B230480" wp14:editId="29706C28">
             <wp:extent cx="5334000" cy="3333750"/>
             <wp:effectExtent l="0" t="0" r="0" b="0"/>
             <wp:docPr id="12" name="kii_register.jpg" descr="KII Register." title="KII Register."/>
@@ -12873,7 +12873,7 @@
         </w:rPr>
         <w:lastRenderedPageBreak/>
         <w:drawing>
-          <wp:inline distT="0" distB="0" distL="0" distR="0" wp14:anchorId="1A5B2391" wp14:editId="35702F91">
+          <wp:inline distT="0" distB="0" distL="0" distR="0" wp14:anchorId="58F20336" wp14:editId="57720FCC">
             <wp:extent cx="5334000" cy="3752850"/>
             <wp:effectExtent l="0" t="0" r="0" b="0"/>
             <wp:docPr id="13" name="kii_detail.jpg" descr="KII record: status, consent, transcript and coding." title="KII record: status, consent, transcript and coding."/>
@@ -13157,7 +13157,7 @@
           <w:noProof/>
         </w:rPr>
         <w:drawing>
-          <wp:inline distT="0" distB="0" distL="0" distR="0" wp14:anchorId="2BDDA8DD" wp14:editId="71A4024B">
+          <wp:inline distT="0" distB="0" distL="0" distR="0" wp14:anchorId="4DD4F580" wp14:editId="7DDB1B05">
             <wp:extent cx="5334000" cy="523875"/>
             <wp:effectExtent l="0" t="0" r="0" b="0"/>
             <wp:docPr id="14" name="kii_coding_locked.jpg" descr="Before consent: no interview link." title="Before consent: no interview link."/>
@@ -13257,7 +13257,7 @@
         </w:rPr>
         <w:lastRenderedPageBreak/>
         <w:drawing>
-          <wp:inline distT="0" distB="0" distL="0" distR="0" wp14:anchorId="3BF8F98C" wp14:editId="598A44E7">
+          <wp:inline distT="0" distB="0" distL="0" distR="0" wp14:anchorId="59A881C1" wp14:editId="3086BB88">
             <wp:extent cx="5334000" cy="742950"/>
             <wp:effectExtent l="0" t="0" r="0" b="0"/>
             <wp:docPr id="15" name="kii_coding_ready.jpg" descr="After consent: Continue this interview." title="After consent: Continue this interview."/>
@@ -13492,7 +13492,7 @@
       <w:pPr>
         <w:pStyle w:val="Heading2"/>
       </w:pPr>
-      <w:bookmarkStart w:id="27" w:name="_Toc240758759"/>
+      <w:bookmarkStart w:id="27" w:name="_Toc240759019"/>
       <w:r>
         <w:t>Module D — Documentary RA</w:t>
       </w:r>
@@ -13540,7 +13540,7 @@
           <w:noProof/>
         </w:rPr>
         <w:drawing>
-          <wp:inline distT="0" distB="0" distL="0" distR="0" wp14:anchorId="288231FA" wp14:editId="25C4186B">
+          <wp:inline distT="0" distB="0" distL="0" distR="0" wp14:anchorId="3BD511E5" wp14:editId="781C4E96">
             <wp:extent cx="5334000" cy="3171825"/>
             <wp:effectExtent l="0" t="0" r="0" b="0"/>
             <wp:docPr id="16" name="doc_new.jpg" descr="New Documentary Evidence Record." title="New Documentary Evidence Record."/>
@@ -13746,7 +13746,7 @@
           <w:noProof/>
         </w:rPr>
         <w:drawing>
-          <wp:inline distT="0" distB="0" distL="0" distR="0" wp14:anchorId="6EE9771E" wp14:editId="0D8BA739">
+          <wp:inline distT="0" distB="0" distL="0" distR="0" wp14:anchorId="70FFCCDF" wp14:editId="206374EF">
             <wp:extent cx="5334000" cy="819150"/>
             <wp:effectExtent l="0" t="0" r="0" b="0"/>
             <wp:docPr id="17" name="doc_source_file.jpg" descr="Source file: the file name, size and date, with Remove file beside it." title="Source file: the file name, size and date, with Remove file beside it."/>
@@ -13997,7 +13997,7 @@
           <w:noProof/>
         </w:rPr>
         <w:drawing>
-          <wp:inline distT="0" distB="0" distL="0" distR="0" wp14:anchorId="419AE9C8" wp14:editId="6F0780B5">
+          <wp:inline distT="0" distB="0" distL="0" distR="0" wp14:anchorId="2289BA49" wp14:editId="18BC449C">
             <wp:extent cx="5334000" cy="3333750"/>
             <wp:effectExtent l="0" t="0" r="0" b="0"/>
             <wp:docPr id="18" name="doc_register.jpg" descr="Documentary Evidence Corpus." title="Documentary Evidence Corpus."/>
@@ -14107,7 +14107,7 @@
           <w:noProof/>
         </w:rPr>
         <w:drawing>
-          <wp:inline distT="0" distB="0" distL="0" distR="0" wp14:anchorId="0DE1A4E8" wp14:editId="24800338">
+          <wp:inline distT="0" distB="0" distL="0" distR="0" wp14:anchorId="09A0D018" wp14:editId="795BDDC4">
             <wp:extent cx="5334000" cy="3419475"/>
             <wp:effectExtent l="0" t="0" r="0" b="0"/>
             <wp:docPr id="19" name="doc_detail.jpg" descr="Document record: authenticity, QA status, memo and coding form." title="Document record: authenticity, QA status, memo and coding form."/>
@@ -14586,7 +14586,7 @@
           <w:noProof/>
         </w:rPr>
         <w:drawing>
-          <wp:inline distT="0" distB="0" distL="0" distR="0" wp14:anchorId="5E0831E4" wp14:editId="7B6EDAA8">
+          <wp:inline distT="0" distB="0" distL="0" distR="0" wp14:anchorId="5457991F" wp14:editId="3F9A09E9">
             <wp:extent cx="5715000" cy="904875"/>
             <wp:effectExtent l="0" t="0" r="0" b="0"/>
             <wp:docPr id="20" name="doc_coding_buttons.jpg" descr="The Coding panel: Code this document, and Auto-fill." title="The Coding panel: Code this document, and Auto-fill."/>
@@ -14739,7 +14739,7 @@
           <w:noProof/>
         </w:rPr>
         <w:drawing>
-          <wp:inline distT="0" distB="0" distL="0" distR="0" wp14:anchorId="66C74F46" wp14:editId="07390E2B">
+          <wp:inline distT="0" distB="0" distL="0" distR="0" wp14:anchorId="137B0CB5" wp14:editId="72A34628">
             <wp:extent cx="5334000" cy="2171700"/>
             <wp:effectExtent l="0" t="0" r="0" b="0"/>
             <wp:docPr id="21" name="doc_autofill_pages.jpg" descr="A 240-page PDF asks for a page range." title="A 240-page PDF asks for a page range."/>
@@ -14838,7 +14838,7 @@
           <w:noProof/>
         </w:rPr>
         <w:drawing>
-          <wp:inline distT="0" distB="0" distL="0" distR="0" wp14:anchorId="32E14404" wp14:editId="06FB105E">
+          <wp:inline distT="0" distB="0" distL="0" distR="0" wp14:anchorId="7CC75487" wp14:editId="0602C3BF">
             <wp:extent cx="5334000" cy="1752600"/>
             <wp:effectExtent l="0" t="0" r="0" b="0"/>
             <wp:docPr id="22" name="doc_autofill_running.jpg" descr="The AI is reading the document." title="The AI is reading the document."/>
@@ -14928,7 +14928,7 @@
         </w:rPr>
         <w:lastRenderedPageBreak/>
         <w:drawing>
-          <wp:inline distT="0" distB="0" distL="0" distR="0" wp14:anchorId="68AFA17D" wp14:editId="34D33338">
+          <wp:inline distT="0" distB="0" distL="0" distR="0" wp14:anchorId="331C1DE0" wp14:editId="58B2E9A6">
             <wp:extent cx="5334000" cy="4581525"/>
             <wp:effectExtent l="0" t="0" r="0" b="0"/>
             <wp:docPr id="23" name="doc_autofill_review.jpg" descr="The review screen: the draft, ready to check and edit." title="The review screen: the draft, ready to check and edit."/>
@@ -15018,7 +15018,7 @@
         </w:rPr>
         <w:lastRenderedPageBreak/>
         <w:drawing>
-          <wp:inline distT="0" distB="0" distL="0" distR="0" wp14:anchorId="2560BA05" wp14:editId="0ACD2105">
+          <wp:inline distT="0" distB="0" distL="0" distR="0" wp14:anchorId="62BA65E3" wp14:editId="23E3947A">
             <wp:extent cx="5334000" cy="3838575"/>
             <wp:effectExtent l="0" t="0" r="0" b="0"/>
             <wp:docPr id="24" name="doc_autofill_section_d.jpg" descr="Section D: ratings and locators, all editable." title="Section D: ratings and locators, all editable."/>
@@ -15107,7 +15107,7 @@
           <w:noProof/>
         </w:rPr>
         <w:drawing>
-          <wp:inline distT="0" distB="0" distL="0" distR="0" wp14:anchorId="7A787010" wp14:editId="79701F4E">
+          <wp:inline distT="0" distB="0" distL="0" distR="0" wp14:anchorId="6CC3CC15" wp14:editId="2E793193">
             <wp:extent cx="5334000" cy="3838575"/>
             <wp:effectExtent l="0" t="0" r="0" b="0"/>
             <wp:docPr id="25" name="doc_autofill_section_j.jpg" descr="Section J: quantitative metrics." title="Section J: quantitative metrics."/>
@@ -16736,7 +16736,7 @@
         <w:pStyle w:val="Heading1"/>
         <w:pageBreakBefore/>
       </w:pPr>
-      <w:bookmarkStart w:id="28" w:name="_Toc240758760"/>
+      <w:bookmarkStart w:id="28" w:name="_Toc240759020"/>
       <w:r>
         <w:lastRenderedPageBreak/>
         <w:t>7. Scenarios</w:t>
@@ -17691,7 +17691,7 @@
         <w:pStyle w:val="Heading1"/>
         <w:pageBreakBefore/>
       </w:pPr>
-      <w:bookmarkStart w:id="29" w:name="_Toc240758761"/>
+      <w:bookmarkStart w:id="29" w:name="_Toc240759021"/>
       <w:r>
         <w:lastRenderedPageBreak/>
         <w:t>8. Practice exercises</w:t>
@@ -17710,7 +17710,7 @@
       <w:pPr>
         <w:pStyle w:val="Heading2"/>
       </w:pPr>
-      <w:bookmarkStart w:id="30" w:name="_Toc240758762"/>
+      <w:bookmarkStart w:id="30" w:name="_Toc240759022"/>
       <w:r>
         <w:t>Exercise 1 — Getting around (all RAs)</w:t>
       </w:r>
@@ -17777,7 +17777,7 @@
       <w:pPr>
         <w:pStyle w:val="Heading2"/>
       </w:pPr>
-      <w:bookmarkStart w:id="31" w:name="_Toc240758763"/>
+      <w:bookmarkStart w:id="31" w:name="_Toc240759023"/>
       <w:r>
         <w:t>Exercise 2 — A complete contact (Contact RAs)</w:t>
       </w:r>
@@ -17857,7 +17857,7 @@
       <w:pPr>
         <w:pStyle w:val="Heading2"/>
       </w:pPr>
-      <w:bookmarkStart w:id="32" w:name="_Toc240758764"/>
+      <w:bookmarkStart w:id="32" w:name="_Toc240759024"/>
       <w:r>
         <w:t>Exercise 3 — QA decisions (QA RAs)</w:t>
       </w:r>
@@ -17924,7 +17924,7 @@
       <w:pPr>
         <w:pStyle w:val="Heading2"/>
       </w:pPr>
-      <w:bookmarkStart w:id="33" w:name="_Toc240758765"/>
+      <w:bookmarkStart w:id="33" w:name="_Toc240759025"/>
       <w:r>
         <w:t>Exercise 4 — A KII record (KII RAs)</w:t>
       </w:r>
@@ -17991,7 +17991,7 @@
       <w:pPr>
         <w:pStyle w:val="Heading2"/>
       </w:pPr>
-      <w:bookmarkStart w:id="34" w:name="_Toc240758766"/>
+      <w:bookmarkStart w:id="34" w:name="_Toc240759026"/>
       <w:r>
         <w:t>Exercise 5 — A document (Documentary RAs)</w:t>
       </w:r>
@@ -18163,7 +18163,7 @@
         <w:pStyle w:val="Heading1"/>
         <w:pageBreakBefore/>
       </w:pPr>
-      <w:bookmarkStart w:id="35" w:name="_Toc240758767"/>
+      <w:bookmarkStart w:id="35" w:name="_Toc240759027"/>
       <w:r>
         <w:lastRenderedPageBreak/>
         <w:t>9. Daily checklists</w:t>
@@ -18174,7 +18174,7 @@
       <w:pPr>
         <w:pStyle w:val="Heading2"/>
       </w:pPr>
-      <w:bookmarkStart w:id="36" w:name="_Toc240758768"/>
+      <w:bookmarkStart w:id="36" w:name="_Toc240759028"/>
       <w:r>
         <w:t>Start of the day</w:t>
       </w:r>
@@ -18254,7 +18254,7 @@
       <w:pPr>
         <w:pStyle w:val="Heading2"/>
       </w:pPr>
-      <w:bookmarkStart w:id="37" w:name="_Toc240758769"/>
+      <w:bookmarkStart w:id="37" w:name="_Toc240759029"/>
       <w:r>
         <w:t>End of the day</w:t>
       </w:r>
@@ -18308,7 +18308,7 @@
       <w:pPr>
         <w:pStyle w:val="Heading2"/>
       </w:pPr>
-      <w:bookmarkStart w:id="38" w:name="_Toc240758770"/>
+      <w:bookmarkStart w:id="38" w:name="_Toc240759030"/>
       <w:r>
         <w:t>Troubleshooting</w:t>
       </w:r>
@@ -19171,7 +19171,7 @@
         <w:pStyle w:val="Heading1"/>
         <w:pageBreakBefore/>
       </w:pPr>
-      <w:bookmarkStart w:id="39" w:name="_Toc240758771"/>
+      <w:bookmarkStart w:id="39" w:name="_Toc240759031"/>
       <w:r>
         <w:lastRenderedPageBreak/>
         <w:t>10. Glossary</w:t>
@@ -20900,7 +20900,7 @@
         <w:pStyle w:val="Heading1"/>
         <w:pageBreakBefore/>
       </w:pPr>
-      <w:bookmarkStart w:id="40" w:name="_Toc240758772"/>
+      <w:bookmarkStart w:id="40" w:name="_Toc240759032"/>
       <w:r>
         <w:lastRenderedPageBreak/>
         <w:t>11. Confidentiality and conduct declaration</w:t>
@@ -21559,10 +21559,10 @@
 <file path=word/numbering.xml><?xml version="1.0" encoding="utf-8"?>
 <w:numbering xmlns:wpc="http://schemas.microsoft.com/office/word/2010/wordprocessingCanvas" xmlns:cx="http://schemas.microsoft.com/office/drawing/2014/chartex" xmlns:cx1="http://schemas.microsoft.com/office/drawing/2015/9/8/chartex" xmlns:cx2="http://schemas.microsoft.com/office/drawing/2015/10/21/chartex" xmlns:cx3="http://schemas.microsoft.com/office/drawing/2016/5/9/chartex" xmlns:cx4="http://schemas.microsoft.com/office/drawing/2016/5/10/chartex" xmlns:cx5="http://schemas.microsoft.com/office/drawing/2016/5/11/chartex" xmlns:cx6="http://schemas.microsoft.com/office/drawing/2016/5/12/chartex" xmlns:cx7="http://schemas.microsoft.com/office/drawing/2016/5/13/chartex" xmlns:cx8="http://schemas.microsoft.com/office/drawing/2016/5/14/chartex" xmlns:mc="http://schemas.openxmlformats.org/markup-compatibility/2006" xmlns:aink="http://schemas.microsoft.com/office/drawing/2016/ink" xmlns:am3d="http://schemas.microsoft.com/office/drawing/2017/model3d" xmlns:o="urn:schemas-microsoft-com:office:office" xmlns:oel="http://schemas.microsoft.com/office/2019/extlst" xmlns:r="http://schemas.openxmlformats.org/officeDocument/2006/relationships" xmlns:m="http://schemas.openxmlformats.org/officeDocument/2006/math" xmlns:v="urn:schemas-microsoft-com:vml" xmlns:wp14="http://schemas.microsoft.com/office/word/2010/wordprocessingDrawing" xmlns:wp="http://schemas.openxmlformats.org/drawingml/2006/wordprocessingDrawing" xmlns:w10="urn:schemas-microsoft-com:office:word" xmlns:w="http://schemas.openxmlformats.org/wordprocessingml/2006/main" xmlns:w14="http://schemas.microsoft.com/office/word/2010/wordml" xmlns:w15="http://schemas.microsoft.com/office/word/2012/wordml" xmlns:w16cex="http://schemas.microsoft.com/office/word/2018/wordml/cex" xmlns:w16cid="http://schemas.microsoft.com/office/word/2016/wordml/cid" xmlns:w16="http://schemas.microsoft.com/office/word/2018/wordml" xmlns:w16sdtdh="http://schemas.microsoft.com/office/word/2020/wordml/sdtdatahash" xmlns:w16se="http://schemas.microsoft.com/office/word/2015/wordml/symex" xmlns:wpg="http://schemas.microsoft.com/office/word/2010/wordprocessingGroup" xmlns:wpi="http://schemas.microsoft.com/office/word/2010/wordprocessingInk" xmlns:wne="http://schemas.microsoft.com/office/word/2006/wordml" xmlns:wps="http://schemas.microsoft.com/office/word/2010/wordprocessingShape" mc:Ignorable="w14 w15 w16se w16cid w16 w16cex w16sdtdh wp14">
   <w:abstractNum w:abstractNumId="0" w15:restartNumberingAfterBreak="0">
-    <w:nsid w:val="01BE107E"/>
+    <w:nsid w:val="02C03B36"/>
     <w:multiLevelType w:val="hybridMultilevel"/>
-    <w:tmpl w:val="B62ADC0A"/>
-    <w:lvl w:ilvl="0" w:tplc="F490D398">
+    <w:tmpl w:val="6A920452"/>
+    <w:lvl w:ilvl="0" w:tplc="04A0EBB0">
       <w:start w:val="1"/>
       <w:numFmt w:val="decimal"/>
       <w:lvlText w:val="%1."/>
@@ -21576,52 +21576,52 @@
         <w:color w:val="A67C27"/>
       </w:rPr>
     </w:lvl>
-    <w:lvl w:ilvl="1" w:tplc="E458C4BA">
+    <w:lvl w:ilvl="1" w:tplc="75687412">
       <w:numFmt w:val="decimal"/>
       <w:lvlText w:val=""/>
       <w:lvlJc w:val="left"/>
     </w:lvl>
-    <w:lvl w:ilvl="2" w:tplc="B9D4900C">
+    <w:lvl w:ilvl="2" w:tplc="4DB44006">
       <w:numFmt w:val="decimal"/>
       <w:lvlText w:val=""/>
       <w:lvlJc w:val="left"/>
     </w:lvl>
-    <w:lvl w:ilvl="3" w:tplc="A43E59CA">
+    <w:lvl w:ilvl="3" w:tplc="78A003DC">
       <w:numFmt w:val="decimal"/>
       <w:lvlText w:val=""/>
       <w:lvlJc w:val="left"/>
     </w:lvl>
-    <w:lvl w:ilvl="4" w:tplc="23F2740C">
+    <w:lvl w:ilvl="4" w:tplc="6A42C2A8">
       <w:numFmt w:val="decimal"/>
       <w:lvlText w:val=""/>
       <w:lvlJc w:val="left"/>
     </w:lvl>
-    <w:lvl w:ilvl="5" w:tplc="639859CC">
+    <w:lvl w:ilvl="5" w:tplc="5238B920">
       <w:numFmt w:val="decimal"/>
       <w:lvlText w:val=""/>
       <w:lvlJc w:val="left"/>
     </w:lvl>
-    <w:lvl w:ilvl="6" w:tplc="505C2CFC">
+    <w:lvl w:ilvl="6" w:tplc="A732A3E4">
       <w:numFmt w:val="decimal"/>
       <w:lvlText w:val=""/>
       <w:lvlJc w:val="left"/>
     </w:lvl>
-    <w:lvl w:ilvl="7" w:tplc="3786949C">
+    <w:lvl w:ilvl="7" w:tplc="C910ECD4">
       <w:numFmt w:val="decimal"/>
       <w:lvlText w:val=""/>
       <w:lvlJc w:val="left"/>
     </w:lvl>
-    <w:lvl w:ilvl="8" w:tplc="A7420FD6">
+    <w:lvl w:ilvl="8" w:tplc="469C65B2">
       <w:numFmt w:val="decimal"/>
       <w:lvlText w:val=""/>
       <w:lvlJc w:val="left"/>
     </w:lvl>
   </w:abstractNum>
   <w:abstractNum w:abstractNumId="1" w15:restartNumberingAfterBreak="0">
-    <w:nsid w:val="02E24F7C"/>
+    <w:nsid w:val="041669E6"/>
     <w:multiLevelType w:val="hybridMultilevel"/>
-    <w:tmpl w:val="3BD4960A"/>
-    <w:lvl w:ilvl="0" w:tplc="95C8C1CA">
+    <w:tmpl w:val="E3745542"/>
+    <w:lvl w:ilvl="0" w:tplc="4438AC44">
       <w:start w:val="1"/>
       <w:numFmt w:val="decimal"/>
       <w:lvlText w:val="%1."/>
@@ -21635,52 +21635,52 @@
         <w:color w:val="A67C27"/>
       </w:rPr>
     </w:lvl>
-    <w:lvl w:ilvl="1" w:tplc="0FE2BAEC">
+    <w:lvl w:ilvl="1" w:tplc="417A7222">
       <w:numFmt w:val="decimal"/>
       <w:lvlText w:val=""/>
       <w:lvlJc w:val="left"/>
     </w:lvl>
-    <w:lvl w:ilvl="2" w:tplc="9DBCB466">
+    <w:lvl w:ilvl="2" w:tplc="1C426658">
       <w:numFmt w:val="decimal"/>
       <w:lvlText w:val=""/>
       <w:lvlJc w:val="left"/>
     </w:lvl>
-    <w:lvl w:ilvl="3" w:tplc="4C4C561E">
+    <w:lvl w:ilvl="3" w:tplc="D78CC9B8">
       <w:numFmt w:val="decimal"/>
       <w:lvlText w:val=""/>
       <w:lvlJc w:val="left"/>
     </w:lvl>
-    <w:lvl w:ilvl="4" w:tplc="14AA448E">
+    <w:lvl w:ilvl="4" w:tplc="3C10C136">
       <w:numFmt w:val="decimal"/>
       <w:lvlText w:val=""/>
       <w:lvlJc w:val="left"/>
     </w:lvl>
-    <w:lvl w:ilvl="5" w:tplc="90546D6A">
+    <w:lvl w:ilvl="5" w:tplc="C6C64636">
       <w:numFmt w:val="decimal"/>
       <w:lvlText w:val=""/>
       <w:lvlJc w:val="left"/>
     </w:lvl>
-    <w:lvl w:ilvl="6" w:tplc="DEB693BA">
+    <w:lvl w:ilvl="6" w:tplc="F934C0AC">
       <w:numFmt w:val="decimal"/>
       <w:lvlText w:val=""/>
       <w:lvlJc w:val="left"/>
     </w:lvl>
-    <w:lvl w:ilvl="7" w:tplc="D400B00A">
+    <w:lvl w:ilvl="7" w:tplc="24206BA6">
       <w:numFmt w:val="decimal"/>
       <w:lvlText w:val=""/>
       <w:lvlJc w:val="left"/>
     </w:lvl>
-    <w:lvl w:ilvl="8" w:tplc="E1E231D2">
+    <w:lvl w:ilvl="8" w:tplc="20AEFDDC">
       <w:numFmt w:val="decimal"/>
       <w:lvlText w:val=""/>
       <w:lvlJc w:val="left"/>
     </w:lvl>
   </w:abstractNum>
   <w:abstractNum w:abstractNumId="2" w15:restartNumberingAfterBreak="0">
-    <w:nsid w:val="04667034"/>
+    <w:nsid w:val="06534D21"/>
     <w:multiLevelType w:val="hybridMultilevel"/>
-    <w:tmpl w:val="A24A9CAC"/>
-    <w:lvl w:ilvl="0" w:tplc="DADCB384">
+    <w:tmpl w:val="5D32A28A"/>
+    <w:lvl w:ilvl="0" w:tplc="28DE1532">
       <w:start w:val="1"/>
       <w:numFmt w:val="decimal"/>
       <w:lvlText w:val="%1."/>
@@ -21694,52 +21694,52 @@
         <w:color w:val="A67C27"/>
       </w:rPr>
     </w:lvl>
-    <w:lvl w:ilvl="1" w:tplc="7E3E8D96">
+    <w:lvl w:ilvl="1" w:tplc="78C48C60">
       <w:numFmt w:val="decimal"/>
       <w:lvlText w:val=""/>
       <w:lvlJc w:val="left"/>
     </w:lvl>
-    <w:lvl w:ilvl="2" w:tplc="19B69FCA">
+    <w:lvl w:ilvl="2" w:tplc="A8DED3F2">
       <w:numFmt w:val="decimal"/>
       <w:lvlText w:val=""/>
       <w:lvlJc w:val="left"/>
     </w:lvl>
-    <w:lvl w:ilvl="3" w:tplc="81FC0F46">
+    <w:lvl w:ilvl="3" w:tplc="9BC8F71A">
       <w:numFmt w:val="decimal"/>
       <w:lvlText w:val=""/>
       <w:lvlJc w:val="left"/>
     </w:lvl>
-    <w:lvl w:ilvl="4" w:tplc="4C1427FC">
+    <w:lvl w:ilvl="4" w:tplc="33F6EF04">
       <w:numFmt w:val="decimal"/>
       <w:lvlText w:val=""/>
       <w:lvlJc w:val="left"/>
     </w:lvl>
-    <w:lvl w:ilvl="5" w:tplc="73BA1DCA">
+    <w:lvl w:ilvl="5" w:tplc="0AE2B99E">
       <w:numFmt w:val="decimal"/>
       <w:lvlText w:val=""/>
       <w:lvlJc w:val="left"/>
     </w:lvl>
-    <w:lvl w:ilvl="6" w:tplc="477CD442">
+    <w:lvl w:ilvl="6" w:tplc="9C74AE74">
       <w:numFmt w:val="decimal"/>
       <w:lvlText w:val=""/>
       <w:lvlJc w:val="left"/>
     </w:lvl>
-    <w:lvl w:ilvl="7" w:tplc="70EA2DB4">
+    <w:lvl w:ilvl="7" w:tplc="0AACA608">
       <w:numFmt w:val="decimal"/>
       <w:lvlText w:val=""/>
       <w:lvlJc w:val="left"/>
     </w:lvl>
-    <w:lvl w:ilvl="8" w:tplc="A7AAA9F8">
+    <w:lvl w:ilvl="8" w:tplc="16A2CE6C">
       <w:numFmt w:val="decimal"/>
       <w:lvlText w:val=""/>
       <w:lvlJc w:val="left"/>
     </w:lvl>
   </w:abstractNum>
   <w:abstractNum w:abstractNumId="3" w15:restartNumberingAfterBreak="0">
-    <w:nsid w:val="09C16E88"/>
+    <w:nsid w:val="0AEF1D0D"/>
     <w:multiLevelType w:val="hybridMultilevel"/>
-    <w:tmpl w:val="3406157C"/>
-    <w:lvl w:ilvl="0" w:tplc="BF2C75A8">
+    <w:tmpl w:val="8B2C7E2C"/>
+    <w:lvl w:ilvl="0" w:tplc="DB7CA342">
       <w:start w:val="1"/>
       <w:numFmt w:val="decimal"/>
       <w:lvlText w:val="%1."/>
@@ -21753,52 +21753,52 @@
         <w:color w:val="A67C27"/>
       </w:rPr>
     </w:lvl>
-    <w:lvl w:ilvl="1" w:tplc="342618C6">
+    <w:lvl w:ilvl="1" w:tplc="CB96C562">
       <w:numFmt w:val="decimal"/>
       <w:lvlText w:val=""/>
       <w:lvlJc w:val="left"/>
     </w:lvl>
-    <w:lvl w:ilvl="2" w:tplc="A2D2EFBC">
+    <w:lvl w:ilvl="2" w:tplc="DE4A7976">
       <w:numFmt w:val="decimal"/>
       <w:lvlText w:val=""/>
       <w:lvlJc w:val="left"/>
     </w:lvl>
-    <w:lvl w:ilvl="3" w:tplc="8F0652D6">
+    <w:lvl w:ilvl="3" w:tplc="42BEFB78">
       <w:numFmt w:val="decimal"/>
       <w:lvlText w:val=""/>
       <w:lvlJc w:val="left"/>
     </w:lvl>
-    <w:lvl w:ilvl="4" w:tplc="530A26BE">
+    <w:lvl w:ilvl="4" w:tplc="F54E5328">
       <w:numFmt w:val="decimal"/>
       <w:lvlText w:val=""/>
       <w:lvlJc w:val="left"/>
     </w:lvl>
-    <w:lvl w:ilvl="5" w:tplc="AE603A7A">
+    <w:lvl w:ilvl="5" w:tplc="865C1746">
       <w:numFmt w:val="decimal"/>
       <w:lvlText w:val=""/>
       <w:lvlJc w:val="left"/>
     </w:lvl>
-    <w:lvl w:ilvl="6" w:tplc="AEBAAA74">
+    <w:lvl w:ilvl="6" w:tplc="5C709DA0">
       <w:numFmt w:val="decimal"/>
       <w:lvlText w:val=""/>
       <w:lvlJc w:val="left"/>
     </w:lvl>
-    <w:lvl w:ilvl="7" w:tplc="A4A4A3CC">
+    <w:lvl w:ilvl="7" w:tplc="79F88D30">
       <w:numFmt w:val="decimal"/>
       <w:lvlText w:val=""/>
       <w:lvlJc w:val="left"/>
     </w:lvl>
-    <w:lvl w:ilvl="8" w:tplc="394A4E92">
+    <w:lvl w:ilvl="8" w:tplc="DC60F2EE">
       <w:numFmt w:val="decimal"/>
       <w:lvlText w:val=""/>
       <w:lvlJc w:val="left"/>
     </w:lvl>
   </w:abstractNum>
   <w:abstractNum w:abstractNumId="4" w15:restartNumberingAfterBreak="0">
-    <w:nsid w:val="0A627A49"/>
+    <w:nsid w:val="0D0E10D5"/>
     <w:multiLevelType w:val="hybridMultilevel"/>
-    <w:tmpl w:val="2660B1EA"/>
-    <w:lvl w:ilvl="0" w:tplc="E3F6DC82">
+    <w:tmpl w:val="E6304B1C"/>
+    <w:lvl w:ilvl="0" w:tplc="FF3C6FF2">
       <w:start w:val="1"/>
       <w:numFmt w:val="decimal"/>
       <w:lvlText w:val="%1."/>
@@ -21812,138 +21812,52 @@
         <w:color w:val="A67C27"/>
       </w:rPr>
     </w:lvl>
-    <w:lvl w:ilvl="1" w:tplc="E998ECC8">
+    <w:lvl w:ilvl="1" w:tplc="01DA556E">
       <w:numFmt w:val="decimal"/>
       <w:lvlText w:val=""/>
       <w:lvlJc w:val="left"/>
     </w:lvl>
-    <w:lvl w:ilvl="2" w:tplc="3924A784">
+    <w:lvl w:ilvl="2" w:tplc="EE0CECFA">
       <w:numFmt w:val="decimal"/>
       <w:lvlText w:val=""/>
       <w:lvlJc w:val="left"/>
     </w:lvl>
-    <w:lvl w:ilvl="3" w:tplc="F4CCF304">
+    <w:lvl w:ilvl="3" w:tplc="F6780C24">
       <w:numFmt w:val="decimal"/>
       <w:lvlText w:val=""/>
       <w:lvlJc w:val="left"/>
     </w:lvl>
-    <w:lvl w:ilvl="4" w:tplc="845054CC">
+    <w:lvl w:ilvl="4" w:tplc="08DE7C82">
       <w:numFmt w:val="decimal"/>
       <w:lvlText w:val=""/>
       <w:lvlJc w:val="left"/>
     </w:lvl>
-    <w:lvl w:ilvl="5" w:tplc="9EF0CA00">
+    <w:lvl w:ilvl="5" w:tplc="2732F26C">
       <w:numFmt w:val="decimal"/>
       <w:lvlText w:val=""/>
       <w:lvlJc w:val="left"/>
     </w:lvl>
-    <w:lvl w:ilvl="6" w:tplc="E06ACC4A">
+    <w:lvl w:ilvl="6" w:tplc="99B2D1DE">
       <w:numFmt w:val="decimal"/>
       <w:lvlText w:val=""/>
       <w:lvlJc w:val="left"/>
     </w:lvl>
-    <w:lvl w:ilvl="7" w:tplc="F282057A">
+    <w:lvl w:ilvl="7" w:tplc="B948785C">
       <w:numFmt w:val="decimal"/>
       <w:lvlText w:val=""/>
       <w:lvlJc w:val="left"/>
     </w:lvl>
-    <w:lvl w:ilvl="8" w:tplc="51AEE382">
+    <w:lvl w:ilvl="8" w:tplc="F6BC3EC4">
       <w:numFmt w:val="decimal"/>
       <w:lvlText w:val=""/>
       <w:lvlJc w:val="left"/>
     </w:lvl>
   </w:abstractNum>
   <w:abstractNum w:abstractNumId="5" w15:restartNumberingAfterBreak="0">
-    <w:nsid w:val="0BB55D67"/>
+    <w:nsid w:val="126F4F01"/>
     <w:multiLevelType w:val="hybridMultilevel"/>
-    <w:tmpl w:val="284C74C0"/>
-    <w:lvl w:ilvl="0" w:tplc="7D023B76">
-      <w:start w:val="1"/>
-      <w:numFmt w:val="bullet"/>
-      <w:lvlText w:val="●"/>
-      <w:lvlJc w:val="left"/>
-      <w:pPr>
-        <w:ind w:left="720" w:hanging="360"/>
-      </w:pPr>
-    </w:lvl>
-    <w:lvl w:ilvl="1" w:tplc="6B3C577E">
-      <w:start w:val="1"/>
-      <w:numFmt w:val="bullet"/>
-      <w:lvlText w:val="○"/>
-      <w:lvlJc w:val="left"/>
-      <w:pPr>
-        <w:ind w:left="1440" w:hanging="360"/>
-      </w:pPr>
-    </w:lvl>
-    <w:lvl w:ilvl="2" w:tplc="03DE9F54">
-      <w:start w:val="1"/>
-      <w:numFmt w:val="bullet"/>
-      <w:lvlText w:val="■"/>
-      <w:lvlJc w:val="left"/>
-      <w:pPr>
-        <w:ind w:left="2160" w:hanging="360"/>
-      </w:pPr>
-    </w:lvl>
-    <w:lvl w:ilvl="3" w:tplc="C28CFC72">
-      <w:start w:val="1"/>
-      <w:numFmt w:val="bullet"/>
-      <w:lvlText w:val="●"/>
-      <w:lvlJc w:val="left"/>
-      <w:pPr>
-        <w:ind w:left="2880" w:hanging="360"/>
-      </w:pPr>
-    </w:lvl>
-    <w:lvl w:ilvl="4" w:tplc="52BC4FAC">
-      <w:start w:val="1"/>
-      <w:numFmt w:val="bullet"/>
-      <w:lvlText w:val="○"/>
-      <w:lvlJc w:val="left"/>
-      <w:pPr>
-        <w:ind w:left="3600" w:hanging="360"/>
-      </w:pPr>
-    </w:lvl>
-    <w:lvl w:ilvl="5" w:tplc="ECA8AE98">
-      <w:start w:val="1"/>
-      <w:numFmt w:val="bullet"/>
-      <w:lvlText w:val="■"/>
-      <w:lvlJc w:val="left"/>
-      <w:pPr>
-        <w:ind w:left="4320" w:hanging="360"/>
-      </w:pPr>
-    </w:lvl>
-    <w:lvl w:ilvl="6" w:tplc="9F1EC3A6">
-      <w:start w:val="1"/>
-      <w:numFmt w:val="bullet"/>
-      <w:lvlText w:val="●"/>
-      <w:lvlJc w:val="left"/>
-      <w:pPr>
-        <w:ind w:left="5040" w:hanging="360"/>
-      </w:pPr>
-    </w:lvl>
-    <w:lvl w:ilvl="7" w:tplc="5718A702">
-      <w:start w:val="1"/>
-      <w:numFmt w:val="bullet"/>
-      <w:lvlText w:val="●"/>
-      <w:lvlJc w:val="left"/>
-      <w:pPr>
-        <w:ind w:left="5760" w:hanging="360"/>
-      </w:pPr>
-    </w:lvl>
-    <w:lvl w:ilvl="8" w:tplc="9EBAD7F0">
-      <w:start w:val="1"/>
-      <w:numFmt w:val="bullet"/>
-      <w:lvlText w:val="●"/>
-      <w:lvlJc w:val="left"/>
-      <w:pPr>
-        <w:ind w:left="6480" w:hanging="360"/>
-      </w:pPr>
-    </w:lvl>
-  </w:abstractNum>
-  <w:abstractNum w:abstractNumId="6" w15:restartNumberingAfterBreak="0">
-    <w:nsid w:val="0BDB0A0F"/>
-    <w:multiLevelType w:val="hybridMultilevel"/>
-    <w:tmpl w:val="01708EC4"/>
-    <w:lvl w:ilvl="0" w:tplc="6FAA55C2">
+    <w:tmpl w:val="5BFC4DF4"/>
+    <w:lvl w:ilvl="0" w:tplc="203C04D2">
       <w:start w:val="1"/>
       <w:numFmt w:val="decimal"/>
       <w:lvlText w:val="%1."/>
@@ -21957,52 +21871,169 @@
         <w:color w:val="A67C27"/>
       </w:rPr>
     </w:lvl>
-    <w:lvl w:ilvl="1" w:tplc="565C7C5C">
+    <w:lvl w:ilvl="1" w:tplc="6510A776">
       <w:numFmt w:val="decimal"/>
       <w:lvlText w:val=""/>
       <w:lvlJc w:val="left"/>
     </w:lvl>
-    <w:lvl w:ilvl="2" w:tplc="653644E8">
+    <w:lvl w:ilvl="2" w:tplc="CDDE4258">
       <w:numFmt w:val="decimal"/>
       <w:lvlText w:val=""/>
       <w:lvlJc w:val="left"/>
     </w:lvl>
-    <w:lvl w:ilvl="3" w:tplc="E6969EFC">
+    <w:lvl w:ilvl="3" w:tplc="AF62D40C">
       <w:numFmt w:val="decimal"/>
       <w:lvlText w:val=""/>
       <w:lvlJc w:val="left"/>
     </w:lvl>
-    <w:lvl w:ilvl="4" w:tplc="D36A4064">
+    <w:lvl w:ilvl="4" w:tplc="66A076CA">
       <w:numFmt w:val="decimal"/>
       <w:lvlText w:val=""/>
       <w:lvlJc w:val="left"/>
     </w:lvl>
-    <w:lvl w:ilvl="5" w:tplc="92703F54">
+    <w:lvl w:ilvl="5" w:tplc="97EE2532">
       <w:numFmt w:val="decimal"/>
       <w:lvlText w:val=""/>
       <w:lvlJc w:val="left"/>
     </w:lvl>
-    <w:lvl w:ilvl="6" w:tplc="0E38BEBE">
+    <w:lvl w:ilvl="6" w:tplc="66EE4142">
       <w:numFmt w:val="decimal"/>
       <w:lvlText w:val=""/>
       <w:lvlJc w:val="left"/>
     </w:lvl>
-    <w:lvl w:ilvl="7" w:tplc="12408330">
+    <w:lvl w:ilvl="7" w:tplc="04B6F66E">
       <w:numFmt w:val="decimal"/>
       <w:lvlText w:val=""/>
       <w:lvlJc w:val="left"/>
     </w:lvl>
-    <w:lvl w:ilvl="8" w:tplc="7292BFE2">
+    <w:lvl w:ilvl="8" w:tplc="708AD95E">
+      <w:numFmt w:val="decimal"/>
+      <w:lvlText w:val=""/>
+      <w:lvlJc w:val="left"/>
+    </w:lvl>
+  </w:abstractNum>
+  <w:abstractNum w:abstractNumId="6" w15:restartNumberingAfterBreak="0">
+    <w:nsid w:val="19F46DA9"/>
+    <w:multiLevelType w:val="hybridMultilevel"/>
+    <w:tmpl w:val="79009030"/>
+    <w:lvl w:ilvl="0" w:tplc="1716F4E0">
+      <w:start w:val="1"/>
+      <w:numFmt w:val="decimal"/>
+      <w:lvlText w:val="%1."/>
+      <w:lvlJc w:val="left"/>
+      <w:pPr>
+        <w:ind w:left="460" w:hanging="360"/>
+      </w:pPr>
+      <w:rPr>
+        <w:b/>
+        <w:bCs/>
+        <w:color w:val="A67C27"/>
+      </w:rPr>
+    </w:lvl>
+    <w:lvl w:ilvl="1" w:tplc="CDACF9D8">
+      <w:numFmt w:val="decimal"/>
+      <w:lvlText w:val=""/>
+      <w:lvlJc w:val="left"/>
+    </w:lvl>
+    <w:lvl w:ilvl="2" w:tplc="7AEACDEA">
+      <w:numFmt w:val="decimal"/>
+      <w:lvlText w:val=""/>
+      <w:lvlJc w:val="left"/>
+    </w:lvl>
+    <w:lvl w:ilvl="3" w:tplc="24A41ED0">
+      <w:numFmt w:val="decimal"/>
+      <w:lvlText w:val=""/>
+      <w:lvlJc w:val="left"/>
+    </w:lvl>
+    <w:lvl w:ilvl="4" w:tplc="54500074">
+      <w:numFmt w:val="decimal"/>
+      <w:lvlText w:val=""/>
+      <w:lvlJc w:val="left"/>
+    </w:lvl>
+    <w:lvl w:ilvl="5" w:tplc="BAF85396">
+      <w:numFmt w:val="decimal"/>
+      <w:lvlText w:val=""/>
+      <w:lvlJc w:val="left"/>
+    </w:lvl>
+    <w:lvl w:ilvl="6" w:tplc="2424D0E4">
+      <w:numFmt w:val="decimal"/>
+      <w:lvlText w:val=""/>
+      <w:lvlJc w:val="left"/>
+    </w:lvl>
+    <w:lvl w:ilvl="7" w:tplc="38128148">
+      <w:numFmt w:val="decimal"/>
+      <w:lvlText w:val=""/>
+      <w:lvlJc w:val="left"/>
+    </w:lvl>
+    <w:lvl w:ilvl="8" w:tplc="466282B4">
       <w:numFmt w:val="decimal"/>
       <w:lvlText w:val=""/>
       <w:lvlJc w:val="left"/>
     </w:lvl>
   </w:abstractNum>
   <w:abstractNum w:abstractNumId="7" w15:restartNumberingAfterBreak="0">
-    <w:nsid w:val="10E2641A"/>
+    <w:nsid w:val="22B11DA8"/>
     <w:multiLevelType w:val="hybridMultilevel"/>
-    <w:tmpl w:val="292CC366"/>
-    <w:lvl w:ilvl="0" w:tplc="A9D497EA">
+    <w:tmpl w:val="B99C2394"/>
+    <w:lvl w:ilvl="0" w:tplc="31EE0474">
+      <w:start w:val="1"/>
+      <w:numFmt w:val="bullet"/>
+      <w:lvlText w:val="•"/>
+      <w:lvlJc w:val="left"/>
+      <w:pPr>
+        <w:ind w:left="460" w:hanging="280"/>
+      </w:pPr>
+    </w:lvl>
+    <w:lvl w:ilvl="1" w:tplc="3DB8504C">
+      <w:start w:val="1"/>
+      <w:numFmt w:val="bullet"/>
+      <w:lvlText w:val="–"/>
+      <w:lvlJc w:val="left"/>
+      <w:pPr>
+        <w:ind w:left="900" w:hanging="280"/>
+      </w:pPr>
+    </w:lvl>
+    <w:lvl w:ilvl="2" w:tplc="DA92D002">
+      <w:numFmt w:val="decimal"/>
+      <w:lvlText w:val=""/>
+      <w:lvlJc w:val="left"/>
+    </w:lvl>
+    <w:lvl w:ilvl="3" w:tplc="826275B6">
+      <w:numFmt w:val="decimal"/>
+      <w:lvlText w:val=""/>
+      <w:lvlJc w:val="left"/>
+    </w:lvl>
+    <w:lvl w:ilvl="4" w:tplc="58949194">
+      <w:numFmt w:val="decimal"/>
+      <w:lvlText w:val=""/>
+      <w:lvlJc w:val="left"/>
+    </w:lvl>
+    <w:lvl w:ilvl="5" w:tplc="799AAB84">
+      <w:numFmt w:val="decimal"/>
+      <w:lvlText w:val=""/>
+      <w:lvlJc w:val="left"/>
+    </w:lvl>
+    <w:lvl w:ilvl="6" w:tplc="6832E22E">
+      <w:numFmt w:val="decimal"/>
+      <w:lvlText w:val=""/>
+      <w:lvlJc w:val="left"/>
+    </w:lvl>
+    <w:lvl w:ilvl="7" w:tplc="7D7A46E0">
+      <w:numFmt w:val="decimal"/>
+      <w:lvlText w:val=""/>
+      <w:lvlJc w:val="left"/>
+    </w:lvl>
+    <w:lvl w:ilvl="8" w:tplc="80EA238E">
+      <w:numFmt w:val="decimal"/>
+      <w:lvlText w:val=""/>
+      <w:lvlJc w:val="left"/>
+    </w:lvl>
+  </w:abstractNum>
+  <w:abstractNum w:abstractNumId="8" w15:restartNumberingAfterBreak="0">
+    <w:nsid w:val="24005CF4"/>
+    <w:multiLevelType w:val="hybridMultilevel"/>
+    <w:tmpl w:val="7A40464C"/>
+    <w:lvl w:ilvl="0" w:tplc="4CA6D6DE">
       <w:start w:val="1"/>
       <w:numFmt w:val="decimal"/>
       <w:lvlText w:val="%1."/>
@@ -22016,52 +22047,138 @@
         <w:color w:val="A67C27"/>
       </w:rPr>
     </w:lvl>
-    <w:lvl w:ilvl="1" w:tplc="6AD25A18">
+    <w:lvl w:ilvl="1" w:tplc="BDD66F54">
       <w:numFmt w:val="decimal"/>
       <w:lvlText w:val=""/>
       <w:lvlJc w:val="left"/>
     </w:lvl>
-    <w:lvl w:ilvl="2" w:tplc="ADCAD03C">
+    <w:lvl w:ilvl="2" w:tplc="8448661C">
       <w:numFmt w:val="decimal"/>
       <w:lvlText w:val=""/>
       <w:lvlJc w:val="left"/>
     </w:lvl>
-    <w:lvl w:ilvl="3" w:tplc="36F81B9C">
+    <w:lvl w:ilvl="3" w:tplc="D466E816">
       <w:numFmt w:val="decimal"/>
       <w:lvlText w:val=""/>
       <w:lvlJc w:val="left"/>
     </w:lvl>
-    <w:lvl w:ilvl="4" w:tplc="B3B8386E">
+    <w:lvl w:ilvl="4" w:tplc="111EFF46">
       <w:numFmt w:val="decimal"/>
       <w:lvlText w:val=""/>
       <w:lvlJc w:val="left"/>
     </w:lvl>
-    <w:lvl w:ilvl="5" w:tplc="57526A8E">
+    <w:lvl w:ilvl="5" w:tplc="A7923416">
       <w:numFmt w:val="decimal"/>
       <w:lvlText w:val=""/>
       <w:lvlJc w:val="left"/>
     </w:lvl>
-    <w:lvl w:ilvl="6" w:tplc="5BFA03D8">
+    <w:lvl w:ilvl="6" w:tplc="AD1C844A">
       <w:numFmt w:val="decimal"/>
       <w:lvlText w:val=""/>
       <w:lvlJc w:val="left"/>
     </w:lvl>
-    <w:lvl w:ilvl="7" w:tplc="C384566A">
+    <w:lvl w:ilvl="7" w:tplc="888CCBFC">
       <w:numFmt w:val="decimal"/>
       <w:lvlText w:val=""/>
       <w:lvlJc w:val="left"/>
     </w:lvl>
-    <w:lvl w:ilvl="8" w:tplc="923A4DB2">
+    <w:lvl w:ilvl="8" w:tplc="167631C2">
       <w:numFmt w:val="decimal"/>
       <w:lvlText w:val=""/>
       <w:lvlJc w:val="left"/>
     </w:lvl>
   </w:abstractNum>
-  <w:abstractNum w:abstractNumId="8" w15:restartNumberingAfterBreak="0">
-    <w:nsid w:val="120749F6"/>
+  <w:abstractNum w:abstractNumId="9" w15:restartNumberingAfterBreak="0">
+    <w:nsid w:val="253A4D71"/>
     <w:multiLevelType w:val="hybridMultilevel"/>
-    <w:tmpl w:val="2DFC6240"/>
-    <w:lvl w:ilvl="0" w:tplc="CABC02E2">
+    <w:tmpl w:val="5FB89046"/>
+    <w:lvl w:ilvl="0" w:tplc="3CCA95B6">
+      <w:start w:val="1"/>
+      <w:numFmt w:val="bullet"/>
+      <w:lvlText w:val="●"/>
+      <w:lvlJc w:val="left"/>
+      <w:pPr>
+        <w:ind w:left="720" w:hanging="360"/>
+      </w:pPr>
+    </w:lvl>
+    <w:lvl w:ilvl="1" w:tplc="E2E6468E">
+      <w:start w:val="1"/>
+      <w:numFmt w:val="bullet"/>
+      <w:lvlText w:val="○"/>
+      <w:lvlJc w:val="left"/>
+      <w:pPr>
+        <w:ind w:left="1440" w:hanging="360"/>
+      </w:pPr>
+    </w:lvl>
+    <w:lvl w:ilvl="2" w:tplc="4A1EDBCE">
+      <w:start w:val="1"/>
+      <w:numFmt w:val="bullet"/>
+      <w:lvlText w:val="■"/>
+      <w:lvlJc w:val="left"/>
+      <w:pPr>
+        <w:ind w:left="2160" w:hanging="360"/>
+      </w:pPr>
+    </w:lvl>
+    <w:lvl w:ilvl="3" w:tplc="00BC8D52">
+      <w:start w:val="1"/>
+      <w:numFmt w:val="bullet"/>
+      <w:lvlText w:val="●"/>
+      <w:lvlJc w:val="left"/>
+      <w:pPr>
+        <w:ind w:left="2880" w:hanging="360"/>
+      </w:pPr>
+    </w:lvl>
+    <w:lvl w:ilvl="4" w:tplc="1AB8517E">
+      <w:start w:val="1"/>
+      <w:numFmt w:val="bullet"/>
+      <w:lvlText w:val="○"/>
+      <w:lvlJc w:val="left"/>
+      <w:pPr>
+        <w:ind w:left="3600" w:hanging="360"/>
+      </w:pPr>
+    </w:lvl>
+    <w:lvl w:ilvl="5" w:tplc="A186142E">
+      <w:start w:val="1"/>
+      <w:numFmt w:val="bullet"/>
+      <w:lvlText w:val="■"/>
+      <w:lvlJc w:val="left"/>
+      <w:pPr>
+        <w:ind w:left="4320" w:hanging="360"/>
+      </w:pPr>
+    </w:lvl>
+    <w:lvl w:ilvl="6" w:tplc="8892D886">
+      <w:start w:val="1"/>
+      <w:numFmt w:val="bullet"/>
+      <w:lvlText w:val="●"/>
+      <w:lvlJc w:val="left"/>
+      <w:pPr>
+        <w:ind w:left="5040" w:hanging="360"/>
+      </w:pPr>
+    </w:lvl>
+    <w:lvl w:ilvl="7" w:tplc="4B7EB104">
+      <w:start w:val="1"/>
+      <w:numFmt w:val="bullet"/>
+      <w:lvlText w:val="●"/>
+      <w:lvlJc w:val="left"/>
+      <w:pPr>
+        <w:ind w:left="5760" w:hanging="360"/>
+      </w:pPr>
+    </w:lvl>
+    <w:lvl w:ilvl="8" w:tplc="57782CDC">
+      <w:start w:val="1"/>
+      <w:numFmt w:val="bullet"/>
+      <w:lvlText w:val="●"/>
+      <w:lvlJc w:val="left"/>
+      <w:pPr>
+        <w:ind w:left="6480" w:hanging="360"/>
+      </w:pPr>
+    </w:lvl>
+  </w:abstractNum>
+  <w:abstractNum w:abstractNumId="10" w15:restartNumberingAfterBreak="0">
+    <w:nsid w:val="28C962DC"/>
+    <w:multiLevelType w:val="hybridMultilevel"/>
+    <w:tmpl w:val="C82499CE"/>
+    <w:lvl w:ilvl="0" w:tplc="004246F4">
       <w:start w:val="1"/>
       <w:numFmt w:val="decimal"/>
       <w:lvlText w:val="%1."/>
@@ -22075,52 +22192,52 @@
         <w:color w:val="A67C27"/>
       </w:rPr>
     </w:lvl>
-    <w:lvl w:ilvl="1" w:tplc="0394C006">
+    <w:lvl w:ilvl="1" w:tplc="57BA0D66">
       <w:numFmt w:val="decimal"/>
       <w:lvlText w:val=""/>
       <w:lvlJc w:val="left"/>
     </w:lvl>
-    <w:lvl w:ilvl="2" w:tplc="5D52952C">
+    <w:lvl w:ilvl="2" w:tplc="6DF004C8">
       <w:numFmt w:val="decimal"/>
       <w:lvlText w:val=""/>
       <w:lvlJc w:val="left"/>
     </w:lvl>
-    <w:lvl w:ilvl="3" w:tplc="4D705774">
+    <w:lvl w:ilvl="3" w:tplc="BC1858AE">
       <w:numFmt w:val="decimal"/>
       <w:lvlText w:val=""/>
       <w:lvlJc w:val="left"/>
     </w:lvl>
-    <w:lvl w:ilvl="4" w:tplc="88CEC9AE">
+    <w:lvl w:ilvl="4" w:tplc="63542404">
       <w:numFmt w:val="decimal"/>
       <w:lvlText w:val=""/>
       <w:lvlJc w:val="left"/>
     </w:lvl>
-    <w:lvl w:ilvl="5" w:tplc="9DC4FE14">
+    <w:lvl w:ilvl="5" w:tplc="06E6F94E">
       <w:numFmt w:val="decimal"/>
       <w:lvlText w:val=""/>
       <w:lvlJc w:val="left"/>
     </w:lvl>
-    <w:lvl w:ilvl="6" w:tplc="CEAC3D02">
+    <w:lvl w:ilvl="6" w:tplc="BEA0B14C">
       <w:numFmt w:val="decimal"/>
       <w:lvlText w:val=""/>
       <w:lvlJc w:val="left"/>
     </w:lvl>
-    <w:lvl w:ilvl="7" w:tplc="E012A31E">
+    <w:lvl w:ilvl="7" w:tplc="3BB63F56">
       <w:numFmt w:val="decimal"/>
       <w:lvlText w:val=""/>
       <w:lvlJc w:val="left"/>
     </w:lvl>
-    <w:lvl w:ilvl="8" w:tplc="23607F34">
+    <w:lvl w:ilvl="8" w:tplc="23F84B5A">
       <w:numFmt w:val="decimal"/>
       <w:lvlText w:val=""/>
       <w:lvlJc w:val="left"/>
     </w:lvl>
   </w:abstractNum>
-  <w:abstractNum w:abstractNumId="9" w15:restartNumberingAfterBreak="0">
-    <w:nsid w:val="199E7F2E"/>
+  <w:abstractNum w:abstractNumId="11" w15:restartNumberingAfterBreak="0">
+    <w:nsid w:val="2BD66780"/>
     <w:multiLevelType w:val="hybridMultilevel"/>
-    <w:tmpl w:val="96F6CFB4"/>
-    <w:lvl w:ilvl="0" w:tplc="B40EFFD8">
+    <w:tmpl w:val="B4942BFE"/>
+    <w:lvl w:ilvl="0" w:tplc="0D3E8530">
       <w:start w:val="1"/>
       <w:numFmt w:val="decimal"/>
       <w:lvlText w:val="%1."/>
@@ -22134,52 +22251,52 @@
         <w:color w:val="A67C27"/>
       </w:rPr>
     </w:lvl>
-    <w:lvl w:ilvl="1" w:tplc="B404AE16">
+    <w:lvl w:ilvl="1" w:tplc="FE42DA42">
       <w:numFmt w:val="decimal"/>
       <w:lvlText w:val=""/>
       <w:lvlJc w:val="left"/>
     </w:lvl>
-    <w:lvl w:ilvl="2" w:tplc="1FD0DFA8">
+    <w:lvl w:ilvl="2" w:tplc="C5723614">
       <w:numFmt w:val="decimal"/>
       <w:lvlText w:val=""/>
       <w:lvlJc w:val="left"/>
     </w:lvl>
-    <w:lvl w:ilvl="3" w:tplc="E0A258F6">
+    <w:lvl w:ilvl="3" w:tplc="E764AB82">
       <w:numFmt w:val="decimal"/>
       <w:lvlText w:val=""/>
       <w:lvlJc w:val="left"/>
     </w:lvl>
-    <w:lvl w:ilvl="4" w:tplc="38DCA248">
+    <w:lvl w:ilvl="4" w:tplc="0EE83718">
       <w:numFmt w:val="decimal"/>
       <w:lvlText w:val=""/>
       <w:lvlJc w:val="left"/>
     </w:lvl>
-    <w:lvl w:ilvl="5" w:tplc="22B4BDE4">
+    <w:lvl w:ilvl="5" w:tplc="DE7E1B28">
       <w:numFmt w:val="decimal"/>
       <w:lvlText w:val=""/>
       <w:lvlJc w:val="left"/>
     </w:lvl>
-    <w:lvl w:ilvl="6" w:tplc="58E83C14">
+    <w:lvl w:ilvl="6" w:tplc="52B6725C">
       <w:numFmt w:val="decimal"/>
       <w:lvlText w:val=""/>
       <w:lvlJc w:val="left"/>
     </w:lvl>
-    <w:lvl w:ilvl="7" w:tplc="1DA0F5B2">
+    <w:lvl w:ilvl="7" w:tplc="BD8AFE54">
       <w:numFmt w:val="decimal"/>
       <w:lvlText w:val=""/>
       <w:lvlJc w:val="left"/>
     </w:lvl>
-    <w:lvl w:ilvl="8" w:tplc="5CC8C5DA">
+    <w:lvl w:ilvl="8" w:tplc="830262CE">
       <w:numFmt w:val="decimal"/>
       <w:lvlText w:val=""/>
       <w:lvlJc w:val="left"/>
     </w:lvl>
   </w:abstractNum>
-  <w:abstractNum w:abstractNumId="10" w15:restartNumberingAfterBreak="0">
-    <w:nsid w:val="1BAA09DE"/>
+  <w:abstractNum w:abstractNumId="12" w15:restartNumberingAfterBreak="0">
+    <w:nsid w:val="2F09181D"/>
     <w:multiLevelType w:val="hybridMultilevel"/>
-    <w:tmpl w:val="65226848"/>
-    <w:lvl w:ilvl="0" w:tplc="2F8A14B8">
+    <w:tmpl w:val="8EB89D08"/>
+    <w:lvl w:ilvl="0" w:tplc="E62E3030">
       <w:start w:val="1"/>
       <w:numFmt w:val="decimal"/>
       <w:lvlText w:val="%1."/>
@@ -22193,52 +22310,52 @@
         <w:color w:val="A67C27"/>
       </w:rPr>
     </w:lvl>
-    <w:lvl w:ilvl="1" w:tplc="2CE6BBE4">
+    <w:lvl w:ilvl="1" w:tplc="1BFACAAE">
       <w:numFmt w:val="decimal"/>
       <w:lvlText w:val=""/>
       <w:lvlJc w:val="left"/>
     </w:lvl>
-    <w:lvl w:ilvl="2" w:tplc="89FCFE9A">
+    <w:lvl w:ilvl="2" w:tplc="27C2815A">
       <w:numFmt w:val="decimal"/>
       <w:lvlText w:val=""/>
       <w:lvlJc w:val="left"/>
     </w:lvl>
-    <w:lvl w:ilvl="3" w:tplc="23F280A6">
+    <w:lvl w:ilvl="3" w:tplc="E9D2C8FC">
       <w:numFmt w:val="decimal"/>
       <w:lvlText w:val=""/>
       <w:lvlJc w:val="left"/>
     </w:lvl>
-    <w:lvl w:ilvl="4" w:tplc="003433D2">
+    <w:lvl w:ilvl="4" w:tplc="072EBABE">
       <w:numFmt w:val="decimal"/>
       <w:lvlText w:val=""/>
       <w:lvlJc w:val="left"/>
     </w:lvl>
-    <w:lvl w:ilvl="5" w:tplc="8ED2B96A">
+    <w:lvl w:ilvl="5" w:tplc="BC64CCF0">
       <w:numFmt w:val="decimal"/>
       <w:lvlText w:val=""/>
       <w:lvlJc w:val="left"/>
     </w:lvl>
-    <w:lvl w:ilvl="6" w:tplc="BC4EB664">
+    <w:lvl w:ilvl="6" w:tplc="B0486E60">
       <w:numFmt w:val="decimal"/>
       <w:lvlText w:val=""/>
       <w:lvlJc w:val="left"/>
     </w:lvl>
-    <w:lvl w:ilvl="7" w:tplc="C4CA00C2">
+    <w:lvl w:ilvl="7" w:tplc="DA1C24C4">
       <w:numFmt w:val="decimal"/>
       <w:lvlText w:val=""/>
       <w:lvlJc w:val="left"/>
     </w:lvl>
-    <w:lvl w:ilvl="8" w:tplc="4D343B8C">
+    <w:lvl w:ilvl="8" w:tplc="C42ECE7C">
       <w:numFmt w:val="decimal"/>
       <w:lvlText w:val=""/>
       <w:lvlJc w:val="left"/>
     </w:lvl>
   </w:abstractNum>
-  <w:abstractNum w:abstractNumId="11" w15:restartNumberingAfterBreak="0">
-    <w:nsid w:val="297777BB"/>
+  <w:abstractNum w:abstractNumId="13" w15:restartNumberingAfterBreak="0">
+    <w:nsid w:val="3C595D7B"/>
     <w:multiLevelType w:val="hybridMultilevel"/>
-    <w:tmpl w:val="0D4ED090"/>
-    <w:lvl w:ilvl="0" w:tplc="D41CF7A2">
+    <w:tmpl w:val="E43E9D48"/>
+    <w:lvl w:ilvl="0" w:tplc="7ADE308E">
       <w:start w:val="1"/>
       <w:numFmt w:val="decimal"/>
       <w:lvlText w:val="%1."/>
@@ -22252,52 +22369,52 @@
         <w:color w:val="A67C27"/>
       </w:rPr>
     </w:lvl>
-    <w:lvl w:ilvl="1" w:tplc="99ACD390">
+    <w:lvl w:ilvl="1" w:tplc="0FBCF2AE">
       <w:numFmt w:val="decimal"/>
       <w:lvlText w:val=""/>
       <w:lvlJc w:val="left"/>
     </w:lvl>
-    <w:lvl w:ilvl="2" w:tplc="F7FC0598">
+    <w:lvl w:ilvl="2" w:tplc="984E7962">
       <w:numFmt w:val="decimal"/>
       <w:lvlText w:val=""/>
       <w:lvlJc w:val="left"/>
     </w:lvl>
-    <w:lvl w:ilvl="3" w:tplc="00006C6C">
+    <w:lvl w:ilvl="3" w:tplc="0AB6558E">
       <w:numFmt w:val="decimal"/>
       <w:lvlText w:val=""/>
       <w:lvlJc w:val="left"/>
     </w:lvl>
-    <w:lvl w:ilvl="4" w:tplc="CA802ACE">
+    <w:lvl w:ilvl="4" w:tplc="BEB6F396">
       <w:numFmt w:val="decimal"/>
       <w:lvlText w:val=""/>
       <w:lvlJc w:val="left"/>
     </w:lvl>
-    <w:lvl w:ilvl="5" w:tplc="A38C99B6">
+    <w:lvl w:ilvl="5" w:tplc="7C3EC326">
       <w:numFmt w:val="decimal"/>
       <w:lvlText w:val=""/>
       <w:lvlJc w:val="left"/>
     </w:lvl>
-    <w:lvl w:ilvl="6" w:tplc="5500698E">
+    <w:lvl w:ilvl="6" w:tplc="258028BA">
       <w:numFmt w:val="decimal"/>
       <w:lvlText w:val=""/>
       <w:lvlJc w:val="left"/>
     </w:lvl>
-    <w:lvl w:ilvl="7" w:tplc="0452FE64">
+    <w:lvl w:ilvl="7" w:tplc="F1DAD814">
       <w:numFmt w:val="decimal"/>
       <w:lvlText w:val=""/>
       <w:lvlJc w:val="left"/>
     </w:lvl>
-    <w:lvl w:ilvl="8" w:tplc="F42CF5C2">
+    <w:lvl w:ilvl="8" w:tplc="211A67CC">
       <w:numFmt w:val="decimal"/>
       <w:lvlText w:val=""/>
       <w:lvlJc w:val="left"/>
     </w:lvl>
   </w:abstractNum>
-  <w:abstractNum w:abstractNumId="12" w15:restartNumberingAfterBreak="0">
-    <w:nsid w:val="2F9E0C9A"/>
+  <w:abstractNum w:abstractNumId="14" w15:restartNumberingAfterBreak="0">
+    <w:nsid w:val="3C8861F2"/>
     <w:multiLevelType w:val="hybridMultilevel"/>
-    <w:tmpl w:val="5E787706"/>
-    <w:lvl w:ilvl="0" w:tplc="85463B26">
+    <w:tmpl w:val="8AB0E87E"/>
+    <w:lvl w:ilvl="0" w:tplc="E0B41CCA">
       <w:start w:val="1"/>
       <w:numFmt w:val="decimal"/>
       <w:lvlText w:val="%1."/>
@@ -22311,52 +22428,52 @@
         <w:color w:val="A67C27"/>
       </w:rPr>
     </w:lvl>
-    <w:lvl w:ilvl="1" w:tplc="9FC48B5C">
+    <w:lvl w:ilvl="1" w:tplc="B2B8E6B6">
       <w:numFmt w:val="decimal"/>
       <w:lvlText w:val=""/>
       <w:lvlJc w:val="left"/>
     </w:lvl>
-    <w:lvl w:ilvl="2" w:tplc="D1869700">
+    <w:lvl w:ilvl="2" w:tplc="5908F11E">
       <w:numFmt w:val="decimal"/>
       <w:lvlText w:val=""/>
       <w:lvlJc w:val="left"/>
     </w:lvl>
-    <w:lvl w:ilvl="3" w:tplc="83E8EF4C">
+    <w:lvl w:ilvl="3" w:tplc="AB4C07F0">
       <w:numFmt w:val="decimal"/>
       <w:lvlText w:val=""/>
       <w:lvlJc w:val="left"/>
     </w:lvl>
-    <w:lvl w:ilvl="4" w:tplc="F2E03A08">
+    <w:lvl w:ilvl="4" w:tplc="F11C433A">
       <w:numFmt w:val="decimal"/>
       <w:lvlText w:val=""/>
       <w:lvlJc w:val="left"/>
     </w:lvl>
-    <w:lvl w:ilvl="5" w:tplc="A32EA162">
+    <w:lvl w:ilvl="5" w:tplc="56BE2CBC">
       <w:numFmt w:val="decimal"/>
       <w:lvlText w:val=""/>
       <w:lvlJc w:val="left"/>
     </w:lvl>
-    <w:lvl w:ilvl="6" w:tplc="C2F83EB0">
+    <w:lvl w:ilvl="6" w:tplc="6BF2AFA4">
       <w:numFmt w:val="decimal"/>
       <w:lvlText w:val=""/>
       <w:lvlJc w:val="left"/>
     </w:lvl>
-    <w:lvl w:ilvl="7" w:tplc="60283948">
+    <w:lvl w:ilvl="7" w:tplc="9926CCCC">
       <w:numFmt w:val="decimal"/>
       <w:lvlText w:val=""/>
       <w:lvlJc w:val="left"/>
     </w:lvl>
-    <w:lvl w:ilvl="8" w:tplc="F5542608">
+    <w:lvl w:ilvl="8" w:tplc="4CB060CA">
       <w:numFmt w:val="decimal"/>
       <w:lvlText w:val=""/>
       <w:lvlJc w:val="left"/>
     </w:lvl>
   </w:abstractNum>
-  <w:abstractNum w:abstractNumId="13" w15:restartNumberingAfterBreak="0">
-    <w:nsid w:val="43CA531E"/>
+  <w:abstractNum w:abstractNumId="15" w15:restartNumberingAfterBreak="0">
+    <w:nsid w:val="3D6463A9"/>
     <w:multiLevelType w:val="hybridMultilevel"/>
-    <w:tmpl w:val="EB02547A"/>
-    <w:lvl w:ilvl="0" w:tplc="4E9409F4">
+    <w:tmpl w:val="387669B6"/>
+    <w:lvl w:ilvl="0" w:tplc="02CED044">
       <w:start w:val="1"/>
       <w:numFmt w:val="decimal"/>
       <w:lvlText w:val="%1."/>
@@ -22370,52 +22487,52 @@
         <w:color w:val="A67C27"/>
       </w:rPr>
     </w:lvl>
-    <w:lvl w:ilvl="1" w:tplc="49CC8024">
+    <w:lvl w:ilvl="1" w:tplc="7754751E">
       <w:numFmt w:val="decimal"/>
       <w:lvlText w:val=""/>
       <w:lvlJc w:val="left"/>
     </w:lvl>
-    <w:lvl w:ilvl="2" w:tplc="4BFEDBC6">
+    <w:lvl w:ilvl="2" w:tplc="8A08D1BE">
       <w:numFmt w:val="decimal"/>
       <w:lvlText w:val=""/>
       <w:lvlJc w:val="left"/>
     </w:lvl>
-    <w:lvl w:ilvl="3" w:tplc="C94A9C6A">
+    <w:lvl w:ilvl="3" w:tplc="162E2894">
       <w:numFmt w:val="decimal"/>
       <w:lvlText w:val=""/>
       <w:lvlJc w:val="left"/>
     </w:lvl>
-    <w:lvl w:ilvl="4" w:tplc="F424C45E">
+    <w:lvl w:ilvl="4" w:tplc="44BA0774">
       <w:numFmt w:val="decimal"/>
       <w:lvlText w:val=""/>
       <w:lvlJc w:val="left"/>
     </w:lvl>
-    <w:lvl w:ilvl="5" w:tplc="CFBC0CD6">
+    <w:lvl w:ilvl="5" w:tplc="535E8ECE">
       <w:numFmt w:val="decimal"/>
       <w:lvlText w:val=""/>
       <w:lvlJc w:val="left"/>
     </w:lvl>
-    <w:lvl w:ilvl="6" w:tplc="D5AEFEB8">
+    <w:lvl w:ilvl="6" w:tplc="1D00CF52">
       <w:numFmt w:val="decimal"/>
       <w:lvlText w:val=""/>
       <w:lvlJc w:val="left"/>
     </w:lvl>
-    <w:lvl w:ilvl="7" w:tplc="75BC31D0">
+    <w:lvl w:ilvl="7" w:tplc="069E1658">
       <w:numFmt w:val="decimal"/>
       <w:lvlText w:val=""/>
       <w:lvlJc w:val="left"/>
     </w:lvl>
-    <w:lvl w:ilvl="8" w:tplc="4F8E81D8">
+    <w:lvl w:ilvl="8" w:tplc="6E96CDA6">
       <w:numFmt w:val="decimal"/>
       <w:lvlText w:val=""/>
       <w:lvlJc w:val="left"/>
     </w:lvl>
   </w:abstractNum>
-  <w:abstractNum w:abstractNumId="14" w15:restartNumberingAfterBreak="0">
-    <w:nsid w:val="4A513D0F"/>
+  <w:abstractNum w:abstractNumId="16" w15:restartNumberingAfterBreak="0">
+    <w:nsid w:val="539C4FD3"/>
     <w:multiLevelType w:val="hybridMultilevel"/>
-    <w:tmpl w:val="69880C2E"/>
-    <w:lvl w:ilvl="0" w:tplc="BF20A102">
+    <w:tmpl w:val="10FCF196"/>
+    <w:lvl w:ilvl="0" w:tplc="92A65326">
       <w:start w:val="1"/>
       <w:numFmt w:val="decimal"/>
       <w:lvlText w:val="%1."/>
@@ -22429,52 +22546,52 @@
         <w:color w:val="A67C27"/>
       </w:rPr>
     </w:lvl>
-    <w:lvl w:ilvl="1" w:tplc="7832B5C2">
+    <w:lvl w:ilvl="1" w:tplc="304E7E7A">
       <w:numFmt w:val="decimal"/>
       <w:lvlText w:val=""/>
       <w:lvlJc w:val="left"/>
     </w:lvl>
-    <w:lvl w:ilvl="2" w:tplc="8C5E52E6">
+    <w:lvl w:ilvl="2" w:tplc="7AAA6E88">
       <w:numFmt w:val="decimal"/>
       <w:lvlText w:val=""/>
       <w:lvlJc w:val="left"/>
     </w:lvl>
-    <w:lvl w:ilvl="3" w:tplc="95A20F7E">
+    <w:lvl w:ilvl="3" w:tplc="D6FAAD4C">
       <w:numFmt w:val="decimal"/>
       <w:lvlText w:val=""/>
       <w:lvlJc w:val="left"/>
     </w:lvl>
-    <w:lvl w:ilvl="4" w:tplc="C774253A">
+    <w:lvl w:ilvl="4" w:tplc="BE402852">
       <w:numFmt w:val="decimal"/>
       <w:lvlText w:val=""/>
       <w:lvlJc w:val="left"/>
     </w:lvl>
-    <w:lvl w:ilvl="5" w:tplc="9C1EDA0A">
+    <w:lvl w:ilvl="5" w:tplc="457876AC">
       <w:numFmt w:val="decimal"/>
       <w:lvlText w:val=""/>
       <w:lvlJc w:val="left"/>
     </w:lvl>
-    <w:lvl w:ilvl="6" w:tplc="7092FC02">
+    <w:lvl w:ilvl="6" w:tplc="0C56A136">
       <w:numFmt w:val="decimal"/>
       <w:lvlText w:val=""/>
       <w:lvlJc w:val="left"/>
     </w:lvl>
-    <w:lvl w:ilvl="7" w:tplc="6E0A04C8">
+    <w:lvl w:ilvl="7" w:tplc="0352D07C">
       <w:numFmt w:val="decimal"/>
       <w:lvlText w:val=""/>
       <w:lvlJc w:val="left"/>
     </w:lvl>
-    <w:lvl w:ilvl="8" w:tplc="A516A62C">
+    <w:lvl w:ilvl="8" w:tplc="CCC42F76">
       <w:numFmt w:val="decimal"/>
       <w:lvlText w:val=""/>
       <w:lvlJc w:val="left"/>
     </w:lvl>
   </w:abstractNum>
-  <w:abstractNum w:abstractNumId="15" w15:restartNumberingAfterBreak="0">
-    <w:nsid w:val="4E625A08"/>
+  <w:abstractNum w:abstractNumId="17" w15:restartNumberingAfterBreak="0">
+    <w:nsid w:val="53DA2B78"/>
     <w:multiLevelType w:val="hybridMultilevel"/>
-    <w:tmpl w:val="6EE4B49A"/>
-    <w:lvl w:ilvl="0" w:tplc="2A1AB4DE">
+    <w:tmpl w:val="ACF009B0"/>
+    <w:lvl w:ilvl="0" w:tplc="2A1AAC68">
       <w:start w:val="1"/>
       <w:numFmt w:val="decimal"/>
       <w:lvlText w:val="%1."/>
@@ -22488,52 +22605,52 @@
         <w:color w:val="A67C27"/>
       </w:rPr>
     </w:lvl>
-    <w:lvl w:ilvl="1" w:tplc="3A566CC6">
+    <w:lvl w:ilvl="1" w:tplc="C5C83944">
       <w:numFmt w:val="decimal"/>
       <w:lvlText w:val=""/>
       <w:lvlJc w:val="left"/>
     </w:lvl>
-    <w:lvl w:ilvl="2" w:tplc="51A6BC3E">
+    <w:lvl w:ilvl="2" w:tplc="6F6ABE36">
       <w:numFmt w:val="decimal"/>
       <w:lvlText w:val=""/>
       <w:lvlJc w:val="left"/>
     </w:lvl>
-    <w:lvl w:ilvl="3" w:tplc="0AA0139A">
+    <w:lvl w:ilvl="3" w:tplc="C8EA6454">
       <w:numFmt w:val="decimal"/>
       <w:lvlText w:val=""/>
       <w:lvlJc w:val="left"/>
     </w:lvl>
-    <w:lvl w:ilvl="4" w:tplc="58D086E2">
+    <w:lvl w:ilvl="4" w:tplc="42C4F008">
       <w:numFmt w:val="decimal"/>
       <w:lvlText w:val=""/>
       <w:lvlJc w:val="left"/>
     </w:lvl>
-    <w:lvl w:ilvl="5" w:tplc="07967472">
+    <w:lvl w:ilvl="5" w:tplc="E4AC3920">
       <w:numFmt w:val="decimal"/>
       <w:lvlText w:val=""/>
       <w:lvlJc w:val="left"/>
     </w:lvl>
-    <w:lvl w:ilvl="6" w:tplc="C750D03C">
+    <w:lvl w:ilvl="6" w:tplc="E6724C4E">
       <w:numFmt w:val="decimal"/>
       <w:lvlText w:val=""/>
       <w:lvlJc w:val="left"/>
     </w:lvl>
-    <w:lvl w:ilvl="7" w:tplc="1C9A8C08">
+    <w:lvl w:ilvl="7" w:tplc="B464E82A">
       <w:numFmt w:val="decimal"/>
       <w:lvlText w:val=""/>
       <w:lvlJc w:val="left"/>
     </w:lvl>
-    <w:lvl w:ilvl="8" w:tplc="94FAB320">
+    <w:lvl w:ilvl="8" w:tplc="2A08BA5C">
       <w:numFmt w:val="decimal"/>
       <w:lvlText w:val=""/>
       <w:lvlJc w:val="left"/>
     </w:lvl>
   </w:abstractNum>
-  <w:abstractNum w:abstractNumId="16" w15:restartNumberingAfterBreak="0">
-    <w:nsid w:val="52431031"/>
+  <w:abstractNum w:abstractNumId="18" w15:restartNumberingAfterBreak="0">
+    <w:nsid w:val="566E0901"/>
     <w:multiLevelType w:val="hybridMultilevel"/>
-    <w:tmpl w:val="B9BE1E64"/>
-    <w:lvl w:ilvl="0" w:tplc="4456EC2E">
+    <w:tmpl w:val="21E47BF4"/>
+    <w:lvl w:ilvl="0" w:tplc="9E54684E">
       <w:start w:val="1"/>
       <w:numFmt w:val="decimal"/>
       <w:lvlText w:val="%1."/>
@@ -22547,52 +22664,52 @@
         <w:color w:val="A67C27"/>
       </w:rPr>
     </w:lvl>
-    <w:lvl w:ilvl="1" w:tplc="5942C934">
+    <w:lvl w:ilvl="1" w:tplc="D3981668">
       <w:numFmt w:val="decimal"/>
       <w:lvlText w:val=""/>
       <w:lvlJc w:val="left"/>
     </w:lvl>
-    <w:lvl w:ilvl="2" w:tplc="6734ACBE">
+    <w:lvl w:ilvl="2" w:tplc="F6F6DC08">
       <w:numFmt w:val="decimal"/>
       <w:lvlText w:val=""/>
       <w:lvlJc w:val="left"/>
     </w:lvl>
-    <w:lvl w:ilvl="3" w:tplc="627A4408">
+    <w:lvl w:ilvl="3" w:tplc="BC64C82C">
       <w:numFmt w:val="decimal"/>
       <w:lvlText w:val=""/>
       <w:lvlJc w:val="left"/>
     </w:lvl>
-    <w:lvl w:ilvl="4" w:tplc="5CAEE910">
+    <w:lvl w:ilvl="4" w:tplc="F1749202">
       <w:numFmt w:val="decimal"/>
       <w:lvlText w:val=""/>
       <w:lvlJc w:val="left"/>
     </w:lvl>
-    <w:lvl w:ilvl="5" w:tplc="9DE03290">
+    <w:lvl w:ilvl="5" w:tplc="CDF6CCFE">
       <w:numFmt w:val="decimal"/>
       <w:lvlText w:val=""/>
       <w:lvlJc w:val="left"/>
     </w:lvl>
-    <w:lvl w:ilvl="6" w:tplc="4DA2D4A8">
+    <w:lvl w:ilvl="6" w:tplc="B2085BEE">
       <w:numFmt w:val="decimal"/>
       <w:lvlText w:val=""/>
       <w:lvlJc w:val="left"/>
     </w:lvl>
-    <w:lvl w:ilvl="7" w:tplc="ECAE6C5E">
+    <w:lvl w:ilvl="7" w:tplc="3A4CC7D0">
       <w:numFmt w:val="decimal"/>
       <w:lvlText w:val=""/>
       <w:lvlJc w:val="left"/>
     </w:lvl>
-    <w:lvl w:ilvl="8" w:tplc="D564F520">
+    <w:lvl w:ilvl="8" w:tplc="01C68576">
       <w:numFmt w:val="decimal"/>
       <w:lvlText w:val=""/>
       <w:lvlJc w:val="left"/>
     </w:lvl>
   </w:abstractNum>
-  <w:abstractNum w:abstractNumId="17" w15:restartNumberingAfterBreak="0">
-    <w:nsid w:val="554616DE"/>
+  <w:abstractNum w:abstractNumId="19" w15:restartNumberingAfterBreak="0">
+    <w:nsid w:val="59583FF0"/>
     <w:multiLevelType w:val="hybridMultilevel"/>
-    <w:tmpl w:val="CCBCBC8A"/>
-    <w:lvl w:ilvl="0" w:tplc="851AC3C4">
+    <w:tmpl w:val="3342E3A6"/>
+    <w:lvl w:ilvl="0" w:tplc="F6560126">
       <w:start w:val="1"/>
       <w:numFmt w:val="decimal"/>
       <w:lvlText w:val="%1."/>
@@ -22606,52 +22723,52 @@
         <w:color w:val="A67C27"/>
       </w:rPr>
     </w:lvl>
-    <w:lvl w:ilvl="1" w:tplc="A8CE68E4">
+    <w:lvl w:ilvl="1" w:tplc="48569DC0">
       <w:numFmt w:val="decimal"/>
       <w:lvlText w:val=""/>
       <w:lvlJc w:val="left"/>
     </w:lvl>
-    <w:lvl w:ilvl="2" w:tplc="82CC4C38">
+    <w:lvl w:ilvl="2" w:tplc="43EC278C">
       <w:numFmt w:val="decimal"/>
       <w:lvlText w:val=""/>
       <w:lvlJc w:val="left"/>
     </w:lvl>
-    <w:lvl w:ilvl="3" w:tplc="7F3C99C6">
+    <w:lvl w:ilvl="3" w:tplc="76C61A2C">
       <w:numFmt w:val="decimal"/>
       <w:lvlText w:val=""/>
       <w:lvlJc w:val="left"/>
     </w:lvl>
-    <w:lvl w:ilvl="4" w:tplc="BAEC9DF2">
+    <w:lvl w:ilvl="4" w:tplc="8A6E2330">
       <w:numFmt w:val="decimal"/>
       <w:lvlText w:val=""/>
       <w:lvlJc w:val="left"/>
     </w:lvl>
-    <w:lvl w:ilvl="5" w:tplc="B3DA269C">
+    <w:lvl w:ilvl="5" w:tplc="6C20A634">
       <w:numFmt w:val="decimal"/>
       <w:lvlText w:val=""/>
       <w:lvlJc w:val="left"/>
     </w:lvl>
-    <w:lvl w:ilvl="6" w:tplc="82A448E6">
+    <w:lvl w:ilvl="6" w:tplc="94449996">
       <w:numFmt w:val="decimal"/>
       <w:lvlText w:val=""/>
       <w:lvlJc w:val="left"/>
     </w:lvl>
-    <w:lvl w:ilvl="7" w:tplc="0B68E498">
+    <w:lvl w:ilvl="7" w:tplc="9006C854">
       <w:numFmt w:val="decimal"/>
       <w:lvlText w:val=""/>
       <w:lvlJc w:val="left"/>
     </w:lvl>
-    <w:lvl w:ilvl="8" w:tplc="22C417F8">
+    <w:lvl w:ilvl="8" w:tplc="C02A8372">
       <w:numFmt w:val="decimal"/>
       <w:lvlText w:val=""/>
       <w:lvlJc w:val="left"/>
     </w:lvl>
   </w:abstractNum>
-  <w:abstractNum w:abstractNumId="18" w15:restartNumberingAfterBreak="0">
-    <w:nsid w:val="57534971"/>
+  <w:abstractNum w:abstractNumId="20" w15:restartNumberingAfterBreak="0">
+    <w:nsid w:val="5DF1332C"/>
     <w:multiLevelType w:val="hybridMultilevel"/>
-    <w:tmpl w:val="4FC23884"/>
-    <w:lvl w:ilvl="0" w:tplc="731A5178">
+    <w:tmpl w:val="DC8A13EA"/>
+    <w:lvl w:ilvl="0" w:tplc="3DE8803A">
       <w:start w:val="1"/>
       <w:numFmt w:val="decimal"/>
       <w:lvlText w:val="%1."/>
@@ -22665,52 +22782,52 @@
         <w:color w:val="A67C27"/>
       </w:rPr>
     </w:lvl>
-    <w:lvl w:ilvl="1" w:tplc="D79C306E">
+    <w:lvl w:ilvl="1" w:tplc="CBCCD39A">
       <w:numFmt w:val="decimal"/>
       <w:lvlText w:val=""/>
       <w:lvlJc w:val="left"/>
     </w:lvl>
-    <w:lvl w:ilvl="2" w:tplc="4966356C">
+    <w:lvl w:ilvl="2" w:tplc="69D81890">
       <w:numFmt w:val="decimal"/>
       <w:lvlText w:val=""/>
       <w:lvlJc w:val="left"/>
     </w:lvl>
-    <w:lvl w:ilvl="3" w:tplc="C2921590">
+    <w:lvl w:ilvl="3" w:tplc="A00C913E">
       <w:numFmt w:val="decimal"/>
       <w:lvlText w:val=""/>
       <w:lvlJc w:val="left"/>
     </w:lvl>
-    <w:lvl w:ilvl="4" w:tplc="AF7231E4">
+    <w:lvl w:ilvl="4" w:tplc="9A98494C">
       <w:numFmt w:val="decimal"/>
       <w:lvlText w:val=""/>
       <w:lvlJc w:val="left"/>
     </w:lvl>
-    <w:lvl w:ilvl="5" w:tplc="55D2F0B2">
+    <w:lvl w:ilvl="5" w:tplc="7766F036">
       <w:numFmt w:val="decimal"/>
       <w:lvlText w:val=""/>
       <w:lvlJc w:val="left"/>
     </w:lvl>
-    <w:lvl w:ilvl="6" w:tplc="5EDA412E">
+    <w:lvl w:ilvl="6" w:tplc="E8F6B4BE">
       <w:numFmt w:val="decimal"/>
       <w:lvlText w:val=""/>
       <w:lvlJc w:val="left"/>
     </w:lvl>
-    <w:lvl w:ilvl="7" w:tplc="0BA2A84A">
+    <w:lvl w:ilvl="7" w:tplc="68D4E872">
       <w:numFmt w:val="decimal"/>
       <w:lvlText w:val=""/>
       <w:lvlJc w:val="left"/>
     </w:lvl>
-    <w:lvl w:ilvl="8" w:tplc="9156FE7A">
+    <w:lvl w:ilvl="8" w:tplc="21C850BA">
       <w:numFmt w:val="decimal"/>
       <w:lvlText w:val=""/>
       <w:lvlJc w:val="left"/>
     </w:lvl>
   </w:abstractNum>
-  <w:abstractNum w:abstractNumId="19" w15:restartNumberingAfterBreak="0">
-    <w:nsid w:val="5CEA3646"/>
+  <w:abstractNum w:abstractNumId="21" w15:restartNumberingAfterBreak="0">
+    <w:nsid w:val="682A6C5F"/>
     <w:multiLevelType w:val="hybridMultilevel"/>
-    <w:tmpl w:val="BD42180E"/>
-    <w:lvl w:ilvl="0" w:tplc="4DDEC036">
+    <w:tmpl w:val="704A51A0"/>
+    <w:lvl w:ilvl="0" w:tplc="F47E3F8E">
       <w:start w:val="1"/>
       <w:numFmt w:val="decimal"/>
       <w:lvlText w:val="%1."/>
@@ -22724,110 +22841,52 @@
         <w:color w:val="A67C27"/>
       </w:rPr>
     </w:lvl>
-    <w:lvl w:ilvl="1" w:tplc="85A218B0">
+    <w:lvl w:ilvl="1" w:tplc="7FFC439E">
       <w:numFmt w:val="decimal"/>
       <w:lvlText w:val=""/>
       <w:lvlJc w:val="left"/>
     </w:lvl>
-    <w:lvl w:ilvl="2" w:tplc="57FA7940">
+    <w:lvl w:ilvl="2" w:tplc="92A40C7C">
       <w:numFmt w:val="decimal"/>
       <w:lvlText w:val=""/>
       <w:lvlJc w:val="left"/>
     </w:lvl>
-    <w:lvl w:ilvl="3" w:tplc="2518594C">
+    <w:lvl w:ilvl="3" w:tplc="331ADC9C">
       <w:numFmt w:val="decimal"/>
       <w:lvlText w:val=""/>
       <w:lvlJc w:val="left"/>
     </w:lvl>
-    <w:lvl w:ilvl="4" w:tplc="499C532E">
+    <w:lvl w:ilvl="4" w:tplc="0B9E20D0">
       <w:numFmt w:val="decimal"/>
       <w:lvlText w:val=""/>
       <w:lvlJc w:val="left"/>
     </w:lvl>
-    <w:lvl w:ilvl="5" w:tplc="9ADECAC6">
+    <w:lvl w:ilvl="5" w:tplc="35A2DD06">
       <w:numFmt w:val="decimal"/>
       <w:lvlText w:val=""/>
       <w:lvlJc w:val="left"/>
     </w:lvl>
-    <w:lvl w:ilvl="6" w:tplc="ADAC22E6">
+    <w:lvl w:ilvl="6" w:tplc="E9120984">
       <w:numFmt w:val="decimal"/>
       <w:lvlText w:val=""/>
       <w:lvlJc w:val="left"/>
     </w:lvl>
-    <w:lvl w:ilvl="7" w:tplc="1826D316">
+    <w:lvl w:ilvl="7" w:tplc="870AF696">
       <w:numFmt w:val="decimal"/>
       <w:lvlText w:val=""/>
       <w:lvlJc w:val="left"/>
     </w:lvl>
-    <w:lvl w:ilvl="8" w:tplc="6D049F5E">
+    <w:lvl w:ilvl="8" w:tplc="71903572">
       <w:numFmt w:val="decimal"/>
       <w:lvlText w:val=""/>
       <w:lvlJc w:val="left"/>
     </w:lvl>
   </w:abstractNum>
-  <w:abstractNum w:abstractNumId="20" w15:restartNumberingAfterBreak="0">
-    <w:nsid w:val="652C1AB7"/>
+  <w:abstractNum w:abstractNumId="22" w15:restartNumberingAfterBreak="0">
+    <w:nsid w:val="6DCD1AC0"/>
     <w:multiLevelType w:val="hybridMultilevel"/>
-    <w:tmpl w:val="362EFB96"/>
-    <w:lvl w:ilvl="0" w:tplc="75F25322">
-      <w:start w:val="1"/>
-      <w:numFmt w:val="bullet"/>
-      <w:lvlText w:val="•"/>
-      <w:lvlJc w:val="left"/>
-      <w:pPr>
-        <w:ind w:left="460" w:hanging="280"/>
-      </w:pPr>
-    </w:lvl>
-    <w:lvl w:ilvl="1" w:tplc="99FE17F4">
-      <w:start w:val="1"/>
-      <w:numFmt w:val="bullet"/>
-      <w:lvlText w:val="–"/>
-      <w:lvlJc w:val="left"/>
-      <w:pPr>
-        <w:ind w:left="900" w:hanging="280"/>
-      </w:pPr>
-    </w:lvl>
-    <w:lvl w:ilvl="2" w:tplc="6666D614">
-      <w:numFmt w:val="decimal"/>
-      <w:lvlText w:val=""/>
-      <w:lvlJc w:val="left"/>
-    </w:lvl>
-    <w:lvl w:ilvl="3" w:tplc="7D7ED298">
-      <w:numFmt w:val="decimal"/>
-      <w:lvlText w:val=""/>
-      <w:lvlJc w:val="left"/>
-    </w:lvl>
-    <w:lvl w:ilvl="4" w:tplc="D1A070E4">
-      <w:numFmt w:val="decimal"/>
-      <w:lvlText w:val=""/>
-      <w:lvlJc w:val="left"/>
-    </w:lvl>
-    <w:lvl w:ilvl="5" w:tplc="3BF0F938">
-      <w:numFmt w:val="decimal"/>
-      <w:lvlText w:val=""/>
-      <w:lvlJc w:val="left"/>
-    </w:lvl>
-    <w:lvl w:ilvl="6" w:tplc="990008CC">
-      <w:numFmt w:val="decimal"/>
-      <w:lvlText w:val=""/>
-      <w:lvlJc w:val="left"/>
-    </w:lvl>
-    <w:lvl w:ilvl="7" w:tplc="C3762EA4">
-      <w:numFmt w:val="decimal"/>
-      <w:lvlText w:val=""/>
-      <w:lvlJc w:val="left"/>
-    </w:lvl>
-    <w:lvl w:ilvl="8" w:tplc="972283AA">
-      <w:numFmt w:val="decimal"/>
-      <w:lvlText w:val=""/>
-      <w:lvlJc w:val="left"/>
-    </w:lvl>
-  </w:abstractNum>
-  <w:abstractNum w:abstractNumId="21" w15:restartNumberingAfterBreak="0">
-    <w:nsid w:val="698B4B19"/>
-    <w:multiLevelType w:val="hybridMultilevel"/>
-    <w:tmpl w:val="745EBB24"/>
-    <w:lvl w:ilvl="0" w:tplc="C6262272">
+    <w:tmpl w:val="C3D2F8D2"/>
+    <w:lvl w:ilvl="0" w:tplc="2F34514E">
       <w:start w:val="1"/>
       <w:numFmt w:val="decimal"/>
       <w:lvlText w:val="%1."/>
@@ -22841,52 +22900,52 @@
         <w:color w:val="A67C27"/>
       </w:rPr>
     </w:lvl>
-    <w:lvl w:ilvl="1" w:tplc="C446451A">
+    <w:lvl w:ilvl="1" w:tplc="7C263406">
       <w:numFmt w:val="decimal"/>
       <w:lvlText w:val=""/>
       <w:lvlJc w:val="left"/>
     </w:lvl>
-    <w:lvl w:ilvl="2" w:tplc="8D8A5B60">
+    <w:lvl w:ilvl="2" w:tplc="1DBCFB40">
       <w:numFmt w:val="decimal"/>
       <w:lvlText w:val=""/>
       <w:lvlJc w:val="left"/>
     </w:lvl>
-    <w:lvl w:ilvl="3" w:tplc="E0360668">
+    <w:lvl w:ilvl="3" w:tplc="66227E1C">
       <w:numFmt w:val="decimal"/>
       <w:lvlText w:val=""/>
       <w:lvlJc w:val="left"/>
     </w:lvl>
-    <w:lvl w:ilvl="4" w:tplc="18D62986">
+    <w:lvl w:ilvl="4" w:tplc="6820013C">
       <w:numFmt w:val="decimal"/>
       <w:lvlText w:val=""/>
       <w:lvlJc w:val="left"/>
     </w:lvl>
-    <w:lvl w:ilvl="5" w:tplc="4566C280">
+    <w:lvl w:ilvl="5" w:tplc="DD2206C8">
       <w:numFmt w:val="decimal"/>
       <w:lvlText w:val=""/>
       <w:lvlJc w:val="left"/>
     </w:lvl>
-    <w:lvl w:ilvl="6" w:tplc="5E7AE662">
+    <w:lvl w:ilvl="6" w:tplc="6DB8C900">
       <w:numFmt w:val="decimal"/>
       <w:lvlText w:val=""/>
       <w:lvlJc w:val="left"/>
     </w:lvl>
-    <w:lvl w:ilvl="7" w:tplc="DB481B98">
+    <w:lvl w:ilvl="7" w:tplc="80D02038">
       <w:numFmt w:val="decimal"/>
       <w:lvlText w:val=""/>
       <w:lvlJc w:val="left"/>
     </w:lvl>
-    <w:lvl w:ilvl="8" w:tplc="EFA07774">
+    <w:lvl w:ilvl="8" w:tplc="6C44CEBA">
       <w:numFmt w:val="decimal"/>
       <w:lvlText w:val=""/>
       <w:lvlJc w:val="left"/>
     </w:lvl>
   </w:abstractNum>
-  <w:abstractNum w:abstractNumId="22" w15:restartNumberingAfterBreak="0">
-    <w:nsid w:val="69D67B9E"/>
+  <w:abstractNum w:abstractNumId="23" w15:restartNumberingAfterBreak="0">
+    <w:nsid w:val="734D123B"/>
     <w:multiLevelType w:val="hybridMultilevel"/>
-    <w:tmpl w:val="85802824"/>
-    <w:lvl w:ilvl="0" w:tplc="7B68B914">
+    <w:tmpl w:val="07D281D0"/>
+    <w:lvl w:ilvl="0" w:tplc="A77E2E82">
       <w:start w:val="1"/>
       <w:numFmt w:val="decimal"/>
       <w:lvlText w:val="%1."/>
@@ -22900,52 +22959,52 @@
         <w:color w:val="A67C27"/>
       </w:rPr>
     </w:lvl>
-    <w:lvl w:ilvl="1" w:tplc="C464E7FE">
+    <w:lvl w:ilvl="1" w:tplc="B6D4989C">
       <w:numFmt w:val="decimal"/>
       <w:lvlText w:val=""/>
       <w:lvlJc w:val="left"/>
     </w:lvl>
-    <w:lvl w:ilvl="2" w:tplc="9F04CB54">
+    <w:lvl w:ilvl="2" w:tplc="1CC071F8">
       <w:numFmt w:val="decimal"/>
       <w:lvlText w:val=""/>
       <w:lvlJc w:val="left"/>
     </w:lvl>
-    <w:lvl w:ilvl="3" w:tplc="CC4883D6">
+    <w:lvl w:ilvl="3" w:tplc="9654C122">
       <w:numFmt w:val="decimal"/>
       <w:lvlText w:val=""/>
       <w:lvlJc w:val="left"/>
     </w:lvl>
-    <w:lvl w:ilvl="4" w:tplc="1FA2F28A">
+    <w:lvl w:ilvl="4" w:tplc="BE6846B4">
       <w:numFmt w:val="decimal"/>
       <w:lvlText w:val=""/>
       <w:lvlJc w:val="left"/>
     </w:lvl>
-    <w:lvl w:ilvl="5" w:tplc="280C9F62">
+    <w:lvl w:ilvl="5" w:tplc="CCCA1372">
       <w:numFmt w:val="decimal"/>
       <w:lvlText w:val=""/>
       <w:lvlJc w:val="left"/>
     </w:lvl>
-    <w:lvl w:ilvl="6" w:tplc="06BA5954">
+    <w:lvl w:ilvl="6" w:tplc="64464120">
       <w:numFmt w:val="decimal"/>
       <w:lvlText w:val=""/>
       <w:lvlJc w:val="left"/>
     </w:lvl>
-    <w:lvl w:ilvl="7" w:tplc="40128622">
+    <w:lvl w:ilvl="7" w:tplc="FB0241A0">
       <w:numFmt w:val="decimal"/>
       <w:lvlText w:val=""/>
       <w:lvlJc w:val="left"/>
     </w:lvl>
-    <w:lvl w:ilvl="8" w:tplc="45B6B1F4">
+    <w:lvl w:ilvl="8" w:tplc="ED8CB0E0">
       <w:numFmt w:val="decimal"/>
       <w:lvlText w:val=""/>
       <w:lvlJc w:val="left"/>
     </w:lvl>
   </w:abstractNum>
-  <w:abstractNum w:abstractNumId="23" w15:restartNumberingAfterBreak="0">
-    <w:nsid w:val="7A056BAF"/>
+  <w:abstractNum w:abstractNumId="24" w15:restartNumberingAfterBreak="0">
+    <w:nsid w:val="74A66531"/>
     <w:multiLevelType w:val="hybridMultilevel"/>
-    <w:tmpl w:val="ADA2A66E"/>
-    <w:lvl w:ilvl="0" w:tplc="77CEAB54">
+    <w:tmpl w:val="CD9ED00E"/>
+    <w:lvl w:ilvl="0" w:tplc="508A5374">
       <w:start w:val="1"/>
       <w:numFmt w:val="decimal"/>
       <w:lvlText w:val="%1."/>
@@ -22959,252 +23018,193 @@
         <w:color w:val="A67C27"/>
       </w:rPr>
     </w:lvl>
-    <w:lvl w:ilvl="1" w:tplc="667E5828">
+    <w:lvl w:ilvl="1" w:tplc="E5F6B29E">
       <w:numFmt w:val="decimal"/>
       <w:lvlText w:val=""/>
       <w:lvlJc w:val="left"/>
     </w:lvl>
-    <w:lvl w:ilvl="2" w:tplc="850822FC">
+    <w:lvl w:ilvl="2" w:tplc="F53A4F76">
       <w:numFmt w:val="decimal"/>
       <w:lvlText w:val=""/>
       <w:lvlJc w:val="left"/>
     </w:lvl>
-    <w:lvl w:ilvl="3" w:tplc="79308836">
+    <w:lvl w:ilvl="3" w:tplc="F7D09EF2">
       <w:numFmt w:val="decimal"/>
       <w:lvlText w:val=""/>
       <w:lvlJc w:val="left"/>
     </w:lvl>
-    <w:lvl w:ilvl="4" w:tplc="F6C2203E">
+    <w:lvl w:ilvl="4" w:tplc="1388C224">
       <w:numFmt w:val="decimal"/>
       <w:lvlText w:val=""/>
       <w:lvlJc w:val="left"/>
     </w:lvl>
-    <w:lvl w:ilvl="5" w:tplc="3AB46FA0">
+    <w:lvl w:ilvl="5" w:tplc="588EB194">
       <w:numFmt w:val="decimal"/>
       <w:lvlText w:val=""/>
       <w:lvlJc w:val="left"/>
     </w:lvl>
-    <w:lvl w:ilvl="6" w:tplc="DF7C2724">
+    <w:lvl w:ilvl="6" w:tplc="0008A0C4">
       <w:numFmt w:val="decimal"/>
       <w:lvlText w:val=""/>
       <w:lvlJc w:val="left"/>
     </w:lvl>
-    <w:lvl w:ilvl="7" w:tplc="19342D96">
+    <w:lvl w:ilvl="7" w:tplc="1CB6F3A0">
       <w:numFmt w:val="decimal"/>
       <w:lvlText w:val=""/>
       <w:lvlJc w:val="left"/>
     </w:lvl>
-    <w:lvl w:ilvl="8" w:tplc="2A927EBE">
+    <w:lvl w:ilvl="8" w:tplc="0C905BDC">
       <w:numFmt w:val="decimal"/>
       <w:lvlText w:val=""/>
       <w:lvlJc w:val="left"/>
     </w:lvl>
   </w:abstractNum>
-  <w:abstractNum w:abstractNumId="24" w15:restartNumberingAfterBreak="0">
-    <w:nsid w:val="7D4D4C4D"/>
-    <w:multiLevelType w:val="hybridMultilevel"/>
-    <w:tmpl w:val="E56AC328"/>
-    <w:lvl w:ilvl="0" w:tplc="673C09B0">
-      <w:start w:val="1"/>
-      <w:numFmt w:val="decimal"/>
-      <w:lvlText w:val="%1."/>
-      <w:lvlJc w:val="left"/>
-      <w:pPr>
-        <w:ind w:left="460" w:hanging="360"/>
-      </w:pPr>
-      <w:rPr>
-        <w:b/>
-        <w:bCs/>
-        <w:color w:val="A67C27"/>
-      </w:rPr>
-    </w:lvl>
-    <w:lvl w:ilvl="1" w:tplc="2144B2AA">
-      <w:numFmt w:val="decimal"/>
-      <w:lvlText w:val=""/>
-      <w:lvlJc w:val="left"/>
-    </w:lvl>
-    <w:lvl w:ilvl="2" w:tplc="D5E65B6E">
-      <w:numFmt w:val="decimal"/>
-      <w:lvlText w:val=""/>
-      <w:lvlJc w:val="left"/>
-    </w:lvl>
-    <w:lvl w:ilvl="3" w:tplc="FB381BDA">
-      <w:numFmt w:val="decimal"/>
-      <w:lvlText w:val=""/>
-      <w:lvlJc w:val="left"/>
-    </w:lvl>
-    <w:lvl w:ilvl="4" w:tplc="D2CEDE8C">
-      <w:numFmt w:val="decimal"/>
-      <w:lvlText w:val=""/>
-      <w:lvlJc w:val="left"/>
-    </w:lvl>
-    <w:lvl w:ilvl="5" w:tplc="4BA2F216">
-      <w:numFmt w:val="decimal"/>
-      <w:lvlText w:val=""/>
-      <w:lvlJc w:val="left"/>
-    </w:lvl>
-    <w:lvl w:ilvl="6" w:tplc="E93C2F4A">
-      <w:numFmt w:val="decimal"/>
-      <w:lvlText w:val=""/>
-      <w:lvlJc w:val="left"/>
-    </w:lvl>
-    <w:lvl w:ilvl="7" w:tplc="B0A41900">
-      <w:numFmt w:val="decimal"/>
-      <w:lvlText w:val=""/>
-      <w:lvlJc w:val="left"/>
-    </w:lvl>
-    <w:lvl w:ilvl="8" w:tplc="61929662">
-      <w:numFmt w:val="decimal"/>
-      <w:lvlText w:val=""/>
-      <w:lvlJc w:val="left"/>
-    </w:lvl>
-  </w:abstractNum>
-  <w:num w:numId="1" w16cid:durableId="982856353">
+  <w:num w:numId="1" w16cid:durableId="907031321">
+    <w:abstractNumId w:val="9"/>
+    <w:lvlOverride w:ilvl="0">
+      <w:startOverride w:val="1"/>
+    </w:lvlOverride>
+  </w:num>
+  <w:num w:numId="2" w16cid:durableId="648705631">
+    <w:abstractNumId w:val="7"/>
+    <w:lvlOverride w:ilvl="0">
+      <w:startOverride w:val="1"/>
+    </w:lvlOverride>
+  </w:num>
+  <w:num w:numId="3" w16cid:durableId="580406698">
     <w:abstractNumId w:val="5"/>
     <w:lvlOverride w:ilvl="0">
       <w:startOverride w:val="1"/>
     </w:lvlOverride>
   </w:num>
-  <w:num w:numId="2" w16cid:durableId="933711736">
+  <w:num w:numId="4" w16cid:durableId="1301619327">
+    <w:abstractNumId w:val="2"/>
+    <w:lvlOverride w:ilvl="0">
+      <w:startOverride w:val="1"/>
+    </w:lvlOverride>
+  </w:num>
+  <w:num w:numId="5" w16cid:durableId="1724017702">
+    <w:abstractNumId w:val="6"/>
+    <w:lvlOverride w:ilvl="0">
+      <w:startOverride w:val="1"/>
+    </w:lvlOverride>
+  </w:num>
+  <w:num w:numId="6" w16cid:durableId="1133213577">
+    <w:abstractNumId w:val="1"/>
+    <w:lvlOverride w:ilvl="0">
+      <w:startOverride w:val="1"/>
+    </w:lvlOverride>
+  </w:num>
+  <w:num w:numId="7" w16cid:durableId="889342679">
+    <w:abstractNumId w:val="22"/>
+    <w:lvlOverride w:ilvl="0">
+      <w:startOverride w:val="1"/>
+    </w:lvlOverride>
+  </w:num>
+  <w:num w:numId="8" w16cid:durableId="841966767">
+    <w:abstractNumId w:val="0"/>
+    <w:lvlOverride w:ilvl="0">
+      <w:startOverride w:val="1"/>
+    </w:lvlOverride>
+  </w:num>
+  <w:num w:numId="9" w16cid:durableId="1604068463">
     <w:abstractNumId w:val="20"/>
     <w:lvlOverride w:ilvl="0">
       <w:startOverride w:val="1"/>
     </w:lvlOverride>
   </w:num>
-  <w:num w:numId="3" w16cid:durableId="1762678445">
+  <w:num w:numId="10" w16cid:durableId="455148184">
+    <w:abstractNumId w:val="14"/>
+    <w:lvlOverride w:ilvl="0">
+      <w:startOverride w:val="1"/>
+    </w:lvlOverride>
+  </w:num>
+  <w:num w:numId="11" w16cid:durableId="1078018157">
+    <w:abstractNumId w:val="16"/>
+    <w:lvlOverride w:ilvl="0">
+      <w:startOverride w:val="1"/>
+    </w:lvlOverride>
+  </w:num>
+  <w:num w:numId="12" w16cid:durableId="757602592">
+    <w:abstractNumId w:val="21"/>
+    <w:lvlOverride w:ilvl="0">
+      <w:startOverride w:val="1"/>
+    </w:lvlOverride>
+  </w:num>
+  <w:num w:numId="13" w16cid:durableId="247889424">
     <w:abstractNumId w:val="18"/>
     <w:lvlOverride w:ilvl="0">
       <w:startOverride w:val="1"/>
     </w:lvlOverride>
   </w:num>
-  <w:num w:numId="4" w16cid:durableId="511189863">
+  <w:num w:numId="14" w16cid:durableId="28772268">
+    <w:abstractNumId w:val="8"/>
+    <w:lvlOverride w:ilvl="0">
+      <w:startOverride w:val="1"/>
+    </w:lvlOverride>
+  </w:num>
+  <w:num w:numId="15" w16cid:durableId="237448812">
+    <w:abstractNumId w:val="13"/>
+    <w:lvlOverride w:ilvl="0">
+      <w:startOverride w:val="1"/>
+    </w:lvlOverride>
+  </w:num>
+  <w:num w:numId="16" w16cid:durableId="678309071">
+    <w:abstractNumId w:val="17"/>
+    <w:lvlOverride w:ilvl="0">
+      <w:startOverride w:val="1"/>
+    </w:lvlOverride>
+  </w:num>
+  <w:num w:numId="17" w16cid:durableId="1015109942">
+    <w:abstractNumId w:val="3"/>
+    <w:lvlOverride w:ilvl="0">
+      <w:startOverride w:val="1"/>
+    </w:lvlOverride>
+  </w:num>
+  <w:num w:numId="18" w16cid:durableId="1967658479">
+    <w:abstractNumId w:val="24"/>
+    <w:lvlOverride w:ilvl="0">
+      <w:startOverride w:val="1"/>
+    </w:lvlOverride>
+  </w:num>
+  <w:num w:numId="19" w16cid:durableId="1592738875">
     <w:abstractNumId w:val="10"/>
     <w:lvlOverride w:ilvl="0">
       <w:startOverride w:val="1"/>
     </w:lvlOverride>
   </w:num>
-  <w:num w:numId="5" w16cid:durableId="667559035">
-    <w:abstractNumId w:val="9"/>
+  <w:num w:numId="20" w16cid:durableId="1515798952">
+    <w:abstractNumId w:val="19"/>
     <w:lvlOverride w:ilvl="0">
       <w:startOverride w:val="1"/>
     </w:lvlOverride>
   </w:num>
-  <w:num w:numId="6" w16cid:durableId="1798572480">
-    <w:abstractNumId w:val="0"/>
-    <w:lvlOverride w:ilvl="0">
-      <w:startOverride w:val="1"/>
-    </w:lvlOverride>
-  </w:num>
-  <w:num w:numId="7" w16cid:durableId="981471866">
-    <w:abstractNumId w:val="8"/>
-    <w:lvlOverride w:ilvl="0">
-      <w:startOverride w:val="1"/>
-    </w:lvlOverride>
-  </w:num>
-  <w:num w:numId="8" w16cid:durableId="145127676">
+  <w:num w:numId="21" w16cid:durableId="63112812">
     <w:abstractNumId w:val="11"/>
     <w:lvlOverride w:ilvl="0">
       <w:startOverride w:val="1"/>
     </w:lvlOverride>
   </w:num>
-  <w:num w:numId="9" w16cid:durableId="728769585">
-    <w:abstractNumId w:val="4"/>
-    <w:lvlOverride w:ilvl="0">
-      <w:startOverride w:val="1"/>
-    </w:lvlOverride>
-  </w:num>
-  <w:num w:numId="10" w16cid:durableId="222185396">
-    <w:abstractNumId w:val="2"/>
-    <w:lvlOverride w:ilvl="0">
-      <w:startOverride w:val="1"/>
-    </w:lvlOverride>
-  </w:num>
-  <w:num w:numId="11" w16cid:durableId="384645093">
+  <w:num w:numId="22" w16cid:durableId="559748681">
     <w:abstractNumId w:val="12"/>
     <w:lvlOverride w:ilvl="0">
       <w:startOverride w:val="1"/>
     </w:lvlOverride>
   </w:num>
-  <w:num w:numId="12" w16cid:durableId="964651637">
-    <w:abstractNumId w:val="24"/>
+  <w:num w:numId="23" w16cid:durableId="1219587872">
+    <w:abstractNumId w:val="23"/>
     <w:lvlOverride w:ilvl="0">
       <w:startOverride w:val="1"/>
     </w:lvlOverride>
   </w:num>
-  <w:num w:numId="13" w16cid:durableId="646282263">
-    <w:abstractNumId w:val="14"/>
-    <w:lvlOverride w:ilvl="0">
-      <w:startOverride w:val="1"/>
-    </w:lvlOverride>
-  </w:num>
-  <w:num w:numId="14" w16cid:durableId="1048726118">
-    <w:abstractNumId w:val="13"/>
-    <w:lvlOverride w:ilvl="0">
-      <w:startOverride w:val="1"/>
-    </w:lvlOverride>
-  </w:num>
-  <w:num w:numId="15" w16cid:durableId="1138912341">
+  <w:num w:numId="24" w16cid:durableId="993072376">
     <w:abstractNumId w:val="15"/>
     <w:lvlOverride w:ilvl="0">
       <w:startOverride w:val="1"/>
     </w:lvlOverride>
   </w:num>
-  <w:num w:numId="16" w16cid:durableId="308438179">
-    <w:abstractNumId w:val="17"/>
-    <w:lvlOverride w:ilvl="0">
-      <w:startOverride w:val="1"/>
-    </w:lvlOverride>
-  </w:num>
-  <w:num w:numId="17" w16cid:durableId="461070927">
-    <w:abstractNumId w:val="6"/>
-    <w:lvlOverride w:ilvl="0">
-      <w:startOverride w:val="1"/>
-    </w:lvlOverride>
-  </w:num>
-  <w:num w:numId="18" w16cid:durableId="297762228">
-    <w:abstractNumId w:val="16"/>
-    <w:lvlOverride w:ilvl="0">
-      <w:startOverride w:val="1"/>
-    </w:lvlOverride>
-  </w:num>
-  <w:num w:numId="19" w16cid:durableId="1714691406">
-    <w:abstractNumId w:val="22"/>
-    <w:lvlOverride w:ilvl="0">
-      <w:startOverride w:val="1"/>
-    </w:lvlOverride>
-  </w:num>
-  <w:num w:numId="20" w16cid:durableId="2069954981">
-    <w:abstractNumId w:val="3"/>
-    <w:lvlOverride w:ilvl="0">
-      <w:startOverride w:val="1"/>
-    </w:lvlOverride>
-  </w:num>
-  <w:num w:numId="21" w16cid:durableId="472140760">
-    <w:abstractNumId w:val="23"/>
-    <w:lvlOverride w:ilvl="0">
-      <w:startOverride w:val="1"/>
-    </w:lvlOverride>
-  </w:num>
-  <w:num w:numId="22" w16cid:durableId="1720206920">
-    <w:abstractNumId w:val="21"/>
-    <w:lvlOverride w:ilvl="0">
-      <w:startOverride w:val="1"/>
-    </w:lvlOverride>
-  </w:num>
-  <w:num w:numId="23" w16cid:durableId="1741518790">
-    <w:abstractNumId w:val="7"/>
-    <w:lvlOverride w:ilvl="0">
-      <w:startOverride w:val="1"/>
-    </w:lvlOverride>
-  </w:num>
-  <w:num w:numId="24" w16cid:durableId="1283728950">
-    <w:abstractNumId w:val="1"/>
-    <w:lvlOverride w:ilvl="0">
-      <w:startOverride w:val="1"/>
-    </w:lvlOverride>
-  </w:num>
-  <w:num w:numId="25" w16cid:durableId="1660767600">
-    <w:abstractNumId w:val="19"/>
+  <w:num w:numId="25" w16cid:durableId="1483351144">
+    <w:abstractNumId w:val="4"/>
     <w:lvlOverride w:ilvl="0">
       <w:startOverride w:val="1"/>
     </w:lvlOverride>
@@ -23829,7 +23829,7 @@
     <w:autoRedefine/>
     <w:uiPriority w:val="39"/>
     <w:unhideWhenUsed/>
-    <w:rsid w:val="00506FF7"/>
+    <w:rsid w:val="00030B9E"/>
     <w:pPr>
       <w:spacing w:after="100"/>
     </w:pPr>
@@ -23841,7 +23841,7 @@
     <w:autoRedefine/>
     <w:uiPriority w:val="39"/>
     <w:unhideWhenUsed/>
-    <w:rsid w:val="00506FF7"/>
+    <w:rsid w:val="00030B9E"/>
     <w:pPr>
       <w:spacing w:after="100"/>
       <w:ind w:left="210"/>

</xml_diff>

<commit_message>
docs: manuals updated for whole-document (in parts) Auto-fill; retaken screenshots (v1.3)
Co-Authored-By: Claude Sonnet 5 <noreply@anthropic.com>
</commit_message>
<xml_diff>
--- a/docs/manuals/RA_Training_Manual.docx
+++ b/docs/manuals/RA_Training_Manual.docx
@@ -469,7 +469,7 @@
                 <w:sz w:val="19"/>
                 <w:szCs w:val="19"/>
               </w:rPr>
-              <w:t>Version 1.2 · 20 September 2026</w:t>
+              <w:t>Version 1.3 · 20 September 2026</w:t>
             </w:r>
           </w:p>
         </w:tc>
@@ -538,7 +538,7 @@
     <w:sdt>
       <w:sdtPr>
         <w:alias w:val="Contents"/>
-        <w:id w:val="-1278561249"/>
+        <w:id w:val="800808880"/>
       </w:sdtPr>
       <w:sdtEndPr/>
       <w:sdtContent>
@@ -567,7 +567,7 @@
           <w:r>
             <w:fldChar w:fldCharType="separate"/>
           </w:r>
-          <w:hyperlink w:anchor="_Toc240758992" w:history="1">
+          <w:hyperlink w:anchor="_Toc240767618" w:history="1">
             <w:r>
               <w:rPr>
                 <w:rStyle w:val="Hyperlink"/>
@@ -591,7 +591,7 @@
               <w:rPr>
                 <w:noProof/>
               </w:rPr>
-              <w:instrText xml:space="preserve"> PAGEREF _Toc240758992 \h </w:instrText>
+              <w:instrText xml:space="preserve"> PAGEREF _Toc240767618 \h </w:instrText>
             </w:r>
             <w:r>
               <w:rPr>
@@ -634,7 +634,7 @@
               <w14:ligatures w14:val="standardContextual"/>
             </w:rPr>
           </w:pPr>
-          <w:hyperlink w:anchor="_Toc240758993" w:history="1">
+          <w:hyperlink w:anchor="_Toc240767619" w:history="1">
             <w:r>
               <w:rPr>
                 <w:rStyle w:val="Hyperlink"/>
@@ -658,7 +658,7 @@
               <w:rPr>
                 <w:noProof/>
               </w:rPr>
-              <w:instrText xml:space="preserve"> PAGEREF _Toc240758993 \h </w:instrText>
+              <w:instrText xml:space="preserve"> PAGEREF _Toc240767619 \h </w:instrText>
             </w:r>
             <w:r>
               <w:rPr>
@@ -701,7 +701,7 @@
               <w14:ligatures w14:val="standardContextual"/>
             </w:rPr>
           </w:pPr>
-          <w:hyperlink w:anchor="_Toc240758994" w:history="1">
+          <w:hyperlink w:anchor="_Toc240767620" w:history="1">
             <w:r>
               <w:rPr>
                 <w:rStyle w:val="Hyperlink"/>
@@ -725,7 +725,7 @@
               <w:rPr>
                 <w:noProof/>
               </w:rPr>
-              <w:instrText xml:space="preserve"> PAGEREF _Toc240758994 \h </w:instrText>
+              <w:instrText xml:space="preserve"> PAGEREF _Toc240767620 \h </w:instrText>
             </w:r>
             <w:r>
               <w:rPr>
@@ -768,7 +768,7 @@
               <w14:ligatures w14:val="standardContextual"/>
             </w:rPr>
           </w:pPr>
-          <w:hyperlink w:anchor="_Toc240758995" w:history="1">
+          <w:hyperlink w:anchor="_Toc240767621" w:history="1">
             <w:r>
               <w:rPr>
                 <w:rStyle w:val="Hyperlink"/>
@@ -792,7 +792,7 @@
               <w:rPr>
                 <w:noProof/>
               </w:rPr>
-              <w:instrText xml:space="preserve"> PAGEREF _Toc240758995 \h </w:instrText>
+              <w:instrText xml:space="preserve"> PAGEREF _Toc240767621 \h </w:instrText>
             </w:r>
             <w:r>
               <w:rPr>
@@ -835,7 +835,7 @@
               <w14:ligatures w14:val="standardContextual"/>
             </w:rPr>
           </w:pPr>
-          <w:hyperlink w:anchor="_Toc240758996" w:history="1">
+          <w:hyperlink w:anchor="_Toc240767622" w:history="1">
             <w:r>
               <w:rPr>
                 <w:rStyle w:val="Hyperlink"/>
@@ -859,7 +859,7 @@
               <w:rPr>
                 <w:noProof/>
               </w:rPr>
-              <w:instrText xml:space="preserve"> PAGEREF _Toc240758996 \h </w:instrText>
+              <w:instrText xml:space="preserve"> PAGEREF _Toc240767622 \h </w:instrText>
             </w:r>
             <w:r>
               <w:rPr>
@@ -902,7 +902,7 @@
               <w14:ligatures w14:val="standardContextual"/>
             </w:rPr>
           </w:pPr>
-          <w:hyperlink w:anchor="_Toc240758997" w:history="1">
+          <w:hyperlink w:anchor="_Toc240767623" w:history="1">
             <w:r>
               <w:rPr>
                 <w:rStyle w:val="Hyperlink"/>
@@ -926,7 +926,7 @@
               <w:rPr>
                 <w:noProof/>
               </w:rPr>
-              <w:instrText xml:space="preserve"> PAGEREF _Toc240758997 \h </w:instrText>
+              <w:instrText xml:space="preserve"> PAGEREF _Toc240767623 \h </w:instrText>
             </w:r>
             <w:r>
               <w:rPr>
@@ -969,7 +969,7 @@
               <w14:ligatures w14:val="standardContextual"/>
             </w:rPr>
           </w:pPr>
-          <w:hyperlink w:anchor="_Toc240758998" w:history="1">
+          <w:hyperlink w:anchor="_Toc240767624" w:history="1">
             <w:r>
               <w:rPr>
                 <w:rStyle w:val="Hyperlink"/>
@@ -993,7 +993,7 @@
               <w:rPr>
                 <w:noProof/>
               </w:rPr>
-              <w:instrText xml:space="preserve"> PAGEREF _Toc240758998 \h </w:instrText>
+              <w:instrText xml:space="preserve"> PAGEREF _Toc240767624 \h </w:instrText>
             </w:r>
             <w:r>
               <w:rPr>
@@ -1036,7 +1036,7 @@
               <w14:ligatures w14:val="standardContextual"/>
             </w:rPr>
           </w:pPr>
-          <w:hyperlink w:anchor="_Toc240758999" w:history="1">
+          <w:hyperlink w:anchor="_Toc240767625" w:history="1">
             <w:r>
               <w:rPr>
                 <w:rStyle w:val="Hyperlink"/>
@@ -1060,7 +1060,7 @@
               <w:rPr>
                 <w:noProof/>
               </w:rPr>
-              <w:instrText xml:space="preserve"> PAGEREF _Toc240758999 \h </w:instrText>
+              <w:instrText xml:space="preserve"> PAGEREF _Toc240767625 \h </w:instrText>
             </w:r>
             <w:r>
               <w:rPr>
@@ -1103,7 +1103,7 @@
               <w14:ligatures w14:val="standardContextual"/>
             </w:rPr>
           </w:pPr>
-          <w:hyperlink w:anchor="_Toc240759000" w:history="1">
+          <w:hyperlink w:anchor="_Toc240767626" w:history="1">
             <w:r>
               <w:rPr>
                 <w:rStyle w:val="Hyperlink"/>
@@ -1127,7 +1127,7 @@
               <w:rPr>
                 <w:noProof/>
               </w:rPr>
-              <w:instrText xml:space="preserve"> PAGEREF _Toc240759000 \h </w:instrText>
+              <w:instrText xml:space="preserve"> PAGEREF _Toc240767626 \h </w:instrText>
             </w:r>
             <w:r>
               <w:rPr>
@@ -1170,7 +1170,7 @@
               <w14:ligatures w14:val="standardContextual"/>
             </w:rPr>
           </w:pPr>
-          <w:hyperlink w:anchor="_Toc240759001" w:history="1">
+          <w:hyperlink w:anchor="_Toc240767627" w:history="1">
             <w:r>
               <w:rPr>
                 <w:rStyle w:val="Hyperlink"/>
@@ -1194,7 +1194,7 @@
               <w:rPr>
                 <w:noProof/>
               </w:rPr>
-              <w:instrText xml:space="preserve"> PAGEREF _Toc240759001 \h </w:instrText>
+              <w:instrText xml:space="preserve"> PAGEREF _Toc240767627 \h </w:instrText>
             </w:r>
             <w:r>
               <w:rPr>
@@ -1237,7 +1237,7 @@
               <w14:ligatures w14:val="standardContextual"/>
             </w:rPr>
           </w:pPr>
-          <w:hyperlink w:anchor="_Toc240759002" w:history="1">
+          <w:hyperlink w:anchor="_Toc240767628" w:history="1">
             <w:r>
               <w:rPr>
                 <w:rStyle w:val="Hyperlink"/>
@@ -1261,7 +1261,7 @@
               <w:rPr>
                 <w:noProof/>
               </w:rPr>
-              <w:instrText xml:space="preserve"> PAGEREF _Toc240759002 \h </w:instrText>
+              <w:instrText xml:space="preserve"> PAGEREF _Toc240767628 \h </w:instrText>
             </w:r>
             <w:r>
               <w:rPr>
@@ -1304,7 +1304,7 @@
               <w14:ligatures w14:val="standardContextual"/>
             </w:rPr>
           </w:pPr>
-          <w:hyperlink w:anchor="_Toc240759003" w:history="1">
+          <w:hyperlink w:anchor="_Toc240767629" w:history="1">
             <w:r>
               <w:rPr>
                 <w:rStyle w:val="Hyperlink"/>
@@ -1328,7 +1328,7 @@
               <w:rPr>
                 <w:noProof/>
               </w:rPr>
-              <w:instrText xml:space="preserve"> PAGEREF _Toc240759003 \h </w:instrText>
+              <w:instrText xml:space="preserve"> PAGEREF _Toc240767629 \h </w:instrText>
             </w:r>
             <w:r>
               <w:rPr>
@@ -1371,7 +1371,7 @@
               <w14:ligatures w14:val="standardContextual"/>
             </w:rPr>
           </w:pPr>
-          <w:hyperlink w:anchor="_Toc240759004" w:history="1">
+          <w:hyperlink w:anchor="_Toc240767630" w:history="1">
             <w:r>
               <w:rPr>
                 <w:rStyle w:val="Hyperlink"/>
@@ -1395,7 +1395,7 @@
               <w:rPr>
                 <w:noProof/>
               </w:rPr>
-              <w:instrText xml:space="preserve"> PAGEREF _Toc240759004 \h </w:instrText>
+              <w:instrText xml:space="preserve"> PAGEREF _Toc240767630 \h </w:instrText>
             </w:r>
             <w:r>
               <w:rPr>
@@ -1438,7 +1438,7 @@
               <w14:ligatures w14:val="standardContextual"/>
             </w:rPr>
           </w:pPr>
-          <w:hyperlink w:anchor="_Toc240759005" w:history="1">
+          <w:hyperlink w:anchor="_Toc240767631" w:history="1">
             <w:r>
               <w:rPr>
                 <w:rStyle w:val="Hyperlink"/>
@@ -1462,7 +1462,7 @@
               <w:rPr>
                 <w:noProof/>
               </w:rPr>
-              <w:instrText xml:space="preserve"> PAGEREF _Toc240759005 \h </w:instrText>
+              <w:instrText xml:space="preserve"> PAGEREF _Toc240767631 \h </w:instrText>
             </w:r>
             <w:r>
               <w:rPr>
@@ -1505,7 +1505,7 @@
               <w14:ligatures w14:val="standardContextual"/>
             </w:rPr>
           </w:pPr>
-          <w:hyperlink w:anchor="_Toc240759006" w:history="1">
+          <w:hyperlink w:anchor="_Toc240767632" w:history="1">
             <w:r>
               <w:rPr>
                 <w:rStyle w:val="Hyperlink"/>
@@ -1529,7 +1529,7 @@
               <w:rPr>
                 <w:noProof/>
               </w:rPr>
-              <w:instrText xml:space="preserve"> PAGEREF _Toc240759006 \h </w:instrText>
+              <w:instrText xml:space="preserve"> PAGEREF _Toc240767632 \h </w:instrText>
             </w:r>
             <w:r>
               <w:rPr>
@@ -1572,7 +1572,7 @@
               <w14:ligatures w14:val="standardContextual"/>
             </w:rPr>
           </w:pPr>
-          <w:hyperlink w:anchor="_Toc240759007" w:history="1">
+          <w:hyperlink w:anchor="_Toc240767633" w:history="1">
             <w:r>
               <w:rPr>
                 <w:rStyle w:val="Hyperlink"/>
@@ -1596,7 +1596,7 @@
               <w:rPr>
                 <w:noProof/>
               </w:rPr>
-              <w:instrText xml:space="preserve"> PAGEREF _Toc240759007 \h </w:instrText>
+              <w:instrText xml:space="preserve"> PAGEREF _Toc240767633 \h </w:instrText>
             </w:r>
             <w:r>
               <w:rPr>
@@ -1639,7 +1639,7 @@
               <w14:ligatures w14:val="standardContextual"/>
             </w:rPr>
           </w:pPr>
-          <w:hyperlink w:anchor="_Toc240759008" w:history="1">
+          <w:hyperlink w:anchor="_Toc240767634" w:history="1">
             <w:r>
               <w:rPr>
                 <w:rStyle w:val="Hyperlink"/>
@@ -1663,7 +1663,7 @@
               <w:rPr>
                 <w:noProof/>
               </w:rPr>
-              <w:instrText xml:space="preserve"> PAGEREF _Toc240759008 \h </w:instrText>
+              <w:instrText xml:space="preserve"> PAGEREF _Toc240767634 \h </w:instrText>
             </w:r>
             <w:r>
               <w:rPr>
@@ -1706,7 +1706,7 @@
               <w14:ligatures w14:val="standardContextual"/>
             </w:rPr>
           </w:pPr>
-          <w:hyperlink w:anchor="_Toc240759009" w:history="1">
+          <w:hyperlink w:anchor="_Toc240767635" w:history="1">
             <w:r>
               <w:rPr>
                 <w:rStyle w:val="Hyperlink"/>
@@ -1730,7 +1730,7 @@
               <w:rPr>
                 <w:noProof/>
               </w:rPr>
-              <w:instrText xml:space="preserve"> PAGEREF _Toc240759009 \h </w:instrText>
+              <w:instrText xml:space="preserve"> PAGEREF _Toc240767635 \h </w:instrText>
             </w:r>
             <w:r>
               <w:rPr>
@@ -1773,7 +1773,7 @@
               <w14:ligatures w14:val="standardContextual"/>
             </w:rPr>
           </w:pPr>
-          <w:hyperlink w:anchor="_Toc240759010" w:history="1">
+          <w:hyperlink w:anchor="_Toc240767636" w:history="1">
             <w:r>
               <w:rPr>
                 <w:rStyle w:val="Hyperlink"/>
@@ -1797,7 +1797,7 @@
               <w:rPr>
                 <w:noProof/>
               </w:rPr>
-              <w:instrText xml:space="preserve"> PAGEREF _Toc240759010 \h </w:instrText>
+              <w:instrText xml:space="preserve"> PAGEREF _Toc240767636 \h </w:instrText>
             </w:r>
             <w:r>
               <w:rPr>
@@ -1840,7 +1840,7 @@
               <w14:ligatures w14:val="standardContextual"/>
             </w:rPr>
           </w:pPr>
-          <w:hyperlink w:anchor="_Toc240759011" w:history="1">
+          <w:hyperlink w:anchor="_Toc240767637" w:history="1">
             <w:r>
               <w:rPr>
                 <w:rStyle w:val="Hyperlink"/>
@@ -1864,7 +1864,7 @@
               <w:rPr>
                 <w:noProof/>
               </w:rPr>
-              <w:instrText xml:space="preserve"> PAGEREF _Toc240759011 \h </w:instrText>
+              <w:instrText xml:space="preserve"> PAGEREF _Toc240767637 \h </w:instrText>
             </w:r>
             <w:r>
               <w:rPr>
@@ -1907,7 +1907,7 @@
               <w14:ligatures w14:val="standardContextual"/>
             </w:rPr>
           </w:pPr>
-          <w:hyperlink w:anchor="_Toc240759012" w:history="1">
+          <w:hyperlink w:anchor="_Toc240767638" w:history="1">
             <w:r>
               <w:rPr>
                 <w:rStyle w:val="Hyperlink"/>
@@ -1931,7 +1931,7 @@
               <w:rPr>
                 <w:noProof/>
               </w:rPr>
-              <w:instrText xml:space="preserve"> PAGEREF _Toc240759012 \h </w:instrText>
+              <w:instrText xml:space="preserve"> PAGEREF _Toc240767638 \h </w:instrText>
             </w:r>
             <w:r>
               <w:rPr>
@@ -1974,7 +1974,7 @@
               <w14:ligatures w14:val="standardContextual"/>
             </w:rPr>
           </w:pPr>
-          <w:hyperlink w:anchor="_Toc240759013" w:history="1">
+          <w:hyperlink w:anchor="_Toc240767639" w:history="1">
             <w:r>
               <w:rPr>
                 <w:rStyle w:val="Hyperlink"/>
@@ -1998,7 +1998,7 @@
               <w:rPr>
                 <w:noProof/>
               </w:rPr>
-              <w:instrText xml:space="preserve"> PAGEREF _Toc240759013 \h </w:instrText>
+              <w:instrText xml:space="preserve"> PAGEREF _Toc240767639 \h </w:instrText>
             </w:r>
             <w:r>
               <w:rPr>
@@ -2041,7 +2041,7 @@
               <w14:ligatures w14:val="standardContextual"/>
             </w:rPr>
           </w:pPr>
-          <w:hyperlink w:anchor="_Toc240759014" w:history="1">
+          <w:hyperlink w:anchor="_Toc240767640" w:history="1">
             <w:r>
               <w:rPr>
                 <w:rStyle w:val="Hyperlink"/>
@@ -2065,7 +2065,7 @@
               <w:rPr>
                 <w:noProof/>
               </w:rPr>
-              <w:instrText xml:space="preserve"> PAGEREF _Toc240759014 \h </w:instrText>
+              <w:instrText xml:space="preserve"> PAGEREF _Toc240767640 \h </w:instrText>
             </w:r>
             <w:r>
               <w:rPr>
@@ -2108,7 +2108,7 @@
               <w14:ligatures w14:val="standardContextual"/>
             </w:rPr>
           </w:pPr>
-          <w:hyperlink w:anchor="_Toc240759015" w:history="1">
+          <w:hyperlink w:anchor="_Toc240767641" w:history="1">
             <w:r>
               <w:rPr>
                 <w:rStyle w:val="Hyperlink"/>
@@ -2132,7 +2132,7 @@
               <w:rPr>
                 <w:noProof/>
               </w:rPr>
-              <w:instrText xml:space="preserve"> PAGEREF _Toc240759015 \h </w:instrText>
+              <w:instrText xml:space="preserve"> PAGEREF _Toc240767641 \h </w:instrText>
             </w:r>
             <w:r>
               <w:rPr>
@@ -2175,7 +2175,7 @@
               <w14:ligatures w14:val="standardContextual"/>
             </w:rPr>
           </w:pPr>
-          <w:hyperlink w:anchor="_Toc240759016" w:history="1">
+          <w:hyperlink w:anchor="_Toc240767642" w:history="1">
             <w:r>
               <w:rPr>
                 <w:rStyle w:val="Hyperlink"/>
@@ -2199,7 +2199,7 @@
               <w:rPr>
                 <w:noProof/>
               </w:rPr>
-              <w:instrText xml:space="preserve"> PAGEREF _Toc240759016 \h </w:instrText>
+              <w:instrText xml:space="preserve"> PAGEREF _Toc240767642 \h </w:instrText>
             </w:r>
             <w:r>
               <w:rPr>
@@ -2242,7 +2242,7 @@
               <w14:ligatures w14:val="standardContextual"/>
             </w:rPr>
           </w:pPr>
-          <w:hyperlink w:anchor="_Toc240759017" w:history="1">
+          <w:hyperlink w:anchor="_Toc240767643" w:history="1">
             <w:r>
               <w:rPr>
                 <w:rStyle w:val="Hyperlink"/>
@@ -2266,7 +2266,7 @@
               <w:rPr>
                 <w:noProof/>
               </w:rPr>
-              <w:instrText xml:space="preserve"> PAGEREF _Toc240759017 \h </w:instrText>
+              <w:instrText xml:space="preserve"> PAGEREF _Toc240767643 \h </w:instrText>
             </w:r>
             <w:r>
               <w:rPr>
@@ -2309,7 +2309,7 @@
               <w14:ligatures w14:val="standardContextual"/>
             </w:rPr>
           </w:pPr>
-          <w:hyperlink w:anchor="_Toc240759018" w:history="1">
+          <w:hyperlink w:anchor="_Toc240767644" w:history="1">
             <w:r>
               <w:rPr>
                 <w:rStyle w:val="Hyperlink"/>
@@ -2333,7 +2333,7 @@
               <w:rPr>
                 <w:noProof/>
               </w:rPr>
-              <w:instrText xml:space="preserve"> PAGEREF _Toc240759018 \h </w:instrText>
+              <w:instrText xml:space="preserve"> PAGEREF _Toc240767644 \h </w:instrText>
             </w:r>
             <w:r>
               <w:rPr>
@@ -2376,7 +2376,7 @@
               <w14:ligatures w14:val="standardContextual"/>
             </w:rPr>
           </w:pPr>
-          <w:hyperlink w:anchor="_Toc240759019" w:history="1">
+          <w:hyperlink w:anchor="_Toc240767645" w:history="1">
             <w:r>
               <w:rPr>
                 <w:rStyle w:val="Hyperlink"/>
@@ -2400,7 +2400,7 @@
               <w:rPr>
                 <w:noProof/>
               </w:rPr>
-              <w:instrText xml:space="preserve"> PAGEREF _Toc240759019 \h </w:instrText>
+              <w:instrText xml:space="preserve"> PAGEREF _Toc240767645 \h </w:instrText>
             </w:r>
             <w:r>
               <w:rPr>
@@ -2443,7 +2443,7 @@
               <w14:ligatures w14:val="standardContextual"/>
             </w:rPr>
           </w:pPr>
-          <w:hyperlink w:anchor="_Toc240759020" w:history="1">
+          <w:hyperlink w:anchor="_Toc240767646" w:history="1">
             <w:r>
               <w:rPr>
                 <w:rStyle w:val="Hyperlink"/>
@@ -2467,7 +2467,7 @@
               <w:rPr>
                 <w:noProof/>
               </w:rPr>
-              <w:instrText xml:space="preserve"> PAGEREF _Toc240759020 \h </w:instrText>
+              <w:instrText xml:space="preserve"> PAGEREF _Toc240767646 \h </w:instrText>
             </w:r>
             <w:r>
               <w:rPr>
@@ -2484,7 +2484,7 @@
               <w:rPr>
                 <w:noProof/>
               </w:rPr>
-              <w:t>29</w:t>
+              <w:t>30</w:t>
             </w:r>
             <w:r>
               <w:rPr>
@@ -2510,7 +2510,7 @@
               <w14:ligatures w14:val="standardContextual"/>
             </w:rPr>
           </w:pPr>
-          <w:hyperlink w:anchor="_Toc240759021" w:history="1">
+          <w:hyperlink w:anchor="_Toc240767647" w:history="1">
             <w:r>
               <w:rPr>
                 <w:rStyle w:val="Hyperlink"/>
@@ -2534,7 +2534,7 @@
               <w:rPr>
                 <w:noProof/>
               </w:rPr>
-              <w:instrText xml:space="preserve"> PAGEREF _Toc240759021 \h </w:instrText>
+              <w:instrText xml:space="preserve"> PAGEREF _Toc240767647 \h </w:instrText>
             </w:r>
             <w:r>
               <w:rPr>
@@ -2551,7 +2551,7 @@
               <w:rPr>
                 <w:noProof/>
               </w:rPr>
-              <w:t>30</w:t>
+              <w:t>31</w:t>
             </w:r>
             <w:r>
               <w:rPr>
@@ -2577,7 +2577,7 @@
               <w14:ligatures w14:val="standardContextual"/>
             </w:rPr>
           </w:pPr>
-          <w:hyperlink w:anchor="_Toc240759022" w:history="1">
+          <w:hyperlink w:anchor="_Toc240767648" w:history="1">
             <w:r>
               <w:rPr>
                 <w:rStyle w:val="Hyperlink"/>
@@ -2601,7 +2601,7 @@
               <w:rPr>
                 <w:noProof/>
               </w:rPr>
-              <w:instrText xml:space="preserve"> PAGEREF _Toc240759022 \h </w:instrText>
+              <w:instrText xml:space="preserve"> PAGEREF _Toc240767648 \h </w:instrText>
             </w:r>
             <w:r>
               <w:rPr>
@@ -2618,7 +2618,7 @@
               <w:rPr>
                 <w:noProof/>
               </w:rPr>
-              <w:t>30</w:t>
+              <w:t>31</w:t>
             </w:r>
             <w:r>
               <w:rPr>
@@ -2644,7 +2644,7 @@
               <w14:ligatures w14:val="standardContextual"/>
             </w:rPr>
           </w:pPr>
-          <w:hyperlink w:anchor="_Toc240759023" w:history="1">
+          <w:hyperlink w:anchor="_Toc240767649" w:history="1">
             <w:r>
               <w:rPr>
                 <w:rStyle w:val="Hyperlink"/>
@@ -2668,7 +2668,7 @@
               <w:rPr>
                 <w:noProof/>
               </w:rPr>
-              <w:instrText xml:space="preserve"> PAGEREF _Toc240759023 \h </w:instrText>
+              <w:instrText xml:space="preserve"> PAGEREF _Toc240767649 \h </w:instrText>
             </w:r>
             <w:r>
               <w:rPr>
@@ -2685,7 +2685,7 @@
               <w:rPr>
                 <w:noProof/>
               </w:rPr>
-              <w:t>30</w:t>
+              <w:t>31</w:t>
             </w:r>
             <w:r>
               <w:rPr>
@@ -2711,7 +2711,7 @@
               <w14:ligatures w14:val="standardContextual"/>
             </w:rPr>
           </w:pPr>
-          <w:hyperlink w:anchor="_Toc240759024" w:history="1">
+          <w:hyperlink w:anchor="_Toc240767650" w:history="1">
             <w:r>
               <w:rPr>
                 <w:rStyle w:val="Hyperlink"/>
@@ -2735,7 +2735,7 @@
               <w:rPr>
                 <w:noProof/>
               </w:rPr>
-              <w:instrText xml:space="preserve"> PAGEREF _Toc240759024 \h </w:instrText>
+              <w:instrText xml:space="preserve"> PAGEREF _Toc240767650 \h </w:instrText>
             </w:r>
             <w:r>
               <w:rPr>
@@ -2752,7 +2752,7 @@
               <w:rPr>
                 <w:noProof/>
               </w:rPr>
-              <w:t>30</w:t>
+              <w:t>31</w:t>
             </w:r>
             <w:r>
               <w:rPr>
@@ -2778,7 +2778,7 @@
               <w14:ligatures w14:val="standardContextual"/>
             </w:rPr>
           </w:pPr>
-          <w:hyperlink w:anchor="_Toc240759025" w:history="1">
+          <w:hyperlink w:anchor="_Toc240767651" w:history="1">
             <w:r>
               <w:rPr>
                 <w:rStyle w:val="Hyperlink"/>
@@ -2802,7 +2802,7 @@
               <w:rPr>
                 <w:noProof/>
               </w:rPr>
-              <w:instrText xml:space="preserve"> PAGEREF _Toc240759025 \h </w:instrText>
+              <w:instrText xml:space="preserve"> PAGEREF _Toc240767651 \h </w:instrText>
             </w:r>
             <w:r>
               <w:rPr>
@@ -2819,7 +2819,7 @@
               <w:rPr>
                 <w:noProof/>
               </w:rPr>
-              <w:t>30</w:t>
+              <w:t>31</w:t>
             </w:r>
             <w:r>
               <w:rPr>
@@ -2845,7 +2845,7 @@
               <w14:ligatures w14:val="standardContextual"/>
             </w:rPr>
           </w:pPr>
-          <w:hyperlink w:anchor="_Toc240759026" w:history="1">
+          <w:hyperlink w:anchor="_Toc240767652" w:history="1">
             <w:r>
               <w:rPr>
                 <w:rStyle w:val="Hyperlink"/>
@@ -2869,7 +2869,7 @@
               <w:rPr>
                 <w:noProof/>
               </w:rPr>
-              <w:instrText xml:space="preserve"> PAGEREF _Toc240759026 \h </w:instrText>
+              <w:instrText xml:space="preserve"> PAGEREF _Toc240767652 \h </w:instrText>
             </w:r>
             <w:r>
               <w:rPr>
@@ -2886,7 +2886,7 @@
               <w:rPr>
                 <w:noProof/>
               </w:rPr>
-              <w:t>30</w:t>
+              <w:t>31</w:t>
             </w:r>
             <w:r>
               <w:rPr>
@@ -2912,7 +2912,7 @@
               <w14:ligatures w14:val="standardContextual"/>
             </w:rPr>
           </w:pPr>
-          <w:hyperlink w:anchor="_Toc240759027" w:history="1">
+          <w:hyperlink w:anchor="_Toc240767653" w:history="1">
             <w:r>
               <w:rPr>
                 <w:rStyle w:val="Hyperlink"/>
@@ -2936,7 +2936,7 @@
               <w:rPr>
                 <w:noProof/>
               </w:rPr>
-              <w:instrText xml:space="preserve"> PAGEREF _Toc240759027 \h </w:instrText>
+              <w:instrText xml:space="preserve"> PAGEREF _Toc240767653 \h </w:instrText>
             </w:r>
             <w:r>
               <w:rPr>
@@ -2953,7 +2953,7 @@
               <w:rPr>
                 <w:noProof/>
               </w:rPr>
-              <w:t>32</w:t>
+              <w:t>33</w:t>
             </w:r>
             <w:r>
               <w:rPr>
@@ -2979,7 +2979,7 @@
               <w14:ligatures w14:val="standardContextual"/>
             </w:rPr>
           </w:pPr>
-          <w:hyperlink w:anchor="_Toc240759028" w:history="1">
+          <w:hyperlink w:anchor="_Toc240767654" w:history="1">
             <w:r>
               <w:rPr>
                 <w:rStyle w:val="Hyperlink"/>
@@ -3003,7 +3003,7 @@
               <w:rPr>
                 <w:noProof/>
               </w:rPr>
-              <w:instrText xml:space="preserve"> PAGEREF _Toc240759028 \h </w:instrText>
+              <w:instrText xml:space="preserve"> PAGEREF _Toc240767654 \h </w:instrText>
             </w:r>
             <w:r>
               <w:rPr>
@@ -3020,7 +3020,7 @@
               <w:rPr>
                 <w:noProof/>
               </w:rPr>
-              <w:t>32</w:t>
+              <w:t>33</w:t>
             </w:r>
             <w:r>
               <w:rPr>
@@ -3046,7 +3046,7 @@
               <w14:ligatures w14:val="standardContextual"/>
             </w:rPr>
           </w:pPr>
-          <w:hyperlink w:anchor="_Toc240759029" w:history="1">
+          <w:hyperlink w:anchor="_Toc240767655" w:history="1">
             <w:r>
               <w:rPr>
                 <w:rStyle w:val="Hyperlink"/>
@@ -3070,7 +3070,7 @@
               <w:rPr>
                 <w:noProof/>
               </w:rPr>
-              <w:instrText xml:space="preserve"> PAGEREF _Toc240759029 \h </w:instrText>
+              <w:instrText xml:space="preserve"> PAGEREF _Toc240767655 \h </w:instrText>
             </w:r>
             <w:r>
               <w:rPr>
@@ -3087,7 +3087,7 @@
               <w:rPr>
                 <w:noProof/>
               </w:rPr>
-              <w:t>32</w:t>
+              <w:t>33</w:t>
             </w:r>
             <w:r>
               <w:rPr>
@@ -3113,7 +3113,7 @@
               <w14:ligatures w14:val="standardContextual"/>
             </w:rPr>
           </w:pPr>
-          <w:hyperlink w:anchor="_Toc240759030" w:history="1">
+          <w:hyperlink w:anchor="_Toc240767656" w:history="1">
             <w:r>
               <w:rPr>
                 <w:rStyle w:val="Hyperlink"/>
@@ -3137,7 +3137,7 @@
               <w:rPr>
                 <w:noProof/>
               </w:rPr>
-              <w:instrText xml:space="preserve"> PAGEREF _Toc240759030 \h </w:instrText>
+              <w:instrText xml:space="preserve"> PAGEREF _Toc240767656 \h </w:instrText>
             </w:r>
             <w:r>
               <w:rPr>
@@ -3154,7 +3154,7 @@
               <w:rPr>
                 <w:noProof/>
               </w:rPr>
-              <w:t>32</w:t>
+              <w:t>33</w:t>
             </w:r>
             <w:r>
               <w:rPr>
@@ -3180,7 +3180,7 @@
               <w14:ligatures w14:val="standardContextual"/>
             </w:rPr>
           </w:pPr>
-          <w:hyperlink w:anchor="_Toc240759031" w:history="1">
+          <w:hyperlink w:anchor="_Toc240767657" w:history="1">
             <w:r>
               <w:rPr>
                 <w:rStyle w:val="Hyperlink"/>
@@ -3204,7 +3204,7 @@
               <w:rPr>
                 <w:noProof/>
               </w:rPr>
-              <w:instrText xml:space="preserve"> PAGEREF _Toc240759031 \h </w:instrText>
+              <w:instrText xml:space="preserve"> PAGEREF _Toc240767657 \h </w:instrText>
             </w:r>
             <w:r>
               <w:rPr>
@@ -3221,7 +3221,7 @@
               <w:rPr>
                 <w:noProof/>
               </w:rPr>
-              <w:t>33</w:t>
+              <w:t>34</w:t>
             </w:r>
             <w:r>
               <w:rPr>
@@ -3247,7 +3247,7 @@
               <w14:ligatures w14:val="standardContextual"/>
             </w:rPr>
           </w:pPr>
-          <w:hyperlink w:anchor="_Toc240759032" w:history="1">
+          <w:hyperlink w:anchor="_Toc240767658" w:history="1">
             <w:r>
               <w:rPr>
                 <w:rStyle w:val="Hyperlink"/>
@@ -3271,7 +3271,7 @@
               <w:rPr>
                 <w:noProof/>
               </w:rPr>
-              <w:instrText xml:space="preserve"> PAGEREF _Toc240759032 \h </w:instrText>
+              <w:instrText xml:space="preserve"> PAGEREF _Toc240767658 \h </w:instrText>
             </w:r>
             <w:r>
               <w:rPr>
@@ -3288,7 +3288,7 @@
               <w:rPr>
                 <w:noProof/>
               </w:rPr>
-              <w:t>35</w:t>
+              <w:t>36</w:t>
             </w:r>
             <w:r>
               <w:rPr>
@@ -3310,7 +3310,7 @@
         <w:pStyle w:val="Heading1"/>
         <w:pageBreakBefore/>
       </w:pPr>
-      <w:bookmarkStart w:id="0" w:name="_Toc240758992"/>
+      <w:bookmarkStart w:id="0" w:name="_Toc240767618"/>
       <w:r>
         <w:lastRenderedPageBreak/>
         <w:t>1. Welcome</w:t>
@@ -3339,7 +3339,7 @@
       <w:pPr>
         <w:pStyle w:val="Heading2"/>
       </w:pPr>
-      <w:bookmarkStart w:id="1" w:name="_Toc240758993"/>
+      <w:bookmarkStart w:id="1" w:name="_Toc240767619"/>
       <w:r>
         <w:t>How to use this manual</w:t>
       </w:r>
@@ -3406,7 +3406,7 @@
       <w:pPr>
         <w:pStyle w:val="Heading2"/>
       </w:pPr>
-      <w:bookmarkStart w:id="2" w:name="_Toc240758994"/>
+      <w:bookmarkStart w:id="2" w:name="_Toc240767620"/>
       <w:r>
         <w:t>Who to contact</w:t>
       </w:r>
@@ -3624,7 +3624,7 @@
         <w:pStyle w:val="Heading1"/>
         <w:pageBreakBefore/>
       </w:pPr>
-      <w:bookmarkStart w:id="3" w:name="_Toc240758995"/>
+      <w:bookmarkStart w:id="3" w:name="_Toc240767621"/>
       <w:r>
         <w:lastRenderedPageBreak/>
         <w:t>2. The study</w:t>
@@ -4220,7 +4220,7 @@
       <w:pPr>
         <w:pStyle w:val="Heading2"/>
       </w:pPr>
-      <w:bookmarkStart w:id="4" w:name="_Toc240758996"/>
+      <w:bookmarkStart w:id="4" w:name="_Toc240767622"/>
       <w:r>
         <w:t>Explaining the study in two minutes</w:t>
       </w:r>
@@ -4239,7 +4239,7 @@
         <w:pStyle w:val="Heading1"/>
         <w:pageBreakBefore/>
       </w:pPr>
-      <w:bookmarkStart w:id="5" w:name="_Toc240758997"/>
+      <w:bookmarkStart w:id="5" w:name="_Toc240767623"/>
       <w:r>
         <w:lastRenderedPageBreak/>
         <w:t>3. Ethics and data protection</w:t>
@@ -4250,7 +4250,7 @@
       <w:pPr>
         <w:pStyle w:val="Heading2"/>
       </w:pPr>
-      <w:bookmarkStart w:id="6" w:name="_Toc240758998"/>
+      <w:bookmarkStart w:id="6" w:name="_Toc240767624"/>
       <w:r>
         <w:t>3.1 Principles you must apply</w:t>
       </w:r>
@@ -4700,7 +4700,7 @@
       <w:pPr>
         <w:pStyle w:val="Heading2"/>
       </w:pPr>
-      <w:bookmarkStart w:id="7" w:name="_Toc240758999"/>
+      <w:bookmarkStart w:id="7" w:name="_Toc240767625"/>
       <w:r>
         <w:t>3.2 What respondents are told (PIS v1.3, summary)</w:t>
       </w:r>
@@ -4806,7 +4806,7 @@
       <w:pPr>
         <w:pStyle w:val="Heading2"/>
       </w:pPr>
-      <w:bookmarkStart w:id="8" w:name="_Toc240759000"/>
+      <w:bookmarkStart w:id="8" w:name="_Toc240767626"/>
       <w:r>
         <w:t>3.3 Data protection rules</w:t>
       </w:r>
@@ -4938,7 +4938,7 @@
       <w:pPr>
         <w:pStyle w:val="Heading2"/>
       </w:pPr>
-      <w:bookmarkStart w:id="9" w:name="_Toc240759001"/>
+      <w:bookmarkStart w:id="9" w:name="_Toc240767627"/>
       <w:r>
         <w:t>3.4 Your devices</w:t>
       </w:r>
@@ -5018,7 +5018,7 @@
       <w:pPr>
         <w:pStyle w:val="Heading2"/>
       </w:pPr>
-      <w:bookmarkStart w:id="10" w:name="_Toc240759002"/>
+      <w:bookmarkStart w:id="10" w:name="_Toc240767628"/>
       <w:r>
         <w:t>3.5 Conduct</w:t>
       </w:r>
@@ -5099,7 +5099,7 @@
         <w:pStyle w:val="Heading1"/>
         <w:pageBreakBefore/>
       </w:pPr>
-      <w:bookmarkStart w:id="11" w:name="_Toc240759003"/>
+      <w:bookmarkStart w:id="11" w:name="_Toc240767629"/>
       <w:r>
         <w:lastRenderedPageBreak/>
         <w:t>4. The portal and the forms</w:t>
@@ -5110,7 +5110,7 @@
       <w:pPr>
         <w:pStyle w:val="Heading2"/>
       </w:pPr>
-      <w:bookmarkStart w:id="12" w:name="_Toc240759004"/>
+      <w:bookmarkStart w:id="12" w:name="_Toc240767630"/>
       <w:r>
         <w:t>Signing in</w:t>
       </w:r>
@@ -5193,7 +5193,7 @@
           <w:noProof/>
         </w:rPr>
         <w:drawing>
-          <wp:inline distT="0" distB="0" distL="0" distR="0" wp14:anchorId="32A4CA14" wp14:editId="76E91E41">
+          <wp:inline distT="0" distB="0" distL="0" distR="0" wp14:anchorId="7C677C0A" wp14:editId="290E7788">
             <wp:extent cx="5334000" cy="2333625"/>
             <wp:effectExtent l="0" t="0" r="0" b="0"/>
             <wp:docPr id="1" name="adm_login.jpg" descr="The sign-in screen for all internal staff." title="The sign-in screen for all internal staff."/>
@@ -5360,7 +5360,7 @@
       <w:pPr>
         <w:pStyle w:val="Heading2"/>
       </w:pPr>
-      <w:bookmarkStart w:id="13" w:name="_Toc240759005"/>
+      <w:bookmarkStart w:id="13" w:name="_Toc240767631"/>
       <w:r>
         <w:t>Finding your way around</w:t>
       </w:r>
@@ -5535,7 +5535,7 @@
         </w:rPr>
         <w:lastRenderedPageBreak/>
         <w:drawing>
-          <wp:inline distT="0" distB="0" distL="0" distR="0" wp14:anchorId="683A9E45" wp14:editId="2BD6A43F">
+          <wp:inline distT="0" distB="0" distL="0" distR="0" wp14:anchorId="2B0C6577" wp14:editId="159D3D88">
             <wp:extent cx="5715000" cy="1876425"/>
             <wp:effectExtent l="0" t="0" r="0" b="0"/>
             <wp:docPr id="2" name="adm_not_your_role.jpg" descr="Opening a screen outside your role (for example from an old bookmark) shows this card instead of the screen." title="Opening a screen outside your role (for example from an old bookmark) shows this card instead of the screen."/>
@@ -5604,7 +5604,7 @@
       <w:pPr>
         <w:pStyle w:val="Heading2"/>
       </w:pPr>
-      <w:bookmarkStart w:id="14" w:name="_Toc240759006"/>
+      <w:bookmarkStart w:id="14" w:name="_Toc240767632"/>
       <w:r>
         <w:t>Roles</w:t>
       </w:r>
@@ -6386,7 +6386,7 @@
       <w:pPr>
         <w:pStyle w:val="Heading2"/>
       </w:pPr>
-      <w:bookmarkStart w:id="15" w:name="_Toc240759007"/>
+      <w:bookmarkStart w:id="15" w:name="_Toc240767633"/>
       <w:r>
         <w:t>Case statuses you will see</w:t>
       </w:r>
@@ -7901,7 +7901,7 @@
       <w:pPr>
         <w:pStyle w:val="Heading2"/>
       </w:pPr>
-      <w:bookmarkStart w:id="16" w:name="_Toc240759008"/>
+      <w:bookmarkStart w:id="16" w:name="_Toc240767634"/>
       <w:r>
         <w:t>The KoboToolbox forms</w:t>
       </w:r>
@@ -8345,7 +8345,7 @@
         <w:pStyle w:val="Heading1"/>
         <w:pageBreakBefore/>
       </w:pPr>
-      <w:bookmarkStart w:id="17" w:name="_Toc240759009"/>
+      <w:bookmarkStart w:id="17" w:name="_Toc240767635"/>
       <w:r>
         <w:lastRenderedPageBreak/>
         <w:t>5. Communication scripts</w:t>
@@ -8356,7 +8356,7 @@
       <w:pPr>
         <w:pStyle w:val="Heading2"/>
       </w:pPr>
-      <w:bookmarkStart w:id="18" w:name="_Toc240759010"/>
+      <w:bookmarkStart w:id="18" w:name="_Toc240767636"/>
       <w:r>
         <w:t>5.1 First phone call</w:t>
       </w:r>
@@ -8436,7 +8436,7 @@
       <w:pPr>
         <w:pStyle w:val="Heading2"/>
       </w:pPr>
-      <w:bookmarkStart w:id="19" w:name="_Toc240759011"/>
+      <w:bookmarkStart w:id="19" w:name="_Toc240767637"/>
       <w:r>
         <w:t>5.2 If they are busy</w:t>
       </w:r>
@@ -8454,7 +8454,7 @@
       <w:pPr>
         <w:pStyle w:val="Heading2"/>
       </w:pPr>
-      <w:bookmarkStart w:id="20" w:name="_Toc240759012"/>
+      <w:bookmarkStart w:id="20" w:name="_Toc240767638"/>
       <w:r>
         <w:t>5.3 Voicemail or no answer</w:t>
       </w:r>
@@ -8472,7 +8472,7 @@
       <w:pPr>
         <w:pStyle w:val="Heading2"/>
       </w:pPr>
-      <w:bookmarkStart w:id="21" w:name="_Toc240759013"/>
+      <w:bookmarkStart w:id="21" w:name="_Toc240767639"/>
       <w:r>
         <w:t>5.4 Common questions</w:t>
       </w:r>
@@ -8922,7 +8922,7 @@
       <w:pPr>
         <w:pStyle w:val="Heading2"/>
       </w:pPr>
-      <w:bookmarkStart w:id="22" w:name="_Toc240759014"/>
+      <w:bookmarkStart w:id="22" w:name="_Toc240767640"/>
       <w:r>
         <w:t>5.5 Refusals and withdrawals</w:t>
       </w:r>
@@ -8941,7 +8941,7 @@
         <w:pStyle w:val="Heading1"/>
         <w:pageBreakBefore/>
       </w:pPr>
-      <w:bookmarkStart w:id="23" w:name="_Toc240759015"/>
+      <w:bookmarkStart w:id="23" w:name="_Toc240767641"/>
       <w:r>
         <w:lastRenderedPageBreak/>
         <w:t>6. Role modules</w:t>
@@ -8960,7 +8960,7 @@
       <w:pPr>
         <w:pStyle w:val="Heading2"/>
       </w:pPr>
-      <w:bookmarkStart w:id="24" w:name="_Toc240759016"/>
+      <w:bookmarkStart w:id="24" w:name="_Toc240767642"/>
       <w:r>
         <w:t>Module A — Contact RA</w:t>
       </w:r>
@@ -9101,7 +9101,7 @@
           <w:noProof/>
         </w:rPr>
         <w:drawing>
-          <wp:inline distT="0" distB="0" distL="0" distR="0" wp14:anchorId="6467BCEE" wp14:editId="7AC7F191">
+          <wp:inline distT="0" distB="0" distL="0" distR="0" wp14:anchorId="4C4E3FD4" wp14:editId="70F39569">
             <wp:extent cx="5334000" cy="2114550"/>
             <wp:effectExtent l="0" t="0" r="0" b="0"/>
             <wp:docPr id="3" name="adm_case_add_person.jpg" descr="Adding a person to a case." title="Adding a person to a case."/>
@@ -9476,7 +9476,7 @@
         </w:rPr>
         <w:lastRenderedPageBreak/>
         <w:drawing>
-          <wp:inline distT="0" distB="0" distL="0" distR="0" wp14:anchorId="638B3239" wp14:editId="6E1299EF">
+          <wp:inline distT="0" distB="0" distL="0" distR="0" wp14:anchorId="4BB7BE7A" wp14:editId="6313265C">
             <wp:extent cx="5334000" cy="1143000"/>
             <wp:effectExtent l="0" t="0" r="0" b="0"/>
             <wp:docPr id="4" name="cra_case_invitations_before.jpg" descr="Invitations panel before sending, with the history of earlier invitations." title="Invitations panel before sending, with the history of earlier invitations."/>
@@ -9605,7 +9605,7 @@
           <w:noProof/>
         </w:rPr>
         <w:drawing>
-          <wp:inline distT="0" distB="0" distL="0" distR="0" wp14:anchorId="5AA84EDF" wp14:editId="05E6B455">
+          <wp:inline distT="0" distB="0" distL="0" distR="0" wp14:anchorId="70B381AB" wp14:editId="31826CB1">
             <wp:extent cx="5334000" cy="2152650"/>
             <wp:effectExtent l="0" t="0" r="0" b="0"/>
             <wp:docPr id="5" name="cra_case_invitation_sent.jpg" descr="The link, manual code and ready-written messages are shown once, with a send button for each channel." title="The link, manual code and ready-written messages are shown once, with a send button for each channel."/>
@@ -10045,7 +10045,7 @@
           <w:noProof/>
         </w:rPr>
         <w:drawing>
-          <wp:inline distT="0" distB="0" distL="0" distR="0" wp14:anchorId="7EA0C2E5" wp14:editId="7861B6DC">
+          <wp:inline distT="0" distB="0" distL="0" distR="0" wp14:anchorId="7390879B" wp14:editId="0AAF4630">
             <wp:extent cx="5334000" cy="1343025"/>
             <wp:effectExtent l="0" t="0" r="0" b="0"/>
             <wp:docPr id="6" name="adm_case_timeline.jpg" descr="Contact timeline and the form for logging an attempt." title="Contact timeline and the form for logging an attempt."/>
@@ -10255,7 +10255,7 @@
         </w:rPr>
         <w:lastRenderedPageBreak/>
         <w:drawing>
-          <wp:inline distT="0" distB="0" distL="0" distR="0" wp14:anchorId="57B116DF" wp14:editId="3FC75A14">
+          <wp:inline distT="0" distB="0" distL="0" distR="0" wp14:anchorId="0124631A" wp14:editId="6BFA90BE">
             <wp:extent cx="5334000" cy="3333750"/>
             <wp:effectExtent l="0" t="0" r="0" b="0"/>
             <wp:docPr id="7" name="cra_follow_ups.jpg" descr="Follow-ups due. Contact RAs see only their own cases." title="Follow-ups due. Contact RAs see only their own cases."/>
@@ -10519,7 +10519,7 @@
           <w:noProof/>
         </w:rPr>
         <w:drawing>
-          <wp:inline distT="0" distB="0" distL="0" distR="0" wp14:anchorId="5DD78EC6" wp14:editId="318D3625">
+          <wp:inline distT="0" distB="0" distL="0" distR="0" wp14:anchorId="068FC0FD" wp14:editId="53EB6195">
             <wp:extent cx="5334000" cy="2667000"/>
             <wp:effectExtent l="0" t="0" r="0" b="0"/>
             <wp:docPr id="8" name="cra_appointments.jpg" descr="Appointment Queue." title="Appointment Queue."/>
@@ -11428,7 +11428,7 @@
       <w:pPr>
         <w:pStyle w:val="Heading2"/>
       </w:pPr>
-      <w:bookmarkStart w:id="25" w:name="_Toc240759017"/>
+      <w:bookmarkStart w:id="25" w:name="_Toc240767643"/>
       <w:r>
         <w:t>Module B — QUAN/Kobo QA RA</w:t>
       </w:r>
@@ -11477,7 +11477,7 @@
         </w:rPr>
         <w:lastRenderedPageBreak/>
         <w:drawing>
-          <wp:inline distT="0" distB="0" distL="0" distR="0" wp14:anchorId="1162F8B8" wp14:editId="1CEC6511">
+          <wp:inline distT="0" distB="0" distL="0" distR="0" wp14:anchorId="080B6966" wp14:editId="38D7207B">
             <wp:extent cx="5334000" cy="3333750"/>
             <wp:effectExtent l="0" t="0" r="0" b="0"/>
             <wp:docPr id="9" name="qa_queue.jpg" descr="QUAN QA Queue with the KoboToolbox sync panel." title="QUAN QA Queue with the KoboToolbox sync panel."/>
@@ -12278,7 +12278,7 @@
           <w:noProof/>
         </w:rPr>
         <w:drawing>
-          <wp:inline distT="0" distB="0" distL="0" distR="0" wp14:anchorId="33EDF5D3" wp14:editId="4AFC5F6A">
+          <wp:inline distT="0" distB="0" distL="0" distR="0" wp14:anchorId="3005F1E4" wp14:editId="6F1D7E2F">
             <wp:extent cx="5334000" cy="3333750"/>
             <wp:effectExtent l="0" t="0" r="0" b="0"/>
             <wp:docPr id="10" name="qa_exceptions.jpg" descr="QA Exception Queue." title="QA Exception Queue."/>
@@ -12539,7 +12539,7 @@
       <w:pPr>
         <w:pStyle w:val="Heading2"/>
       </w:pPr>
-      <w:bookmarkStart w:id="26" w:name="_Toc240759018"/>
+      <w:bookmarkStart w:id="26" w:name="_Toc240767644"/>
       <w:r>
         <w:t>Module C — KII RA</w:t>
       </w:r>
@@ -12588,7 +12588,7 @@
         </w:rPr>
         <w:lastRenderedPageBreak/>
         <w:drawing>
-          <wp:inline distT="0" distB="0" distL="0" distR="0" wp14:anchorId="4EE55573" wp14:editId="4F0C04DA">
+          <wp:inline distT="0" distB="0" distL="0" distR="0" wp14:anchorId="597EC06B" wp14:editId="6EA89FB6">
             <wp:extent cx="5334000" cy="2667000"/>
             <wp:effectExtent l="0" t="0" r="0" b="0"/>
             <wp:docPr id="11" name="kii_new.jpg" descr="New KII Record." title="New KII Record."/>
@@ -12773,7 +12773,7 @@
           <w:noProof/>
         </w:rPr>
         <w:drawing>
-          <wp:inline distT="0" distB="0" distL="0" distR="0" wp14:anchorId="1B230480" wp14:editId="29706C28">
+          <wp:inline distT="0" distB="0" distL="0" distR="0" wp14:anchorId="5603F6F6" wp14:editId="7126204B">
             <wp:extent cx="5334000" cy="3333750"/>
             <wp:effectExtent l="0" t="0" r="0" b="0"/>
             <wp:docPr id="12" name="kii_register.jpg" descr="KII Register." title="KII Register."/>
@@ -12873,7 +12873,7 @@
         </w:rPr>
         <w:lastRenderedPageBreak/>
         <w:drawing>
-          <wp:inline distT="0" distB="0" distL="0" distR="0" wp14:anchorId="58F20336" wp14:editId="57720FCC">
+          <wp:inline distT="0" distB="0" distL="0" distR="0" wp14:anchorId="5EB1D0C9" wp14:editId="66A38C74">
             <wp:extent cx="5334000" cy="3752850"/>
             <wp:effectExtent l="0" t="0" r="0" b="0"/>
             <wp:docPr id="13" name="kii_detail.jpg" descr="KII record: status, consent, transcript and coding." title="KII record: status, consent, transcript and coding."/>
@@ -13157,7 +13157,7 @@
           <w:noProof/>
         </w:rPr>
         <w:drawing>
-          <wp:inline distT="0" distB="0" distL="0" distR="0" wp14:anchorId="4DD4F580" wp14:editId="7DDB1B05">
+          <wp:inline distT="0" distB="0" distL="0" distR="0" wp14:anchorId="2B502B63" wp14:editId="3D9D485C">
             <wp:extent cx="5334000" cy="523875"/>
             <wp:effectExtent l="0" t="0" r="0" b="0"/>
             <wp:docPr id="14" name="kii_coding_locked.jpg" descr="Before consent: no interview link." title="Before consent: no interview link."/>
@@ -13257,7 +13257,7 @@
         </w:rPr>
         <w:lastRenderedPageBreak/>
         <w:drawing>
-          <wp:inline distT="0" distB="0" distL="0" distR="0" wp14:anchorId="59A881C1" wp14:editId="3086BB88">
+          <wp:inline distT="0" distB="0" distL="0" distR="0" wp14:anchorId="55EDD1A1" wp14:editId="1F8FF005">
             <wp:extent cx="5334000" cy="742950"/>
             <wp:effectExtent l="0" t="0" r="0" b="0"/>
             <wp:docPr id="15" name="kii_coding_ready.jpg" descr="After consent: Continue this interview." title="After consent: Continue this interview."/>
@@ -13492,7 +13492,7 @@
       <w:pPr>
         <w:pStyle w:val="Heading2"/>
       </w:pPr>
-      <w:bookmarkStart w:id="27" w:name="_Toc240759019"/>
+      <w:bookmarkStart w:id="27" w:name="_Toc240767645"/>
       <w:r>
         <w:t>Module D — Documentary RA</w:t>
       </w:r>
@@ -13540,7 +13540,7 @@
           <w:noProof/>
         </w:rPr>
         <w:drawing>
-          <wp:inline distT="0" distB="0" distL="0" distR="0" wp14:anchorId="3BD511E5" wp14:editId="781C4E96">
+          <wp:inline distT="0" distB="0" distL="0" distR="0" wp14:anchorId="6FF7C42F" wp14:editId="0F2E2D26">
             <wp:extent cx="5334000" cy="3171825"/>
             <wp:effectExtent l="0" t="0" r="0" b="0"/>
             <wp:docPr id="16" name="doc_new.jpg" descr="New Documentary Evidence Record." title="New Documentary Evidence Record."/>
@@ -13746,7 +13746,7 @@
           <w:noProof/>
         </w:rPr>
         <w:drawing>
-          <wp:inline distT="0" distB="0" distL="0" distR="0" wp14:anchorId="70FFCCDF" wp14:editId="206374EF">
+          <wp:inline distT="0" distB="0" distL="0" distR="0" wp14:anchorId="7986B7D5" wp14:editId="40476CF3">
             <wp:extent cx="5334000" cy="819150"/>
             <wp:effectExtent l="0" t="0" r="0" b="0"/>
             <wp:docPr id="17" name="doc_source_file.jpg" descr="Source file: the file name, size and date, with Remove file beside it." title="Source file: the file name, size and date, with Remove file beside it."/>
@@ -13997,7 +13997,7 @@
           <w:noProof/>
         </w:rPr>
         <w:drawing>
-          <wp:inline distT="0" distB="0" distL="0" distR="0" wp14:anchorId="2289BA49" wp14:editId="18BC449C">
+          <wp:inline distT="0" distB="0" distL="0" distR="0" wp14:anchorId="0F2B88D0" wp14:editId="142C4192">
             <wp:extent cx="5334000" cy="3333750"/>
             <wp:effectExtent l="0" t="0" r="0" b="0"/>
             <wp:docPr id="18" name="doc_register.jpg" descr="Documentary Evidence Corpus." title="Documentary Evidence Corpus."/>
@@ -14107,7 +14107,7 @@
           <w:noProof/>
         </w:rPr>
         <w:drawing>
-          <wp:inline distT="0" distB="0" distL="0" distR="0" wp14:anchorId="09A0D018" wp14:editId="795BDDC4">
+          <wp:inline distT="0" distB="0" distL="0" distR="0" wp14:anchorId="00DC45C0" wp14:editId="1D6C83B6">
             <wp:extent cx="5334000" cy="3419475"/>
             <wp:effectExtent l="0" t="0" r="0" b="0"/>
             <wp:docPr id="19" name="doc_detail.jpg" descr="Document record: authenticity, QA status, memo and coding form." title="Document record: authenticity, QA status, memo and coding form."/>
@@ -14586,7 +14586,7 @@
           <w:noProof/>
         </w:rPr>
         <w:drawing>
-          <wp:inline distT="0" distB="0" distL="0" distR="0" wp14:anchorId="5457991F" wp14:editId="3F9A09E9">
+          <wp:inline distT="0" distB="0" distL="0" distR="0" wp14:anchorId="67058FFE" wp14:editId="5B71F56D">
             <wp:extent cx="5715000" cy="904875"/>
             <wp:effectExtent l="0" t="0" r="0" b="0"/>
             <wp:docPr id="20" name="doc_coding_buttons.jpg" descr="The Coding panel: Code this document, and Auto-fill." title="The Coding panel: Code this document, and Auto-fill."/>
@@ -14725,7 +14725,17 @@
         <w:t>10-90</w:t>
       </w:r>
       <w:r>
-        <w:t>. The AI reads up to 100 pages at a time, so choose the pages that make up this evidence unit, such as one chapter. Its locators use the original page numbers. For shorter files, leave the box empty to read everything.</w:t>
+        <w:t xml:space="preserve">. The AI reads up to 100 pages at a time, so either choose the pages that make up this evidence unit, such as one chapter, or tick </w:t>
+      </w:r>
+      <w:r>
+        <w:rPr>
+          <w:b/>
+          <w:bCs/>
+        </w:rPr>
+        <w:t>Read the whole document in parts</w:t>
+      </w:r>
+      <w:r>
+        <w:t xml:space="preserve"> (see “Coding a very long document” below). Its locators use the original page numbers. For shorter files, leave the box empty to read everything.</w:t>
       </w:r>
     </w:p>
     <w:p>
@@ -14739,10 +14749,10 @@
           <w:noProof/>
         </w:rPr>
         <w:drawing>
-          <wp:inline distT="0" distB="0" distL="0" distR="0" wp14:anchorId="137B0CB5" wp14:editId="72A34628">
-            <wp:extent cx="5334000" cy="2171700"/>
+          <wp:inline distT="0" distB="0" distL="0" distR="0" wp14:anchorId="3DE13934" wp14:editId="045C5B3B">
+            <wp:extent cx="5334000" cy="2667000"/>
             <wp:effectExtent l="0" t="0" r="0" b="0"/>
-            <wp:docPr id="21" name="doc_autofill_pages.jpg" descr="A 240-page PDF asks for a page range." title="A 240-page PDF asks for a page range."/>
+            <wp:docPr id="21" name="doc_autofill_pages.jpg" descr="A 240-page PDF: enter a page range, or read the whole document in parts." title="A 240-page PDF: enter a page range, or read the whole document in parts."/>
             <wp:cNvGraphicFramePr>
               <a:graphicFrameLocks xmlns:a="http://schemas.openxmlformats.org/drawingml/2006/main" noChangeAspect="1"/>
             </wp:cNvGraphicFramePr>
@@ -14765,7 +14775,7 @@
                   <pic:spPr bwMode="auto">
                     <a:xfrm>
                       <a:off x="0" y="0"/>
-                      <a:ext cx="5334000" cy="2171700"/>
+                      <a:ext cx="5334000" cy="2667000"/>
                     </a:xfrm>
                     <a:prstGeom prst="rect">
                       <a:avLst/>
@@ -14801,7 +14811,7 @@
           <w:sz w:val="17"/>
           <w:szCs w:val="17"/>
         </w:rPr>
-        <w:t>A 240-page PDF asks for a page range.</w:t>
+        <w:t>A 240-page PDF: enter a page range, or read the whole document in parts.</w:t>
       </w:r>
     </w:p>
     <w:p>
@@ -14838,7 +14848,7 @@
           <w:noProof/>
         </w:rPr>
         <w:drawing>
-          <wp:inline distT="0" distB="0" distL="0" distR="0" wp14:anchorId="7CC75487" wp14:editId="0602C3BF">
+          <wp:inline distT="0" distB="0" distL="0" distR="0" wp14:anchorId="6624AA04" wp14:editId="279B5583">
             <wp:extent cx="5334000" cy="1752600"/>
             <wp:effectExtent l="0" t="0" r="0" b="0"/>
             <wp:docPr id="22" name="doc_autofill_running.jpg" descr="The AI is reading the document." title="The AI is reading the document."/>
@@ -14928,7 +14938,7 @@
         </w:rPr>
         <w:lastRenderedPageBreak/>
         <w:drawing>
-          <wp:inline distT="0" distB="0" distL="0" distR="0" wp14:anchorId="331C1DE0" wp14:editId="58B2E9A6">
+          <wp:inline distT="0" distB="0" distL="0" distR="0" wp14:anchorId="0D2C5850" wp14:editId="7944A0BE">
             <wp:extent cx="5334000" cy="4581525"/>
             <wp:effectExtent l="0" t="0" r="0" b="0"/>
             <wp:docPr id="23" name="doc_autofill_review.jpg" descr="The review screen: the draft, ready to check and edit." title="The review screen: the draft, ready to check and edit."/>
@@ -15018,7 +15028,7 @@
         </w:rPr>
         <w:lastRenderedPageBreak/>
         <w:drawing>
-          <wp:inline distT="0" distB="0" distL="0" distR="0" wp14:anchorId="62BA65E3" wp14:editId="23E3947A">
+          <wp:inline distT="0" distB="0" distL="0" distR="0" wp14:anchorId="58D79541" wp14:editId="6185BEBF">
             <wp:extent cx="5334000" cy="3838575"/>
             <wp:effectExtent l="0" t="0" r="0" b="0"/>
             <wp:docPr id="24" name="doc_autofill_section_d.jpg" descr="Section D: ratings and locators, all editable." title="Section D: ratings and locators, all editable."/>
@@ -15107,7 +15117,7 @@
           <w:noProof/>
         </w:rPr>
         <w:drawing>
-          <wp:inline distT="0" distB="0" distL="0" distR="0" wp14:anchorId="6CC3CC15" wp14:editId="2E793193">
+          <wp:inline distT="0" distB="0" distL="0" distR="0" wp14:anchorId="62F380F3" wp14:editId="32A6C2C5">
             <wp:extent cx="5334000" cy="3838575"/>
             <wp:effectExtent l="0" t="0" r="0" b="0"/>
             <wp:docPr id="25" name="doc_autofill_section_j.jpg" descr="Section J: quantitative metrics." title="Section J: quantitative metrics."/>
@@ -15547,7 +15557,7 @@
                 <w:sz w:val="19"/>
                 <w:szCs w:val="19"/>
               </w:rPr>
-              <w:t>Yes, up to 100 pages at a time (choose a page range for longer files).</w:t>
+              <w:t>Yes, up to 100 pages at a time; longer files by page range, or read whole in parts (up to 1,500 pages).</w:t>
             </w:r>
           </w:p>
         </w:tc>
@@ -15951,6 +15961,194 @@
         <w:spacing w:after="120"/>
       </w:pPr>
     </w:p>
+    <w:p>
+      <w:pPr>
+        <w:pStyle w:val="Heading3"/>
+      </w:pPr>
+      <w:r>
+        <w:t>Coding a very long document</w:t>
+      </w:r>
+    </w:p>
+    <w:p>
+      <w:pPr>
+        <w:spacing w:after="120" w:line="288" w:lineRule="auto"/>
+      </w:pPr>
+      <w:r>
+        <w:t>The AI can take in 100 pages at a time. A report of several hundred or a thousand pages therefore needs one of two approaches:</w:t>
+      </w:r>
+    </w:p>
+    <w:p>
+      <w:pPr>
+        <w:pStyle w:val="ListParagraph"/>
+        <w:numPr>
+          <w:ilvl w:val="0"/>
+          <w:numId w:val="2"/>
+        </w:numPr>
+        <w:spacing w:after="60" w:line="276" w:lineRule="auto"/>
+      </w:pPr>
+      <w:r>
+        <w:rPr>
+          <w:b/>
+          <w:bCs/>
+        </w:rPr>
+        <w:t>One record per chapter (recommended).</w:t>
+      </w:r>
+      <w:r>
+        <w:t xml:space="preserve"> Create a document record for each part you want coded, for example “NDS2 – Agriculture chapter”. Upload the same PDF to each, enter that part's page range, and review and submit each one. Each part gets its own DOC ID, its own coding and its own row in the Excel export.</w:t>
+      </w:r>
+    </w:p>
+    <w:p>
+      <w:pPr>
+        <w:pStyle w:val="ListParagraph"/>
+        <w:numPr>
+          <w:ilvl w:val="0"/>
+          <w:numId w:val="2"/>
+        </w:numPr>
+        <w:spacing w:after="60" w:line="276" w:lineRule="auto"/>
+      </w:pPr>
+      <w:r>
+        <w:rPr>
+          <w:b/>
+          <w:bCs/>
+        </w:rPr>
+        <w:t>Read the whole document in parts.</w:t>
+      </w:r>
+      <w:r>
+        <w:t xml:space="preserve"> Tick </w:t>
+      </w:r>
+      <w:r>
+        <w:rPr>
+          <w:b/>
+          <w:bCs/>
+        </w:rPr>
+        <w:t>Read the whole document in parts</w:t>
+      </w:r>
+      <w:r>
+        <w:t xml:space="preserve">. Leave </w:t>
+      </w:r>
+      <w:r>
+        <w:rPr>
+          <w:b/>
+          <w:bCs/>
+        </w:rPr>
+        <w:t>Pages to read</w:t>
+      </w:r>
+      <w:r>
+        <w:t xml:space="preserve"> empty for every page, or enter a longer range such as </w:t>
+      </w:r>
+      <w:r>
+        <w:rPr>
+          <w:rFonts w:ascii="Consolas" w:eastAsia="Consolas" w:hAnsi="Consolas" w:cs="Consolas"/>
+          <w:color w:val="122238"/>
+          <w:sz w:val="19"/>
+          <w:szCs w:val="19"/>
+        </w:rPr>
+        <w:t>1-600</w:t>
+      </w:r>
+      <w:r>
+        <w:t xml:space="preserve"> (up to 1,500 pages). The AI codes each part of about 80 pages, then combines them into one draft for the record. The screen tells you how many parts it will take and asks you to confirm, then shows progress (“Read part 3 of 8”, then “Combining the parts into one draft”). Expect roughly ten to thirty minutes, and you can leave the page.</w:t>
+      </w:r>
+    </w:p>
+    <w:p>
+      <w:pPr>
+        <w:spacing w:after="60"/>
+      </w:pPr>
+    </w:p>
+    <w:tbl>
+      <w:tblPr>
+        <w:tblW w:w="9412" w:type="dxa"/>
+        <w:tblBorders>
+          <w:top w:val="single" w:sz="2" w:space="0" w:color="FBF1E1"/>
+          <w:left w:val="single" w:sz="24" w:space="0" w:color="D9A441"/>
+          <w:bottom w:val="single" w:sz="2" w:space="0" w:color="FBF1E1"/>
+          <w:right w:val="single" w:sz="2" w:space="0" w:color="FBF1E1"/>
+          <w:insideH w:val="single" w:sz="4" w:space="0" w:color="FBF1E1"/>
+          <w:insideV w:val="single" w:sz="4" w:space="0" w:color="FBF1E1"/>
+        </w:tblBorders>
+        <w:tblCellMar>
+          <w:left w:w="10" w:type="dxa"/>
+          <w:right w:w="10" w:type="dxa"/>
+        </w:tblCellMar>
+        <w:tblLook w:val="04A0" w:firstRow="1" w:lastRow="0" w:firstColumn="1" w:lastColumn="0" w:noHBand="0" w:noVBand="1"/>
+      </w:tblPr>
+      <w:tblGrid>
+        <w:gridCol w:w="9412"/>
+      </w:tblGrid>
+      <w:tr>
+        <w:tblPrEx>
+          <w:tblCellMar>
+            <w:top w:w="0" w:type="dxa"/>
+            <w:bottom w:w="0" w:type="dxa"/>
+          </w:tblCellMar>
+        </w:tblPrEx>
+        <w:trPr>
+          <w:cantSplit/>
+        </w:trPr>
+        <w:tc>
+          <w:tcPr>
+            <w:tcW w:w="9412" w:type="dxa"/>
+            <w:shd w:val="clear" w:color="auto" w:fill="FBF1E1"/>
+            <w:tcMar>
+              <w:top w:w="100" w:type="dxa"/>
+              <w:left w:w="180" w:type="dxa"/>
+              <w:bottom w:w="100" w:type="dxa"/>
+              <w:right w:w="160" w:type="dxa"/>
+            </w:tcMar>
+          </w:tcPr>
+          <w:p>
+            <w:pPr>
+              <w:spacing w:after="40"/>
+            </w:pPr>
+            <w:r>
+              <w:rPr>
+                <w:b/>
+                <w:bCs/>
+                <w:sz w:val="20"/>
+                <w:szCs w:val="20"/>
+              </w:rPr>
+              <w:lastRenderedPageBreak/>
+              <w:t>A combined draft needs extra care</w:t>
+            </w:r>
+          </w:p>
+          <w:p>
+            <w:pPr>
+              <w:spacing w:after="40" w:line="264" w:lineRule="auto"/>
+            </w:pPr>
+            <w:r>
+              <w:rPr>
+                <w:sz w:val="19"/>
+                <w:szCs w:val="19"/>
+              </w:rPr>
+              <w:t>Because the ratings are judged across the parts rather than from every page at once, check the strength ratings (Sections D and H), the hypothesis codes (Section K) and the locators more carefully than for a single chapter. The draft states which pages it covers; confirm that this is the evidence unit you meant.</w:t>
+            </w:r>
+          </w:p>
+          <w:p>
+            <w:pPr>
+              <w:spacing w:after="40" w:line="264" w:lineRule="auto"/>
+            </w:pPr>
+            <w:r>
+              <w:rPr>
+                <w:sz w:val="19"/>
+                <w:szCs w:val="19"/>
+              </w:rPr>
+              <w:t>A whole-document read costs about the number of parts plus one times an ordinary draft. If any part fails, the whole draft fails and nothing is saved, so you never receive a coding that silently skipped pages.</w:t>
+            </w:r>
+          </w:p>
+          <w:p>
+            <w:pPr>
+              <w:spacing w:after="40" w:line="264" w:lineRule="auto"/>
+            </w:pPr>
+            <w:r>
+              <w:rPr>
+                <w:sz w:val="19"/>
+                <w:szCs w:val="19"/>
+              </w:rPr>
+              <w:t>Whether a whole-document coding is appropriate for a given source is a methodology decision for the PI; for a report that covers many topics, one record per chapter usually gives a sharper analysis.</w:t>
+            </w:r>
+          </w:p>
+        </w:tc>
+      </w:tr>
+    </w:tbl>
     <w:p>
       <w:pPr>
         <w:pStyle w:val="Heading3"/>
@@ -16148,7 +16346,7 @@
                 <w:sz w:val="19"/>
                 <w:szCs w:val="19"/>
               </w:rPr>
-              <w:t>Enter a page range of up to 100 pages.</w:t>
+              <w:t>Enter a page range of up to 100 pages, or tick Read the whole document in parts.</w:t>
             </w:r>
           </w:p>
         </w:tc>
@@ -16183,7 +16381,7 @@
                 <w:sz w:val="19"/>
                 <w:szCs w:val="19"/>
               </w:rPr>
-              <w:t>“The AI's answer was cut off…”</w:t>
+              <w:t>“…over the 1500-page ceiling…”</w:t>
             </w:r>
           </w:p>
         </w:tc>
@@ -16207,7 +16405,7 @@
                 <w:sz w:val="19"/>
                 <w:szCs w:val="19"/>
               </w:rPr>
-              <w:t>The range was too big to answer in one go.</w:t>
+              <w:t>The PDF is longer than the most that can be read in one draft.</w:t>
             </w:r>
           </w:p>
         </w:tc>
@@ -16231,7 +16429,7 @@
                 <w:sz w:val="19"/>
                 <w:szCs w:val="19"/>
               </w:rPr>
-              <w:t>Try a narrower range.</w:t>
+              <w:t>Enter a page range, or make one record per chapter.</w:t>
             </w:r>
           </w:p>
         </w:tc>
@@ -16265,6 +16463,169 @@
                 <w:sz w:val="19"/>
                 <w:szCs w:val="19"/>
               </w:rPr>
+              <w:t>“Read part 4 of 12” or “Combining the parts…”</w:t>
+            </w:r>
+          </w:p>
+        </w:tc>
+        <w:tc>
+          <w:tcPr>
+            <w:tcW w:w="3294" w:type="dxa"/>
+            <w:tcMar>
+              <w:top w:w="70" w:type="dxa"/>
+              <w:left w:w="110" w:type="dxa"/>
+              <w:bottom w:w="70" w:type="dxa"/>
+              <w:right w:w="110" w:type="dxa"/>
+            </w:tcMar>
+          </w:tcPr>
+          <w:p>
+            <w:pPr>
+              <w:spacing w:after="40"/>
+            </w:pPr>
+            <w:r>
+              <w:rPr>
+                <w:sz w:val="19"/>
+                <w:szCs w:val="19"/>
+              </w:rPr>
+              <w:t>A long document is being read in parts. Nothing is wrong.</w:t>
+            </w:r>
+          </w:p>
+        </w:tc>
+        <w:tc>
+          <w:tcPr>
+            <w:tcW w:w="3294" w:type="dxa"/>
+            <w:tcMar>
+              <w:top w:w="70" w:type="dxa"/>
+              <w:left w:w="110" w:type="dxa"/>
+              <w:bottom w:w="70" w:type="dxa"/>
+              <w:right w:w="110" w:type="dxa"/>
+            </w:tcMar>
+          </w:tcPr>
+          <w:p>
+            <w:pPr>
+              <w:spacing w:after="40"/>
+            </w:pPr>
+            <w:r>
+              <w:rPr>
+                <w:sz w:val="19"/>
+                <w:szCs w:val="19"/>
+              </w:rPr>
+              <w:t>Wait, or leave the page and come back.</w:t>
+            </w:r>
+          </w:p>
+        </w:tc>
+      </w:tr>
+      <w:tr>
+        <w:tblPrEx>
+          <w:tblCellMar>
+            <w:top w:w="0" w:type="dxa"/>
+            <w:bottom w:w="0" w:type="dxa"/>
+          </w:tblCellMar>
+        </w:tblPrEx>
+        <w:trPr>
+          <w:cantSplit/>
+        </w:trPr>
+        <w:tc>
+          <w:tcPr>
+            <w:tcW w:w="2824" w:type="dxa"/>
+            <w:shd w:val="clear" w:color="auto" w:fill="F8FAFB"/>
+            <w:tcMar>
+              <w:top w:w="70" w:type="dxa"/>
+              <w:left w:w="110" w:type="dxa"/>
+              <w:bottom w:w="70" w:type="dxa"/>
+              <w:right w:w="110" w:type="dxa"/>
+            </w:tcMar>
+          </w:tcPr>
+          <w:p>
+            <w:pPr>
+              <w:spacing w:after="40"/>
+            </w:pPr>
+            <w:r>
+              <w:rPr>
+                <w:sz w:val="19"/>
+                <w:szCs w:val="19"/>
+              </w:rPr>
+              <w:t>“The AI's answer was cut off…”</w:t>
+            </w:r>
+          </w:p>
+        </w:tc>
+        <w:tc>
+          <w:tcPr>
+            <w:tcW w:w="3294" w:type="dxa"/>
+            <w:shd w:val="clear" w:color="auto" w:fill="F8FAFB"/>
+            <w:tcMar>
+              <w:top w:w="70" w:type="dxa"/>
+              <w:left w:w="110" w:type="dxa"/>
+              <w:bottom w:w="70" w:type="dxa"/>
+              <w:right w:w="110" w:type="dxa"/>
+            </w:tcMar>
+          </w:tcPr>
+          <w:p>
+            <w:pPr>
+              <w:spacing w:after="40"/>
+            </w:pPr>
+            <w:r>
+              <w:rPr>
+                <w:sz w:val="19"/>
+                <w:szCs w:val="19"/>
+              </w:rPr>
+              <w:t>The range was too big to answer in one go.</w:t>
+            </w:r>
+          </w:p>
+        </w:tc>
+        <w:tc>
+          <w:tcPr>
+            <w:tcW w:w="3294" w:type="dxa"/>
+            <w:shd w:val="clear" w:color="auto" w:fill="F8FAFB"/>
+            <w:tcMar>
+              <w:top w:w="70" w:type="dxa"/>
+              <w:left w:w="110" w:type="dxa"/>
+              <w:bottom w:w="70" w:type="dxa"/>
+              <w:right w:w="110" w:type="dxa"/>
+            </w:tcMar>
+          </w:tcPr>
+          <w:p>
+            <w:pPr>
+              <w:spacing w:after="40"/>
+            </w:pPr>
+            <w:r>
+              <w:rPr>
+                <w:sz w:val="19"/>
+                <w:szCs w:val="19"/>
+              </w:rPr>
+              <w:t>Try a narrower range.</w:t>
+            </w:r>
+          </w:p>
+        </w:tc>
+      </w:tr>
+      <w:tr>
+        <w:tblPrEx>
+          <w:tblCellMar>
+            <w:top w:w="0" w:type="dxa"/>
+            <w:bottom w:w="0" w:type="dxa"/>
+          </w:tblCellMar>
+        </w:tblPrEx>
+        <w:trPr>
+          <w:cantSplit/>
+        </w:trPr>
+        <w:tc>
+          <w:tcPr>
+            <w:tcW w:w="2824" w:type="dxa"/>
+            <w:tcMar>
+              <w:top w:w="70" w:type="dxa"/>
+              <w:left w:w="110" w:type="dxa"/>
+              <w:bottom w:w="70" w:type="dxa"/>
+              <w:right w:w="110" w:type="dxa"/>
+            </w:tcMar>
+          </w:tcPr>
+          <w:p>
+            <w:pPr>
+              <w:spacing w:after="40"/>
+            </w:pPr>
+            <w:r>
+              <w:rPr>
+                <w:sz w:val="19"/>
+                <w:szCs w:val="19"/>
+              </w:rPr>
               <w:t>“A draft is already being generated”</w:t>
             </w:r>
           </w:p>
@@ -16311,7 +16672,7 @@
                 <w:sz w:val="19"/>
                 <w:szCs w:val="19"/>
               </w:rPr>
-              <w:t>Wait for it to finish (about five minutes).</w:t>
+              <w:t>Wait for it to finish (about five minutes; up to half an hour for a document read in parts).</w:t>
             </w:r>
           </w:p>
         </w:tc>
@@ -16646,7 +17007,7 @@
                 <w:sz w:val="19"/>
                 <w:szCs w:val="19"/>
               </w:rPr>
-              <w:t>Each draft is a paid request on the study's AI account. A short chapter costs little; a full 100 pages costs several times more. Choose the pages you need.</w:t>
+              <w:t>Each draft is a paid request on the study's AI account. A short chapter costs little; a full 100 pages costs several times more; a whole document read in parts costs about the number of parts plus one times an ordinary draft. Choose the pages you need.</w:t>
             </w:r>
           </w:p>
         </w:tc>
@@ -16657,7 +17018,6 @@
         <w:pStyle w:val="Heading3"/>
       </w:pPr>
       <w:r>
-        <w:lastRenderedPageBreak/>
         <w:t>Evidence standards</w:t>
       </w:r>
     </w:p>
@@ -16736,7 +17096,7 @@
         <w:pStyle w:val="Heading1"/>
         <w:pageBreakBefore/>
       </w:pPr>
-      <w:bookmarkStart w:id="28" w:name="_Toc240759020"/>
+      <w:bookmarkStart w:id="28" w:name="_Toc240767646"/>
       <w:r>
         <w:lastRenderedPageBreak/>
         <w:t>7. Scenarios</w:t>
@@ -17691,7 +18051,7 @@
         <w:pStyle w:val="Heading1"/>
         <w:pageBreakBefore/>
       </w:pPr>
-      <w:bookmarkStart w:id="29" w:name="_Toc240759021"/>
+      <w:bookmarkStart w:id="29" w:name="_Toc240767647"/>
       <w:r>
         <w:lastRenderedPageBreak/>
         <w:t>8. Practice exercises</w:t>
@@ -17710,7 +18070,7 @@
       <w:pPr>
         <w:pStyle w:val="Heading2"/>
       </w:pPr>
-      <w:bookmarkStart w:id="30" w:name="_Toc240759022"/>
+      <w:bookmarkStart w:id="30" w:name="_Toc240767648"/>
       <w:r>
         <w:t>Exercise 1 — Getting around (all RAs)</w:t>
       </w:r>
@@ -17777,7 +18137,7 @@
       <w:pPr>
         <w:pStyle w:val="Heading2"/>
       </w:pPr>
-      <w:bookmarkStart w:id="31" w:name="_Toc240759023"/>
+      <w:bookmarkStart w:id="31" w:name="_Toc240767649"/>
       <w:r>
         <w:t>Exercise 2 — A complete contact (Contact RAs)</w:t>
       </w:r>
@@ -17857,7 +18217,7 @@
       <w:pPr>
         <w:pStyle w:val="Heading2"/>
       </w:pPr>
-      <w:bookmarkStart w:id="32" w:name="_Toc240759024"/>
+      <w:bookmarkStart w:id="32" w:name="_Toc240767650"/>
       <w:r>
         <w:t>Exercise 3 — QA decisions (QA RAs)</w:t>
       </w:r>
@@ -17924,7 +18284,7 @@
       <w:pPr>
         <w:pStyle w:val="Heading2"/>
       </w:pPr>
-      <w:bookmarkStart w:id="33" w:name="_Toc240759025"/>
+      <w:bookmarkStart w:id="33" w:name="_Toc240767651"/>
       <w:r>
         <w:t>Exercise 4 — A KII record (KII RAs)</w:t>
       </w:r>
@@ -17991,7 +18351,7 @@
       <w:pPr>
         <w:pStyle w:val="Heading2"/>
       </w:pPr>
-      <w:bookmarkStart w:id="34" w:name="_Toc240759026"/>
+      <w:bookmarkStart w:id="34" w:name="_Toc240767652"/>
       <w:r>
         <w:t>Exercise 5 — A document (Documentary RAs)</w:t>
       </w:r>
@@ -18163,7 +18523,7 @@
         <w:pStyle w:val="Heading1"/>
         <w:pageBreakBefore/>
       </w:pPr>
-      <w:bookmarkStart w:id="35" w:name="_Toc240759027"/>
+      <w:bookmarkStart w:id="35" w:name="_Toc240767653"/>
       <w:r>
         <w:lastRenderedPageBreak/>
         <w:t>9. Daily checklists</w:t>
@@ -18174,7 +18534,7 @@
       <w:pPr>
         <w:pStyle w:val="Heading2"/>
       </w:pPr>
-      <w:bookmarkStart w:id="36" w:name="_Toc240759028"/>
+      <w:bookmarkStart w:id="36" w:name="_Toc240767654"/>
       <w:r>
         <w:t>Start of the day</w:t>
       </w:r>
@@ -18254,7 +18614,7 @@
       <w:pPr>
         <w:pStyle w:val="Heading2"/>
       </w:pPr>
-      <w:bookmarkStart w:id="37" w:name="_Toc240759029"/>
+      <w:bookmarkStart w:id="37" w:name="_Toc240767655"/>
       <w:r>
         <w:t>End of the day</w:t>
       </w:r>
@@ -18308,7 +18668,7 @@
       <w:pPr>
         <w:pStyle w:val="Heading2"/>
       </w:pPr>
-      <w:bookmarkStart w:id="38" w:name="_Toc240759030"/>
+      <w:bookmarkStart w:id="38" w:name="_Toc240767656"/>
       <w:r>
         <w:t>Troubleshooting</w:t>
       </w:r>
@@ -19171,7 +19531,7 @@
         <w:pStyle w:val="Heading1"/>
         <w:pageBreakBefore/>
       </w:pPr>
-      <w:bookmarkStart w:id="39" w:name="_Toc240759031"/>
+      <w:bookmarkStart w:id="39" w:name="_Toc240767657"/>
       <w:r>
         <w:lastRenderedPageBreak/>
         <w:t>10. Glossary</w:t>
@@ -20627,7 +20987,7 @@
                 <w:sz w:val="19"/>
                 <w:szCs w:val="19"/>
               </w:rPr>
-              <w:t>Administration mode</w:t>
+              <w:t>Read in parts</w:t>
             </w:r>
           </w:p>
         </w:tc>
@@ -20651,7 +21011,7 @@
                 <w:sz w:val="19"/>
                 <w:szCs w:val="19"/>
               </w:rPr>
-              <w:t>How the questionnaire was completed (codes 01–06).</w:t>
+              <w:t>Auto-fill option for a PDF over 100 pages: the AI codes each part of about 80 pages, then combines them into one draft.</w:t>
             </w:r>
           </w:p>
         </w:tc>
@@ -20685,7 +21045,7 @@
                 <w:sz w:val="19"/>
                 <w:szCs w:val="19"/>
               </w:rPr>
-              <w:t>Follow-up</w:t>
+              <w:t>Administration mode</w:t>
             </w:r>
           </w:p>
         </w:tc>
@@ -20708,7 +21068,7 @@
                 <w:sz w:val="19"/>
                 <w:szCs w:val="19"/>
               </w:rPr>
-              <w:t>An approved reminder due to be sent to an invited respondent (Day 2, Day 7).</w:t>
+              <w:t>How the questionnaire was completed (codes 01–06).</w:t>
             </w:r>
           </w:p>
         </w:tc>
@@ -20744,7 +21104,7 @@
                 <w:szCs w:val="19"/>
               </w:rPr>
               <w:lastRenderedPageBreak/>
-              <w:t>Withdrawal</w:t>
+              <w:t>Follow-up</w:t>
             </w:r>
           </w:p>
         </w:tc>
@@ -20768,7 +21128,7 @@
                 <w:sz w:val="19"/>
                 <w:szCs w:val="19"/>
               </w:rPr>
-              <w:t>A participant's request to stop taking part, recorded once in the portal.</w:t>
+              <w:t>An approved reminder due to be sent to an invited respondent (Day 2, Day 7).</w:t>
             </w:r>
           </w:p>
         </w:tc>
@@ -20802,7 +21162,7 @@
                 <w:sz w:val="19"/>
                 <w:szCs w:val="19"/>
               </w:rPr>
-              <w:t>Audit log</w:t>
+              <w:t>Withdrawal</w:t>
             </w:r>
           </w:p>
         </w:tc>
@@ -20825,7 +21185,7 @@
                 <w:sz w:val="19"/>
                 <w:szCs w:val="19"/>
               </w:rPr>
-              <w:t>The permanent record of every sensitive action and who took it.</w:t>
+              <w:t>A participant's request to stop taking part, recorded once in the portal.</w:t>
             </w:r>
           </w:p>
         </w:tc>
@@ -20860,7 +21220,7 @@
                 <w:sz w:val="19"/>
                 <w:szCs w:val="19"/>
               </w:rPr>
-              <w:t>Data lock</w:t>
+              <w:t>Audit log</w:t>
             </w:r>
           </w:p>
         </w:tc>
@@ -20884,6 +21244,63 @@
                 <w:sz w:val="19"/>
                 <w:szCs w:val="19"/>
               </w:rPr>
+              <w:t>The permanent record of every sensitive action and who took it.</w:t>
+            </w:r>
+          </w:p>
+        </w:tc>
+      </w:tr>
+      <w:tr>
+        <w:tblPrEx>
+          <w:tblCellMar>
+            <w:top w:w="0" w:type="dxa"/>
+            <w:bottom w:w="0" w:type="dxa"/>
+          </w:tblCellMar>
+        </w:tblPrEx>
+        <w:trPr>
+          <w:cantSplit/>
+        </w:trPr>
+        <w:tc>
+          <w:tcPr>
+            <w:tcW w:w="2353" w:type="dxa"/>
+            <w:tcMar>
+              <w:top w:w="70" w:type="dxa"/>
+              <w:left w:w="110" w:type="dxa"/>
+              <w:bottom w:w="70" w:type="dxa"/>
+              <w:right w:w="110" w:type="dxa"/>
+            </w:tcMar>
+          </w:tcPr>
+          <w:p>
+            <w:pPr>
+              <w:spacing w:after="40"/>
+            </w:pPr>
+            <w:r>
+              <w:rPr>
+                <w:sz w:val="19"/>
+                <w:szCs w:val="19"/>
+              </w:rPr>
+              <w:t>Data lock</w:t>
+            </w:r>
+          </w:p>
+        </w:tc>
+        <w:tc>
+          <w:tcPr>
+            <w:tcW w:w="7059" w:type="dxa"/>
+            <w:tcMar>
+              <w:top w:w="70" w:type="dxa"/>
+              <w:left w:w="110" w:type="dxa"/>
+              <w:bottom w:w="70" w:type="dxa"/>
+              <w:right w:w="110" w:type="dxa"/>
+            </w:tcMar>
+          </w:tcPr>
+          <w:p>
+            <w:pPr>
+              <w:spacing w:after="40"/>
+            </w:pPr>
+            <w:r>
+              <w:rPr>
+                <w:sz w:val="19"/>
+                <w:szCs w:val="19"/>
+              </w:rPr>
               <w:t>30 November 2026 — the date fieldwork data is frozen for analysis.</w:t>
             </w:r>
           </w:p>
@@ -20900,7 +21317,7 @@
         <w:pStyle w:val="Heading1"/>
         <w:pageBreakBefore/>
       </w:pPr>
-      <w:bookmarkStart w:id="40" w:name="_Toc240759032"/>
+      <w:bookmarkStart w:id="40" w:name="_Toc240767658"/>
       <w:r>
         <w:lastRenderedPageBreak/>
         <w:t>11. Confidentiality and conduct declaration</w:t>
@@ -21386,7 +21803,7 @@
         <w:sz w:val="16"/>
         <w:szCs w:val="16"/>
       </w:rPr>
-      <w:t>Version 1.2 · 20 September 2026</w:t>
+      <w:t>Version 1.3 · 20 September 2026</w:t>
     </w:r>
     <w:r>
       <w:rPr>
@@ -21559,10 +21976,10 @@
 <file path=word/numbering.xml><?xml version="1.0" encoding="utf-8"?>
 <w:numbering xmlns:wpc="http://schemas.microsoft.com/office/word/2010/wordprocessingCanvas" xmlns:cx="http://schemas.microsoft.com/office/drawing/2014/chartex" xmlns:cx1="http://schemas.microsoft.com/office/drawing/2015/9/8/chartex" xmlns:cx2="http://schemas.microsoft.com/office/drawing/2015/10/21/chartex" xmlns:cx3="http://schemas.microsoft.com/office/drawing/2016/5/9/chartex" xmlns:cx4="http://schemas.microsoft.com/office/drawing/2016/5/10/chartex" xmlns:cx5="http://schemas.microsoft.com/office/drawing/2016/5/11/chartex" xmlns:cx6="http://schemas.microsoft.com/office/drawing/2016/5/12/chartex" xmlns:cx7="http://schemas.microsoft.com/office/drawing/2016/5/13/chartex" xmlns:cx8="http://schemas.microsoft.com/office/drawing/2016/5/14/chartex" xmlns:mc="http://schemas.openxmlformats.org/markup-compatibility/2006" xmlns:aink="http://schemas.microsoft.com/office/drawing/2016/ink" xmlns:am3d="http://schemas.microsoft.com/office/drawing/2017/model3d" xmlns:o="urn:schemas-microsoft-com:office:office" xmlns:oel="http://schemas.microsoft.com/office/2019/extlst" xmlns:r="http://schemas.openxmlformats.org/officeDocument/2006/relationships" xmlns:m="http://schemas.openxmlformats.org/officeDocument/2006/math" xmlns:v="urn:schemas-microsoft-com:vml" xmlns:wp14="http://schemas.microsoft.com/office/word/2010/wordprocessingDrawing" xmlns:wp="http://schemas.openxmlformats.org/drawingml/2006/wordprocessingDrawing" xmlns:w10="urn:schemas-microsoft-com:office:word" xmlns:w="http://schemas.openxmlformats.org/wordprocessingml/2006/main" xmlns:w14="http://schemas.microsoft.com/office/word/2010/wordml" xmlns:w15="http://schemas.microsoft.com/office/word/2012/wordml" xmlns:w16cex="http://schemas.microsoft.com/office/word/2018/wordml/cex" xmlns:w16cid="http://schemas.microsoft.com/office/word/2016/wordml/cid" xmlns:w16="http://schemas.microsoft.com/office/word/2018/wordml" xmlns:w16sdtdh="http://schemas.microsoft.com/office/word/2020/wordml/sdtdatahash" xmlns:w16se="http://schemas.microsoft.com/office/word/2015/wordml/symex" xmlns:wpg="http://schemas.microsoft.com/office/word/2010/wordprocessingGroup" xmlns:wpi="http://schemas.microsoft.com/office/word/2010/wordprocessingInk" xmlns:wne="http://schemas.microsoft.com/office/word/2006/wordml" xmlns:wps="http://schemas.microsoft.com/office/word/2010/wordprocessingShape" mc:Ignorable="w14 w15 w16se w16cid w16 w16cex w16sdtdh wp14">
   <w:abstractNum w:abstractNumId="0" w15:restartNumberingAfterBreak="0">
-    <w:nsid w:val="02C03B36"/>
+    <w:nsid w:val="04141A35"/>
     <w:multiLevelType w:val="hybridMultilevel"/>
-    <w:tmpl w:val="6A920452"/>
-    <w:lvl w:ilvl="0" w:tplc="04A0EBB0">
+    <w:tmpl w:val="231417EC"/>
+    <w:lvl w:ilvl="0" w:tplc="FEB8751A">
       <w:start w:val="1"/>
       <w:numFmt w:val="decimal"/>
       <w:lvlText w:val="%1."/>
@@ -21576,52 +21993,52 @@
         <w:color w:val="A67C27"/>
       </w:rPr>
     </w:lvl>
-    <w:lvl w:ilvl="1" w:tplc="75687412">
+    <w:lvl w:ilvl="1" w:tplc="C23CF2FA">
       <w:numFmt w:val="decimal"/>
       <w:lvlText w:val=""/>
       <w:lvlJc w:val="left"/>
     </w:lvl>
-    <w:lvl w:ilvl="2" w:tplc="4DB44006">
+    <w:lvl w:ilvl="2" w:tplc="123C07CC">
       <w:numFmt w:val="decimal"/>
       <w:lvlText w:val=""/>
       <w:lvlJc w:val="left"/>
     </w:lvl>
-    <w:lvl w:ilvl="3" w:tplc="78A003DC">
+    <w:lvl w:ilvl="3" w:tplc="6D583F26">
       <w:numFmt w:val="decimal"/>
       <w:lvlText w:val=""/>
       <w:lvlJc w:val="left"/>
     </w:lvl>
-    <w:lvl w:ilvl="4" w:tplc="6A42C2A8">
+    <w:lvl w:ilvl="4" w:tplc="E5242518">
       <w:numFmt w:val="decimal"/>
       <w:lvlText w:val=""/>
       <w:lvlJc w:val="left"/>
     </w:lvl>
-    <w:lvl w:ilvl="5" w:tplc="5238B920">
+    <w:lvl w:ilvl="5" w:tplc="93DA7BB4">
       <w:numFmt w:val="decimal"/>
       <w:lvlText w:val=""/>
       <w:lvlJc w:val="left"/>
     </w:lvl>
-    <w:lvl w:ilvl="6" w:tplc="A732A3E4">
+    <w:lvl w:ilvl="6" w:tplc="106C3A5C">
       <w:numFmt w:val="decimal"/>
       <w:lvlText w:val=""/>
       <w:lvlJc w:val="left"/>
     </w:lvl>
-    <w:lvl w:ilvl="7" w:tplc="C910ECD4">
+    <w:lvl w:ilvl="7" w:tplc="31445700">
       <w:numFmt w:val="decimal"/>
       <w:lvlText w:val=""/>
       <w:lvlJc w:val="left"/>
     </w:lvl>
-    <w:lvl w:ilvl="8" w:tplc="469C65B2">
+    <w:lvl w:ilvl="8" w:tplc="FF4A4398">
       <w:numFmt w:val="decimal"/>
       <w:lvlText w:val=""/>
       <w:lvlJc w:val="left"/>
     </w:lvl>
   </w:abstractNum>
   <w:abstractNum w:abstractNumId="1" w15:restartNumberingAfterBreak="0">
-    <w:nsid w:val="041669E6"/>
+    <w:nsid w:val="0D616548"/>
     <w:multiLevelType w:val="hybridMultilevel"/>
-    <w:tmpl w:val="E3745542"/>
-    <w:lvl w:ilvl="0" w:tplc="4438AC44">
+    <w:tmpl w:val="8A7C4BE8"/>
+    <w:lvl w:ilvl="0" w:tplc="87C05D5C">
       <w:start w:val="1"/>
       <w:numFmt w:val="decimal"/>
       <w:lvlText w:val="%1."/>
@@ -21635,52 +22052,52 @@
         <w:color w:val="A67C27"/>
       </w:rPr>
     </w:lvl>
-    <w:lvl w:ilvl="1" w:tplc="417A7222">
+    <w:lvl w:ilvl="1" w:tplc="252E9BB8">
       <w:numFmt w:val="decimal"/>
       <w:lvlText w:val=""/>
       <w:lvlJc w:val="left"/>
     </w:lvl>
-    <w:lvl w:ilvl="2" w:tplc="1C426658">
+    <w:lvl w:ilvl="2" w:tplc="4DB0C116">
       <w:numFmt w:val="decimal"/>
       <w:lvlText w:val=""/>
       <w:lvlJc w:val="left"/>
     </w:lvl>
-    <w:lvl w:ilvl="3" w:tplc="D78CC9B8">
+    <w:lvl w:ilvl="3" w:tplc="E176167C">
       <w:numFmt w:val="decimal"/>
       <w:lvlText w:val=""/>
       <w:lvlJc w:val="left"/>
     </w:lvl>
-    <w:lvl w:ilvl="4" w:tplc="3C10C136">
+    <w:lvl w:ilvl="4" w:tplc="0F14C8A0">
       <w:numFmt w:val="decimal"/>
       <w:lvlText w:val=""/>
       <w:lvlJc w:val="left"/>
     </w:lvl>
-    <w:lvl w:ilvl="5" w:tplc="C6C64636">
+    <w:lvl w:ilvl="5" w:tplc="4B8823F0">
       <w:numFmt w:val="decimal"/>
       <w:lvlText w:val=""/>
       <w:lvlJc w:val="left"/>
     </w:lvl>
-    <w:lvl w:ilvl="6" w:tplc="F934C0AC">
+    <w:lvl w:ilvl="6" w:tplc="16A055CE">
       <w:numFmt w:val="decimal"/>
       <w:lvlText w:val=""/>
       <w:lvlJc w:val="left"/>
     </w:lvl>
-    <w:lvl w:ilvl="7" w:tplc="24206BA6">
+    <w:lvl w:ilvl="7" w:tplc="26A037C8">
       <w:numFmt w:val="decimal"/>
       <w:lvlText w:val=""/>
       <w:lvlJc w:val="left"/>
     </w:lvl>
-    <w:lvl w:ilvl="8" w:tplc="20AEFDDC">
+    <w:lvl w:ilvl="8" w:tplc="8326D0F2">
       <w:numFmt w:val="decimal"/>
       <w:lvlText w:val=""/>
       <w:lvlJc w:val="left"/>
     </w:lvl>
   </w:abstractNum>
   <w:abstractNum w:abstractNumId="2" w15:restartNumberingAfterBreak="0">
-    <w:nsid w:val="06534D21"/>
+    <w:nsid w:val="0E341FCD"/>
     <w:multiLevelType w:val="hybridMultilevel"/>
-    <w:tmpl w:val="5D32A28A"/>
-    <w:lvl w:ilvl="0" w:tplc="28DE1532">
+    <w:tmpl w:val="86EC949C"/>
+    <w:lvl w:ilvl="0" w:tplc="B30A3616">
       <w:start w:val="1"/>
       <w:numFmt w:val="decimal"/>
       <w:lvlText w:val="%1."/>
@@ -21694,52 +22111,52 @@
         <w:color w:val="A67C27"/>
       </w:rPr>
     </w:lvl>
-    <w:lvl w:ilvl="1" w:tplc="78C48C60">
+    <w:lvl w:ilvl="1" w:tplc="4D32C730">
       <w:numFmt w:val="decimal"/>
       <w:lvlText w:val=""/>
       <w:lvlJc w:val="left"/>
     </w:lvl>
-    <w:lvl w:ilvl="2" w:tplc="A8DED3F2">
+    <w:lvl w:ilvl="2" w:tplc="2DF43B4A">
       <w:numFmt w:val="decimal"/>
       <w:lvlText w:val=""/>
       <w:lvlJc w:val="left"/>
     </w:lvl>
-    <w:lvl w:ilvl="3" w:tplc="9BC8F71A">
+    <w:lvl w:ilvl="3" w:tplc="047E9ED6">
       <w:numFmt w:val="decimal"/>
       <w:lvlText w:val=""/>
       <w:lvlJc w:val="left"/>
     </w:lvl>
-    <w:lvl w:ilvl="4" w:tplc="33F6EF04">
+    <w:lvl w:ilvl="4" w:tplc="1EE6DCD6">
       <w:numFmt w:val="decimal"/>
       <w:lvlText w:val=""/>
       <w:lvlJc w:val="left"/>
     </w:lvl>
-    <w:lvl w:ilvl="5" w:tplc="0AE2B99E">
+    <w:lvl w:ilvl="5" w:tplc="8E3AEAFC">
       <w:numFmt w:val="decimal"/>
       <w:lvlText w:val=""/>
       <w:lvlJc w:val="left"/>
     </w:lvl>
-    <w:lvl w:ilvl="6" w:tplc="9C74AE74">
+    <w:lvl w:ilvl="6" w:tplc="46A8EADA">
       <w:numFmt w:val="decimal"/>
       <w:lvlText w:val=""/>
       <w:lvlJc w:val="left"/>
     </w:lvl>
-    <w:lvl w:ilvl="7" w:tplc="0AACA608">
+    <w:lvl w:ilvl="7" w:tplc="4D121BB4">
       <w:numFmt w:val="decimal"/>
       <w:lvlText w:val=""/>
       <w:lvlJc w:val="left"/>
     </w:lvl>
-    <w:lvl w:ilvl="8" w:tplc="16A2CE6C">
+    <w:lvl w:ilvl="8" w:tplc="0C6E43EC">
       <w:numFmt w:val="decimal"/>
       <w:lvlText w:val=""/>
       <w:lvlJc w:val="left"/>
     </w:lvl>
   </w:abstractNum>
   <w:abstractNum w:abstractNumId="3" w15:restartNumberingAfterBreak="0">
-    <w:nsid w:val="0AEF1D0D"/>
+    <w:nsid w:val="1139630A"/>
     <w:multiLevelType w:val="hybridMultilevel"/>
-    <w:tmpl w:val="8B2C7E2C"/>
-    <w:lvl w:ilvl="0" w:tplc="DB7CA342">
+    <w:tmpl w:val="93D002F4"/>
+    <w:lvl w:ilvl="0" w:tplc="BE30B6C2">
       <w:start w:val="1"/>
       <w:numFmt w:val="decimal"/>
       <w:lvlText w:val="%1."/>
@@ -21753,52 +22170,52 @@
         <w:color w:val="A67C27"/>
       </w:rPr>
     </w:lvl>
-    <w:lvl w:ilvl="1" w:tplc="CB96C562">
+    <w:lvl w:ilvl="1" w:tplc="DA9C2090">
       <w:numFmt w:val="decimal"/>
       <w:lvlText w:val=""/>
       <w:lvlJc w:val="left"/>
     </w:lvl>
-    <w:lvl w:ilvl="2" w:tplc="DE4A7976">
+    <w:lvl w:ilvl="2" w:tplc="7FEE6CA4">
       <w:numFmt w:val="decimal"/>
       <w:lvlText w:val=""/>
       <w:lvlJc w:val="left"/>
     </w:lvl>
-    <w:lvl w:ilvl="3" w:tplc="42BEFB78">
+    <w:lvl w:ilvl="3" w:tplc="34527B06">
       <w:numFmt w:val="decimal"/>
       <w:lvlText w:val=""/>
       <w:lvlJc w:val="left"/>
     </w:lvl>
-    <w:lvl w:ilvl="4" w:tplc="F54E5328">
+    <w:lvl w:ilvl="4" w:tplc="36B64C02">
       <w:numFmt w:val="decimal"/>
       <w:lvlText w:val=""/>
       <w:lvlJc w:val="left"/>
     </w:lvl>
-    <w:lvl w:ilvl="5" w:tplc="865C1746">
+    <w:lvl w:ilvl="5" w:tplc="4B6A8E96">
       <w:numFmt w:val="decimal"/>
       <w:lvlText w:val=""/>
       <w:lvlJc w:val="left"/>
     </w:lvl>
-    <w:lvl w:ilvl="6" w:tplc="5C709DA0">
+    <w:lvl w:ilvl="6" w:tplc="9C923446">
       <w:numFmt w:val="decimal"/>
       <w:lvlText w:val=""/>
       <w:lvlJc w:val="left"/>
     </w:lvl>
-    <w:lvl w:ilvl="7" w:tplc="79F88D30">
+    <w:lvl w:ilvl="7" w:tplc="A9E43424">
       <w:numFmt w:val="decimal"/>
       <w:lvlText w:val=""/>
       <w:lvlJc w:val="left"/>
     </w:lvl>
-    <w:lvl w:ilvl="8" w:tplc="DC60F2EE">
+    <w:lvl w:ilvl="8" w:tplc="A8F4296E">
       <w:numFmt w:val="decimal"/>
       <w:lvlText w:val=""/>
       <w:lvlJc w:val="left"/>
     </w:lvl>
   </w:abstractNum>
   <w:abstractNum w:abstractNumId="4" w15:restartNumberingAfterBreak="0">
-    <w:nsid w:val="0D0E10D5"/>
+    <w:nsid w:val="1DA1527E"/>
     <w:multiLevelType w:val="hybridMultilevel"/>
-    <w:tmpl w:val="E6304B1C"/>
-    <w:lvl w:ilvl="0" w:tplc="FF3C6FF2">
+    <w:tmpl w:val="DBE20A96"/>
+    <w:lvl w:ilvl="0" w:tplc="7C682A78">
       <w:start w:val="1"/>
       <w:numFmt w:val="decimal"/>
       <w:lvlText w:val="%1."/>
@@ -21812,52 +22229,52 @@
         <w:color w:val="A67C27"/>
       </w:rPr>
     </w:lvl>
-    <w:lvl w:ilvl="1" w:tplc="01DA556E">
+    <w:lvl w:ilvl="1" w:tplc="85301FF0">
       <w:numFmt w:val="decimal"/>
       <w:lvlText w:val=""/>
       <w:lvlJc w:val="left"/>
     </w:lvl>
-    <w:lvl w:ilvl="2" w:tplc="EE0CECFA">
+    <w:lvl w:ilvl="2" w:tplc="9932BDD6">
       <w:numFmt w:val="decimal"/>
       <w:lvlText w:val=""/>
       <w:lvlJc w:val="left"/>
     </w:lvl>
-    <w:lvl w:ilvl="3" w:tplc="F6780C24">
+    <w:lvl w:ilvl="3" w:tplc="4B4AE272">
       <w:numFmt w:val="decimal"/>
       <w:lvlText w:val=""/>
       <w:lvlJc w:val="left"/>
     </w:lvl>
-    <w:lvl w:ilvl="4" w:tplc="08DE7C82">
+    <w:lvl w:ilvl="4" w:tplc="B79A15AE">
       <w:numFmt w:val="decimal"/>
       <w:lvlText w:val=""/>
       <w:lvlJc w:val="left"/>
     </w:lvl>
-    <w:lvl w:ilvl="5" w:tplc="2732F26C">
+    <w:lvl w:ilvl="5" w:tplc="251C1612">
       <w:numFmt w:val="decimal"/>
       <w:lvlText w:val=""/>
       <w:lvlJc w:val="left"/>
     </w:lvl>
-    <w:lvl w:ilvl="6" w:tplc="99B2D1DE">
+    <w:lvl w:ilvl="6" w:tplc="0F42A086">
       <w:numFmt w:val="decimal"/>
       <w:lvlText w:val=""/>
       <w:lvlJc w:val="left"/>
     </w:lvl>
-    <w:lvl w:ilvl="7" w:tplc="B948785C">
+    <w:lvl w:ilvl="7" w:tplc="E592D5EC">
       <w:numFmt w:val="decimal"/>
       <w:lvlText w:val=""/>
       <w:lvlJc w:val="left"/>
     </w:lvl>
-    <w:lvl w:ilvl="8" w:tplc="F6BC3EC4">
+    <w:lvl w:ilvl="8" w:tplc="6E0A0D70">
       <w:numFmt w:val="decimal"/>
       <w:lvlText w:val=""/>
       <w:lvlJc w:val="left"/>
     </w:lvl>
   </w:abstractNum>
   <w:abstractNum w:abstractNumId="5" w15:restartNumberingAfterBreak="0">
-    <w:nsid w:val="126F4F01"/>
+    <w:nsid w:val="208666DF"/>
     <w:multiLevelType w:val="hybridMultilevel"/>
-    <w:tmpl w:val="5BFC4DF4"/>
-    <w:lvl w:ilvl="0" w:tplc="203C04D2">
+    <w:tmpl w:val="7A56BF20"/>
+    <w:lvl w:ilvl="0" w:tplc="CAB40DC6">
       <w:start w:val="1"/>
       <w:numFmt w:val="decimal"/>
       <w:lvlText w:val="%1."/>
@@ -21871,52 +22288,52 @@
         <w:color w:val="A67C27"/>
       </w:rPr>
     </w:lvl>
-    <w:lvl w:ilvl="1" w:tplc="6510A776">
+    <w:lvl w:ilvl="1" w:tplc="B9BAB720">
       <w:numFmt w:val="decimal"/>
       <w:lvlText w:val=""/>
       <w:lvlJc w:val="left"/>
     </w:lvl>
-    <w:lvl w:ilvl="2" w:tplc="CDDE4258">
+    <w:lvl w:ilvl="2" w:tplc="EED6165E">
       <w:numFmt w:val="decimal"/>
       <w:lvlText w:val=""/>
       <w:lvlJc w:val="left"/>
     </w:lvl>
-    <w:lvl w:ilvl="3" w:tplc="AF62D40C">
+    <w:lvl w:ilvl="3" w:tplc="5C30268A">
       <w:numFmt w:val="decimal"/>
       <w:lvlText w:val=""/>
       <w:lvlJc w:val="left"/>
     </w:lvl>
-    <w:lvl w:ilvl="4" w:tplc="66A076CA">
+    <w:lvl w:ilvl="4" w:tplc="F43C605C">
       <w:numFmt w:val="decimal"/>
       <w:lvlText w:val=""/>
       <w:lvlJc w:val="left"/>
     </w:lvl>
-    <w:lvl w:ilvl="5" w:tplc="97EE2532">
+    <w:lvl w:ilvl="5" w:tplc="32BA9858">
       <w:numFmt w:val="decimal"/>
       <w:lvlText w:val=""/>
       <w:lvlJc w:val="left"/>
     </w:lvl>
-    <w:lvl w:ilvl="6" w:tplc="66EE4142">
+    <w:lvl w:ilvl="6" w:tplc="FF562FA4">
       <w:numFmt w:val="decimal"/>
       <w:lvlText w:val=""/>
       <w:lvlJc w:val="left"/>
     </w:lvl>
-    <w:lvl w:ilvl="7" w:tplc="04B6F66E">
+    <w:lvl w:ilvl="7" w:tplc="0CD21720">
       <w:numFmt w:val="decimal"/>
       <w:lvlText w:val=""/>
       <w:lvlJc w:val="left"/>
     </w:lvl>
-    <w:lvl w:ilvl="8" w:tplc="708AD95E">
+    <w:lvl w:ilvl="8" w:tplc="95BCFCD6">
       <w:numFmt w:val="decimal"/>
       <w:lvlText w:val=""/>
       <w:lvlJc w:val="left"/>
     </w:lvl>
   </w:abstractNum>
   <w:abstractNum w:abstractNumId="6" w15:restartNumberingAfterBreak="0">
-    <w:nsid w:val="19F46DA9"/>
+    <w:nsid w:val="22CD419B"/>
     <w:multiLevelType w:val="hybridMultilevel"/>
-    <w:tmpl w:val="79009030"/>
-    <w:lvl w:ilvl="0" w:tplc="1716F4E0">
+    <w:tmpl w:val="48C4EECE"/>
+    <w:lvl w:ilvl="0" w:tplc="E368969A">
       <w:start w:val="1"/>
       <w:numFmt w:val="decimal"/>
       <w:lvlText w:val="%1."/>
@@ -21930,110 +22347,111 @@
         <w:color w:val="A67C27"/>
       </w:rPr>
     </w:lvl>
-    <w:lvl w:ilvl="1" w:tplc="CDACF9D8">
+    <w:lvl w:ilvl="1" w:tplc="194616CA">
       <w:numFmt w:val="decimal"/>
       <w:lvlText w:val=""/>
       <w:lvlJc w:val="left"/>
     </w:lvl>
-    <w:lvl w:ilvl="2" w:tplc="7AEACDEA">
+    <w:lvl w:ilvl="2" w:tplc="8738FC6A">
       <w:numFmt w:val="decimal"/>
       <w:lvlText w:val=""/>
       <w:lvlJc w:val="left"/>
     </w:lvl>
-    <w:lvl w:ilvl="3" w:tplc="24A41ED0">
+    <w:lvl w:ilvl="3" w:tplc="1FDCB8C6">
       <w:numFmt w:val="decimal"/>
       <w:lvlText w:val=""/>
       <w:lvlJc w:val="left"/>
     </w:lvl>
-    <w:lvl w:ilvl="4" w:tplc="54500074">
+    <w:lvl w:ilvl="4" w:tplc="3C364B14">
       <w:numFmt w:val="decimal"/>
       <w:lvlText w:val=""/>
       <w:lvlJc w:val="left"/>
     </w:lvl>
-    <w:lvl w:ilvl="5" w:tplc="BAF85396">
+    <w:lvl w:ilvl="5" w:tplc="908E3858">
       <w:numFmt w:val="decimal"/>
       <w:lvlText w:val=""/>
       <w:lvlJc w:val="left"/>
     </w:lvl>
-    <w:lvl w:ilvl="6" w:tplc="2424D0E4">
+    <w:lvl w:ilvl="6" w:tplc="F392B426">
       <w:numFmt w:val="decimal"/>
       <w:lvlText w:val=""/>
       <w:lvlJc w:val="left"/>
     </w:lvl>
-    <w:lvl w:ilvl="7" w:tplc="38128148">
+    <w:lvl w:ilvl="7" w:tplc="CD548FF8">
       <w:numFmt w:val="decimal"/>
       <w:lvlText w:val=""/>
       <w:lvlJc w:val="left"/>
     </w:lvl>
-    <w:lvl w:ilvl="8" w:tplc="466282B4">
+    <w:lvl w:ilvl="8" w:tplc="BAE68170">
       <w:numFmt w:val="decimal"/>
       <w:lvlText w:val=""/>
       <w:lvlJc w:val="left"/>
     </w:lvl>
   </w:abstractNum>
   <w:abstractNum w:abstractNumId="7" w15:restartNumberingAfterBreak="0">
-    <w:nsid w:val="22B11DA8"/>
+    <w:nsid w:val="239D7C2D"/>
     <w:multiLevelType w:val="hybridMultilevel"/>
-    <w:tmpl w:val="B99C2394"/>
-    <w:lvl w:ilvl="0" w:tplc="31EE0474">
+    <w:tmpl w:val="16F63A66"/>
+    <w:lvl w:ilvl="0" w:tplc="D17E8574">
       <w:start w:val="1"/>
-      <w:numFmt w:val="bullet"/>
-      <w:lvlText w:val="•"/>
+      <w:numFmt w:val="decimal"/>
+      <w:lvlText w:val="%1."/>
       <w:lvlJc w:val="left"/>
       <w:pPr>
-        <w:ind w:left="460" w:hanging="280"/>
-      </w:pPr>
+        <w:ind w:left="460" w:hanging="360"/>
+      </w:pPr>
+      <w:rPr>
+        <w:b/>
+        <w:bCs/>
+        <w:color w:val="A67C27"/>
+      </w:rPr>
     </w:lvl>
-    <w:lvl w:ilvl="1" w:tplc="3DB8504C">
-      <w:start w:val="1"/>
-      <w:numFmt w:val="bullet"/>
-      <w:lvlText w:val="–"/>
-      <w:lvlJc w:val="left"/>
-      <w:pPr>
-        <w:ind w:left="900" w:hanging="280"/>
-      </w:pPr>
-    </w:lvl>
-    <w:lvl w:ilvl="2" w:tplc="DA92D002">
+    <w:lvl w:ilvl="1" w:tplc="249E253E">
       <w:numFmt w:val="decimal"/>
       <w:lvlText w:val=""/>
       <w:lvlJc w:val="left"/>
     </w:lvl>
-    <w:lvl w:ilvl="3" w:tplc="826275B6">
+    <w:lvl w:ilvl="2" w:tplc="0FE2BF2A">
       <w:numFmt w:val="decimal"/>
       <w:lvlText w:val=""/>
       <w:lvlJc w:val="left"/>
     </w:lvl>
-    <w:lvl w:ilvl="4" w:tplc="58949194">
+    <w:lvl w:ilvl="3" w:tplc="66B46D88">
       <w:numFmt w:val="decimal"/>
       <w:lvlText w:val=""/>
       <w:lvlJc w:val="left"/>
     </w:lvl>
-    <w:lvl w:ilvl="5" w:tplc="799AAB84">
+    <w:lvl w:ilvl="4" w:tplc="75A6DD62">
       <w:numFmt w:val="decimal"/>
       <w:lvlText w:val=""/>
       <w:lvlJc w:val="left"/>
     </w:lvl>
-    <w:lvl w:ilvl="6" w:tplc="6832E22E">
+    <w:lvl w:ilvl="5" w:tplc="A9D6EE44">
       <w:numFmt w:val="decimal"/>
       <w:lvlText w:val=""/>
       <w:lvlJc w:val="left"/>
     </w:lvl>
-    <w:lvl w:ilvl="7" w:tplc="7D7A46E0">
+    <w:lvl w:ilvl="6" w:tplc="317E1C56">
       <w:numFmt w:val="decimal"/>
       <w:lvlText w:val=""/>
       <w:lvlJc w:val="left"/>
     </w:lvl>
-    <w:lvl w:ilvl="8" w:tplc="80EA238E">
+    <w:lvl w:ilvl="7" w:tplc="7B2A5B6C">
+      <w:numFmt w:val="decimal"/>
+      <w:lvlText w:val=""/>
+      <w:lvlJc w:val="left"/>
+    </w:lvl>
+    <w:lvl w:ilvl="8" w:tplc="B868FBBE">
       <w:numFmt w:val="decimal"/>
       <w:lvlText w:val=""/>
       <w:lvlJc w:val="left"/>
     </w:lvl>
   </w:abstractNum>
   <w:abstractNum w:abstractNumId="8" w15:restartNumberingAfterBreak="0">
-    <w:nsid w:val="24005CF4"/>
+    <w:nsid w:val="28A3312F"/>
     <w:multiLevelType w:val="hybridMultilevel"/>
-    <w:tmpl w:val="7A40464C"/>
-    <w:lvl w:ilvl="0" w:tplc="4CA6D6DE">
+    <w:tmpl w:val="127A2786"/>
+    <w:lvl w:ilvl="0" w:tplc="96AA88D2">
       <w:start w:val="1"/>
       <w:numFmt w:val="decimal"/>
       <w:lvlText w:val="%1."/>
@@ -22047,138 +22465,52 @@
         <w:color w:val="A67C27"/>
       </w:rPr>
     </w:lvl>
-    <w:lvl w:ilvl="1" w:tplc="BDD66F54">
+    <w:lvl w:ilvl="1" w:tplc="615EA8E8">
       <w:numFmt w:val="decimal"/>
       <w:lvlText w:val=""/>
       <w:lvlJc w:val="left"/>
     </w:lvl>
-    <w:lvl w:ilvl="2" w:tplc="8448661C">
+    <w:lvl w:ilvl="2" w:tplc="6DAE0612">
       <w:numFmt w:val="decimal"/>
       <w:lvlText w:val=""/>
       <w:lvlJc w:val="left"/>
     </w:lvl>
-    <w:lvl w:ilvl="3" w:tplc="D466E816">
+    <w:lvl w:ilvl="3" w:tplc="45BA4720">
       <w:numFmt w:val="decimal"/>
       <w:lvlText w:val=""/>
       <w:lvlJc w:val="left"/>
     </w:lvl>
-    <w:lvl w:ilvl="4" w:tplc="111EFF46">
+    <w:lvl w:ilvl="4" w:tplc="0134703A">
       <w:numFmt w:val="decimal"/>
       <w:lvlText w:val=""/>
       <w:lvlJc w:val="left"/>
     </w:lvl>
-    <w:lvl w:ilvl="5" w:tplc="A7923416">
+    <w:lvl w:ilvl="5" w:tplc="B916F0C4">
       <w:numFmt w:val="decimal"/>
       <w:lvlText w:val=""/>
       <w:lvlJc w:val="left"/>
     </w:lvl>
-    <w:lvl w:ilvl="6" w:tplc="AD1C844A">
+    <w:lvl w:ilvl="6" w:tplc="2A267A36">
       <w:numFmt w:val="decimal"/>
       <w:lvlText w:val=""/>
       <w:lvlJc w:val="left"/>
     </w:lvl>
-    <w:lvl w:ilvl="7" w:tplc="888CCBFC">
+    <w:lvl w:ilvl="7" w:tplc="0240A54E">
       <w:numFmt w:val="decimal"/>
       <w:lvlText w:val=""/>
       <w:lvlJc w:val="left"/>
     </w:lvl>
-    <w:lvl w:ilvl="8" w:tplc="167631C2">
+    <w:lvl w:ilvl="8" w:tplc="15A850A0">
       <w:numFmt w:val="decimal"/>
       <w:lvlText w:val=""/>
       <w:lvlJc w:val="left"/>
     </w:lvl>
   </w:abstractNum>
   <w:abstractNum w:abstractNumId="9" w15:restartNumberingAfterBreak="0">
-    <w:nsid w:val="253A4D71"/>
+    <w:nsid w:val="33E511D7"/>
     <w:multiLevelType w:val="hybridMultilevel"/>
-    <w:tmpl w:val="5FB89046"/>
-    <w:lvl w:ilvl="0" w:tplc="3CCA95B6">
-      <w:start w:val="1"/>
-      <w:numFmt w:val="bullet"/>
-      <w:lvlText w:val="●"/>
-      <w:lvlJc w:val="left"/>
-      <w:pPr>
-        <w:ind w:left="720" w:hanging="360"/>
-      </w:pPr>
-    </w:lvl>
-    <w:lvl w:ilvl="1" w:tplc="E2E6468E">
-      <w:start w:val="1"/>
-      <w:numFmt w:val="bullet"/>
-      <w:lvlText w:val="○"/>
-      <w:lvlJc w:val="left"/>
-      <w:pPr>
-        <w:ind w:left="1440" w:hanging="360"/>
-      </w:pPr>
-    </w:lvl>
-    <w:lvl w:ilvl="2" w:tplc="4A1EDBCE">
-      <w:start w:val="1"/>
-      <w:numFmt w:val="bullet"/>
-      <w:lvlText w:val="■"/>
-      <w:lvlJc w:val="left"/>
-      <w:pPr>
-        <w:ind w:left="2160" w:hanging="360"/>
-      </w:pPr>
-    </w:lvl>
-    <w:lvl w:ilvl="3" w:tplc="00BC8D52">
-      <w:start w:val="1"/>
-      <w:numFmt w:val="bullet"/>
-      <w:lvlText w:val="●"/>
-      <w:lvlJc w:val="left"/>
-      <w:pPr>
-        <w:ind w:left="2880" w:hanging="360"/>
-      </w:pPr>
-    </w:lvl>
-    <w:lvl w:ilvl="4" w:tplc="1AB8517E">
-      <w:start w:val="1"/>
-      <w:numFmt w:val="bullet"/>
-      <w:lvlText w:val="○"/>
-      <w:lvlJc w:val="left"/>
-      <w:pPr>
-        <w:ind w:left="3600" w:hanging="360"/>
-      </w:pPr>
-    </w:lvl>
-    <w:lvl w:ilvl="5" w:tplc="A186142E">
-      <w:start w:val="1"/>
-      <w:numFmt w:val="bullet"/>
-      <w:lvlText w:val="■"/>
-      <w:lvlJc w:val="left"/>
-      <w:pPr>
-        <w:ind w:left="4320" w:hanging="360"/>
-      </w:pPr>
-    </w:lvl>
-    <w:lvl w:ilvl="6" w:tplc="8892D886">
-      <w:start w:val="1"/>
-      <w:numFmt w:val="bullet"/>
-      <w:lvlText w:val="●"/>
-      <w:lvlJc w:val="left"/>
-      <w:pPr>
-        <w:ind w:left="5040" w:hanging="360"/>
-      </w:pPr>
-    </w:lvl>
-    <w:lvl w:ilvl="7" w:tplc="4B7EB104">
-      <w:start w:val="1"/>
-      <w:numFmt w:val="bullet"/>
-      <w:lvlText w:val="●"/>
-      <w:lvlJc w:val="left"/>
-      <w:pPr>
-        <w:ind w:left="5760" w:hanging="360"/>
-      </w:pPr>
-    </w:lvl>
-    <w:lvl w:ilvl="8" w:tplc="57782CDC">
-      <w:start w:val="1"/>
-      <w:numFmt w:val="bullet"/>
-      <w:lvlText w:val="●"/>
-      <w:lvlJc w:val="left"/>
-      <w:pPr>
-        <w:ind w:left="6480" w:hanging="360"/>
-      </w:pPr>
-    </w:lvl>
-  </w:abstractNum>
-  <w:abstractNum w:abstractNumId="10" w15:restartNumberingAfterBreak="0">
-    <w:nsid w:val="28C962DC"/>
-    <w:multiLevelType w:val="hybridMultilevel"/>
-    <w:tmpl w:val="C82499CE"/>
-    <w:lvl w:ilvl="0" w:tplc="004246F4">
+    <w:tmpl w:val="53788A3E"/>
+    <w:lvl w:ilvl="0" w:tplc="DC788AF4">
       <w:start w:val="1"/>
       <w:numFmt w:val="decimal"/>
       <w:lvlText w:val="%1."/>
@@ -22192,52 +22524,111 @@
         <w:color w:val="A67C27"/>
       </w:rPr>
     </w:lvl>
-    <w:lvl w:ilvl="1" w:tplc="57BA0D66">
+    <w:lvl w:ilvl="1" w:tplc="530A40AC">
       <w:numFmt w:val="decimal"/>
       <w:lvlText w:val=""/>
       <w:lvlJc w:val="left"/>
     </w:lvl>
-    <w:lvl w:ilvl="2" w:tplc="6DF004C8">
+    <w:lvl w:ilvl="2" w:tplc="60D400BE">
       <w:numFmt w:val="decimal"/>
       <w:lvlText w:val=""/>
       <w:lvlJc w:val="left"/>
     </w:lvl>
-    <w:lvl w:ilvl="3" w:tplc="BC1858AE">
+    <w:lvl w:ilvl="3" w:tplc="DF00AD80">
       <w:numFmt w:val="decimal"/>
       <w:lvlText w:val=""/>
       <w:lvlJc w:val="left"/>
     </w:lvl>
-    <w:lvl w:ilvl="4" w:tplc="63542404">
+    <w:lvl w:ilvl="4" w:tplc="B7F6FCB8">
       <w:numFmt w:val="decimal"/>
       <w:lvlText w:val=""/>
       <w:lvlJc w:val="left"/>
     </w:lvl>
-    <w:lvl w:ilvl="5" w:tplc="06E6F94E">
+    <w:lvl w:ilvl="5" w:tplc="E268372C">
       <w:numFmt w:val="decimal"/>
       <w:lvlText w:val=""/>
       <w:lvlJc w:val="left"/>
     </w:lvl>
-    <w:lvl w:ilvl="6" w:tplc="BEA0B14C">
+    <w:lvl w:ilvl="6" w:tplc="242AE870">
       <w:numFmt w:val="decimal"/>
       <w:lvlText w:val=""/>
       <w:lvlJc w:val="left"/>
     </w:lvl>
-    <w:lvl w:ilvl="7" w:tplc="3BB63F56">
+    <w:lvl w:ilvl="7" w:tplc="9A729390">
       <w:numFmt w:val="decimal"/>
       <w:lvlText w:val=""/>
       <w:lvlJc w:val="left"/>
     </w:lvl>
-    <w:lvl w:ilvl="8" w:tplc="23F84B5A">
+    <w:lvl w:ilvl="8" w:tplc="A2261F12">
+      <w:numFmt w:val="decimal"/>
+      <w:lvlText w:val=""/>
+      <w:lvlJc w:val="left"/>
+    </w:lvl>
+  </w:abstractNum>
+  <w:abstractNum w:abstractNumId="10" w15:restartNumberingAfterBreak="0">
+    <w:nsid w:val="36A16EA1"/>
+    <w:multiLevelType w:val="hybridMultilevel"/>
+    <w:tmpl w:val="DC2AD616"/>
+    <w:lvl w:ilvl="0" w:tplc="A4445272">
+      <w:start w:val="1"/>
+      <w:numFmt w:val="decimal"/>
+      <w:lvlText w:val="%1."/>
+      <w:lvlJc w:val="left"/>
+      <w:pPr>
+        <w:ind w:left="460" w:hanging="360"/>
+      </w:pPr>
+      <w:rPr>
+        <w:b/>
+        <w:bCs/>
+        <w:color w:val="A67C27"/>
+      </w:rPr>
+    </w:lvl>
+    <w:lvl w:ilvl="1" w:tplc="7002881C">
+      <w:numFmt w:val="decimal"/>
+      <w:lvlText w:val=""/>
+      <w:lvlJc w:val="left"/>
+    </w:lvl>
+    <w:lvl w:ilvl="2" w:tplc="12AE057E">
+      <w:numFmt w:val="decimal"/>
+      <w:lvlText w:val=""/>
+      <w:lvlJc w:val="left"/>
+    </w:lvl>
+    <w:lvl w:ilvl="3" w:tplc="1AA6BC34">
+      <w:numFmt w:val="decimal"/>
+      <w:lvlText w:val=""/>
+      <w:lvlJc w:val="left"/>
+    </w:lvl>
+    <w:lvl w:ilvl="4" w:tplc="9A342250">
+      <w:numFmt w:val="decimal"/>
+      <w:lvlText w:val=""/>
+      <w:lvlJc w:val="left"/>
+    </w:lvl>
+    <w:lvl w:ilvl="5" w:tplc="ADEEFE60">
+      <w:numFmt w:val="decimal"/>
+      <w:lvlText w:val=""/>
+      <w:lvlJc w:val="left"/>
+    </w:lvl>
+    <w:lvl w:ilvl="6" w:tplc="647EC570">
+      <w:numFmt w:val="decimal"/>
+      <w:lvlText w:val=""/>
+      <w:lvlJc w:val="left"/>
+    </w:lvl>
+    <w:lvl w:ilvl="7" w:tplc="09A44CEC">
+      <w:numFmt w:val="decimal"/>
+      <w:lvlText w:val=""/>
+      <w:lvlJc w:val="left"/>
+    </w:lvl>
+    <w:lvl w:ilvl="8" w:tplc="8EDC0E7A">
       <w:numFmt w:val="decimal"/>
       <w:lvlText w:val=""/>
       <w:lvlJc w:val="left"/>
     </w:lvl>
   </w:abstractNum>
   <w:abstractNum w:abstractNumId="11" w15:restartNumberingAfterBreak="0">
-    <w:nsid w:val="2BD66780"/>
+    <w:nsid w:val="3EA87B60"/>
     <w:multiLevelType w:val="hybridMultilevel"/>
-    <w:tmpl w:val="B4942BFE"/>
-    <w:lvl w:ilvl="0" w:tplc="0D3E8530">
+    <w:tmpl w:val="AFB08096"/>
+    <w:lvl w:ilvl="0" w:tplc="612A0C5A">
       <w:start w:val="1"/>
       <w:numFmt w:val="decimal"/>
       <w:lvlText w:val="%1."/>
@@ -22251,52 +22642,52 @@
         <w:color w:val="A67C27"/>
       </w:rPr>
     </w:lvl>
-    <w:lvl w:ilvl="1" w:tplc="FE42DA42">
+    <w:lvl w:ilvl="1" w:tplc="593E283C">
       <w:numFmt w:val="decimal"/>
       <w:lvlText w:val=""/>
       <w:lvlJc w:val="left"/>
     </w:lvl>
-    <w:lvl w:ilvl="2" w:tplc="C5723614">
+    <w:lvl w:ilvl="2" w:tplc="11D44EE2">
       <w:numFmt w:val="decimal"/>
       <w:lvlText w:val=""/>
       <w:lvlJc w:val="left"/>
     </w:lvl>
-    <w:lvl w:ilvl="3" w:tplc="E764AB82">
+    <w:lvl w:ilvl="3" w:tplc="9B8CE898">
       <w:numFmt w:val="decimal"/>
       <w:lvlText w:val=""/>
       <w:lvlJc w:val="left"/>
     </w:lvl>
-    <w:lvl w:ilvl="4" w:tplc="0EE83718">
+    <w:lvl w:ilvl="4" w:tplc="CB620BA2">
       <w:numFmt w:val="decimal"/>
       <w:lvlText w:val=""/>
       <w:lvlJc w:val="left"/>
     </w:lvl>
-    <w:lvl w:ilvl="5" w:tplc="DE7E1B28">
+    <w:lvl w:ilvl="5" w:tplc="BCA495BE">
       <w:numFmt w:val="decimal"/>
       <w:lvlText w:val=""/>
       <w:lvlJc w:val="left"/>
     </w:lvl>
-    <w:lvl w:ilvl="6" w:tplc="52B6725C">
+    <w:lvl w:ilvl="6" w:tplc="FF5C051A">
       <w:numFmt w:val="decimal"/>
       <w:lvlText w:val=""/>
       <w:lvlJc w:val="left"/>
     </w:lvl>
-    <w:lvl w:ilvl="7" w:tplc="BD8AFE54">
+    <w:lvl w:ilvl="7" w:tplc="31CA6ABE">
       <w:numFmt w:val="decimal"/>
       <w:lvlText w:val=""/>
       <w:lvlJc w:val="left"/>
     </w:lvl>
-    <w:lvl w:ilvl="8" w:tplc="830262CE">
+    <w:lvl w:ilvl="8" w:tplc="7200E384">
       <w:numFmt w:val="decimal"/>
       <w:lvlText w:val=""/>
       <w:lvlJc w:val="left"/>
     </w:lvl>
   </w:abstractNum>
   <w:abstractNum w:abstractNumId="12" w15:restartNumberingAfterBreak="0">
-    <w:nsid w:val="2F09181D"/>
+    <w:nsid w:val="459B1998"/>
     <w:multiLevelType w:val="hybridMultilevel"/>
-    <w:tmpl w:val="8EB89D08"/>
-    <w:lvl w:ilvl="0" w:tplc="E62E3030">
+    <w:tmpl w:val="1BB073D0"/>
+    <w:lvl w:ilvl="0" w:tplc="7F3CBB40">
       <w:start w:val="1"/>
       <w:numFmt w:val="decimal"/>
       <w:lvlText w:val="%1."/>
@@ -22310,52 +22701,52 @@
         <w:color w:val="A67C27"/>
       </w:rPr>
     </w:lvl>
-    <w:lvl w:ilvl="1" w:tplc="1BFACAAE">
+    <w:lvl w:ilvl="1" w:tplc="40C8931C">
       <w:numFmt w:val="decimal"/>
       <w:lvlText w:val=""/>
       <w:lvlJc w:val="left"/>
     </w:lvl>
-    <w:lvl w:ilvl="2" w:tplc="27C2815A">
+    <w:lvl w:ilvl="2" w:tplc="34CE0DDA">
       <w:numFmt w:val="decimal"/>
       <w:lvlText w:val=""/>
       <w:lvlJc w:val="left"/>
     </w:lvl>
-    <w:lvl w:ilvl="3" w:tplc="E9D2C8FC">
+    <w:lvl w:ilvl="3" w:tplc="D276AA78">
       <w:numFmt w:val="decimal"/>
       <w:lvlText w:val=""/>
       <w:lvlJc w:val="left"/>
     </w:lvl>
-    <w:lvl w:ilvl="4" w:tplc="072EBABE">
+    <w:lvl w:ilvl="4" w:tplc="42A89AB4">
       <w:numFmt w:val="decimal"/>
       <w:lvlText w:val=""/>
       <w:lvlJc w:val="left"/>
     </w:lvl>
-    <w:lvl w:ilvl="5" w:tplc="BC64CCF0">
+    <w:lvl w:ilvl="5" w:tplc="5894ACC4">
       <w:numFmt w:val="decimal"/>
       <w:lvlText w:val=""/>
       <w:lvlJc w:val="left"/>
     </w:lvl>
-    <w:lvl w:ilvl="6" w:tplc="B0486E60">
+    <w:lvl w:ilvl="6" w:tplc="4516CDE4">
       <w:numFmt w:val="decimal"/>
       <w:lvlText w:val=""/>
       <w:lvlJc w:val="left"/>
     </w:lvl>
-    <w:lvl w:ilvl="7" w:tplc="DA1C24C4">
+    <w:lvl w:ilvl="7" w:tplc="280A786A">
       <w:numFmt w:val="decimal"/>
       <w:lvlText w:val=""/>
       <w:lvlJc w:val="left"/>
     </w:lvl>
-    <w:lvl w:ilvl="8" w:tplc="C42ECE7C">
+    <w:lvl w:ilvl="8" w:tplc="0A1C15AE">
       <w:numFmt w:val="decimal"/>
       <w:lvlText w:val=""/>
       <w:lvlJc w:val="left"/>
     </w:lvl>
   </w:abstractNum>
   <w:abstractNum w:abstractNumId="13" w15:restartNumberingAfterBreak="0">
-    <w:nsid w:val="3C595D7B"/>
+    <w:nsid w:val="4A741639"/>
     <w:multiLevelType w:val="hybridMultilevel"/>
-    <w:tmpl w:val="E43E9D48"/>
-    <w:lvl w:ilvl="0" w:tplc="7ADE308E">
+    <w:tmpl w:val="8BAA7C2A"/>
+    <w:lvl w:ilvl="0" w:tplc="F81E18C4">
       <w:start w:val="1"/>
       <w:numFmt w:val="decimal"/>
       <w:lvlText w:val="%1."/>
@@ -22369,52 +22760,52 @@
         <w:color w:val="A67C27"/>
       </w:rPr>
     </w:lvl>
-    <w:lvl w:ilvl="1" w:tplc="0FBCF2AE">
+    <w:lvl w:ilvl="1" w:tplc="64E4E540">
       <w:numFmt w:val="decimal"/>
       <w:lvlText w:val=""/>
       <w:lvlJc w:val="left"/>
     </w:lvl>
-    <w:lvl w:ilvl="2" w:tplc="984E7962">
+    <w:lvl w:ilvl="2" w:tplc="711CCB98">
       <w:numFmt w:val="decimal"/>
       <w:lvlText w:val=""/>
       <w:lvlJc w:val="left"/>
     </w:lvl>
-    <w:lvl w:ilvl="3" w:tplc="0AB6558E">
+    <w:lvl w:ilvl="3" w:tplc="0B0ACD42">
       <w:numFmt w:val="decimal"/>
       <w:lvlText w:val=""/>
       <w:lvlJc w:val="left"/>
     </w:lvl>
-    <w:lvl w:ilvl="4" w:tplc="BEB6F396">
+    <w:lvl w:ilvl="4" w:tplc="0A8C0E7E">
       <w:numFmt w:val="decimal"/>
       <w:lvlText w:val=""/>
       <w:lvlJc w:val="left"/>
     </w:lvl>
-    <w:lvl w:ilvl="5" w:tplc="7C3EC326">
+    <w:lvl w:ilvl="5" w:tplc="65BE9B54">
       <w:numFmt w:val="decimal"/>
       <w:lvlText w:val=""/>
       <w:lvlJc w:val="left"/>
     </w:lvl>
-    <w:lvl w:ilvl="6" w:tplc="258028BA">
+    <w:lvl w:ilvl="6" w:tplc="5A0610C0">
       <w:numFmt w:val="decimal"/>
       <w:lvlText w:val=""/>
       <w:lvlJc w:val="left"/>
     </w:lvl>
-    <w:lvl w:ilvl="7" w:tplc="F1DAD814">
+    <w:lvl w:ilvl="7" w:tplc="04C68150">
       <w:numFmt w:val="decimal"/>
       <w:lvlText w:val=""/>
       <w:lvlJc w:val="left"/>
     </w:lvl>
-    <w:lvl w:ilvl="8" w:tplc="211A67CC">
+    <w:lvl w:ilvl="8" w:tplc="42F8B6B4">
       <w:numFmt w:val="decimal"/>
       <w:lvlText w:val=""/>
       <w:lvlJc w:val="left"/>
     </w:lvl>
   </w:abstractNum>
   <w:abstractNum w:abstractNumId="14" w15:restartNumberingAfterBreak="0">
-    <w:nsid w:val="3C8861F2"/>
+    <w:nsid w:val="595A227C"/>
     <w:multiLevelType w:val="hybridMultilevel"/>
-    <w:tmpl w:val="8AB0E87E"/>
-    <w:lvl w:ilvl="0" w:tplc="E0B41CCA">
+    <w:tmpl w:val="4D16CCD4"/>
+    <w:lvl w:ilvl="0" w:tplc="6018DD78">
       <w:start w:val="1"/>
       <w:numFmt w:val="decimal"/>
       <w:lvlText w:val="%1."/>
@@ -22428,52 +22819,52 @@
         <w:color w:val="A67C27"/>
       </w:rPr>
     </w:lvl>
-    <w:lvl w:ilvl="1" w:tplc="B2B8E6B6">
+    <w:lvl w:ilvl="1" w:tplc="FA82FBBC">
       <w:numFmt w:val="decimal"/>
       <w:lvlText w:val=""/>
       <w:lvlJc w:val="left"/>
     </w:lvl>
-    <w:lvl w:ilvl="2" w:tplc="5908F11E">
+    <w:lvl w:ilvl="2" w:tplc="DDCA2C6C">
       <w:numFmt w:val="decimal"/>
       <w:lvlText w:val=""/>
       <w:lvlJc w:val="left"/>
     </w:lvl>
-    <w:lvl w:ilvl="3" w:tplc="AB4C07F0">
+    <w:lvl w:ilvl="3" w:tplc="8724D5D0">
       <w:numFmt w:val="decimal"/>
       <w:lvlText w:val=""/>
       <w:lvlJc w:val="left"/>
     </w:lvl>
-    <w:lvl w:ilvl="4" w:tplc="F11C433A">
+    <w:lvl w:ilvl="4" w:tplc="31E694E6">
       <w:numFmt w:val="decimal"/>
       <w:lvlText w:val=""/>
       <w:lvlJc w:val="left"/>
     </w:lvl>
-    <w:lvl w:ilvl="5" w:tplc="56BE2CBC">
+    <w:lvl w:ilvl="5" w:tplc="C2501AE0">
       <w:numFmt w:val="decimal"/>
       <w:lvlText w:val=""/>
       <w:lvlJc w:val="left"/>
     </w:lvl>
-    <w:lvl w:ilvl="6" w:tplc="6BF2AFA4">
+    <w:lvl w:ilvl="6" w:tplc="7A3CD2E6">
       <w:numFmt w:val="decimal"/>
       <w:lvlText w:val=""/>
       <w:lvlJc w:val="left"/>
     </w:lvl>
-    <w:lvl w:ilvl="7" w:tplc="9926CCCC">
+    <w:lvl w:ilvl="7" w:tplc="7C68220C">
       <w:numFmt w:val="decimal"/>
       <w:lvlText w:val=""/>
       <w:lvlJc w:val="left"/>
     </w:lvl>
-    <w:lvl w:ilvl="8" w:tplc="4CB060CA">
+    <w:lvl w:ilvl="8" w:tplc="6C58E5BA">
       <w:numFmt w:val="decimal"/>
       <w:lvlText w:val=""/>
       <w:lvlJc w:val="left"/>
     </w:lvl>
   </w:abstractNum>
   <w:abstractNum w:abstractNumId="15" w15:restartNumberingAfterBreak="0">
-    <w:nsid w:val="3D6463A9"/>
+    <w:nsid w:val="5A2D26A7"/>
     <w:multiLevelType w:val="hybridMultilevel"/>
-    <w:tmpl w:val="387669B6"/>
-    <w:lvl w:ilvl="0" w:tplc="02CED044">
+    <w:tmpl w:val="FDAE81F4"/>
+    <w:lvl w:ilvl="0" w:tplc="EFF2AB36">
       <w:start w:val="1"/>
       <w:numFmt w:val="decimal"/>
       <w:lvlText w:val="%1."/>
@@ -22487,52 +22878,52 @@
         <w:color w:val="A67C27"/>
       </w:rPr>
     </w:lvl>
-    <w:lvl w:ilvl="1" w:tplc="7754751E">
+    <w:lvl w:ilvl="1" w:tplc="C3D41B40">
       <w:numFmt w:val="decimal"/>
       <w:lvlText w:val=""/>
       <w:lvlJc w:val="left"/>
     </w:lvl>
-    <w:lvl w:ilvl="2" w:tplc="8A08D1BE">
+    <w:lvl w:ilvl="2" w:tplc="CBE6E964">
       <w:numFmt w:val="decimal"/>
       <w:lvlText w:val=""/>
       <w:lvlJc w:val="left"/>
     </w:lvl>
-    <w:lvl w:ilvl="3" w:tplc="162E2894">
+    <w:lvl w:ilvl="3" w:tplc="55F6132C">
       <w:numFmt w:val="decimal"/>
       <w:lvlText w:val=""/>
       <w:lvlJc w:val="left"/>
     </w:lvl>
-    <w:lvl w:ilvl="4" w:tplc="44BA0774">
+    <w:lvl w:ilvl="4" w:tplc="EAF44E2E">
       <w:numFmt w:val="decimal"/>
       <w:lvlText w:val=""/>
       <w:lvlJc w:val="left"/>
     </w:lvl>
-    <w:lvl w:ilvl="5" w:tplc="535E8ECE">
+    <w:lvl w:ilvl="5" w:tplc="BD667FA0">
       <w:numFmt w:val="decimal"/>
       <w:lvlText w:val=""/>
       <w:lvlJc w:val="left"/>
     </w:lvl>
-    <w:lvl w:ilvl="6" w:tplc="1D00CF52">
+    <w:lvl w:ilvl="6" w:tplc="C3761986">
       <w:numFmt w:val="decimal"/>
       <w:lvlText w:val=""/>
       <w:lvlJc w:val="left"/>
     </w:lvl>
-    <w:lvl w:ilvl="7" w:tplc="069E1658">
+    <w:lvl w:ilvl="7" w:tplc="7B5C140E">
       <w:numFmt w:val="decimal"/>
       <w:lvlText w:val=""/>
       <w:lvlJc w:val="left"/>
     </w:lvl>
-    <w:lvl w:ilvl="8" w:tplc="6E96CDA6">
+    <w:lvl w:ilvl="8" w:tplc="D1BC9F9C">
       <w:numFmt w:val="decimal"/>
       <w:lvlText w:val=""/>
       <w:lvlJc w:val="left"/>
     </w:lvl>
   </w:abstractNum>
   <w:abstractNum w:abstractNumId="16" w15:restartNumberingAfterBreak="0">
-    <w:nsid w:val="539C4FD3"/>
+    <w:nsid w:val="5D1D5C9C"/>
     <w:multiLevelType w:val="hybridMultilevel"/>
-    <w:tmpl w:val="10FCF196"/>
-    <w:lvl w:ilvl="0" w:tplc="92A65326">
+    <w:tmpl w:val="223237D2"/>
+    <w:lvl w:ilvl="0" w:tplc="FAC03E20">
       <w:start w:val="1"/>
       <w:numFmt w:val="decimal"/>
       <w:lvlText w:val="%1."/>
@@ -22546,52 +22937,52 @@
         <w:color w:val="A67C27"/>
       </w:rPr>
     </w:lvl>
-    <w:lvl w:ilvl="1" w:tplc="304E7E7A">
+    <w:lvl w:ilvl="1" w:tplc="AA02BCC0">
       <w:numFmt w:val="decimal"/>
       <w:lvlText w:val=""/>
       <w:lvlJc w:val="left"/>
     </w:lvl>
-    <w:lvl w:ilvl="2" w:tplc="7AAA6E88">
+    <w:lvl w:ilvl="2" w:tplc="81344AE4">
       <w:numFmt w:val="decimal"/>
       <w:lvlText w:val=""/>
       <w:lvlJc w:val="left"/>
     </w:lvl>
-    <w:lvl w:ilvl="3" w:tplc="D6FAAD4C">
+    <w:lvl w:ilvl="3" w:tplc="868C4412">
       <w:numFmt w:val="decimal"/>
       <w:lvlText w:val=""/>
       <w:lvlJc w:val="left"/>
     </w:lvl>
-    <w:lvl w:ilvl="4" w:tplc="BE402852">
+    <w:lvl w:ilvl="4" w:tplc="DDC2D9CE">
       <w:numFmt w:val="decimal"/>
       <w:lvlText w:val=""/>
       <w:lvlJc w:val="left"/>
     </w:lvl>
-    <w:lvl w:ilvl="5" w:tplc="457876AC">
+    <w:lvl w:ilvl="5" w:tplc="6228F1AA">
       <w:numFmt w:val="decimal"/>
       <w:lvlText w:val=""/>
       <w:lvlJc w:val="left"/>
     </w:lvl>
-    <w:lvl w:ilvl="6" w:tplc="0C56A136">
+    <w:lvl w:ilvl="6" w:tplc="BFF826F6">
       <w:numFmt w:val="decimal"/>
       <w:lvlText w:val=""/>
       <w:lvlJc w:val="left"/>
     </w:lvl>
-    <w:lvl w:ilvl="7" w:tplc="0352D07C">
+    <w:lvl w:ilvl="7" w:tplc="FB9AF114">
       <w:numFmt w:val="decimal"/>
       <w:lvlText w:val=""/>
       <w:lvlJc w:val="left"/>
     </w:lvl>
-    <w:lvl w:ilvl="8" w:tplc="CCC42F76">
+    <w:lvl w:ilvl="8" w:tplc="3BD4B220">
       <w:numFmt w:val="decimal"/>
       <w:lvlText w:val=""/>
       <w:lvlJc w:val="left"/>
     </w:lvl>
   </w:abstractNum>
   <w:abstractNum w:abstractNumId="17" w15:restartNumberingAfterBreak="0">
-    <w:nsid w:val="53DA2B78"/>
+    <w:nsid w:val="5F1E564B"/>
     <w:multiLevelType w:val="hybridMultilevel"/>
-    <w:tmpl w:val="ACF009B0"/>
-    <w:lvl w:ilvl="0" w:tplc="2A1AAC68">
+    <w:tmpl w:val="6F966312"/>
+    <w:lvl w:ilvl="0" w:tplc="00A414FE">
       <w:start w:val="1"/>
       <w:numFmt w:val="decimal"/>
       <w:lvlText w:val="%1."/>
@@ -22605,52 +22996,52 @@
         <w:color w:val="A67C27"/>
       </w:rPr>
     </w:lvl>
-    <w:lvl w:ilvl="1" w:tplc="C5C83944">
+    <w:lvl w:ilvl="1" w:tplc="AC142530">
       <w:numFmt w:val="decimal"/>
       <w:lvlText w:val=""/>
       <w:lvlJc w:val="left"/>
     </w:lvl>
-    <w:lvl w:ilvl="2" w:tplc="6F6ABE36">
+    <w:lvl w:ilvl="2" w:tplc="24DA27A0">
       <w:numFmt w:val="decimal"/>
       <w:lvlText w:val=""/>
       <w:lvlJc w:val="left"/>
     </w:lvl>
-    <w:lvl w:ilvl="3" w:tplc="C8EA6454">
+    <w:lvl w:ilvl="3" w:tplc="AE56A622">
       <w:numFmt w:val="decimal"/>
       <w:lvlText w:val=""/>
       <w:lvlJc w:val="left"/>
     </w:lvl>
-    <w:lvl w:ilvl="4" w:tplc="42C4F008">
+    <w:lvl w:ilvl="4" w:tplc="07A6AA90">
       <w:numFmt w:val="decimal"/>
       <w:lvlText w:val=""/>
       <w:lvlJc w:val="left"/>
     </w:lvl>
-    <w:lvl w:ilvl="5" w:tplc="E4AC3920">
+    <w:lvl w:ilvl="5" w:tplc="0B0066DE">
       <w:numFmt w:val="decimal"/>
       <w:lvlText w:val=""/>
       <w:lvlJc w:val="left"/>
     </w:lvl>
-    <w:lvl w:ilvl="6" w:tplc="E6724C4E">
+    <w:lvl w:ilvl="6" w:tplc="B42EF562">
       <w:numFmt w:val="decimal"/>
       <w:lvlText w:val=""/>
       <w:lvlJc w:val="left"/>
     </w:lvl>
-    <w:lvl w:ilvl="7" w:tplc="B464E82A">
+    <w:lvl w:ilvl="7" w:tplc="478EA8D2">
       <w:numFmt w:val="decimal"/>
       <w:lvlText w:val=""/>
       <w:lvlJc w:val="left"/>
     </w:lvl>
-    <w:lvl w:ilvl="8" w:tplc="2A08BA5C">
+    <w:lvl w:ilvl="8" w:tplc="0F7C5046">
       <w:numFmt w:val="decimal"/>
       <w:lvlText w:val=""/>
       <w:lvlJc w:val="left"/>
     </w:lvl>
   </w:abstractNum>
   <w:abstractNum w:abstractNumId="18" w15:restartNumberingAfterBreak="0">
-    <w:nsid w:val="566E0901"/>
+    <w:nsid w:val="60C36491"/>
     <w:multiLevelType w:val="hybridMultilevel"/>
-    <w:tmpl w:val="21E47BF4"/>
-    <w:lvl w:ilvl="0" w:tplc="9E54684E">
+    <w:tmpl w:val="BBEE3038"/>
+    <w:lvl w:ilvl="0" w:tplc="2D36B56C">
       <w:start w:val="1"/>
       <w:numFmt w:val="decimal"/>
       <w:lvlText w:val="%1."/>
@@ -22664,52 +23055,196 @@
         <w:color w:val="A67C27"/>
       </w:rPr>
     </w:lvl>
-    <w:lvl w:ilvl="1" w:tplc="D3981668">
+    <w:lvl w:ilvl="1" w:tplc="7AF2F33C">
       <w:numFmt w:val="decimal"/>
       <w:lvlText w:val=""/>
       <w:lvlJc w:val="left"/>
     </w:lvl>
-    <w:lvl w:ilvl="2" w:tplc="F6F6DC08">
+    <w:lvl w:ilvl="2" w:tplc="EA3A5B3E">
       <w:numFmt w:val="decimal"/>
       <w:lvlText w:val=""/>
       <w:lvlJc w:val="left"/>
     </w:lvl>
-    <w:lvl w:ilvl="3" w:tplc="BC64C82C">
+    <w:lvl w:ilvl="3" w:tplc="BEB6BF4C">
       <w:numFmt w:val="decimal"/>
       <w:lvlText w:val=""/>
       <w:lvlJc w:val="left"/>
     </w:lvl>
-    <w:lvl w:ilvl="4" w:tplc="F1749202">
+    <w:lvl w:ilvl="4" w:tplc="7C728066">
       <w:numFmt w:val="decimal"/>
       <w:lvlText w:val=""/>
       <w:lvlJc w:val="left"/>
     </w:lvl>
-    <w:lvl w:ilvl="5" w:tplc="CDF6CCFE">
+    <w:lvl w:ilvl="5" w:tplc="6C1043A8">
       <w:numFmt w:val="decimal"/>
       <w:lvlText w:val=""/>
       <w:lvlJc w:val="left"/>
     </w:lvl>
-    <w:lvl w:ilvl="6" w:tplc="B2085BEE">
+    <w:lvl w:ilvl="6" w:tplc="D2406398">
       <w:numFmt w:val="decimal"/>
       <w:lvlText w:val=""/>
       <w:lvlJc w:val="left"/>
     </w:lvl>
-    <w:lvl w:ilvl="7" w:tplc="3A4CC7D0">
+    <w:lvl w:ilvl="7" w:tplc="410CDACC">
       <w:numFmt w:val="decimal"/>
       <w:lvlText w:val=""/>
       <w:lvlJc w:val="left"/>
     </w:lvl>
-    <w:lvl w:ilvl="8" w:tplc="01C68576">
+    <w:lvl w:ilvl="8" w:tplc="5C408D94">
       <w:numFmt w:val="decimal"/>
       <w:lvlText w:val=""/>
       <w:lvlJc w:val="left"/>
     </w:lvl>
   </w:abstractNum>
   <w:abstractNum w:abstractNumId="19" w15:restartNumberingAfterBreak="0">
-    <w:nsid w:val="59583FF0"/>
+    <w:nsid w:val="637A7FE4"/>
     <w:multiLevelType w:val="hybridMultilevel"/>
-    <w:tmpl w:val="3342E3A6"/>
-    <w:lvl w:ilvl="0" w:tplc="F6560126">
+    <w:tmpl w:val="296803D2"/>
+    <w:lvl w:ilvl="0" w:tplc="F0081E48">
+      <w:start w:val="1"/>
+      <w:numFmt w:val="bullet"/>
+      <w:lvlText w:val="•"/>
+      <w:lvlJc w:val="left"/>
+      <w:pPr>
+        <w:ind w:left="460" w:hanging="280"/>
+      </w:pPr>
+    </w:lvl>
+    <w:lvl w:ilvl="1" w:tplc="338A7B5A">
+      <w:start w:val="1"/>
+      <w:numFmt w:val="bullet"/>
+      <w:lvlText w:val="–"/>
+      <w:lvlJc w:val="left"/>
+      <w:pPr>
+        <w:ind w:left="900" w:hanging="280"/>
+      </w:pPr>
+    </w:lvl>
+    <w:lvl w:ilvl="2" w:tplc="AB06909A">
+      <w:numFmt w:val="decimal"/>
+      <w:lvlText w:val=""/>
+      <w:lvlJc w:val="left"/>
+    </w:lvl>
+    <w:lvl w:ilvl="3" w:tplc="E21CD0AA">
+      <w:numFmt w:val="decimal"/>
+      <w:lvlText w:val=""/>
+      <w:lvlJc w:val="left"/>
+    </w:lvl>
+    <w:lvl w:ilvl="4" w:tplc="8E00F996">
+      <w:numFmt w:val="decimal"/>
+      <w:lvlText w:val=""/>
+      <w:lvlJc w:val="left"/>
+    </w:lvl>
+    <w:lvl w:ilvl="5" w:tplc="A6D00300">
+      <w:numFmt w:val="decimal"/>
+      <w:lvlText w:val=""/>
+      <w:lvlJc w:val="left"/>
+    </w:lvl>
+    <w:lvl w:ilvl="6" w:tplc="4F168B7C">
+      <w:numFmt w:val="decimal"/>
+      <w:lvlText w:val=""/>
+      <w:lvlJc w:val="left"/>
+    </w:lvl>
+    <w:lvl w:ilvl="7" w:tplc="7B5E4788">
+      <w:numFmt w:val="decimal"/>
+      <w:lvlText w:val=""/>
+      <w:lvlJc w:val="left"/>
+    </w:lvl>
+    <w:lvl w:ilvl="8" w:tplc="8DC079A6">
+      <w:numFmt w:val="decimal"/>
+      <w:lvlText w:val=""/>
+      <w:lvlJc w:val="left"/>
+    </w:lvl>
+  </w:abstractNum>
+  <w:abstractNum w:abstractNumId="20" w15:restartNumberingAfterBreak="0">
+    <w:nsid w:val="64BF2E94"/>
+    <w:multiLevelType w:val="hybridMultilevel"/>
+    <w:tmpl w:val="1C706892"/>
+    <w:lvl w:ilvl="0" w:tplc="35543DCC">
+      <w:start w:val="1"/>
+      <w:numFmt w:val="bullet"/>
+      <w:lvlText w:val="●"/>
+      <w:lvlJc w:val="left"/>
+      <w:pPr>
+        <w:ind w:left="720" w:hanging="360"/>
+      </w:pPr>
+    </w:lvl>
+    <w:lvl w:ilvl="1" w:tplc="1F24F0B4">
+      <w:start w:val="1"/>
+      <w:numFmt w:val="bullet"/>
+      <w:lvlText w:val="○"/>
+      <w:lvlJc w:val="left"/>
+      <w:pPr>
+        <w:ind w:left="1440" w:hanging="360"/>
+      </w:pPr>
+    </w:lvl>
+    <w:lvl w:ilvl="2" w:tplc="B18CCF0C">
+      <w:start w:val="1"/>
+      <w:numFmt w:val="bullet"/>
+      <w:lvlText w:val="■"/>
+      <w:lvlJc w:val="left"/>
+      <w:pPr>
+        <w:ind w:left="2160" w:hanging="360"/>
+      </w:pPr>
+    </w:lvl>
+    <w:lvl w:ilvl="3" w:tplc="A1A4AC3C">
+      <w:start w:val="1"/>
+      <w:numFmt w:val="bullet"/>
+      <w:lvlText w:val="●"/>
+      <w:lvlJc w:val="left"/>
+      <w:pPr>
+        <w:ind w:left="2880" w:hanging="360"/>
+      </w:pPr>
+    </w:lvl>
+    <w:lvl w:ilvl="4" w:tplc="172A2EF4">
+      <w:start w:val="1"/>
+      <w:numFmt w:val="bullet"/>
+      <w:lvlText w:val="○"/>
+      <w:lvlJc w:val="left"/>
+      <w:pPr>
+        <w:ind w:left="3600" w:hanging="360"/>
+      </w:pPr>
+    </w:lvl>
+    <w:lvl w:ilvl="5" w:tplc="D6C84248">
+      <w:start w:val="1"/>
+      <w:numFmt w:val="bullet"/>
+      <w:lvlText w:val="■"/>
+      <w:lvlJc w:val="left"/>
+      <w:pPr>
+        <w:ind w:left="4320" w:hanging="360"/>
+      </w:pPr>
+    </w:lvl>
+    <w:lvl w:ilvl="6" w:tplc="4482AFE6">
+      <w:start w:val="1"/>
+      <w:numFmt w:val="bullet"/>
+      <w:lvlText w:val="●"/>
+      <w:lvlJc w:val="left"/>
+      <w:pPr>
+        <w:ind w:left="5040" w:hanging="360"/>
+      </w:pPr>
+    </w:lvl>
+    <w:lvl w:ilvl="7" w:tplc="93300888">
+      <w:start w:val="1"/>
+      <w:numFmt w:val="bullet"/>
+      <w:lvlText w:val="●"/>
+      <w:lvlJc w:val="left"/>
+      <w:pPr>
+        <w:ind w:left="5760" w:hanging="360"/>
+      </w:pPr>
+    </w:lvl>
+    <w:lvl w:ilvl="8" w:tplc="B0E48F5A">
+      <w:start w:val="1"/>
+      <w:numFmt w:val="bullet"/>
+      <w:lvlText w:val="●"/>
+      <w:lvlJc w:val="left"/>
+      <w:pPr>
+        <w:ind w:left="6480" w:hanging="360"/>
+      </w:pPr>
+    </w:lvl>
+  </w:abstractNum>
+  <w:abstractNum w:abstractNumId="21" w15:restartNumberingAfterBreak="0">
+    <w:nsid w:val="6A127F71"/>
+    <w:multiLevelType w:val="hybridMultilevel"/>
+    <w:tmpl w:val="D4426E96"/>
+    <w:lvl w:ilvl="0" w:tplc="0C6A833A">
       <w:start w:val="1"/>
       <w:numFmt w:val="decimal"/>
       <w:lvlText w:val="%1."/>
@@ -22723,52 +23258,52 @@
         <w:color w:val="A67C27"/>
       </w:rPr>
     </w:lvl>
-    <w:lvl w:ilvl="1" w:tplc="48569DC0">
+    <w:lvl w:ilvl="1" w:tplc="DEFCF3DA">
       <w:numFmt w:val="decimal"/>
       <w:lvlText w:val=""/>
       <w:lvlJc w:val="left"/>
     </w:lvl>
-    <w:lvl w:ilvl="2" w:tplc="43EC278C">
+    <w:lvl w:ilvl="2" w:tplc="B31E2C36">
       <w:numFmt w:val="decimal"/>
       <w:lvlText w:val=""/>
       <w:lvlJc w:val="left"/>
     </w:lvl>
-    <w:lvl w:ilvl="3" w:tplc="76C61A2C">
+    <w:lvl w:ilvl="3" w:tplc="A0428298">
       <w:numFmt w:val="decimal"/>
       <w:lvlText w:val=""/>
       <w:lvlJc w:val="left"/>
     </w:lvl>
-    <w:lvl w:ilvl="4" w:tplc="8A6E2330">
+    <w:lvl w:ilvl="4" w:tplc="AAE21578">
       <w:numFmt w:val="decimal"/>
       <w:lvlText w:val=""/>
       <w:lvlJc w:val="left"/>
     </w:lvl>
-    <w:lvl w:ilvl="5" w:tplc="6C20A634">
+    <w:lvl w:ilvl="5" w:tplc="F0C2CB28">
       <w:numFmt w:val="decimal"/>
       <w:lvlText w:val=""/>
       <w:lvlJc w:val="left"/>
     </w:lvl>
-    <w:lvl w:ilvl="6" w:tplc="94449996">
+    <w:lvl w:ilvl="6" w:tplc="405C952E">
       <w:numFmt w:val="decimal"/>
       <w:lvlText w:val=""/>
       <w:lvlJc w:val="left"/>
     </w:lvl>
-    <w:lvl w:ilvl="7" w:tplc="9006C854">
+    <w:lvl w:ilvl="7" w:tplc="96CA3CE2">
       <w:numFmt w:val="decimal"/>
       <w:lvlText w:val=""/>
       <w:lvlJc w:val="left"/>
     </w:lvl>
-    <w:lvl w:ilvl="8" w:tplc="C02A8372">
+    <w:lvl w:ilvl="8" w:tplc="36FCB456">
       <w:numFmt w:val="decimal"/>
       <w:lvlText w:val=""/>
       <w:lvlJc w:val="left"/>
     </w:lvl>
   </w:abstractNum>
-  <w:abstractNum w:abstractNumId="20" w15:restartNumberingAfterBreak="0">
-    <w:nsid w:val="5DF1332C"/>
+  <w:abstractNum w:abstractNumId="22" w15:restartNumberingAfterBreak="0">
+    <w:nsid w:val="71E76BC8"/>
     <w:multiLevelType w:val="hybridMultilevel"/>
-    <w:tmpl w:val="DC8A13EA"/>
-    <w:lvl w:ilvl="0" w:tplc="3DE8803A">
+    <w:tmpl w:val="6DE8E2A6"/>
+    <w:lvl w:ilvl="0" w:tplc="7A80DCC4">
       <w:start w:val="1"/>
       <w:numFmt w:val="decimal"/>
       <w:lvlText w:val="%1."/>
@@ -22782,52 +23317,52 @@
         <w:color w:val="A67C27"/>
       </w:rPr>
     </w:lvl>
-    <w:lvl w:ilvl="1" w:tplc="CBCCD39A">
+    <w:lvl w:ilvl="1" w:tplc="F7761090">
       <w:numFmt w:val="decimal"/>
       <w:lvlText w:val=""/>
       <w:lvlJc w:val="left"/>
     </w:lvl>
-    <w:lvl w:ilvl="2" w:tplc="69D81890">
+    <w:lvl w:ilvl="2" w:tplc="D4208D8A">
       <w:numFmt w:val="decimal"/>
       <w:lvlText w:val=""/>
       <w:lvlJc w:val="left"/>
     </w:lvl>
-    <w:lvl w:ilvl="3" w:tplc="A00C913E">
+    <w:lvl w:ilvl="3" w:tplc="4D96CBEC">
       <w:numFmt w:val="decimal"/>
       <w:lvlText w:val=""/>
       <w:lvlJc w:val="left"/>
     </w:lvl>
-    <w:lvl w:ilvl="4" w:tplc="9A98494C">
+    <w:lvl w:ilvl="4" w:tplc="BEA8DF30">
       <w:numFmt w:val="decimal"/>
       <w:lvlText w:val=""/>
       <w:lvlJc w:val="left"/>
     </w:lvl>
-    <w:lvl w:ilvl="5" w:tplc="7766F036">
+    <w:lvl w:ilvl="5" w:tplc="B6EC253E">
       <w:numFmt w:val="decimal"/>
       <w:lvlText w:val=""/>
       <w:lvlJc w:val="left"/>
     </w:lvl>
-    <w:lvl w:ilvl="6" w:tplc="E8F6B4BE">
+    <w:lvl w:ilvl="6" w:tplc="01CC52F2">
       <w:numFmt w:val="decimal"/>
       <w:lvlText w:val=""/>
       <w:lvlJc w:val="left"/>
     </w:lvl>
-    <w:lvl w:ilvl="7" w:tplc="68D4E872">
+    <w:lvl w:ilvl="7" w:tplc="9C2252FA">
       <w:numFmt w:val="decimal"/>
       <w:lvlText w:val=""/>
       <w:lvlJc w:val="left"/>
     </w:lvl>
-    <w:lvl w:ilvl="8" w:tplc="21C850BA">
+    <w:lvl w:ilvl="8" w:tplc="D9E4B80C">
       <w:numFmt w:val="decimal"/>
       <w:lvlText w:val=""/>
       <w:lvlJc w:val="left"/>
     </w:lvl>
   </w:abstractNum>
-  <w:abstractNum w:abstractNumId="21" w15:restartNumberingAfterBreak="0">
-    <w:nsid w:val="682A6C5F"/>
+  <w:abstractNum w:abstractNumId="23" w15:restartNumberingAfterBreak="0">
+    <w:nsid w:val="79127331"/>
     <w:multiLevelType w:val="hybridMultilevel"/>
-    <w:tmpl w:val="704A51A0"/>
-    <w:lvl w:ilvl="0" w:tplc="F47E3F8E">
+    <w:tmpl w:val="F4108DF2"/>
+    <w:lvl w:ilvl="0" w:tplc="ECE82ECC">
       <w:start w:val="1"/>
       <w:numFmt w:val="decimal"/>
       <w:lvlText w:val="%1."/>
@@ -22841,52 +23376,52 @@
         <w:color w:val="A67C27"/>
       </w:rPr>
     </w:lvl>
-    <w:lvl w:ilvl="1" w:tplc="7FFC439E">
+    <w:lvl w:ilvl="1" w:tplc="9398B062">
       <w:numFmt w:val="decimal"/>
       <w:lvlText w:val=""/>
       <w:lvlJc w:val="left"/>
     </w:lvl>
-    <w:lvl w:ilvl="2" w:tplc="92A40C7C">
+    <w:lvl w:ilvl="2" w:tplc="3D766360">
       <w:numFmt w:val="decimal"/>
       <w:lvlText w:val=""/>
       <w:lvlJc w:val="left"/>
     </w:lvl>
-    <w:lvl w:ilvl="3" w:tplc="331ADC9C">
+    <w:lvl w:ilvl="3" w:tplc="DC8444FA">
       <w:numFmt w:val="decimal"/>
       <w:lvlText w:val=""/>
       <w:lvlJc w:val="left"/>
     </w:lvl>
-    <w:lvl w:ilvl="4" w:tplc="0B9E20D0">
+    <w:lvl w:ilvl="4" w:tplc="ACF84726">
       <w:numFmt w:val="decimal"/>
       <w:lvlText w:val=""/>
       <w:lvlJc w:val="left"/>
     </w:lvl>
-    <w:lvl w:ilvl="5" w:tplc="35A2DD06">
+    <w:lvl w:ilvl="5" w:tplc="F586B45E">
       <w:numFmt w:val="decimal"/>
       <w:lvlText w:val=""/>
       <w:lvlJc w:val="left"/>
     </w:lvl>
-    <w:lvl w:ilvl="6" w:tplc="E9120984">
+    <w:lvl w:ilvl="6" w:tplc="F8F80DFE">
       <w:numFmt w:val="decimal"/>
       <w:lvlText w:val=""/>
       <w:lvlJc w:val="left"/>
     </w:lvl>
-    <w:lvl w:ilvl="7" w:tplc="870AF696">
+    <w:lvl w:ilvl="7" w:tplc="3370C5B0">
       <w:numFmt w:val="decimal"/>
       <w:lvlText w:val=""/>
       <w:lvlJc w:val="left"/>
     </w:lvl>
-    <w:lvl w:ilvl="8" w:tplc="71903572">
+    <w:lvl w:ilvl="8" w:tplc="A50C3F38">
       <w:numFmt w:val="decimal"/>
       <w:lvlText w:val=""/>
       <w:lvlJc w:val="left"/>
     </w:lvl>
   </w:abstractNum>
-  <w:abstractNum w:abstractNumId="22" w15:restartNumberingAfterBreak="0">
-    <w:nsid w:val="6DCD1AC0"/>
+  <w:abstractNum w:abstractNumId="24" w15:restartNumberingAfterBreak="0">
+    <w:nsid w:val="794D500C"/>
     <w:multiLevelType w:val="hybridMultilevel"/>
-    <w:tmpl w:val="C3D2F8D2"/>
-    <w:lvl w:ilvl="0" w:tplc="2F34514E">
+    <w:tmpl w:val="257ED512"/>
+    <w:lvl w:ilvl="0" w:tplc="B3C64678">
       <w:start w:val="1"/>
       <w:numFmt w:val="decimal"/>
       <w:lvlText w:val="%1."/>
@@ -22900,311 +23435,193 @@
         <w:color w:val="A67C27"/>
       </w:rPr>
     </w:lvl>
-    <w:lvl w:ilvl="1" w:tplc="7C263406">
+    <w:lvl w:ilvl="1" w:tplc="CED66C5A">
       <w:numFmt w:val="decimal"/>
       <w:lvlText w:val=""/>
       <w:lvlJc w:val="left"/>
     </w:lvl>
-    <w:lvl w:ilvl="2" w:tplc="1DBCFB40">
+    <w:lvl w:ilvl="2" w:tplc="23CE1A12">
       <w:numFmt w:val="decimal"/>
       <w:lvlText w:val=""/>
       <w:lvlJc w:val="left"/>
     </w:lvl>
-    <w:lvl w:ilvl="3" w:tplc="66227E1C">
+    <w:lvl w:ilvl="3" w:tplc="6C0CAB2A">
       <w:numFmt w:val="decimal"/>
       <w:lvlText w:val=""/>
       <w:lvlJc w:val="left"/>
     </w:lvl>
-    <w:lvl w:ilvl="4" w:tplc="6820013C">
+    <w:lvl w:ilvl="4" w:tplc="1EEE0AF8">
       <w:numFmt w:val="decimal"/>
       <w:lvlText w:val=""/>
       <w:lvlJc w:val="left"/>
     </w:lvl>
-    <w:lvl w:ilvl="5" w:tplc="DD2206C8">
+    <w:lvl w:ilvl="5" w:tplc="4CE8BC22">
       <w:numFmt w:val="decimal"/>
       <w:lvlText w:val=""/>
       <w:lvlJc w:val="left"/>
     </w:lvl>
-    <w:lvl w:ilvl="6" w:tplc="6DB8C900">
+    <w:lvl w:ilvl="6" w:tplc="12EC6BF6">
       <w:numFmt w:val="decimal"/>
       <w:lvlText w:val=""/>
       <w:lvlJc w:val="left"/>
     </w:lvl>
-    <w:lvl w:ilvl="7" w:tplc="80D02038">
+    <w:lvl w:ilvl="7" w:tplc="52F25FF8">
       <w:numFmt w:val="decimal"/>
       <w:lvlText w:val=""/>
       <w:lvlJc w:val="left"/>
     </w:lvl>
-    <w:lvl w:ilvl="8" w:tplc="6C44CEBA">
+    <w:lvl w:ilvl="8" w:tplc="166ED46C">
       <w:numFmt w:val="decimal"/>
       <w:lvlText w:val=""/>
       <w:lvlJc w:val="left"/>
     </w:lvl>
   </w:abstractNum>
-  <w:abstractNum w:abstractNumId="23" w15:restartNumberingAfterBreak="0">
-    <w:nsid w:val="734D123B"/>
-    <w:multiLevelType w:val="hybridMultilevel"/>
-    <w:tmpl w:val="07D281D0"/>
-    <w:lvl w:ilvl="0" w:tplc="A77E2E82">
-      <w:start w:val="1"/>
-      <w:numFmt w:val="decimal"/>
-      <w:lvlText w:val="%1."/>
-      <w:lvlJc w:val="left"/>
-      <w:pPr>
-        <w:ind w:left="460" w:hanging="360"/>
-      </w:pPr>
-      <w:rPr>
-        <w:b/>
-        <w:bCs/>
-        <w:color w:val="A67C27"/>
-      </w:rPr>
-    </w:lvl>
-    <w:lvl w:ilvl="1" w:tplc="B6D4989C">
-      <w:numFmt w:val="decimal"/>
-      <w:lvlText w:val=""/>
-      <w:lvlJc w:val="left"/>
-    </w:lvl>
-    <w:lvl w:ilvl="2" w:tplc="1CC071F8">
-      <w:numFmt w:val="decimal"/>
-      <w:lvlText w:val=""/>
-      <w:lvlJc w:val="left"/>
-    </w:lvl>
-    <w:lvl w:ilvl="3" w:tplc="9654C122">
-      <w:numFmt w:val="decimal"/>
-      <w:lvlText w:val=""/>
-      <w:lvlJc w:val="left"/>
-    </w:lvl>
-    <w:lvl w:ilvl="4" w:tplc="BE6846B4">
-      <w:numFmt w:val="decimal"/>
-      <w:lvlText w:val=""/>
-      <w:lvlJc w:val="left"/>
-    </w:lvl>
-    <w:lvl w:ilvl="5" w:tplc="CCCA1372">
-      <w:numFmt w:val="decimal"/>
-      <w:lvlText w:val=""/>
-      <w:lvlJc w:val="left"/>
-    </w:lvl>
-    <w:lvl w:ilvl="6" w:tplc="64464120">
-      <w:numFmt w:val="decimal"/>
-      <w:lvlText w:val=""/>
-      <w:lvlJc w:val="left"/>
-    </w:lvl>
-    <w:lvl w:ilvl="7" w:tplc="FB0241A0">
-      <w:numFmt w:val="decimal"/>
-      <w:lvlText w:val=""/>
-      <w:lvlJc w:val="left"/>
-    </w:lvl>
-    <w:lvl w:ilvl="8" w:tplc="ED8CB0E0">
-      <w:numFmt w:val="decimal"/>
-      <w:lvlText w:val=""/>
-      <w:lvlJc w:val="left"/>
-    </w:lvl>
-  </w:abstractNum>
-  <w:abstractNum w:abstractNumId="24" w15:restartNumberingAfterBreak="0">
-    <w:nsid w:val="74A66531"/>
-    <w:multiLevelType w:val="hybridMultilevel"/>
-    <w:tmpl w:val="CD9ED00E"/>
-    <w:lvl w:ilvl="0" w:tplc="508A5374">
-      <w:start w:val="1"/>
-      <w:numFmt w:val="decimal"/>
-      <w:lvlText w:val="%1."/>
-      <w:lvlJc w:val="left"/>
-      <w:pPr>
-        <w:ind w:left="460" w:hanging="360"/>
-      </w:pPr>
-      <w:rPr>
-        <w:b/>
-        <w:bCs/>
-        <w:color w:val="A67C27"/>
-      </w:rPr>
-    </w:lvl>
-    <w:lvl w:ilvl="1" w:tplc="E5F6B29E">
-      <w:numFmt w:val="decimal"/>
-      <w:lvlText w:val=""/>
-      <w:lvlJc w:val="left"/>
-    </w:lvl>
-    <w:lvl w:ilvl="2" w:tplc="F53A4F76">
-      <w:numFmt w:val="decimal"/>
-      <w:lvlText w:val=""/>
-      <w:lvlJc w:val="left"/>
-    </w:lvl>
-    <w:lvl w:ilvl="3" w:tplc="F7D09EF2">
-      <w:numFmt w:val="decimal"/>
-      <w:lvlText w:val=""/>
-      <w:lvlJc w:val="left"/>
-    </w:lvl>
-    <w:lvl w:ilvl="4" w:tplc="1388C224">
-      <w:numFmt w:val="decimal"/>
-      <w:lvlText w:val=""/>
-      <w:lvlJc w:val="left"/>
-    </w:lvl>
-    <w:lvl w:ilvl="5" w:tplc="588EB194">
-      <w:numFmt w:val="decimal"/>
-      <w:lvlText w:val=""/>
-      <w:lvlJc w:val="left"/>
-    </w:lvl>
-    <w:lvl w:ilvl="6" w:tplc="0008A0C4">
-      <w:numFmt w:val="decimal"/>
-      <w:lvlText w:val=""/>
-      <w:lvlJc w:val="left"/>
-    </w:lvl>
-    <w:lvl w:ilvl="7" w:tplc="1CB6F3A0">
-      <w:numFmt w:val="decimal"/>
-      <w:lvlText w:val=""/>
-      <w:lvlJc w:val="left"/>
-    </w:lvl>
-    <w:lvl w:ilvl="8" w:tplc="0C905BDC">
-      <w:numFmt w:val="decimal"/>
-      <w:lvlText w:val=""/>
-      <w:lvlJc w:val="left"/>
-    </w:lvl>
-  </w:abstractNum>
-  <w:num w:numId="1" w16cid:durableId="907031321">
+  <w:num w:numId="1" w16cid:durableId="2119179662">
+    <w:abstractNumId w:val="20"/>
+    <w:lvlOverride w:ilvl="0">
+      <w:startOverride w:val="1"/>
+    </w:lvlOverride>
+  </w:num>
+  <w:num w:numId="2" w16cid:durableId="1606425400">
+    <w:abstractNumId w:val="19"/>
+    <w:lvlOverride w:ilvl="0">
+      <w:startOverride w:val="1"/>
+    </w:lvlOverride>
+  </w:num>
+  <w:num w:numId="3" w16cid:durableId="618149819">
+    <w:abstractNumId w:val="24"/>
+    <w:lvlOverride w:ilvl="0">
+      <w:startOverride w:val="1"/>
+    </w:lvlOverride>
+  </w:num>
+  <w:num w:numId="4" w16cid:durableId="1835411817">
+    <w:abstractNumId w:val="18"/>
+    <w:lvlOverride w:ilvl="0">
+      <w:startOverride w:val="1"/>
+    </w:lvlOverride>
+  </w:num>
+  <w:num w:numId="5" w16cid:durableId="1807236145">
+    <w:abstractNumId w:val="1"/>
+    <w:lvlOverride w:ilvl="0">
+      <w:startOverride w:val="1"/>
+    </w:lvlOverride>
+  </w:num>
+  <w:num w:numId="6" w16cid:durableId="1005865437">
+    <w:abstractNumId w:val="22"/>
+    <w:lvlOverride w:ilvl="0">
+      <w:startOverride w:val="1"/>
+    </w:lvlOverride>
+  </w:num>
+  <w:num w:numId="7" w16cid:durableId="927807981">
+    <w:abstractNumId w:val="14"/>
+    <w:lvlOverride w:ilvl="0">
+      <w:startOverride w:val="1"/>
+    </w:lvlOverride>
+  </w:num>
+  <w:num w:numId="8" w16cid:durableId="271281911">
+    <w:abstractNumId w:val="12"/>
+    <w:lvlOverride w:ilvl="0">
+      <w:startOverride w:val="1"/>
+    </w:lvlOverride>
+  </w:num>
+  <w:num w:numId="9" w16cid:durableId="1397975865">
+    <w:abstractNumId w:val="17"/>
+    <w:lvlOverride w:ilvl="0">
+      <w:startOverride w:val="1"/>
+    </w:lvlOverride>
+  </w:num>
+  <w:num w:numId="10" w16cid:durableId="1997806746">
     <w:abstractNumId w:val="9"/>
     <w:lvlOverride w:ilvl="0">
       <w:startOverride w:val="1"/>
     </w:lvlOverride>
   </w:num>
-  <w:num w:numId="2" w16cid:durableId="648705631">
+  <w:num w:numId="11" w16cid:durableId="1540973336">
+    <w:abstractNumId w:val="16"/>
+    <w:lvlOverride w:ilvl="0">
+      <w:startOverride w:val="1"/>
+    </w:lvlOverride>
+  </w:num>
+  <w:num w:numId="12" w16cid:durableId="1998914939">
+    <w:abstractNumId w:val="0"/>
+    <w:lvlOverride w:ilvl="0">
+      <w:startOverride w:val="1"/>
+    </w:lvlOverride>
+  </w:num>
+  <w:num w:numId="13" w16cid:durableId="1141847675">
+    <w:abstractNumId w:val="15"/>
+    <w:lvlOverride w:ilvl="0">
+      <w:startOverride w:val="1"/>
+    </w:lvlOverride>
+  </w:num>
+  <w:num w:numId="14" w16cid:durableId="1295524450">
+    <w:abstractNumId w:val="23"/>
+    <w:lvlOverride w:ilvl="0">
+      <w:startOverride w:val="1"/>
+    </w:lvlOverride>
+  </w:num>
+  <w:num w:numId="15" w16cid:durableId="1145048430">
+    <w:abstractNumId w:val="11"/>
+    <w:lvlOverride w:ilvl="0">
+      <w:startOverride w:val="1"/>
+    </w:lvlOverride>
+  </w:num>
+  <w:num w:numId="16" w16cid:durableId="37434786">
+    <w:abstractNumId w:val="3"/>
+    <w:lvlOverride w:ilvl="0">
+      <w:startOverride w:val="1"/>
+    </w:lvlOverride>
+  </w:num>
+  <w:num w:numId="17" w16cid:durableId="363602935">
+    <w:abstractNumId w:val="10"/>
+    <w:lvlOverride w:ilvl="0">
+      <w:startOverride w:val="1"/>
+    </w:lvlOverride>
+  </w:num>
+  <w:num w:numId="18" w16cid:durableId="132530407">
+    <w:abstractNumId w:val="4"/>
+    <w:lvlOverride w:ilvl="0">
+      <w:startOverride w:val="1"/>
+    </w:lvlOverride>
+  </w:num>
+  <w:num w:numId="19" w16cid:durableId="1380133129">
+    <w:abstractNumId w:val="6"/>
+    <w:lvlOverride w:ilvl="0">
+      <w:startOverride w:val="1"/>
+    </w:lvlOverride>
+  </w:num>
+  <w:num w:numId="20" w16cid:durableId="1230581793">
+    <w:abstractNumId w:val="2"/>
+    <w:lvlOverride w:ilvl="0">
+      <w:startOverride w:val="1"/>
+    </w:lvlOverride>
+  </w:num>
+  <w:num w:numId="21" w16cid:durableId="1927568784">
     <w:abstractNumId w:val="7"/>
     <w:lvlOverride w:ilvl="0">
       <w:startOverride w:val="1"/>
     </w:lvlOverride>
   </w:num>
-  <w:num w:numId="3" w16cid:durableId="580406698">
+  <w:num w:numId="22" w16cid:durableId="1724450550">
+    <w:abstractNumId w:val="13"/>
+    <w:lvlOverride w:ilvl="0">
+      <w:startOverride w:val="1"/>
+    </w:lvlOverride>
+  </w:num>
+  <w:num w:numId="23" w16cid:durableId="40833270">
+    <w:abstractNumId w:val="21"/>
+    <w:lvlOverride w:ilvl="0">
+      <w:startOverride w:val="1"/>
+    </w:lvlOverride>
+  </w:num>
+  <w:num w:numId="24" w16cid:durableId="431510856">
     <w:abstractNumId w:val="5"/>
     <w:lvlOverride w:ilvl="0">
       <w:startOverride w:val="1"/>
     </w:lvlOverride>
   </w:num>
-  <w:num w:numId="4" w16cid:durableId="1301619327">
-    <w:abstractNumId w:val="2"/>
-    <w:lvlOverride w:ilvl="0">
-      <w:startOverride w:val="1"/>
-    </w:lvlOverride>
-  </w:num>
-  <w:num w:numId="5" w16cid:durableId="1724017702">
-    <w:abstractNumId w:val="6"/>
-    <w:lvlOverride w:ilvl="0">
-      <w:startOverride w:val="1"/>
-    </w:lvlOverride>
-  </w:num>
-  <w:num w:numId="6" w16cid:durableId="1133213577">
-    <w:abstractNumId w:val="1"/>
-    <w:lvlOverride w:ilvl="0">
-      <w:startOverride w:val="1"/>
-    </w:lvlOverride>
-  </w:num>
-  <w:num w:numId="7" w16cid:durableId="889342679">
-    <w:abstractNumId w:val="22"/>
-    <w:lvlOverride w:ilvl="0">
-      <w:startOverride w:val="1"/>
-    </w:lvlOverride>
-  </w:num>
-  <w:num w:numId="8" w16cid:durableId="841966767">
-    <w:abstractNumId w:val="0"/>
-    <w:lvlOverride w:ilvl="0">
-      <w:startOverride w:val="1"/>
-    </w:lvlOverride>
-  </w:num>
-  <w:num w:numId="9" w16cid:durableId="1604068463">
-    <w:abstractNumId w:val="20"/>
-    <w:lvlOverride w:ilvl="0">
-      <w:startOverride w:val="1"/>
-    </w:lvlOverride>
-  </w:num>
-  <w:num w:numId="10" w16cid:durableId="455148184">
-    <w:abstractNumId w:val="14"/>
-    <w:lvlOverride w:ilvl="0">
-      <w:startOverride w:val="1"/>
-    </w:lvlOverride>
-  </w:num>
-  <w:num w:numId="11" w16cid:durableId="1078018157">
-    <w:abstractNumId w:val="16"/>
-    <w:lvlOverride w:ilvl="0">
-      <w:startOverride w:val="1"/>
-    </w:lvlOverride>
-  </w:num>
-  <w:num w:numId="12" w16cid:durableId="757602592">
-    <w:abstractNumId w:val="21"/>
-    <w:lvlOverride w:ilvl="0">
-      <w:startOverride w:val="1"/>
-    </w:lvlOverride>
-  </w:num>
-  <w:num w:numId="13" w16cid:durableId="247889424">
-    <w:abstractNumId w:val="18"/>
-    <w:lvlOverride w:ilvl="0">
-      <w:startOverride w:val="1"/>
-    </w:lvlOverride>
-  </w:num>
-  <w:num w:numId="14" w16cid:durableId="28772268">
+  <w:num w:numId="25" w16cid:durableId="1748766884">
     <w:abstractNumId w:val="8"/>
-    <w:lvlOverride w:ilvl="0">
-      <w:startOverride w:val="1"/>
-    </w:lvlOverride>
-  </w:num>
-  <w:num w:numId="15" w16cid:durableId="237448812">
-    <w:abstractNumId w:val="13"/>
-    <w:lvlOverride w:ilvl="0">
-      <w:startOverride w:val="1"/>
-    </w:lvlOverride>
-  </w:num>
-  <w:num w:numId="16" w16cid:durableId="678309071">
-    <w:abstractNumId w:val="17"/>
-    <w:lvlOverride w:ilvl="0">
-      <w:startOverride w:val="1"/>
-    </w:lvlOverride>
-  </w:num>
-  <w:num w:numId="17" w16cid:durableId="1015109942">
-    <w:abstractNumId w:val="3"/>
-    <w:lvlOverride w:ilvl="0">
-      <w:startOverride w:val="1"/>
-    </w:lvlOverride>
-  </w:num>
-  <w:num w:numId="18" w16cid:durableId="1967658479">
-    <w:abstractNumId w:val="24"/>
-    <w:lvlOverride w:ilvl="0">
-      <w:startOverride w:val="1"/>
-    </w:lvlOverride>
-  </w:num>
-  <w:num w:numId="19" w16cid:durableId="1592738875">
-    <w:abstractNumId w:val="10"/>
-    <w:lvlOverride w:ilvl="0">
-      <w:startOverride w:val="1"/>
-    </w:lvlOverride>
-  </w:num>
-  <w:num w:numId="20" w16cid:durableId="1515798952">
-    <w:abstractNumId w:val="19"/>
-    <w:lvlOverride w:ilvl="0">
-      <w:startOverride w:val="1"/>
-    </w:lvlOverride>
-  </w:num>
-  <w:num w:numId="21" w16cid:durableId="63112812">
-    <w:abstractNumId w:val="11"/>
-    <w:lvlOverride w:ilvl="0">
-      <w:startOverride w:val="1"/>
-    </w:lvlOverride>
-  </w:num>
-  <w:num w:numId="22" w16cid:durableId="559748681">
-    <w:abstractNumId w:val="12"/>
-    <w:lvlOverride w:ilvl="0">
-      <w:startOverride w:val="1"/>
-    </w:lvlOverride>
-  </w:num>
-  <w:num w:numId="23" w16cid:durableId="1219587872">
-    <w:abstractNumId w:val="23"/>
-    <w:lvlOverride w:ilvl="0">
-      <w:startOverride w:val="1"/>
-    </w:lvlOverride>
-  </w:num>
-  <w:num w:numId="24" w16cid:durableId="993072376">
-    <w:abstractNumId w:val="15"/>
-    <w:lvlOverride w:ilvl="0">
-      <w:startOverride w:val="1"/>
-    </w:lvlOverride>
-  </w:num>
-  <w:num w:numId="25" w16cid:durableId="1483351144">
-    <w:abstractNumId w:val="4"/>
     <w:lvlOverride w:ilvl="0">
       <w:startOverride w:val="1"/>
     </w:lvlOverride>
@@ -23829,7 +24246,7 @@
     <w:autoRedefine/>
     <w:uiPriority w:val="39"/>
     <w:unhideWhenUsed/>
-    <w:rsid w:val="00030B9E"/>
+    <w:rsid w:val="003B164B"/>
     <w:pPr>
       <w:spacing w:after="100"/>
     </w:pPr>
@@ -23841,7 +24258,7 @@
     <w:autoRedefine/>
     <w:uiPriority w:val="39"/>
     <w:unhideWhenUsed/>
-    <w:rsid w:val="00030B9E"/>
+    <w:rsid w:val="003B164B"/>
     <w:pPr>
       <w:spacing w:after="100"/>
       <w:ind w:left="210"/>

</xml_diff>

<commit_message>
feat: pagination with rows-per-page choice (10/20/50/100/200) on every register; manuals v1.6
Co-Authored-By: Claude Sonnet 5 <noreply@anthropic.com>
</commit_message>
<xml_diff>
--- a/docs/manuals/RA_Training_Manual.docx
+++ b/docs/manuals/RA_Training_Manual.docx
@@ -69,7 +69,7 @@
           <w:left w:w="10" w:type="dxa"/>
           <w:right w:w="10" w:type="dxa"/>
         </w:tblCellMar>
-        <w:tblLook w:val="0000" w:firstRow="0" w:lastRow="0" w:firstColumn="0" w:lastColumn="0" w:noHBand="0" w:noVBand="0"/>
+        <w:tblLook w:val="04A0" w:firstRow="1" w:lastRow="0" w:firstColumn="1" w:lastColumn="0" w:noHBand="0" w:noVBand="1"/>
       </w:tblPr>
       <w:tblGrid>
         <w:gridCol w:w="2300"/>
@@ -469,7 +469,7 @@
                 <w:sz w:val="19"/>
                 <w:szCs w:val="19"/>
               </w:rPr>
-              <w:t>Version 1.5 · 20 September 2026</w:t>
+              <w:t>Version 1.6 · 20 September 2026</w:t>
             </w:r>
           </w:p>
         </w:tc>
@@ -538,7 +538,7 @@
     <w:sdt>
       <w:sdtPr>
         <w:alias w:val="Contents"/>
-        <w:id w:val="475808389"/>
+        <w:id w:val="1314144819"/>
       </w:sdtPr>
       <w:sdtEndPr/>
       <w:sdtContent>
@@ -567,7 +567,7 @@
           <w:r>
             <w:fldChar w:fldCharType="separate"/>
           </w:r>
-          <w:hyperlink w:anchor="_Toc240779345" w:history="1">
+          <w:hyperlink w:anchor="_Toc240784103" w:history="1">
             <w:r>
               <w:rPr>
                 <w:rStyle w:val="Hyperlink"/>
@@ -591,7 +591,7 @@
               <w:rPr>
                 <w:noProof/>
               </w:rPr>
-              <w:instrText xml:space="preserve"> PAGEREF _Toc240779345 \h </w:instrText>
+              <w:instrText xml:space="preserve"> PAGEREF _Toc240784103 \h </w:instrText>
             </w:r>
             <w:r>
               <w:rPr>
@@ -634,7 +634,7 @@
               <w14:ligatures w14:val="standardContextual"/>
             </w:rPr>
           </w:pPr>
-          <w:hyperlink w:anchor="_Toc240779346" w:history="1">
+          <w:hyperlink w:anchor="_Toc240784104" w:history="1">
             <w:r>
               <w:rPr>
                 <w:rStyle w:val="Hyperlink"/>
@@ -658,7 +658,7 @@
               <w:rPr>
                 <w:noProof/>
               </w:rPr>
-              <w:instrText xml:space="preserve"> PAGEREF _Toc240779346 \h </w:instrText>
+              <w:instrText xml:space="preserve"> PAGEREF _Toc240784104 \h </w:instrText>
             </w:r>
             <w:r>
               <w:rPr>
@@ -701,7 +701,7 @@
               <w14:ligatures w14:val="standardContextual"/>
             </w:rPr>
           </w:pPr>
-          <w:hyperlink w:anchor="_Toc240779347" w:history="1">
+          <w:hyperlink w:anchor="_Toc240784105" w:history="1">
             <w:r>
               <w:rPr>
                 <w:rStyle w:val="Hyperlink"/>
@@ -725,7 +725,7 @@
               <w:rPr>
                 <w:noProof/>
               </w:rPr>
-              <w:instrText xml:space="preserve"> PAGEREF _Toc240779347 \h </w:instrText>
+              <w:instrText xml:space="preserve"> PAGEREF _Toc240784105 \h </w:instrText>
             </w:r>
             <w:r>
               <w:rPr>
@@ -768,7 +768,7 @@
               <w14:ligatures w14:val="standardContextual"/>
             </w:rPr>
           </w:pPr>
-          <w:hyperlink w:anchor="_Toc240779348" w:history="1">
+          <w:hyperlink w:anchor="_Toc240784106" w:history="1">
             <w:r>
               <w:rPr>
                 <w:rStyle w:val="Hyperlink"/>
@@ -792,7 +792,7 @@
               <w:rPr>
                 <w:noProof/>
               </w:rPr>
-              <w:instrText xml:space="preserve"> PAGEREF _Toc240779348 \h </w:instrText>
+              <w:instrText xml:space="preserve"> PAGEREF _Toc240784106 \h </w:instrText>
             </w:r>
             <w:r>
               <w:rPr>
@@ -835,7 +835,7 @@
               <w14:ligatures w14:val="standardContextual"/>
             </w:rPr>
           </w:pPr>
-          <w:hyperlink w:anchor="_Toc240779349" w:history="1">
+          <w:hyperlink w:anchor="_Toc240784107" w:history="1">
             <w:r>
               <w:rPr>
                 <w:rStyle w:val="Hyperlink"/>
@@ -859,7 +859,7 @@
               <w:rPr>
                 <w:noProof/>
               </w:rPr>
-              <w:instrText xml:space="preserve"> PAGEREF _Toc240779349 \h </w:instrText>
+              <w:instrText xml:space="preserve"> PAGEREF _Toc240784107 \h </w:instrText>
             </w:r>
             <w:r>
               <w:rPr>
@@ -902,7 +902,7 @@
               <w14:ligatures w14:val="standardContextual"/>
             </w:rPr>
           </w:pPr>
-          <w:hyperlink w:anchor="_Toc240779350" w:history="1">
+          <w:hyperlink w:anchor="_Toc240784108" w:history="1">
             <w:r>
               <w:rPr>
                 <w:rStyle w:val="Hyperlink"/>
@@ -926,7 +926,7 @@
               <w:rPr>
                 <w:noProof/>
               </w:rPr>
-              <w:instrText xml:space="preserve"> PAGEREF _Toc240779350 \h </w:instrText>
+              <w:instrText xml:space="preserve"> PAGEREF _Toc240784108 \h </w:instrText>
             </w:r>
             <w:r>
               <w:rPr>
@@ -969,7 +969,7 @@
               <w14:ligatures w14:val="standardContextual"/>
             </w:rPr>
           </w:pPr>
-          <w:hyperlink w:anchor="_Toc240779351" w:history="1">
+          <w:hyperlink w:anchor="_Toc240784109" w:history="1">
             <w:r>
               <w:rPr>
                 <w:rStyle w:val="Hyperlink"/>
@@ -993,7 +993,7 @@
               <w:rPr>
                 <w:noProof/>
               </w:rPr>
-              <w:instrText xml:space="preserve"> PAGEREF _Toc240779351 \h </w:instrText>
+              <w:instrText xml:space="preserve"> PAGEREF _Toc240784109 \h </w:instrText>
             </w:r>
             <w:r>
               <w:rPr>
@@ -1036,7 +1036,7 @@
               <w14:ligatures w14:val="standardContextual"/>
             </w:rPr>
           </w:pPr>
-          <w:hyperlink w:anchor="_Toc240779352" w:history="1">
+          <w:hyperlink w:anchor="_Toc240784110" w:history="1">
             <w:r>
               <w:rPr>
                 <w:rStyle w:val="Hyperlink"/>
@@ -1060,7 +1060,7 @@
               <w:rPr>
                 <w:noProof/>
               </w:rPr>
-              <w:instrText xml:space="preserve"> PAGEREF _Toc240779352 \h </w:instrText>
+              <w:instrText xml:space="preserve"> PAGEREF _Toc240784110 \h </w:instrText>
             </w:r>
             <w:r>
               <w:rPr>
@@ -1103,7 +1103,7 @@
               <w14:ligatures w14:val="standardContextual"/>
             </w:rPr>
           </w:pPr>
-          <w:hyperlink w:anchor="_Toc240779353" w:history="1">
+          <w:hyperlink w:anchor="_Toc240784111" w:history="1">
             <w:r>
               <w:rPr>
                 <w:rStyle w:val="Hyperlink"/>
@@ -1127,7 +1127,7 @@
               <w:rPr>
                 <w:noProof/>
               </w:rPr>
-              <w:instrText xml:space="preserve"> PAGEREF _Toc240779353 \h </w:instrText>
+              <w:instrText xml:space="preserve"> PAGEREF _Toc240784111 \h </w:instrText>
             </w:r>
             <w:r>
               <w:rPr>
@@ -1170,7 +1170,7 @@
               <w14:ligatures w14:val="standardContextual"/>
             </w:rPr>
           </w:pPr>
-          <w:hyperlink w:anchor="_Toc240779354" w:history="1">
+          <w:hyperlink w:anchor="_Toc240784112" w:history="1">
             <w:r>
               <w:rPr>
                 <w:rStyle w:val="Hyperlink"/>
@@ -1194,7 +1194,7 @@
               <w:rPr>
                 <w:noProof/>
               </w:rPr>
-              <w:instrText xml:space="preserve"> PAGEREF _Toc240779354 \h </w:instrText>
+              <w:instrText xml:space="preserve"> PAGEREF _Toc240784112 \h </w:instrText>
             </w:r>
             <w:r>
               <w:rPr>
@@ -1237,7 +1237,7 @@
               <w14:ligatures w14:val="standardContextual"/>
             </w:rPr>
           </w:pPr>
-          <w:hyperlink w:anchor="_Toc240779355" w:history="1">
+          <w:hyperlink w:anchor="_Toc240784113" w:history="1">
             <w:r>
               <w:rPr>
                 <w:rStyle w:val="Hyperlink"/>
@@ -1261,7 +1261,7 @@
               <w:rPr>
                 <w:noProof/>
               </w:rPr>
-              <w:instrText xml:space="preserve"> PAGEREF _Toc240779355 \h </w:instrText>
+              <w:instrText xml:space="preserve"> PAGEREF _Toc240784113 \h </w:instrText>
             </w:r>
             <w:r>
               <w:rPr>
@@ -1304,7 +1304,7 @@
               <w14:ligatures w14:val="standardContextual"/>
             </w:rPr>
           </w:pPr>
-          <w:hyperlink w:anchor="_Toc240779356" w:history="1">
+          <w:hyperlink w:anchor="_Toc240784114" w:history="1">
             <w:r>
               <w:rPr>
                 <w:rStyle w:val="Hyperlink"/>
@@ -1328,7 +1328,7 @@
               <w:rPr>
                 <w:noProof/>
               </w:rPr>
-              <w:instrText xml:space="preserve"> PAGEREF _Toc240779356 \h </w:instrText>
+              <w:instrText xml:space="preserve"> PAGEREF _Toc240784114 \h </w:instrText>
             </w:r>
             <w:r>
               <w:rPr>
@@ -1371,7 +1371,7 @@
               <w14:ligatures w14:val="standardContextual"/>
             </w:rPr>
           </w:pPr>
-          <w:hyperlink w:anchor="_Toc240779357" w:history="1">
+          <w:hyperlink w:anchor="_Toc240784115" w:history="1">
             <w:r>
               <w:rPr>
                 <w:rStyle w:val="Hyperlink"/>
@@ -1395,7 +1395,7 @@
               <w:rPr>
                 <w:noProof/>
               </w:rPr>
-              <w:instrText xml:space="preserve"> PAGEREF _Toc240779357 \h </w:instrText>
+              <w:instrText xml:space="preserve"> PAGEREF _Toc240784115 \h </w:instrText>
             </w:r>
             <w:r>
               <w:rPr>
@@ -1438,7 +1438,7 @@
               <w14:ligatures w14:val="standardContextual"/>
             </w:rPr>
           </w:pPr>
-          <w:hyperlink w:anchor="_Toc240779358" w:history="1">
+          <w:hyperlink w:anchor="_Toc240784116" w:history="1">
             <w:r>
               <w:rPr>
                 <w:rStyle w:val="Hyperlink"/>
@@ -1462,7 +1462,7 @@
               <w:rPr>
                 <w:noProof/>
               </w:rPr>
-              <w:instrText xml:space="preserve"> PAGEREF _Toc240779358 \h </w:instrText>
+              <w:instrText xml:space="preserve"> PAGEREF _Toc240784116 \h </w:instrText>
             </w:r>
             <w:r>
               <w:rPr>
@@ -1505,7 +1505,7 @@
               <w14:ligatures w14:val="standardContextual"/>
             </w:rPr>
           </w:pPr>
-          <w:hyperlink w:anchor="_Toc240779359" w:history="1">
+          <w:hyperlink w:anchor="_Toc240784117" w:history="1">
             <w:r>
               <w:rPr>
                 <w:rStyle w:val="Hyperlink"/>
@@ -1529,7 +1529,7 @@
               <w:rPr>
                 <w:noProof/>
               </w:rPr>
-              <w:instrText xml:space="preserve"> PAGEREF _Toc240779359 \h </w:instrText>
+              <w:instrText xml:space="preserve"> PAGEREF _Toc240784117 \h </w:instrText>
             </w:r>
             <w:r>
               <w:rPr>
@@ -1572,7 +1572,7 @@
               <w14:ligatures w14:val="standardContextual"/>
             </w:rPr>
           </w:pPr>
-          <w:hyperlink w:anchor="_Toc240779360" w:history="1">
+          <w:hyperlink w:anchor="_Toc240784118" w:history="1">
             <w:r>
               <w:rPr>
                 <w:rStyle w:val="Hyperlink"/>
@@ -1596,7 +1596,7 @@
               <w:rPr>
                 <w:noProof/>
               </w:rPr>
-              <w:instrText xml:space="preserve"> PAGEREF _Toc240779360 \h </w:instrText>
+              <w:instrText xml:space="preserve"> PAGEREF _Toc240784118 \h </w:instrText>
             </w:r>
             <w:r>
               <w:rPr>
@@ -1639,7 +1639,7 @@
               <w14:ligatures w14:val="standardContextual"/>
             </w:rPr>
           </w:pPr>
-          <w:hyperlink w:anchor="_Toc240779361" w:history="1">
+          <w:hyperlink w:anchor="_Toc240784119" w:history="1">
             <w:r>
               <w:rPr>
                 <w:rStyle w:val="Hyperlink"/>
@@ -1663,7 +1663,7 @@
               <w:rPr>
                 <w:noProof/>
               </w:rPr>
-              <w:instrText xml:space="preserve"> PAGEREF _Toc240779361 \h </w:instrText>
+              <w:instrText xml:space="preserve"> PAGEREF _Toc240784119 \h </w:instrText>
             </w:r>
             <w:r>
               <w:rPr>
@@ -1706,7 +1706,7 @@
               <w14:ligatures w14:val="standardContextual"/>
             </w:rPr>
           </w:pPr>
-          <w:hyperlink w:anchor="_Toc240779362" w:history="1">
+          <w:hyperlink w:anchor="_Toc240784120" w:history="1">
             <w:r>
               <w:rPr>
                 <w:rStyle w:val="Hyperlink"/>
@@ -1730,7 +1730,7 @@
               <w:rPr>
                 <w:noProof/>
               </w:rPr>
-              <w:instrText xml:space="preserve"> PAGEREF _Toc240779362 \h </w:instrText>
+              <w:instrText xml:space="preserve"> PAGEREF _Toc240784120 \h </w:instrText>
             </w:r>
             <w:r>
               <w:rPr>
@@ -1773,7 +1773,7 @@
               <w14:ligatures w14:val="standardContextual"/>
             </w:rPr>
           </w:pPr>
-          <w:hyperlink w:anchor="_Toc240779363" w:history="1">
+          <w:hyperlink w:anchor="_Toc240784121" w:history="1">
             <w:r>
               <w:rPr>
                 <w:rStyle w:val="Hyperlink"/>
@@ -1797,7 +1797,7 @@
               <w:rPr>
                 <w:noProof/>
               </w:rPr>
-              <w:instrText xml:space="preserve"> PAGEREF _Toc240779363 \h </w:instrText>
+              <w:instrText xml:space="preserve"> PAGEREF _Toc240784121 \h </w:instrText>
             </w:r>
             <w:r>
               <w:rPr>
@@ -1840,7 +1840,7 @@
               <w14:ligatures w14:val="standardContextual"/>
             </w:rPr>
           </w:pPr>
-          <w:hyperlink w:anchor="_Toc240779364" w:history="1">
+          <w:hyperlink w:anchor="_Toc240784122" w:history="1">
             <w:r>
               <w:rPr>
                 <w:rStyle w:val="Hyperlink"/>
@@ -1864,7 +1864,7 @@
               <w:rPr>
                 <w:noProof/>
               </w:rPr>
-              <w:instrText xml:space="preserve"> PAGEREF _Toc240779364 \h </w:instrText>
+              <w:instrText xml:space="preserve"> PAGEREF _Toc240784122 \h </w:instrText>
             </w:r>
             <w:r>
               <w:rPr>
@@ -1907,7 +1907,7 @@
               <w14:ligatures w14:val="standardContextual"/>
             </w:rPr>
           </w:pPr>
-          <w:hyperlink w:anchor="_Toc240779365" w:history="1">
+          <w:hyperlink w:anchor="_Toc240784123" w:history="1">
             <w:r>
               <w:rPr>
                 <w:rStyle w:val="Hyperlink"/>
@@ -1931,7 +1931,7 @@
               <w:rPr>
                 <w:noProof/>
               </w:rPr>
-              <w:instrText xml:space="preserve"> PAGEREF _Toc240779365 \h </w:instrText>
+              <w:instrText xml:space="preserve"> PAGEREF _Toc240784123 \h </w:instrText>
             </w:r>
             <w:r>
               <w:rPr>
@@ -1974,7 +1974,7 @@
               <w14:ligatures w14:val="standardContextual"/>
             </w:rPr>
           </w:pPr>
-          <w:hyperlink w:anchor="_Toc240779366" w:history="1">
+          <w:hyperlink w:anchor="_Toc240784124" w:history="1">
             <w:r>
               <w:rPr>
                 <w:rStyle w:val="Hyperlink"/>
@@ -1998,7 +1998,7 @@
               <w:rPr>
                 <w:noProof/>
               </w:rPr>
-              <w:instrText xml:space="preserve"> PAGEREF _Toc240779366 \h </w:instrText>
+              <w:instrText xml:space="preserve"> PAGEREF _Toc240784124 \h </w:instrText>
             </w:r>
             <w:r>
               <w:rPr>
@@ -2041,7 +2041,7 @@
               <w14:ligatures w14:val="standardContextual"/>
             </w:rPr>
           </w:pPr>
-          <w:hyperlink w:anchor="_Toc240779367" w:history="1">
+          <w:hyperlink w:anchor="_Toc240784125" w:history="1">
             <w:r>
               <w:rPr>
                 <w:rStyle w:val="Hyperlink"/>
@@ -2065,7 +2065,7 @@
               <w:rPr>
                 <w:noProof/>
               </w:rPr>
-              <w:instrText xml:space="preserve"> PAGEREF _Toc240779367 \h </w:instrText>
+              <w:instrText xml:space="preserve"> PAGEREF _Toc240784125 \h </w:instrText>
             </w:r>
             <w:r>
               <w:rPr>
@@ -2108,7 +2108,7 @@
               <w14:ligatures w14:val="standardContextual"/>
             </w:rPr>
           </w:pPr>
-          <w:hyperlink w:anchor="_Toc240779368" w:history="1">
+          <w:hyperlink w:anchor="_Toc240784126" w:history="1">
             <w:r>
               <w:rPr>
                 <w:rStyle w:val="Hyperlink"/>
@@ -2132,7 +2132,7 @@
               <w:rPr>
                 <w:noProof/>
               </w:rPr>
-              <w:instrText xml:space="preserve"> PAGEREF _Toc240779368 \h </w:instrText>
+              <w:instrText xml:space="preserve"> PAGEREF _Toc240784126 \h </w:instrText>
             </w:r>
             <w:r>
               <w:rPr>
@@ -2175,7 +2175,7 @@
               <w14:ligatures w14:val="standardContextual"/>
             </w:rPr>
           </w:pPr>
-          <w:hyperlink w:anchor="_Toc240779369" w:history="1">
+          <w:hyperlink w:anchor="_Toc240784127" w:history="1">
             <w:r>
               <w:rPr>
                 <w:rStyle w:val="Hyperlink"/>
@@ -2199,7 +2199,7 @@
               <w:rPr>
                 <w:noProof/>
               </w:rPr>
-              <w:instrText xml:space="preserve"> PAGEREF _Toc240779369 \h </w:instrText>
+              <w:instrText xml:space="preserve"> PAGEREF _Toc240784127 \h </w:instrText>
             </w:r>
             <w:r>
               <w:rPr>
@@ -2242,7 +2242,7 @@
               <w14:ligatures w14:val="standardContextual"/>
             </w:rPr>
           </w:pPr>
-          <w:hyperlink w:anchor="_Toc240779370" w:history="1">
+          <w:hyperlink w:anchor="_Toc240784128" w:history="1">
             <w:r>
               <w:rPr>
                 <w:rStyle w:val="Hyperlink"/>
@@ -2266,7 +2266,7 @@
               <w:rPr>
                 <w:noProof/>
               </w:rPr>
-              <w:instrText xml:space="preserve"> PAGEREF _Toc240779370 \h </w:instrText>
+              <w:instrText xml:space="preserve"> PAGEREF _Toc240784128 \h </w:instrText>
             </w:r>
             <w:r>
               <w:rPr>
@@ -2309,7 +2309,7 @@
               <w14:ligatures w14:val="standardContextual"/>
             </w:rPr>
           </w:pPr>
-          <w:hyperlink w:anchor="_Toc240779371" w:history="1">
+          <w:hyperlink w:anchor="_Toc240784129" w:history="1">
             <w:r>
               <w:rPr>
                 <w:rStyle w:val="Hyperlink"/>
@@ -2333,7 +2333,7 @@
               <w:rPr>
                 <w:noProof/>
               </w:rPr>
-              <w:instrText xml:space="preserve"> PAGEREF _Toc240779371 \h </w:instrText>
+              <w:instrText xml:space="preserve"> PAGEREF _Toc240784129 \h </w:instrText>
             </w:r>
             <w:r>
               <w:rPr>
@@ -2376,7 +2376,7 @@
               <w14:ligatures w14:val="standardContextual"/>
             </w:rPr>
           </w:pPr>
-          <w:hyperlink w:anchor="_Toc240779372" w:history="1">
+          <w:hyperlink w:anchor="_Toc240784130" w:history="1">
             <w:r>
               <w:rPr>
                 <w:rStyle w:val="Hyperlink"/>
@@ -2400,7 +2400,7 @@
               <w:rPr>
                 <w:noProof/>
               </w:rPr>
-              <w:instrText xml:space="preserve"> PAGEREF _Toc240779372 \h </w:instrText>
+              <w:instrText xml:space="preserve"> PAGEREF _Toc240784130 \h </w:instrText>
             </w:r>
             <w:r>
               <w:rPr>
@@ -2443,7 +2443,7 @@
               <w14:ligatures w14:val="standardContextual"/>
             </w:rPr>
           </w:pPr>
-          <w:hyperlink w:anchor="_Toc240779373" w:history="1">
+          <w:hyperlink w:anchor="_Toc240784131" w:history="1">
             <w:r>
               <w:rPr>
                 <w:rStyle w:val="Hyperlink"/>
@@ -2467,7 +2467,7 @@
               <w:rPr>
                 <w:noProof/>
               </w:rPr>
-              <w:instrText xml:space="preserve"> PAGEREF _Toc240779373 \h </w:instrText>
+              <w:instrText xml:space="preserve"> PAGEREF _Toc240784131 \h </w:instrText>
             </w:r>
             <w:r>
               <w:rPr>
@@ -2510,7 +2510,7 @@
               <w14:ligatures w14:val="standardContextual"/>
             </w:rPr>
           </w:pPr>
-          <w:hyperlink w:anchor="_Toc240779374" w:history="1">
+          <w:hyperlink w:anchor="_Toc240784132" w:history="1">
             <w:r>
               <w:rPr>
                 <w:rStyle w:val="Hyperlink"/>
@@ -2534,7 +2534,7 @@
               <w:rPr>
                 <w:noProof/>
               </w:rPr>
-              <w:instrText xml:space="preserve"> PAGEREF _Toc240779374 \h </w:instrText>
+              <w:instrText xml:space="preserve"> PAGEREF _Toc240784132 \h </w:instrText>
             </w:r>
             <w:r>
               <w:rPr>
@@ -2577,7 +2577,7 @@
               <w14:ligatures w14:val="standardContextual"/>
             </w:rPr>
           </w:pPr>
-          <w:hyperlink w:anchor="_Toc240779375" w:history="1">
+          <w:hyperlink w:anchor="_Toc240784133" w:history="1">
             <w:r>
               <w:rPr>
                 <w:rStyle w:val="Hyperlink"/>
@@ -2601,7 +2601,7 @@
               <w:rPr>
                 <w:noProof/>
               </w:rPr>
-              <w:instrText xml:space="preserve"> PAGEREF _Toc240779375 \h </w:instrText>
+              <w:instrText xml:space="preserve"> PAGEREF _Toc240784133 \h </w:instrText>
             </w:r>
             <w:r>
               <w:rPr>
@@ -2644,7 +2644,7 @@
               <w14:ligatures w14:val="standardContextual"/>
             </w:rPr>
           </w:pPr>
-          <w:hyperlink w:anchor="_Toc240779376" w:history="1">
+          <w:hyperlink w:anchor="_Toc240784134" w:history="1">
             <w:r>
               <w:rPr>
                 <w:rStyle w:val="Hyperlink"/>
@@ -2668,7 +2668,7 @@
               <w:rPr>
                 <w:noProof/>
               </w:rPr>
-              <w:instrText xml:space="preserve"> PAGEREF _Toc240779376 \h </w:instrText>
+              <w:instrText xml:space="preserve"> PAGEREF _Toc240784134 \h </w:instrText>
             </w:r>
             <w:r>
               <w:rPr>
@@ -2711,7 +2711,7 @@
               <w14:ligatures w14:val="standardContextual"/>
             </w:rPr>
           </w:pPr>
-          <w:hyperlink w:anchor="_Toc240779377" w:history="1">
+          <w:hyperlink w:anchor="_Toc240784135" w:history="1">
             <w:r>
               <w:rPr>
                 <w:rStyle w:val="Hyperlink"/>
@@ -2735,7 +2735,7 @@
               <w:rPr>
                 <w:noProof/>
               </w:rPr>
-              <w:instrText xml:space="preserve"> PAGEREF _Toc240779377 \h </w:instrText>
+              <w:instrText xml:space="preserve"> PAGEREF _Toc240784135 \h </w:instrText>
             </w:r>
             <w:r>
               <w:rPr>
@@ -2778,7 +2778,7 @@
               <w14:ligatures w14:val="standardContextual"/>
             </w:rPr>
           </w:pPr>
-          <w:hyperlink w:anchor="_Toc240779378" w:history="1">
+          <w:hyperlink w:anchor="_Toc240784136" w:history="1">
             <w:r>
               <w:rPr>
                 <w:rStyle w:val="Hyperlink"/>
@@ -2802,7 +2802,7 @@
               <w:rPr>
                 <w:noProof/>
               </w:rPr>
-              <w:instrText xml:space="preserve"> PAGEREF _Toc240779378 \h </w:instrText>
+              <w:instrText xml:space="preserve"> PAGEREF _Toc240784136 \h </w:instrText>
             </w:r>
             <w:r>
               <w:rPr>
@@ -2845,7 +2845,7 @@
               <w14:ligatures w14:val="standardContextual"/>
             </w:rPr>
           </w:pPr>
-          <w:hyperlink w:anchor="_Toc240779379" w:history="1">
+          <w:hyperlink w:anchor="_Toc240784137" w:history="1">
             <w:r>
               <w:rPr>
                 <w:rStyle w:val="Hyperlink"/>
@@ -2869,7 +2869,7 @@
               <w:rPr>
                 <w:noProof/>
               </w:rPr>
-              <w:instrText xml:space="preserve"> PAGEREF _Toc240779379 \h </w:instrText>
+              <w:instrText xml:space="preserve"> PAGEREF _Toc240784137 \h </w:instrText>
             </w:r>
             <w:r>
               <w:rPr>
@@ -2912,7 +2912,7 @@
               <w14:ligatures w14:val="standardContextual"/>
             </w:rPr>
           </w:pPr>
-          <w:hyperlink w:anchor="_Toc240779380" w:history="1">
+          <w:hyperlink w:anchor="_Toc240784138" w:history="1">
             <w:r>
               <w:rPr>
                 <w:rStyle w:val="Hyperlink"/>
@@ -2936,7 +2936,7 @@
               <w:rPr>
                 <w:noProof/>
               </w:rPr>
-              <w:instrText xml:space="preserve"> PAGEREF _Toc240779380 \h </w:instrText>
+              <w:instrText xml:space="preserve"> PAGEREF _Toc240784138 \h </w:instrText>
             </w:r>
             <w:r>
               <w:rPr>
@@ -2979,7 +2979,7 @@
               <w14:ligatures w14:val="standardContextual"/>
             </w:rPr>
           </w:pPr>
-          <w:hyperlink w:anchor="_Toc240779381" w:history="1">
+          <w:hyperlink w:anchor="_Toc240784139" w:history="1">
             <w:r>
               <w:rPr>
                 <w:rStyle w:val="Hyperlink"/>
@@ -3003,7 +3003,7 @@
               <w:rPr>
                 <w:noProof/>
               </w:rPr>
-              <w:instrText xml:space="preserve"> PAGEREF _Toc240779381 \h </w:instrText>
+              <w:instrText xml:space="preserve"> PAGEREF _Toc240784139 \h </w:instrText>
             </w:r>
             <w:r>
               <w:rPr>
@@ -3046,7 +3046,7 @@
               <w14:ligatures w14:val="standardContextual"/>
             </w:rPr>
           </w:pPr>
-          <w:hyperlink w:anchor="_Toc240779382" w:history="1">
+          <w:hyperlink w:anchor="_Toc240784140" w:history="1">
             <w:r>
               <w:rPr>
                 <w:rStyle w:val="Hyperlink"/>
@@ -3070,7 +3070,7 @@
               <w:rPr>
                 <w:noProof/>
               </w:rPr>
-              <w:instrText xml:space="preserve"> PAGEREF _Toc240779382 \h </w:instrText>
+              <w:instrText xml:space="preserve"> PAGEREF _Toc240784140 \h </w:instrText>
             </w:r>
             <w:r>
               <w:rPr>
@@ -3113,7 +3113,7 @@
               <w14:ligatures w14:val="standardContextual"/>
             </w:rPr>
           </w:pPr>
-          <w:hyperlink w:anchor="_Toc240779383" w:history="1">
+          <w:hyperlink w:anchor="_Toc240784141" w:history="1">
             <w:r>
               <w:rPr>
                 <w:rStyle w:val="Hyperlink"/>
@@ -3137,7 +3137,7 @@
               <w:rPr>
                 <w:noProof/>
               </w:rPr>
-              <w:instrText xml:space="preserve"> PAGEREF _Toc240779383 \h </w:instrText>
+              <w:instrText xml:space="preserve"> PAGEREF _Toc240784141 \h </w:instrText>
             </w:r>
             <w:r>
               <w:rPr>
@@ -3180,7 +3180,7 @@
               <w14:ligatures w14:val="standardContextual"/>
             </w:rPr>
           </w:pPr>
-          <w:hyperlink w:anchor="_Toc240779384" w:history="1">
+          <w:hyperlink w:anchor="_Toc240784142" w:history="1">
             <w:r>
               <w:rPr>
                 <w:rStyle w:val="Hyperlink"/>
@@ -3204,7 +3204,7 @@
               <w:rPr>
                 <w:noProof/>
               </w:rPr>
-              <w:instrText xml:space="preserve"> PAGEREF _Toc240779384 \h </w:instrText>
+              <w:instrText xml:space="preserve"> PAGEREF _Toc240784142 \h </w:instrText>
             </w:r>
             <w:r>
               <w:rPr>
@@ -3221,7 +3221,7 @@
               <w:rPr>
                 <w:noProof/>
               </w:rPr>
-              <w:t>36</w:t>
+              <w:t>37</w:t>
             </w:r>
             <w:r>
               <w:rPr>
@@ -3247,7 +3247,7 @@
               <w14:ligatures w14:val="standardContextual"/>
             </w:rPr>
           </w:pPr>
-          <w:hyperlink w:anchor="_Toc240779385" w:history="1">
+          <w:hyperlink w:anchor="_Toc240784143" w:history="1">
             <w:r>
               <w:rPr>
                 <w:rStyle w:val="Hyperlink"/>
@@ -3271,7 +3271,7 @@
               <w:rPr>
                 <w:noProof/>
               </w:rPr>
-              <w:instrText xml:space="preserve"> PAGEREF _Toc240779385 \h </w:instrText>
+              <w:instrText xml:space="preserve"> PAGEREF _Toc240784143 \h </w:instrText>
             </w:r>
             <w:r>
               <w:rPr>
@@ -3288,7 +3288,7 @@
               <w:rPr>
                 <w:noProof/>
               </w:rPr>
-              <w:t>38</w:t>
+              <w:t>39</w:t>
             </w:r>
             <w:r>
               <w:rPr>
@@ -3310,7 +3310,7 @@
         <w:pStyle w:val="Heading1"/>
         <w:pageBreakBefore/>
       </w:pPr>
-      <w:bookmarkStart w:id="0" w:name="_Toc240779345"/>
+      <w:bookmarkStart w:id="0" w:name="_Toc240784103"/>
       <w:r>
         <w:lastRenderedPageBreak/>
         <w:t>1. Welcome</w:t>
@@ -3339,7 +3339,7 @@
       <w:pPr>
         <w:pStyle w:val="Heading2"/>
       </w:pPr>
-      <w:bookmarkStart w:id="1" w:name="_Toc240779346"/>
+      <w:bookmarkStart w:id="1" w:name="_Toc240784104"/>
       <w:r>
         <w:t>How to use this manual</w:t>
       </w:r>
@@ -3406,7 +3406,7 @@
       <w:pPr>
         <w:pStyle w:val="Heading2"/>
       </w:pPr>
-      <w:bookmarkStart w:id="2" w:name="_Toc240779347"/>
+      <w:bookmarkStart w:id="2" w:name="_Toc240784105"/>
       <w:r>
         <w:t>Who to contact</w:t>
       </w:r>
@@ -3427,7 +3427,7 @@
           <w:left w:w="10" w:type="dxa"/>
           <w:right w:w="10" w:type="dxa"/>
         </w:tblCellMar>
-        <w:tblLook w:val="0000" w:firstRow="0" w:lastRow="0" w:firstColumn="0" w:lastColumn="0" w:noHBand="0" w:noVBand="0"/>
+        <w:tblLook w:val="04A0" w:firstRow="1" w:lastRow="0" w:firstColumn="1" w:lastColumn="0" w:noHBand="0" w:noVBand="1"/>
       </w:tblPr>
       <w:tblGrid>
         <w:gridCol w:w="2824"/>
@@ -3624,7 +3624,7 @@
         <w:pStyle w:val="Heading1"/>
         <w:pageBreakBefore/>
       </w:pPr>
-      <w:bookmarkStart w:id="3" w:name="_Toc240779348"/>
+      <w:bookmarkStart w:id="3" w:name="_Toc240784106"/>
       <w:r>
         <w:lastRenderedPageBreak/>
         <w:t>2. The study</w:t>
@@ -3661,7 +3661,7 @@
           <w:left w:w="10" w:type="dxa"/>
           <w:right w:w="10" w:type="dxa"/>
         </w:tblCellMar>
-        <w:tblLook w:val="0000" w:firstRow="0" w:lastRow="0" w:firstColumn="0" w:lastColumn="0" w:noHBand="0" w:noVBand="0"/>
+        <w:tblLook w:val="04A0" w:firstRow="1" w:lastRow="0" w:firstColumn="1" w:lastColumn="0" w:noHBand="0" w:noVBand="1"/>
       </w:tblPr>
       <w:tblGrid>
         <w:gridCol w:w="2635"/>
@@ -4024,7 +4024,7 @@
           <w:left w:w="10" w:type="dxa"/>
           <w:right w:w="10" w:type="dxa"/>
         </w:tblCellMar>
-        <w:tblLook w:val="0000" w:firstRow="0" w:lastRow="0" w:firstColumn="0" w:lastColumn="0" w:noHBand="0" w:noVBand="0"/>
+        <w:tblLook w:val="04A0" w:firstRow="1" w:lastRow="0" w:firstColumn="1" w:lastColumn="0" w:noHBand="0" w:noVBand="1"/>
       </w:tblPr>
       <w:tblGrid>
         <w:gridCol w:w="2824"/>
@@ -4220,7 +4220,7 @@
       <w:pPr>
         <w:pStyle w:val="Heading2"/>
       </w:pPr>
-      <w:bookmarkStart w:id="4" w:name="_Toc240779349"/>
+      <w:bookmarkStart w:id="4" w:name="_Toc240784107"/>
       <w:r>
         <w:t>Explaining the study in two minutes</w:t>
       </w:r>
@@ -4239,7 +4239,7 @@
         <w:pStyle w:val="Heading1"/>
         <w:pageBreakBefore/>
       </w:pPr>
-      <w:bookmarkStart w:id="5" w:name="_Toc240779350"/>
+      <w:bookmarkStart w:id="5" w:name="_Toc240784108"/>
       <w:r>
         <w:lastRenderedPageBreak/>
         <w:t>3. Ethics and data protection</w:t>
@@ -4250,7 +4250,7 @@
       <w:pPr>
         <w:pStyle w:val="Heading2"/>
       </w:pPr>
-      <w:bookmarkStart w:id="6" w:name="_Toc240779351"/>
+      <w:bookmarkStart w:id="6" w:name="_Toc240784109"/>
       <w:r>
         <w:t>3.1 Principles you must apply</w:t>
       </w:r>
@@ -4271,7 +4271,7 @@
           <w:left w:w="10" w:type="dxa"/>
           <w:right w:w="10" w:type="dxa"/>
         </w:tblCellMar>
-        <w:tblLook w:val="0000" w:firstRow="0" w:lastRow="0" w:firstColumn="0" w:lastColumn="0" w:noHBand="0" w:noVBand="0"/>
+        <w:tblLook w:val="04A0" w:firstRow="1" w:lastRow="0" w:firstColumn="1" w:lastColumn="0" w:noHBand="0" w:noVBand="1"/>
       </w:tblPr>
       <w:tblGrid>
         <w:gridCol w:w="2447"/>
@@ -4700,7 +4700,7 @@
       <w:pPr>
         <w:pStyle w:val="Heading2"/>
       </w:pPr>
-      <w:bookmarkStart w:id="7" w:name="_Toc240779352"/>
+      <w:bookmarkStart w:id="7" w:name="_Toc240784110"/>
       <w:r>
         <w:t>3.2 What respondents are told (PIS v1.3, summary)</w:t>
       </w:r>
@@ -4806,7 +4806,7 @@
       <w:pPr>
         <w:pStyle w:val="Heading2"/>
       </w:pPr>
-      <w:bookmarkStart w:id="8" w:name="_Toc240779353"/>
+      <w:bookmarkStart w:id="8" w:name="_Toc240784111"/>
       <w:r>
         <w:t>3.3 Data protection rules</w:t>
       </w:r>
@@ -4938,7 +4938,7 @@
       <w:pPr>
         <w:pStyle w:val="Heading2"/>
       </w:pPr>
-      <w:bookmarkStart w:id="9" w:name="_Toc240779354"/>
+      <w:bookmarkStart w:id="9" w:name="_Toc240784112"/>
       <w:r>
         <w:t>3.4 Your devices</w:t>
       </w:r>
@@ -5018,7 +5018,7 @@
       <w:pPr>
         <w:pStyle w:val="Heading2"/>
       </w:pPr>
-      <w:bookmarkStart w:id="10" w:name="_Toc240779355"/>
+      <w:bookmarkStart w:id="10" w:name="_Toc240784113"/>
       <w:r>
         <w:t>3.5 Conduct</w:t>
       </w:r>
@@ -5099,7 +5099,7 @@
         <w:pStyle w:val="Heading1"/>
         <w:pageBreakBefore/>
       </w:pPr>
-      <w:bookmarkStart w:id="11" w:name="_Toc240779356"/>
+      <w:bookmarkStart w:id="11" w:name="_Toc240784114"/>
       <w:r>
         <w:lastRenderedPageBreak/>
         <w:t>4. The portal and the forms</w:t>
@@ -5110,7 +5110,7 @@
       <w:pPr>
         <w:pStyle w:val="Heading2"/>
       </w:pPr>
-      <w:bookmarkStart w:id="12" w:name="_Toc240779357"/>
+      <w:bookmarkStart w:id="12" w:name="_Toc240784115"/>
       <w:r>
         <w:t>Signing in</w:t>
       </w:r>
@@ -5193,7 +5193,7 @@
           <w:noProof/>
         </w:rPr>
         <w:drawing>
-          <wp:inline distT="0" distB="0" distL="0" distR="0" wp14:anchorId="1A399594" wp14:editId="2E2BFF78">
+          <wp:inline distT="0" distB="0" distL="0" distR="0">
             <wp:extent cx="5334000" cy="2333625"/>
             <wp:effectExtent l="0" t="0" r="0" b="0"/>
             <wp:docPr id="1" name="adm_login.jpg" descr="The sign-in screen for all internal staff." title="The sign-in screen for all internal staff."/>
@@ -5301,7 +5301,7 @@
           <w:left w:w="10" w:type="dxa"/>
           <w:right w:w="10" w:type="dxa"/>
         </w:tblCellMar>
-        <w:tblLook w:val="0000" w:firstRow="0" w:lastRow="0" w:firstColumn="0" w:lastColumn="0" w:noHBand="0" w:noVBand="0"/>
+        <w:tblLook w:val="04A0" w:firstRow="1" w:lastRow="0" w:firstColumn="1" w:lastColumn="0" w:noHBand="0" w:noVBand="1"/>
       </w:tblPr>
       <w:tblGrid>
         <w:gridCol w:w="9412"/>
@@ -5360,7 +5360,7 @@
       <w:pPr>
         <w:pStyle w:val="Heading2"/>
       </w:pPr>
-      <w:bookmarkStart w:id="13" w:name="_Toc240779358"/>
+      <w:bookmarkStart w:id="13" w:name="_Toc240784116"/>
       <w:r>
         <w:t>Finding your way around</w:t>
       </w:r>
@@ -5432,37 +5432,47 @@
         <w:t>20 rows per page</w:t>
       </w:r>
       <w:r>
-        <w:t xml:space="preserve">. Use </w:t>
+        <w:t xml:space="preserve"> to begin with. At the foot of the list, </w:t>
       </w:r>
       <w:r>
         <w:rPr>
           <w:b/>
           <w:bCs/>
         </w:rPr>
-        <w:t>Previous</w:t>
-      </w:r>
-      <w:r>
-        <w:t xml:space="preserve"> and </w:t>
+        <w:t>Show</w:t>
+      </w:r>
+      <w:r>
+        <w:t xml:space="preserve"> lets you choose 10, 20, 50, 100 or 200 rows per page (the portal remembers your choice), and the page numbers, </w:t>
       </w:r>
       <w:r>
         <w:rPr>
           <w:b/>
           <w:bCs/>
         </w:rPr>
-        <w:t>Next</w:t>
-      </w:r>
-      <w:r>
-        <w:t xml:space="preserve"> at the foot of the list, and the </w:t>
+        <w:t>Previous</w:t>
+      </w:r>
+      <w:r>
+        <w:t xml:space="preserve">, </w:t>
       </w:r>
       <w:r>
         <w:rPr>
           <w:b/>
           <w:bCs/>
         </w:rPr>
+        <w:t>Next</w:t>
+      </w:r>
+      <w:r>
+        <w:t xml:space="preserve"> and the double arrows take you to any page. The </w:t>
+      </w:r>
+      <w:r>
+        <w:rPr>
+          <w:b/>
+          <w:bCs/>
+        </w:rPr>
         <w:t>Search</w:t>
       </w:r>
       <w:r>
-        <w:t xml:space="preserve"> box above it.</w:t>
+        <w:t xml:space="preserve"> box above the list narrows it.</w:t>
       </w:r>
     </w:p>
     <w:p>
@@ -5535,7 +5545,7 @@
         </w:rPr>
         <w:lastRenderedPageBreak/>
         <w:drawing>
-          <wp:inline distT="0" distB="0" distL="0" distR="0" wp14:anchorId="68F47AFA" wp14:editId="061EC79A">
+          <wp:inline distT="0" distB="0" distL="0" distR="0">
             <wp:extent cx="5715000" cy="1876425"/>
             <wp:effectExtent l="0" t="0" r="0" b="0"/>
             <wp:docPr id="2" name="adm_not_your_role.jpg" descr="Opening a screen outside your role (for example from an old bookmark) shows this card instead of the screen." title="Opening a screen outside your role (for example from an old bookmark) shows this card instead of the screen."/>
@@ -5604,7 +5614,7 @@
       <w:pPr>
         <w:pStyle w:val="Heading2"/>
       </w:pPr>
-      <w:bookmarkStart w:id="14" w:name="_Toc240779359"/>
+      <w:bookmarkStart w:id="14" w:name="_Toc240784117"/>
       <w:r>
         <w:t>Roles</w:t>
       </w:r>
@@ -5625,7 +5635,7 @@
           <w:left w:w="10" w:type="dxa"/>
           <w:right w:w="10" w:type="dxa"/>
         </w:tblCellMar>
-        <w:tblLook w:val="0000" w:firstRow="0" w:lastRow="0" w:firstColumn="0" w:lastColumn="0" w:noHBand="0" w:noVBand="0"/>
+        <w:tblLook w:val="04A0" w:firstRow="1" w:lastRow="0" w:firstColumn="1" w:lastColumn="0" w:noHBand="0" w:noVBand="1"/>
       </w:tblPr>
       <w:tblGrid>
         <w:gridCol w:w="2071"/>
@@ -6386,7 +6396,7 @@
       <w:pPr>
         <w:pStyle w:val="Heading2"/>
       </w:pPr>
-      <w:bookmarkStart w:id="15" w:name="_Toc240779360"/>
+      <w:bookmarkStart w:id="15" w:name="_Toc240784118"/>
       <w:r>
         <w:t>Case statuses you will see</w:t>
       </w:r>
@@ -6407,7 +6417,7 @@
           <w:left w:w="10" w:type="dxa"/>
           <w:right w:w="10" w:type="dxa"/>
         </w:tblCellMar>
-        <w:tblLook w:val="0000" w:firstRow="0" w:lastRow="0" w:firstColumn="0" w:lastColumn="0" w:noHBand="0" w:noVBand="0"/>
+        <w:tblLook w:val="04A0" w:firstRow="1" w:lastRow="0" w:firstColumn="1" w:lastColumn="0" w:noHBand="0" w:noVBand="1"/>
       </w:tblPr>
       <w:tblGrid>
         <w:gridCol w:w="847"/>
@@ -7901,7 +7911,7 @@
       <w:pPr>
         <w:pStyle w:val="Heading2"/>
       </w:pPr>
-      <w:bookmarkStart w:id="16" w:name="_Toc240779361"/>
+      <w:bookmarkStart w:id="16" w:name="_Toc240784119"/>
       <w:r>
         <w:t>The KoboToolbox forms</w:t>
       </w:r>
@@ -7922,7 +7932,7 @@
           <w:left w:w="10" w:type="dxa"/>
           <w:right w:w="10" w:type="dxa"/>
         </w:tblCellMar>
-        <w:tblLook w:val="0000" w:firstRow="0" w:lastRow="0" w:firstColumn="0" w:lastColumn="0" w:noHBand="0" w:noVBand="0"/>
+        <w:tblLook w:val="04A0" w:firstRow="1" w:lastRow="0" w:firstColumn="1" w:lastColumn="0" w:noHBand="0" w:noVBand="1"/>
       </w:tblPr>
       <w:tblGrid>
         <w:gridCol w:w="3388"/>
@@ -8285,7 +8295,7 @@
           <w:left w:w="10" w:type="dxa"/>
           <w:right w:w="10" w:type="dxa"/>
         </w:tblCellMar>
-        <w:tblLook w:val="0000" w:firstRow="0" w:lastRow="0" w:firstColumn="0" w:lastColumn="0" w:noHBand="0" w:noVBand="0"/>
+        <w:tblLook w:val="04A0" w:firstRow="1" w:lastRow="0" w:firstColumn="1" w:lastColumn="0" w:noHBand="0" w:noVBand="1"/>
       </w:tblPr>
       <w:tblGrid>
         <w:gridCol w:w="9412"/>
@@ -8345,7 +8355,7 @@
         <w:pStyle w:val="Heading1"/>
         <w:pageBreakBefore/>
       </w:pPr>
-      <w:bookmarkStart w:id="17" w:name="_Toc240779362"/>
+      <w:bookmarkStart w:id="17" w:name="_Toc240784120"/>
       <w:r>
         <w:lastRenderedPageBreak/>
         <w:t>5. Communication scripts</w:t>
@@ -8356,7 +8366,7 @@
       <w:pPr>
         <w:pStyle w:val="Heading2"/>
       </w:pPr>
-      <w:bookmarkStart w:id="18" w:name="_Toc240779363"/>
+      <w:bookmarkStart w:id="18" w:name="_Toc240784121"/>
       <w:r>
         <w:t>5.1 First phone call</w:t>
       </w:r>
@@ -8436,7 +8446,7 @@
       <w:pPr>
         <w:pStyle w:val="Heading2"/>
       </w:pPr>
-      <w:bookmarkStart w:id="19" w:name="_Toc240779364"/>
+      <w:bookmarkStart w:id="19" w:name="_Toc240784122"/>
       <w:r>
         <w:t>5.2 If they are busy</w:t>
       </w:r>
@@ -8454,7 +8464,7 @@
       <w:pPr>
         <w:pStyle w:val="Heading2"/>
       </w:pPr>
-      <w:bookmarkStart w:id="20" w:name="_Toc240779365"/>
+      <w:bookmarkStart w:id="20" w:name="_Toc240784123"/>
       <w:r>
         <w:t>5.3 Voicemail or no answer</w:t>
       </w:r>
@@ -8472,7 +8482,7 @@
       <w:pPr>
         <w:pStyle w:val="Heading2"/>
       </w:pPr>
-      <w:bookmarkStart w:id="21" w:name="_Toc240779366"/>
+      <w:bookmarkStart w:id="21" w:name="_Toc240784124"/>
       <w:r>
         <w:t>5.4 Common questions</w:t>
       </w:r>
@@ -8493,7 +8503,7 @@
           <w:left w:w="10" w:type="dxa"/>
           <w:right w:w="10" w:type="dxa"/>
         </w:tblCellMar>
-        <w:tblLook w:val="0000" w:firstRow="0" w:lastRow="0" w:firstColumn="0" w:lastColumn="0" w:noHBand="0" w:noVBand="0"/>
+        <w:tblLook w:val="04A0" w:firstRow="1" w:lastRow="0" w:firstColumn="1" w:lastColumn="0" w:noHBand="0" w:noVBand="1"/>
       </w:tblPr>
       <w:tblGrid>
         <w:gridCol w:w="3200"/>
@@ -8922,7 +8932,7 @@
       <w:pPr>
         <w:pStyle w:val="Heading2"/>
       </w:pPr>
-      <w:bookmarkStart w:id="22" w:name="_Toc240779367"/>
+      <w:bookmarkStart w:id="22" w:name="_Toc240784125"/>
       <w:r>
         <w:t>5.5 Refusals and withdrawals</w:t>
       </w:r>
@@ -8941,7 +8951,7 @@
         <w:pStyle w:val="Heading1"/>
         <w:pageBreakBefore/>
       </w:pPr>
-      <w:bookmarkStart w:id="23" w:name="_Toc240779368"/>
+      <w:bookmarkStart w:id="23" w:name="_Toc240784126"/>
       <w:r>
         <w:lastRenderedPageBreak/>
         <w:t>6. Role modules</w:t>
@@ -8960,7 +8970,7 @@
       <w:pPr>
         <w:pStyle w:val="Heading2"/>
       </w:pPr>
-      <w:bookmarkStart w:id="24" w:name="_Toc240779369"/>
+      <w:bookmarkStart w:id="24" w:name="_Toc240784127"/>
       <w:r>
         <w:t>Module A — Contact RA</w:t>
       </w:r>
@@ -9101,7 +9111,7 @@
           <w:noProof/>
         </w:rPr>
         <w:drawing>
-          <wp:inline distT="0" distB="0" distL="0" distR="0" wp14:anchorId="65DC1F4F" wp14:editId="48A9F4A9">
+          <wp:inline distT="0" distB="0" distL="0" distR="0">
             <wp:extent cx="5334000" cy="2114550"/>
             <wp:effectExtent l="0" t="0" r="0" b="0"/>
             <wp:docPr id="3" name="adm_case_add_person.jpg" descr="Adding a person to a case." title="Adding a person to a case."/>
@@ -9305,7 +9315,7 @@
           <w:left w:w="10" w:type="dxa"/>
           <w:right w:w="10" w:type="dxa"/>
         </w:tblCellMar>
-        <w:tblLook w:val="0000" w:firstRow="0" w:lastRow="0" w:firstColumn="0" w:lastColumn="0" w:noHBand="0" w:noVBand="0"/>
+        <w:tblLook w:val="04A0" w:firstRow="1" w:lastRow="0" w:firstColumn="1" w:lastColumn="0" w:noHBand="0" w:noVBand="1"/>
       </w:tblPr>
       <w:tblGrid>
         <w:gridCol w:w="9412"/>
@@ -9476,7 +9486,7 @@
         </w:rPr>
         <w:lastRenderedPageBreak/>
         <w:drawing>
-          <wp:inline distT="0" distB="0" distL="0" distR="0" wp14:anchorId="3B1BE4DE" wp14:editId="3827DA96">
+          <wp:inline distT="0" distB="0" distL="0" distR="0">
             <wp:extent cx="5334000" cy="1143000"/>
             <wp:effectExtent l="0" t="0" r="0" b="0"/>
             <wp:docPr id="4" name="cra_case_invitations_before.jpg" descr="Invitations panel before sending, with the history of earlier invitations." title="Invitations panel before sending, with the history of earlier invitations."/>
@@ -9605,7 +9615,7 @@
           <w:noProof/>
         </w:rPr>
         <w:drawing>
-          <wp:inline distT="0" distB="0" distL="0" distR="0" wp14:anchorId="6BF98056" wp14:editId="5DBD46E5">
+          <wp:inline distT="0" distB="0" distL="0" distR="0">
             <wp:extent cx="5334000" cy="2152650"/>
             <wp:effectExtent l="0" t="0" r="0" b="0"/>
             <wp:docPr id="5" name="cra_case_invitation_sent.jpg" descr="The link, manual code and ready-written messages are shown once, with a send button for each channel." title="The link, manual code and ready-written messages are shown once, with a send button for each channel."/>
@@ -9859,7 +9869,7 @@
           <w:left w:w="10" w:type="dxa"/>
           <w:right w:w="10" w:type="dxa"/>
         </w:tblCellMar>
-        <w:tblLook w:val="0000" w:firstRow="0" w:lastRow="0" w:firstColumn="0" w:lastColumn="0" w:noHBand="0" w:noVBand="0"/>
+        <w:tblLook w:val="04A0" w:firstRow="1" w:lastRow="0" w:firstColumn="1" w:lastColumn="0" w:noHBand="0" w:noVBand="1"/>
       </w:tblPr>
       <w:tblGrid>
         <w:gridCol w:w="9412"/>
@@ -10045,7 +10055,7 @@
           <w:noProof/>
         </w:rPr>
         <w:drawing>
-          <wp:inline distT="0" distB="0" distL="0" distR="0" wp14:anchorId="4155AF82" wp14:editId="0F3AF2C9">
+          <wp:inline distT="0" distB="0" distL="0" distR="0">
             <wp:extent cx="5334000" cy="1343025"/>
             <wp:effectExtent l="0" t="0" r="0" b="0"/>
             <wp:docPr id="6" name="adm_case_timeline.jpg" descr="Contact timeline and the form for logging an attempt." title="Contact timeline and the form for logging an attempt."/>
@@ -10255,7 +10265,7 @@
         </w:rPr>
         <w:lastRenderedPageBreak/>
         <w:drawing>
-          <wp:inline distT="0" distB="0" distL="0" distR="0" wp14:anchorId="6380B35A" wp14:editId="5B6D7596">
+          <wp:inline distT="0" distB="0" distL="0" distR="0">
             <wp:extent cx="5334000" cy="3333750"/>
             <wp:effectExtent l="0" t="0" r="0" b="0"/>
             <wp:docPr id="7" name="cra_follow_ups.jpg" descr="Follow-ups due. Contact RAs see only their own cases." title="Follow-ups due. Contact RAs see only their own cases."/>
@@ -10406,7 +10416,7 @@
           <w:left w:w="10" w:type="dxa"/>
           <w:right w:w="10" w:type="dxa"/>
         </w:tblCellMar>
-        <w:tblLook w:val="0000" w:firstRow="0" w:lastRow="0" w:firstColumn="0" w:lastColumn="0" w:noHBand="0" w:noVBand="0"/>
+        <w:tblLook w:val="04A0" w:firstRow="1" w:lastRow="0" w:firstColumn="1" w:lastColumn="0" w:noHBand="0" w:noVBand="1"/>
       </w:tblPr>
       <w:tblGrid>
         <w:gridCol w:w="9412"/>
@@ -10519,7 +10529,7 @@
           <w:noProof/>
         </w:rPr>
         <w:drawing>
-          <wp:inline distT="0" distB="0" distL="0" distR="0" wp14:anchorId="1144D8EE" wp14:editId="1942E959">
+          <wp:inline distT="0" distB="0" distL="0" distR="0">
             <wp:extent cx="5334000" cy="2667000"/>
             <wp:effectExtent l="0" t="0" r="0" b="0"/>
             <wp:docPr id="8" name="cra_appointments.jpg" descr="Appointment Queue." title="Appointment Queue."/>
@@ -10830,7 +10840,7 @@
           <w:left w:w="10" w:type="dxa"/>
           <w:right w:w="10" w:type="dxa"/>
         </w:tblCellMar>
-        <w:tblLook w:val="0000" w:firstRow="0" w:lastRow="0" w:firstColumn="0" w:lastColumn="0" w:noHBand="0" w:noVBand="0"/>
+        <w:tblLook w:val="04A0" w:firstRow="1" w:lastRow="0" w:firstColumn="1" w:lastColumn="0" w:noHBand="0" w:noVBand="1"/>
       </w:tblPr>
       <w:tblGrid>
         <w:gridCol w:w="941"/>
@@ -11428,7 +11438,7 @@
       <w:pPr>
         <w:pStyle w:val="Heading2"/>
       </w:pPr>
-      <w:bookmarkStart w:id="25" w:name="_Toc240779370"/>
+      <w:bookmarkStart w:id="25" w:name="_Toc240784128"/>
       <w:r>
         <w:t>Module B — QUAN/Kobo QA RA</w:t>
       </w:r>
@@ -11477,7 +11487,7 @@
         </w:rPr>
         <w:lastRenderedPageBreak/>
         <w:drawing>
-          <wp:inline distT="0" distB="0" distL="0" distR="0" wp14:anchorId="36FEA85D" wp14:editId="628DD7FE">
+          <wp:inline distT="0" distB="0" distL="0" distR="0">
             <wp:extent cx="5334000" cy="3333750"/>
             <wp:effectExtent l="0" t="0" r="0" b="0"/>
             <wp:docPr id="9" name="qa_queue.jpg" descr="QUAN QA Queue with the KoboToolbox sync panel." title="QUAN QA Queue with the KoboToolbox sync panel."/>
@@ -11674,7 +11684,7 @@
           <w:left w:w="10" w:type="dxa"/>
           <w:right w:w="10" w:type="dxa"/>
         </w:tblCellMar>
-        <w:tblLook w:val="0000" w:firstRow="0" w:lastRow="0" w:firstColumn="0" w:lastColumn="0" w:noHBand="0" w:noVBand="0"/>
+        <w:tblLook w:val="04A0" w:firstRow="1" w:lastRow="0" w:firstColumn="1" w:lastColumn="0" w:noHBand="0" w:noVBand="1"/>
       </w:tblPr>
       <w:tblGrid>
         <w:gridCol w:w="2353"/>
@@ -12120,7 +12130,7 @@
           <w:left w:w="10" w:type="dxa"/>
           <w:right w:w="10" w:type="dxa"/>
         </w:tblCellMar>
-        <w:tblLook w:val="0000" w:firstRow="0" w:lastRow="0" w:firstColumn="0" w:lastColumn="0" w:noHBand="0" w:noVBand="0"/>
+        <w:tblLook w:val="04A0" w:firstRow="1" w:lastRow="0" w:firstColumn="1" w:lastColumn="0" w:noHBand="0" w:noVBand="1"/>
       </w:tblPr>
       <w:tblGrid>
         <w:gridCol w:w="9412"/>
@@ -12278,7 +12288,7 @@
           <w:noProof/>
         </w:rPr>
         <w:drawing>
-          <wp:inline distT="0" distB="0" distL="0" distR="0" wp14:anchorId="76A40DCD" wp14:editId="0EB26C35">
+          <wp:inline distT="0" distB="0" distL="0" distR="0">
             <wp:extent cx="5334000" cy="3333750"/>
             <wp:effectExtent l="0" t="0" r="0" b="0"/>
             <wp:docPr id="10" name="qa_exceptions.jpg" descr="QA Exception Queue." title="QA Exception Queue."/>
@@ -12539,7 +12549,7 @@
       <w:pPr>
         <w:pStyle w:val="Heading2"/>
       </w:pPr>
-      <w:bookmarkStart w:id="26" w:name="_Toc240779371"/>
+      <w:bookmarkStart w:id="26" w:name="_Toc240784129"/>
       <w:r>
         <w:t>Module C — KII RA</w:t>
       </w:r>
@@ -12588,7 +12598,7 @@
         </w:rPr>
         <w:lastRenderedPageBreak/>
         <w:drawing>
-          <wp:inline distT="0" distB="0" distL="0" distR="0" wp14:anchorId="6DEDF51C" wp14:editId="5CE1146D">
+          <wp:inline distT="0" distB="0" distL="0" distR="0">
             <wp:extent cx="5334000" cy="2667000"/>
             <wp:effectExtent l="0" t="0" r="0" b="0"/>
             <wp:docPr id="11" name="kii_new.jpg" descr="New KII Record." title="New KII Record."/>
@@ -12773,7 +12783,7 @@
           <w:noProof/>
         </w:rPr>
         <w:drawing>
-          <wp:inline distT="0" distB="0" distL="0" distR="0" wp14:anchorId="41D9911C" wp14:editId="52A0AE25">
+          <wp:inline distT="0" distB="0" distL="0" distR="0">
             <wp:extent cx="5334000" cy="3333750"/>
             <wp:effectExtent l="0" t="0" r="0" b="0"/>
             <wp:docPr id="12" name="kii_register.jpg" descr="KII Register." title="KII Register."/>
@@ -12873,7 +12883,7 @@
         </w:rPr>
         <w:lastRenderedPageBreak/>
         <w:drawing>
-          <wp:inline distT="0" distB="0" distL="0" distR="0" wp14:anchorId="7945AC83" wp14:editId="00F80D16">
+          <wp:inline distT="0" distB="0" distL="0" distR="0">
             <wp:extent cx="5334000" cy="3752850"/>
             <wp:effectExtent l="0" t="0" r="0" b="0"/>
             <wp:docPr id="13" name="kii_detail.jpg" descr="KII record: status, consent, transcript and coding." title="KII record: status, consent, transcript and coding."/>
@@ -13157,7 +13167,7 @@
           <w:noProof/>
         </w:rPr>
         <w:drawing>
-          <wp:inline distT="0" distB="0" distL="0" distR="0" wp14:anchorId="471AC342" wp14:editId="68C192A4">
+          <wp:inline distT="0" distB="0" distL="0" distR="0">
             <wp:extent cx="5334000" cy="523875"/>
             <wp:effectExtent l="0" t="0" r="0" b="0"/>
             <wp:docPr id="14" name="kii_coding_locked.jpg" descr="Before consent: no interview link." title="Before consent: no interview link."/>
@@ -13257,7 +13267,7 @@
         </w:rPr>
         <w:lastRenderedPageBreak/>
         <w:drawing>
-          <wp:inline distT="0" distB="0" distL="0" distR="0" wp14:anchorId="652396CF" wp14:editId="215D7F5C">
+          <wp:inline distT="0" distB="0" distL="0" distR="0">
             <wp:extent cx="5334000" cy="742950"/>
             <wp:effectExtent l="0" t="0" r="0" b="0"/>
             <wp:docPr id="15" name="kii_coding_ready.jpg" descr="After consent: Continue this interview." title="After consent: Continue this interview."/>
@@ -13355,7 +13365,7 @@
           <w:left w:w="10" w:type="dxa"/>
           <w:right w:w="10" w:type="dxa"/>
         </w:tblCellMar>
-        <w:tblLook w:val="0000" w:firstRow="0" w:lastRow="0" w:firstColumn="0" w:lastColumn="0" w:noHBand="0" w:noVBand="0"/>
+        <w:tblLook w:val="04A0" w:firstRow="1" w:lastRow="0" w:firstColumn="1" w:lastColumn="0" w:noHBand="0" w:noVBand="1"/>
       </w:tblPr>
       <w:tblGrid>
         <w:gridCol w:w="9412"/>
@@ -13492,7 +13502,7 @@
       <w:pPr>
         <w:pStyle w:val="Heading2"/>
       </w:pPr>
-      <w:bookmarkStart w:id="27" w:name="_Toc240779372"/>
+      <w:bookmarkStart w:id="27" w:name="_Toc240784130"/>
       <w:r>
         <w:t>Module D — Documentary RA</w:t>
       </w:r>
@@ -13559,7 +13569,7 @@
         </w:rPr>
         <w:lastRenderedPageBreak/>
         <w:drawing>
-          <wp:inline distT="0" distB="0" distL="0" distR="0" wp14:anchorId="1AEB9F13" wp14:editId="5C426DA6">
+          <wp:inline distT="0" distB="0" distL="0" distR="0">
             <wp:extent cx="5334000" cy="4248150"/>
             <wp:effectExtent l="0" t="0" r="0" b="0"/>
             <wp:docPr id="16" name="doc_new.jpg" descr="New document: upload the file and let the AI do the rest." title="New document: upload the file and let the AI do the rest."/>
@@ -13932,7 +13942,7 @@
           <w:noProof/>
         </w:rPr>
         <w:drawing>
-          <wp:inline distT="0" distB="0" distL="0" distR="0" wp14:anchorId="7B7559A9" wp14:editId="5FFD98DC">
+          <wp:inline distT="0" distB="0" distL="0" distR="0">
             <wp:extent cx="5334000" cy="1019175"/>
             <wp:effectExtent l="0" t="0" r="0" b="0"/>
             <wp:docPr id="17" name="doc_copy_chapter.jpg" descr="Copy for another chapter: pages, and an optional title." title="Copy for another chapter: pages, and an optional title."/>
@@ -14096,7 +14106,7 @@
           <w:left w:w="10" w:type="dxa"/>
           <w:right w:w="10" w:type="dxa"/>
         </w:tblCellMar>
-        <w:tblLook w:val="0000" w:firstRow="0" w:lastRow="0" w:firstColumn="0" w:lastColumn="0" w:noHBand="0" w:noVBand="0"/>
+        <w:tblLook w:val="04A0" w:firstRow="1" w:lastRow="0" w:firstColumn="1" w:lastColumn="0" w:noHBand="0" w:noVBand="1"/>
       </w:tblPr>
       <w:tblGrid>
         <w:gridCol w:w="9412"/>
@@ -14348,7 +14358,7 @@
           <w:noProof/>
         </w:rPr>
         <w:drawing>
-          <wp:inline distT="0" distB="0" distL="0" distR="0" wp14:anchorId="1EDE227D" wp14:editId="4ADDE4D5">
+          <wp:inline distT="0" distB="0" distL="0" distR="0">
             <wp:extent cx="5334000" cy="2038350"/>
             <wp:effectExtent l="0" t="0" r="0" b="0"/>
             <wp:docPr id="18" name="doc_record_details.jpg" descr="Record details: the details the AI filled in, ready to check." title="Record details: the details the AI filled in, ready to check."/>
@@ -14494,7 +14504,7 @@
           <w:noProof/>
         </w:rPr>
         <w:drawing>
-          <wp:inline distT="0" distB="0" distL="0" distR="0" wp14:anchorId="3DA0ADE6" wp14:editId="583C2752">
+          <wp:inline distT="0" distB="0" distL="0" distR="0">
             <wp:extent cx="5334000" cy="952500"/>
             <wp:effectExtent l="0" t="0" r="0" b="0"/>
             <wp:docPr id="19" name="doc_source_file.jpg" descr="Source file: the file name, size and date, with Remove file beside it." title="Source file: the file name, size and date, with Remove file beside it."/>
@@ -14648,7 +14658,7 @@
           <w:left w:w="10" w:type="dxa"/>
           <w:right w:w="10" w:type="dxa"/>
         </w:tblCellMar>
-        <w:tblLook w:val="0000" w:firstRow="0" w:lastRow="0" w:firstColumn="0" w:lastColumn="0" w:noHBand="0" w:noVBand="0"/>
+        <w:tblLook w:val="04A0" w:firstRow="1" w:lastRow="0" w:firstColumn="1" w:lastColumn="0" w:noHBand="0" w:noVBand="1"/>
       </w:tblPr>
       <w:tblGrid>
         <w:gridCol w:w="9412"/>
@@ -14756,7 +14766,7 @@
         </w:rPr>
         <w:lastRenderedPageBreak/>
         <w:drawing>
-          <wp:inline distT="0" distB="0" distL="0" distR="0" wp14:anchorId="16BD5BAB" wp14:editId="797271A7">
+          <wp:inline distT="0" distB="0" distL="0" distR="0">
             <wp:extent cx="5334000" cy="3333750"/>
             <wp:effectExtent l="0" t="0" r="0" b="0"/>
             <wp:docPr id="20" name="doc_register.jpg" descr="Documentary Evidence Corpus." title="Documentary Evidence Corpus."/>
@@ -14865,7 +14875,7 @@
           <w:noProof/>
         </w:rPr>
         <w:drawing>
-          <wp:inline distT="0" distB="0" distL="0" distR="0" wp14:anchorId="367F1F43" wp14:editId="45DF101A">
+          <wp:inline distT="0" distB="0" distL="0" distR="0">
             <wp:extent cx="5334000" cy="3419475"/>
             <wp:effectExtent l="0" t="0" r="0" b="0"/>
             <wp:docPr id="21" name="doc_detail.jpg" descr="Document record: authenticity, QA status, memo and coding form." title="Document record: authenticity, QA status, memo and coding form."/>
@@ -15066,7 +15076,7 @@
           <w:left w:w="10" w:type="dxa"/>
           <w:right w:w="10" w:type="dxa"/>
         </w:tblCellMar>
-        <w:tblLook w:val="0000" w:firstRow="0" w:lastRow="0" w:firstColumn="0" w:lastColumn="0" w:noHBand="0" w:noVBand="0"/>
+        <w:tblLook w:val="04A0" w:firstRow="1" w:lastRow="0" w:firstColumn="1" w:lastColumn="0" w:noHBand="0" w:noVBand="1"/>
       </w:tblPr>
       <w:tblGrid>
         <w:gridCol w:w="1882"/>
@@ -15345,7 +15355,7 @@
           <w:noProof/>
         </w:rPr>
         <w:drawing>
-          <wp:inline distT="0" distB="0" distL="0" distR="0" wp14:anchorId="19798938" wp14:editId="6691DFAA">
+          <wp:inline distT="0" distB="0" distL="0" distR="0">
             <wp:extent cx="5715000" cy="904875"/>
             <wp:effectExtent l="0" t="0" r="0" b="0"/>
             <wp:docPr id="22" name="doc_coding_buttons.jpg" descr="The Coding panel: Code this document, and Auto-fill." title="The Coding panel: Code this document, and Auto-fill."/>
@@ -15507,7 +15517,7 @@
           <w:noProof/>
         </w:rPr>
         <w:drawing>
-          <wp:inline distT="0" distB="0" distL="0" distR="0" wp14:anchorId="053E710D" wp14:editId="4783AF9A">
+          <wp:inline distT="0" distB="0" distL="0" distR="0">
             <wp:extent cx="5334000" cy="2667000"/>
             <wp:effectExtent l="0" t="0" r="0" b="0"/>
             <wp:docPr id="23" name="doc_autofill_pages.jpg" descr="A 240-page PDF: enter a page range, or read the whole document in parts." title="A 240-page PDF: enter a page range, or read the whole document in parts."/>
@@ -15607,7 +15617,7 @@
         </w:rPr>
         <w:lastRenderedPageBreak/>
         <w:drawing>
-          <wp:inline distT="0" distB="0" distL="0" distR="0" wp14:anchorId="21F48369" wp14:editId="3C620C2A">
+          <wp:inline distT="0" distB="0" distL="0" distR="0">
             <wp:extent cx="5334000" cy="1752600"/>
             <wp:effectExtent l="0" t="0" r="0" b="0"/>
             <wp:docPr id="24" name="doc_autofill_running.jpg" descr="The AI is reading the document." title="The AI is reading the document."/>
@@ -15696,7 +15706,7 @@
           <w:noProof/>
         </w:rPr>
         <w:drawing>
-          <wp:inline distT="0" distB="0" distL="0" distR="0" wp14:anchorId="187989DE" wp14:editId="09AABEA0">
+          <wp:inline distT="0" distB="0" distL="0" distR="0">
             <wp:extent cx="5334000" cy="4581525"/>
             <wp:effectExtent l="0" t="0" r="0" b="0"/>
             <wp:docPr id="25" name="doc_autofill_review.jpg" descr="The review screen: the draft, ready to check and edit." title="The review screen: the draft, ready to check and edit."/>
@@ -15786,7 +15796,7 @@
         </w:rPr>
         <w:lastRenderedPageBreak/>
         <w:drawing>
-          <wp:inline distT="0" distB="0" distL="0" distR="0" wp14:anchorId="765FC3B5" wp14:editId="52E3F0D0">
+          <wp:inline distT="0" distB="0" distL="0" distR="0">
             <wp:extent cx="5334000" cy="3838575"/>
             <wp:effectExtent l="0" t="0" r="0" b="0"/>
             <wp:docPr id="26" name="doc_autofill_section_d.jpg" descr="Section D: ratings and locators, all editable." title="Section D: ratings and locators, all editable."/>
@@ -15875,7 +15885,7 @@
           <w:noProof/>
         </w:rPr>
         <w:drawing>
-          <wp:inline distT="0" distB="0" distL="0" distR="0" wp14:anchorId="0D9A315C" wp14:editId="6F644912">
+          <wp:inline distT="0" distB="0" distL="0" distR="0">
             <wp:extent cx="5334000" cy="3838575"/>
             <wp:effectExtent l="0" t="0" r="0" b="0"/>
             <wp:docPr id="27" name="doc_autofill_section_j.jpg" descr="Section J: quantitative metrics." title="Section J: quantitative metrics."/>
@@ -16048,7 +16058,7 @@
           <w:left w:w="10" w:type="dxa"/>
           <w:right w:w="10" w:type="dxa"/>
         </w:tblCellMar>
-        <w:tblLook w:val="0000" w:firstRow="0" w:lastRow="0" w:firstColumn="0" w:lastColumn="0" w:noHBand="0" w:noVBand="0"/>
+        <w:tblLook w:val="04A0" w:firstRow="1" w:lastRow="0" w:firstColumn="1" w:lastColumn="0" w:noHBand="0" w:noVBand="1"/>
       </w:tblPr>
       <w:tblGrid>
         <w:gridCol w:w="24"/>
@@ -16837,7 +16847,7 @@
           <w:left w:w="10" w:type="dxa"/>
           <w:right w:w="10" w:type="dxa"/>
         </w:tblCellMar>
-        <w:tblLook w:val="0000" w:firstRow="0" w:lastRow="0" w:firstColumn="0" w:lastColumn="0" w:noHBand="0" w:noVBand="0"/>
+        <w:tblLook w:val="04A0" w:firstRow="1" w:lastRow="0" w:firstColumn="1" w:lastColumn="0" w:noHBand="0" w:noVBand="1"/>
       </w:tblPr>
       <w:tblGrid>
         <w:gridCol w:w="9412"/>
@@ -16940,7 +16950,7 @@
           <w:left w:w="10" w:type="dxa"/>
           <w:right w:w="10" w:type="dxa"/>
         </w:tblCellMar>
-        <w:tblLook w:val="0000" w:firstRow="0" w:lastRow="0" w:firstColumn="0" w:lastColumn="0" w:noHBand="0" w:noVBand="0"/>
+        <w:tblLook w:val="04A0" w:firstRow="1" w:lastRow="0" w:firstColumn="1" w:lastColumn="0" w:noHBand="0" w:noVBand="1"/>
       </w:tblPr>
       <w:tblGrid>
         <w:gridCol w:w="2824"/>
@@ -17969,7 +17979,7 @@
           <w:left w:w="10" w:type="dxa"/>
           <w:right w:w="10" w:type="dxa"/>
         </w:tblCellMar>
-        <w:tblLook w:val="0000" w:firstRow="0" w:lastRow="0" w:firstColumn="0" w:lastColumn="0" w:noHBand="0" w:noVBand="0"/>
+        <w:tblLook w:val="04A0" w:firstRow="1" w:lastRow="0" w:firstColumn="1" w:lastColumn="0" w:noHBand="0" w:noVBand="1"/>
       </w:tblPr>
       <w:tblGrid>
         <w:gridCol w:w="9412"/>
@@ -18108,7 +18118,7 @@
         <w:pStyle w:val="Heading1"/>
         <w:pageBreakBefore/>
       </w:pPr>
-      <w:bookmarkStart w:id="28" w:name="_Toc240779373"/>
+      <w:bookmarkStart w:id="28" w:name="_Toc240784131"/>
       <w:r>
         <w:lastRenderedPageBreak/>
         <w:t>7. Scenarios</w:t>
@@ -18138,7 +18148,7 @@
           <w:left w:w="10" w:type="dxa"/>
           <w:right w:w="10" w:type="dxa"/>
         </w:tblCellMar>
-        <w:tblLook w:val="0000" w:firstRow="0" w:lastRow="0" w:firstColumn="0" w:lastColumn="0" w:noHBand="0" w:noVBand="0"/>
+        <w:tblLook w:val="04A0" w:firstRow="1" w:lastRow="0" w:firstColumn="1" w:lastColumn="0" w:noHBand="0" w:noVBand="1"/>
       </w:tblPr>
       <w:tblGrid>
         <w:gridCol w:w="1882"/>
@@ -19063,7 +19073,7 @@
         <w:pStyle w:val="Heading1"/>
         <w:pageBreakBefore/>
       </w:pPr>
-      <w:bookmarkStart w:id="29" w:name="_Toc240779374"/>
+      <w:bookmarkStart w:id="29" w:name="_Toc240784132"/>
       <w:r>
         <w:lastRenderedPageBreak/>
         <w:t>8. Practice exercises</w:t>
@@ -19082,7 +19092,7 @@
       <w:pPr>
         <w:pStyle w:val="Heading2"/>
       </w:pPr>
-      <w:bookmarkStart w:id="30" w:name="_Toc240779375"/>
+      <w:bookmarkStart w:id="30" w:name="_Toc240784133"/>
       <w:r>
         <w:t>Exercise 1 — Getting around (all RAs)</w:t>
       </w:r>
@@ -19149,7 +19159,7 @@
       <w:pPr>
         <w:pStyle w:val="Heading2"/>
       </w:pPr>
-      <w:bookmarkStart w:id="31" w:name="_Toc240779376"/>
+      <w:bookmarkStart w:id="31" w:name="_Toc240784134"/>
       <w:r>
         <w:t>Exercise 2 — A complete contact (Contact RAs)</w:t>
       </w:r>
@@ -19229,7 +19239,7 @@
       <w:pPr>
         <w:pStyle w:val="Heading2"/>
       </w:pPr>
-      <w:bookmarkStart w:id="32" w:name="_Toc240779377"/>
+      <w:bookmarkStart w:id="32" w:name="_Toc240784135"/>
       <w:r>
         <w:t>Exercise 3 — QA decisions (QA RAs)</w:t>
       </w:r>
@@ -19296,7 +19306,7 @@
       <w:pPr>
         <w:pStyle w:val="Heading2"/>
       </w:pPr>
-      <w:bookmarkStart w:id="33" w:name="_Toc240779378"/>
+      <w:bookmarkStart w:id="33" w:name="_Toc240784136"/>
       <w:r>
         <w:t>Exercise 4 — A KII record (KII RAs)</w:t>
       </w:r>
@@ -19363,7 +19373,7 @@
       <w:pPr>
         <w:pStyle w:val="Heading2"/>
       </w:pPr>
-      <w:bookmarkStart w:id="34" w:name="_Toc240779379"/>
+      <w:bookmarkStart w:id="34" w:name="_Toc240784137"/>
       <w:r>
         <w:t>Exercise 5 — A document (Documentary RAs)</w:t>
       </w:r>
@@ -19551,7 +19561,7 @@
           <w:left w:w="10" w:type="dxa"/>
           <w:right w:w="10" w:type="dxa"/>
         </w:tblCellMar>
-        <w:tblLook w:val="0000" w:firstRow="0" w:lastRow="0" w:firstColumn="0" w:lastColumn="0" w:noHBand="0" w:noVBand="0"/>
+        <w:tblLook w:val="04A0" w:firstRow="1" w:lastRow="0" w:firstColumn="1" w:lastColumn="0" w:noHBand="0" w:noVBand="1"/>
       </w:tblPr>
       <w:tblGrid>
         <w:gridCol w:w="9412"/>
@@ -19611,7 +19621,7 @@
         <w:pStyle w:val="Heading1"/>
         <w:pageBreakBefore/>
       </w:pPr>
-      <w:bookmarkStart w:id="35" w:name="_Toc240779380"/>
+      <w:bookmarkStart w:id="35" w:name="_Toc240784138"/>
       <w:r>
         <w:lastRenderedPageBreak/>
         <w:t>9. Daily checklists</w:t>
@@ -19622,7 +19632,7 @@
       <w:pPr>
         <w:pStyle w:val="Heading2"/>
       </w:pPr>
-      <w:bookmarkStart w:id="36" w:name="_Toc240779381"/>
+      <w:bookmarkStart w:id="36" w:name="_Toc240784139"/>
       <w:r>
         <w:t>Start of the day</w:t>
       </w:r>
@@ -19702,7 +19712,7 @@
       <w:pPr>
         <w:pStyle w:val="Heading2"/>
       </w:pPr>
-      <w:bookmarkStart w:id="37" w:name="_Toc240779382"/>
+      <w:bookmarkStart w:id="37" w:name="_Toc240784140"/>
       <w:r>
         <w:t>End of the day</w:t>
       </w:r>
@@ -19756,7 +19766,7 @@
       <w:pPr>
         <w:pStyle w:val="Heading2"/>
       </w:pPr>
-      <w:bookmarkStart w:id="38" w:name="_Toc240779383"/>
+      <w:bookmarkStart w:id="38" w:name="_Toc240784141"/>
       <w:r>
         <w:t>Troubleshooting</w:t>
       </w:r>
@@ -19777,7 +19787,7 @@
           <w:left w:w="10" w:type="dxa"/>
           <w:right w:w="10" w:type="dxa"/>
         </w:tblCellMar>
-        <w:tblLook w:val="0000" w:firstRow="0" w:lastRow="0" w:firstColumn="0" w:lastColumn="0" w:noHBand="0" w:noVBand="0"/>
+        <w:tblLook w:val="04A0" w:firstRow="1" w:lastRow="0" w:firstColumn="1" w:lastColumn="0" w:noHBand="0" w:noVBand="1"/>
       </w:tblPr>
       <w:tblGrid>
         <w:gridCol w:w="2635"/>
@@ -20091,7 +20101,7 @@
                 <w:sz w:val="19"/>
                 <w:szCs w:val="19"/>
               </w:rPr>
-              <w:t>Registers show 20 rows per page; a Contact RA sees only assigned cases.</w:t>
+              <w:t>Registers show 20 rows per page to begin with; a Contact RA sees only assigned cases.</w:t>
             </w:r>
           </w:p>
         </w:tc>
@@ -20114,7 +20124,7 @@
                 <w:sz w:val="19"/>
                 <w:szCs w:val="19"/>
               </w:rPr>
-              <w:t>Use Next, or search. Ask the Field Coordinator to assign the case.</w:t>
+              <w:t>Choose more rows under Show at the foot of the list, use the page numbers or Next, or search. Ask the Field Coordinator to assign the case.</w:t>
             </w:r>
           </w:p>
         </w:tc>
@@ -20619,7 +20629,7 @@
         <w:pStyle w:val="Heading1"/>
         <w:pageBreakBefore/>
       </w:pPr>
-      <w:bookmarkStart w:id="39" w:name="_Toc240779384"/>
+      <w:bookmarkStart w:id="39" w:name="_Toc240784142"/>
       <w:r>
         <w:lastRenderedPageBreak/>
         <w:t>10. Glossary</w:t>
@@ -20641,7 +20651,7 @@
           <w:left w:w="10" w:type="dxa"/>
           <w:right w:w="10" w:type="dxa"/>
         </w:tblCellMar>
-        <w:tblLook w:val="0000" w:firstRow="0" w:lastRow="0" w:firstColumn="0" w:lastColumn="0" w:noHBand="0" w:noVBand="0"/>
+        <w:tblLook w:val="04A0" w:firstRow="1" w:lastRow="0" w:firstColumn="1" w:lastColumn="0" w:noHBand="0" w:noVBand="1"/>
       </w:tblPr>
       <w:tblGrid>
         <w:gridCol w:w="2353"/>
@@ -22580,7 +22590,7 @@
         <w:pStyle w:val="Heading1"/>
         <w:pageBreakBefore/>
       </w:pPr>
-      <w:bookmarkStart w:id="40" w:name="_Toc240779385"/>
+      <w:bookmarkStart w:id="40" w:name="_Toc240784143"/>
       <w:r>
         <w:lastRenderedPageBreak/>
         <w:t>11. Confidentiality and conduct declaration</w:t>
@@ -22706,7 +22716,7 @@
           <w:left w:w="10" w:type="dxa"/>
           <w:right w:w="10" w:type="dxa"/>
         </w:tblCellMar>
-        <w:tblLook w:val="0000" w:firstRow="0" w:lastRow="0" w:firstColumn="0" w:lastColumn="0" w:noHBand="0" w:noVBand="0"/>
+        <w:tblLook w:val="04A0" w:firstRow="1" w:lastRow="0" w:firstColumn="1" w:lastColumn="0" w:noHBand="0" w:noVBand="1"/>
       </w:tblPr>
       <w:tblGrid>
         <w:gridCol w:w="2824"/>
@@ -23066,7 +23076,7 @@
         <w:sz w:val="16"/>
         <w:szCs w:val="16"/>
       </w:rPr>
-      <w:t>Version 1.5 · 20 September 2026</w:t>
+      <w:t>Version 1.6 · 20 September 2026</w:t>
     </w:r>
     <w:r>
       <w:rPr>
@@ -23239,10 +23249,10 @@
 <file path=word/numbering.xml><?xml version="1.0" encoding="utf-8"?>
 <w:numbering xmlns:wpc="http://schemas.microsoft.com/office/word/2010/wordprocessingCanvas" xmlns:cx="http://schemas.microsoft.com/office/drawing/2014/chartex" xmlns:cx1="http://schemas.microsoft.com/office/drawing/2015/9/8/chartex" xmlns:cx2="http://schemas.microsoft.com/office/drawing/2015/10/21/chartex" xmlns:cx3="http://schemas.microsoft.com/office/drawing/2016/5/9/chartex" xmlns:cx4="http://schemas.microsoft.com/office/drawing/2016/5/10/chartex" xmlns:cx5="http://schemas.microsoft.com/office/drawing/2016/5/11/chartex" xmlns:cx6="http://schemas.microsoft.com/office/drawing/2016/5/12/chartex" xmlns:cx7="http://schemas.microsoft.com/office/drawing/2016/5/13/chartex" xmlns:cx8="http://schemas.microsoft.com/office/drawing/2016/5/14/chartex" xmlns:mc="http://schemas.openxmlformats.org/markup-compatibility/2006" xmlns:aink="http://schemas.microsoft.com/office/drawing/2016/ink" xmlns:am3d="http://schemas.microsoft.com/office/drawing/2017/model3d" xmlns:o="urn:schemas-microsoft-com:office:office" xmlns:oel="http://schemas.microsoft.com/office/2019/extlst" xmlns:r="http://schemas.openxmlformats.org/officeDocument/2006/relationships" xmlns:m="http://schemas.openxmlformats.org/officeDocument/2006/math" xmlns:v="urn:schemas-microsoft-com:vml" xmlns:wp14="http://schemas.microsoft.com/office/word/2010/wordprocessingDrawing" xmlns:wp="http://schemas.openxmlformats.org/drawingml/2006/wordprocessingDrawing" xmlns:w10="urn:schemas-microsoft-com:office:word" xmlns:w="http://schemas.openxmlformats.org/wordprocessingml/2006/main" xmlns:w14="http://schemas.microsoft.com/office/word/2010/wordml" xmlns:w15="http://schemas.microsoft.com/office/word/2012/wordml" xmlns:w16cex="http://schemas.microsoft.com/office/word/2018/wordml/cex" xmlns:w16cid="http://schemas.microsoft.com/office/word/2016/wordml/cid" xmlns:w16="http://schemas.microsoft.com/office/word/2018/wordml" xmlns:w16sdtdh="http://schemas.microsoft.com/office/word/2020/wordml/sdtdatahash" xmlns:w16se="http://schemas.microsoft.com/office/word/2015/wordml/symex" xmlns:wpg="http://schemas.microsoft.com/office/word/2010/wordprocessingGroup" xmlns:wpi="http://schemas.microsoft.com/office/word/2010/wordprocessingInk" xmlns:wne="http://schemas.microsoft.com/office/word/2006/wordml" xmlns:wps="http://schemas.microsoft.com/office/word/2010/wordprocessingShape" mc:Ignorable="w14 w15 w16se w16cid w16 w16cex w16sdtdh wp14">
   <w:abstractNum w:abstractNumId="0" w15:restartNumberingAfterBreak="0">
-    <w:nsid w:val="037B3BE1"/>
+    <w:nsid w:val="0060128F"/>
     <w:multiLevelType w:val="hybridMultilevel"/>
-    <w:tmpl w:val="BE901132"/>
-    <w:lvl w:ilvl="0" w:tplc="2F321FFE">
+    <w:tmpl w:val="390E1F30"/>
+    <w:lvl w:ilvl="0" w:tplc="C6146554">
       <w:start w:val="1"/>
       <w:numFmt w:val="decimal"/>
       <w:lvlText w:val="%1."/>
@@ -23256,52 +23266,52 @@
         <w:color w:val="A67C27"/>
       </w:rPr>
     </w:lvl>
-    <w:lvl w:ilvl="1" w:tplc="BE321DAC">
+    <w:lvl w:ilvl="1" w:tplc="AD38AA2E">
       <w:numFmt w:val="decimal"/>
       <w:lvlText w:val=""/>
       <w:lvlJc w:val="left"/>
     </w:lvl>
-    <w:lvl w:ilvl="2" w:tplc="AF92EBA6">
+    <w:lvl w:ilvl="2" w:tplc="3E0483D0">
       <w:numFmt w:val="decimal"/>
       <w:lvlText w:val=""/>
       <w:lvlJc w:val="left"/>
     </w:lvl>
-    <w:lvl w:ilvl="3" w:tplc="C34CB4FA">
+    <w:lvl w:ilvl="3" w:tplc="3AE84642">
       <w:numFmt w:val="decimal"/>
       <w:lvlText w:val=""/>
       <w:lvlJc w:val="left"/>
     </w:lvl>
-    <w:lvl w:ilvl="4" w:tplc="5FE4377E">
+    <w:lvl w:ilvl="4" w:tplc="AC40C612">
       <w:numFmt w:val="decimal"/>
       <w:lvlText w:val=""/>
       <w:lvlJc w:val="left"/>
     </w:lvl>
-    <w:lvl w:ilvl="5" w:tplc="5F64D3C8">
+    <w:lvl w:ilvl="5" w:tplc="2906388A">
       <w:numFmt w:val="decimal"/>
       <w:lvlText w:val=""/>
       <w:lvlJc w:val="left"/>
     </w:lvl>
-    <w:lvl w:ilvl="6" w:tplc="1B54ECA0">
+    <w:lvl w:ilvl="6" w:tplc="9278985E">
       <w:numFmt w:val="decimal"/>
       <w:lvlText w:val=""/>
       <w:lvlJc w:val="left"/>
     </w:lvl>
-    <w:lvl w:ilvl="7" w:tplc="335CA686">
+    <w:lvl w:ilvl="7" w:tplc="D9ECC34A">
       <w:numFmt w:val="decimal"/>
       <w:lvlText w:val=""/>
       <w:lvlJc w:val="left"/>
     </w:lvl>
-    <w:lvl w:ilvl="8" w:tplc="120A4FB6">
+    <w:lvl w:ilvl="8" w:tplc="7F2656BE">
       <w:numFmt w:val="decimal"/>
       <w:lvlText w:val=""/>
       <w:lvlJc w:val="left"/>
     </w:lvl>
   </w:abstractNum>
   <w:abstractNum w:abstractNumId="1" w15:restartNumberingAfterBreak="0">
-    <w:nsid w:val="0983217E"/>
+    <w:nsid w:val="02A63BF1"/>
     <w:multiLevelType w:val="hybridMultilevel"/>
-    <w:tmpl w:val="294EE95A"/>
-    <w:lvl w:ilvl="0" w:tplc="B23E89EA">
+    <w:tmpl w:val="7A300F4A"/>
+    <w:lvl w:ilvl="0" w:tplc="E43A133C">
       <w:start w:val="1"/>
       <w:numFmt w:val="decimal"/>
       <w:lvlText w:val="%1."/>
@@ -23315,52 +23325,52 @@
         <w:color w:val="A67C27"/>
       </w:rPr>
     </w:lvl>
-    <w:lvl w:ilvl="1" w:tplc="456C91DA">
+    <w:lvl w:ilvl="1" w:tplc="53A2CD9A">
       <w:numFmt w:val="decimal"/>
       <w:lvlText w:val=""/>
       <w:lvlJc w:val="left"/>
     </w:lvl>
-    <w:lvl w:ilvl="2" w:tplc="C5501DE6">
+    <w:lvl w:ilvl="2" w:tplc="0F9AF566">
       <w:numFmt w:val="decimal"/>
       <w:lvlText w:val=""/>
       <w:lvlJc w:val="left"/>
     </w:lvl>
-    <w:lvl w:ilvl="3" w:tplc="5DCCB3BE">
+    <w:lvl w:ilvl="3" w:tplc="F85EBEB8">
       <w:numFmt w:val="decimal"/>
       <w:lvlText w:val=""/>
       <w:lvlJc w:val="left"/>
     </w:lvl>
-    <w:lvl w:ilvl="4" w:tplc="EDB27F36">
+    <w:lvl w:ilvl="4" w:tplc="507068E0">
       <w:numFmt w:val="decimal"/>
       <w:lvlText w:val=""/>
       <w:lvlJc w:val="left"/>
     </w:lvl>
-    <w:lvl w:ilvl="5" w:tplc="99165710">
+    <w:lvl w:ilvl="5" w:tplc="EC983B0E">
       <w:numFmt w:val="decimal"/>
       <w:lvlText w:val=""/>
       <w:lvlJc w:val="left"/>
     </w:lvl>
-    <w:lvl w:ilvl="6" w:tplc="59E6291A">
+    <w:lvl w:ilvl="6" w:tplc="D5ACD6E4">
       <w:numFmt w:val="decimal"/>
       <w:lvlText w:val=""/>
       <w:lvlJc w:val="left"/>
     </w:lvl>
-    <w:lvl w:ilvl="7" w:tplc="4C90BF00">
+    <w:lvl w:ilvl="7" w:tplc="6EDEDCFA">
       <w:numFmt w:val="decimal"/>
       <w:lvlText w:val=""/>
       <w:lvlJc w:val="left"/>
     </w:lvl>
-    <w:lvl w:ilvl="8" w:tplc="1A6A9F2A">
+    <w:lvl w:ilvl="8" w:tplc="2294FB78">
       <w:numFmt w:val="decimal"/>
       <w:lvlText w:val=""/>
       <w:lvlJc w:val="left"/>
     </w:lvl>
   </w:abstractNum>
   <w:abstractNum w:abstractNumId="2" w15:restartNumberingAfterBreak="0">
-    <w:nsid w:val="0F711378"/>
+    <w:nsid w:val="07864136"/>
     <w:multiLevelType w:val="hybridMultilevel"/>
-    <w:tmpl w:val="3F668AEE"/>
-    <w:lvl w:ilvl="0" w:tplc="301634C6">
+    <w:tmpl w:val="12602A8E"/>
+    <w:lvl w:ilvl="0" w:tplc="D5A6CFE0">
       <w:start w:val="1"/>
       <w:numFmt w:val="decimal"/>
       <w:lvlText w:val="%1."/>
@@ -23374,52 +23384,52 @@
         <w:color w:val="A67C27"/>
       </w:rPr>
     </w:lvl>
-    <w:lvl w:ilvl="1" w:tplc="F510F7CC">
+    <w:lvl w:ilvl="1" w:tplc="7ECAB1EC">
       <w:numFmt w:val="decimal"/>
       <w:lvlText w:val=""/>
       <w:lvlJc w:val="left"/>
     </w:lvl>
-    <w:lvl w:ilvl="2" w:tplc="05BEC6F2">
+    <w:lvl w:ilvl="2" w:tplc="37480FDE">
       <w:numFmt w:val="decimal"/>
       <w:lvlText w:val=""/>
       <w:lvlJc w:val="left"/>
     </w:lvl>
-    <w:lvl w:ilvl="3" w:tplc="CED4165A">
+    <w:lvl w:ilvl="3" w:tplc="01C68122">
       <w:numFmt w:val="decimal"/>
       <w:lvlText w:val=""/>
       <w:lvlJc w:val="left"/>
     </w:lvl>
-    <w:lvl w:ilvl="4" w:tplc="D12880B6">
+    <w:lvl w:ilvl="4" w:tplc="96D6200C">
       <w:numFmt w:val="decimal"/>
       <w:lvlText w:val=""/>
       <w:lvlJc w:val="left"/>
     </w:lvl>
-    <w:lvl w:ilvl="5" w:tplc="2E306A50">
+    <w:lvl w:ilvl="5" w:tplc="CE66CAB8">
       <w:numFmt w:val="decimal"/>
       <w:lvlText w:val=""/>
       <w:lvlJc w:val="left"/>
     </w:lvl>
-    <w:lvl w:ilvl="6" w:tplc="D55CB952">
+    <w:lvl w:ilvl="6" w:tplc="6BCE5D84">
       <w:numFmt w:val="decimal"/>
       <w:lvlText w:val=""/>
       <w:lvlJc w:val="left"/>
     </w:lvl>
-    <w:lvl w:ilvl="7" w:tplc="2AEC093A">
+    <w:lvl w:ilvl="7" w:tplc="F8E4D076">
       <w:numFmt w:val="decimal"/>
       <w:lvlText w:val=""/>
       <w:lvlJc w:val="left"/>
     </w:lvl>
-    <w:lvl w:ilvl="8" w:tplc="5BB243F8">
+    <w:lvl w:ilvl="8" w:tplc="B998A6C2">
       <w:numFmt w:val="decimal"/>
       <w:lvlText w:val=""/>
       <w:lvlJc w:val="left"/>
     </w:lvl>
   </w:abstractNum>
   <w:abstractNum w:abstractNumId="3" w15:restartNumberingAfterBreak="0">
-    <w:nsid w:val="149D0356"/>
+    <w:nsid w:val="0C914930"/>
     <w:multiLevelType w:val="hybridMultilevel"/>
-    <w:tmpl w:val="5A20038C"/>
-    <w:lvl w:ilvl="0" w:tplc="6F2426BE">
+    <w:tmpl w:val="E976D2CC"/>
+    <w:lvl w:ilvl="0" w:tplc="58C4F0D8">
       <w:start w:val="1"/>
       <w:numFmt w:val="decimal"/>
       <w:lvlText w:val="%1."/>
@@ -23433,52 +23443,52 @@
         <w:color w:val="A67C27"/>
       </w:rPr>
     </w:lvl>
-    <w:lvl w:ilvl="1" w:tplc="AB123E58">
+    <w:lvl w:ilvl="1" w:tplc="30BCF0F2">
       <w:numFmt w:val="decimal"/>
       <w:lvlText w:val=""/>
       <w:lvlJc w:val="left"/>
     </w:lvl>
-    <w:lvl w:ilvl="2" w:tplc="0360ECE8">
+    <w:lvl w:ilvl="2" w:tplc="31DC2E10">
       <w:numFmt w:val="decimal"/>
       <w:lvlText w:val=""/>
       <w:lvlJc w:val="left"/>
     </w:lvl>
-    <w:lvl w:ilvl="3" w:tplc="44284960">
+    <w:lvl w:ilvl="3" w:tplc="63CCFB48">
       <w:numFmt w:val="decimal"/>
       <w:lvlText w:val=""/>
       <w:lvlJc w:val="left"/>
     </w:lvl>
-    <w:lvl w:ilvl="4" w:tplc="623400E0">
+    <w:lvl w:ilvl="4" w:tplc="A8B6CD4C">
       <w:numFmt w:val="decimal"/>
       <w:lvlText w:val=""/>
       <w:lvlJc w:val="left"/>
     </w:lvl>
-    <w:lvl w:ilvl="5" w:tplc="CD84FEFC">
+    <w:lvl w:ilvl="5" w:tplc="875EA624">
       <w:numFmt w:val="decimal"/>
       <w:lvlText w:val=""/>
       <w:lvlJc w:val="left"/>
     </w:lvl>
-    <w:lvl w:ilvl="6" w:tplc="D7F8E5B6">
+    <w:lvl w:ilvl="6" w:tplc="2E4ED2AE">
       <w:numFmt w:val="decimal"/>
       <w:lvlText w:val=""/>
       <w:lvlJc w:val="left"/>
     </w:lvl>
-    <w:lvl w:ilvl="7" w:tplc="326A9A92">
+    <w:lvl w:ilvl="7" w:tplc="EC60C9DE">
       <w:numFmt w:val="decimal"/>
       <w:lvlText w:val=""/>
       <w:lvlJc w:val="left"/>
     </w:lvl>
-    <w:lvl w:ilvl="8" w:tplc="73CA8DDA">
+    <w:lvl w:ilvl="8" w:tplc="06E6008E">
       <w:numFmt w:val="decimal"/>
       <w:lvlText w:val=""/>
       <w:lvlJc w:val="left"/>
     </w:lvl>
   </w:abstractNum>
   <w:abstractNum w:abstractNumId="4" w15:restartNumberingAfterBreak="0">
-    <w:nsid w:val="155D3D30"/>
+    <w:nsid w:val="155933E8"/>
     <w:multiLevelType w:val="hybridMultilevel"/>
-    <w:tmpl w:val="151AD318"/>
-    <w:lvl w:ilvl="0" w:tplc="F57420F6">
+    <w:tmpl w:val="1A14E140"/>
+    <w:lvl w:ilvl="0" w:tplc="D12ACDE8">
       <w:start w:val="1"/>
       <w:numFmt w:val="decimal"/>
       <w:lvlText w:val="%1."/>
@@ -23492,52 +23502,52 @@
         <w:color w:val="A67C27"/>
       </w:rPr>
     </w:lvl>
-    <w:lvl w:ilvl="1" w:tplc="F49EE040">
+    <w:lvl w:ilvl="1" w:tplc="D682CC2A">
       <w:numFmt w:val="decimal"/>
       <w:lvlText w:val=""/>
       <w:lvlJc w:val="left"/>
     </w:lvl>
-    <w:lvl w:ilvl="2" w:tplc="7D3E1A4C">
+    <w:lvl w:ilvl="2" w:tplc="0E32F62E">
       <w:numFmt w:val="decimal"/>
       <w:lvlText w:val=""/>
       <w:lvlJc w:val="left"/>
     </w:lvl>
-    <w:lvl w:ilvl="3" w:tplc="3150186A">
+    <w:lvl w:ilvl="3" w:tplc="CB3EB796">
       <w:numFmt w:val="decimal"/>
       <w:lvlText w:val=""/>
       <w:lvlJc w:val="left"/>
     </w:lvl>
-    <w:lvl w:ilvl="4" w:tplc="1B8C34B6">
+    <w:lvl w:ilvl="4" w:tplc="AD14717A">
       <w:numFmt w:val="decimal"/>
       <w:lvlText w:val=""/>
       <w:lvlJc w:val="left"/>
     </w:lvl>
-    <w:lvl w:ilvl="5" w:tplc="8ABA7026">
+    <w:lvl w:ilvl="5" w:tplc="BA5C0AC2">
       <w:numFmt w:val="decimal"/>
       <w:lvlText w:val=""/>
       <w:lvlJc w:val="left"/>
     </w:lvl>
-    <w:lvl w:ilvl="6" w:tplc="D7546B40">
+    <w:lvl w:ilvl="6" w:tplc="22A22BD6">
       <w:numFmt w:val="decimal"/>
       <w:lvlText w:val=""/>
       <w:lvlJc w:val="left"/>
     </w:lvl>
-    <w:lvl w:ilvl="7" w:tplc="1780DEE0">
+    <w:lvl w:ilvl="7" w:tplc="3850A552">
       <w:numFmt w:val="decimal"/>
       <w:lvlText w:val=""/>
       <w:lvlJc w:val="left"/>
     </w:lvl>
-    <w:lvl w:ilvl="8" w:tplc="B1409190">
+    <w:lvl w:ilvl="8" w:tplc="E1AC3B7E">
       <w:numFmt w:val="decimal"/>
       <w:lvlText w:val=""/>
       <w:lvlJc w:val="left"/>
     </w:lvl>
   </w:abstractNum>
   <w:abstractNum w:abstractNumId="5" w15:restartNumberingAfterBreak="0">
-    <w:nsid w:val="21EC247E"/>
+    <w:nsid w:val="17F714FC"/>
     <w:multiLevelType w:val="hybridMultilevel"/>
-    <w:tmpl w:val="6B203F62"/>
-    <w:lvl w:ilvl="0" w:tplc="1ED2A8D2">
+    <w:tmpl w:val="9D0EC5E2"/>
+    <w:lvl w:ilvl="0" w:tplc="0CE89F9E">
       <w:start w:val="1"/>
       <w:numFmt w:val="decimal"/>
       <w:lvlText w:val="%1."/>
@@ -23551,52 +23561,52 @@
         <w:color w:val="A67C27"/>
       </w:rPr>
     </w:lvl>
-    <w:lvl w:ilvl="1" w:tplc="FA0ADD22">
+    <w:lvl w:ilvl="1" w:tplc="218420AE">
       <w:numFmt w:val="decimal"/>
       <w:lvlText w:val=""/>
       <w:lvlJc w:val="left"/>
     </w:lvl>
-    <w:lvl w:ilvl="2" w:tplc="04A46808">
+    <w:lvl w:ilvl="2" w:tplc="0F3A6CB2">
       <w:numFmt w:val="decimal"/>
       <w:lvlText w:val=""/>
       <w:lvlJc w:val="left"/>
     </w:lvl>
-    <w:lvl w:ilvl="3" w:tplc="760AC89C">
+    <w:lvl w:ilvl="3" w:tplc="66F09D6E">
       <w:numFmt w:val="decimal"/>
       <w:lvlText w:val=""/>
       <w:lvlJc w:val="left"/>
     </w:lvl>
-    <w:lvl w:ilvl="4" w:tplc="B15A5606">
+    <w:lvl w:ilvl="4" w:tplc="2742732A">
       <w:numFmt w:val="decimal"/>
       <w:lvlText w:val=""/>
       <w:lvlJc w:val="left"/>
     </w:lvl>
-    <w:lvl w:ilvl="5" w:tplc="A522B20A">
+    <w:lvl w:ilvl="5" w:tplc="8332862C">
       <w:numFmt w:val="decimal"/>
       <w:lvlText w:val=""/>
       <w:lvlJc w:val="left"/>
     </w:lvl>
-    <w:lvl w:ilvl="6" w:tplc="9B1C158C">
+    <w:lvl w:ilvl="6" w:tplc="CDEED786">
       <w:numFmt w:val="decimal"/>
       <w:lvlText w:val=""/>
       <w:lvlJc w:val="left"/>
     </w:lvl>
-    <w:lvl w:ilvl="7" w:tplc="DF962E04">
+    <w:lvl w:ilvl="7" w:tplc="C5DAB3D2">
       <w:numFmt w:val="decimal"/>
       <w:lvlText w:val=""/>
       <w:lvlJc w:val="left"/>
     </w:lvl>
-    <w:lvl w:ilvl="8" w:tplc="BD04F6AE">
+    <w:lvl w:ilvl="8" w:tplc="1B04D0B8">
       <w:numFmt w:val="decimal"/>
       <w:lvlText w:val=""/>
       <w:lvlJc w:val="left"/>
     </w:lvl>
   </w:abstractNum>
   <w:abstractNum w:abstractNumId="6" w15:restartNumberingAfterBreak="0">
-    <w:nsid w:val="21FD1454"/>
+    <w:nsid w:val="37155F53"/>
     <w:multiLevelType w:val="hybridMultilevel"/>
-    <w:tmpl w:val="131A08F8"/>
-    <w:lvl w:ilvl="0" w:tplc="8D56A212">
+    <w:tmpl w:val="71D0C3C2"/>
+    <w:lvl w:ilvl="0" w:tplc="88824650">
       <w:start w:val="1"/>
       <w:numFmt w:val="decimal"/>
       <w:lvlText w:val="%1."/>
@@ -23610,52 +23620,52 @@
         <w:color w:val="A67C27"/>
       </w:rPr>
     </w:lvl>
-    <w:lvl w:ilvl="1" w:tplc="19C61374">
+    <w:lvl w:ilvl="1" w:tplc="DB4A5A80">
       <w:numFmt w:val="decimal"/>
       <w:lvlText w:val=""/>
       <w:lvlJc w:val="left"/>
     </w:lvl>
-    <w:lvl w:ilvl="2" w:tplc="D188C500">
+    <w:lvl w:ilvl="2" w:tplc="6BE00A50">
       <w:numFmt w:val="decimal"/>
       <w:lvlText w:val=""/>
       <w:lvlJc w:val="left"/>
     </w:lvl>
-    <w:lvl w:ilvl="3" w:tplc="1DAA64E8">
+    <w:lvl w:ilvl="3" w:tplc="055A900C">
       <w:numFmt w:val="decimal"/>
       <w:lvlText w:val=""/>
       <w:lvlJc w:val="left"/>
     </w:lvl>
-    <w:lvl w:ilvl="4" w:tplc="ABE2876C">
+    <w:lvl w:ilvl="4" w:tplc="842E5C32">
       <w:numFmt w:val="decimal"/>
       <w:lvlText w:val=""/>
       <w:lvlJc w:val="left"/>
     </w:lvl>
-    <w:lvl w:ilvl="5" w:tplc="DA4C3EC2">
+    <w:lvl w:ilvl="5" w:tplc="5818F6A2">
       <w:numFmt w:val="decimal"/>
       <w:lvlText w:val=""/>
       <w:lvlJc w:val="left"/>
     </w:lvl>
-    <w:lvl w:ilvl="6" w:tplc="F30A4C34">
+    <w:lvl w:ilvl="6" w:tplc="4A2AB196">
       <w:numFmt w:val="decimal"/>
       <w:lvlText w:val=""/>
       <w:lvlJc w:val="left"/>
     </w:lvl>
-    <w:lvl w:ilvl="7" w:tplc="B838E96C">
+    <w:lvl w:ilvl="7" w:tplc="4558CC0A">
       <w:numFmt w:val="decimal"/>
       <w:lvlText w:val=""/>
       <w:lvlJc w:val="left"/>
     </w:lvl>
-    <w:lvl w:ilvl="8" w:tplc="71568552">
+    <w:lvl w:ilvl="8" w:tplc="34588144">
       <w:numFmt w:val="decimal"/>
       <w:lvlText w:val=""/>
       <w:lvlJc w:val="left"/>
     </w:lvl>
   </w:abstractNum>
   <w:abstractNum w:abstractNumId="7" w15:restartNumberingAfterBreak="0">
-    <w:nsid w:val="25415C05"/>
+    <w:nsid w:val="38C633FC"/>
     <w:multiLevelType w:val="hybridMultilevel"/>
-    <w:tmpl w:val="D7EAC164"/>
-    <w:lvl w:ilvl="0" w:tplc="C3F2B126">
+    <w:tmpl w:val="0C824450"/>
+    <w:lvl w:ilvl="0" w:tplc="2E84D6C8">
       <w:start w:val="1"/>
       <w:numFmt w:val="decimal"/>
       <w:lvlText w:val="%1."/>
@@ -23669,52 +23679,52 @@
         <w:color w:val="A67C27"/>
       </w:rPr>
     </w:lvl>
-    <w:lvl w:ilvl="1" w:tplc="7E40F098">
+    <w:lvl w:ilvl="1" w:tplc="34FAC5C6">
       <w:numFmt w:val="decimal"/>
       <w:lvlText w:val=""/>
       <w:lvlJc w:val="left"/>
     </w:lvl>
-    <w:lvl w:ilvl="2" w:tplc="A9B06934">
+    <w:lvl w:ilvl="2" w:tplc="F54C26A6">
       <w:numFmt w:val="decimal"/>
       <w:lvlText w:val=""/>
       <w:lvlJc w:val="left"/>
     </w:lvl>
-    <w:lvl w:ilvl="3" w:tplc="4D8A00C6">
+    <w:lvl w:ilvl="3" w:tplc="FECA20BA">
       <w:numFmt w:val="decimal"/>
       <w:lvlText w:val=""/>
       <w:lvlJc w:val="left"/>
     </w:lvl>
-    <w:lvl w:ilvl="4" w:tplc="049040F8">
+    <w:lvl w:ilvl="4" w:tplc="DEA4DF78">
       <w:numFmt w:val="decimal"/>
       <w:lvlText w:val=""/>
       <w:lvlJc w:val="left"/>
     </w:lvl>
-    <w:lvl w:ilvl="5" w:tplc="EF4A6BE0">
+    <w:lvl w:ilvl="5" w:tplc="A6209648">
       <w:numFmt w:val="decimal"/>
       <w:lvlText w:val=""/>
       <w:lvlJc w:val="left"/>
     </w:lvl>
-    <w:lvl w:ilvl="6" w:tplc="D4DE09E2">
+    <w:lvl w:ilvl="6" w:tplc="E1FAD5C4">
       <w:numFmt w:val="decimal"/>
       <w:lvlText w:val=""/>
       <w:lvlJc w:val="left"/>
     </w:lvl>
-    <w:lvl w:ilvl="7" w:tplc="947CD478">
+    <w:lvl w:ilvl="7" w:tplc="794CF0AC">
       <w:numFmt w:val="decimal"/>
       <w:lvlText w:val=""/>
       <w:lvlJc w:val="left"/>
     </w:lvl>
-    <w:lvl w:ilvl="8" w:tplc="91D2C77A">
+    <w:lvl w:ilvl="8" w:tplc="97AC338A">
       <w:numFmt w:val="decimal"/>
       <w:lvlText w:val=""/>
       <w:lvlJc w:val="left"/>
     </w:lvl>
   </w:abstractNum>
   <w:abstractNum w:abstractNumId="8" w15:restartNumberingAfterBreak="0">
-    <w:nsid w:val="2C364CD3"/>
+    <w:nsid w:val="3A700E2B"/>
     <w:multiLevelType w:val="hybridMultilevel"/>
-    <w:tmpl w:val="07E2A6C6"/>
-    <w:lvl w:ilvl="0" w:tplc="669269EA">
+    <w:tmpl w:val="62DE70BA"/>
+    <w:lvl w:ilvl="0" w:tplc="FFC6FB02">
       <w:start w:val="1"/>
       <w:numFmt w:val="decimal"/>
       <w:lvlText w:val="%1."/>
@@ -23728,52 +23738,52 @@
         <w:color w:val="A67C27"/>
       </w:rPr>
     </w:lvl>
-    <w:lvl w:ilvl="1" w:tplc="93CCA4D4">
+    <w:lvl w:ilvl="1" w:tplc="10526B50">
       <w:numFmt w:val="decimal"/>
       <w:lvlText w:val=""/>
       <w:lvlJc w:val="left"/>
     </w:lvl>
-    <w:lvl w:ilvl="2" w:tplc="F1C0D836">
+    <w:lvl w:ilvl="2" w:tplc="653C31A8">
       <w:numFmt w:val="decimal"/>
       <w:lvlText w:val=""/>
       <w:lvlJc w:val="left"/>
     </w:lvl>
-    <w:lvl w:ilvl="3" w:tplc="2682CDFC">
+    <w:lvl w:ilvl="3" w:tplc="56B60DEA">
       <w:numFmt w:val="decimal"/>
       <w:lvlText w:val=""/>
       <w:lvlJc w:val="left"/>
     </w:lvl>
-    <w:lvl w:ilvl="4" w:tplc="D1985630">
+    <w:lvl w:ilvl="4" w:tplc="3138AE0A">
       <w:numFmt w:val="decimal"/>
       <w:lvlText w:val=""/>
       <w:lvlJc w:val="left"/>
     </w:lvl>
-    <w:lvl w:ilvl="5" w:tplc="F5566716">
+    <w:lvl w:ilvl="5" w:tplc="3BC42844">
       <w:numFmt w:val="decimal"/>
       <w:lvlText w:val=""/>
       <w:lvlJc w:val="left"/>
     </w:lvl>
-    <w:lvl w:ilvl="6" w:tplc="48CAE490">
+    <w:lvl w:ilvl="6" w:tplc="41E089E2">
       <w:numFmt w:val="decimal"/>
       <w:lvlText w:val=""/>
       <w:lvlJc w:val="left"/>
     </w:lvl>
-    <w:lvl w:ilvl="7" w:tplc="0930D656">
+    <w:lvl w:ilvl="7" w:tplc="43B25894">
       <w:numFmt w:val="decimal"/>
       <w:lvlText w:val=""/>
       <w:lvlJc w:val="left"/>
     </w:lvl>
-    <w:lvl w:ilvl="8" w:tplc="4A06216C">
+    <w:lvl w:ilvl="8" w:tplc="95986A2A">
       <w:numFmt w:val="decimal"/>
       <w:lvlText w:val=""/>
       <w:lvlJc w:val="left"/>
     </w:lvl>
   </w:abstractNum>
   <w:abstractNum w:abstractNumId="9" w15:restartNumberingAfterBreak="0">
-    <w:nsid w:val="2F24281B"/>
+    <w:nsid w:val="3BF73A0C"/>
     <w:multiLevelType w:val="hybridMultilevel"/>
-    <w:tmpl w:val="B98828C4"/>
-    <w:lvl w:ilvl="0" w:tplc="44DAB764">
+    <w:tmpl w:val="32789B24"/>
+    <w:lvl w:ilvl="0" w:tplc="4A343138">
       <w:start w:val="1"/>
       <w:numFmt w:val="decimal"/>
       <w:lvlText w:val="%1."/>
@@ -23787,52 +23797,52 @@
         <w:color w:val="A67C27"/>
       </w:rPr>
     </w:lvl>
-    <w:lvl w:ilvl="1" w:tplc="1F2AEF60">
+    <w:lvl w:ilvl="1" w:tplc="BF409990">
       <w:numFmt w:val="decimal"/>
       <w:lvlText w:val=""/>
       <w:lvlJc w:val="left"/>
     </w:lvl>
-    <w:lvl w:ilvl="2" w:tplc="B72EE97E">
+    <w:lvl w:ilvl="2" w:tplc="AECAE8F8">
       <w:numFmt w:val="decimal"/>
       <w:lvlText w:val=""/>
       <w:lvlJc w:val="left"/>
     </w:lvl>
-    <w:lvl w:ilvl="3" w:tplc="2A324458">
+    <w:lvl w:ilvl="3" w:tplc="08445340">
       <w:numFmt w:val="decimal"/>
       <w:lvlText w:val=""/>
       <w:lvlJc w:val="left"/>
     </w:lvl>
-    <w:lvl w:ilvl="4" w:tplc="4A5E4F2C">
+    <w:lvl w:ilvl="4" w:tplc="29F4D722">
       <w:numFmt w:val="decimal"/>
       <w:lvlText w:val=""/>
       <w:lvlJc w:val="left"/>
     </w:lvl>
-    <w:lvl w:ilvl="5" w:tplc="C5AE2526">
+    <w:lvl w:ilvl="5" w:tplc="D94A687C">
       <w:numFmt w:val="decimal"/>
       <w:lvlText w:val=""/>
       <w:lvlJc w:val="left"/>
     </w:lvl>
-    <w:lvl w:ilvl="6" w:tplc="84485A20">
+    <w:lvl w:ilvl="6" w:tplc="E22064F8">
       <w:numFmt w:val="decimal"/>
       <w:lvlText w:val=""/>
       <w:lvlJc w:val="left"/>
     </w:lvl>
-    <w:lvl w:ilvl="7" w:tplc="1156935E">
+    <w:lvl w:ilvl="7" w:tplc="F796DFEA">
       <w:numFmt w:val="decimal"/>
       <w:lvlText w:val=""/>
       <w:lvlJc w:val="left"/>
     </w:lvl>
-    <w:lvl w:ilvl="8" w:tplc="1D103004">
+    <w:lvl w:ilvl="8" w:tplc="9B76ABF4">
       <w:numFmt w:val="decimal"/>
       <w:lvlText w:val=""/>
       <w:lvlJc w:val="left"/>
     </w:lvl>
   </w:abstractNum>
   <w:abstractNum w:abstractNumId="10" w15:restartNumberingAfterBreak="0">
-    <w:nsid w:val="33004BFF"/>
+    <w:nsid w:val="3C0C5ED6"/>
     <w:multiLevelType w:val="hybridMultilevel"/>
-    <w:tmpl w:val="7FA6601A"/>
-    <w:lvl w:ilvl="0" w:tplc="245AE0E2">
+    <w:tmpl w:val="E5DCD42A"/>
+    <w:lvl w:ilvl="0" w:tplc="D8EA1814">
       <w:start w:val="1"/>
       <w:numFmt w:val="decimal"/>
       <w:lvlText w:val="%1."/>
@@ -23846,52 +23856,138 @@
         <w:color w:val="A67C27"/>
       </w:rPr>
     </w:lvl>
-    <w:lvl w:ilvl="1" w:tplc="D632E9F0">
+    <w:lvl w:ilvl="1" w:tplc="1ABE7434">
       <w:numFmt w:val="decimal"/>
       <w:lvlText w:val=""/>
       <w:lvlJc w:val="left"/>
     </w:lvl>
-    <w:lvl w:ilvl="2" w:tplc="4FD4FA46">
+    <w:lvl w:ilvl="2" w:tplc="7E38ACE2">
       <w:numFmt w:val="decimal"/>
       <w:lvlText w:val=""/>
       <w:lvlJc w:val="left"/>
     </w:lvl>
-    <w:lvl w:ilvl="3" w:tplc="EF7CFC46">
+    <w:lvl w:ilvl="3" w:tplc="E0D0112A">
       <w:numFmt w:val="decimal"/>
       <w:lvlText w:val=""/>
       <w:lvlJc w:val="left"/>
     </w:lvl>
-    <w:lvl w:ilvl="4" w:tplc="997A7702">
+    <w:lvl w:ilvl="4" w:tplc="D514EDBE">
       <w:numFmt w:val="decimal"/>
       <w:lvlText w:val=""/>
       <w:lvlJc w:val="left"/>
     </w:lvl>
-    <w:lvl w:ilvl="5" w:tplc="09B0E616">
+    <w:lvl w:ilvl="5" w:tplc="43FA4A82">
       <w:numFmt w:val="decimal"/>
       <w:lvlText w:val=""/>
       <w:lvlJc w:val="left"/>
     </w:lvl>
-    <w:lvl w:ilvl="6" w:tplc="628CED86">
+    <w:lvl w:ilvl="6" w:tplc="BF2A581E">
       <w:numFmt w:val="decimal"/>
       <w:lvlText w:val=""/>
       <w:lvlJc w:val="left"/>
     </w:lvl>
-    <w:lvl w:ilvl="7" w:tplc="DB20E704">
+    <w:lvl w:ilvl="7" w:tplc="12940172">
       <w:numFmt w:val="decimal"/>
       <w:lvlText w:val=""/>
       <w:lvlJc w:val="left"/>
     </w:lvl>
-    <w:lvl w:ilvl="8" w:tplc="06B832E6">
+    <w:lvl w:ilvl="8" w:tplc="C7AEF960">
       <w:numFmt w:val="decimal"/>
       <w:lvlText w:val=""/>
       <w:lvlJc w:val="left"/>
     </w:lvl>
   </w:abstractNum>
   <w:abstractNum w:abstractNumId="11" w15:restartNumberingAfterBreak="0">
-    <w:nsid w:val="337D748A"/>
+    <w:nsid w:val="48CF638E"/>
     <w:multiLevelType w:val="hybridMultilevel"/>
-    <w:tmpl w:val="2530EBAA"/>
-    <w:lvl w:ilvl="0" w:tplc="7E2CD6FE">
+    <w:tmpl w:val="24CCED9A"/>
+    <w:lvl w:ilvl="0" w:tplc="EBE07A6A">
+      <w:start w:val="1"/>
+      <w:numFmt w:val="bullet"/>
+      <w:lvlText w:val="●"/>
+      <w:lvlJc w:val="left"/>
+      <w:pPr>
+        <w:ind w:left="720" w:hanging="360"/>
+      </w:pPr>
+    </w:lvl>
+    <w:lvl w:ilvl="1" w:tplc="D576AEBC">
+      <w:start w:val="1"/>
+      <w:numFmt w:val="bullet"/>
+      <w:lvlText w:val="○"/>
+      <w:lvlJc w:val="left"/>
+      <w:pPr>
+        <w:ind w:left="1440" w:hanging="360"/>
+      </w:pPr>
+    </w:lvl>
+    <w:lvl w:ilvl="2" w:tplc="10B2E746">
+      <w:start w:val="1"/>
+      <w:numFmt w:val="bullet"/>
+      <w:lvlText w:val="■"/>
+      <w:lvlJc w:val="left"/>
+      <w:pPr>
+        <w:ind w:left="2160" w:hanging="360"/>
+      </w:pPr>
+    </w:lvl>
+    <w:lvl w:ilvl="3" w:tplc="EF84443E">
+      <w:start w:val="1"/>
+      <w:numFmt w:val="bullet"/>
+      <w:lvlText w:val="●"/>
+      <w:lvlJc w:val="left"/>
+      <w:pPr>
+        <w:ind w:left="2880" w:hanging="360"/>
+      </w:pPr>
+    </w:lvl>
+    <w:lvl w:ilvl="4" w:tplc="62FE3FE4">
+      <w:start w:val="1"/>
+      <w:numFmt w:val="bullet"/>
+      <w:lvlText w:val="○"/>
+      <w:lvlJc w:val="left"/>
+      <w:pPr>
+        <w:ind w:left="3600" w:hanging="360"/>
+      </w:pPr>
+    </w:lvl>
+    <w:lvl w:ilvl="5" w:tplc="8B6C2660">
+      <w:start w:val="1"/>
+      <w:numFmt w:val="bullet"/>
+      <w:lvlText w:val="■"/>
+      <w:lvlJc w:val="left"/>
+      <w:pPr>
+        <w:ind w:left="4320" w:hanging="360"/>
+      </w:pPr>
+    </w:lvl>
+    <w:lvl w:ilvl="6" w:tplc="90B63C44">
+      <w:start w:val="1"/>
+      <w:numFmt w:val="bullet"/>
+      <w:lvlText w:val="●"/>
+      <w:lvlJc w:val="left"/>
+      <w:pPr>
+        <w:ind w:left="5040" w:hanging="360"/>
+      </w:pPr>
+    </w:lvl>
+    <w:lvl w:ilvl="7" w:tplc="5EF08E60">
+      <w:start w:val="1"/>
+      <w:numFmt w:val="bullet"/>
+      <w:lvlText w:val="●"/>
+      <w:lvlJc w:val="left"/>
+      <w:pPr>
+        <w:ind w:left="5760" w:hanging="360"/>
+      </w:pPr>
+    </w:lvl>
+    <w:lvl w:ilvl="8" w:tplc="5FC6ACF4">
+      <w:start w:val="1"/>
+      <w:numFmt w:val="bullet"/>
+      <w:lvlText w:val="●"/>
+      <w:lvlJc w:val="left"/>
+      <w:pPr>
+        <w:ind w:left="6480" w:hanging="360"/>
+      </w:pPr>
+    </w:lvl>
+  </w:abstractNum>
+  <w:abstractNum w:abstractNumId="12" w15:restartNumberingAfterBreak="0">
+    <w:nsid w:val="4ECD5127"/>
+    <w:multiLevelType w:val="hybridMultilevel"/>
+    <w:tmpl w:val="257EB836"/>
+    <w:lvl w:ilvl="0" w:tplc="6C9276B0">
       <w:start w:val="1"/>
       <w:numFmt w:val="decimal"/>
       <w:lvlText w:val="%1."/>
@@ -23905,52 +24001,52 @@
         <w:color w:val="A67C27"/>
       </w:rPr>
     </w:lvl>
-    <w:lvl w:ilvl="1" w:tplc="8AC883CE">
+    <w:lvl w:ilvl="1" w:tplc="A4E0BA42">
       <w:numFmt w:val="decimal"/>
       <w:lvlText w:val=""/>
       <w:lvlJc w:val="left"/>
     </w:lvl>
-    <w:lvl w:ilvl="2" w:tplc="D768322E">
+    <w:lvl w:ilvl="2" w:tplc="F1CEF01C">
       <w:numFmt w:val="decimal"/>
       <w:lvlText w:val=""/>
       <w:lvlJc w:val="left"/>
     </w:lvl>
-    <w:lvl w:ilvl="3" w:tplc="99A85CC0">
+    <w:lvl w:ilvl="3" w:tplc="1C4E5268">
       <w:numFmt w:val="decimal"/>
       <w:lvlText w:val=""/>
       <w:lvlJc w:val="left"/>
     </w:lvl>
-    <w:lvl w:ilvl="4" w:tplc="CAD4B6B0">
+    <w:lvl w:ilvl="4" w:tplc="D7568FB0">
       <w:numFmt w:val="decimal"/>
       <w:lvlText w:val=""/>
       <w:lvlJc w:val="left"/>
     </w:lvl>
-    <w:lvl w:ilvl="5" w:tplc="FDEE194C">
+    <w:lvl w:ilvl="5" w:tplc="EC529F0A">
       <w:numFmt w:val="decimal"/>
       <w:lvlText w:val=""/>
       <w:lvlJc w:val="left"/>
     </w:lvl>
-    <w:lvl w:ilvl="6" w:tplc="B6CC49C4">
+    <w:lvl w:ilvl="6" w:tplc="D38E8B58">
       <w:numFmt w:val="decimal"/>
       <w:lvlText w:val=""/>
       <w:lvlJc w:val="left"/>
     </w:lvl>
-    <w:lvl w:ilvl="7" w:tplc="3E384C4C">
+    <w:lvl w:ilvl="7" w:tplc="3A120D9C">
       <w:numFmt w:val="decimal"/>
       <w:lvlText w:val=""/>
       <w:lvlJc w:val="left"/>
     </w:lvl>
-    <w:lvl w:ilvl="8" w:tplc="5A387EAE">
+    <w:lvl w:ilvl="8" w:tplc="7E586394">
       <w:numFmt w:val="decimal"/>
       <w:lvlText w:val=""/>
       <w:lvlJc w:val="left"/>
     </w:lvl>
   </w:abstractNum>
-  <w:abstractNum w:abstractNumId="12" w15:restartNumberingAfterBreak="0">
-    <w:nsid w:val="33D112CC"/>
+  <w:abstractNum w:abstractNumId="13" w15:restartNumberingAfterBreak="0">
+    <w:nsid w:val="51836288"/>
     <w:multiLevelType w:val="hybridMultilevel"/>
-    <w:tmpl w:val="92DEF308"/>
-    <w:lvl w:ilvl="0" w:tplc="13CE3304">
+    <w:tmpl w:val="AADADD84"/>
+    <w:lvl w:ilvl="0" w:tplc="CDF60622">
       <w:start w:val="1"/>
       <w:numFmt w:val="decimal"/>
       <w:lvlText w:val="%1."/>
@@ -23964,52 +24060,52 @@
         <w:color w:val="A67C27"/>
       </w:rPr>
     </w:lvl>
-    <w:lvl w:ilvl="1" w:tplc="87486B20">
+    <w:lvl w:ilvl="1" w:tplc="AD7ABDD4">
       <w:numFmt w:val="decimal"/>
       <w:lvlText w:val=""/>
       <w:lvlJc w:val="left"/>
     </w:lvl>
-    <w:lvl w:ilvl="2" w:tplc="312843FE">
+    <w:lvl w:ilvl="2" w:tplc="F5B47ECC">
       <w:numFmt w:val="decimal"/>
       <w:lvlText w:val=""/>
       <w:lvlJc w:val="left"/>
     </w:lvl>
-    <w:lvl w:ilvl="3" w:tplc="BA025726">
+    <w:lvl w:ilvl="3" w:tplc="DD64F2C2">
       <w:numFmt w:val="decimal"/>
       <w:lvlText w:val=""/>
       <w:lvlJc w:val="left"/>
     </w:lvl>
-    <w:lvl w:ilvl="4" w:tplc="A732B184">
+    <w:lvl w:ilvl="4" w:tplc="A308080E">
       <w:numFmt w:val="decimal"/>
       <w:lvlText w:val=""/>
       <w:lvlJc w:val="left"/>
     </w:lvl>
-    <w:lvl w:ilvl="5" w:tplc="B5A285CE">
+    <w:lvl w:ilvl="5" w:tplc="4DE49708">
       <w:numFmt w:val="decimal"/>
       <w:lvlText w:val=""/>
       <w:lvlJc w:val="left"/>
     </w:lvl>
-    <w:lvl w:ilvl="6" w:tplc="93746792">
+    <w:lvl w:ilvl="6" w:tplc="73A4CCA8">
       <w:numFmt w:val="decimal"/>
       <w:lvlText w:val=""/>
       <w:lvlJc w:val="left"/>
     </w:lvl>
-    <w:lvl w:ilvl="7" w:tplc="CE40134C">
+    <w:lvl w:ilvl="7" w:tplc="0504AAE8">
       <w:numFmt w:val="decimal"/>
       <w:lvlText w:val=""/>
       <w:lvlJc w:val="left"/>
     </w:lvl>
-    <w:lvl w:ilvl="8" w:tplc="ACAE18B0">
+    <w:lvl w:ilvl="8" w:tplc="38E881C6">
       <w:numFmt w:val="decimal"/>
       <w:lvlText w:val=""/>
       <w:lvlJc w:val="left"/>
     </w:lvl>
   </w:abstractNum>
-  <w:abstractNum w:abstractNumId="13" w15:restartNumberingAfterBreak="0">
-    <w:nsid w:val="3AE360B3"/>
+  <w:abstractNum w:abstractNumId="14" w15:restartNumberingAfterBreak="0">
+    <w:nsid w:val="591A117A"/>
     <w:multiLevelType w:val="hybridMultilevel"/>
-    <w:tmpl w:val="1BD88F24"/>
-    <w:lvl w:ilvl="0" w:tplc="EB665260">
+    <w:tmpl w:val="728843DA"/>
+    <w:lvl w:ilvl="0" w:tplc="88E0878A">
       <w:start w:val="1"/>
       <w:numFmt w:val="decimal"/>
       <w:lvlText w:val="%1."/>
@@ -24023,138 +24119,52 @@
         <w:color w:val="A67C27"/>
       </w:rPr>
     </w:lvl>
-    <w:lvl w:ilvl="1" w:tplc="83605E42">
+    <w:lvl w:ilvl="1" w:tplc="2FC2A7B0">
       <w:numFmt w:val="decimal"/>
       <w:lvlText w:val=""/>
       <w:lvlJc w:val="left"/>
     </w:lvl>
-    <w:lvl w:ilvl="2" w:tplc="5C640284">
+    <w:lvl w:ilvl="2" w:tplc="7CE835EC">
       <w:numFmt w:val="decimal"/>
       <w:lvlText w:val=""/>
       <w:lvlJc w:val="left"/>
     </w:lvl>
-    <w:lvl w:ilvl="3" w:tplc="E668DDC2">
+    <w:lvl w:ilvl="3" w:tplc="174C0300">
       <w:numFmt w:val="decimal"/>
       <w:lvlText w:val=""/>
       <w:lvlJc w:val="left"/>
     </w:lvl>
-    <w:lvl w:ilvl="4" w:tplc="F6885268">
+    <w:lvl w:ilvl="4" w:tplc="7CFC60F4">
       <w:numFmt w:val="decimal"/>
       <w:lvlText w:val=""/>
       <w:lvlJc w:val="left"/>
     </w:lvl>
-    <w:lvl w:ilvl="5" w:tplc="CC7C5FF0">
+    <w:lvl w:ilvl="5" w:tplc="F7F29E64">
       <w:numFmt w:val="decimal"/>
       <w:lvlText w:val=""/>
       <w:lvlJc w:val="left"/>
     </w:lvl>
-    <w:lvl w:ilvl="6" w:tplc="D012E4C0">
+    <w:lvl w:ilvl="6" w:tplc="E4EA6B14">
       <w:numFmt w:val="decimal"/>
       <w:lvlText w:val=""/>
       <w:lvlJc w:val="left"/>
     </w:lvl>
-    <w:lvl w:ilvl="7" w:tplc="22DA521E">
+    <w:lvl w:ilvl="7" w:tplc="534043D0">
       <w:numFmt w:val="decimal"/>
       <w:lvlText w:val=""/>
       <w:lvlJc w:val="left"/>
     </w:lvl>
-    <w:lvl w:ilvl="8" w:tplc="D556F05A">
+    <w:lvl w:ilvl="8" w:tplc="CED44EFE">
       <w:numFmt w:val="decimal"/>
       <w:lvlText w:val=""/>
       <w:lvlJc w:val="left"/>
     </w:lvl>
   </w:abstractNum>
-  <w:abstractNum w:abstractNumId="14" w15:restartNumberingAfterBreak="0">
-    <w:nsid w:val="3C276CCF"/>
+  <w:abstractNum w:abstractNumId="15" w15:restartNumberingAfterBreak="0">
+    <w:nsid w:val="5C573A1A"/>
     <w:multiLevelType w:val="hybridMultilevel"/>
-    <w:tmpl w:val="24E6D19C"/>
-    <w:lvl w:ilvl="0" w:tplc="E8F8233E">
-      <w:start w:val="1"/>
-      <w:numFmt w:val="bullet"/>
-      <w:lvlText w:val="●"/>
-      <w:lvlJc w:val="left"/>
-      <w:pPr>
-        <w:ind w:left="720" w:hanging="360"/>
-      </w:pPr>
-    </w:lvl>
-    <w:lvl w:ilvl="1" w:tplc="5680EEB8">
-      <w:start w:val="1"/>
-      <w:numFmt w:val="bullet"/>
-      <w:lvlText w:val="○"/>
-      <w:lvlJc w:val="left"/>
-      <w:pPr>
-        <w:ind w:left="1440" w:hanging="360"/>
-      </w:pPr>
-    </w:lvl>
-    <w:lvl w:ilvl="2" w:tplc="C6809134">
-      <w:start w:val="1"/>
-      <w:numFmt w:val="bullet"/>
-      <w:lvlText w:val="■"/>
-      <w:lvlJc w:val="left"/>
-      <w:pPr>
-        <w:ind w:left="2160" w:hanging="360"/>
-      </w:pPr>
-    </w:lvl>
-    <w:lvl w:ilvl="3" w:tplc="0AD4B9CE">
-      <w:start w:val="1"/>
-      <w:numFmt w:val="bullet"/>
-      <w:lvlText w:val="●"/>
-      <w:lvlJc w:val="left"/>
-      <w:pPr>
-        <w:ind w:left="2880" w:hanging="360"/>
-      </w:pPr>
-    </w:lvl>
-    <w:lvl w:ilvl="4" w:tplc="8A626C10">
-      <w:start w:val="1"/>
-      <w:numFmt w:val="bullet"/>
-      <w:lvlText w:val="○"/>
-      <w:lvlJc w:val="left"/>
-      <w:pPr>
-        <w:ind w:left="3600" w:hanging="360"/>
-      </w:pPr>
-    </w:lvl>
-    <w:lvl w:ilvl="5" w:tplc="376819A6">
-      <w:start w:val="1"/>
-      <w:numFmt w:val="bullet"/>
-      <w:lvlText w:val="■"/>
-      <w:lvlJc w:val="left"/>
-      <w:pPr>
-        <w:ind w:left="4320" w:hanging="360"/>
-      </w:pPr>
-    </w:lvl>
-    <w:lvl w:ilvl="6" w:tplc="414A0AAE">
-      <w:start w:val="1"/>
-      <w:numFmt w:val="bullet"/>
-      <w:lvlText w:val="●"/>
-      <w:lvlJc w:val="left"/>
-      <w:pPr>
-        <w:ind w:left="5040" w:hanging="360"/>
-      </w:pPr>
-    </w:lvl>
-    <w:lvl w:ilvl="7" w:tplc="10DC35DA">
-      <w:start w:val="1"/>
-      <w:numFmt w:val="bullet"/>
-      <w:lvlText w:val="●"/>
-      <w:lvlJc w:val="left"/>
-      <w:pPr>
-        <w:ind w:left="5760" w:hanging="360"/>
-      </w:pPr>
-    </w:lvl>
-    <w:lvl w:ilvl="8" w:tplc="7690E24E">
-      <w:start w:val="1"/>
-      <w:numFmt w:val="bullet"/>
-      <w:lvlText w:val="●"/>
-      <w:lvlJc w:val="left"/>
-      <w:pPr>
-        <w:ind w:left="6480" w:hanging="360"/>
-      </w:pPr>
-    </w:lvl>
-  </w:abstractNum>
-  <w:abstractNum w:abstractNumId="15" w15:restartNumberingAfterBreak="0">
-    <w:nsid w:val="3C8C064E"/>
-    <w:multiLevelType w:val="hybridMultilevel"/>
-    <w:tmpl w:val="433CD41C"/>
-    <w:lvl w:ilvl="0" w:tplc="F7841374">
+    <w:tmpl w:val="77103374"/>
+    <w:lvl w:ilvl="0" w:tplc="5E8EDF10">
       <w:start w:val="1"/>
       <w:numFmt w:val="decimal"/>
       <w:lvlText w:val="%1."/>
@@ -24168,52 +24178,52 @@
         <w:color w:val="A67C27"/>
       </w:rPr>
     </w:lvl>
-    <w:lvl w:ilvl="1" w:tplc="BBD2111E">
+    <w:lvl w:ilvl="1" w:tplc="0D1653A6">
       <w:numFmt w:val="decimal"/>
       <w:lvlText w:val=""/>
       <w:lvlJc w:val="left"/>
     </w:lvl>
-    <w:lvl w:ilvl="2" w:tplc="266A2276">
+    <w:lvl w:ilvl="2" w:tplc="5FE40CE2">
       <w:numFmt w:val="decimal"/>
       <w:lvlText w:val=""/>
       <w:lvlJc w:val="left"/>
     </w:lvl>
-    <w:lvl w:ilvl="3" w:tplc="769E18A4">
+    <w:lvl w:ilvl="3" w:tplc="852A09E4">
       <w:numFmt w:val="decimal"/>
       <w:lvlText w:val=""/>
       <w:lvlJc w:val="left"/>
     </w:lvl>
-    <w:lvl w:ilvl="4" w:tplc="8C4242A6">
+    <w:lvl w:ilvl="4" w:tplc="C4162DC0">
       <w:numFmt w:val="decimal"/>
       <w:lvlText w:val=""/>
       <w:lvlJc w:val="left"/>
     </w:lvl>
-    <w:lvl w:ilvl="5" w:tplc="2E887A00">
+    <w:lvl w:ilvl="5" w:tplc="64848528">
       <w:numFmt w:val="decimal"/>
       <w:lvlText w:val=""/>
       <w:lvlJc w:val="left"/>
     </w:lvl>
-    <w:lvl w:ilvl="6" w:tplc="F5568C6E">
+    <w:lvl w:ilvl="6" w:tplc="E30A8EA2">
       <w:numFmt w:val="decimal"/>
       <w:lvlText w:val=""/>
       <w:lvlJc w:val="left"/>
     </w:lvl>
-    <w:lvl w:ilvl="7" w:tplc="E892D1A8">
+    <w:lvl w:ilvl="7" w:tplc="88C09E9A">
       <w:numFmt w:val="decimal"/>
       <w:lvlText w:val=""/>
       <w:lvlJc w:val="left"/>
     </w:lvl>
-    <w:lvl w:ilvl="8" w:tplc="93B85C56">
+    <w:lvl w:ilvl="8" w:tplc="21E00CC6">
       <w:numFmt w:val="decimal"/>
       <w:lvlText w:val=""/>
       <w:lvlJc w:val="left"/>
     </w:lvl>
   </w:abstractNum>
   <w:abstractNum w:abstractNumId="16" w15:restartNumberingAfterBreak="0">
-    <w:nsid w:val="3D301E1D"/>
+    <w:nsid w:val="5DCC18FF"/>
     <w:multiLevelType w:val="hybridMultilevel"/>
-    <w:tmpl w:val="F20A23DC"/>
-    <w:lvl w:ilvl="0" w:tplc="0FB4B552">
+    <w:tmpl w:val="2BFA8614"/>
+    <w:lvl w:ilvl="0" w:tplc="4E685D04">
       <w:start w:val="1"/>
       <w:numFmt w:val="decimal"/>
       <w:lvlText w:val="%1."/>
@@ -24227,52 +24237,52 @@
         <w:color w:val="A67C27"/>
       </w:rPr>
     </w:lvl>
-    <w:lvl w:ilvl="1" w:tplc="B9DA7F3E">
+    <w:lvl w:ilvl="1" w:tplc="B8D4429A">
       <w:numFmt w:val="decimal"/>
       <w:lvlText w:val=""/>
       <w:lvlJc w:val="left"/>
     </w:lvl>
-    <w:lvl w:ilvl="2" w:tplc="E9EE012A">
+    <w:lvl w:ilvl="2" w:tplc="7EFCF606">
       <w:numFmt w:val="decimal"/>
       <w:lvlText w:val=""/>
       <w:lvlJc w:val="left"/>
     </w:lvl>
-    <w:lvl w:ilvl="3" w:tplc="0C6E1FB8">
+    <w:lvl w:ilvl="3" w:tplc="C5887E3E">
       <w:numFmt w:val="decimal"/>
       <w:lvlText w:val=""/>
       <w:lvlJc w:val="left"/>
     </w:lvl>
-    <w:lvl w:ilvl="4" w:tplc="33EEBE8A">
+    <w:lvl w:ilvl="4" w:tplc="9EA82DA0">
       <w:numFmt w:val="decimal"/>
       <w:lvlText w:val=""/>
       <w:lvlJc w:val="left"/>
     </w:lvl>
-    <w:lvl w:ilvl="5" w:tplc="55400330">
+    <w:lvl w:ilvl="5" w:tplc="997CC184">
       <w:numFmt w:val="decimal"/>
       <w:lvlText w:val=""/>
       <w:lvlJc w:val="left"/>
     </w:lvl>
-    <w:lvl w:ilvl="6" w:tplc="9F48300C">
+    <w:lvl w:ilvl="6" w:tplc="A166368A">
       <w:numFmt w:val="decimal"/>
       <w:lvlText w:val=""/>
       <w:lvlJc w:val="left"/>
     </w:lvl>
-    <w:lvl w:ilvl="7" w:tplc="AD7841F6">
+    <w:lvl w:ilvl="7" w:tplc="CBCC0192">
       <w:numFmt w:val="decimal"/>
       <w:lvlText w:val=""/>
       <w:lvlJc w:val="left"/>
     </w:lvl>
-    <w:lvl w:ilvl="8" w:tplc="EDFC88A4">
+    <w:lvl w:ilvl="8" w:tplc="9B86E1C0">
       <w:numFmt w:val="decimal"/>
       <w:lvlText w:val=""/>
       <w:lvlJc w:val="left"/>
     </w:lvl>
   </w:abstractNum>
   <w:abstractNum w:abstractNumId="17" w15:restartNumberingAfterBreak="0">
-    <w:nsid w:val="4007029A"/>
+    <w:nsid w:val="5F574820"/>
     <w:multiLevelType w:val="hybridMultilevel"/>
-    <w:tmpl w:val="F5C07B90"/>
-    <w:lvl w:ilvl="0" w:tplc="E36A04A2">
+    <w:tmpl w:val="8F425FBA"/>
+    <w:lvl w:ilvl="0" w:tplc="DB2CAE96">
       <w:start w:val="1"/>
       <w:numFmt w:val="decimal"/>
       <w:lvlText w:val="%1."/>
@@ -24286,52 +24296,52 @@
         <w:color w:val="A67C27"/>
       </w:rPr>
     </w:lvl>
-    <w:lvl w:ilvl="1" w:tplc="11A088E0">
+    <w:lvl w:ilvl="1" w:tplc="31F4AD6A">
       <w:numFmt w:val="decimal"/>
       <w:lvlText w:val=""/>
       <w:lvlJc w:val="left"/>
     </w:lvl>
-    <w:lvl w:ilvl="2" w:tplc="7D9C4770">
+    <w:lvl w:ilvl="2" w:tplc="6B287DB8">
       <w:numFmt w:val="decimal"/>
       <w:lvlText w:val=""/>
       <w:lvlJc w:val="left"/>
     </w:lvl>
-    <w:lvl w:ilvl="3" w:tplc="0A022D82">
+    <w:lvl w:ilvl="3" w:tplc="A08207D2">
       <w:numFmt w:val="decimal"/>
       <w:lvlText w:val=""/>
       <w:lvlJc w:val="left"/>
     </w:lvl>
-    <w:lvl w:ilvl="4" w:tplc="4C62BEC6">
+    <w:lvl w:ilvl="4" w:tplc="41283134">
       <w:numFmt w:val="decimal"/>
       <w:lvlText w:val=""/>
       <w:lvlJc w:val="left"/>
     </w:lvl>
-    <w:lvl w:ilvl="5" w:tplc="2736CC0A">
+    <w:lvl w:ilvl="5" w:tplc="F9FC0036">
       <w:numFmt w:val="decimal"/>
       <w:lvlText w:val=""/>
       <w:lvlJc w:val="left"/>
     </w:lvl>
-    <w:lvl w:ilvl="6" w:tplc="30D0F6C8">
+    <w:lvl w:ilvl="6" w:tplc="87ECD354">
       <w:numFmt w:val="decimal"/>
       <w:lvlText w:val=""/>
       <w:lvlJc w:val="left"/>
     </w:lvl>
-    <w:lvl w:ilvl="7" w:tplc="1610D8D8">
+    <w:lvl w:ilvl="7" w:tplc="FB28C604">
       <w:numFmt w:val="decimal"/>
       <w:lvlText w:val=""/>
       <w:lvlJc w:val="left"/>
     </w:lvl>
-    <w:lvl w:ilvl="8" w:tplc="55D67B1C">
+    <w:lvl w:ilvl="8" w:tplc="FF4A408A">
       <w:numFmt w:val="decimal"/>
       <w:lvlText w:val=""/>
       <w:lvlJc w:val="left"/>
     </w:lvl>
   </w:abstractNum>
   <w:abstractNum w:abstractNumId="18" w15:restartNumberingAfterBreak="0">
-    <w:nsid w:val="4628248E"/>
+    <w:nsid w:val="61F70A38"/>
     <w:multiLevelType w:val="hybridMultilevel"/>
-    <w:tmpl w:val="46CC9762"/>
-    <w:lvl w:ilvl="0" w:tplc="F9F849CA">
+    <w:tmpl w:val="63ECD668"/>
+    <w:lvl w:ilvl="0" w:tplc="F0CEA46E">
       <w:start w:val="1"/>
       <w:numFmt w:val="decimal"/>
       <w:lvlText w:val="%1."/>
@@ -24345,52 +24355,52 @@
         <w:color w:val="A67C27"/>
       </w:rPr>
     </w:lvl>
-    <w:lvl w:ilvl="1" w:tplc="35C065EE">
+    <w:lvl w:ilvl="1" w:tplc="ABEE7128">
       <w:numFmt w:val="decimal"/>
       <w:lvlText w:val=""/>
       <w:lvlJc w:val="left"/>
     </w:lvl>
-    <w:lvl w:ilvl="2" w:tplc="D2F81BF8">
+    <w:lvl w:ilvl="2" w:tplc="A5B494B2">
       <w:numFmt w:val="decimal"/>
       <w:lvlText w:val=""/>
       <w:lvlJc w:val="left"/>
     </w:lvl>
-    <w:lvl w:ilvl="3" w:tplc="6A5000F8">
+    <w:lvl w:ilvl="3" w:tplc="F18AD8E6">
       <w:numFmt w:val="decimal"/>
       <w:lvlText w:val=""/>
       <w:lvlJc w:val="left"/>
     </w:lvl>
-    <w:lvl w:ilvl="4" w:tplc="9DA4212A">
+    <w:lvl w:ilvl="4" w:tplc="AE2E9892">
       <w:numFmt w:val="decimal"/>
       <w:lvlText w:val=""/>
       <w:lvlJc w:val="left"/>
     </w:lvl>
-    <w:lvl w:ilvl="5" w:tplc="896A2556">
+    <w:lvl w:ilvl="5" w:tplc="8732127E">
       <w:numFmt w:val="decimal"/>
       <w:lvlText w:val=""/>
       <w:lvlJc w:val="left"/>
     </w:lvl>
-    <w:lvl w:ilvl="6" w:tplc="B7ACD5F4">
+    <w:lvl w:ilvl="6" w:tplc="BCA83406">
       <w:numFmt w:val="decimal"/>
       <w:lvlText w:val=""/>
       <w:lvlJc w:val="left"/>
     </w:lvl>
-    <w:lvl w:ilvl="7" w:tplc="6C08CD9A">
+    <w:lvl w:ilvl="7" w:tplc="164239B0">
       <w:numFmt w:val="decimal"/>
       <w:lvlText w:val=""/>
       <w:lvlJc w:val="left"/>
     </w:lvl>
-    <w:lvl w:ilvl="8" w:tplc="1B3C44AA">
+    <w:lvl w:ilvl="8" w:tplc="851AD22C">
       <w:numFmt w:val="decimal"/>
       <w:lvlText w:val=""/>
       <w:lvlJc w:val="left"/>
     </w:lvl>
   </w:abstractNum>
   <w:abstractNum w:abstractNumId="19" w15:restartNumberingAfterBreak="0">
-    <w:nsid w:val="4A096D1E"/>
+    <w:nsid w:val="62B04813"/>
     <w:multiLevelType w:val="hybridMultilevel"/>
-    <w:tmpl w:val="DAE4F316"/>
-    <w:lvl w:ilvl="0" w:tplc="5C661172">
+    <w:tmpl w:val="A1AE030C"/>
+    <w:lvl w:ilvl="0" w:tplc="2C5622D2">
       <w:start w:val="1"/>
       <w:numFmt w:val="decimal"/>
       <w:lvlText w:val="%1."/>
@@ -24404,52 +24414,52 @@
         <w:color w:val="A67C27"/>
       </w:rPr>
     </w:lvl>
-    <w:lvl w:ilvl="1" w:tplc="94249026">
+    <w:lvl w:ilvl="1" w:tplc="1FCADE46">
       <w:numFmt w:val="decimal"/>
       <w:lvlText w:val=""/>
       <w:lvlJc w:val="left"/>
     </w:lvl>
-    <w:lvl w:ilvl="2" w:tplc="72BADFA2">
+    <w:lvl w:ilvl="2" w:tplc="D4985DEA">
       <w:numFmt w:val="decimal"/>
       <w:lvlText w:val=""/>
       <w:lvlJc w:val="left"/>
     </w:lvl>
-    <w:lvl w:ilvl="3" w:tplc="F7A6592C">
+    <w:lvl w:ilvl="3" w:tplc="5A1C3CEC">
       <w:numFmt w:val="decimal"/>
       <w:lvlText w:val=""/>
       <w:lvlJc w:val="left"/>
     </w:lvl>
-    <w:lvl w:ilvl="4" w:tplc="4656ABAA">
+    <w:lvl w:ilvl="4" w:tplc="9F90E4DE">
       <w:numFmt w:val="decimal"/>
       <w:lvlText w:val=""/>
       <w:lvlJc w:val="left"/>
     </w:lvl>
-    <w:lvl w:ilvl="5" w:tplc="49FA7086">
+    <w:lvl w:ilvl="5" w:tplc="A1585352">
       <w:numFmt w:val="decimal"/>
       <w:lvlText w:val=""/>
       <w:lvlJc w:val="left"/>
     </w:lvl>
-    <w:lvl w:ilvl="6" w:tplc="20B62E2E">
+    <w:lvl w:ilvl="6" w:tplc="F2E4D532">
       <w:numFmt w:val="decimal"/>
       <w:lvlText w:val=""/>
       <w:lvlJc w:val="left"/>
     </w:lvl>
-    <w:lvl w:ilvl="7" w:tplc="F7481FB2">
+    <w:lvl w:ilvl="7" w:tplc="93768DE0">
       <w:numFmt w:val="decimal"/>
       <w:lvlText w:val=""/>
       <w:lvlJc w:val="left"/>
     </w:lvl>
-    <w:lvl w:ilvl="8" w:tplc="3CF87E48">
+    <w:lvl w:ilvl="8" w:tplc="6A2ECBE0">
       <w:numFmt w:val="decimal"/>
       <w:lvlText w:val=""/>
       <w:lvlJc w:val="left"/>
     </w:lvl>
   </w:abstractNum>
   <w:abstractNum w:abstractNumId="20" w15:restartNumberingAfterBreak="0">
-    <w:nsid w:val="4D976960"/>
+    <w:nsid w:val="636F5850"/>
     <w:multiLevelType w:val="hybridMultilevel"/>
-    <w:tmpl w:val="89142CBA"/>
-    <w:lvl w:ilvl="0" w:tplc="3B1E6094">
+    <w:tmpl w:val="900697B2"/>
+    <w:lvl w:ilvl="0" w:tplc="28A6AFDA">
       <w:start w:val="1"/>
       <w:numFmt w:val="decimal"/>
       <w:lvlText w:val="%1."/>
@@ -24463,52 +24473,52 @@
         <w:color w:val="A67C27"/>
       </w:rPr>
     </w:lvl>
-    <w:lvl w:ilvl="1" w:tplc="84AEA9A4">
+    <w:lvl w:ilvl="1" w:tplc="DE0AB8AC">
       <w:numFmt w:val="decimal"/>
       <w:lvlText w:val=""/>
       <w:lvlJc w:val="left"/>
     </w:lvl>
-    <w:lvl w:ilvl="2" w:tplc="80AAA25A">
+    <w:lvl w:ilvl="2" w:tplc="41F24414">
       <w:numFmt w:val="decimal"/>
       <w:lvlText w:val=""/>
       <w:lvlJc w:val="left"/>
     </w:lvl>
-    <w:lvl w:ilvl="3" w:tplc="D51661B0">
+    <w:lvl w:ilvl="3" w:tplc="3F08870E">
       <w:numFmt w:val="decimal"/>
       <w:lvlText w:val=""/>
       <w:lvlJc w:val="left"/>
     </w:lvl>
-    <w:lvl w:ilvl="4" w:tplc="3CEEFF3A">
+    <w:lvl w:ilvl="4" w:tplc="CCF0AF9C">
       <w:numFmt w:val="decimal"/>
       <w:lvlText w:val=""/>
       <w:lvlJc w:val="left"/>
     </w:lvl>
-    <w:lvl w:ilvl="5" w:tplc="05E4677E">
+    <w:lvl w:ilvl="5" w:tplc="948C3FC6">
       <w:numFmt w:val="decimal"/>
       <w:lvlText w:val=""/>
       <w:lvlJc w:val="left"/>
     </w:lvl>
-    <w:lvl w:ilvl="6" w:tplc="E6526A16">
+    <w:lvl w:ilvl="6" w:tplc="11E4BE14">
       <w:numFmt w:val="decimal"/>
       <w:lvlText w:val=""/>
       <w:lvlJc w:val="left"/>
     </w:lvl>
-    <w:lvl w:ilvl="7" w:tplc="688AD336">
+    <w:lvl w:ilvl="7" w:tplc="967C8C94">
       <w:numFmt w:val="decimal"/>
       <w:lvlText w:val=""/>
       <w:lvlJc w:val="left"/>
     </w:lvl>
-    <w:lvl w:ilvl="8" w:tplc="4A32D580">
+    <w:lvl w:ilvl="8" w:tplc="6B064444">
       <w:numFmt w:val="decimal"/>
       <w:lvlText w:val=""/>
       <w:lvlJc w:val="left"/>
     </w:lvl>
   </w:abstractNum>
   <w:abstractNum w:abstractNumId="21" w15:restartNumberingAfterBreak="0">
-    <w:nsid w:val="56FA0B06"/>
+    <w:nsid w:val="64030A6A"/>
     <w:multiLevelType w:val="hybridMultilevel"/>
-    <w:tmpl w:val="4CAA9104"/>
-    <w:lvl w:ilvl="0" w:tplc="CEECF008">
+    <w:tmpl w:val="53E29232"/>
+    <w:lvl w:ilvl="0" w:tplc="EB2A4B5E">
       <w:start w:val="1"/>
       <w:numFmt w:val="decimal"/>
       <w:lvlText w:val="%1."/>
@@ -24522,52 +24532,52 @@
         <w:color w:val="A67C27"/>
       </w:rPr>
     </w:lvl>
-    <w:lvl w:ilvl="1" w:tplc="0FF227C2">
+    <w:lvl w:ilvl="1" w:tplc="EDDEDB9C">
       <w:numFmt w:val="decimal"/>
       <w:lvlText w:val=""/>
       <w:lvlJc w:val="left"/>
     </w:lvl>
-    <w:lvl w:ilvl="2" w:tplc="A2A87A1E">
+    <w:lvl w:ilvl="2" w:tplc="AC969FBA">
       <w:numFmt w:val="decimal"/>
       <w:lvlText w:val=""/>
       <w:lvlJc w:val="left"/>
     </w:lvl>
-    <w:lvl w:ilvl="3" w:tplc="551C6E94">
+    <w:lvl w:ilvl="3" w:tplc="120EF26C">
       <w:numFmt w:val="decimal"/>
       <w:lvlText w:val=""/>
       <w:lvlJc w:val="left"/>
     </w:lvl>
-    <w:lvl w:ilvl="4" w:tplc="8B887F72">
+    <w:lvl w:ilvl="4" w:tplc="AE0A4CF8">
       <w:numFmt w:val="decimal"/>
       <w:lvlText w:val=""/>
       <w:lvlJc w:val="left"/>
     </w:lvl>
-    <w:lvl w:ilvl="5" w:tplc="CC7C41A8">
+    <w:lvl w:ilvl="5" w:tplc="5ECAFA40">
       <w:numFmt w:val="decimal"/>
       <w:lvlText w:val=""/>
       <w:lvlJc w:val="left"/>
     </w:lvl>
-    <w:lvl w:ilvl="6" w:tplc="5AAAA87A">
+    <w:lvl w:ilvl="6" w:tplc="203E3052">
       <w:numFmt w:val="decimal"/>
       <w:lvlText w:val=""/>
       <w:lvlJc w:val="left"/>
     </w:lvl>
-    <w:lvl w:ilvl="7" w:tplc="C4FA621A">
+    <w:lvl w:ilvl="7" w:tplc="22D49D68">
       <w:numFmt w:val="decimal"/>
       <w:lvlText w:val=""/>
       <w:lvlJc w:val="left"/>
     </w:lvl>
-    <w:lvl w:ilvl="8" w:tplc="05201EAE">
+    <w:lvl w:ilvl="8" w:tplc="2AF8DEEC">
       <w:numFmt w:val="decimal"/>
       <w:lvlText w:val=""/>
       <w:lvlJc w:val="left"/>
     </w:lvl>
   </w:abstractNum>
   <w:abstractNum w:abstractNumId="22" w15:restartNumberingAfterBreak="0">
-    <w:nsid w:val="69745AE3"/>
+    <w:nsid w:val="64B002C8"/>
     <w:multiLevelType w:val="hybridMultilevel"/>
-    <w:tmpl w:val="22405998"/>
-    <w:lvl w:ilvl="0" w:tplc="9F0619B2">
+    <w:tmpl w:val="DCD69720"/>
+    <w:lvl w:ilvl="0" w:tplc="348AFA68">
       <w:start w:val="1"/>
       <w:numFmt w:val="decimal"/>
       <w:lvlText w:val="%1."/>
@@ -24581,52 +24591,52 @@
         <w:color w:val="A67C27"/>
       </w:rPr>
     </w:lvl>
-    <w:lvl w:ilvl="1" w:tplc="391C3A1C">
+    <w:lvl w:ilvl="1" w:tplc="27BA574E">
       <w:numFmt w:val="decimal"/>
       <w:lvlText w:val=""/>
       <w:lvlJc w:val="left"/>
     </w:lvl>
-    <w:lvl w:ilvl="2" w:tplc="BC92E74A">
+    <w:lvl w:ilvl="2" w:tplc="C5E80736">
       <w:numFmt w:val="decimal"/>
       <w:lvlText w:val=""/>
       <w:lvlJc w:val="left"/>
     </w:lvl>
-    <w:lvl w:ilvl="3" w:tplc="BBD6A500">
+    <w:lvl w:ilvl="3" w:tplc="052A590E">
       <w:numFmt w:val="decimal"/>
       <w:lvlText w:val=""/>
       <w:lvlJc w:val="left"/>
     </w:lvl>
-    <w:lvl w:ilvl="4" w:tplc="7E5CF4C6">
+    <w:lvl w:ilvl="4" w:tplc="C2DCF456">
       <w:numFmt w:val="decimal"/>
       <w:lvlText w:val=""/>
       <w:lvlJc w:val="left"/>
     </w:lvl>
-    <w:lvl w:ilvl="5" w:tplc="D54A0EAA">
+    <w:lvl w:ilvl="5" w:tplc="385806D8">
       <w:numFmt w:val="decimal"/>
       <w:lvlText w:val=""/>
       <w:lvlJc w:val="left"/>
     </w:lvl>
-    <w:lvl w:ilvl="6" w:tplc="CCCC453C">
+    <w:lvl w:ilvl="6" w:tplc="F4E0BEB2">
       <w:numFmt w:val="decimal"/>
       <w:lvlText w:val=""/>
       <w:lvlJc w:val="left"/>
     </w:lvl>
-    <w:lvl w:ilvl="7" w:tplc="61649C62">
+    <w:lvl w:ilvl="7" w:tplc="3042BFFC">
       <w:numFmt w:val="decimal"/>
       <w:lvlText w:val=""/>
       <w:lvlJc w:val="left"/>
     </w:lvl>
-    <w:lvl w:ilvl="8" w:tplc="F3408A98">
+    <w:lvl w:ilvl="8" w:tplc="C1AEBA7E">
       <w:numFmt w:val="decimal"/>
       <w:lvlText w:val=""/>
       <w:lvlJc w:val="left"/>
     </w:lvl>
   </w:abstractNum>
   <w:abstractNum w:abstractNumId="23" w15:restartNumberingAfterBreak="0">
-    <w:nsid w:val="6BB26CD5"/>
+    <w:nsid w:val="6AE52C8B"/>
     <w:multiLevelType w:val="hybridMultilevel"/>
-    <w:tmpl w:val="D320EAD6"/>
-    <w:lvl w:ilvl="0" w:tplc="C4F46B98">
+    <w:tmpl w:val="1B54D94E"/>
+    <w:lvl w:ilvl="0" w:tplc="FF18F896">
       <w:start w:val="1"/>
       <w:numFmt w:val="decimal"/>
       <w:lvlText w:val="%1."/>
@@ -24640,110 +24650,111 @@
         <w:color w:val="A67C27"/>
       </w:rPr>
     </w:lvl>
-    <w:lvl w:ilvl="1" w:tplc="000ACD48">
+    <w:lvl w:ilvl="1" w:tplc="4BEE6B78">
       <w:numFmt w:val="decimal"/>
       <w:lvlText w:val=""/>
       <w:lvlJc w:val="left"/>
     </w:lvl>
-    <w:lvl w:ilvl="2" w:tplc="C2B64794">
+    <w:lvl w:ilvl="2" w:tplc="331647E6">
       <w:numFmt w:val="decimal"/>
       <w:lvlText w:val=""/>
       <w:lvlJc w:val="left"/>
     </w:lvl>
-    <w:lvl w:ilvl="3" w:tplc="743244AA">
+    <w:lvl w:ilvl="3" w:tplc="B1B2A6EC">
       <w:numFmt w:val="decimal"/>
       <w:lvlText w:val=""/>
       <w:lvlJc w:val="left"/>
     </w:lvl>
-    <w:lvl w:ilvl="4" w:tplc="98F0A72A">
+    <w:lvl w:ilvl="4" w:tplc="59EE97CE">
       <w:numFmt w:val="decimal"/>
       <w:lvlText w:val=""/>
       <w:lvlJc w:val="left"/>
     </w:lvl>
-    <w:lvl w:ilvl="5" w:tplc="9D08B408">
+    <w:lvl w:ilvl="5" w:tplc="51F6CE74">
       <w:numFmt w:val="decimal"/>
       <w:lvlText w:val=""/>
       <w:lvlJc w:val="left"/>
     </w:lvl>
-    <w:lvl w:ilvl="6" w:tplc="32822D44">
+    <w:lvl w:ilvl="6" w:tplc="DB329204">
       <w:numFmt w:val="decimal"/>
       <w:lvlText w:val=""/>
       <w:lvlJc w:val="left"/>
     </w:lvl>
-    <w:lvl w:ilvl="7" w:tplc="03F66160">
+    <w:lvl w:ilvl="7" w:tplc="4B86B168">
       <w:numFmt w:val="decimal"/>
       <w:lvlText w:val=""/>
       <w:lvlJc w:val="left"/>
     </w:lvl>
-    <w:lvl w:ilvl="8" w:tplc="12EE9668">
+    <w:lvl w:ilvl="8" w:tplc="5E10E328">
       <w:numFmt w:val="decimal"/>
       <w:lvlText w:val=""/>
       <w:lvlJc w:val="left"/>
     </w:lvl>
   </w:abstractNum>
   <w:abstractNum w:abstractNumId="24" w15:restartNumberingAfterBreak="0">
-    <w:nsid w:val="6C17081B"/>
+    <w:nsid w:val="6F8630F4"/>
     <w:multiLevelType w:val="hybridMultilevel"/>
-    <w:tmpl w:val="366E6B68"/>
-    <w:lvl w:ilvl="0" w:tplc="CB726C12">
+    <w:tmpl w:val="72CA4180"/>
+    <w:lvl w:ilvl="0" w:tplc="2DACA046">
       <w:start w:val="1"/>
-      <w:numFmt w:val="bullet"/>
-      <w:lvlText w:val="•"/>
+      <w:numFmt w:val="decimal"/>
+      <w:lvlText w:val="%1."/>
       <w:lvlJc w:val="left"/>
       <w:pPr>
-        <w:ind w:left="460" w:hanging="280"/>
-      </w:pPr>
+        <w:ind w:left="460" w:hanging="360"/>
+      </w:pPr>
+      <w:rPr>
+        <w:b/>
+        <w:bCs/>
+        <w:color w:val="A67C27"/>
+      </w:rPr>
     </w:lvl>
-    <w:lvl w:ilvl="1" w:tplc="6F0A33C0">
-      <w:start w:val="1"/>
-      <w:numFmt w:val="bullet"/>
-      <w:lvlText w:val="–"/>
-      <w:lvlJc w:val="left"/>
-      <w:pPr>
-        <w:ind w:left="900" w:hanging="280"/>
-      </w:pPr>
-    </w:lvl>
-    <w:lvl w:ilvl="2" w:tplc="9566D8F2">
+    <w:lvl w:ilvl="1" w:tplc="1436B96C">
       <w:numFmt w:val="decimal"/>
       <w:lvlText w:val=""/>
       <w:lvlJc w:val="left"/>
     </w:lvl>
-    <w:lvl w:ilvl="3" w:tplc="7DD25748">
+    <w:lvl w:ilvl="2" w:tplc="F6BAF256">
       <w:numFmt w:val="decimal"/>
       <w:lvlText w:val=""/>
       <w:lvlJc w:val="left"/>
     </w:lvl>
-    <w:lvl w:ilvl="4" w:tplc="FA5AFA78">
+    <w:lvl w:ilvl="3" w:tplc="948C4DE6">
       <w:numFmt w:val="decimal"/>
       <w:lvlText w:val=""/>
       <w:lvlJc w:val="left"/>
     </w:lvl>
-    <w:lvl w:ilvl="5" w:tplc="5262F4DC">
+    <w:lvl w:ilvl="4" w:tplc="E138CF7A">
       <w:numFmt w:val="decimal"/>
       <w:lvlText w:val=""/>
       <w:lvlJc w:val="left"/>
     </w:lvl>
-    <w:lvl w:ilvl="6" w:tplc="384062EC">
+    <w:lvl w:ilvl="5" w:tplc="22B605FC">
       <w:numFmt w:val="decimal"/>
       <w:lvlText w:val=""/>
       <w:lvlJc w:val="left"/>
     </w:lvl>
-    <w:lvl w:ilvl="7" w:tplc="8A3E1304">
+    <w:lvl w:ilvl="6" w:tplc="D4A2F628">
       <w:numFmt w:val="decimal"/>
       <w:lvlText w:val=""/>
       <w:lvlJc w:val="left"/>
     </w:lvl>
-    <w:lvl w:ilvl="8" w:tplc="C10EDC08">
+    <w:lvl w:ilvl="7" w:tplc="EB2EC300">
+      <w:numFmt w:val="decimal"/>
+      <w:lvlText w:val=""/>
+      <w:lvlJc w:val="left"/>
+    </w:lvl>
+    <w:lvl w:ilvl="8" w:tplc="52F4B0C8">
       <w:numFmt w:val="decimal"/>
       <w:lvlText w:val=""/>
       <w:lvlJc w:val="left"/>
     </w:lvl>
   </w:abstractNum>
   <w:abstractNum w:abstractNumId="25" w15:restartNumberingAfterBreak="0">
-    <w:nsid w:val="728F3410"/>
+    <w:nsid w:val="76BC6ABC"/>
     <w:multiLevelType w:val="hybridMultilevel"/>
-    <w:tmpl w:val="F808CF28"/>
-    <w:lvl w:ilvl="0" w:tplc="D18A2F32">
+    <w:tmpl w:val="E0220F9A"/>
+    <w:lvl w:ilvl="0" w:tplc="C5A01140">
       <w:start w:val="1"/>
       <w:numFmt w:val="decimal"/>
       <w:lvlText w:val="%1."/>
@@ -24757,52 +24768,110 @@
         <w:color w:val="A67C27"/>
       </w:rPr>
     </w:lvl>
-    <w:lvl w:ilvl="1" w:tplc="0CD2142C">
+    <w:lvl w:ilvl="1" w:tplc="0762766E">
       <w:numFmt w:val="decimal"/>
       <w:lvlText w:val=""/>
       <w:lvlJc w:val="left"/>
     </w:lvl>
-    <w:lvl w:ilvl="2" w:tplc="409C231C">
+    <w:lvl w:ilvl="2" w:tplc="CB6C70E4">
       <w:numFmt w:val="decimal"/>
       <w:lvlText w:val=""/>
       <w:lvlJc w:val="left"/>
     </w:lvl>
-    <w:lvl w:ilvl="3" w:tplc="732853E6">
+    <w:lvl w:ilvl="3" w:tplc="4CA25B70">
       <w:numFmt w:val="decimal"/>
       <w:lvlText w:val=""/>
       <w:lvlJc w:val="left"/>
     </w:lvl>
-    <w:lvl w:ilvl="4" w:tplc="170EDFD0">
+    <w:lvl w:ilvl="4" w:tplc="4C023B10">
       <w:numFmt w:val="decimal"/>
       <w:lvlText w:val=""/>
       <w:lvlJc w:val="left"/>
     </w:lvl>
-    <w:lvl w:ilvl="5" w:tplc="BE984EBA">
+    <w:lvl w:ilvl="5" w:tplc="3CDAEFD4">
       <w:numFmt w:val="decimal"/>
       <w:lvlText w:val=""/>
       <w:lvlJc w:val="left"/>
     </w:lvl>
-    <w:lvl w:ilvl="6" w:tplc="A4085FD4">
+    <w:lvl w:ilvl="6" w:tplc="5884334E">
       <w:numFmt w:val="decimal"/>
       <w:lvlText w:val=""/>
       <w:lvlJc w:val="left"/>
     </w:lvl>
-    <w:lvl w:ilvl="7" w:tplc="C5D03694">
+    <w:lvl w:ilvl="7" w:tplc="7EF28642">
       <w:numFmt w:val="decimal"/>
       <w:lvlText w:val=""/>
       <w:lvlJc w:val="left"/>
     </w:lvl>
-    <w:lvl w:ilvl="8" w:tplc="1520E41C">
+    <w:lvl w:ilvl="8" w:tplc="244E1662">
       <w:numFmt w:val="decimal"/>
       <w:lvlText w:val=""/>
       <w:lvlJc w:val="left"/>
     </w:lvl>
   </w:abstractNum>
   <w:abstractNum w:abstractNumId="26" w15:restartNumberingAfterBreak="0">
-    <w:nsid w:val="74FE7E61"/>
+    <w:nsid w:val="7A822AB0"/>
     <w:multiLevelType w:val="hybridMultilevel"/>
-    <w:tmpl w:val="28FCC4C0"/>
-    <w:lvl w:ilvl="0" w:tplc="9F1A2E0E">
+    <w:tmpl w:val="D7C65B80"/>
+    <w:lvl w:ilvl="0" w:tplc="A860DF90">
+      <w:start w:val="1"/>
+      <w:numFmt w:val="bullet"/>
+      <w:lvlText w:val="•"/>
+      <w:lvlJc w:val="left"/>
+      <w:pPr>
+        <w:ind w:left="460" w:hanging="280"/>
+      </w:pPr>
+    </w:lvl>
+    <w:lvl w:ilvl="1" w:tplc="224E5D90">
+      <w:start w:val="1"/>
+      <w:numFmt w:val="bullet"/>
+      <w:lvlText w:val="–"/>
+      <w:lvlJc w:val="left"/>
+      <w:pPr>
+        <w:ind w:left="900" w:hanging="280"/>
+      </w:pPr>
+    </w:lvl>
+    <w:lvl w:ilvl="2" w:tplc="E368BA00">
+      <w:numFmt w:val="decimal"/>
+      <w:lvlText w:val=""/>
+      <w:lvlJc w:val="left"/>
+    </w:lvl>
+    <w:lvl w:ilvl="3" w:tplc="2F10FF2E">
+      <w:numFmt w:val="decimal"/>
+      <w:lvlText w:val=""/>
+      <w:lvlJc w:val="left"/>
+    </w:lvl>
+    <w:lvl w:ilvl="4" w:tplc="2A5C61C0">
+      <w:numFmt w:val="decimal"/>
+      <w:lvlText w:val=""/>
+      <w:lvlJc w:val="left"/>
+    </w:lvl>
+    <w:lvl w:ilvl="5" w:tplc="91C80C36">
+      <w:numFmt w:val="decimal"/>
+      <w:lvlText w:val=""/>
+      <w:lvlJc w:val="left"/>
+    </w:lvl>
+    <w:lvl w:ilvl="6" w:tplc="EE3CF2AA">
+      <w:numFmt w:val="decimal"/>
+      <w:lvlText w:val=""/>
+      <w:lvlJc w:val="left"/>
+    </w:lvl>
+    <w:lvl w:ilvl="7" w:tplc="EFEE00C8">
+      <w:numFmt w:val="decimal"/>
+      <w:lvlText w:val=""/>
+      <w:lvlJc w:val="left"/>
+    </w:lvl>
+    <w:lvl w:ilvl="8" w:tplc="4882033A">
+      <w:numFmt w:val="decimal"/>
+      <w:lvlText w:val=""/>
+      <w:lvlJc w:val="left"/>
+    </w:lvl>
+  </w:abstractNum>
+  <w:abstractNum w:abstractNumId="27" w15:restartNumberingAfterBreak="0">
+    <w:nsid w:val="7E196374"/>
+    <w:multiLevelType w:val="hybridMultilevel"/>
+    <w:tmpl w:val="650ABD7C"/>
+    <w:lvl w:ilvl="0" w:tplc="F506AE04">
       <w:start w:val="1"/>
       <w:numFmt w:val="decimal"/>
       <w:lvlText w:val="%1."/>
@@ -24816,270 +24885,211 @@
         <w:color w:val="A67C27"/>
       </w:rPr>
     </w:lvl>
-    <w:lvl w:ilvl="1" w:tplc="40B60E44">
+    <w:lvl w:ilvl="1" w:tplc="59082354">
       <w:numFmt w:val="decimal"/>
       <w:lvlText w:val=""/>
       <w:lvlJc w:val="left"/>
     </w:lvl>
-    <w:lvl w:ilvl="2" w:tplc="9294A51E">
+    <w:lvl w:ilvl="2" w:tplc="AF9EDB5A">
       <w:numFmt w:val="decimal"/>
       <w:lvlText w:val=""/>
       <w:lvlJc w:val="left"/>
     </w:lvl>
-    <w:lvl w:ilvl="3" w:tplc="D78EE61A">
+    <w:lvl w:ilvl="3" w:tplc="CAFE1D98">
       <w:numFmt w:val="decimal"/>
       <w:lvlText w:val=""/>
       <w:lvlJc w:val="left"/>
     </w:lvl>
-    <w:lvl w:ilvl="4" w:tplc="0A104216">
+    <w:lvl w:ilvl="4" w:tplc="C194C970">
       <w:numFmt w:val="decimal"/>
       <w:lvlText w:val=""/>
       <w:lvlJc w:val="left"/>
     </w:lvl>
-    <w:lvl w:ilvl="5" w:tplc="A80EC5D6">
+    <w:lvl w:ilvl="5" w:tplc="718EBA7C">
       <w:numFmt w:val="decimal"/>
       <w:lvlText w:val=""/>
       <w:lvlJc w:val="left"/>
     </w:lvl>
-    <w:lvl w:ilvl="6" w:tplc="2B2A5914">
+    <w:lvl w:ilvl="6" w:tplc="B78CF410">
       <w:numFmt w:val="decimal"/>
       <w:lvlText w:val=""/>
       <w:lvlJc w:val="left"/>
     </w:lvl>
-    <w:lvl w:ilvl="7" w:tplc="A8FEAA44">
+    <w:lvl w:ilvl="7" w:tplc="9624762E">
       <w:numFmt w:val="decimal"/>
       <w:lvlText w:val=""/>
       <w:lvlJc w:val="left"/>
     </w:lvl>
-    <w:lvl w:ilvl="8" w:tplc="8A28A490">
+    <w:lvl w:ilvl="8" w:tplc="4C141D6E">
       <w:numFmt w:val="decimal"/>
       <w:lvlText w:val=""/>
       <w:lvlJc w:val="left"/>
     </w:lvl>
   </w:abstractNum>
-  <w:abstractNum w:abstractNumId="27" w15:restartNumberingAfterBreak="0">
-    <w:nsid w:val="7BC87485"/>
-    <w:multiLevelType w:val="hybridMultilevel"/>
-    <w:tmpl w:val="CAB2AA9A"/>
-    <w:lvl w:ilvl="0" w:tplc="5F28FC3C">
-      <w:start w:val="1"/>
-      <w:numFmt w:val="decimal"/>
-      <w:lvlText w:val="%1."/>
-      <w:lvlJc w:val="left"/>
-      <w:pPr>
-        <w:ind w:left="460" w:hanging="360"/>
-      </w:pPr>
-      <w:rPr>
-        <w:b/>
-        <w:bCs/>
-        <w:color w:val="A67C27"/>
-      </w:rPr>
-    </w:lvl>
-    <w:lvl w:ilvl="1" w:tplc="10F24FC0">
-      <w:numFmt w:val="decimal"/>
-      <w:lvlText w:val=""/>
-      <w:lvlJc w:val="left"/>
-    </w:lvl>
-    <w:lvl w:ilvl="2" w:tplc="F29E2A28">
-      <w:numFmt w:val="decimal"/>
-      <w:lvlText w:val=""/>
-      <w:lvlJc w:val="left"/>
-    </w:lvl>
-    <w:lvl w:ilvl="3" w:tplc="B9604570">
-      <w:numFmt w:val="decimal"/>
-      <w:lvlText w:val=""/>
-      <w:lvlJc w:val="left"/>
-    </w:lvl>
-    <w:lvl w:ilvl="4" w:tplc="5C50CB0A">
-      <w:numFmt w:val="decimal"/>
-      <w:lvlText w:val=""/>
-      <w:lvlJc w:val="left"/>
-    </w:lvl>
-    <w:lvl w:ilvl="5" w:tplc="E7EE3B50">
-      <w:numFmt w:val="decimal"/>
-      <w:lvlText w:val=""/>
-      <w:lvlJc w:val="left"/>
-    </w:lvl>
-    <w:lvl w:ilvl="6" w:tplc="F28EDE02">
-      <w:numFmt w:val="decimal"/>
-      <w:lvlText w:val=""/>
-      <w:lvlJc w:val="left"/>
-    </w:lvl>
-    <w:lvl w:ilvl="7" w:tplc="726C1324">
-      <w:numFmt w:val="decimal"/>
-      <w:lvlText w:val=""/>
-      <w:lvlJc w:val="left"/>
-    </w:lvl>
-    <w:lvl w:ilvl="8" w:tplc="927048C0">
-      <w:numFmt w:val="decimal"/>
-      <w:lvlText w:val=""/>
-      <w:lvlJc w:val="left"/>
-    </w:lvl>
-  </w:abstractNum>
-  <w:num w:numId="1" w16cid:durableId="848713489">
+  <w:num w:numId="1" w16cid:durableId="889878372">
+    <w:abstractNumId w:val="11"/>
+    <w:lvlOverride w:ilvl="0">
+      <w:startOverride w:val="1"/>
+    </w:lvlOverride>
+  </w:num>
+  <w:num w:numId="2" w16cid:durableId="497040865">
+    <w:abstractNumId w:val="26"/>
+    <w:lvlOverride w:ilvl="0">
+      <w:startOverride w:val="1"/>
+    </w:lvlOverride>
+  </w:num>
+  <w:num w:numId="3" w16cid:durableId="1394501113">
+    <w:abstractNumId w:val="4"/>
+    <w:lvlOverride w:ilvl="0">
+      <w:startOverride w:val="1"/>
+    </w:lvlOverride>
+  </w:num>
+  <w:num w:numId="4" w16cid:durableId="309986309">
+    <w:abstractNumId w:val="20"/>
+    <w:lvlOverride w:ilvl="0">
+      <w:startOverride w:val="1"/>
+    </w:lvlOverride>
+  </w:num>
+  <w:num w:numId="5" w16cid:durableId="1017806013">
+    <w:abstractNumId w:val="5"/>
+    <w:lvlOverride w:ilvl="0">
+      <w:startOverride w:val="1"/>
+    </w:lvlOverride>
+  </w:num>
+  <w:num w:numId="6" w16cid:durableId="162085592">
+    <w:abstractNumId w:val="17"/>
+    <w:lvlOverride w:ilvl="0">
+      <w:startOverride w:val="1"/>
+    </w:lvlOverride>
+  </w:num>
+  <w:num w:numId="7" w16cid:durableId="619846410">
+    <w:abstractNumId w:val="13"/>
+    <w:lvlOverride w:ilvl="0">
+      <w:startOverride w:val="1"/>
+    </w:lvlOverride>
+  </w:num>
+  <w:num w:numId="8" w16cid:durableId="1073503082">
+    <w:abstractNumId w:val="24"/>
+    <w:lvlOverride w:ilvl="0">
+      <w:startOverride w:val="1"/>
+    </w:lvlOverride>
+  </w:num>
+  <w:num w:numId="9" w16cid:durableId="821653699">
+    <w:abstractNumId w:val="27"/>
+    <w:lvlOverride w:ilvl="0">
+      <w:startOverride w:val="1"/>
+    </w:lvlOverride>
+  </w:num>
+  <w:num w:numId="10" w16cid:durableId="1798909916">
+    <w:abstractNumId w:val="18"/>
+    <w:lvlOverride w:ilvl="0">
+      <w:startOverride w:val="1"/>
+    </w:lvlOverride>
+  </w:num>
+  <w:num w:numId="11" w16cid:durableId="267857134">
+    <w:abstractNumId w:val="2"/>
+    <w:lvlOverride w:ilvl="0">
+      <w:startOverride w:val="1"/>
+    </w:lvlOverride>
+  </w:num>
+  <w:num w:numId="12" w16cid:durableId="1671331018">
+    <w:abstractNumId w:val="16"/>
+    <w:lvlOverride w:ilvl="0">
+      <w:startOverride w:val="1"/>
+    </w:lvlOverride>
+  </w:num>
+  <w:num w:numId="13" w16cid:durableId="1757943579">
+    <w:abstractNumId w:val="10"/>
+    <w:lvlOverride w:ilvl="0">
+      <w:startOverride w:val="1"/>
+    </w:lvlOverride>
+  </w:num>
+  <w:num w:numId="14" w16cid:durableId="132256408">
+    <w:abstractNumId w:val="7"/>
+    <w:lvlOverride w:ilvl="0">
+      <w:startOverride w:val="1"/>
+    </w:lvlOverride>
+  </w:num>
+  <w:num w:numId="15" w16cid:durableId="203060908">
+    <w:abstractNumId w:val="1"/>
+    <w:lvlOverride w:ilvl="0">
+      <w:startOverride w:val="1"/>
+    </w:lvlOverride>
+  </w:num>
+  <w:num w:numId="16" w16cid:durableId="310329172">
+    <w:abstractNumId w:val="15"/>
+    <w:lvlOverride w:ilvl="0">
+      <w:startOverride w:val="1"/>
+    </w:lvlOverride>
+  </w:num>
+  <w:num w:numId="17" w16cid:durableId="693070279">
+    <w:abstractNumId w:val="9"/>
+    <w:lvlOverride w:ilvl="0">
+      <w:startOverride w:val="1"/>
+    </w:lvlOverride>
+  </w:num>
+  <w:num w:numId="18" w16cid:durableId="1301954560">
+    <w:abstractNumId w:val="21"/>
+    <w:lvlOverride w:ilvl="0">
+      <w:startOverride w:val="1"/>
+    </w:lvlOverride>
+  </w:num>
+  <w:num w:numId="19" w16cid:durableId="1368600403">
     <w:abstractNumId w:val="14"/>
     <w:lvlOverride w:ilvl="0">
       <w:startOverride w:val="1"/>
     </w:lvlOverride>
   </w:num>
-  <w:num w:numId="2" w16cid:durableId="173417470">
-    <w:abstractNumId w:val="24"/>
+  <w:num w:numId="20" w16cid:durableId="1222860772">
+    <w:abstractNumId w:val="8"/>
     <w:lvlOverride w:ilvl="0">
       <w:startOverride w:val="1"/>
     </w:lvlOverride>
   </w:num>
-  <w:num w:numId="3" w16cid:durableId="1307782558">
-    <w:abstractNumId w:val="9"/>
+  <w:num w:numId="21" w16cid:durableId="1482236362">
+    <w:abstractNumId w:val="25"/>
     <w:lvlOverride w:ilvl="0">
       <w:startOverride w:val="1"/>
     </w:lvlOverride>
   </w:num>
-  <w:num w:numId="4" w16cid:durableId="901793323">
+  <w:num w:numId="22" w16cid:durableId="1220631364">
     <w:abstractNumId w:val="12"/>
     <w:lvlOverride w:ilvl="0">
       <w:startOverride w:val="1"/>
     </w:lvlOverride>
   </w:num>
-  <w:num w:numId="5" w16cid:durableId="748230404">
+  <w:num w:numId="23" w16cid:durableId="1811363397">
+    <w:abstractNumId w:val="19"/>
+    <w:lvlOverride w:ilvl="0">
+      <w:startOverride w:val="1"/>
+    </w:lvlOverride>
+  </w:num>
+  <w:num w:numId="24" w16cid:durableId="2015917497">
+    <w:abstractNumId w:val="22"/>
+    <w:lvlOverride w:ilvl="0">
+      <w:startOverride w:val="1"/>
+    </w:lvlOverride>
+  </w:num>
+  <w:num w:numId="25" w16cid:durableId="1088888941">
+    <w:abstractNumId w:val="3"/>
+    <w:lvlOverride w:ilvl="0">
+      <w:startOverride w:val="1"/>
+    </w:lvlOverride>
+  </w:num>
+  <w:num w:numId="26" w16cid:durableId="114057484">
     <w:abstractNumId w:val="0"/>
     <w:lvlOverride w:ilvl="0">
       <w:startOverride w:val="1"/>
     </w:lvlOverride>
   </w:num>
-  <w:num w:numId="6" w16cid:durableId="1566792725">
-    <w:abstractNumId w:val="15"/>
-    <w:lvlOverride w:ilvl="0">
-      <w:startOverride w:val="1"/>
-    </w:lvlOverride>
-  </w:num>
-  <w:num w:numId="7" w16cid:durableId="1905218229">
-    <w:abstractNumId w:val="20"/>
-    <w:lvlOverride w:ilvl="0">
-      <w:startOverride w:val="1"/>
-    </w:lvlOverride>
-  </w:num>
-  <w:num w:numId="8" w16cid:durableId="1567643505">
-    <w:abstractNumId w:val="18"/>
-    <w:lvlOverride w:ilvl="0">
-      <w:startOverride w:val="1"/>
-    </w:lvlOverride>
-  </w:num>
-  <w:num w:numId="9" w16cid:durableId="1510367330">
-    <w:abstractNumId w:val="1"/>
-    <w:lvlOverride w:ilvl="0">
-      <w:startOverride w:val="1"/>
-    </w:lvlOverride>
-  </w:num>
-  <w:num w:numId="10" w16cid:durableId="991910174">
-    <w:abstractNumId w:val="10"/>
-    <w:lvlOverride w:ilvl="0">
-      <w:startOverride w:val="1"/>
-    </w:lvlOverride>
-  </w:num>
-  <w:num w:numId="11" w16cid:durableId="1105150976">
-    <w:abstractNumId w:val="22"/>
-    <w:lvlOverride w:ilvl="0">
-      <w:startOverride w:val="1"/>
-    </w:lvlOverride>
-  </w:num>
-  <w:num w:numId="12" w16cid:durableId="1991051870">
-    <w:abstractNumId w:val="19"/>
-    <w:lvlOverride w:ilvl="0">
-      <w:startOverride w:val="1"/>
-    </w:lvlOverride>
-  </w:num>
-  <w:num w:numId="13" w16cid:durableId="647901036">
+  <w:num w:numId="27" w16cid:durableId="156576389">
     <w:abstractNumId w:val="23"/>
     <w:lvlOverride w:ilvl="0">
       <w:startOverride w:val="1"/>
     </w:lvlOverride>
   </w:num>
-  <w:num w:numId="14" w16cid:durableId="1700280969">
-    <w:abstractNumId w:val="11"/>
-    <w:lvlOverride w:ilvl="0">
-      <w:startOverride w:val="1"/>
-    </w:lvlOverride>
-  </w:num>
-  <w:num w:numId="15" w16cid:durableId="132889">
-    <w:abstractNumId w:val="13"/>
-    <w:lvlOverride w:ilvl="0">
-      <w:startOverride w:val="1"/>
-    </w:lvlOverride>
-  </w:num>
-  <w:num w:numId="16" w16cid:durableId="1365329998">
-    <w:abstractNumId w:val="7"/>
-    <w:lvlOverride w:ilvl="0">
-      <w:startOverride w:val="1"/>
-    </w:lvlOverride>
-  </w:num>
-  <w:num w:numId="17" w16cid:durableId="1555265332">
-    <w:abstractNumId w:val="16"/>
-    <w:lvlOverride w:ilvl="0">
-      <w:startOverride w:val="1"/>
-    </w:lvlOverride>
-  </w:num>
-  <w:num w:numId="18" w16cid:durableId="424502275">
-    <w:abstractNumId w:val="25"/>
-    <w:lvlOverride w:ilvl="0">
-      <w:startOverride w:val="1"/>
-    </w:lvlOverride>
-  </w:num>
-  <w:num w:numId="19" w16cid:durableId="573781773">
-    <w:abstractNumId w:val="2"/>
-    <w:lvlOverride w:ilvl="0">
-      <w:startOverride w:val="1"/>
-    </w:lvlOverride>
-  </w:num>
-  <w:num w:numId="20" w16cid:durableId="626475653">
-    <w:abstractNumId w:val="27"/>
-    <w:lvlOverride w:ilvl="0">
-      <w:startOverride w:val="1"/>
-    </w:lvlOverride>
-  </w:num>
-  <w:num w:numId="21" w16cid:durableId="147138566">
-    <w:abstractNumId w:val="3"/>
-    <w:lvlOverride w:ilvl="0">
-      <w:startOverride w:val="1"/>
-    </w:lvlOverride>
-  </w:num>
-  <w:num w:numId="22" w16cid:durableId="1341156870">
-    <w:abstractNumId w:val="5"/>
-    <w:lvlOverride w:ilvl="0">
-      <w:startOverride w:val="1"/>
-    </w:lvlOverride>
-  </w:num>
-  <w:num w:numId="23" w16cid:durableId="1507329054">
-    <w:abstractNumId w:val="26"/>
-    <w:lvlOverride w:ilvl="0">
-      <w:startOverride w:val="1"/>
-    </w:lvlOverride>
-  </w:num>
-  <w:num w:numId="24" w16cid:durableId="1111129112">
-    <w:abstractNumId w:val="17"/>
-    <w:lvlOverride w:ilvl="0">
-      <w:startOverride w:val="1"/>
-    </w:lvlOverride>
-  </w:num>
-  <w:num w:numId="25" w16cid:durableId="330641132">
+  <w:num w:numId="28" w16cid:durableId="391392790">
     <w:abstractNumId w:val="6"/>
-    <w:lvlOverride w:ilvl="0">
-      <w:startOverride w:val="1"/>
-    </w:lvlOverride>
-  </w:num>
-  <w:num w:numId="26" w16cid:durableId="944574152">
-    <w:abstractNumId w:val="8"/>
-    <w:lvlOverride w:ilvl="0">
-      <w:startOverride w:val="1"/>
-    </w:lvlOverride>
-  </w:num>
-  <w:num w:numId="27" w16cid:durableId="1366053069">
-    <w:abstractNumId w:val="4"/>
-    <w:lvlOverride w:ilvl="0">
-      <w:startOverride w:val="1"/>
-    </w:lvlOverride>
-  </w:num>
-  <w:num w:numId="28" w16cid:durableId="1366829732">
-    <w:abstractNumId w:val="21"/>
     <w:lvlOverride w:ilvl="0">
       <w:startOverride w:val="1"/>
     </w:lvlOverride>
@@ -25704,7 +25714,7 @@
     <w:autoRedefine/>
     <w:uiPriority w:val="39"/>
     <w:unhideWhenUsed/>
-    <w:rsid w:val="007D3876"/>
+    <w:rsid w:val="00D34E16"/>
     <w:pPr>
       <w:spacing w:after="100"/>
     </w:pPr>
@@ -25716,7 +25726,7 @@
     <w:autoRedefine/>
     <w:uiPriority w:val="39"/>
     <w:unhideWhenUsed/>
-    <w:rsid w:val="007D3876"/>
+    <w:rsid w:val="00D34E16"/>
     <w:pPr>
       <w:spacing w:after="100"/>
       <w:ind w:left="210"/>

</xml_diff>

<commit_message>
docs: Screen and Button Reference (30 pp) and a per-role screens-and-buttons appendix in every Role Guide; manuals v1.7
Every screen and control: what it does, when to use it, why it exists, what happens next.
Generated from docs/tools/manuals/reference_a.js + reference_b.js.

Co-Authored-By: Claude Sonnet 5 <noreply@anthropic.com>
</commit_message>
<xml_diff>
--- a/docs/manuals/RA_Training_Manual.docx
+++ b/docs/manuals/RA_Training_Manual.docx
@@ -469,7 +469,7 @@
                 <w:sz w:val="19"/>
                 <w:szCs w:val="19"/>
               </w:rPr>
-              <w:t>Version 1.6 · 20 September 2026</w:t>
+              <w:t>Version 1.7 · 21 September 2026</w:t>
             </w:r>
           </w:p>
         </w:tc>
@@ -538,7 +538,7 @@
     <w:sdt>
       <w:sdtPr>
         <w:alias w:val="Contents"/>
-        <w:id w:val="1314144819"/>
+        <w:id w:val="1660886792"/>
       </w:sdtPr>
       <w:sdtEndPr/>
       <w:sdtContent>
@@ -567,7 +567,7 @@
           <w:r>
             <w:fldChar w:fldCharType="separate"/>
           </w:r>
-          <w:hyperlink w:anchor="_Toc240784103" w:history="1">
+          <w:hyperlink w:anchor="_Toc240888524" w:history="1">
             <w:r>
               <w:rPr>
                 <w:rStyle w:val="Hyperlink"/>
@@ -591,7 +591,7 @@
               <w:rPr>
                 <w:noProof/>
               </w:rPr>
-              <w:instrText xml:space="preserve"> PAGEREF _Toc240784103 \h </w:instrText>
+              <w:instrText xml:space="preserve"> PAGEREF _Toc240888524 \h </w:instrText>
             </w:r>
             <w:r>
               <w:rPr>
@@ -634,7 +634,7 @@
               <w14:ligatures w14:val="standardContextual"/>
             </w:rPr>
           </w:pPr>
-          <w:hyperlink w:anchor="_Toc240784104" w:history="1">
+          <w:hyperlink w:anchor="_Toc240888525" w:history="1">
             <w:r>
               <w:rPr>
                 <w:rStyle w:val="Hyperlink"/>
@@ -658,7 +658,7 @@
               <w:rPr>
                 <w:noProof/>
               </w:rPr>
-              <w:instrText xml:space="preserve"> PAGEREF _Toc240784104 \h </w:instrText>
+              <w:instrText xml:space="preserve"> PAGEREF _Toc240888525 \h </w:instrText>
             </w:r>
             <w:r>
               <w:rPr>
@@ -701,7 +701,7 @@
               <w14:ligatures w14:val="standardContextual"/>
             </w:rPr>
           </w:pPr>
-          <w:hyperlink w:anchor="_Toc240784105" w:history="1">
+          <w:hyperlink w:anchor="_Toc240888526" w:history="1">
             <w:r>
               <w:rPr>
                 <w:rStyle w:val="Hyperlink"/>
@@ -725,7 +725,7 @@
               <w:rPr>
                 <w:noProof/>
               </w:rPr>
-              <w:instrText xml:space="preserve"> PAGEREF _Toc240784105 \h </w:instrText>
+              <w:instrText xml:space="preserve"> PAGEREF _Toc240888526 \h </w:instrText>
             </w:r>
             <w:r>
               <w:rPr>
@@ -768,7 +768,7 @@
               <w14:ligatures w14:val="standardContextual"/>
             </w:rPr>
           </w:pPr>
-          <w:hyperlink w:anchor="_Toc240784106" w:history="1">
+          <w:hyperlink w:anchor="_Toc240888527" w:history="1">
             <w:r>
               <w:rPr>
                 <w:rStyle w:val="Hyperlink"/>
@@ -792,7 +792,7 @@
               <w:rPr>
                 <w:noProof/>
               </w:rPr>
-              <w:instrText xml:space="preserve"> PAGEREF _Toc240784106 \h </w:instrText>
+              <w:instrText xml:space="preserve"> PAGEREF _Toc240888527 \h </w:instrText>
             </w:r>
             <w:r>
               <w:rPr>
@@ -835,7 +835,7 @@
               <w14:ligatures w14:val="standardContextual"/>
             </w:rPr>
           </w:pPr>
-          <w:hyperlink w:anchor="_Toc240784107" w:history="1">
+          <w:hyperlink w:anchor="_Toc240888528" w:history="1">
             <w:r>
               <w:rPr>
                 <w:rStyle w:val="Hyperlink"/>
@@ -859,7 +859,7 @@
               <w:rPr>
                 <w:noProof/>
               </w:rPr>
-              <w:instrText xml:space="preserve"> PAGEREF _Toc240784107 \h </w:instrText>
+              <w:instrText xml:space="preserve"> PAGEREF _Toc240888528 \h </w:instrText>
             </w:r>
             <w:r>
               <w:rPr>
@@ -902,7 +902,7 @@
               <w14:ligatures w14:val="standardContextual"/>
             </w:rPr>
           </w:pPr>
-          <w:hyperlink w:anchor="_Toc240784108" w:history="1">
+          <w:hyperlink w:anchor="_Toc240888529" w:history="1">
             <w:r>
               <w:rPr>
                 <w:rStyle w:val="Hyperlink"/>
@@ -926,7 +926,7 @@
               <w:rPr>
                 <w:noProof/>
               </w:rPr>
-              <w:instrText xml:space="preserve"> PAGEREF _Toc240784108 \h </w:instrText>
+              <w:instrText xml:space="preserve"> PAGEREF _Toc240888529 \h </w:instrText>
             </w:r>
             <w:r>
               <w:rPr>
@@ -969,7 +969,7 @@
               <w14:ligatures w14:val="standardContextual"/>
             </w:rPr>
           </w:pPr>
-          <w:hyperlink w:anchor="_Toc240784109" w:history="1">
+          <w:hyperlink w:anchor="_Toc240888530" w:history="1">
             <w:r>
               <w:rPr>
                 <w:rStyle w:val="Hyperlink"/>
@@ -993,7 +993,7 @@
               <w:rPr>
                 <w:noProof/>
               </w:rPr>
-              <w:instrText xml:space="preserve"> PAGEREF _Toc240784109 \h </w:instrText>
+              <w:instrText xml:space="preserve"> PAGEREF _Toc240888530 \h </w:instrText>
             </w:r>
             <w:r>
               <w:rPr>
@@ -1036,7 +1036,7 @@
               <w14:ligatures w14:val="standardContextual"/>
             </w:rPr>
           </w:pPr>
-          <w:hyperlink w:anchor="_Toc240784110" w:history="1">
+          <w:hyperlink w:anchor="_Toc240888531" w:history="1">
             <w:r>
               <w:rPr>
                 <w:rStyle w:val="Hyperlink"/>
@@ -1060,7 +1060,7 @@
               <w:rPr>
                 <w:noProof/>
               </w:rPr>
-              <w:instrText xml:space="preserve"> PAGEREF _Toc240784110 \h </w:instrText>
+              <w:instrText xml:space="preserve"> PAGEREF _Toc240888531 \h </w:instrText>
             </w:r>
             <w:r>
               <w:rPr>
@@ -1103,7 +1103,7 @@
               <w14:ligatures w14:val="standardContextual"/>
             </w:rPr>
           </w:pPr>
-          <w:hyperlink w:anchor="_Toc240784111" w:history="1">
+          <w:hyperlink w:anchor="_Toc240888532" w:history="1">
             <w:r>
               <w:rPr>
                 <w:rStyle w:val="Hyperlink"/>
@@ -1127,7 +1127,7 @@
               <w:rPr>
                 <w:noProof/>
               </w:rPr>
-              <w:instrText xml:space="preserve"> PAGEREF _Toc240784111 \h </w:instrText>
+              <w:instrText xml:space="preserve"> PAGEREF _Toc240888532 \h </w:instrText>
             </w:r>
             <w:r>
               <w:rPr>
@@ -1170,7 +1170,7 @@
               <w14:ligatures w14:val="standardContextual"/>
             </w:rPr>
           </w:pPr>
-          <w:hyperlink w:anchor="_Toc240784112" w:history="1">
+          <w:hyperlink w:anchor="_Toc240888533" w:history="1">
             <w:r>
               <w:rPr>
                 <w:rStyle w:val="Hyperlink"/>
@@ -1194,7 +1194,7 @@
               <w:rPr>
                 <w:noProof/>
               </w:rPr>
-              <w:instrText xml:space="preserve"> PAGEREF _Toc240784112 \h </w:instrText>
+              <w:instrText xml:space="preserve"> PAGEREF _Toc240888533 \h </w:instrText>
             </w:r>
             <w:r>
               <w:rPr>
@@ -1237,7 +1237,7 @@
               <w14:ligatures w14:val="standardContextual"/>
             </w:rPr>
           </w:pPr>
-          <w:hyperlink w:anchor="_Toc240784113" w:history="1">
+          <w:hyperlink w:anchor="_Toc240888534" w:history="1">
             <w:r>
               <w:rPr>
                 <w:rStyle w:val="Hyperlink"/>
@@ -1261,7 +1261,7 @@
               <w:rPr>
                 <w:noProof/>
               </w:rPr>
-              <w:instrText xml:space="preserve"> PAGEREF _Toc240784113 \h </w:instrText>
+              <w:instrText xml:space="preserve"> PAGEREF _Toc240888534 \h </w:instrText>
             </w:r>
             <w:r>
               <w:rPr>
@@ -1304,7 +1304,7 @@
               <w14:ligatures w14:val="standardContextual"/>
             </w:rPr>
           </w:pPr>
-          <w:hyperlink w:anchor="_Toc240784114" w:history="1">
+          <w:hyperlink w:anchor="_Toc240888535" w:history="1">
             <w:r>
               <w:rPr>
                 <w:rStyle w:val="Hyperlink"/>
@@ -1328,7 +1328,7 @@
               <w:rPr>
                 <w:noProof/>
               </w:rPr>
-              <w:instrText xml:space="preserve"> PAGEREF _Toc240784114 \h </w:instrText>
+              <w:instrText xml:space="preserve"> PAGEREF _Toc240888535 \h </w:instrText>
             </w:r>
             <w:r>
               <w:rPr>
@@ -1371,7 +1371,7 @@
               <w14:ligatures w14:val="standardContextual"/>
             </w:rPr>
           </w:pPr>
-          <w:hyperlink w:anchor="_Toc240784115" w:history="1">
+          <w:hyperlink w:anchor="_Toc240888536" w:history="1">
             <w:r>
               <w:rPr>
                 <w:rStyle w:val="Hyperlink"/>
@@ -1395,7 +1395,7 @@
               <w:rPr>
                 <w:noProof/>
               </w:rPr>
-              <w:instrText xml:space="preserve"> PAGEREF _Toc240784115 \h </w:instrText>
+              <w:instrText xml:space="preserve"> PAGEREF _Toc240888536 \h </w:instrText>
             </w:r>
             <w:r>
               <w:rPr>
@@ -1438,7 +1438,7 @@
               <w14:ligatures w14:val="standardContextual"/>
             </w:rPr>
           </w:pPr>
-          <w:hyperlink w:anchor="_Toc240784116" w:history="1">
+          <w:hyperlink w:anchor="_Toc240888537" w:history="1">
             <w:r>
               <w:rPr>
                 <w:rStyle w:val="Hyperlink"/>
@@ -1462,7 +1462,7 @@
               <w:rPr>
                 <w:noProof/>
               </w:rPr>
-              <w:instrText xml:space="preserve"> PAGEREF _Toc240784116 \h </w:instrText>
+              <w:instrText xml:space="preserve"> PAGEREF _Toc240888537 \h </w:instrText>
             </w:r>
             <w:r>
               <w:rPr>
@@ -1505,7 +1505,7 @@
               <w14:ligatures w14:val="standardContextual"/>
             </w:rPr>
           </w:pPr>
-          <w:hyperlink w:anchor="_Toc240784117" w:history="1">
+          <w:hyperlink w:anchor="_Toc240888538" w:history="1">
             <w:r>
               <w:rPr>
                 <w:rStyle w:val="Hyperlink"/>
@@ -1529,7 +1529,7 @@
               <w:rPr>
                 <w:noProof/>
               </w:rPr>
-              <w:instrText xml:space="preserve"> PAGEREF _Toc240784117 \h </w:instrText>
+              <w:instrText xml:space="preserve"> PAGEREF _Toc240888538 \h </w:instrText>
             </w:r>
             <w:r>
               <w:rPr>
@@ -1572,7 +1572,7 @@
               <w14:ligatures w14:val="standardContextual"/>
             </w:rPr>
           </w:pPr>
-          <w:hyperlink w:anchor="_Toc240784118" w:history="1">
+          <w:hyperlink w:anchor="_Toc240888539" w:history="1">
             <w:r>
               <w:rPr>
                 <w:rStyle w:val="Hyperlink"/>
@@ -1596,7 +1596,7 @@
               <w:rPr>
                 <w:noProof/>
               </w:rPr>
-              <w:instrText xml:space="preserve"> PAGEREF _Toc240784118 \h </w:instrText>
+              <w:instrText xml:space="preserve"> PAGEREF _Toc240888539 \h </w:instrText>
             </w:r>
             <w:r>
               <w:rPr>
@@ -1639,7 +1639,7 @@
               <w14:ligatures w14:val="standardContextual"/>
             </w:rPr>
           </w:pPr>
-          <w:hyperlink w:anchor="_Toc240784119" w:history="1">
+          <w:hyperlink w:anchor="_Toc240888540" w:history="1">
             <w:r>
               <w:rPr>
                 <w:rStyle w:val="Hyperlink"/>
@@ -1663,7 +1663,7 @@
               <w:rPr>
                 <w:noProof/>
               </w:rPr>
-              <w:instrText xml:space="preserve"> PAGEREF _Toc240784119 \h </w:instrText>
+              <w:instrText xml:space="preserve"> PAGEREF _Toc240888540 \h </w:instrText>
             </w:r>
             <w:r>
               <w:rPr>
@@ -1706,7 +1706,7 @@
               <w14:ligatures w14:val="standardContextual"/>
             </w:rPr>
           </w:pPr>
-          <w:hyperlink w:anchor="_Toc240784120" w:history="1">
+          <w:hyperlink w:anchor="_Toc240888541" w:history="1">
             <w:r>
               <w:rPr>
                 <w:rStyle w:val="Hyperlink"/>
@@ -1730,7 +1730,7 @@
               <w:rPr>
                 <w:noProof/>
               </w:rPr>
-              <w:instrText xml:space="preserve"> PAGEREF _Toc240784120 \h </w:instrText>
+              <w:instrText xml:space="preserve"> PAGEREF _Toc240888541 \h </w:instrText>
             </w:r>
             <w:r>
               <w:rPr>
@@ -1773,7 +1773,7 @@
               <w14:ligatures w14:val="standardContextual"/>
             </w:rPr>
           </w:pPr>
-          <w:hyperlink w:anchor="_Toc240784121" w:history="1">
+          <w:hyperlink w:anchor="_Toc240888542" w:history="1">
             <w:r>
               <w:rPr>
                 <w:rStyle w:val="Hyperlink"/>
@@ -1797,7 +1797,7 @@
               <w:rPr>
                 <w:noProof/>
               </w:rPr>
-              <w:instrText xml:space="preserve"> PAGEREF _Toc240784121 \h </w:instrText>
+              <w:instrText xml:space="preserve"> PAGEREF _Toc240888542 \h </w:instrText>
             </w:r>
             <w:r>
               <w:rPr>
@@ -1840,7 +1840,7 @@
               <w14:ligatures w14:val="standardContextual"/>
             </w:rPr>
           </w:pPr>
-          <w:hyperlink w:anchor="_Toc240784122" w:history="1">
+          <w:hyperlink w:anchor="_Toc240888543" w:history="1">
             <w:r>
               <w:rPr>
                 <w:rStyle w:val="Hyperlink"/>
@@ -1864,7 +1864,7 @@
               <w:rPr>
                 <w:noProof/>
               </w:rPr>
-              <w:instrText xml:space="preserve"> PAGEREF _Toc240784122 \h </w:instrText>
+              <w:instrText xml:space="preserve"> PAGEREF _Toc240888543 \h </w:instrText>
             </w:r>
             <w:r>
               <w:rPr>
@@ -1907,7 +1907,7 @@
               <w14:ligatures w14:val="standardContextual"/>
             </w:rPr>
           </w:pPr>
-          <w:hyperlink w:anchor="_Toc240784123" w:history="1">
+          <w:hyperlink w:anchor="_Toc240888544" w:history="1">
             <w:r>
               <w:rPr>
                 <w:rStyle w:val="Hyperlink"/>
@@ -1931,7 +1931,7 @@
               <w:rPr>
                 <w:noProof/>
               </w:rPr>
-              <w:instrText xml:space="preserve"> PAGEREF _Toc240784123 \h </w:instrText>
+              <w:instrText xml:space="preserve"> PAGEREF _Toc240888544 \h </w:instrText>
             </w:r>
             <w:r>
               <w:rPr>
@@ -1974,7 +1974,7 @@
               <w14:ligatures w14:val="standardContextual"/>
             </w:rPr>
           </w:pPr>
-          <w:hyperlink w:anchor="_Toc240784124" w:history="1">
+          <w:hyperlink w:anchor="_Toc240888545" w:history="1">
             <w:r>
               <w:rPr>
                 <w:rStyle w:val="Hyperlink"/>
@@ -1998,7 +1998,7 @@
               <w:rPr>
                 <w:noProof/>
               </w:rPr>
-              <w:instrText xml:space="preserve"> PAGEREF _Toc240784124 \h </w:instrText>
+              <w:instrText xml:space="preserve"> PAGEREF _Toc240888545 \h </w:instrText>
             </w:r>
             <w:r>
               <w:rPr>
@@ -2041,7 +2041,7 @@
               <w14:ligatures w14:val="standardContextual"/>
             </w:rPr>
           </w:pPr>
-          <w:hyperlink w:anchor="_Toc240784125" w:history="1">
+          <w:hyperlink w:anchor="_Toc240888546" w:history="1">
             <w:r>
               <w:rPr>
                 <w:rStyle w:val="Hyperlink"/>
@@ -2065,7 +2065,7 @@
               <w:rPr>
                 <w:noProof/>
               </w:rPr>
-              <w:instrText xml:space="preserve"> PAGEREF _Toc240784125 \h </w:instrText>
+              <w:instrText xml:space="preserve"> PAGEREF _Toc240888546 \h </w:instrText>
             </w:r>
             <w:r>
               <w:rPr>
@@ -2108,7 +2108,7 @@
               <w14:ligatures w14:val="standardContextual"/>
             </w:rPr>
           </w:pPr>
-          <w:hyperlink w:anchor="_Toc240784126" w:history="1">
+          <w:hyperlink w:anchor="_Toc240888547" w:history="1">
             <w:r>
               <w:rPr>
                 <w:rStyle w:val="Hyperlink"/>
@@ -2132,7 +2132,7 @@
               <w:rPr>
                 <w:noProof/>
               </w:rPr>
-              <w:instrText xml:space="preserve"> PAGEREF _Toc240784126 \h </w:instrText>
+              <w:instrText xml:space="preserve"> PAGEREF _Toc240888547 \h </w:instrText>
             </w:r>
             <w:r>
               <w:rPr>
@@ -2175,7 +2175,7 @@
               <w14:ligatures w14:val="standardContextual"/>
             </w:rPr>
           </w:pPr>
-          <w:hyperlink w:anchor="_Toc240784127" w:history="1">
+          <w:hyperlink w:anchor="_Toc240888548" w:history="1">
             <w:r>
               <w:rPr>
                 <w:rStyle w:val="Hyperlink"/>
@@ -2199,7 +2199,7 @@
               <w:rPr>
                 <w:noProof/>
               </w:rPr>
-              <w:instrText xml:space="preserve"> PAGEREF _Toc240784127 \h </w:instrText>
+              <w:instrText xml:space="preserve"> PAGEREF _Toc240888548 \h </w:instrText>
             </w:r>
             <w:r>
               <w:rPr>
@@ -2242,7 +2242,7 @@
               <w14:ligatures w14:val="standardContextual"/>
             </w:rPr>
           </w:pPr>
-          <w:hyperlink w:anchor="_Toc240784128" w:history="1">
+          <w:hyperlink w:anchor="_Toc240888549" w:history="1">
             <w:r>
               <w:rPr>
                 <w:rStyle w:val="Hyperlink"/>
@@ -2266,7 +2266,7 @@
               <w:rPr>
                 <w:noProof/>
               </w:rPr>
-              <w:instrText xml:space="preserve"> PAGEREF _Toc240784128 \h </w:instrText>
+              <w:instrText xml:space="preserve"> PAGEREF _Toc240888549 \h </w:instrText>
             </w:r>
             <w:r>
               <w:rPr>
@@ -2309,7 +2309,7 @@
               <w14:ligatures w14:val="standardContextual"/>
             </w:rPr>
           </w:pPr>
-          <w:hyperlink w:anchor="_Toc240784129" w:history="1">
+          <w:hyperlink w:anchor="_Toc240888550" w:history="1">
             <w:r>
               <w:rPr>
                 <w:rStyle w:val="Hyperlink"/>
@@ -2333,7 +2333,7 @@
               <w:rPr>
                 <w:noProof/>
               </w:rPr>
-              <w:instrText xml:space="preserve"> PAGEREF _Toc240784129 \h </w:instrText>
+              <w:instrText xml:space="preserve"> PAGEREF _Toc240888550 \h </w:instrText>
             </w:r>
             <w:r>
               <w:rPr>
@@ -2376,7 +2376,7 @@
               <w14:ligatures w14:val="standardContextual"/>
             </w:rPr>
           </w:pPr>
-          <w:hyperlink w:anchor="_Toc240784130" w:history="1">
+          <w:hyperlink w:anchor="_Toc240888551" w:history="1">
             <w:r>
               <w:rPr>
                 <w:rStyle w:val="Hyperlink"/>
@@ -2400,7 +2400,7 @@
               <w:rPr>
                 <w:noProof/>
               </w:rPr>
-              <w:instrText xml:space="preserve"> PAGEREF _Toc240784130 \h </w:instrText>
+              <w:instrText xml:space="preserve"> PAGEREF _Toc240888551 \h </w:instrText>
             </w:r>
             <w:r>
               <w:rPr>
@@ -2443,7 +2443,7 @@
               <w14:ligatures w14:val="standardContextual"/>
             </w:rPr>
           </w:pPr>
-          <w:hyperlink w:anchor="_Toc240784131" w:history="1">
+          <w:hyperlink w:anchor="_Toc240888552" w:history="1">
             <w:r>
               <w:rPr>
                 <w:rStyle w:val="Hyperlink"/>
@@ -2467,7 +2467,7 @@
               <w:rPr>
                 <w:noProof/>
               </w:rPr>
-              <w:instrText xml:space="preserve"> PAGEREF _Toc240784131 \h </w:instrText>
+              <w:instrText xml:space="preserve"> PAGEREF _Toc240888552 \h </w:instrText>
             </w:r>
             <w:r>
               <w:rPr>
@@ -2510,7 +2510,7 @@
               <w14:ligatures w14:val="standardContextual"/>
             </w:rPr>
           </w:pPr>
-          <w:hyperlink w:anchor="_Toc240784132" w:history="1">
+          <w:hyperlink w:anchor="_Toc240888553" w:history="1">
             <w:r>
               <w:rPr>
                 <w:rStyle w:val="Hyperlink"/>
@@ -2534,7 +2534,7 @@
               <w:rPr>
                 <w:noProof/>
               </w:rPr>
-              <w:instrText xml:space="preserve"> PAGEREF _Toc240784132 \h </w:instrText>
+              <w:instrText xml:space="preserve"> PAGEREF _Toc240888553 \h </w:instrText>
             </w:r>
             <w:r>
               <w:rPr>
@@ -2577,7 +2577,7 @@
               <w14:ligatures w14:val="standardContextual"/>
             </w:rPr>
           </w:pPr>
-          <w:hyperlink w:anchor="_Toc240784133" w:history="1">
+          <w:hyperlink w:anchor="_Toc240888554" w:history="1">
             <w:r>
               <w:rPr>
                 <w:rStyle w:val="Hyperlink"/>
@@ -2601,7 +2601,7 @@
               <w:rPr>
                 <w:noProof/>
               </w:rPr>
-              <w:instrText xml:space="preserve"> PAGEREF _Toc240784133 \h </w:instrText>
+              <w:instrText xml:space="preserve"> PAGEREF _Toc240888554 \h </w:instrText>
             </w:r>
             <w:r>
               <w:rPr>
@@ -2644,7 +2644,7 @@
               <w14:ligatures w14:val="standardContextual"/>
             </w:rPr>
           </w:pPr>
-          <w:hyperlink w:anchor="_Toc240784134" w:history="1">
+          <w:hyperlink w:anchor="_Toc240888555" w:history="1">
             <w:r>
               <w:rPr>
                 <w:rStyle w:val="Hyperlink"/>
@@ -2668,7 +2668,7 @@
               <w:rPr>
                 <w:noProof/>
               </w:rPr>
-              <w:instrText xml:space="preserve"> PAGEREF _Toc240784134 \h </w:instrText>
+              <w:instrText xml:space="preserve"> PAGEREF _Toc240888555 \h </w:instrText>
             </w:r>
             <w:r>
               <w:rPr>
@@ -2711,7 +2711,7 @@
               <w14:ligatures w14:val="standardContextual"/>
             </w:rPr>
           </w:pPr>
-          <w:hyperlink w:anchor="_Toc240784135" w:history="1">
+          <w:hyperlink w:anchor="_Toc240888556" w:history="1">
             <w:r>
               <w:rPr>
                 <w:rStyle w:val="Hyperlink"/>
@@ -2735,7 +2735,7 @@
               <w:rPr>
                 <w:noProof/>
               </w:rPr>
-              <w:instrText xml:space="preserve"> PAGEREF _Toc240784135 \h </w:instrText>
+              <w:instrText xml:space="preserve"> PAGEREF _Toc240888556 \h </w:instrText>
             </w:r>
             <w:r>
               <w:rPr>
@@ -2778,7 +2778,7 @@
               <w14:ligatures w14:val="standardContextual"/>
             </w:rPr>
           </w:pPr>
-          <w:hyperlink w:anchor="_Toc240784136" w:history="1">
+          <w:hyperlink w:anchor="_Toc240888557" w:history="1">
             <w:r>
               <w:rPr>
                 <w:rStyle w:val="Hyperlink"/>
@@ -2802,7 +2802,7 @@
               <w:rPr>
                 <w:noProof/>
               </w:rPr>
-              <w:instrText xml:space="preserve"> PAGEREF _Toc240784136 \h </w:instrText>
+              <w:instrText xml:space="preserve"> PAGEREF _Toc240888557 \h </w:instrText>
             </w:r>
             <w:r>
               <w:rPr>
@@ -2845,7 +2845,7 @@
               <w14:ligatures w14:val="standardContextual"/>
             </w:rPr>
           </w:pPr>
-          <w:hyperlink w:anchor="_Toc240784137" w:history="1">
+          <w:hyperlink w:anchor="_Toc240888558" w:history="1">
             <w:r>
               <w:rPr>
                 <w:rStyle w:val="Hyperlink"/>
@@ -2869,7 +2869,7 @@
               <w:rPr>
                 <w:noProof/>
               </w:rPr>
-              <w:instrText xml:space="preserve"> PAGEREF _Toc240784137 \h </w:instrText>
+              <w:instrText xml:space="preserve"> PAGEREF _Toc240888558 \h </w:instrText>
             </w:r>
             <w:r>
               <w:rPr>
@@ -2912,7 +2912,7 @@
               <w14:ligatures w14:val="standardContextual"/>
             </w:rPr>
           </w:pPr>
-          <w:hyperlink w:anchor="_Toc240784138" w:history="1">
+          <w:hyperlink w:anchor="_Toc240888559" w:history="1">
             <w:r>
               <w:rPr>
                 <w:rStyle w:val="Hyperlink"/>
@@ -2936,7 +2936,7 @@
               <w:rPr>
                 <w:noProof/>
               </w:rPr>
-              <w:instrText xml:space="preserve"> PAGEREF _Toc240784138 \h </w:instrText>
+              <w:instrText xml:space="preserve"> PAGEREF _Toc240888559 \h </w:instrText>
             </w:r>
             <w:r>
               <w:rPr>
@@ -2979,7 +2979,7 @@
               <w14:ligatures w14:val="standardContextual"/>
             </w:rPr>
           </w:pPr>
-          <w:hyperlink w:anchor="_Toc240784139" w:history="1">
+          <w:hyperlink w:anchor="_Toc240888560" w:history="1">
             <w:r>
               <w:rPr>
                 <w:rStyle w:val="Hyperlink"/>
@@ -3003,7 +3003,7 @@
               <w:rPr>
                 <w:noProof/>
               </w:rPr>
-              <w:instrText xml:space="preserve"> PAGEREF _Toc240784139 \h </w:instrText>
+              <w:instrText xml:space="preserve"> PAGEREF _Toc240888560 \h </w:instrText>
             </w:r>
             <w:r>
               <w:rPr>
@@ -3046,7 +3046,7 @@
               <w14:ligatures w14:val="standardContextual"/>
             </w:rPr>
           </w:pPr>
-          <w:hyperlink w:anchor="_Toc240784140" w:history="1">
+          <w:hyperlink w:anchor="_Toc240888561" w:history="1">
             <w:r>
               <w:rPr>
                 <w:rStyle w:val="Hyperlink"/>
@@ -3070,7 +3070,7 @@
               <w:rPr>
                 <w:noProof/>
               </w:rPr>
-              <w:instrText xml:space="preserve"> PAGEREF _Toc240784140 \h </w:instrText>
+              <w:instrText xml:space="preserve"> PAGEREF _Toc240888561 \h </w:instrText>
             </w:r>
             <w:r>
               <w:rPr>
@@ -3113,7 +3113,7 @@
               <w14:ligatures w14:val="standardContextual"/>
             </w:rPr>
           </w:pPr>
-          <w:hyperlink w:anchor="_Toc240784141" w:history="1">
+          <w:hyperlink w:anchor="_Toc240888562" w:history="1">
             <w:r>
               <w:rPr>
                 <w:rStyle w:val="Hyperlink"/>
@@ -3137,7 +3137,7 @@
               <w:rPr>
                 <w:noProof/>
               </w:rPr>
-              <w:instrText xml:space="preserve"> PAGEREF _Toc240784141 \h </w:instrText>
+              <w:instrText xml:space="preserve"> PAGEREF _Toc240888562 \h </w:instrText>
             </w:r>
             <w:r>
               <w:rPr>
@@ -3180,7 +3180,7 @@
               <w14:ligatures w14:val="standardContextual"/>
             </w:rPr>
           </w:pPr>
-          <w:hyperlink w:anchor="_Toc240784142" w:history="1">
+          <w:hyperlink w:anchor="_Toc240888563" w:history="1">
             <w:r>
               <w:rPr>
                 <w:rStyle w:val="Hyperlink"/>
@@ -3204,7 +3204,7 @@
               <w:rPr>
                 <w:noProof/>
               </w:rPr>
-              <w:instrText xml:space="preserve"> PAGEREF _Toc240784142 \h </w:instrText>
+              <w:instrText xml:space="preserve"> PAGEREF _Toc240888563 \h </w:instrText>
             </w:r>
             <w:r>
               <w:rPr>
@@ -3247,7 +3247,7 @@
               <w14:ligatures w14:val="standardContextual"/>
             </w:rPr>
           </w:pPr>
-          <w:hyperlink w:anchor="_Toc240784143" w:history="1">
+          <w:hyperlink w:anchor="_Toc240888564" w:history="1">
             <w:r>
               <w:rPr>
                 <w:rStyle w:val="Hyperlink"/>
@@ -3271,7 +3271,7 @@
               <w:rPr>
                 <w:noProof/>
               </w:rPr>
-              <w:instrText xml:space="preserve"> PAGEREF _Toc240784143 \h </w:instrText>
+              <w:instrText xml:space="preserve"> PAGEREF _Toc240888564 \h </w:instrText>
             </w:r>
             <w:r>
               <w:rPr>
@@ -3310,7 +3310,7 @@
         <w:pStyle w:val="Heading1"/>
         <w:pageBreakBefore/>
       </w:pPr>
-      <w:bookmarkStart w:id="0" w:name="_Toc240784103"/>
+      <w:bookmarkStart w:id="0" w:name="_Toc240888524"/>
       <w:r>
         <w:lastRenderedPageBreak/>
         <w:t>1. Welcome</w:t>
@@ -3339,7 +3339,7 @@
       <w:pPr>
         <w:pStyle w:val="Heading2"/>
       </w:pPr>
-      <w:bookmarkStart w:id="1" w:name="_Toc240784104"/>
+      <w:bookmarkStart w:id="1" w:name="_Toc240888525"/>
       <w:r>
         <w:t>How to use this manual</w:t>
       </w:r>
@@ -3406,7 +3406,7 @@
       <w:pPr>
         <w:pStyle w:val="Heading2"/>
       </w:pPr>
-      <w:bookmarkStart w:id="2" w:name="_Toc240784105"/>
+      <w:bookmarkStart w:id="2" w:name="_Toc240888526"/>
       <w:r>
         <w:t>Who to contact</w:t>
       </w:r>
@@ -3624,7 +3624,7 @@
         <w:pStyle w:val="Heading1"/>
         <w:pageBreakBefore/>
       </w:pPr>
-      <w:bookmarkStart w:id="3" w:name="_Toc240784106"/>
+      <w:bookmarkStart w:id="3" w:name="_Toc240888527"/>
       <w:r>
         <w:lastRenderedPageBreak/>
         <w:t>2. The study</w:t>
@@ -4220,7 +4220,7 @@
       <w:pPr>
         <w:pStyle w:val="Heading2"/>
       </w:pPr>
-      <w:bookmarkStart w:id="4" w:name="_Toc240784107"/>
+      <w:bookmarkStart w:id="4" w:name="_Toc240888528"/>
       <w:r>
         <w:t>Explaining the study in two minutes</w:t>
       </w:r>
@@ -4239,7 +4239,7 @@
         <w:pStyle w:val="Heading1"/>
         <w:pageBreakBefore/>
       </w:pPr>
-      <w:bookmarkStart w:id="5" w:name="_Toc240784108"/>
+      <w:bookmarkStart w:id="5" w:name="_Toc240888529"/>
       <w:r>
         <w:lastRenderedPageBreak/>
         <w:t>3. Ethics and data protection</w:t>
@@ -4250,7 +4250,7 @@
       <w:pPr>
         <w:pStyle w:val="Heading2"/>
       </w:pPr>
-      <w:bookmarkStart w:id="6" w:name="_Toc240784109"/>
+      <w:bookmarkStart w:id="6" w:name="_Toc240888530"/>
       <w:r>
         <w:t>3.1 Principles you must apply</w:t>
       </w:r>
@@ -4700,7 +4700,7 @@
       <w:pPr>
         <w:pStyle w:val="Heading2"/>
       </w:pPr>
-      <w:bookmarkStart w:id="7" w:name="_Toc240784110"/>
+      <w:bookmarkStart w:id="7" w:name="_Toc240888531"/>
       <w:r>
         <w:t>3.2 What respondents are told (PIS v1.3, summary)</w:t>
       </w:r>
@@ -4806,7 +4806,7 @@
       <w:pPr>
         <w:pStyle w:val="Heading2"/>
       </w:pPr>
-      <w:bookmarkStart w:id="8" w:name="_Toc240784111"/>
+      <w:bookmarkStart w:id="8" w:name="_Toc240888532"/>
       <w:r>
         <w:t>3.3 Data protection rules</w:t>
       </w:r>
@@ -4938,7 +4938,7 @@
       <w:pPr>
         <w:pStyle w:val="Heading2"/>
       </w:pPr>
-      <w:bookmarkStart w:id="9" w:name="_Toc240784112"/>
+      <w:bookmarkStart w:id="9" w:name="_Toc240888533"/>
       <w:r>
         <w:t>3.4 Your devices</w:t>
       </w:r>
@@ -5018,7 +5018,7 @@
       <w:pPr>
         <w:pStyle w:val="Heading2"/>
       </w:pPr>
-      <w:bookmarkStart w:id="10" w:name="_Toc240784113"/>
+      <w:bookmarkStart w:id="10" w:name="_Toc240888534"/>
       <w:r>
         <w:t>3.5 Conduct</w:t>
       </w:r>
@@ -5099,7 +5099,7 @@
         <w:pStyle w:val="Heading1"/>
         <w:pageBreakBefore/>
       </w:pPr>
-      <w:bookmarkStart w:id="11" w:name="_Toc240784114"/>
+      <w:bookmarkStart w:id="11" w:name="_Toc240888535"/>
       <w:r>
         <w:lastRenderedPageBreak/>
         <w:t>4. The portal and the forms</w:t>
@@ -5110,7 +5110,7 @@
       <w:pPr>
         <w:pStyle w:val="Heading2"/>
       </w:pPr>
-      <w:bookmarkStart w:id="12" w:name="_Toc240784115"/>
+      <w:bookmarkStart w:id="12" w:name="_Toc240888536"/>
       <w:r>
         <w:t>Signing in</w:t>
       </w:r>
@@ -5360,7 +5360,7 @@
       <w:pPr>
         <w:pStyle w:val="Heading2"/>
       </w:pPr>
-      <w:bookmarkStart w:id="13" w:name="_Toc240784116"/>
+      <w:bookmarkStart w:id="13" w:name="_Toc240888537"/>
       <w:r>
         <w:t>Finding your way around</w:t>
       </w:r>
@@ -5614,7 +5614,7 @@
       <w:pPr>
         <w:pStyle w:val="Heading2"/>
       </w:pPr>
-      <w:bookmarkStart w:id="14" w:name="_Toc240784117"/>
+      <w:bookmarkStart w:id="14" w:name="_Toc240888538"/>
       <w:r>
         <w:t>Roles</w:t>
       </w:r>
@@ -6396,7 +6396,7 @@
       <w:pPr>
         <w:pStyle w:val="Heading2"/>
       </w:pPr>
-      <w:bookmarkStart w:id="15" w:name="_Toc240784118"/>
+      <w:bookmarkStart w:id="15" w:name="_Toc240888539"/>
       <w:r>
         <w:t>Case statuses you will see</w:t>
       </w:r>
@@ -7911,7 +7911,7 @@
       <w:pPr>
         <w:pStyle w:val="Heading2"/>
       </w:pPr>
-      <w:bookmarkStart w:id="16" w:name="_Toc240784119"/>
+      <w:bookmarkStart w:id="16" w:name="_Toc240888540"/>
       <w:r>
         <w:t>The KoboToolbox forms</w:t>
       </w:r>
@@ -8355,7 +8355,7 @@
         <w:pStyle w:val="Heading1"/>
         <w:pageBreakBefore/>
       </w:pPr>
-      <w:bookmarkStart w:id="17" w:name="_Toc240784120"/>
+      <w:bookmarkStart w:id="17" w:name="_Toc240888541"/>
       <w:r>
         <w:lastRenderedPageBreak/>
         <w:t>5. Communication scripts</w:t>
@@ -8366,7 +8366,7 @@
       <w:pPr>
         <w:pStyle w:val="Heading2"/>
       </w:pPr>
-      <w:bookmarkStart w:id="18" w:name="_Toc240784121"/>
+      <w:bookmarkStart w:id="18" w:name="_Toc240888542"/>
       <w:r>
         <w:t>5.1 First phone call</w:t>
       </w:r>
@@ -8446,7 +8446,7 @@
       <w:pPr>
         <w:pStyle w:val="Heading2"/>
       </w:pPr>
-      <w:bookmarkStart w:id="19" w:name="_Toc240784122"/>
+      <w:bookmarkStart w:id="19" w:name="_Toc240888543"/>
       <w:r>
         <w:t>5.2 If they are busy</w:t>
       </w:r>
@@ -8464,7 +8464,7 @@
       <w:pPr>
         <w:pStyle w:val="Heading2"/>
       </w:pPr>
-      <w:bookmarkStart w:id="20" w:name="_Toc240784123"/>
+      <w:bookmarkStart w:id="20" w:name="_Toc240888544"/>
       <w:r>
         <w:t>5.3 Voicemail or no answer</w:t>
       </w:r>
@@ -8482,7 +8482,7 @@
       <w:pPr>
         <w:pStyle w:val="Heading2"/>
       </w:pPr>
-      <w:bookmarkStart w:id="21" w:name="_Toc240784124"/>
+      <w:bookmarkStart w:id="21" w:name="_Toc240888545"/>
       <w:r>
         <w:t>5.4 Common questions</w:t>
       </w:r>
@@ -8932,7 +8932,7 @@
       <w:pPr>
         <w:pStyle w:val="Heading2"/>
       </w:pPr>
-      <w:bookmarkStart w:id="22" w:name="_Toc240784125"/>
+      <w:bookmarkStart w:id="22" w:name="_Toc240888546"/>
       <w:r>
         <w:t>5.5 Refusals and withdrawals</w:t>
       </w:r>
@@ -8951,7 +8951,7 @@
         <w:pStyle w:val="Heading1"/>
         <w:pageBreakBefore/>
       </w:pPr>
-      <w:bookmarkStart w:id="23" w:name="_Toc240784126"/>
+      <w:bookmarkStart w:id="23" w:name="_Toc240888547"/>
       <w:r>
         <w:lastRenderedPageBreak/>
         <w:t>6. Role modules</w:t>
@@ -8970,7 +8970,7 @@
       <w:pPr>
         <w:pStyle w:val="Heading2"/>
       </w:pPr>
-      <w:bookmarkStart w:id="24" w:name="_Toc240784127"/>
+      <w:bookmarkStart w:id="24" w:name="_Toc240888548"/>
       <w:r>
         <w:t>Module A — Contact RA</w:t>
       </w:r>
@@ -11438,7 +11438,7 @@
       <w:pPr>
         <w:pStyle w:val="Heading2"/>
       </w:pPr>
-      <w:bookmarkStart w:id="25" w:name="_Toc240784128"/>
+      <w:bookmarkStart w:id="25" w:name="_Toc240888549"/>
       <w:r>
         <w:t>Module B — QUAN/Kobo QA RA</w:t>
       </w:r>
@@ -12549,7 +12549,7 @@
       <w:pPr>
         <w:pStyle w:val="Heading2"/>
       </w:pPr>
-      <w:bookmarkStart w:id="26" w:name="_Toc240784129"/>
+      <w:bookmarkStart w:id="26" w:name="_Toc240888550"/>
       <w:r>
         <w:t>Module C — KII RA</w:t>
       </w:r>
@@ -13502,7 +13502,7 @@
       <w:pPr>
         <w:pStyle w:val="Heading2"/>
       </w:pPr>
-      <w:bookmarkStart w:id="27" w:name="_Toc240784130"/>
+      <w:bookmarkStart w:id="27" w:name="_Toc240888551"/>
       <w:r>
         <w:t>Module D — Documentary RA</w:t>
       </w:r>
@@ -18118,7 +18118,7 @@
         <w:pStyle w:val="Heading1"/>
         <w:pageBreakBefore/>
       </w:pPr>
-      <w:bookmarkStart w:id="28" w:name="_Toc240784131"/>
+      <w:bookmarkStart w:id="28" w:name="_Toc240888552"/>
       <w:r>
         <w:lastRenderedPageBreak/>
         <w:t>7. Scenarios</w:t>
@@ -19073,7 +19073,7 @@
         <w:pStyle w:val="Heading1"/>
         <w:pageBreakBefore/>
       </w:pPr>
-      <w:bookmarkStart w:id="29" w:name="_Toc240784132"/>
+      <w:bookmarkStart w:id="29" w:name="_Toc240888553"/>
       <w:r>
         <w:lastRenderedPageBreak/>
         <w:t>8. Practice exercises</w:t>
@@ -19092,7 +19092,7 @@
       <w:pPr>
         <w:pStyle w:val="Heading2"/>
       </w:pPr>
-      <w:bookmarkStart w:id="30" w:name="_Toc240784133"/>
+      <w:bookmarkStart w:id="30" w:name="_Toc240888554"/>
       <w:r>
         <w:t>Exercise 1 — Getting around (all RAs)</w:t>
       </w:r>
@@ -19159,7 +19159,7 @@
       <w:pPr>
         <w:pStyle w:val="Heading2"/>
       </w:pPr>
-      <w:bookmarkStart w:id="31" w:name="_Toc240784134"/>
+      <w:bookmarkStart w:id="31" w:name="_Toc240888555"/>
       <w:r>
         <w:t>Exercise 2 — A complete contact (Contact RAs)</w:t>
       </w:r>
@@ -19239,7 +19239,7 @@
       <w:pPr>
         <w:pStyle w:val="Heading2"/>
       </w:pPr>
-      <w:bookmarkStart w:id="32" w:name="_Toc240784135"/>
+      <w:bookmarkStart w:id="32" w:name="_Toc240888556"/>
       <w:r>
         <w:t>Exercise 3 — QA decisions (QA RAs)</w:t>
       </w:r>
@@ -19306,7 +19306,7 @@
       <w:pPr>
         <w:pStyle w:val="Heading2"/>
       </w:pPr>
-      <w:bookmarkStart w:id="33" w:name="_Toc240784136"/>
+      <w:bookmarkStart w:id="33" w:name="_Toc240888557"/>
       <w:r>
         <w:t>Exercise 4 — A KII record (KII RAs)</w:t>
       </w:r>
@@ -19373,7 +19373,7 @@
       <w:pPr>
         <w:pStyle w:val="Heading2"/>
       </w:pPr>
-      <w:bookmarkStart w:id="34" w:name="_Toc240784137"/>
+      <w:bookmarkStart w:id="34" w:name="_Toc240888558"/>
       <w:r>
         <w:t>Exercise 5 — A document (Documentary RAs)</w:t>
       </w:r>
@@ -19621,7 +19621,7 @@
         <w:pStyle w:val="Heading1"/>
         <w:pageBreakBefore/>
       </w:pPr>
-      <w:bookmarkStart w:id="35" w:name="_Toc240784138"/>
+      <w:bookmarkStart w:id="35" w:name="_Toc240888559"/>
       <w:r>
         <w:lastRenderedPageBreak/>
         <w:t>9. Daily checklists</w:t>
@@ -19632,7 +19632,7 @@
       <w:pPr>
         <w:pStyle w:val="Heading2"/>
       </w:pPr>
-      <w:bookmarkStart w:id="36" w:name="_Toc240784139"/>
+      <w:bookmarkStart w:id="36" w:name="_Toc240888560"/>
       <w:r>
         <w:t>Start of the day</w:t>
       </w:r>
@@ -19712,7 +19712,7 @@
       <w:pPr>
         <w:pStyle w:val="Heading2"/>
       </w:pPr>
-      <w:bookmarkStart w:id="37" w:name="_Toc240784140"/>
+      <w:bookmarkStart w:id="37" w:name="_Toc240888561"/>
       <w:r>
         <w:t>End of the day</w:t>
       </w:r>
@@ -19766,7 +19766,7 @@
       <w:pPr>
         <w:pStyle w:val="Heading2"/>
       </w:pPr>
-      <w:bookmarkStart w:id="38" w:name="_Toc240784141"/>
+      <w:bookmarkStart w:id="38" w:name="_Toc240888562"/>
       <w:r>
         <w:t>Troubleshooting</w:t>
       </w:r>
@@ -20629,7 +20629,7 @@
         <w:pStyle w:val="Heading1"/>
         <w:pageBreakBefore/>
       </w:pPr>
-      <w:bookmarkStart w:id="39" w:name="_Toc240784142"/>
+      <w:bookmarkStart w:id="39" w:name="_Toc240888563"/>
       <w:r>
         <w:lastRenderedPageBreak/>
         <w:t>10. Glossary</w:t>
@@ -22590,7 +22590,7 @@
         <w:pStyle w:val="Heading1"/>
         <w:pageBreakBefore/>
       </w:pPr>
-      <w:bookmarkStart w:id="40" w:name="_Toc240784143"/>
+      <w:bookmarkStart w:id="40" w:name="_Toc240888564"/>
       <w:r>
         <w:lastRenderedPageBreak/>
         <w:t>11. Confidentiality and conduct declaration</w:t>
@@ -23076,7 +23076,7 @@
         <w:sz w:val="16"/>
         <w:szCs w:val="16"/>
       </w:rPr>
-      <w:t>Version 1.6 · 20 September 2026</w:t>
+      <w:t>Version 1.7 · 21 September 2026</w:t>
     </w:r>
     <w:r>
       <w:rPr>
@@ -23249,10 +23249,10 @@
 <file path=word/numbering.xml><?xml version="1.0" encoding="utf-8"?>
 <w:numbering xmlns:wpc="http://schemas.microsoft.com/office/word/2010/wordprocessingCanvas" xmlns:cx="http://schemas.microsoft.com/office/drawing/2014/chartex" xmlns:cx1="http://schemas.microsoft.com/office/drawing/2015/9/8/chartex" xmlns:cx2="http://schemas.microsoft.com/office/drawing/2015/10/21/chartex" xmlns:cx3="http://schemas.microsoft.com/office/drawing/2016/5/9/chartex" xmlns:cx4="http://schemas.microsoft.com/office/drawing/2016/5/10/chartex" xmlns:cx5="http://schemas.microsoft.com/office/drawing/2016/5/11/chartex" xmlns:cx6="http://schemas.microsoft.com/office/drawing/2016/5/12/chartex" xmlns:cx7="http://schemas.microsoft.com/office/drawing/2016/5/13/chartex" xmlns:cx8="http://schemas.microsoft.com/office/drawing/2016/5/14/chartex" xmlns:mc="http://schemas.openxmlformats.org/markup-compatibility/2006" xmlns:aink="http://schemas.microsoft.com/office/drawing/2016/ink" xmlns:am3d="http://schemas.microsoft.com/office/drawing/2017/model3d" xmlns:o="urn:schemas-microsoft-com:office:office" xmlns:oel="http://schemas.microsoft.com/office/2019/extlst" xmlns:r="http://schemas.openxmlformats.org/officeDocument/2006/relationships" xmlns:m="http://schemas.openxmlformats.org/officeDocument/2006/math" xmlns:v="urn:schemas-microsoft-com:vml" xmlns:wp14="http://schemas.microsoft.com/office/word/2010/wordprocessingDrawing" xmlns:wp="http://schemas.openxmlformats.org/drawingml/2006/wordprocessingDrawing" xmlns:w10="urn:schemas-microsoft-com:office:word" xmlns:w="http://schemas.openxmlformats.org/wordprocessingml/2006/main" xmlns:w14="http://schemas.microsoft.com/office/word/2010/wordml" xmlns:w15="http://schemas.microsoft.com/office/word/2012/wordml" xmlns:w16cex="http://schemas.microsoft.com/office/word/2018/wordml/cex" xmlns:w16cid="http://schemas.microsoft.com/office/word/2016/wordml/cid" xmlns:w16="http://schemas.microsoft.com/office/word/2018/wordml" xmlns:w16sdtdh="http://schemas.microsoft.com/office/word/2020/wordml/sdtdatahash" xmlns:w16se="http://schemas.microsoft.com/office/word/2015/wordml/symex" xmlns:wpg="http://schemas.microsoft.com/office/word/2010/wordprocessingGroup" xmlns:wpi="http://schemas.microsoft.com/office/word/2010/wordprocessingInk" xmlns:wne="http://schemas.microsoft.com/office/word/2006/wordml" xmlns:wps="http://schemas.microsoft.com/office/word/2010/wordprocessingShape" mc:Ignorable="w14 w15 w16se w16cid w16 w16cex w16sdtdh wp14">
   <w:abstractNum w:abstractNumId="0" w15:restartNumberingAfterBreak="0">
-    <w:nsid w:val="0060128F"/>
+    <w:nsid w:val="012637F6"/>
     <w:multiLevelType w:val="hybridMultilevel"/>
-    <w:tmpl w:val="390E1F30"/>
-    <w:lvl w:ilvl="0" w:tplc="C6146554">
+    <w:tmpl w:val="1FCC58E0"/>
+    <w:lvl w:ilvl="0" w:tplc="E9F28B6A">
       <w:start w:val="1"/>
       <w:numFmt w:val="decimal"/>
       <w:lvlText w:val="%1."/>
@@ -23266,52 +23266,52 @@
         <w:color w:val="A67C27"/>
       </w:rPr>
     </w:lvl>
-    <w:lvl w:ilvl="1" w:tplc="AD38AA2E">
+    <w:lvl w:ilvl="1" w:tplc="CA883F28">
       <w:numFmt w:val="decimal"/>
       <w:lvlText w:val=""/>
       <w:lvlJc w:val="left"/>
     </w:lvl>
-    <w:lvl w:ilvl="2" w:tplc="3E0483D0">
+    <w:lvl w:ilvl="2" w:tplc="3EA6CB58">
       <w:numFmt w:val="decimal"/>
       <w:lvlText w:val=""/>
       <w:lvlJc w:val="left"/>
     </w:lvl>
-    <w:lvl w:ilvl="3" w:tplc="3AE84642">
+    <w:lvl w:ilvl="3" w:tplc="8014E80C">
       <w:numFmt w:val="decimal"/>
       <w:lvlText w:val=""/>
       <w:lvlJc w:val="left"/>
     </w:lvl>
-    <w:lvl w:ilvl="4" w:tplc="AC40C612">
+    <w:lvl w:ilvl="4" w:tplc="B246C6B2">
       <w:numFmt w:val="decimal"/>
       <w:lvlText w:val=""/>
       <w:lvlJc w:val="left"/>
     </w:lvl>
-    <w:lvl w:ilvl="5" w:tplc="2906388A">
+    <w:lvl w:ilvl="5" w:tplc="1B4EE0A0">
       <w:numFmt w:val="decimal"/>
       <w:lvlText w:val=""/>
       <w:lvlJc w:val="left"/>
     </w:lvl>
-    <w:lvl w:ilvl="6" w:tplc="9278985E">
+    <w:lvl w:ilvl="6" w:tplc="19EE05E8">
       <w:numFmt w:val="decimal"/>
       <w:lvlText w:val=""/>
       <w:lvlJc w:val="left"/>
     </w:lvl>
-    <w:lvl w:ilvl="7" w:tplc="D9ECC34A">
+    <w:lvl w:ilvl="7" w:tplc="EFFE8CFC">
       <w:numFmt w:val="decimal"/>
       <w:lvlText w:val=""/>
       <w:lvlJc w:val="left"/>
     </w:lvl>
-    <w:lvl w:ilvl="8" w:tplc="7F2656BE">
+    <w:lvl w:ilvl="8" w:tplc="2BCEEC62">
       <w:numFmt w:val="decimal"/>
       <w:lvlText w:val=""/>
       <w:lvlJc w:val="left"/>
     </w:lvl>
   </w:abstractNum>
   <w:abstractNum w:abstractNumId="1" w15:restartNumberingAfterBreak="0">
-    <w:nsid w:val="02A63BF1"/>
+    <w:nsid w:val="017A45A8"/>
     <w:multiLevelType w:val="hybridMultilevel"/>
-    <w:tmpl w:val="7A300F4A"/>
-    <w:lvl w:ilvl="0" w:tplc="E43A133C">
+    <w:tmpl w:val="0AB87C22"/>
+    <w:lvl w:ilvl="0" w:tplc="AFEA26E0">
       <w:start w:val="1"/>
       <w:numFmt w:val="decimal"/>
       <w:lvlText w:val="%1."/>
@@ -23325,52 +23325,52 @@
         <w:color w:val="A67C27"/>
       </w:rPr>
     </w:lvl>
-    <w:lvl w:ilvl="1" w:tplc="53A2CD9A">
+    <w:lvl w:ilvl="1" w:tplc="B02E8804">
       <w:numFmt w:val="decimal"/>
       <w:lvlText w:val=""/>
       <w:lvlJc w:val="left"/>
     </w:lvl>
-    <w:lvl w:ilvl="2" w:tplc="0F9AF566">
+    <w:lvl w:ilvl="2" w:tplc="9518261C">
       <w:numFmt w:val="decimal"/>
       <w:lvlText w:val=""/>
       <w:lvlJc w:val="left"/>
     </w:lvl>
-    <w:lvl w:ilvl="3" w:tplc="F85EBEB8">
+    <w:lvl w:ilvl="3" w:tplc="6A06FEB8">
       <w:numFmt w:val="decimal"/>
       <w:lvlText w:val=""/>
       <w:lvlJc w:val="left"/>
     </w:lvl>
-    <w:lvl w:ilvl="4" w:tplc="507068E0">
+    <w:lvl w:ilvl="4" w:tplc="9AFA00DA">
       <w:numFmt w:val="decimal"/>
       <w:lvlText w:val=""/>
       <w:lvlJc w:val="left"/>
     </w:lvl>
-    <w:lvl w:ilvl="5" w:tplc="EC983B0E">
+    <w:lvl w:ilvl="5" w:tplc="1E505D5C">
       <w:numFmt w:val="decimal"/>
       <w:lvlText w:val=""/>
       <w:lvlJc w:val="left"/>
     </w:lvl>
-    <w:lvl w:ilvl="6" w:tplc="D5ACD6E4">
+    <w:lvl w:ilvl="6" w:tplc="FCB65684">
       <w:numFmt w:val="decimal"/>
       <w:lvlText w:val=""/>
       <w:lvlJc w:val="left"/>
     </w:lvl>
-    <w:lvl w:ilvl="7" w:tplc="6EDEDCFA">
+    <w:lvl w:ilvl="7" w:tplc="805A6998">
       <w:numFmt w:val="decimal"/>
       <w:lvlText w:val=""/>
       <w:lvlJc w:val="left"/>
     </w:lvl>
-    <w:lvl w:ilvl="8" w:tplc="2294FB78">
+    <w:lvl w:ilvl="8" w:tplc="6D6E7E3C">
       <w:numFmt w:val="decimal"/>
       <w:lvlText w:val=""/>
       <w:lvlJc w:val="left"/>
     </w:lvl>
   </w:abstractNum>
   <w:abstractNum w:abstractNumId="2" w15:restartNumberingAfterBreak="0">
-    <w:nsid w:val="07864136"/>
+    <w:nsid w:val="04057083"/>
     <w:multiLevelType w:val="hybridMultilevel"/>
-    <w:tmpl w:val="12602A8E"/>
-    <w:lvl w:ilvl="0" w:tplc="D5A6CFE0">
+    <w:tmpl w:val="29D400F8"/>
+    <w:lvl w:ilvl="0" w:tplc="8F2C0D7A">
       <w:start w:val="1"/>
       <w:numFmt w:val="decimal"/>
       <w:lvlText w:val="%1."/>
@@ -23384,52 +23384,52 @@
         <w:color w:val="A67C27"/>
       </w:rPr>
     </w:lvl>
-    <w:lvl w:ilvl="1" w:tplc="7ECAB1EC">
+    <w:lvl w:ilvl="1" w:tplc="5300BD60">
       <w:numFmt w:val="decimal"/>
       <w:lvlText w:val=""/>
       <w:lvlJc w:val="left"/>
     </w:lvl>
-    <w:lvl w:ilvl="2" w:tplc="37480FDE">
+    <w:lvl w:ilvl="2" w:tplc="9CC6EE4E">
       <w:numFmt w:val="decimal"/>
       <w:lvlText w:val=""/>
       <w:lvlJc w:val="left"/>
     </w:lvl>
-    <w:lvl w:ilvl="3" w:tplc="01C68122">
+    <w:lvl w:ilvl="3" w:tplc="B6ECFF78">
       <w:numFmt w:val="decimal"/>
       <w:lvlText w:val=""/>
       <w:lvlJc w:val="left"/>
     </w:lvl>
-    <w:lvl w:ilvl="4" w:tplc="96D6200C">
+    <w:lvl w:ilvl="4" w:tplc="3F40D6BC">
       <w:numFmt w:val="decimal"/>
       <w:lvlText w:val=""/>
       <w:lvlJc w:val="left"/>
     </w:lvl>
-    <w:lvl w:ilvl="5" w:tplc="CE66CAB8">
+    <w:lvl w:ilvl="5" w:tplc="6F047184">
       <w:numFmt w:val="decimal"/>
       <w:lvlText w:val=""/>
       <w:lvlJc w:val="left"/>
     </w:lvl>
-    <w:lvl w:ilvl="6" w:tplc="6BCE5D84">
+    <w:lvl w:ilvl="6" w:tplc="46386074">
       <w:numFmt w:val="decimal"/>
       <w:lvlText w:val=""/>
       <w:lvlJc w:val="left"/>
     </w:lvl>
-    <w:lvl w:ilvl="7" w:tplc="F8E4D076">
+    <w:lvl w:ilvl="7" w:tplc="B544803E">
       <w:numFmt w:val="decimal"/>
       <w:lvlText w:val=""/>
       <w:lvlJc w:val="left"/>
     </w:lvl>
-    <w:lvl w:ilvl="8" w:tplc="B998A6C2">
+    <w:lvl w:ilvl="8" w:tplc="3A14982C">
       <w:numFmt w:val="decimal"/>
       <w:lvlText w:val=""/>
       <w:lvlJc w:val="left"/>
     </w:lvl>
   </w:abstractNum>
   <w:abstractNum w:abstractNumId="3" w15:restartNumberingAfterBreak="0">
-    <w:nsid w:val="0C914930"/>
+    <w:nsid w:val="111B7CC7"/>
     <w:multiLevelType w:val="hybridMultilevel"/>
-    <w:tmpl w:val="E976D2CC"/>
-    <w:lvl w:ilvl="0" w:tplc="58C4F0D8">
+    <w:tmpl w:val="7EA8659A"/>
+    <w:lvl w:ilvl="0" w:tplc="26D62332">
       <w:start w:val="1"/>
       <w:numFmt w:val="decimal"/>
       <w:lvlText w:val="%1."/>
@@ -23443,52 +23443,52 @@
         <w:color w:val="A67C27"/>
       </w:rPr>
     </w:lvl>
-    <w:lvl w:ilvl="1" w:tplc="30BCF0F2">
+    <w:lvl w:ilvl="1" w:tplc="905E1354">
       <w:numFmt w:val="decimal"/>
       <w:lvlText w:val=""/>
       <w:lvlJc w:val="left"/>
     </w:lvl>
-    <w:lvl w:ilvl="2" w:tplc="31DC2E10">
+    <w:lvl w:ilvl="2" w:tplc="CB30A9DE">
       <w:numFmt w:val="decimal"/>
       <w:lvlText w:val=""/>
       <w:lvlJc w:val="left"/>
     </w:lvl>
-    <w:lvl w:ilvl="3" w:tplc="63CCFB48">
+    <w:lvl w:ilvl="3" w:tplc="3C3E76E2">
       <w:numFmt w:val="decimal"/>
       <w:lvlText w:val=""/>
       <w:lvlJc w:val="left"/>
     </w:lvl>
-    <w:lvl w:ilvl="4" w:tplc="A8B6CD4C">
+    <w:lvl w:ilvl="4" w:tplc="50760E94">
       <w:numFmt w:val="decimal"/>
       <w:lvlText w:val=""/>
       <w:lvlJc w:val="left"/>
     </w:lvl>
-    <w:lvl w:ilvl="5" w:tplc="875EA624">
+    <w:lvl w:ilvl="5" w:tplc="8F367FA0">
       <w:numFmt w:val="decimal"/>
       <w:lvlText w:val=""/>
       <w:lvlJc w:val="left"/>
     </w:lvl>
-    <w:lvl w:ilvl="6" w:tplc="2E4ED2AE">
+    <w:lvl w:ilvl="6" w:tplc="98884972">
       <w:numFmt w:val="decimal"/>
       <w:lvlText w:val=""/>
       <w:lvlJc w:val="left"/>
     </w:lvl>
-    <w:lvl w:ilvl="7" w:tplc="EC60C9DE">
+    <w:lvl w:ilvl="7" w:tplc="F24AAB72">
       <w:numFmt w:val="decimal"/>
       <w:lvlText w:val=""/>
       <w:lvlJc w:val="left"/>
     </w:lvl>
-    <w:lvl w:ilvl="8" w:tplc="06E6008E">
+    <w:lvl w:ilvl="8" w:tplc="C1FC6214">
       <w:numFmt w:val="decimal"/>
       <w:lvlText w:val=""/>
       <w:lvlJc w:val="left"/>
     </w:lvl>
   </w:abstractNum>
   <w:abstractNum w:abstractNumId="4" w15:restartNumberingAfterBreak="0">
-    <w:nsid w:val="155933E8"/>
+    <w:nsid w:val="131B1AD9"/>
     <w:multiLevelType w:val="hybridMultilevel"/>
-    <w:tmpl w:val="1A14E140"/>
-    <w:lvl w:ilvl="0" w:tplc="D12ACDE8">
+    <w:tmpl w:val="6854F55A"/>
+    <w:lvl w:ilvl="0" w:tplc="1B80772E">
       <w:start w:val="1"/>
       <w:numFmt w:val="decimal"/>
       <w:lvlText w:val="%1."/>
@@ -23502,52 +23502,52 @@
         <w:color w:val="A67C27"/>
       </w:rPr>
     </w:lvl>
-    <w:lvl w:ilvl="1" w:tplc="D682CC2A">
+    <w:lvl w:ilvl="1" w:tplc="B44087F4">
       <w:numFmt w:val="decimal"/>
       <w:lvlText w:val=""/>
       <w:lvlJc w:val="left"/>
     </w:lvl>
-    <w:lvl w:ilvl="2" w:tplc="0E32F62E">
+    <w:lvl w:ilvl="2" w:tplc="1B421358">
       <w:numFmt w:val="decimal"/>
       <w:lvlText w:val=""/>
       <w:lvlJc w:val="left"/>
     </w:lvl>
-    <w:lvl w:ilvl="3" w:tplc="CB3EB796">
+    <w:lvl w:ilvl="3" w:tplc="93BAE734">
       <w:numFmt w:val="decimal"/>
       <w:lvlText w:val=""/>
       <w:lvlJc w:val="left"/>
     </w:lvl>
-    <w:lvl w:ilvl="4" w:tplc="AD14717A">
+    <w:lvl w:ilvl="4" w:tplc="34146B60">
       <w:numFmt w:val="decimal"/>
       <w:lvlText w:val=""/>
       <w:lvlJc w:val="left"/>
     </w:lvl>
-    <w:lvl w:ilvl="5" w:tplc="BA5C0AC2">
+    <w:lvl w:ilvl="5" w:tplc="E22AE454">
       <w:numFmt w:val="decimal"/>
       <w:lvlText w:val=""/>
       <w:lvlJc w:val="left"/>
     </w:lvl>
-    <w:lvl w:ilvl="6" w:tplc="22A22BD6">
+    <w:lvl w:ilvl="6" w:tplc="09904594">
       <w:numFmt w:val="decimal"/>
       <w:lvlText w:val=""/>
       <w:lvlJc w:val="left"/>
     </w:lvl>
-    <w:lvl w:ilvl="7" w:tplc="3850A552">
+    <w:lvl w:ilvl="7" w:tplc="B60A25EA">
       <w:numFmt w:val="decimal"/>
       <w:lvlText w:val=""/>
       <w:lvlJc w:val="left"/>
     </w:lvl>
-    <w:lvl w:ilvl="8" w:tplc="E1AC3B7E">
+    <w:lvl w:ilvl="8" w:tplc="D5BC1F96">
       <w:numFmt w:val="decimal"/>
       <w:lvlText w:val=""/>
       <w:lvlJc w:val="left"/>
     </w:lvl>
   </w:abstractNum>
   <w:abstractNum w:abstractNumId="5" w15:restartNumberingAfterBreak="0">
-    <w:nsid w:val="17F714FC"/>
+    <w:nsid w:val="160909FB"/>
     <w:multiLevelType w:val="hybridMultilevel"/>
-    <w:tmpl w:val="9D0EC5E2"/>
-    <w:lvl w:ilvl="0" w:tplc="0CE89F9E">
+    <w:tmpl w:val="0A085A56"/>
+    <w:lvl w:ilvl="0" w:tplc="100E2D6E">
       <w:start w:val="1"/>
       <w:numFmt w:val="decimal"/>
       <w:lvlText w:val="%1."/>
@@ -23561,52 +23561,138 @@
         <w:color w:val="A67C27"/>
       </w:rPr>
     </w:lvl>
-    <w:lvl w:ilvl="1" w:tplc="218420AE">
+    <w:lvl w:ilvl="1" w:tplc="64545968">
       <w:numFmt w:val="decimal"/>
       <w:lvlText w:val=""/>
       <w:lvlJc w:val="left"/>
     </w:lvl>
-    <w:lvl w:ilvl="2" w:tplc="0F3A6CB2">
+    <w:lvl w:ilvl="2" w:tplc="63123EB0">
       <w:numFmt w:val="decimal"/>
       <w:lvlText w:val=""/>
       <w:lvlJc w:val="left"/>
     </w:lvl>
-    <w:lvl w:ilvl="3" w:tplc="66F09D6E">
+    <w:lvl w:ilvl="3" w:tplc="364EB936">
       <w:numFmt w:val="decimal"/>
       <w:lvlText w:val=""/>
       <w:lvlJc w:val="left"/>
     </w:lvl>
-    <w:lvl w:ilvl="4" w:tplc="2742732A">
+    <w:lvl w:ilvl="4" w:tplc="C62E4BB2">
       <w:numFmt w:val="decimal"/>
       <w:lvlText w:val=""/>
       <w:lvlJc w:val="left"/>
     </w:lvl>
-    <w:lvl w:ilvl="5" w:tplc="8332862C">
+    <w:lvl w:ilvl="5" w:tplc="791EF8C6">
       <w:numFmt w:val="decimal"/>
       <w:lvlText w:val=""/>
       <w:lvlJc w:val="left"/>
     </w:lvl>
-    <w:lvl w:ilvl="6" w:tplc="CDEED786">
+    <w:lvl w:ilvl="6" w:tplc="58F0568C">
       <w:numFmt w:val="decimal"/>
       <w:lvlText w:val=""/>
       <w:lvlJc w:val="left"/>
     </w:lvl>
-    <w:lvl w:ilvl="7" w:tplc="C5DAB3D2">
+    <w:lvl w:ilvl="7" w:tplc="9E0E0DA2">
       <w:numFmt w:val="decimal"/>
       <w:lvlText w:val=""/>
       <w:lvlJc w:val="left"/>
     </w:lvl>
-    <w:lvl w:ilvl="8" w:tplc="1B04D0B8">
+    <w:lvl w:ilvl="8" w:tplc="7EB67A76">
       <w:numFmt w:val="decimal"/>
       <w:lvlText w:val=""/>
       <w:lvlJc w:val="left"/>
     </w:lvl>
   </w:abstractNum>
   <w:abstractNum w:abstractNumId="6" w15:restartNumberingAfterBreak="0">
-    <w:nsid w:val="37155F53"/>
+    <w:nsid w:val="18C16670"/>
     <w:multiLevelType w:val="hybridMultilevel"/>
-    <w:tmpl w:val="71D0C3C2"/>
-    <w:lvl w:ilvl="0" w:tplc="88824650">
+    <w:tmpl w:val="52A629AC"/>
+    <w:lvl w:ilvl="0" w:tplc="157810F6">
+      <w:start w:val="1"/>
+      <w:numFmt w:val="bullet"/>
+      <w:lvlText w:val="●"/>
+      <w:lvlJc w:val="left"/>
+      <w:pPr>
+        <w:ind w:left="720" w:hanging="360"/>
+      </w:pPr>
+    </w:lvl>
+    <w:lvl w:ilvl="1" w:tplc="F6D0325A">
+      <w:start w:val="1"/>
+      <w:numFmt w:val="bullet"/>
+      <w:lvlText w:val="○"/>
+      <w:lvlJc w:val="left"/>
+      <w:pPr>
+        <w:ind w:left="1440" w:hanging="360"/>
+      </w:pPr>
+    </w:lvl>
+    <w:lvl w:ilvl="2" w:tplc="0A548014">
+      <w:start w:val="1"/>
+      <w:numFmt w:val="bullet"/>
+      <w:lvlText w:val="■"/>
+      <w:lvlJc w:val="left"/>
+      <w:pPr>
+        <w:ind w:left="2160" w:hanging="360"/>
+      </w:pPr>
+    </w:lvl>
+    <w:lvl w:ilvl="3" w:tplc="F80CAB50">
+      <w:start w:val="1"/>
+      <w:numFmt w:val="bullet"/>
+      <w:lvlText w:val="●"/>
+      <w:lvlJc w:val="left"/>
+      <w:pPr>
+        <w:ind w:left="2880" w:hanging="360"/>
+      </w:pPr>
+    </w:lvl>
+    <w:lvl w:ilvl="4" w:tplc="C406C330">
+      <w:start w:val="1"/>
+      <w:numFmt w:val="bullet"/>
+      <w:lvlText w:val="○"/>
+      <w:lvlJc w:val="left"/>
+      <w:pPr>
+        <w:ind w:left="3600" w:hanging="360"/>
+      </w:pPr>
+    </w:lvl>
+    <w:lvl w:ilvl="5" w:tplc="A7CE0756">
+      <w:start w:val="1"/>
+      <w:numFmt w:val="bullet"/>
+      <w:lvlText w:val="■"/>
+      <w:lvlJc w:val="left"/>
+      <w:pPr>
+        <w:ind w:left="4320" w:hanging="360"/>
+      </w:pPr>
+    </w:lvl>
+    <w:lvl w:ilvl="6" w:tplc="D9B8E434">
+      <w:start w:val="1"/>
+      <w:numFmt w:val="bullet"/>
+      <w:lvlText w:val="●"/>
+      <w:lvlJc w:val="left"/>
+      <w:pPr>
+        <w:ind w:left="5040" w:hanging="360"/>
+      </w:pPr>
+    </w:lvl>
+    <w:lvl w:ilvl="7" w:tplc="4A8A23B2">
+      <w:start w:val="1"/>
+      <w:numFmt w:val="bullet"/>
+      <w:lvlText w:val="●"/>
+      <w:lvlJc w:val="left"/>
+      <w:pPr>
+        <w:ind w:left="5760" w:hanging="360"/>
+      </w:pPr>
+    </w:lvl>
+    <w:lvl w:ilvl="8" w:tplc="A7F841C4">
+      <w:start w:val="1"/>
+      <w:numFmt w:val="bullet"/>
+      <w:lvlText w:val="●"/>
+      <w:lvlJc w:val="left"/>
+      <w:pPr>
+        <w:ind w:left="6480" w:hanging="360"/>
+      </w:pPr>
+    </w:lvl>
+  </w:abstractNum>
+  <w:abstractNum w:abstractNumId="7" w15:restartNumberingAfterBreak="0">
+    <w:nsid w:val="1E6821C8"/>
+    <w:multiLevelType w:val="hybridMultilevel"/>
+    <w:tmpl w:val="3AFC412C"/>
+    <w:lvl w:ilvl="0" w:tplc="B5F64846">
       <w:start w:val="1"/>
       <w:numFmt w:val="decimal"/>
       <w:lvlText w:val="%1."/>
@@ -23620,52 +23706,110 @@
         <w:color w:val="A67C27"/>
       </w:rPr>
     </w:lvl>
-    <w:lvl w:ilvl="1" w:tplc="DB4A5A80">
+    <w:lvl w:ilvl="1" w:tplc="0728D8C8">
       <w:numFmt w:val="decimal"/>
       <w:lvlText w:val=""/>
       <w:lvlJc w:val="left"/>
     </w:lvl>
-    <w:lvl w:ilvl="2" w:tplc="6BE00A50">
+    <w:lvl w:ilvl="2" w:tplc="0D802CC4">
       <w:numFmt w:val="decimal"/>
       <w:lvlText w:val=""/>
       <w:lvlJc w:val="left"/>
     </w:lvl>
-    <w:lvl w:ilvl="3" w:tplc="055A900C">
+    <w:lvl w:ilvl="3" w:tplc="C79433F8">
       <w:numFmt w:val="decimal"/>
       <w:lvlText w:val=""/>
       <w:lvlJc w:val="left"/>
     </w:lvl>
-    <w:lvl w:ilvl="4" w:tplc="842E5C32">
+    <w:lvl w:ilvl="4" w:tplc="FAB0E602">
       <w:numFmt w:val="decimal"/>
       <w:lvlText w:val=""/>
       <w:lvlJc w:val="left"/>
     </w:lvl>
-    <w:lvl w:ilvl="5" w:tplc="5818F6A2">
+    <w:lvl w:ilvl="5" w:tplc="743A78C4">
       <w:numFmt w:val="decimal"/>
       <w:lvlText w:val=""/>
       <w:lvlJc w:val="left"/>
     </w:lvl>
-    <w:lvl w:ilvl="6" w:tplc="4A2AB196">
+    <w:lvl w:ilvl="6" w:tplc="6B645A9A">
       <w:numFmt w:val="decimal"/>
       <w:lvlText w:val=""/>
       <w:lvlJc w:val="left"/>
     </w:lvl>
-    <w:lvl w:ilvl="7" w:tplc="4558CC0A">
+    <w:lvl w:ilvl="7" w:tplc="50F8AC0E">
       <w:numFmt w:val="decimal"/>
       <w:lvlText w:val=""/>
       <w:lvlJc w:val="left"/>
     </w:lvl>
-    <w:lvl w:ilvl="8" w:tplc="34588144">
+    <w:lvl w:ilvl="8" w:tplc="1D70BC72">
       <w:numFmt w:val="decimal"/>
       <w:lvlText w:val=""/>
       <w:lvlJc w:val="left"/>
     </w:lvl>
   </w:abstractNum>
-  <w:abstractNum w:abstractNumId="7" w15:restartNumberingAfterBreak="0">
-    <w:nsid w:val="38C633FC"/>
+  <w:abstractNum w:abstractNumId="8" w15:restartNumberingAfterBreak="0">
+    <w:nsid w:val="1F0A7F8C"/>
     <w:multiLevelType w:val="hybridMultilevel"/>
-    <w:tmpl w:val="0C824450"/>
-    <w:lvl w:ilvl="0" w:tplc="2E84D6C8">
+    <w:tmpl w:val="CDCCBF0C"/>
+    <w:lvl w:ilvl="0" w:tplc="B344A7CC">
+      <w:start w:val="1"/>
+      <w:numFmt w:val="bullet"/>
+      <w:lvlText w:val="•"/>
+      <w:lvlJc w:val="left"/>
+      <w:pPr>
+        <w:ind w:left="460" w:hanging="280"/>
+      </w:pPr>
+    </w:lvl>
+    <w:lvl w:ilvl="1" w:tplc="D2C8F74E">
+      <w:start w:val="1"/>
+      <w:numFmt w:val="bullet"/>
+      <w:lvlText w:val="–"/>
+      <w:lvlJc w:val="left"/>
+      <w:pPr>
+        <w:ind w:left="900" w:hanging="280"/>
+      </w:pPr>
+    </w:lvl>
+    <w:lvl w:ilvl="2" w:tplc="179C0770">
+      <w:numFmt w:val="decimal"/>
+      <w:lvlText w:val=""/>
+      <w:lvlJc w:val="left"/>
+    </w:lvl>
+    <w:lvl w:ilvl="3" w:tplc="A45279FE">
+      <w:numFmt w:val="decimal"/>
+      <w:lvlText w:val=""/>
+      <w:lvlJc w:val="left"/>
+    </w:lvl>
+    <w:lvl w:ilvl="4" w:tplc="85162CFE">
+      <w:numFmt w:val="decimal"/>
+      <w:lvlText w:val=""/>
+      <w:lvlJc w:val="left"/>
+    </w:lvl>
+    <w:lvl w:ilvl="5" w:tplc="780C0420">
+      <w:numFmt w:val="decimal"/>
+      <w:lvlText w:val=""/>
+      <w:lvlJc w:val="left"/>
+    </w:lvl>
+    <w:lvl w:ilvl="6" w:tplc="8AAC5C56">
+      <w:numFmt w:val="decimal"/>
+      <w:lvlText w:val=""/>
+      <w:lvlJc w:val="left"/>
+    </w:lvl>
+    <w:lvl w:ilvl="7" w:tplc="E1CC1396">
+      <w:numFmt w:val="decimal"/>
+      <w:lvlText w:val=""/>
+      <w:lvlJc w:val="left"/>
+    </w:lvl>
+    <w:lvl w:ilvl="8" w:tplc="CFB4BD8C">
+      <w:numFmt w:val="decimal"/>
+      <w:lvlText w:val=""/>
+      <w:lvlJc w:val="left"/>
+    </w:lvl>
+  </w:abstractNum>
+  <w:abstractNum w:abstractNumId="9" w15:restartNumberingAfterBreak="0">
+    <w:nsid w:val="2346770A"/>
+    <w:multiLevelType w:val="hybridMultilevel"/>
+    <w:tmpl w:val="008067EA"/>
+    <w:lvl w:ilvl="0" w:tplc="D7ECF6F4">
       <w:start w:val="1"/>
       <w:numFmt w:val="decimal"/>
       <w:lvlText w:val="%1."/>
@@ -23679,52 +23823,52 @@
         <w:color w:val="A67C27"/>
       </w:rPr>
     </w:lvl>
-    <w:lvl w:ilvl="1" w:tplc="34FAC5C6">
+    <w:lvl w:ilvl="1" w:tplc="B2FE6378">
       <w:numFmt w:val="decimal"/>
       <w:lvlText w:val=""/>
       <w:lvlJc w:val="left"/>
     </w:lvl>
-    <w:lvl w:ilvl="2" w:tplc="F54C26A6">
+    <w:lvl w:ilvl="2" w:tplc="905C82C2">
       <w:numFmt w:val="decimal"/>
       <w:lvlText w:val=""/>
       <w:lvlJc w:val="left"/>
     </w:lvl>
-    <w:lvl w:ilvl="3" w:tplc="FECA20BA">
+    <w:lvl w:ilvl="3" w:tplc="B0DEB704">
       <w:numFmt w:val="decimal"/>
       <w:lvlText w:val=""/>
       <w:lvlJc w:val="left"/>
     </w:lvl>
-    <w:lvl w:ilvl="4" w:tplc="DEA4DF78">
+    <w:lvl w:ilvl="4" w:tplc="BD9EE182">
       <w:numFmt w:val="decimal"/>
       <w:lvlText w:val=""/>
       <w:lvlJc w:val="left"/>
     </w:lvl>
-    <w:lvl w:ilvl="5" w:tplc="A6209648">
+    <w:lvl w:ilvl="5" w:tplc="C3FADAB0">
       <w:numFmt w:val="decimal"/>
       <w:lvlText w:val=""/>
       <w:lvlJc w:val="left"/>
     </w:lvl>
-    <w:lvl w:ilvl="6" w:tplc="E1FAD5C4">
+    <w:lvl w:ilvl="6" w:tplc="2416ED68">
       <w:numFmt w:val="decimal"/>
       <w:lvlText w:val=""/>
       <w:lvlJc w:val="left"/>
     </w:lvl>
-    <w:lvl w:ilvl="7" w:tplc="794CF0AC">
+    <w:lvl w:ilvl="7" w:tplc="3912E9FE">
       <w:numFmt w:val="decimal"/>
       <w:lvlText w:val=""/>
       <w:lvlJc w:val="left"/>
     </w:lvl>
-    <w:lvl w:ilvl="8" w:tplc="97AC338A">
+    <w:lvl w:ilvl="8" w:tplc="4712F884">
       <w:numFmt w:val="decimal"/>
       <w:lvlText w:val=""/>
       <w:lvlJc w:val="left"/>
     </w:lvl>
   </w:abstractNum>
-  <w:abstractNum w:abstractNumId="8" w15:restartNumberingAfterBreak="0">
-    <w:nsid w:val="3A700E2B"/>
+  <w:abstractNum w:abstractNumId="10" w15:restartNumberingAfterBreak="0">
+    <w:nsid w:val="30FE500F"/>
     <w:multiLevelType w:val="hybridMultilevel"/>
-    <w:tmpl w:val="62DE70BA"/>
-    <w:lvl w:ilvl="0" w:tplc="FFC6FB02">
+    <w:tmpl w:val="1BE4661E"/>
+    <w:lvl w:ilvl="0" w:tplc="E676F458">
       <w:start w:val="1"/>
       <w:numFmt w:val="decimal"/>
       <w:lvlText w:val="%1."/>
@@ -23738,52 +23882,52 @@
         <w:color w:val="A67C27"/>
       </w:rPr>
     </w:lvl>
-    <w:lvl w:ilvl="1" w:tplc="10526B50">
+    <w:lvl w:ilvl="1" w:tplc="9C920CD2">
       <w:numFmt w:val="decimal"/>
       <w:lvlText w:val=""/>
       <w:lvlJc w:val="left"/>
     </w:lvl>
-    <w:lvl w:ilvl="2" w:tplc="653C31A8">
+    <w:lvl w:ilvl="2" w:tplc="116A4CBE">
       <w:numFmt w:val="decimal"/>
       <w:lvlText w:val=""/>
       <w:lvlJc w:val="left"/>
     </w:lvl>
-    <w:lvl w:ilvl="3" w:tplc="56B60DEA">
+    <w:lvl w:ilvl="3" w:tplc="90BE6F5C">
       <w:numFmt w:val="decimal"/>
       <w:lvlText w:val=""/>
       <w:lvlJc w:val="left"/>
     </w:lvl>
-    <w:lvl w:ilvl="4" w:tplc="3138AE0A">
+    <w:lvl w:ilvl="4" w:tplc="81FE6822">
       <w:numFmt w:val="decimal"/>
       <w:lvlText w:val=""/>
       <w:lvlJc w:val="left"/>
     </w:lvl>
-    <w:lvl w:ilvl="5" w:tplc="3BC42844">
+    <w:lvl w:ilvl="5" w:tplc="40267006">
       <w:numFmt w:val="decimal"/>
       <w:lvlText w:val=""/>
       <w:lvlJc w:val="left"/>
     </w:lvl>
-    <w:lvl w:ilvl="6" w:tplc="41E089E2">
+    <w:lvl w:ilvl="6" w:tplc="042C50E0">
       <w:numFmt w:val="decimal"/>
       <w:lvlText w:val=""/>
       <w:lvlJc w:val="left"/>
     </w:lvl>
-    <w:lvl w:ilvl="7" w:tplc="43B25894">
+    <w:lvl w:ilvl="7" w:tplc="082A8C86">
       <w:numFmt w:val="decimal"/>
       <w:lvlText w:val=""/>
       <w:lvlJc w:val="left"/>
     </w:lvl>
-    <w:lvl w:ilvl="8" w:tplc="95986A2A">
+    <w:lvl w:ilvl="8" w:tplc="90F0D51C">
       <w:numFmt w:val="decimal"/>
       <w:lvlText w:val=""/>
       <w:lvlJc w:val="left"/>
     </w:lvl>
   </w:abstractNum>
-  <w:abstractNum w:abstractNumId="9" w15:restartNumberingAfterBreak="0">
-    <w:nsid w:val="3BF73A0C"/>
+  <w:abstractNum w:abstractNumId="11" w15:restartNumberingAfterBreak="0">
+    <w:nsid w:val="318624A3"/>
     <w:multiLevelType w:val="hybridMultilevel"/>
-    <w:tmpl w:val="32789B24"/>
-    <w:lvl w:ilvl="0" w:tplc="4A343138">
+    <w:tmpl w:val="7A0A70E8"/>
+    <w:lvl w:ilvl="0" w:tplc="15E0962E">
       <w:start w:val="1"/>
       <w:numFmt w:val="decimal"/>
       <w:lvlText w:val="%1."/>
@@ -23797,52 +23941,52 @@
         <w:color w:val="A67C27"/>
       </w:rPr>
     </w:lvl>
-    <w:lvl w:ilvl="1" w:tplc="BF409990">
+    <w:lvl w:ilvl="1" w:tplc="E4C4CF74">
       <w:numFmt w:val="decimal"/>
       <w:lvlText w:val=""/>
       <w:lvlJc w:val="left"/>
     </w:lvl>
-    <w:lvl w:ilvl="2" w:tplc="AECAE8F8">
+    <w:lvl w:ilvl="2" w:tplc="300202C2">
       <w:numFmt w:val="decimal"/>
       <w:lvlText w:val=""/>
       <w:lvlJc w:val="left"/>
     </w:lvl>
-    <w:lvl w:ilvl="3" w:tplc="08445340">
+    <w:lvl w:ilvl="3" w:tplc="0B8C54E8">
       <w:numFmt w:val="decimal"/>
       <w:lvlText w:val=""/>
       <w:lvlJc w:val="left"/>
     </w:lvl>
-    <w:lvl w:ilvl="4" w:tplc="29F4D722">
+    <w:lvl w:ilvl="4" w:tplc="BEC05676">
       <w:numFmt w:val="decimal"/>
       <w:lvlText w:val=""/>
       <w:lvlJc w:val="left"/>
     </w:lvl>
-    <w:lvl w:ilvl="5" w:tplc="D94A687C">
+    <w:lvl w:ilvl="5" w:tplc="524A4D2C">
       <w:numFmt w:val="decimal"/>
       <w:lvlText w:val=""/>
       <w:lvlJc w:val="left"/>
     </w:lvl>
-    <w:lvl w:ilvl="6" w:tplc="E22064F8">
+    <w:lvl w:ilvl="6" w:tplc="207A3926">
       <w:numFmt w:val="decimal"/>
       <w:lvlText w:val=""/>
       <w:lvlJc w:val="left"/>
     </w:lvl>
-    <w:lvl w:ilvl="7" w:tplc="F796DFEA">
+    <w:lvl w:ilvl="7" w:tplc="ED50A63A">
       <w:numFmt w:val="decimal"/>
       <w:lvlText w:val=""/>
       <w:lvlJc w:val="left"/>
     </w:lvl>
-    <w:lvl w:ilvl="8" w:tplc="9B76ABF4">
+    <w:lvl w:ilvl="8" w:tplc="96720EA0">
       <w:numFmt w:val="decimal"/>
       <w:lvlText w:val=""/>
       <w:lvlJc w:val="left"/>
     </w:lvl>
   </w:abstractNum>
-  <w:abstractNum w:abstractNumId="10" w15:restartNumberingAfterBreak="0">
-    <w:nsid w:val="3C0C5ED6"/>
+  <w:abstractNum w:abstractNumId="12" w15:restartNumberingAfterBreak="0">
+    <w:nsid w:val="32D261BD"/>
     <w:multiLevelType w:val="hybridMultilevel"/>
-    <w:tmpl w:val="E5DCD42A"/>
-    <w:lvl w:ilvl="0" w:tplc="D8EA1814">
+    <w:tmpl w:val="D6E47EE6"/>
+    <w:lvl w:ilvl="0" w:tplc="ADECD0A8">
       <w:start w:val="1"/>
       <w:numFmt w:val="decimal"/>
       <w:lvlText w:val="%1."/>
@@ -23856,138 +24000,52 @@
         <w:color w:val="A67C27"/>
       </w:rPr>
     </w:lvl>
-    <w:lvl w:ilvl="1" w:tplc="1ABE7434">
+    <w:lvl w:ilvl="1" w:tplc="37BC8F72">
       <w:numFmt w:val="decimal"/>
       <w:lvlText w:val=""/>
       <w:lvlJc w:val="left"/>
     </w:lvl>
-    <w:lvl w:ilvl="2" w:tplc="7E38ACE2">
+    <w:lvl w:ilvl="2" w:tplc="A01A8D5E">
       <w:numFmt w:val="decimal"/>
       <w:lvlText w:val=""/>
       <w:lvlJc w:val="left"/>
     </w:lvl>
-    <w:lvl w:ilvl="3" w:tplc="E0D0112A">
+    <w:lvl w:ilvl="3" w:tplc="C7964060">
       <w:numFmt w:val="decimal"/>
       <w:lvlText w:val=""/>
       <w:lvlJc w:val="left"/>
     </w:lvl>
-    <w:lvl w:ilvl="4" w:tplc="D514EDBE">
+    <w:lvl w:ilvl="4" w:tplc="1D34A042">
       <w:numFmt w:val="decimal"/>
       <w:lvlText w:val=""/>
       <w:lvlJc w:val="left"/>
     </w:lvl>
-    <w:lvl w:ilvl="5" w:tplc="43FA4A82">
+    <w:lvl w:ilvl="5" w:tplc="86644E7A">
       <w:numFmt w:val="decimal"/>
       <w:lvlText w:val=""/>
       <w:lvlJc w:val="left"/>
     </w:lvl>
-    <w:lvl w:ilvl="6" w:tplc="BF2A581E">
+    <w:lvl w:ilvl="6" w:tplc="F06CE11E">
       <w:numFmt w:val="decimal"/>
       <w:lvlText w:val=""/>
       <w:lvlJc w:val="left"/>
     </w:lvl>
-    <w:lvl w:ilvl="7" w:tplc="12940172">
+    <w:lvl w:ilvl="7" w:tplc="E0884BB2">
       <w:numFmt w:val="decimal"/>
       <w:lvlText w:val=""/>
       <w:lvlJc w:val="left"/>
     </w:lvl>
-    <w:lvl w:ilvl="8" w:tplc="C7AEF960">
+    <w:lvl w:ilvl="8" w:tplc="3BA82E96">
       <w:numFmt w:val="decimal"/>
       <w:lvlText w:val=""/>
       <w:lvlJc w:val="left"/>
     </w:lvl>
   </w:abstractNum>
-  <w:abstractNum w:abstractNumId="11" w15:restartNumberingAfterBreak="0">
-    <w:nsid w:val="48CF638E"/>
+  <w:abstractNum w:abstractNumId="13" w15:restartNumberingAfterBreak="0">
+    <w:nsid w:val="37D82366"/>
     <w:multiLevelType w:val="hybridMultilevel"/>
-    <w:tmpl w:val="24CCED9A"/>
-    <w:lvl w:ilvl="0" w:tplc="EBE07A6A">
-      <w:start w:val="1"/>
-      <w:numFmt w:val="bullet"/>
-      <w:lvlText w:val="●"/>
-      <w:lvlJc w:val="left"/>
-      <w:pPr>
-        <w:ind w:left="720" w:hanging="360"/>
-      </w:pPr>
-    </w:lvl>
-    <w:lvl w:ilvl="1" w:tplc="D576AEBC">
-      <w:start w:val="1"/>
-      <w:numFmt w:val="bullet"/>
-      <w:lvlText w:val="○"/>
-      <w:lvlJc w:val="left"/>
-      <w:pPr>
-        <w:ind w:left="1440" w:hanging="360"/>
-      </w:pPr>
-    </w:lvl>
-    <w:lvl w:ilvl="2" w:tplc="10B2E746">
-      <w:start w:val="1"/>
-      <w:numFmt w:val="bullet"/>
-      <w:lvlText w:val="■"/>
-      <w:lvlJc w:val="left"/>
-      <w:pPr>
-        <w:ind w:left="2160" w:hanging="360"/>
-      </w:pPr>
-    </w:lvl>
-    <w:lvl w:ilvl="3" w:tplc="EF84443E">
-      <w:start w:val="1"/>
-      <w:numFmt w:val="bullet"/>
-      <w:lvlText w:val="●"/>
-      <w:lvlJc w:val="left"/>
-      <w:pPr>
-        <w:ind w:left="2880" w:hanging="360"/>
-      </w:pPr>
-    </w:lvl>
-    <w:lvl w:ilvl="4" w:tplc="62FE3FE4">
-      <w:start w:val="1"/>
-      <w:numFmt w:val="bullet"/>
-      <w:lvlText w:val="○"/>
-      <w:lvlJc w:val="left"/>
-      <w:pPr>
-        <w:ind w:left="3600" w:hanging="360"/>
-      </w:pPr>
-    </w:lvl>
-    <w:lvl w:ilvl="5" w:tplc="8B6C2660">
-      <w:start w:val="1"/>
-      <w:numFmt w:val="bullet"/>
-      <w:lvlText w:val="■"/>
-      <w:lvlJc w:val="left"/>
-      <w:pPr>
-        <w:ind w:left="4320" w:hanging="360"/>
-      </w:pPr>
-    </w:lvl>
-    <w:lvl w:ilvl="6" w:tplc="90B63C44">
-      <w:start w:val="1"/>
-      <w:numFmt w:val="bullet"/>
-      <w:lvlText w:val="●"/>
-      <w:lvlJc w:val="left"/>
-      <w:pPr>
-        <w:ind w:left="5040" w:hanging="360"/>
-      </w:pPr>
-    </w:lvl>
-    <w:lvl w:ilvl="7" w:tplc="5EF08E60">
-      <w:start w:val="1"/>
-      <w:numFmt w:val="bullet"/>
-      <w:lvlText w:val="●"/>
-      <w:lvlJc w:val="left"/>
-      <w:pPr>
-        <w:ind w:left="5760" w:hanging="360"/>
-      </w:pPr>
-    </w:lvl>
-    <w:lvl w:ilvl="8" w:tplc="5FC6ACF4">
-      <w:start w:val="1"/>
-      <w:numFmt w:val="bullet"/>
-      <w:lvlText w:val="●"/>
-      <w:lvlJc w:val="left"/>
-      <w:pPr>
-        <w:ind w:left="6480" w:hanging="360"/>
-      </w:pPr>
-    </w:lvl>
-  </w:abstractNum>
-  <w:abstractNum w:abstractNumId="12" w15:restartNumberingAfterBreak="0">
-    <w:nsid w:val="4ECD5127"/>
-    <w:multiLevelType w:val="hybridMultilevel"/>
-    <w:tmpl w:val="257EB836"/>
-    <w:lvl w:ilvl="0" w:tplc="6C9276B0">
+    <w:tmpl w:val="5C22F14C"/>
+    <w:lvl w:ilvl="0" w:tplc="7EC48330">
       <w:start w:val="1"/>
       <w:numFmt w:val="decimal"/>
       <w:lvlText w:val="%1."/>
@@ -24001,52 +24059,52 @@
         <w:color w:val="A67C27"/>
       </w:rPr>
     </w:lvl>
-    <w:lvl w:ilvl="1" w:tplc="A4E0BA42">
+    <w:lvl w:ilvl="1" w:tplc="26A4BE64">
       <w:numFmt w:val="decimal"/>
       <w:lvlText w:val=""/>
       <w:lvlJc w:val="left"/>
     </w:lvl>
-    <w:lvl w:ilvl="2" w:tplc="F1CEF01C">
+    <w:lvl w:ilvl="2" w:tplc="7856E0C8">
       <w:numFmt w:val="decimal"/>
       <w:lvlText w:val=""/>
       <w:lvlJc w:val="left"/>
     </w:lvl>
-    <w:lvl w:ilvl="3" w:tplc="1C4E5268">
+    <w:lvl w:ilvl="3" w:tplc="F0DE2A44">
       <w:numFmt w:val="decimal"/>
       <w:lvlText w:val=""/>
       <w:lvlJc w:val="left"/>
     </w:lvl>
-    <w:lvl w:ilvl="4" w:tplc="D7568FB0">
+    <w:lvl w:ilvl="4" w:tplc="E7C2A6C0">
       <w:numFmt w:val="decimal"/>
       <w:lvlText w:val=""/>
       <w:lvlJc w:val="left"/>
     </w:lvl>
-    <w:lvl w:ilvl="5" w:tplc="EC529F0A">
+    <w:lvl w:ilvl="5" w:tplc="B936FE40">
       <w:numFmt w:val="decimal"/>
       <w:lvlText w:val=""/>
       <w:lvlJc w:val="left"/>
     </w:lvl>
-    <w:lvl w:ilvl="6" w:tplc="D38E8B58">
+    <w:lvl w:ilvl="6" w:tplc="862A8CBA">
       <w:numFmt w:val="decimal"/>
       <w:lvlText w:val=""/>
       <w:lvlJc w:val="left"/>
     </w:lvl>
-    <w:lvl w:ilvl="7" w:tplc="3A120D9C">
+    <w:lvl w:ilvl="7" w:tplc="411E8822">
       <w:numFmt w:val="decimal"/>
       <w:lvlText w:val=""/>
       <w:lvlJc w:val="left"/>
     </w:lvl>
-    <w:lvl w:ilvl="8" w:tplc="7E586394">
+    <w:lvl w:ilvl="8" w:tplc="E64C7D3E">
       <w:numFmt w:val="decimal"/>
       <w:lvlText w:val=""/>
       <w:lvlJc w:val="left"/>
     </w:lvl>
   </w:abstractNum>
-  <w:abstractNum w:abstractNumId="13" w15:restartNumberingAfterBreak="0">
-    <w:nsid w:val="51836288"/>
+  <w:abstractNum w:abstractNumId="14" w15:restartNumberingAfterBreak="0">
+    <w:nsid w:val="3A9E01B4"/>
     <w:multiLevelType w:val="hybridMultilevel"/>
-    <w:tmpl w:val="AADADD84"/>
-    <w:lvl w:ilvl="0" w:tplc="CDF60622">
+    <w:tmpl w:val="1A3AA344"/>
+    <w:lvl w:ilvl="0" w:tplc="FD54092E">
       <w:start w:val="1"/>
       <w:numFmt w:val="decimal"/>
       <w:lvlText w:val="%1."/>
@@ -24060,52 +24118,52 @@
         <w:color w:val="A67C27"/>
       </w:rPr>
     </w:lvl>
-    <w:lvl w:ilvl="1" w:tplc="AD7ABDD4">
+    <w:lvl w:ilvl="1" w:tplc="734821BA">
       <w:numFmt w:val="decimal"/>
       <w:lvlText w:val=""/>
       <w:lvlJc w:val="left"/>
     </w:lvl>
-    <w:lvl w:ilvl="2" w:tplc="F5B47ECC">
+    <w:lvl w:ilvl="2" w:tplc="1DFA6C36">
       <w:numFmt w:val="decimal"/>
       <w:lvlText w:val=""/>
       <w:lvlJc w:val="left"/>
     </w:lvl>
-    <w:lvl w:ilvl="3" w:tplc="DD64F2C2">
+    <w:lvl w:ilvl="3" w:tplc="F34C4DC0">
       <w:numFmt w:val="decimal"/>
       <w:lvlText w:val=""/>
       <w:lvlJc w:val="left"/>
     </w:lvl>
-    <w:lvl w:ilvl="4" w:tplc="A308080E">
+    <w:lvl w:ilvl="4" w:tplc="0C94D214">
       <w:numFmt w:val="decimal"/>
       <w:lvlText w:val=""/>
       <w:lvlJc w:val="left"/>
     </w:lvl>
-    <w:lvl w:ilvl="5" w:tplc="4DE49708">
+    <w:lvl w:ilvl="5" w:tplc="E7567F62">
       <w:numFmt w:val="decimal"/>
       <w:lvlText w:val=""/>
       <w:lvlJc w:val="left"/>
     </w:lvl>
-    <w:lvl w:ilvl="6" w:tplc="73A4CCA8">
+    <w:lvl w:ilvl="6" w:tplc="59347A90">
       <w:numFmt w:val="decimal"/>
       <w:lvlText w:val=""/>
       <w:lvlJc w:val="left"/>
     </w:lvl>
-    <w:lvl w:ilvl="7" w:tplc="0504AAE8">
+    <w:lvl w:ilvl="7" w:tplc="4D148EF2">
       <w:numFmt w:val="decimal"/>
       <w:lvlText w:val=""/>
       <w:lvlJc w:val="left"/>
     </w:lvl>
-    <w:lvl w:ilvl="8" w:tplc="38E881C6">
+    <w:lvl w:ilvl="8" w:tplc="806E8E7E">
       <w:numFmt w:val="decimal"/>
       <w:lvlText w:val=""/>
       <w:lvlJc w:val="left"/>
     </w:lvl>
   </w:abstractNum>
-  <w:abstractNum w:abstractNumId="14" w15:restartNumberingAfterBreak="0">
-    <w:nsid w:val="591A117A"/>
+  <w:abstractNum w:abstractNumId="15" w15:restartNumberingAfterBreak="0">
+    <w:nsid w:val="49964A95"/>
     <w:multiLevelType w:val="hybridMultilevel"/>
-    <w:tmpl w:val="728843DA"/>
-    <w:lvl w:ilvl="0" w:tplc="88E0878A">
+    <w:tmpl w:val="FD4AAB1E"/>
+    <w:lvl w:ilvl="0" w:tplc="2034F19E">
       <w:start w:val="1"/>
       <w:numFmt w:val="decimal"/>
       <w:lvlText w:val="%1."/>
@@ -24119,52 +24177,52 @@
         <w:color w:val="A67C27"/>
       </w:rPr>
     </w:lvl>
-    <w:lvl w:ilvl="1" w:tplc="2FC2A7B0">
+    <w:lvl w:ilvl="1" w:tplc="05640C64">
       <w:numFmt w:val="decimal"/>
       <w:lvlText w:val=""/>
       <w:lvlJc w:val="left"/>
     </w:lvl>
-    <w:lvl w:ilvl="2" w:tplc="7CE835EC">
+    <w:lvl w:ilvl="2" w:tplc="BFBC3B50">
       <w:numFmt w:val="decimal"/>
       <w:lvlText w:val=""/>
       <w:lvlJc w:val="left"/>
     </w:lvl>
-    <w:lvl w:ilvl="3" w:tplc="174C0300">
+    <w:lvl w:ilvl="3" w:tplc="D5748194">
       <w:numFmt w:val="decimal"/>
       <w:lvlText w:val=""/>
       <w:lvlJc w:val="left"/>
     </w:lvl>
-    <w:lvl w:ilvl="4" w:tplc="7CFC60F4">
+    <w:lvl w:ilvl="4" w:tplc="9810083E">
       <w:numFmt w:val="decimal"/>
       <w:lvlText w:val=""/>
       <w:lvlJc w:val="left"/>
     </w:lvl>
-    <w:lvl w:ilvl="5" w:tplc="F7F29E64">
+    <w:lvl w:ilvl="5" w:tplc="70723C5C">
       <w:numFmt w:val="decimal"/>
       <w:lvlText w:val=""/>
       <w:lvlJc w:val="left"/>
     </w:lvl>
-    <w:lvl w:ilvl="6" w:tplc="E4EA6B14">
+    <w:lvl w:ilvl="6" w:tplc="FFE6C772">
       <w:numFmt w:val="decimal"/>
       <w:lvlText w:val=""/>
       <w:lvlJc w:val="left"/>
     </w:lvl>
-    <w:lvl w:ilvl="7" w:tplc="534043D0">
+    <w:lvl w:ilvl="7" w:tplc="D91A3BDC">
       <w:numFmt w:val="decimal"/>
       <w:lvlText w:val=""/>
       <w:lvlJc w:val="left"/>
     </w:lvl>
-    <w:lvl w:ilvl="8" w:tplc="CED44EFE">
+    <w:lvl w:ilvl="8" w:tplc="D75CA700">
       <w:numFmt w:val="decimal"/>
       <w:lvlText w:val=""/>
       <w:lvlJc w:val="left"/>
     </w:lvl>
   </w:abstractNum>
-  <w:abstractNum w:abstractNumId="15" w15:restartNumberingAfterBreak="0">
-    <w:nsid w:val="5C573A1A"/>
+  <w:abstractNum w:abstractNumId="16" w15:restartNumberingAfterBreak="0">
+    <w:nsid w:val="4CE66A62"/>
     <w:multiLevelType w:val="hybridMultilevel"/>
-    <w:tmpl w:val="77103374"/>
-    <w:lvl w:ilvl="0" w:tplc="5E8EDF10">
+    <w:tmpl w:val="E51E75EA"/>
+    <w:lvl w:ilvl="0" w:tplc="2D22C69A">
       <w:start w:val="1"/>
       <w:numFmt w:val="decimal"/>
       <w:lvlText w:val="%1."/>
@@ -24178,52 +24236,52 @@
         <w:color w:val="A67C27"/>
       </w:rPr>
     </w:lvl>
-    <w:lvl w:ilvl="1" w:tplc="0D1653A6">
+    <w:lvl w:ilvl="1" w:tplc="B03A498E">
       <w:numFmt w:val="decimal"/>
       <w:lvlText w:val=""/>
       <w:lvlJc w:val="left"/>
     </w:lvl>
-    <w:lvl w:ilvl="2" w:tplc="5FE40CE2">
+    <w:lvl w:ilvl="2" w:tplc="19FE8E7A">
       <w:numFmt w:val="decimal"/>
       <w:lvlText w:val=""/>
       <w:lvlJc w:val="left"/>
     </w:lvl>
-    <w:lvl w:ilvl="3" w:tplc="852A09E4">
+    <w:lvl w:ilvl="3" w:tplc="5344E152">
       <w:numFmt w:val="decimal"/>
       <w:lvlText w:val=""/>
       <w:lvlJc w:val="left"/>
     </w:lvl>
-    <w:lvl w:ilvl="4" w:tplc="C4162DC0">
+    <w:lvl w:ilvl="4" w:tplc="B5ECBE54">
       <w:numFmt w:val="decimal"/>
       <w:lvlText w:val=""/>
       <w:lvlJc w:val="left"/>
     </w:lvl>
-    <w:lvl w:ilvl="5" w:tplc="64848528">
+    <w:lvl w:ilvl="5" w:tplc="4EF0B918">
       <w:numFmt w:val="decimal"/>
       <w:lvlText w:val=""/>
       <w:lvlJc w:val="left"/>
     </w:lvl>
-    <w:lvl w:ilvl="6" w:tplc="E30A8EA2">
+    <w:lvl w:ilvl="6" w:tplc="64C8E2CA">
       <w:numFmt w:val="decimal"/>
       <w:lvlText w:val=""/>
       <w:lvlJc w:val="left"/>
     </w:lvl>
-    <w:lvl w:ilvl="7" w:tplc="88C09E9A">
+    <w:lvl w:ilvl="7" w:tplc="0888ACCC">
       <w:numFmt w:val="decimal"/>
       <w:lvlText w:val=""/>
       <w:lvlJc w:val="left"/>
     </w:lvl>
-    <w:lvl w:ilvl="8" w:tplc="21E00CC6">
+    <w:lvl w:ilvl="8" w:tplc="7AE055F2">
       <w:numFmt w:val="decimal"/>
       <w:lvlText w:val=""/>
       <w:lvlJc w:val="left"/>
     </w:lvl>
   </w:abstractNum>
-  <w:abstractNum w:abstractNumId="16" w15:restartNumberingAfterBreak="0">
-    <w:nsid w:val="5DCC18FF"/>
+  <w:abstractNum w:abstractNumId="17" w15:restartNumberingAfterBreak="0">
+    <w:nsid w:val="4EAE2B2E"/>
     <w:multiLevelType w:val="hybridMultilevel"/>
-    <w:tmpl w:val="2BFA8614"/>
-    <w:lvl w:ilvl="0" w:tplc="4E685D04">
+    <w:tmpl w:val="8124D818"/>
+    <w:lvl w:ilvl="0" w:tplc="D4068B0E">
       <w:start w:val="1"/>
       <w:numFmt w:val="decimal"/>
       <w:lvlText w:val="%1."/>
@@ -24237,52 +24295,52 @@
         <w:color w:val="A67C27"/>
       </w:rPr>
     </w:lvl>
-    <w:lvl w:ilvl="1" w:tplc="B8D4429A">
+    <w:lvl w:ilvl="1" w:tplc="2A06A0F0">
       <w:numFmt w:val="decimal"/>
       <w:lvlText w:val=""/>
       <w:lvlJc w:val="left"/>
     </w:lvl>
-    <w:lvl w:ilvl="2" w:tplc="7EFCF606">
+    <w:lvl w:ilvl="2" w:tplc="A68A651A">
       <w:numFmt w:val="decimal"/>
       <w:lvlText w:val=""/>
       <w:lvlJc w:val="left"/>
     </w:lvl>
-    <w:lvl w:ilvl="3" w:tplc="C5887E3E">
+    <w:lvl w:ilvl="3" w:tplc="F880FC98">
       <w:numFmt w:val="decimal"/>
       <w:lvlText w:val=""/>
       <w:lvlJc w:val="left"/>
     </w:lvl>
-    <w:lvl w:ilvl="4" w:tplc="9EA82DA0">
+    <w:lvl w:ilvl="4" w:tplc="1BC26B04">
       <w:numFmt w:val="decimal"/>
       <w:lvlText w:val=""/>
       <w:lvlJc w:val="left"/>
     </w:lvl>
-    <w:lvl w:ilvl="5" w:tplc="997CC184">
+    <w:lvl w:ilvl="5" w:tplc="F5E4B878">
       <w:numFmt w:val="decimal"/>
       <w:lvlText w:val=""/>
       <w:lvlJc w:val="left"/>
     </w:lvl>
-    <w:lvl w:ilvl="6" w:tplc="A166368A">
+    <w:lvl w:ilvl="6" w:tplc="54B62C5E">
       <w:numFmt w:val="decimal"/>
       <w:lvlText w:val=""/>
       <w:lvlJc w:val="left"/>
     </w:lvl>
-    <w:lvl w:ilvl="7" w:tplc="CBCC0192">
+    <w:lvl w:ilvl="7" w:tplc="774034EC">
       <w:numFmt w:val="decimal"/>
       <w:lvlText w:val=""/>
       <w:lvlJc w:val="left"/>
     </w:lvl>
-    <w:lvl w:ilvl="8" w:tplc="9B86E1C0">
+    <w:lvl w:ilvl="8" w:tplc="B316CA6C">
       <w:numFmt w:val="decimal"/>
       <w:lvlText w:val=""/>
       <w:lvlJc w:val="left"/>
     </w:lvl>
   </w:abstractNum>
-  <w:abstractNum w:abstractNumId="17" w15:restartNumberingAfterBreak="0">
-    <w:nsid w:val="5F574820"/>
+  <w:abstractNum w:abstractNumId="18" w15:restartNumberingAfterBreak="0">
+    <w:nsid w:val="50E65CFA"/>
     <w:multiLevelType w:val="hybridMultilevel"/>
-    <w:tmpl w:val="8F425FBA"/>
-    <w:lvl w:ilvl="0" w:tplc="DB2CAE96">
+    <w:tmpl w:val="631E0B14"/>
+    <w:lvl w:ilvl="0" w:tplc="45EE4650">
       <w:start w:val="1"/>
       <w:numFmt w:val="decimal"/>
       <w:lvlText w:val="%1."/>
@@ -24296,52 +24354,52 @@
         <w:color w:val="A67C27"/>
       </w:rPr>
     </w:lvl>
-    <w:lvl w:ilvl="1" w:tplc="31F4AD6A">
+    <w:lvl w:ilvl="1" w:tplc="CAE2C8D4">
       <w:numFmt w:val="decimal"/>
       <w:lvlText w:val=""/>
       <w:lvlJc w:val="left"/>
     </w:lvl>
-    <w:lvl w:ilvl="2" w:tplc="6B287DB8">
+    <w:lvl w:ilvl="2" w:tplc="1B1C607A">
       <w:numFmt w:val="decimal"/>
       <w:lvlText w:val=""/>
       <w:lvlJc w:val="left"/>
     </w:lvl>
-    <w:lvl w:ilvl="3" w:tplc="A08207D2">
+    <w:lvl w:ilvl="3" w:tplc="84B0F1CE">
       <w:numFmt w:val="decimal"/>
       <w:lvlText w:val=""/>
       <w:lvlJc w:val="left"/>
     </w:lvl>
-    <w:lvl w:ilvl="4" w:tplc="41283134">
+    <w:lvl w:ilvl="4" w:tplc="135C17BE">
       <w:numFmt w:val="decimal"/>
       <w:lvlText w:val=""/>
       <w:lvlJc w:val="left"/>
     </w:lvl>
-    <w:lvl w:ilvl="5" w:tplc="F9FC0036">
+    <w:lvl w:ilvl="5" w:tplc="275405D8">
       <w:numFmt w:val="decimal"/>
       <w:lvlText w:val=""/>
       <w:lvlJc w:val="left"/>
     </w:lvl>
-    <w:lvl w:ilvl="6" w:tplc="87ECD354">
+    <w:lvl w:ilvl="6" w:tplc="70DE7CEC">
       <w:numFmt w:val="decimal"/>
       <w:lvlText w:val=""/>
       <w:lvlJc w:val="left"/>
     </w:lvl>
-    <w:lvl w:ilvl="7" w:tplc="FB28C604">
+    <w:lvl w:ilvl="7" w:tplc="07689866">
       <w:numFmt w:val="decimal"/>
       <w:lvlText w:val=""/>
       <w:lvlJc w:val="left"/>
     </w:lvl>
-    <w:lvl w:ilvl="8" w:tplc="FF4A408A">
+    <w:lvl w:ilvl="8" w:tplc="20302866">
       <w:numFmt w:val="decimal"/>
       <w:lvlText w:val=""/>
       <w:lvlJc w:val="left"/>
     </w:lvl>
   </w:abstractNum>
-  <w:abstractNum w:abstractNumId="18" w15:restartNumberingAfterBreak="0">
-    <w:nsid w:val="61F70A38"/>
+  <w:abstractNum w:abstractNumId="19" w15:restartNumberingAfterBreak="0">
+    <w:nsid w:val="54307C14"/>
     <w:multiLevelType w:val="hybridMultilevel"/>
-    <w:tmpl w:val="63ECD668"/>
-    <w:lvl w:ilvl="0" w:tplc="F0CEA46E">
+    <w:tmpl w:val="B26EB76E"/>
+    <w:lvl w:ilvl="0" w:tplc="B082F8D4">
       <w:start w:val="1"/>
       <w:numFmt w:val="decimal"/>
       <w:lvlText w:val="%1."/>
@@ -24355,52 +24413,52 @@
         <w:color w:val="A67C27"/>
       </w:rPr>
     </w:lvl>
-    <w:lvl w:ilvl="1" w:tplc="ABEE7128">
+    <w:lvl w:ilvl="1" w:tplc="7E62E93E">
       <w:numFmt w:val="decimal"/>
       <w:lvlText w:val=""/>
       <w:lvlJc w:val="left"/>
     </w:lvl>
-    <w:lvl w:ilvl="2" w:tplc="A5B494B2">
+    <w:lvl w:ilvl="2" w:tplc="A718EF96">
       <w:numFmt w:val="decimal"/>
       <w:lvlText w:val=""/>
       <w:lvlJc w:val="left"/>
     </w:lvl>
-    <w:lvl w:ilvl="3" w:tplc="F18AD8E6">
+    <w:lvl w:ilvl="3" w:tplc="14F43FA2">
       <w:numFmt w:val="decimal"/>
       <w:lvlText w:val=""/>
       <w:lvlJc w:val="left"/>
     </w:lvl>
-    <w:lvl w:ilvl="4" w:tplc="AE2E9892">
+    <w:lvl w:ilvl="4" w:tplc="BA747DC2">
       <w:numFmt w:val="decimal"/>
       <w:lvlText w:val=""/>
       <w:lvlJc w:val="left"/>
     </w:lvl>
-    <w:lvl w:ilvl="5" w:tplc="8732127E">
+    <w:lvl w:ilvl="5" w:tplc="F8DEFBC8">
       <w:numFmt w:val="decimal"/>
       <w:lvlText w:val=""/>
       <w:lvlJc w:val="left"/>
     </w:lvl>
-    <w:lvl w:ilvl="6" w:tplc="BCA83406">
+    <w:lvl w:ilvl="6" w:tplc="CA86F0B2">
       <w:numFmt w:val="decimal"/>
       <w:lvlText w:val=""/>
       <w:lvlJc w:val="left"/>
     </w:lvl>
-    <w:lvl w:ilvl="7" w:tplc="164239B0">
+    <w:lvl w:ilvl="7" w:tplc="74D81E8A">
       <w:numFmt w:val="decimal"/>
       <w:lvlText w:val=""/>
       <w:lvlJc w:val="left"/>
     </w:lvl>
-    <w:lvl w:ilvl="8" w:tplc="851AD22C">
+    <w:lvl w:ilvl="8" w:tplc="079058AA">
       <w:numFmt w:val="decimal"/>
       <w:lvlText w:val=""/>
       <w:lvlJc w:val="left"/>
     </w:lvl>
   </w:abstractNum>
-  <w:abstractNum w:abstractNumId="19" w15:restartNumberingAfterBreak="0">
-    <w:nsid w:val="62B04813"/>
+  <w:abstractNum w:abstractNumId="20" w15:restartNumberingAfterBreak="0">
+    <w:nsid w:val="56A52EF1"/>
     <w:multiLevelType w:val="hybridMultilevel"/>
-    <w:tmpl w:val="A1AE030C"/>
-    <w:lvl w:ilvl="0" w:tplc="2C5622D2">
+    <w:tmpl w:val="04EE78D2"/>
+    <w:lvl w:ilvl="0" w:tplc="92069E80">
       <w:start w:val="1"/>
       <w:numFmt w:val="decimal"/>
       <w:lvlText w:val="%1."/>
@@ -24414,52 +24472,52 @@
         <w:color w:val="A67C27"/>
       </w:rPr>
     </w:lvl>
-    <w:lvl w:ilvl="1" w:tplc="1FCADE46">
+    <w:lvl w:ilvl="1" w:tplc="2B78DF7C">
       <w:numFmt w:val="decimal"/>
       <w:lvlText w:val=""/>
       <w:lvlJc w:val="left"/>
     </w:lvl>
-    <w:lvl w:ilvl="2" w:tplc="D4985DEA">
+    <w:lvl w:ilvl="2" w:tplc="27763028">
       <w:numFmt w:val="decimal"/>
       <w:lvlText w:val=""/>
       <w:lvlJc w:val="left"/>
     </w:lvl>
-    <w:lvl w:ilvl="3" w:tplc="5A1C3CEC">
+    <w:lvl w:ilvl="3" w:tplc="CFA21348">
       <w:numFmt w:val="decimal"/>
       <w:lvlText w:val=""/>
       <w:lvlJc w:val="left"/>
     </w:lvl>
-    <w:lvl w:ilvl="4" w:tplc="9F90E4DE">
+    <w:lvl w:ilvl="4" w:tplc="2A66D804">
       <w:numFmt w:val="decimal"/>
       <w:lvlText w:val=""/>
       <w:lvlJc w:val="left"/>
     </w:lvl>
-    <w:lvl w:ilvl="5" w:tplc="A1585352">
+    <w:lvl w:ilvl="5" w:tplc="95CADCF8">
       <w:numFmt w:val="decimal"/>
       <w:lvlText w:val=""/>
       <w:lvlJc w:val="left"/>
     </w:lvl>
-    <w:lvl w:ilvl="6" w:tplc="F2E4D532">
+    <w:lvl w:ilvl="6" w:tplc="92C86B5C">
       <w:numFmt w:val="decimal"/>
       <w:lvlText w:val=""/>
       <w:lvlJc w:val="left"/>
     </w:lvl>
-    <w:lvl w:ilvl="7" w:tplc="93768DE0">
+    <w:lvl w:ilvl="7" w:tplc="16B6A67E">
       <w:numFmt w:val="decimal"/>
       <w:lvlText w:val=""/>
       <w:lvlJc w:val="left"/>
     </w:lvl>
-    <w:lvl w:ilvl="8" w:tplc="6A2ECBE0">
+    <w:lvl w:ilvl="8" w:tplc="D002737A">
       <w:numFmt w:val="decimal"/>
       <w:lvlText w:val=""/>
       <w:lvlJc w:val="left"/>
     </w:lvl>
   </w:abstractNum>
-  <w:abstractNum w:abstractNumId="20" w15:restartNumberingAfterBreak="0">
-    <w:nsid w:val="636F5850"/>
+  <w:abstractNum w:abstractNumId="21" w15:restartNumberingAfterBreak="0">
+    <w:nsid w:val="5E3D17EE"/>
     <w:multiLevelType w:val="hybridMultilevel"/>
-    <w:tmpl w:val="900697B2"/>
-    <w:lvl w:ilvl="0" w:tplc="28A6AFDA">
+    <w:tmpl w:val="6F185B9A"/>
+    <w:lvl w:ilvl="0" w:tplc="B87283D2">
       <w:start w:val="1"/>
       <w:numFmt w:val="decimal"/>
       <w:lvlText w:val="%1."/>
@@ -24473,52 +24531,52 @@
         <w:color w:val="A67C27"/>
       </w:rPr>
     </w:lvl>
-    <w:lvl w:ilvl="1" w:tplc="DE0AB8AC">
+    <w:lvl w:ilvl="1" w:tplc="A0E04458">
       <w:numFmt w:val="decimal"/>
       <w:lvlText w:val=""/>
       <w:lvlJc w:val="left"/>
     </w:lvl>
-    <w:lvl w:ilvl="2" w:tplc="41F24414">
+    <w:lvl w:ilvl="2" w:tplc="531CE948">
       <w:numFmt w:val="decimal"/>
       <w:lvlText w:val=""/>
       <w:lvlJc w:val="left"/>
     </w:lvl>
-    <w:lvl w:ilvl="3" w:tplc="3F08870E">
+    <w:lvl w:ilvl="3" w:tplc="16201D04">
       <w:numFmt w:val="decimal"/>
       <w:lvlText w:val=""/>
       <w:lvlJc w:val="left"/>
     </w:lvl>
-    <w:lvl w:ilvl="4" w:tplc="CCF0AF9C">
+    <w:lvl w:ilvl="4" w:tplc="8884A1B2">
       <w:numFmt w:val="decimal"/>
       <w:lvlText w:val=""/>
       <w:lvlJc w:val="left"/>
     </w:lvl>
-    <w:lvl w:ilvl="5" w:tplc="948C3FC6">
+    <w:lvl w:ilvl="5" w:tplc="AD507544">
       <w:numFmt w:val="decimal"/>
       <w:lvlText w:val=""/>
       <w:lvlJc w:val="left"/>
     </w:lvl>
-    <w:lvl w:ilvl="6" w:tplc="11E4BE14">
+    <w:lvl w:ilvl="6" w:tplc="52BEBD92">
       <w:numFmt w:val="decimal"/>
       <w:lvlText w:val=""/>
       <w:lvlJc w:val="left"/>
     </w:lvl>
-    <w:lvl w:ilvl="7" w:tplc="967C8C94">
+    <w:lvl w:ilvl="7" w:tplc="FB881980">
       <w:numFmt w:val="decimal"/>
       <w:lvlText w:val=""/>
       <w:lvlJc w:val="left"/>
     </w:lvl>
-    <w:lvl w:ilvl="8" w:tplc="6B064444">
+    <w:lvl w:ilvl="8" w:tplc="A7F87098">
       <w:numFmt w:val="decimal"/>
       <w:lvlText w:val=""/>
       <w:lvlJc w:val="left"/>
     </w:lvl>
   </w:abstractNum>
-  <w:abstractNum w:abstractNumId="21" w15:restartNumberingAfterBreak="0">
-    <w:nsid w:val="64030A6A"/>
+  <w:abstractNum w:abstractNumId="22" w15:restartNumberingAfterBreak="0">
+    <w:nsid w:val="5E466257"/>
     <w:multiLevelType w:val="hybridMultilevel"/>
-    <w:tmpl w:val="53E29232"/>
-    <w:lvl w:ilvl="0" w:tplc="EB2A4B5E">
+    <w:tmpl w:val="CF8CEA46"/>
+    <w:lvl w:ilvl="0" w:tplc="29BA4C2E">
       <w:start w:val="1"/>
       <w:numFmt w:val="decimal"/>
       <w:lvlText w:val="%1."/>
@@ -24532,52 +24590,52 @@
         <w:color w:val="A67C27"/>
       </w:rPr>
     </w:lvl>
-    <w:lvl w:ilvl="1" w:tplc="EDDEDB9C">
+    <w:lvl w:ilvl="1" w:tplc="E118F392">
       <w:numFmt w:val="decimal"/>
       <w:lvlText w:val=""/>
       <w:lvlJc w:val="left"/>
     </w:lvl>
-    <w:lvl w:ilvl="2" w:tplc="AC969FBA">
+    <w:lvl w:ilvl="2" w:tplc="E98C2364">
       <w:numFmt w:val="decimal"/>
       <w:lvlText w:val=""/>
       <w:lvlJc w:val="left"/>
     </w:lvl>
-    <w:lvl w:ilvl="3" w:tplc="120EF26C">
+    <w:lvl w:ilvl="3" w:tplc="0CCAE8FA">
       <w:numFmt w:val="decimal"/>
       <w:lvlText w:val=""/>
       <w:lvlJc w:val="left"/>
     </w:lvl>
-    <w:lvl w:ilvl="4" w:tplc="AE0A4CF8">
+    <w:lvl w:ilvl="4" w:tplc="70C6EDF2">
       <w:numFmt w:val="decimal"/>
       <w:lvlText w:val=""/>
       <w:lvlJc w:val="left"/>
     </w:lvl>
-    <w:lvl w:ilvl="5" w:tplc="5ECAFA40">
+    <w:lvl w:ilvl="5" w:tplc="F9F0127E">
       <w:numFmt w:val="decimal"/>
       <w:lvlText w:val=""/>
       <w:lvlJc w:val="left"/>
     </w:lvl>
-    <w:lvl w:ilvl="6" w:tplc="203E3052">
+    <w:lvl w:ilvl="6" w:tplc="EAE85A66">
       <w:numFmt w:val="decimal"/>
       <w:lvlText w:val=""/>
       <w:lvlJc w:val="left"/>
     </w:lvl>
-    <w:lvl w:ilvl="7" w:tplc="22D49D68">
+    <w:lvl w:ilvl="7" w:tplc="4F5CD39C">
       <w:numFmt w:val="decimal"/>
       <w:lvlText w:val=""/>
       <w:lvlJc w:val="left"/>
     </w:lvl>
-    <w:lvl w:ilvl="8" w:tplc="2AF8DEEC">
+    <w:lvl w:ilvl="8" w:tplc="97946F00">
       <w:numFmt w:val="decimal"/>
       <w:lvlText w:val=""/>
       <w:lvlJc w:val="left"/>
     </w:lvl>
   </w:abstractNum>
-  <w:abstractNum w:abstractNumId="22" w15:restartNumberingAfterBreak="0">
-    <w:nsid w:val="64B002C8"/>
+  <w:abstractNum w:abstractNumId="23" w15:restartNumberingAfterBreak="0">
+    <w:nsid w:val="628A1DCD"/>
     <w:multiLevelType w:val="hybridMultilevel"/>
-    <w:tmpl w:val="DCD69720"/>
-    <w:lvl w:ilvl="0" w:tplc="348AFA68">
+    <w:tmpl w:val="F3B64072"/>
+    <w:lvl w:ilvl="0" w:tplc="DBD4E656">
       <w:start w:val="1"/>
       <w:numFmt w:val="decimal"/>
       <w:lvlText w:val="%1."/>
@@ -24591,52 +24649,52 @@
         <w:color w:val="A67C27"/>
       </w:rPr>
     </w:lvl>
-    <w:lvl w:ilvl="1" w:tplc="27BA574E">
+    <w:lvl w:ilvl="1" w:tplc="31ECAB6C">
       <w:numFmt w:val="decimal"/>
       <w:lvlText w:val=""/>
       <w:lvlJc w:val="left"/>
     </w:lvl>
-    <w:lvl w:ilvl="2" w:tplc="C5E80736">
+    <w:lvl w:ilvl="2" w:tplc="E2B828F0">
       <w:numFmt w:val="decimal"/>
       <w:lvlText w:val=""/>
       <w:lvlJc w:val="left"/>
     </w:lvl>
-    <w:lvl w:ilvl="3" w:tplc="052A590E">
+    <w:lvl w:ilvl="3" w:tplc="D50A6022">
       <w:numFmt w:val="decimal"/>
       <w:lvlText w:val=""/>
       <w:lvlJc w:val="left"/>
     </w:lvl>
-    <w:lvl w:ilvl="4" w:tplc="C2DCF456">
+    <w:lvl w:ilvl="4" w:tplc="8FA075C2">
       <w:numFmt w:val="decimal"/>
       <w:lvlText w:val=""/>
       <w:lvlJc w:val="left"/>
     </w:lvl>
-    <w:lvl w:ilvl="5" w:tplc="385806D8">
+    <w:lvl w:ilvl="5" w:tplc="2F567BAE">
       <w:numFmt w:val="decimal"/>
       <w:lvlText w:val=""/>
       <w:lvlJc w:val="left"/>
     </w:lvl>
-    <w:lvl w:ilvl="6" w:tplc="F4E0BEB2">
+    <w:lvl w:ilvl="6" w:tplc="44327F28">
       <w:numFmt w:val="decimal"/>
       <w:lvlText w:val=""/>
       <w:lvlJc w:val="left"/>
     </w:lvl>
-    <w:lvl w:ilvl="7" w:tplc="3042BFFC">
+    <w:lvl w:ilvl="7" w:tplc="7E66A12C">
       <w:numFmt w:val="decimal"/>
       <w:lvlText w:val=""/>
       <w:lvlJc w:val="left"/>
     </w:lvl>
-    <w:lvl w:ilvl="8" w:tplc="C1AEBA7E">
+    <w:lvl w:ilvl="8" w:tplc="9072CDBC">
       <w:numFmt w:val="decimal"/>
       <w:lvlText w:val=""/>
       <w:lvlJc w:val="left"/>
     </w:lvl>
   </w:abstractNum>
-  <w:abstractNum w:abstractNumId="23" w15:restartNumberingAfterBreak="0">
-    <w:nsid w:val="6AE52C8B"/>
+  <w:abstractNum w:abstractNumId="24" w15:restartNumberingAfterBreak="0">
+    <w:nsid w:val="6A731B38"/>
     <w:multiLevelType w:val="hybridMultilevel"/>
-    <w:tmpl w:val="1B54D94E"/>
-    <w:lvl w:ilvl="0" w:tplc="FF18F896">
+    <w:tmpl w:val="C1E2886C"/>
+    <w:lvl w:ilvl="0" w:tplc="23A4BCDE">
       <w:start w:val="1"/>
       <w:numFmt w:val="decimal"/>
       <w:lvlText w:val="%1."/>
@@ -24650,52 +24708,52 @@
         <w:color w:val="A67C27"/>
       </w:rPr>
     </w:lvl>
-    <w:lvl w:ilvl="1" w:tplc="4BEE6B78">
+    <w:lvl w:ilvl="1" w:tplc="351CF12C">
       <w:numFmt w:val="decimal"/>
       <w:lvlText w:val=""/>
       <w:lvlJc w:val="left"/>
     </w:lvl>
-    <w:lvl w:ilvl="2" w:tplc="331647E6">
+    <w:lvl w:ilvl="2" w:tplc="D4B82674">
       <w:numFmt w:val="decimal"/>
       <w:lvlText w:val=""/>
       <w:lvlJc w:val="left"/>
     </w:lvl>
-    <w:lvl w:ilvl="3" w:tplc="B1B2A6EC">
+    <w:lvl w:ilvl="3" w:tplc="7F729A0C">
       <w:numFmt w:val="decimal"/>
       <w:lvlText w:val=""/>
       <w:lvlJc w:val="left"/>
     </w:lvl>
-    <w:lvl w:ilvl="4" w:tplc="59EE97CE">
+    <w:lvl w:ilvl="4" w:tplc="638437B2">
       <w:numFmt w:val="decimal"/>
       <w:lvlText w:val=""/>
       <w:lvlJc w:val="left"/>
     </w:lvl>
-    <w:lvl w:ilvl="5" w:tplc="51F6CE74">
+    <w:lvl w:ilvl="5" w:tplc="14A42B78">
       <w:numFmt w:val="decimal"/>
       <w:lvlText w:val=""/>
       <w:lvlJc w:val="left"/>
     </w:lvl>
-    <w:lvl w:ilvl="6" w:tplc="DB329204">
+    <w:lvl w:ilvl="6" w:tplc="17C8A046">
       <w:numFmt w:val="decimal"/>
       <w:lvlText w:val=""/>
       <w:lvlJc w:val="left"/>
     </w:lvl>
-    <w:lvl w:ilvl="7" w:tplc="4B86B168">
+    <w:lvl w:ilvl="7" w:tplc="3EEC7068">
       <w:numFmt w:val="decimal"/>
       <w:lvlText w:val=""/>
       <w:lvlJc w:val="left"/>
     </w:lvl>
-    <w:lvl w:ilvl="8" w:tplc="5E10E328">
+    <w:lvl w:ilvl="8" w:tplc="C944C190">
       <w:numFmt w:val="decimal"/>
       <w:lvlText w:val=""/>
       <w:lvlJc w:val="left"/>
     </w:lvl>
   </w:abstractNum>
-  <w:abstractNum w:abstractNumId="24" w15:restartNumberingAfterBreak="0">
-    <w:nsid w:val="6F8630F4"/>
+  <w:abstractNum w:abstractNumId="25" w15:restartNumberingAfterBreak="0">
+    <w:nsid w:val="70E60995"/>
     <w:multiLevelType w:val="hybridMultilevel"/>
-    <w:tmpl w:val="72CA4180"/>
-    <w:lvl w:ilvl="0" w:tplc="2DACA046">
+    <w:tmpl w:val="6EF0839A"/>
+    <w:lvl w:ilvl="0" w:tplc="39E46F9A">
       <w:start w:val="1"/>
       <w:numFmt w:val="decimal"/>
       <w:lvlText w:val="%1."/>
@@ -24709,52 +24767,52 @@
         <w:color w:val="A67C27"/>
       </w:rPr>
     </w:lvl>
-    <w:lvl w:ilvl="1" w:tplc="1436B96C">
+    <w:lvl w:ilvl="1" w:tplc="02D6395E">
       <w:numFmt w:val="decimal"/>
       <w:lvlText w:val=""/>
       <w:lvlJc w:val="left"/>
     </w:lvl>
-    <w:lvl w:ilvl="2" w:tplc="F6BAF256">
+    <w:lvl w:ilvl="2" w:tplc="440E302A">
       <w:numFmt w:val="decimal"/>
       <w:lvlText w:val=""/>
       <w:lvlJc w:val="left"/>
     </w:lvl>
-    <w:lvl w:ilvl="3" w:tplc="948C4DE6">
+    <w:lvl w:ilvl="3" w:tplc="372CFCDA">
       <w:numFmt w:val="decimal"/>
       <w:lvlText w:val=""/>
       <w:lvlJc w:val="left"/>
     </w:lvl>
-    <w:lvl w:ilvl="4" w:tplc="E138CF7A">
+    <w:lvl w:ilvl="4" w:tplc="BB4A7D42">
       <w:numFmt w:val="decimal"/>
       <w:lvlText w:val=""/>
       <w:lvlJc w:val="left"/>
     </w:lvl>
-    <w:lvl w:ilvl="5" w:tplc="22B605FC">
+    <w:lvl w:ilvl="5" w:tplc="C3FC40CA">
       <w:numFmt w:val="decimal"/>
       <w:lvlText w:val=""/>
       <w:lvlJc w:val="left"/>
     </w:lvl>
-    <w:lvl w:ilvl="6" w:tplc="D4A2F628">
+    <w:lvl w:ilvl="6" w:tplc="1368D544">
       <w:numFmt w:val="decimal"/>
       <w:lvlText w:val=""/>
       <w:lvlJc w:val="left"/>
     </w:lvl>
-    <w:lvl w:ilvl="7" w:tplc="EB2EC300">
+    <w:lvl w:ilvl="7" w:tplc="0A04994A">
       <w:numFmt w:val="decimal"/>
       <w:lvlText w:val=""/>
       <w:lvlJc w:val="left"/>
     </w:lvl>
-    <w:lvl w:ilvl="8" w:tplc="52F4B0C8">
+    <w:lvl w:ilvl="8" w:tplc="3148006A">
       <w:numFmt w:val="decimal"/>
       <w:lvlText w:val=""/>
       <w:lvlJc w:val="left"/>
     </w:lvl>
   </w:abstractNum>
-  <w:abstractNum w:abstractNumId="25" w15:restartNumberingAfterBreak="0">
-    <w:nsid w:val="76BC6ABC"/>
+  <w:abstractNum w:abstractNumId="26" w15:restartNumberingAfterBreak="0">
+    <w:nsid w:val="7B0E2A99"/>
     <w:multiLevelType w:val="hybridMultilevel"/>
-    <w:tmpl w:val="E0220F9A"/>
-    <w:lvl w:ilvl="0" w:tplc="C5A01140">
+    <w:tmpl w:val="F9DE7CDC"/>
+    <w:lvl w:ilvl="0" w:tplc="9D80E648">
       <w:start w:val="1"/>
       <w:numFmt w:val="decimal"/>
       <w:lvlText w:val="%1."/>
@@ -24768,110 +24826,52 @@
         <w:color w:val="A67C27"/>
       </w:rPr>
     </w:lvl>
-    <w:lvl w:ilvl="1" w:tplc="0762766E">
+    <w:lvl w:ilvl="1" w:tplc="18526C3C">
       <w:numFmt w:val="decimal"/>
       <w:lvlText w:val=""/>
       <w:lvlJc w:val="left"/>
     </w:lvl>
-    <w:lvl w:ilvl="2" w:tplc="CB6C70E4">
+    <w:lvl w:ilvl="2" w:tplc="DB04C118">
       <w:numFmt w:val="decimal"/>
       <w:lvlText w:val=""/>
       <w:lvlJc w:val="left"/>
     </w:lvl>
-    <w:lvl w:ilvl="3" w:tplc="4CA25B70">
+    <w:lvl w:ilvl="3" w:tplc="43FECF4A">
       <w:numFmt w:val="decimal"/>
       <w:lvlText w:val=""/>
       <w:lvlJc w:val="left"/>
     </w:lvl>
-    <w:lvl w:ilvl="4" w:tplc="4C023B10">
+    <w:lvl w:ilvl="4" w:tplc="EBE8A06A">
       <w:numFmt w:val="decimal"/>
       <w:lvlText w:val=""/>
       <w:lvlJc w:val="left"/>
     </w:lvl>
-    <w:lvl w:ilvl="5" w:tplc="3CDAEFD4">
+    <w:lvl w:ilvl="5" w:tplc="A15E3342">
       <w:numFmt w:val="decimal"/>
       <w:lvlText w:val=""/>
       <w:lvlJc w:val="left"/>
     </w:lvl>
-    <w:lvl w:ilvl="6" w:tplc="5884334E">
+    <w:lvl w:ilvl="6" w:tplc="BC745E56">
       <w:numFmt w:val="decimal"/>
       <w:lvlText w:val=""/>
       <w:lvlJc w:val="left"/>
     </w:lvl>
-    <w:lvl w:ilvl="7" w:tplc="7EF28642">
+    <w:lvl w:ilvl="7" w:tplc="773EFECA">
       <w:numFmt w:val="decimal"/>
       <w:lvlText w:val=""/>
       <w:lvlJc w:val="left"/>
     </w:lvl>
-    <w:lvl w:ilvl="8" w:tplc="244E1662">
-      <w:numFmt w:val="decimal"/>
-      <w:lvlText w:val=""/>
-      <w:lvlJc w:val="left"/>
-    </w:lvl>
-  </w:abstractNum>
-  <w:abstractNum w:abstractNumId="26" w15:restartNumberingAfterBreak="0">
-    <w:nsid w:val="7A822AB0"/>
-    <w:multiLevelType w:val="hybridMultilevel"/>
-    <w:tmpl w:val="D7C65B80"/>
-    <w:lvl w:ilvl="0" w:tplc="A860DF90">
-      <w:start w:val="1"/>
-      <w:numFmt w:val="bullet"/>
-      <w:lvlText w:val="•"/>
-      <w:lvlJc w:val="left"/>
-      <w:pPr>
-        <w:ind w:left="460" w:hanging="280"/>
-      </w:pPr>
-    </w:lvl>
-    <w:lvl w:ilvl="1" w:tplc="224E5D90">
-      <w:start w:val="1"/>
-      <w:numFmt w:val="bullet"/>
-      <w:lvlText w:val="–"/>
-      <w:lvlJc w:val="left"/>
-      <w:pPr>
-        <w:ind w:left="900" w:hanging="280"/>
-      </w:pPr>
-    </w:lvl>
-    <w:lvl w:ilvl="2" w:tplc="E368BA00">
-      <w:numFmt w:val="decimal"/>
-      <w:lvlText w:val=""/>
-      <w:lvlJc w:val="left"/>
-    </w:lvl>
-    <w:lvl w:ilvl="3" w:tplc="2F10FF2E">
-      <w:numFmt w:val="decimal"/>
-      <w:lvlText w:val=""/>
-      <w:lvlJc w:val="left"/>
-    </w:lvl>
-    <w:lvl w:ilvl="4" w:tplc="2A5C61C0">
-      <w:numFmt w:val="decimal"/>
-      <w:lvlText w:val=""/>
-      <w:lvlJc w:val="left"/>
-    </w:lvl>
-    <w:lvl w:ilvl="5" w:tplc="91C80C36">
-      <w:numFmt w:val="decimal"/>
-      <w:lvlText w:val=""/>
-      <w:lvlJc w:val="left"/>
-    </w:lvl>
-    <w:lvl w:ilvl="6" w:tplc="EE3CF2AA">
-      <w:numFmt w:val="decimal"/>
-      <w:lvlText w:val=""/>
-      <w:lvlJc w:val="left"/>
-    </w:lvl>
-    <w:lvl w:ilvl="7" w:tplc="EFEE00C8">
-      <w:numFmt w:val="decimal"/>
-      <w:lvlText w:val=""/>
-      <w:lvlJc w:val="left"/>
-    </w:lvl>
-    <w:lvl w:ilvl="8" w:tplc="4882033A">
+    <w:lvl w:ilvl="8" w:tplc="164A6D60">
       <w:numFmt w:val="decimal"/>
       <w:lvlText w:val=""/>
       <w:lvlJc w:val="left"/>
     </w:lvl>
   </w:abstractNum>
   <w:abstractNum w:abstractNumId="27" w15:restartNumberingAfterBreak="0">
-    <w:nsid w:val="7E196374"/>
+    <w:nsid w:val="7FF53CC8"/>
     <w:multiLevelType w:val="hybridMultilevel"/>
-    <w:tmpl w:val="650ABD7C"/>
-    <w:lvl w:ilvl="0" w:tplc="F506AE04">
+    <w:tmpl w:val="F9B413C6"/>
+    <w:lvl w:ilvl="0" w:tplc="EC32D95E">
       <w:start w:val="1"/>
       <w:numFmt w:val="decimal"/>
       <w:lvlText w:val="%1."/>
@@ -24885,211 +24885,211 @@
         <w:color w:val="A67C27"/>
       </w:rPr>
     </w:lvl>
-    <w:lvl w:ilvl="1" w:tplc="59082354">
+    <w:lvl w:ilvl="1" w:tplc="714E498E">
       <w:numFmt w:val="decimal"/>
       <w:lvlText w:val=""/>
       <w:lvlJc w:val="left"/>
     </w:lvl>
-    <w:lvl w:ilvl="2" w:tplc="AF9EDB5A">
+    <w:lvl w:ilvl="2" w:tplc="2184365A">
       <w:numFmt w:val="decimal"/>
       <w:lvlText w:val=""/>
       <w:lvlJc w:val="left"/>
     </w:lvl>
-    <w:lvl w:ilvl="3" w:tplc="CAFE1D98">
+    <w:lvl w:ilvl="3" w:tplc="80D885EA">
       <w:numFmt w:val="decimal"/>
       <w:lvlText w:val=""/>
       <w:lvlJc w:val="left"/>
     </w:lvl>
-    <w:lvl w:ilvl="4" w:tplc="C194C970">
+    <w:lvl w:ilvl="4" w:tplc="E9F4BAE2">
       <w:numFmt w:val="decimal"/>
       <w:lvlText w:val=""/>
       <w:lvlJc w:val="left"/>
     </w:lvl>
-    <w:lvl w:ilvl="5" w:tplc="718EBA7C">
+    <w:lvl w:ilvl="5" w:tplc="ED9636E4">
       <w:numFmt w:val="decimal"/>
       <w:lvlText w:val=""/>
       <w:lvlJc w:val="left"/>
     </w:lvl>
-    <w:lvl w:ilvl="6" w:tplc="B78CF410">
+    <w:lvl w:ilvl="6" w:tplc="4A7C0296">
       <w:numFmt w:val="decimal"/>
       <w:lvlText w:val=""/>
       <w:lvlJc w:val="left"/>
     </w:lvl>
-    <w:lvl w:ilvl="7" w:tplc="9624762E">
+    <w:lvl w:ilvl="7" w:tplc="97DE8E1A">
       <w:numFmt w:val="decimal"/>
       <w:lvlText w:val=""/>
       <w:lvlJc w:val="left"/>
     </w:lvl>
-    <w:lvl w:ilvl="8" w:tplc="4C141D6E">
+    <w:lvl w:ilvl="8" w:tplc="FA985844">
       <w:numFmt w:val="decimal"/>
       <w:lvlText w:val=""/>
       <w:lvlJc w:val="left"/>
     </w:lvl>
   </w:abstractNum>
-  <w:num w:numId="1" w16cid:durableId="889878372">
+  <w:num w:numId="1" w16cid:durableId="1209344101">
+    <w:abstractNumId w:val="6"/>
+    <w:lvlOverride w:ilvl="0">
+      <w:startOverride w:val="1"/>
+    </w:lvlOverride>
+  </w:num>
+  <w:num w:numId="2" w16cid:durableId="2023046645">
+    <w:abstractNumId w:val="8"/>
+    <w:lvlOverride w:ilvl="0">
+      <w:startOverride w:val="1"/>
+    </w:lvlOverride>
+  </w:num>
+  <w:num w:numId="3" w16cid:durableId="552274382">
+    <w:abstractNumId w:val="13"/>
+    <w:lvlOverride w:ilvl="0">
+      <w:startOverride w:val="1"/>
+    </w:lvlOverride>
+  </w:num>
+  <w:num w:numId="4" w16cid:durableId="1052921871">
+    <w:abstractNumId w:val="7"/>
+    <w:lvlOverride w:ilvl="0">
+      <w:startOverride w:val="1"/>
+    </w:lvlOverride>
+  </w:num>
+  <w:num w:numId="5" w16cid:durableId="581178833">
+    <w:abstractNumId w:val="3"/>
+    <w:lvlOverride w:ilvl="0">
+      <w:startOverride w:val="1"/>
+    </w:lvlOverride>
+  </w:num>
+  <w:num w:numId="6" w16cid:durableId="18631445">
+    <w:abstractNumId w:val="12"/>
+    <w:lvlOverride w:ilvl="0">
+      <w:startOverride w:val="1"/>
+    </w:lvlOverride>
+  </w:num>
+  <w:num w:numId="7" w16cid:durableId="1088187126">
+    <w:abstractNumId w:val="4"/>
+    <w:lvlOverride w:ilvl="0">
+      <w:startOverride w:val="1"/>
+    </w:lvlOverride>
+  </w:num>
+  <w:num w:numId="8" w16cid:durableId="1093552612">
+    <w:abstractNumId w:val="26"/>
+    <w:lvlOverride w:ilvl="0">
+      <w:startOverride w:val="1"/>
+    </w:lvlOverride>
+  </w:num>
+  <w:num w:numId="9" w16cid:durableId="293292603">
+    <w:abstractNumId w:val="20"/>
+    <w:lvlOverride w:ilvl="0">
+      <w:startOverride w:val="1"/>
+    </w:lvlOverride>
+  </w:num>
+  <w:num w:numId="10" w16cid:durableId="174468287">
+    <w:abstractNumId w:val="21"/>
+    <w:lvlOverride w:ilvl="0">
+      <w:startOverride w:val="1"/>
+    </w:lvlOverride>
+  </w:num>
+  <w:num w:numId="11" w16cid:durableId="1231768270">
+    <w:abstractNumId w:val="2"/>
+    <w:lvlOverride w:ilvl="0">
+      <w:startOverride w:val="1"/>
+    </w:lvlOverride>
+  </w:num>
+  <w:num w:numId="12" w16cid:durableId="1587419613">
+    <w:abstractNumId w:val="17"/>
+    <w:lvlOverride w:ilvl="0">
+      <w:startOverride w:val="1"/>
+    </w:lvlOverride>
+  </w:num>
+  <w:num w:numId="13" w16cid:durableId="556209963">
+    <w:abstractNumId w:val="10"/>
+    <w:lvlOverride w:ilvl="0">
+      <w:startOverride w:val="1"/>
+    </w:lvlOverride>
+  </w:num>
+  <w:num w:numId="14" w16cid:durableId="489566807">
+    <w:abstractNumId w:val="27"/>
+    <w:lvlOverride w:ilvl="0">
+      <w:startOverride w:val="1"/>
+    </w:lvlOverride>
+  </w:num>
+  <w:num w:numId="15" w16cid:durableId="358089333">
+    <w:abstractNumId w:val="15"/>
+    <w:lvlOverride w:ilvl="0">
+      <w:startOverride w:val="1"/>
+    </w:lvlOverride>
+  </w:num>
+  <w:num w:numId="16" w16cid:durableId="1557626749">
+    <w:abstractNumId w:val="1"/>
+    <w:lvlOverride w:ilvl="0">
+      <w:startOverride w:val="1"/>
+    </w:lvlOverride>
+  </w:num>
+  <w:num w:numId="17" w16cid:durableId="896474062">
+    <w:abstractNumId w:val="14"/>
+    <w:lvlOverride w:ilvl="0">
+      <w:startOverride w:val="1"/>
+    </w:lvlOverride>
+  </w:num>
+  <w:num w:numId="18" w16cid:durableId="2035767701">
+    <w:abstractNumId w:val="25"/>
+    <w:lvlOverride w:ilvl="0">
+      <w:startOverride w:val="1"/>
+    </w:lvlOverride>
+  </w:num>
+  <w:num w:numId="19" w16cid:durableId="2018262444">
+    <w:abstractNumId w:val="9"/>
+    <w:lvlOverride w:ilvl="0">
+      <w:startOverride w:val="1"/>
+    </w:lvlOverride>
+  </w:num>
+  <w:num w:numId="20" w16cid:durableId="16658474">
+    <w:abstractNumId w:val="19"/>
+    <w:lvlOverride w:ilvl="0">
+      <w:startOverride w:val="1"/>
+    </w:lvlOverride>
+  </w:num>
+  <w:num w:numId="21" w16cid:durableId="526480025">
+    <w:abstractNumId w:val="5"/>
+    <w:lvlOverride w:ilvl="0">
+      <w:startOverride w:val="1"/>
+    </w:lvlOverride>
+  </w:num>
+  <w:num w:numId="22" w16cid:durableId="562180551">
     <w:abstractNumId w:val="11"/>
     <w:lvlOverride w:ilvl="0">
       <w:startOverride w:val="1"/>
     </w:lvlOverride>
   </w:num>
-  <w:num w:numId="2" w16cid:durableId="497040865">
-    <w:abstractNumId w:val="26"/>
-    <w:lvlOverride w:ilvl="0">
-      <w:startOverride w:val="1"/>
-    </w:lvlOverride>
-  </w:num>
-  <w:num w:numId="3" w16cid:durableId="1394501113">
-    <w:abstractNumId w:val="4"/>
-    <w:lvlOverride w:ilvl="0">
-      <w:startOverride w:val="1"/>
-    </w:lvlOverride>
-  </w:num>
-  <w:num w:numId="4" w16cid:durableId="309986309">
-    <w:abstractNumId w:val="20"/>
-    <w:lvlOverride w:ilvl="0">
-      <w:startOverride w:val="1"/>
-    </w:lvlOverride>
-  </w:num>
-  <w:num w:numId="5" w16cid:durableId="1017806013">
-    <w:abstractNumId w:val="5"/>
-    <w:lvlOverride w:ilvl="0">
-      <w:startOverride w:val="1"/>
-    </w:lvlOverride>
-  </w:num>
-  <w:num w:numId="6" w16cid:durableId="162085592">
-    <w:abstractNumId w:val="17"/>
-    <w:lvlOverride w:ilvl="0">
-      <w:startOverride w:val="1"/>
-    </w:lvlOverride>
-  </w:num>
-  <w:num w:numId="7" w16cid:durableId="619846410">
-    <w:abstractNumId w:val="13"/>
-    <w:lvlOverride w:ilvl="0">
-      <w:startOverride w:val="1"/>
-    </w:lvlOverride>
-  </w:num>
-  <w:num w:numId="8" w16cid:durableId="1073503082">
+  <w:num w:numId="23" w16cid:durableId="338889238">
     <w:abstractNumId w:val="24"/>
     <w:lvlOverride w:ilvl="0">
       <w:startOverride w:val="1"/>
     </w:lvlOverride>
   </w:num>
-  <w:num w:numId="9" w16cid:durableId="821653699">
-    <w:abstractNumId w:val="27"/>
+  <w:num w:numId="24" w16cid:durableId="1345132680">
+    <w:abstractNumId w:val="0"/>
     <w:lvlOverride w:ilvl="0">
       <w:startOverride w:val="1"/>
     </w:lvlOverride>
   </w:num>
-  <w:num w:numId="10" w16cid:durableId="1798909916">
+  <w:num w:numId="25" w16cid:durableId="1027827919">
     <w:abstractNumId w:val="18"/>
     <w:lvlOverride w:ilvl="0">
       <w:startOverride w:val="1"/>
     </w:lvlOverride>
   </w:num>
-  <w:num w:numId="11" w16cid:durableId="267857134">
-    <w:abstractNumId w:val="2"/>
+  <w:num w:numId="26" w16cid:durableId="270359898">
+    <w:abstractNumId w:val="23"/>
     <w:lvlOverride w:ilvl="0">
       <w:startOverride w:val="1"/>
     </w:lvlOverride>
   </w:num>
-  <w:num w:numId="12" w16cid:durableId="1671331018">
-    <w:abstractNumId w:val="16"/>
-    <w:lvlOverride w:ilvl="0">
-      <w:startOverride w:val="1"/>
-    </w:lvlOverride>
-  </w:num>
-  <w:num w:numId="13" w16cid:durableId="1757943579">
-    <w:abstractNumId w:val="10"/>
-    <w:lvlOverride w:ilvl="0">
-      <w:startOverride w:val="1"/>
-    </w:lvlOverride>
-  </w:num>
-  <w:num w:numId="14" w16cid:durableId="132256408">
-    <w:abstractNumId w:val="7"/>
-    <w:lvlOverride w:ilvl="0">
-      <w:startOverride w:val="1"/>
-    </w:lvlOverride>
-  </w:num>
-  <w:num w:numId="15" w16cid:durableId="203060908">
-    <w:abstractNumId w:val="1"/>
-    <w:lvlOverride w:ilvl="0">
-      <w:startOverride w:val="1"/>
-    </w:lvlOverride>
-  </w:num>
-  <w:num w:numId="16" w16cid:durableId="310329172">
-    <w:abstractNumId w:val="15"/>
-    <w:lvlOverride w:ilvl="0">
-      <w:startOverride w:val="1"/>
-    </w:lvlOverride>
-  </w:num>
-  <w:num w:numId="17" w16cid:durableId="693070279">
-    <w:abstractNumId w:val="9"/>
-    <w:lvlOverride w:ilvl="0">
-      <w:startOverride w:val="1"/>
-    </w:lvlOverride>
-  </w:num>
-  <w:num w:numId="18" w16cid:durableId="1301954560">
-    <w:abstractNumId w:val="21"/>
-    <w:lvlOverride w:ilvl="0">
-      <w:startOverride w:val="1"/>
-    </w:lvlOverride>
-  </w:num>
-  <w:num w:numId="19" w16cid:durableId="1368600403">
-    <w:abstractNumId w:val="14"/>
-    <w:lvlOverride w:ilvl="0">
-      <w:startOverride w:val="1"/>
-    </w:lvlOverride>
-  </w:num>
-  <w:num w:numId="20" w16cid:durableId="1222860772">
-    <w:abstractNumId w:val="8"/>
-    <w:lvlOverride w:ilvl="0">
-      <w:startOverride w:val="1"/>
-    </w:lvlOverride>
-  </w:num>
-  <w:num w:numId="21" w16cid:durableId="1482236362">
-    <w:abstractNumId w:val="25"/>
-    <w:lvlOverride w:ilvl="0">
-      <w:startOverride w:val="1"/>
-    </w:lvlOverride>
-  </w:num>
-  <w:num w:numId="22" w16cid:durableId="1220631364">
-    <w:abstractNumId w:val="12"/>
-    <w:lvlOverride w:ilvl="0">
-      <w:startOverride w:val="1"/>
-    </w:lvlOverride>
-  </w:num>
-  <w:num w:numId="23" w16cid:durableId="1811363397">
-    <w:abstractNumId w:val="19"/>
-    <w:lvlOverride w:ilvl="0">
-      <w:startOverride w:val="1"/>
-    </w:lvlOverride>
-  </w:num>
-  <w:num w:numId="24" w16cid:durableId="2015917497">
+  <w:num w:numId="27" w16cid:durableId="2124182718">
     <w:abstractNumId w:val="22"/>
     <w:lvlOverride w:ilvl="0">
       <w:startOverride w:val="1"/>
     </w:lvlOverride>
   </w:num>
-  <w:num w:numId="25" w16cid:durableId="1088888941">
-    <w:abstractNumId w:val="3"/>
-    <w:lvlOverride w:ilvl="0">
-      <w:startOverride w:val="1"/>
-    </w:lvlOverride>
-  </w:num>
-  <w:num w:numId="26" w16cid:durableId="114057484">
-    <w:abstractNumId w:val="0"/>
-    <w:lvlOverride w:ilvl="0">
-      <w:startOverride w:val="1"/>
-    </w:lvlOverride>
-  </w:num>
-  <w:num w:numId="27" w16cid:durableId="156576389">
-    <w:abstractNumId w:val="23"/>
-    <w:lvlOverride w:ilvl="0">
-      <w:startOverride w:val="1"/>
-    </w:lvlOverride>
-  </w:num>
-  <w:num w:numId="28" w16cid:durableId="391392790">
-    <w:abstractNumId w:val="6"/>
+  <w:num w:numId="28" w16cid:durableId="1844515784">
+    <w:abstractNumId w:val="16"/>
     <w:lvlOverride w:ilvl="0">
       <w:startOverride w:val="1"/>
     </w:lvlOverride>
@@ -25714,7 +25714,7 @@
     <w:autoRedefine/>
     <w:uiPriority w:val="39"/>
     <w:unhideWhenUsed/>
-    <w:rsid w:val="00D34E16"/>
+    <w:rsid w:val="00883E21"/>
     <w:pPr>
       <w:spacing w:after="100"/>
     </w:pPr>
@@ -25726,7 +25726,7 @@
     <w:autoRedefine/>
     <w:uiPriority w:val="39"/>
     <w:unhideWhenUsed/>
-    <w:rsid w:val="00D34E16"/>
+    <w:rsid w:val="00883E21"/>
     <w:pPr>
       <w:spacing w:after="100"/>
       <w:ind w:left="210"/>

</xml_diff>